<commit_message>
US 2.3.2 - organizational structure (#17)
</commit_message>
<xml_diff>
--- a/docs/client_analysis/report_APS.docx
+++ b/docs/client_analysis/report_APS.docx
@@ -714,7 +714,7 @@
           <w:r>
             <w:fldChar w:fldCharType="separate"/>
           </w:r>
-          <w:hyperlink w:anchor="_Toc211415483" w:history="1">
+          <w:hyperlink w:anchor="_Toc211416493" w:history="1">
             <w:r>
               <w:rPr>
                 <w:rStyle w:val="Hyperlink"/>
@@ -742,7 +742,7 @@
                 <w:noProof/>
                 <w:webHidden/>
               </w:rPr>
-              <w:instrText xml:space="preserve"> PAGEREF _Toc211415483 \h </w:instrText>
+              <w:instrText xml:space="preserve"> PAGEREF _Toc211416493 \h </w:instrText>
             </w:r>
             <w:r>
               <w:rPr>
@@ -762,7 +762,7 @@
                 <w:noProof/>
                 <w:webHidden/>
               </w:rPr>
-              <w:t>3</w:t>
+              <w:t>4</w:t>
             </w:r>
             <w:r>
               <w:rPr>
@@ -787,7 +787,7 @@
               <w14:ligatures w14:val="standardContextual"/>
             </w:rPr>
           </w:pPr>
-          <w:hyperlink w:anchor="_Toc211415484" w:history="1">
+          <w:hyperlink w:anchor="_Toc211416494" w:history="1">
             <w:r>
               <w:rPr>
                 <w:rStyle w:val="Hyperlink"/>
@@ -815,7 +815,7 @@
                 <w:noProof/>
                 <w:webHidden/>
               </w:rPr>
-              <w:instrText xml:space="preserve"> PAGEREF _Toc211415484 \h </w:instrText>
+              <w:instrText xml:space="preserve"> PAGEREF _Toc211416494 \h </w:instrText>
             </w:r>
             <w:r>
               <w:rPr>
@@ -835,7 +835,7 @@
                 <w:noProof/>
                 <w:webHidden/>
               </w:rPr>
-              <w:t>3</w:t>
+              <w:t>4</w:t>
             </w:r>
             <w:r>
               <w:rPr>
@@ -860,7 +860,7 @@
               <w14:ligatures w14:val="standardContextual"/>
             </w:rPr>
           </w:pPr>
-          <w:hyperlink w:anchor="_Toc211415485" w:history="1">
+          <w:hyperlink w:anchor="_Toc211416495" w:history="1">
             <w:r>
               <w:rPr>
                 <w:rStyle w:val="Hyperlink"/>
@@ -887,7 +887,7 @@
                 <w:noProof/>
                 <w:webHidden/>
               </w:rPr>
-              <w:instrText xml:space="preserve"> PAGEREF _Toc211415485 \h </w:instrText>
+              <w:instrText xml:space="preserve"> PAGEREF _Toc211416495 \h </w:instrText>
             </w:r>
             <w:r>
               <w:rPr>
@@ -907,7 +907,7 @@
                 <w:noProof/>
                 <w:webHidden/>
               </w:rPr>
-              <w:t>3</w:t>
+              <w:t>4</w:t>
             </w:r>
             <w:r>
               <w:rPr>
@@ -932,7 +932,7 @@
               <w14:ligatures w14:val="standardContextual"/>
             </w:rPr>
           </w:pPr>
-          <w:hyperlink w:anchor="_Toc211415486" w:history="1">
+          <w:hyperlink w:anchor="_Toc211416496" w:history="1">
             <w:r>
               <w:rPr>
                 <w:rStyle w:val="Hyperlink"/>
@@ -959,7 +959,7 @@
                 <w:noProof/>
                 <w:webHidden/>
               </w:rPr>
-              <w:instrText xml:space="preserve"> PAGEREF _Toc211415486 \h </w:instrText>
+              <w:instrText xml:space="preserve"> PAGEREF _Toc211416496 \h </w:instrText>
             </w:r>
             <w:r>
               <w:rPr>
@@ -979,7 +979,7 @@
                 <w:noProof/>
                 <w:webHidden/>
               </w:rPr>
-              <w:t>7</w:t>
+              <w:t>8</w:t>
             </w:r>
             <w:r>
               <w:rPr>
@@ -1004,7 +1004,7 @@
               <w14:ligatures w14:val="standardContextual"/>
             </w:rPr>
           </w:pPr>
-          <w:hyperlink w:anchor="_Toc211415487" w:history="1">
+          <w:hyperlink w:anchor="_Toc211416497" w:history="1">
             <w:r>
               <w:rPr>
                 <w:rStyle w:val="Hyperlink"/>
@@ -1031,7 +1031,7 @@
                 <w:noProof/>
                 <w:webHidden/>
               </w:rPr>
-              <w:instrText xml:space="preserve"> PAGEREF _Toc211415487 \h </w:instrText>
+              <w:instrText xml:space="preserve"> PAGEREF _Toc211416497 \h </w:instrText>
             </w:r>
             <w:r>
               <w:rPr>
@@ -1051,7 +1051,7 @@
                 <w:noProof/>
                 <w:webHidden/>
               </w:rPr>
-              <w:t>8</w:t>
+              <w:t>9</w:t>
             </w:r>
             <w:r>
               <w:rPr>
@@ -1076,7 +1076,7 @@
               <w14:ligatures w14:val="standardContextual"/>
             </w:rPr>
           </w:pPr>
-          <w:hyperlink w:anchor="_Toc211415488" w:history="1">
+          <w:hyperlink w:anchor="_Toc211416498" w:history="1">
             <w:r>
               <w:rPr>
                 <w:rStyle w:val="Hyperlink"/>
@@ -1103,7 +1103,7 @@
                 <w:noProof/>
                 <w:webHidden/>
               </w:rPr>
-              <w:instrText xml:space="preserve"> PAGEREF _Toc211415488 \h </w:instrText>
+              <w:instrText xml:space="preserve"> PAGEREF _Toc211416498 \h </w:instrText>
             </w:r>
             <w:r>
               <w:rPr>
@@ -1123,7 +1123,7 @@
                 <w:noProof/>
                 <w:webHidden/>
               </w:rPr>
-              <w:t>8</w:t>
+              <w:t>9</w:t>
             </w:r>
             <w:r>
               <w:rPr>
@@ -1148,7 +1148,7 @@
               <w14:ligatures w14:val="standardContextual"/>
             </w:rPr>
           </w:pPr>
-          <w:hyperlink w:anchor="_Toc211415489" w:history="1">
+          <w:hyperlink w:anchor="_Toc211416499" w:history="1">
             <w:r>
               <w:rPr>
                 <w:rStyle w:val="Hyperlink"/>
@@ -1175,7 +1175,7 @@
                 <w:noProof/>
                 <w:webHidden/>
               </w:rPr>
-              <w:instrText xml:space="preserve"> PAGEREF _Toc211415489 \h </w:instrText>
+              <w:instrText xml:space="preserve"> PAGEREF _Toc211416499 \h </w:instrText>
             </w:r>
             <w:r>
               <w:rPr>
@@ -1195,7 +1195,7 @@
                 <w:noProof/>
                 <w:webHidden/>
               </w:rPr>
-              <w:t>9</w:t>
+              <w:t>10</w:t>
             </w:r>
             <w:r>
               <w:rPr>
@@ -1220,7 +1220,7 @@
               <w14:ligatures w14:val="standardContextual"/>
             </w:rPr>
           </w:pPr>
-          <w:hyperlink w:anchor="_Toc211415490" w:history="1">
+          <w:hyperlink w:anchor="_Toc211416500" w:history="1">
             <w:r>
               <w:rPr>
                 <w:rStyle w:val="Hyperlink"/>
@@ -1247,7 +1247,7 @@
                 <w:noProof/>
                 <w:webHidden/>
               </w:rPr>
-              <w:instrText xml:space="preserve"> PAGEREF _Toc211415490 \h </w:instrText>
+              <w:instrText xml:space="preserve"> PAGEREF _Toc211416500 \h </w:instrText>
             </w:r>
             <w:r>
               <w:rPr>
@@ -1267,7 +1267,7 @@
                 <w:noProof/>
                 <w:webHidden/>
               </w:rPr>
-              <w:t>11</w:t>
+              <w:t>12</w:t>
             </w:r>
             <w:r>
               <w:rPr>
@@ -1292,7 +1292,7 @@
               <w14:ligatures w14:val="standardContextual"/>
             </w:rPr>
           </w:pPr>
-          <w:hyperlink w:anchor="_Toc211415491" w:history="1">
+          <w:hyperlink w:anchor="_Toc211416501" w:history="1">
             <w:r>
               <w:rPr>
                 <w:rStyle w:val="Hyperlink"/>
@@ -1319,7 +1319,7 @@
                 <w:noProof/>
                 <w:webHidden/>
               </w:rPr>
-              <w:instrText xml:space="preserve"> PAGEREF _Toc211415491 \h </w:instrText>
+              <w:instrText xml:space="preserve"> PAGEREF _Toc211416501 \h </w:instrText>
             </w:r>
             <w:r>
               <w:rPr>
@@ -1339,7 +1339,7 @@
                 <w:noProof/>
                 <w:webHidden/>
               </w:rPr>
-              <w:t>12</w:t>
+              <w:t>13</w:t>
             </w:r>
             <w:r>
               <w:rPr>
@@ -1364,7 +1364,7 @@
               <w14:ligatures w14:val="standardContextual"/>
             </w:rPr>
           </w:pPr>
-          <w:hyperlink w:anchor="_Toc211415492" w:history="1">
+          <w:hyperlink w:anchor="_Toc211416502" w:history="1">
             <w:r>
               <w:rPr>
                 <w:rStyle w:val="Hyperlink"/>
@@ -1391,7 +1391,7 @@
                 <w:noProof/>
                 <w:webHidden/>
               </w:rPr>
-              <w:instrText xml:space="preserve"> PAGEREF _Toc211415492 \h </w:instrText>
+              <w:instrText xml:space="preserve"> PAGEREF _Toc211416502 \h </w:instrText>
             </w:r>
             <w:r>
               <w:rPr>
@@ -1411,7 +1411,7 @@
                 <w:noProof/>
                 <w:webHidden/>
               </w:rPr>
-              <w:t>12</w:t>
+              <w:t>13</w:t>
             </w:r>
             <w:r>
               <w:rPr>
@@ -1436,7 +1436,7 @@
               <w14:ligatures w14:val="standardContextual"/>
             </w:rPr>
           </w:pPr>
-          <w:hyperlink w:anchor="_Toc211415493" w:history="1">
+          <w:hyperlink w:anchor="_Toc211416503" w:history="1">
             <w:r>
               <w:rPr>
                 <w:rStyle w:val="Hyperlink"/>
@@ -1463,7 +1463,7 @@
                 <w:noProof/>
                 <w:webHidden/>
               </w:rPr>
-              <w:instrText xml:space="preserve"> PAGEREF _Toc211415493 \h </w:instrText>
+              <w:instrText xml:space="preserve"> PAGEREF _Toc211416503 \h </w:instrText>
             </w:r>
             <w:r>
               <w:rPr>
@@ -1483,7 +1483,7 @@
                 <w:noProof/>
                 <w:webHidden/>
               </w:rPr>
-              <w:t>13</w:t>
+              <w:t>14</w:t>
             </w:r>
             <w:r>
               <w:rPr>
@@ -1508,7 +1508,7 @@
               <w14:ligatures w14:val="standardContextual"/>
             </w:rPr>
           </w:pPr>
-          <w:hyperlink w:anchor="_Toc211415494" w:history="1">
+          <w:hyperlink w:anchor="_Toc211416504" w:history="1">
             <w:r>
               <w:rPr>
                 <w:rStyle w:val="Hyperlink"/>
@@ -1535,7 +1535,7 @@
                 <w:noProof/>
                 <w:webHidden/>
               </w:rPr>
-              <w:instrText xml:space="preserve"> PAGEREF _Toc211415494 \h </w:instrText>
+              <w:instrText xml:space="preserve"> PAGEREF _Toc211416504 \h </w:instrText>
             </w:r>
             <w:r>
               <w:rPr>
@@ -1555,7 +1555,7 @@
                 <w:noProof/>
                 <w:webHidden/>
               </w:rPr>
-              <w:t>14</w:t>
+              <w:t>15</w:t>
             </w:r>
             <w:r>
               <w:rPr>
@@ -1580,7 +1580,7 @@
               <w14:ligatures w14:val="standardContextual"/>
             </w:rPr>
           </w:pPr>
-          <w:hyperlink w:anchor="_Toc211415495" w:history="1">
+          <w:hyperlink w:anchor="_Toc211416505" w:history="1">
             <w:r>
               <w:rPr>
                 <w:rStyle w:val="Hyperlink"/>
@@ -1607,7 +1607,7 @@
                 <w:noProof/>
                 <w:webHidden/>
               </w:rPr>
-              <w:instrText xml:space="preserve"> PAGEREF _Toc211415495 \h </w:instrText>
+              <w:instrText xml:space="preserve"> PAGEREF _Toc211416505 \h </w:instrText>
             </w:r>
             <w:r>
               <w:rPr>
@@ -1627,7 +1627,79 @@
                 <w:noProof/>
                 <w:webHidden/>
               </w:rPr>
-              <w:t>14</w:t>
+              <w:t>15</w:t>
+            </w:r>
+            <w:r>
+              <w:rPr>
+                <w:noProof/>
+                <w:webHidden/>
+              </w:rPr>
+              <w:fldChar w:fldCharType="end"/>
+            </w:r>
+          </w:hyperlink>
+        </w:p>
+        <w:p>
+          <w:pPr>
+            <w:pStyle w:val="TOC3"/>
+            <w:tabs>
+              <w:tab w:val="right" w:leader="dot" w:pos="9350"/>
+            </w:tabs>
+            <w:rPr>
+              <w:rFonts w:asciiTheme="minorHAnsi" w:eastAsiaTheme="minorEastAsia" w:hAnsiTheme="minorHAnsi" w:cstheme="minorBidi"/>
+              <w:noProof/>
+              <w:kern w:val="2"/>
+              <w:sz w:val="24"/>
+              <w14:ligatures w14:val="standardContextual"/>
+            </w:rPr>
+          </w:pPr>
+          <w:hyperlink w:anchor="_Toc211416506" w:history="1">
+            <w:r>
+              <w:rPr>
+                <w:rStyle w:val="Hyperlink"/>
+                <w:noProof/>
+              </w:rPr>
+              <w:t>Estrutura organizacional</w:t>
+            </w:r>
+            <w:r>
+              <w:rPr>
+                <w:noProof/>
+                <w:webHidden/>
+              </w:rPr>
+              <w:tab/>
+            </w:r>
+            <w:r>
+              <w:rPr>
+                <w:noProof/>
+                <w:webHidden/>
+              </w:rPr>
+              <w:fldChar w:fldCharType="begin"/>
+            </w:r>
+            <w:r>
+              <w:rPr>
+                <w:noProof/>
+                <w:webHidden/>
+              </w:rPr>
+              <w:instrText xml:space="preserve"> PAGEREF _Toc211416506 \h </w:instrText>
+            </w:r>
+            <w:r>
+              <w:rPr>
+                <w:noProof/>
+                <w:webHidden/>
+              </w:rPr>
+            </w:r>
+            <w:r>
+              <w:rPr>
+                <w:noProof/>
+                <w:webHidden/>
+              </w:rPr>
+              <w:fldChar w:fldCharType="separate"/>
+            </w:r>
+            <w:r>
+              <w:rPr>
+                <w:noProof/>
+                <w:webHidden/>
+              </w:rPr>
+              <w:t>15</w:t>
             </w:r>
             <w:r>
               <w:rPr>
@@ -1652,7 +1724,7 @@
               <w14:ligatures w14:val="standardContextual"/>
             </w:rPr>
           </w:pPr>
-          <w:hyperlink w:anchor="_Toc211415496" w:history="1">
+          <w:hyperlink w:anchor="_Toc211416507" w:history="1">
             <w:r>
               <w:rPr>
                 <w:rStyle w:val="Hyperlink"/>
@@ -1679,7 +1751,7 @@
                 <w:noProof/>
                 <w:webHidden/>
               </w:rPr>
-              <w:instrText xml:space="preserve"> PAGEREF _Toc211415496 \h </w:instrText>
+              <w:instrText xml:space="preserve"> PAGEREF _Toc211416507 \h </w:instrText>
             </w:r>
             <w:r>
               <w:rPr>
@@ -1699,7 +1771,7 @@
                 <w:noProof/>
                 <w:webHidden/>
               </w:rPr>
-              <w:t>14</w:t>
+              <w:t>16</w:t>
             </w:r>
             <w:r>
               <w:rPr>
@@ -1724,7 +1796,7 @@
               <w14:ligatures w14:val="standardContextual"/>
             </w:rPr>
           </w:pPr>
-          <w:hyperlink w:anchor="_Toc211415497" w:history="1">
+          <w:hyperlink w:anchor="_Toc211416508" w:history="1">
             <w:r>
               <w:rPr>
                 <w:rStyle w:val="Hyperlink"/>
@@ -1751,7 +1823,7 @@
                 <w:noProof/>
                 <w:webHidden/>
               </w:rPr>
-              <w:instrText xml:space="preserve"> PAGEREF _Toc211415497 \h </w:instrText>
+              <w:instrText xml:space="preserve"> PAGEREF _Toc211416508 \h </w:instrText>
             </w:r>
             <w:r>
               <w:rPr>
@@ -1771,7 +1843,7 @@
                 <w:noProof/>
                 <w:webHidden/>
               </w:rPr>
-              <w:t>15</w:t>
+              <w:t>17</w:t>
             </w:r>
             <w:r>
               <w:rPr>
@@ -1796,7 +1868,7 @@
               <w14:ligatures w14:val="standardContextual"/>
             </w:rPr>
           </w:pPr>
-          <w:hyperlink w:anchor="_Toc211415498" w:history="1">
+          <w:hyperlink w:anchor="_Toc211416509" w:history="1">
             <w:r>
               <w:rPr>
                 <w:rStyle w:val="Hyperlink"/>
@@ -1823,7 +1895,7 @@
                 <w:noProof/>
                 <w:webHidden/>
               </w:rPr>
-              <w:instrText xml:space="preserve"> PAGEREF _Toc211415498 \h </w:instrText>
+              <w:instrText xml:space="preserve"> PAGEREF _Toc211416509 \h </w:instrText>
             </w:r>
             <w:r>
               <w:rPr>
@@ -1843,7 +1915,7 @@
                 <w:noProof/>
                 <w:webHidden/>
               </w:rPr>
-              <w:t>15</w:t>
+              <w:t>17</w:t>
             </w:r>
             <w:r>
               <w:rPr>
@@ -1868,7 +1940,7 @@
               <w14:ligatures w14:val="standardContextual"/>
             </w:rPr>
           </w:pPr>
-          <w:hyperlink w:anchor="_Toc211415499" w:history="1">
+          <w:hyperlink w:anchor="_Toc211416510" w:history="1">
             <w:r>
               <w:rPr>
                 <w:rStyle w:val="Hyperlink"/>
@@ -1895,7 +1967,7 @@
                 <w:noProof/>
                 <w:webHidden/>
               </w:rPr>
-              <w:instrText xml:space="preserve"> PAGEREF _Toc211415499 \h </w:instrText>
+              <w:instrText xml:space="preserve"> PAGEREF _Toc211416510 \h </w:instrText>
             </w:r>
             <w:r>
               <w:rPr>
@@ -1915,7 +1987,7 @@
                 <w:noProof/>
                 <w:webHidden/>
               </w:rPr>
-              <w:t>15</w:t>
+              <w:t>17</w:t>
             </w:r>
             <w:r>
               <w:rPr>
@@ -1940,7 +2012,7 @@
               <w14:ligatures w14:val="standardContextual"/>
             </w:rPr>
           </w:pPr>
-          <w:hyperlink w:anchor="_Toc211415500" w:history="1">
+          <w:hyperlink w:anchor="_Toc211416511" w:history="1">
             <w:r>
               <w:rPr>
                 <w:rStyle w:val="Hyperlink"/>
@@ -1967,7 +2039,7 @@
                 <w:noProof/>
                 <w:webHidden/>
               </w:rPr>
-              <w:instrText xml:space="preserve"> PAGEREF _Toc211415500 \h </w:instrText>
+              <w:instrText xml:space="preserve"> PAGEREF _Toc211416511 \h </w:instrText>
             </w:r>
             <w:r>
               <w:rPr>
@@ -1987,7 +2059,7 @@
                 <w:noProof/>
                 <w:webHidden/>
               </w:rPr>
-              <w:t>15</w:t>
+              <w:t>17</w:t>
             </w:r>
             <w:r>
               <w:rPr>
@@ -2012,7 +2084,7 @@
               <w14:ligatures w14:val="standardContextual"/>
             </w:rPr>
           </w:pPr>
-          <w:hyperlink w:anchor="_Toc211415501" w:history="1">
+          <w:hyperlink w:anchor="_Toc211416512" w:history="1">
             <w:r>
               <w:rPr>
                 <w:rStyle w:val="Hyperlink"/>
@@ -2039,7 +2111,7 @@
                 <w:noProof/>
                 <w:webHidden/>
               </w:rPr>
-              <w:instrText xml:space="preserve"> PAGEREF _Toc211415501 \h </w:instrText>
+              <w:instrText xml:space="preserve"> PAGEREF _Toc211416512 \h </w:instrText>
             </w:r>
             <w:r>
               <w:rPr>
@@ -2059,7 +2131,7 @@
                 <w:noProof/>
                 <w:webHidden/>
               </w:rPr>
-              <w:t>15</w:t>
+              <w:t>17</w:t>
             </w:r>
             <w:r>
               <w:rPr>
@@ -2084,7 +2156,7 @@
               <w14:ligatures w14:val="standardContextual"/>
             </w:rPr>
           </w:pPr>
-          <w:hyperlink w:anchor="_Toc211415502" w:history="1">
+          <w:hyperlink w:anchor="_Toc211416513" w:history="1">
             <w:r>
               <w:rPr>
                 <w:rStyle w:val="Hyperlink"/>
@@ -2111,7 +2183,7 @@
                 <w:noProof/>
                 <w:webHidden/>
               </w:rPr>
-              <w:instrText xml:space="preserve"> PAGEREF _Toc211415502 \h </w:instrText>
+              <w:instrText xml:space="preserve"> PAGEREF _Toc211416513 \h </w:instrText>
             </w:r>
             <w:r>
               <w:rPr>
@@ -2131,7 +2203,7 @@
                 <w:noProof/>
                 <w:webHidden/>
               </w:rPr>
-              <w:t>15</w:t>
+              <w:t>17</w:t>
             </w:r>
             <w:r>
               <w:rPr>
@@ -2156,7 +2228,7 @@
               <w14:ligatures w14:val="standardContextual"/>
             </w:rPr>
           </w:pPr>
-          <w:hyperlink w:anchor="_Toc211415503" w:history="1">
+          <w:hyperlink w:anchor="_Toc211416514" w:history="1">
             <w:r>
               <w:rPr>
                 <w:rStyle w:val="Hyperlink"/>
@@ -2183,7 +2255,7 @@
                 <w:noProof/>
                 <w:webHidden/>
               </w:rPr>
-              <w:instrText xml:space="preserve"> PAGEREF _Toc211415503 \h </w:instrText>
+              <w:instrText xml:space="preserve"> PAGEREF _Toc211416514 \h </w:instrText>
             </w:r>
             <w:r>
               <w:rPr>
@@ -2203,7 +2275,7 @@
                 <w:noProof/>
                 <w:webHidden/>
               </w:rPr>
-              <w:t>15</w:t>
+              <w:t>17</w:t>
             </w:r>
             <w:r>
               <w:rPr>
@@ -2228,7 +2300,7 @@
               <w14:ligatures w14:val="standardContextual"/>
             </w:rPr>
           </w:pPr>
-          <w:hyperlink w:anchor="_Toc211415504" w:history="1">
+          <w:hyperlink w:anchor="_Toc211416515" w:history="1">
             <w:r>
               <w:rPr>
                 <w:rStyle w:val="Hyperlink"/>
@@ -2255,7 +2327,7 @@
                 <w:noProof/>
                 <w:webHidden/>
               </w:rPr>
-              <w:instrText xml:space="preserve"> PAGEREF _Toc211415504 \h </w:instrText>
+              <w:instrText xml:space="preserve"> PAGEREF _Toc211416515 \h </w:instrText>
             </w:r>
             <w:r>
               <w:rPr>
@@ -2275,7 +2347,7 @@
                 <w:noProof/>
                 <w:webHidden/>
               </w:rPr>
-              <w:t>16</w:t>
+              <w:t>18</w:t>
             </w:r>
             <w:r>
               <w:rPr>
@@ -2300,7 +2372,7 @@
               <w14:ligatures w14:val="standardContextual"/>
             </w:rPr>
           </w:pPr>
-          <w:hyperlink w:anchor="_Toc211415505" w:history="1">
+          <w:hyperlink w:anchor="_Toc211416516" w:history="1">
             <w:r>
               <w:rPr>
                 <w:rStyle w:val="Hyperlink"/>
@@ -2327,7 +2399,7 @@
                 <w:noProof/>
                 <w:webHidden/>
               </w:rPr>
-              <w:instrText xml:space="preserve"> PAGEREF _Toc211415505 \h </w:instrText>
+              <w:instrText xml:space="preserve"> PAGEREF _Toc211416516 \h </w:instrText>
             </w:r>
             <w:r>
               <w:rPr>
@@ -2347,7 +2419,7 @@
                 <w:noProof/>
                 <w:webHidden/>
               </w:rPr>
-              <w:t>16</w:t>
+              <w:t>18</w:t>
             </w:r>
             <w:r>
               <w:rPr>
@@ -2372,7 +2444,7 @@
               <w14:ligatures w14:val="standardContextual"/>
             </w:rPr>
           </w:pPr>
-          <w:hyperlink w:anchor="_Toc211415506" w:history="1">
+          <w:hyperlink w:anchor="_Toc211416517" w:history="1">
             <w:r>
               <w:rPr>
                 <w:rStyle w:val="Hyperlink"/>
@@ -2399,7 +2471,7 @@
                 <w:noProof/>
                 <w:webHidden/>
               </w:rPr>
-              <w:instrText xml:space="preserve"> PAGEREF _Toc211415506 \h </w:instrText>
+              <w:instrText xml:space="preserve"> PAGEREF _Toc211416517 \h </w:instrText>
             </w:r>
             <w:r>
               <w:rPr>
@@ -2419,7 +2491,7 @@
                 <w:noProof/>
                 <w:webHidden/>
               </w:rPr>
-              <w:t>16</w:t>
+              <w:t>18</w:t>
             </w:r>
             <w:r>
               <w:rPr>
@@ -2444,7 +2516,7 @@
               <w14:ligatures w14:val="standardContextual"/>
             </w:rPr>
           </w:pPr>
-          <w:hyperlink w:anchor="_Toc211415507" w:history="1">
+          <w:hyperlink w:anchor="_Toc211416518" w:history="1">
             <w:r>
               <w:rPr>
                 <w:rStyle w:val="Hyperlink"/>
@@ -2471,7 +2543,7 @@
                 <w:noProof/>
                 <w:webHidden/>
               </w:rPr>
-              <w:instrText xml:space="preserve"> PAGEREF _Toc211415507 \h </w:instrText>
+              <w:instrText xml:space="preserve"> PAGEREF _Toc211416518 \h </w:instrText>
             </w:r>
             <w:r>
               <w:rPr>
@@ -2491,7 +2563,7 @@
                 <w:noProof/>
                 <w:webHidden/>
               </w:rPr>
-              <w:t>17</w:t>
+              <w:t>19</w:t>
             </w:r>
             <w:r>
               <w:rPr>
@@ -2516,7 +2588,7 @@
               <w14:ligatures w14:val="standardContextual"/>
             </w:rPr>
           </w:pPr>
-          <w:hyperlink w:anchor="_Toc211415508" w:history="1">
+          <w:hyperlink w:anchor="_Toc211416519" w:history="1">
             <w:r>
               <w:rPr>
                 <w:rStyle w:val="Hyperlink"/>
@@ -2544,7 +2616,7 @@
                 <w:noProof/>
                 <w:webHidden/>
               </w:rPr>
-              <w:instrText xml:space="preserve"> PAGEREF _Toc211415508 \h </w:instrText>
+              <w:instrText xml:space="preserve"> PAGEREF _Toc211416519 \h </w:instrText>
             </w:r>
             <w:r>
               <w:rPr>
@@ -2564,7 +2636,7 @@
                 <w:noProof/>
                 <w:webHidden/>
               </w:rPr>
-              <w:t>17</w:t>
+              <w:t>19</w:t>
             </w:r>
             <w:r>
               <w:rPr>
@@ -2621,7 +2693,7 @@
           <w:lang w:bidi="pt-PT"/>
         </w:rPr>
       </w:pPr>
-      <w:bookmarkStart w:id="4" w:name="_Toc211415483"/>
+      <w:bookmarkStart w:id="4" w:name="_Toc211416493"/>
       <w:r>
         <w:rPr>
           <w:sz w:val="24"/>
@@ -2646,7 +2718,7 @@
           <w:lang w:bidi="pt-PT"/>
         </w:rPr>
       </w:pPr>
-      <w:bookmarkStart w:id="5" w:name="_Toc211415484"/>
+      <w:bookmarkStart w:id="5" w:name="_Toc211416494"/>
       <w:r>
         <w:rPr>
           <w:lang w:bidi="pt-PT"/>
@@ -2772,7 +2844,7 @@
       <w:pPr>
         <w:pStyle w:val="Heading2"/>
       </w:pPr>
-      <w:bookmarkStart w:id="6" w:name="_Toc211415485"/>
+      <w:bookmarkStart w:id="6" w:name="_Toc211416495"/>
       <w:r>
         <w:t>Opções Estratégicas para o Porto de Sines</w:t>
       </w:r>
@@ -3923,7 +3995,7 @@
       <w:pPr>
         <w:pStyle w:val="Heading2"/>
       </w:pPr>
-      <w:bookmarkStart w:id="7" w:name="_Toc211415486"/>
+      <w:bookmarkStart w:id="7" w:name="_Toc211416496"/>
       <w:r>
         <w:t xml:space="preserve">Ligações e </w:t>
       </w:r>
@@ -4120,7 +4192,7 @@
       <w:pPr>
         <w:pStyle w:val="Heading2"/>
       </w:pPr>
-      <w:bookmarkStart w:id="8" w:name="_Toc211415487"/>
+      <w:bookmarkStart w:id="8" w:name="_Toc211416497"/>
       <w:r>
         <w:t>Estatísticas</w:t>
       </w:r>
@@ -4137,7 +4209,7 @@
           <w:szCs w:val="20"/>
         </w:rPr>
       </w:pPr>
-      <w:bookmarkStart w:id="9" w:name="_Toc211415488"/>
+      <w:bookmarkStart w:id="9" w:name="_Toc211416498"/>
       <w:r>
         <w:rPr>
           <w:b/>
@@ -4528,7 +4600,7 @@
           <w:szCs w:val="20"/>
         </w:rPr>
       </w:pPr>
-      <w:bookmarkStart w:id="10" w:name="_Toc211415489"/>
+      <w:bookmarkStart w:id="10" w:name="_Toc211416499"/>
       <w:r>
         <w:rPr>
           <w:b/>
@@ -4929,7 +5001,7 @@
           <w:szCs w:val="20"/>
         </w:rPr>
       </w:pPr>
-      <w:bookmarkStart w:id="11" w:name="_Toc211415490"/>
+      <w:bookmarkStart w:id="11" w:name="_Toc211416500"/>
       <w:r>
         <w:rPr>
           <w:b/>
@@ -5111,7 +5183,7 @@
       <w:pPr>
         <w:pStyle w:val="Heading1"/>
       </w:pPr>
-      <w:bookmarkStart w:id="12" w:name="_Toc211415491"/>
+      <w:bookmarkStart w:id="12" w:name="_Toc211416501"/>
       <w:r>
         <w:t>Parte I – Introdução e estrutura do trabalho</w:t>
       </w:r>
@@ -5122,7 +5194,7 @@
       <w:pPr>
         <w:pStyle w:val="Heading2"/>
       </w:pPr>
-      <w:bookmarkStart w:id="13" w:name="_Toc211415492"/>
+      <w:bookmarkStart w:id="13" w:name="_Toc211416502"/>
       <w:r>
         <w:t>I.1 Caracterização da organização</w:t>
       </w:r>
@@ -5222,7 +5294,7 @@
       <w:pPr>
         <w:pStyle w:val="Heading2"/>
       </w:pPr>
-      <w:bookmarkStart w:id="14" w:name="_Toc211415493"/>
+      <w:bookmarkStart w:id="14" w:name="_Toc211416503"/>
       <w:r>
         <w:t>I.2 Fontes de informação</w:t>
       </w:r>
@@ -5247,7 +5319,7 @@
           <w:szCs w:val="22"/>
         </w:rPr>
       </w:pPr>
-      <w:bookmarkStart w:id="15" w:name="_Toc211415494"/>
+      <w:bookmarkStart w:id="15" w:name="_Toc211416504"/>
       <w:r>
         <w:t xml:space="preserve">Parte II – </w:t>
       </w:r>
@@ -5261,7 +5333,7 @@
       <w:pPr>
         <w:pStyle w:val="Heading2"/>
       </w:pPr>
-      <w:bookmarkStart w:id="16" w:name="_Toc211415495"/>
+      <w:bookmarkStart w:id="16" w:name="_Toc211416505"/>
       <w:r>
         <w:t>II.</w:t>
       </w:r>
@@ -5279,12 +5351,136 @@
         <w:t xml:space="preserve"> </w:t>
       </w:r>
     </w:p>
+    <w:p>
+      <w:pPr>
+        <w:pStyle w:val="Heading3"/>
+        <w:rPr>
+          <w:b/>
+          <w:bCs/>
+          <w:color w:val="auto"/>
+          <w:sz w:val="20"/>
+          <w:szCs w:val="20"/>
+        </w:rPr>
+      </w:pPr>
+      <w:bookmarkStart w:id="17" w:name="_Toc211333575"/>
+      <w:bookmarkStart w:id="18" w:name="_Toc211416506"/>
+      <w:r>
+        <w:rPr>
+          <w:b/>
+          <w:bCs/>
+          <w:color w:val="auto"/>
+          <w:sz w:val="20"/>
+          <w:szCs w:val="20"/>
+        </w:rPr>
+        <w:t>Estrutura organizacional</w:t>
+      </w:r>
+      <w:bookmarkEnd w:id="17"/>
+      <w:bookmarkEnd w:id="18"/>
+    </w:p>
     <w:p/>
     <w:p>
+      <w:r>
+        <w:t>Tal como referido anteriormente, a</w:t>
+      </w:r>
+      <w:r>
+        <w:t xml:space="preserve"> Administração dos Portos de Sines e do Algarve, S.A. (APS) é uma sociedade anónima de capitais públicos, detida a 100% pelo Estado Português, sob tutela do Ministério das Infraestruturas e da Habitação. O órgão de superintendência é o Conselho de Administração, apoiado por várias unidades de suporte técnico e operacional.</w:t>
+      </w:r>
+    </w:p>
+    <w:p>
+      <w:r>
+        <w:t>De acordo com a informação institucional disponibilizada no site oficial da APS, a organização apresenta uma estrutura hierárquica formal e funcional, com departamentalização por funções. Entre as principais áreas destacam-se:</w:t>
+      </w:r>
+    </w:p>
+    <w:p>
+      <w:pPr>
+        <w:numPr>
+          <w:ilvl w:val="0"/>
+          <w:numId w:val="23"/>
+        </w:numPr>
+      </w:pPr>
+      <w:r>
+        <w:t>Direção de Administração e Finanças, responsável pela gestão orçamental, financeira e patrimonial;</w:t>
+      </w:r>
+    </w:p>
+    <w:p>
+      <w:pPr>
+        <w:numPr>
+          <w:ilvl w:val="0"/>
+          <w:numId w:val="23"/>
+        </w:numPr>
+      </w:pPr>
+      <w:r>
+        <w:t>Direção de Desenvolvimento e Sustentabilidade, encarregada de planeamento estratégico, ambiente e inovação;</w:t>
+      </w:r>
+    </w:p>
+    <w:p>
+      <w:pPr>
+        <w:numPr>
+          <w:ilvl w:val="0"/>
+          <w:numId w:val="23"/>
+        </w:numPr>
+      </w:pPr>
+      <w:r>
+        <w:t>Direção de Operações Portuárias, focada na coordenação das atividades marítimo-portuárias;</w:t>
+      </w:r>
+    </w:p>
+    <w:p>
+      <w:pPr>
+        <w:numPr>
+          <w:ilvl w:val="0"/>
+          <w:numId w:val="23"/>
+        </w:numPr>
+      </w:pPr>
+      <w:r>
+        <w:t>Direção de Engenharia e Manutenção, que assegura a gestão de infraestruturas e projetos;</w:t>
+      </w:r>
+    </w:p>
+    <w:p>
+      <w:pPr>
+        <w:numPr>
+          <w:ilvl w:val="0"/>
+          <w:numId w:val="23"/>
+        </w:numPr>
+      </w:pPr>
+      <w:r>
+        <w:t>Serviços Jurídicos e de Auditoria Interna, com funções de controlo e conformidade.</w:t>
+      </w:r>
+    </w:p>
+    <w:p>
+      <w:r>
+        <w:t>O organograma disponível evidencia uma cadeia de comando clara, composta por três níveis hierárquicos principais: Conselho de Administração, Direções e Departamentos/Serviços Técnicos. Esta estrutura favorece a coordenação e o controlo operacional, sendo adequada a uma entidade pública com funções estratégicas de interesse nacional.</w:t>
+      </w:r>
+    </w:p>
+    <w:p>
+      <w:r>
+        <w:t>Em termos de posições de linha e de staff, observa-se que as Direções Operacionais e de Engenharia desempenham papéis de linha, diretamente ligados à execução e gestão portuária, enquanto as áreas de apoio (como Jurídico, Comunicação, Financeira e Recursos Humanos) assumem funções de staff, fornecendo suporte especializado à tomada de decisão.</w:t>
+      </w:r>
+    </w:p>
+    <w:p>
+      <w:r>
+        <w:t>Quanto à flexibilidade e capacidade de adaptação, a APS demonstra um equilíbrio entre rigidez administrativa, típica de entidades públicas sujeitas a regulamentação estatal, e uma crescente abertura à inovação, sobretudo nas áreas de sustentabilidade, digitalização e logística inteligente. A adesão a normas ISO (9001, 14001, 45001) e a integração em redes internacionais de portos sustentáveis refletem essa capacidade de modernização.</w:t>
+      </w:r>
+    </w:p>
+    <w:p>
+      <w:r>
+        <w:t>No entanto, a estrutura formal ainda apresenta características de centralização decisória, com decisões estratégicas concentradas no Conselho de Administração. Apesar disso, há evidências de estruturas informais de cooperação entre direções, especialmente em projetos transversais (por exemplo, iniciativas de eficiência energética ou de transformação digital). Esta articulação informal tem contribuído para maior agilidade na resposta a desafios emergentes, como os associados à transição verde e à digitalização dos processos portuários.</w:t>
+      </w:r>
+    </w:p>
+    <w:p>
+      <w:r>
+        <w:t>Concluindo</w:t>
+      </w:r>
+      <w:r>
+        <w:t>, a APS possui uma estrutura funcional hierarquizada, estável e tecnicamente orientada, adequada à natureza pública da organização, mas que enfrenta o desafio de equilibrar a conformidade administrativa com a necessidade de inovação e flexibilidade no setor portuário moderno.</w:t>
+      </w:r>
+    </w:p>
+    <w:p/>
+    <w:p/>
+    <w:p>
       <w:pPr>
         <w:pStyle w:val="Heading2"/>
       </w:pPr>
-      <w:bookmarkStart w:id="17" w:name="_Toc211415496"/>
+      <w:bookmarkStart w:id="19" w:name="_Toc211416507"/>
       <w:r>
         <w:t>II.</w:t>
       </w:r>
@@ -5297,7 +5493,7 @@
       <w:r>
         <w:t>Planeamento</w:t>
       </w:r>
-      <w:bookmarkEnd w:id="17"/>
+      <w:bookmarkEnd w:id="19"/>
     </w:p>
     <w:p>
       <w:pPr>
@@ -5320,7 +5516,7 @@
       <w:pPr>
         <w:pStyle w:val="Heading2"/>
       </w:pPr>
-      <w:bookmarkStart w:id="18" w:name="_Toc211415497"/>
+      <w:bookmarkStart w:id="20" w:name="_Toc211416508"/>
       <w:r>
         <w:t>II.</w:t>
       </w:r>
@@ -5333,14 +5529,14 @@
       <w:r>
         <w:t xml:space="preserve"> e Sistemas de informação</w:t>
       </w:r>
-      <w:bookmarkEnd w:id="18"/>
+      <w:bookmarkEnd w:id="20"/>
     </w:p>
     <w:p/>
     <w:p>
       <w:pPr>
         <w:pStyle w:val="Heading2"/>
       </w:pPr>
-      <w:bookmarkStart w:id="19" w:name="_Toc211415498"/>
+      <w:bookmarkStart w:id="21" w:name="_Toc211416509"/>
       <w:r>
         <w:t>II</w:t>
       </w:r>
@@ -5365,50 +5561,50 @@
       <w:r>
         <w:t>Pessoas</w:t>
       </w:r>
-      <w:bookmarkEnd w:id="19"/>
+      <w:bookmarkEnd w:id="21"/>
     </w:p>
     <w:p/>
     <w:p>
       <w:pPr>
         <w:pStyle w:val="Heading2"/>
       </w:pPr>
-      <w:bookmarkStart w:id="20" w:name="_Toc211415499"/>
+      <w:bookmarkStart w:id="22" w:name="_Toc211416510"/>
       <w:r>
         <w:t>II.5 Promoção da produtividade</w:t>
       </w:r>
-      <w:bookmarkEnd w:id="20"/>
+      <w:bookmarkEnd w:id="22"/>
     </w:p>
     <w:p/>
     <w:p>
       <w:pPr>
         <w:pStyle w:val="Heading2"/>
       </w:pPr>
-      <w:bookmarkStart w:id="21" w:name="_Toc211415500"/>
+      <w:bookmarkStart w:id="23" w:name="_Toc211416511"/>
       <w:r>
         <w:t>II.6 Economia circular</w:t>
       </w:r>
-      <w:bookmarkEnd w:id="21"/>
+      <w:bookmarkEnd w:id="23"/>
     </w:p>
     <w:p/>
     <w:p>
       <w:pPr>
         <w:pStyle w:val="Heading2"/>
       </w:pPr>
-      <w:bookmarkStart w:id="22" w:name="_Toc211415501"/>
+      <w:bookmarkStart w:id="24" w:name="_Toc211416512"/>
       <w:r>
         <w:t xml:space="preserve">II.7 </w:t>
       </w:r>
       <w:r>
         <w:t>Marketing</w:t>
       </w:r>
-      <w:bookmarkEnd w:id="22"/>
+      <w:bookmarkEnd w:id="24"/>
     </w:p>
     <w:p/>
     <w:p>
       <w:pPr>
         <w:pStyle w:val="Heading2"/>
       </w:pPr>
-      <w:bookmarkStart w:id="23" w:name="_Toc211415502"/>
+      <w:bookmarkStart w:id="25" w:name="_Toc211416513"/>
       <w:r>
         <w:t>II.</w:t>
       </w:r>
@@ -5427,14 +5623,14 @@
       <w:r>
         <w:t>Financeira</w:t>
       </w:r>
-      <w:bookmarkEnd w:id="23"/>
+      <w:bookmarkEnd w:id="25"/>
     </w:p>
     <w:p/>
     <w:p>
       <w:pPr>
         <w:pStyle w:val="Heading2"/>
       </w:pPr>
-      <w:bookmarkStart w:id="24" w:name="_Toc211415503"/>
+      <w:bookmarkStart w:id="26" w:name="_Toc211416514"/>
       <w:r>
         <w:t>II.</w:t>
       </w:r>
@@ -5450,7 +5646,7 @@
       <w:r>
         <w:t xml:space="preserve"> e Indústria 4.0</w:t>
       </w:r>
-      <w:bookmarkEnd w:id="24"/>
+      <w:bookmarkEnd w:id="26"/>
     </w:p>
     <w:p/>
     <w:p>
@@ -5474,11 +5670,11 @@
           <w:szCs w:val="22"/>
         </w:rPr>
       </w:pPr>
-      <w:bookmarkStart w:id="25" w:name="_Toc211415504"/>
+      <w:bookmarkStart w:id="27" w:name="_Toc211416515"/>
       <w:r>
         <w:t>Parte III – Conclusão</w:t>
       </w:r>
-      <w:bookmarkEnd w:id="25"/>
+      <w:bookmarkEnd w:id="27"/>
     </w:p>
     <w:p>
       <w:pPr>
@@ -5491,22 +5687,22 @@
       <w:pPr>
         <w:pStyle w:val="Heading2"/>
       </w:pPr>
-      <w:bookmarkStart w:id="26" w:name="_Toc211415505"/>
+      <w:bookmarkStart w:id="28" w:name="_Toc211416516"/>
       <w:r>
         <w:t>III.1 Conclusão</w:t>
       </w:r>
-      <w:bookmarkEnd w:id="26"/>
+      <w:bookmarkEnd w:id="28"/>
     </w:p>
     <w:p/>
     <w:p>
       <w:pPr>
         <w:pStyle w:val="Heading2"/>
       </w:pPr>
-      <w:bookmarkStart w:id="27" w:name="_Toc211415506"/>
+      <w:bookmarkStart w:id="29" w:name="_Toc211416517"/>
       <w:r>
         <w:t>III.2 Sugestões de melhoria</w:t>
       </w:r>
-      <w:bookmarkEnd w:id="27"/>
+      <w:bookmarkEnd w:id="29"/>
     </w:p>
     <w:p>
       <w:pPr>
@@ -5516,13 +5712,13 @@
       <w:r>
         <w:br w:type="page"/>
       </w:r>
-      <w:bookmarkStart w:id="28" w:name="_Toc471979356"/>
-      <w:bookmarkStart w:id="29" w:name="_Toc211415507"/>
+      <w:bookmarkStart w:id="30" w:name="_Toc471979356"/>
+      <w:bookmarkStart w:id="31" w:name="_Toc211416518"/>
       <w:r>
         <w:t>Referências</w:t>
       </w:r>
-      <w:bookmarkEnd w:id="28"/>
-      <w:bookmarkEnd w:id="29"/>
+      <w:bookmarkEnd w:id="30"/>
+      <w:bookmarkEnd w:id="31"/>
     </w:p>
     <w:p/>
     <w:p>
@@ -5533,16 +5729,16 @@
           <w:rFonts w:eastAsia="Arial Narrow"/>
         </w:rPr>
       </w:pPr>
-      <w:bookmarkStart w:id="30" w:name="_Toc471979357"/>
-      <w:bookmarkStart w:id="31" w:name="_Toc211415508"/>
+      <w:bookmarkStart w:id="32" w:name="_Toc471979357"/>
+      <w:bookmarkStart w:id="33" w:name="_Toc211416519"/>
       <w:r>
         <w:rPr>
           <w:rFonts w:eastAsia="Arial Narrow"/>
         </w:rPr>
         <w:t>Anexos</w:t>
       </w:r>
-      <w:bookmarkEnd w:id="30"/>
-      <w:bookmarkEnd w:id="31"/>
+      <w:bookmarkEnd w:id="32"/>
+      <w:bookmarkEnd w:id="33"/>
       <w:r>
         <w:rPr>
           <w:rFonts w:eastAsia="Arial Narrow"/>

</xml_diff>

<commit_message>
US 2.3.3 - improvement proposal (#18)
</commit_message>
<xml_diff>
--- a/docs/client_analysis/report_APS.docx
+++ b/docs/client_analysis/report_APS.docx
@@ -3331,21 +3331,7 @@
         <w:rPr>
           <w:color w:val="auto"/>
         </w:rPr>
-        <w:t xml:space="preserve"> - </w:t>
-      </w:r>
-      <w:proofErr w:type="spellStart"/>
-      <w:r>
-        <w:rPr>
-          <w:color w:val="auto"/>
-        </w:rPr>
-        <w:t>Legacy</w:t>
-      </w:r>
-      <w:proofErr w:type="spellEnd"/>
-      <w:r>
-        <w:rPr>
-          <w:color w:val="auto"/>
-        </w:rPr>
-        <w:t xml:space="preserve"> (riscos estratégicos)</w:t>
+        <w:t xml:space="preserve"> - Legacy (riscos estratégicos)</w:t>
       </w:r>
     </w:p>
     <w:p>
@@ -3568,21 +3554,7 @@
         <w:rPr>
           <w:color w:val="auto"/>
         </w:rPr>
-        <w:t xml:space="preserve"> - </w:t>
-      </w:r>
-      <w:proofErr w:type="spellStart"/>
-      <w:r>
-        <w:rPr>
-          <w:color w:val="auto"/>
-        </w:rPr>
-        <w:t>Enablers</w:t>
-      </w:r>
-      <w:proofErr w:type="spellEnd"/>
-      <w:r>
-        <w:rPr>
-          <w:color w:val="auto"/>
-        </w:rPr>
-        <w:t xml:space="preserve"> de competitividade (recursos e competências)</w:t>
+        <w:t xml:space="preserve"> - Enablers de competitividade (recursos e competências)</w:t>
       </w:r>
     </w:p>
     <w:p/>
@@ -3713,21 +3685,7 @@
         <w:rPr>
           <w:color w:val="auto"/>
         </w:rPr>
-        <w:t xml:space="preserve"> - Visão dos </w:t>
-      </w:r>
-      <w:proofErr w:type="spellStart"/>
-      <w:r>
-        <w:rPr>
-          <w:color w:val="auto"/>
-        </w:rPr>
-        <w:t>Stakeholders</w:t>
-      </w:r>
-      <w:proofErr w:type="spellEnd"/>
-      <w:r>
-        <w:rPr>
-          <w:color w:val="auto"/>
-        </w:rPr>
-        <w:t xml:space="preserve"> (competitividade</w:t>
+        <w:t xml:space="preserve"> - Visão dos Stakeholders (competitividade</w:t>
       </w:r>
       <w:r>
         <w:rPr>
@@ -3845,21 +3803,7 @@
         <w:rPr>
           <w:color w:val="auto"/>
         </w:rPr>
-        <w:t xml:space="preserve"> - Visão dos </w:t>
-      </w:r>
-      <w:proofErr w:type="spellStart"/>
-      <w:r>
-        <w:rPr>
-          <w:color w:val="auto"/>
-        </w:rPr>
-        <w:t>Stakeholders</w:t>
-      </w:r>
-      <w:proofErr w:type="spellEnd"/>
-      <w:r>
-        <w:rPr>
-          <w:color w:val="auto"/>
-        </w:rPr>
-        <w:t xml:space="preserve"> (cooperação)</w:t>
+        <w:t xml:space="preserve"> - Visão dos Stakeholders (cooperação)</w:t>
       </w:r>
     </w:p>
     <w:p>
@@ -3967,21 +3911,7 @@
         <w:rPr>
           <w:color w:val="auto"/>
         </w:rPr>
-        <w:t xml:space="preserve"> - Visão dos </w:t>
-      </w:r>
-      <w:proofErr w:type="spellStart"/>
-      <w:r>
-        <w:rPr>
-          <w:color w:val="auto"/>
-        </w:rPr>
-        <w:t>Stakeholders</w:t>
-      </w:r>
-      <w:proofErr w:type="spellEnd"/>
-      <w:r>
-        <w:rPr>
-          <w:color w:val="auto"/>
-        </w:rPr>
-        <w:t xml:space="preserve"> (expectativas)</w:t>
+        <w:t xml:space="preserve"> - Visão dos Stakeholders (expectativas)</w:t>
       </w:r>
     </w:p>
     <w:p>
@@ -3997,17 +3927,12 @@
       </w:pPr>
       <w:bookmarkStart w:id="7" w:name="_Toc211416496"/>
       <w:r>
-        <w:t xml:space="preserve">Ligações e </w:t>
-      </w:r>
-      <w:proofErr w:type="spellStart"/>
-      <w:r>
-        <w:t>Hi</w:t>
+        <w:t>Ligações e Hi</w:t>
       </w:r>
       <w:r>
         <w:t>nterland</w:t>
       </w:r>
       <w:bookmarkEnd w:id="7"/>
-      <w:proofErr w:type="spellEnd"/>
     </w:p>
     <w:p>
       <w:pPr>
@@ -4136,21 +4061,7 @@
         <w:rPr>
           <w:color w:val="auto"/>
         </w:rPr>
-        <w:t xml:space="preserve"> - Ligações estratégicas do Porto de Sines: acessos marítimos globais e </w:t>
-      </w:r>
-      <w:proofErr w:type="spellStart"/>
-      <w:r>
-        <w:rPr>
-          <w:color w:val="auto"/>
-        </w:rPr>
-        <w:t>hinterland</w:t>
-      </w:r>
-      <w:proofErr w:type="spellEnd"/>
-      <w:r>
-        <w:rPr>
-          <w:color w:val="auto"/>
-        </w:rPr>
-        <w:t xml:space="preserve"> ibéric</w:t>
+        <w:t xml:space="preserve"> - Ligações estratégicas do Porto de Sines: acessos marítimos globais e hinterland ibéric</w:t>
       </w:r>
       <w:r>
         <w:rPr>
@@ -5207,15 +5118,7 @@
     </w:p>
     <w:p>
       <w:r>
-        <w:t xml:space="preserve">A APS tem como missão administrar, conservar e desenvolver os portos sob a sua responsabilidade, promovendo serviços eficientes, seguros e sustentáveis. O seu objetivo estratégico é consolidar o Porto de Sines como um </w:t>
-      </w:r>
-      <w:proofErr w:type="spellStart"/>
-      <w:r>
-        <w:t>hub</w:t>
-      </w:r>
-      <w:proofErr w:type="spellEnd"/>
-      <w:r>
-        <w:t xml:space="preserve"> logístico, energético e industrial de referência no Atlântico, enquanto reforça a importância dos Portos de Faro e Portimão como infraestruturas de apoio ao turismo de cruzeiros e ao transporte marítimo regional.</w:t>
+        <w:t>A APS tem como missão administrar, conservar e desenvolver os portos sob a sua responsabilidade, promovendo serviços eficientes, seguros e sustentáveis. O seu objetivo estratégico é consolidar o Porto de Sines como um hub logístico, energético e industrial de referência no Atlântico, enquanto reforça a importância dos Portos de Faro e Portimão como infraestruturas de apoio ao turismo de cruzeiros e ao transporte marítimo regional.</w:t>
       </w:r>
     </w:p>
     <w:p>
@@ -5235,36 +5138,12 @@
     </w:p>
     <w:p>
       <w:r>
-        <w:t xml:space="preserve">Em termos de indicadores-chave, o Porto de Sines movimenta anualmente mais de 50 milhões de toneladas de carga, representando uma parcela expressiva do comércio externo nacional. É líder em movimentação de contentores em Portugal, com cerca de 65% das operações correspondentes a </w:t>
-      </w:r>
-      <w:proofErr w:type="spellStart"/>
-      <w:r>
-        <w:t>transshipment</w:t>
-      </w:r>
-      <w:proofErr w:type="spellEnd"/>
-      <w:r>
-        <w:t xml:space="preserve"> (transbordo). A APS emprega cerca de 200 colaboradores, e o ecossistema portuário sob a sua administração envolve milhares de empregos indiretos.</w:t>
-      </w:r>
-    </w:p>
-    <w:p>
-      <w:r>
-        <w:t xml:space="preserve">Entre os seus principais parceiros e </w:t>
-      </w:r>
-      <w:proofErr w:type="spellStart"/>
-      <w:r>
-        <w:t>stakeholders</w:t>
-      </w:r>
-      <w:proofErr w:type="spellEnd"/>
-      <w:r>
-        <w:t xml:space="preserve"> encontram-se o Governo </w:t>
-      </w:r>
-      <w:proofErr w:type="gramStart"/>
-      <w:r>
-        <w:t>Português</w:t>
-      </w:r>
-      <w:proofErr w:type="gramEnd"/>
-      <w:r>
-        <w:t xml:space="preserve">, as </w:t>
+        <w:t>Em termos de indicadores-chave, o Porto de Sines movimenta anualmente mais de 50 milhões de toneladas de carga, representando uma parcela expressiva do comércio externo nacional. É líder em movimentação de contentores em Portugal, com cerca de 65% das operações correspondentes a transshipment (transbordo). A APS emprega cerca de 200 colaboradores, e o ecossistema portuário sob a sua administração envolve milhares de empregos indiretos.</w:t>
+      </w:r>
+    </w:p>
+    <w:p>
+      <w:r>
+        <w:t xml:space="preserve">Entre os seus principais parceiros e stakeholders encontram-se o Governo Português, as </w:t>
       </w:r>
       <w:r>
         <w:t xml:space="preserve">concessionárias </w:t>
@@ -5273,15 +5152,7 @@
         <w:t>de</w:t>
       </w:r>
       <w:r>
-        <w:t xml:space="preserve"> terminais (como a PSA Sines e a REN Atlântico), empresas energéticas e industriais (Galp, Repsol, EDP, entre outras), operadores logísticos, municípios e entidades locais. A APS adota sistemas de gestão certificados nas áreas da qualidade, ambiente e segurança, seguindo normas internacionais (ISO 9001, ISO 14001, ISO 45001), e mantém políticas de </w:t>
-      </w:r>
-      <w:proofErr w:type="spellStart"/>
-      <w:r>
-        <w:t>compliance</w:t>
-      </w:r>
-      <w:proofErr w:type="spellEnd"/>
-      <w:r>
-        <w:t xml:space="preserve"> e transparência alinhadas com os princípios de bom governo corporativo.</w:t>
+        <w:t xml:space="preserve"> terminais (como a PSA Sines e a REN Atlântico), empresas energéticas e industriais (Galp, Repsol, EDP, entre outras), operadores logísticos, municípios e entidades locais. A APS adota sistemas de gestão certificados nas áreas da qualidade, ambiente e segurança, seguindo normas internacionais (ISO 9001, ISO 14001, ISO 45001), e mantém políticas de compliance e transparência alinhadas com os princípios de bom governo corporativo.</w:t>
       </w:r>
     </w:p>
     <w:p>
@@ -5377,7 +5248,6 @@
       <w:bookmarkEnd w:id="17"/>
       <w:bookmarkEnd w:id="18"/>
     </w:p>
-    <w:p/>
     <w:p>
       <w:r>
         <w:t>Tal como referido anteriormente, a</w:t>
@@ -5475,12 +5345,205 @@
       </w:r>
     </w:p>
     <w:p/>
+    <w:p>
+      <w:pPr>
+        <w:pStyle w:val="Heading3"/>
+        <w:rPr>
+          <w:b/>
+          <w:bCs/>
+          <w:color w:val="auto"/>
+          <w:sz w:val="20"/>
+          <w:szCs w:val="20"/>
+        </w:rPr>
+      </w:pPr>
+      <w:bookmarkStart w:id="19" w:name="_Toc211333576"/>
+      <w:r>
+        <w:rPr>
+          <w:b/>
+          <w:bCs/>
+          <w:color w:val="auto"/>
+          <w:sz w:val="20"/>
+          <w:szCs w:val="20"/>
+        </w:rPr>
+        <w:t>Proposta de melhoria</w:t>
+      </w:r>
+      <w:bookmarkEnd w:id="19"/>
+    </w:p>
+    <w:p>
+      <w:r>
+        <w:t>Com base na análise anterior, identificam-se algumas oportunidades de melhoria na estrutura e nos processos internos da APS, de modo a aumentar a eficiência organizacional, a agilidade decisória e a capacidade de adaptação tecnológica.</w:t>
+      </w:r>
+    </w:p>
+    <w:p>
+      <w:r>
+        <w:t>1. Criação de uma Unidade de Transformação Digital (UTD)</w:t>
+      </w:r>
+    </w:p>
+    <w:p>
+      <w:pPr>
+        <w:numPr>
+          <w:ilvl w:val="0"/>
+          <w:numId w:val="24"/>
+        </w:numPr>
+      </w:pPr>
+      <w:r>
+        <w:t>Justificação: A APS tem vindo a investir em inovação e sustentabilidade, mas a gestão digital ainda se encontra distribuída entre diferentes departamentos. Uma UTD dedicada permitiria coordenar projetos de automação, sistemas de informação e segurança cibernética, promovendo uma estratégia digital integrada.</w:t>
+      </w:r>
+    </w:p>
+    <w:p>
+      <w:pPr>
+        <w:numPr>
+          <w:ilvl w:val="0"/>
+          <w:numId w:val="24"/>
+        </w:numPr>
+      </w:pPr>
+      <w:r>
+        <w:t>Ação recomendada: Reestruturação parcial da Direção de Desenvolvimento e Sustentabilidade, incorporando uma equipa multidisciplinar focada em transformação digital.</w:t>
+      </w:r>
+    </w:p>
+    <w:p>
+      <w:pPr>
+        <w:numPr>
+          <w:ilvl w:val="0"/>
+          <w:numId w:val="24"/>
+        </w:numPr>
+      </w:pPr>
+      <w:r>
+        <w:t>Impacto esperado: Maior coerência entre os sistemas tecnológicos, aumento da eficiência dos fluxos informacionais e suporte direto à inovação portuária.</w:t>
+      </w:r>
+    </w:p>
+    <w:p>
+      <w:r>
+        <w:t>2. Descentralização controlada da tomada de decisão operacional</w:t>
+      </w:r>
+    </w:p>
+    <w:p>
+      <w:pPr>
+        <w:numPr>
+          <w:ilvl w:val="0"/>
+          <w:numId w:val="25"/>
+        </w:numPr>
+      </w:pPr>
+      <w:r>
+        <w:t>Justificação: A centralização excessiva no Conselho de Administração pode atrasar decisões operacionais de menor impacto estratégico.</w:t>
+      </w:r>
+    </w:p>
+    <w:p>
+      <w:pPr>
+        <w:numPr>
+          <w:ilvl w:val="0"/>
+          <w:numId w:val="25"/>
+        </w:numPr>
+      </w:pPr>
+      <w:r>
+        <w:t>Ação recomendada: Delegar competências específicas às Direções de Operações e Engenharia, estabelecendo limites claros de autonomia.</w:t>
+      </w:r>
+    </w:p>
+    <w:p>
+      <w:pPr>
+        <w:numPr>
+          <w:ilvl w:val="0"/>
+          <w:numId w:val="25"/>
+        </w:numPr>
+      </w:pPr>
+      <w:r>
+        <w:t>Impacto esperado: Aceleração da execução de projetos, melhoria da resposta operacional e aumento do envolvimento das equipas técnicas.</w:t>
+      </w:r>
+    </w:p>
+    <w:p>
+      <w:r>
+        <w:t>3. Reforço das equipas de staff com perfis especializados em análise de dados e sustentabilidade</w:t>
+      </w:r>
+    </w:p>
+    <w:p>
+      <w:pPr>
+        <w:numPr>
+          <w:ilvl w:val="0"/>
+          <w:numId w:val="26"/>
+        </w:numPr>
+      </w:pPr>
+      <w:r>
+        <w:t>Justificação: A crescente exigência de relatórios de desempenho ambiental e indicadores logísticos requer competências analíticas avançadas.</w:t>
+      </w:r>
+    </w:p>
+    <w:p>
+      <w:pPr>
+        <w:numPr>
+          <w:ilvl w:val="0"/>
+          <w:numId w:val="26"/>
+        </w:numPr>
+      </w:pPr>
+      <w:r>
+        <w:t>Ação recomendada: Recrutamento de analistas de dados e especialistas em ESG (Environmental, Social and Governance).</w:t>
+      </w:r>
+    </w:p>
+    <w:p>
+      <w:pPr>
+        <w:numPr>
+          <w:ilvl w:val="0"/>
+          <w:numId w:val="26"/>
+        </w:numPr>
+      </w:pPr>
+      <w:r>
+        <w:t>Impacto esperado: Melhoria da qualidade da informação estratégica e fortalecimento da reputação institucional.</w:t>
+      </w:r>
+    </w:p>
+    <w:p>
+      <w:r>
+        <w:t>4. Implementação de um sistema interno de comunicação e inovação colaborativa</w:t>
+      </w:r>
+    </w:p>
+    <w:p>
+      <w:pPr>
+        <w:numPr>
+          <w:ilvl w:val="0"/>
+          <w:numId w:val="27"/>
+        </w:numPr>
+      </w:pPr>
+      <w:r>
+        <w:t>Justificação: As estruturas informais existentes poderiam ser formalizadas através de um canal digital interno (plataforma colaborativa) que promova a partilha de ideias e boas práticas.</w:t>
+      </w:r>
+    </w:p>
+    <w:p>
+      <w:pPr>
+        <w:numPr>
+          <w:ilvl w:val="0"/>
+          <w:numId w:val="27"/>
+        </w:numPr>
+      </w:pPr>
+      <w:r>
+        <w:t>Ação recomendada: Desenvolvimento ou adoção de uma plataforma de gestão de conhecimento.</w:t>
+      </w:r>
+    </w:p>
+    <w:p>
+      <w:pPr>
+        <w:numPr>
+          <w:ilvl w:val="0"/>
+          <w:numId w:val="27"/>
+        </w:numPr>
+      </w:pPr>
+      <w:r>
+        <w:t>Impacto esperado: Aumento do envolvimento dos colaboradores e fomento de uma cultura de melhoria contínua.</w:t>
+      </w:r>
+    </w:p>
+    <w:p>
+      <w:r>
+        <w:t>Para concluir, a</w:t>
+      </w:r>
+      <w:r>
+        <w:t xml:space="preserve"> APS apresenta uma estrutura sólida, eficiente e compatível com o seu papel institucional. Contudo, a evolução do setor portuário europeu e os desafios da transição digital e energética tornam necessário um modelo mais descentralizado, colaborativo e orientado à inovação. As propostas apresentadas são realistas, alinhadas com a estratégia da empresa e focadas em ganhos de eficiência, modernização e sustentabilidade</w:t>
+      </w:r>
+      <w:r>
+        <w:t>.</w:t>
+      </w:r>
+    </w:p>
     <w:p/>
+    <w:p/>
     <w:p>
       <w:pPr>
         <w:pStyle w:val="Heading2"/>
       </w:pPr>
-      <w:bookmarkStart w:id="19" w:name="_Toc211416507"/>
+      <w:bookmarkStart w:id="20" w:name="_Toc211416507"/>
       <w:r>
         <w:t>II.</w:t>
       </w:r>
@@ -5493,7 +5556,7 @@
       <w:r>
         <w:t>Planeamento</w:t>
       </w:r>
-      <w:bookmarkEnd w:id="19"/>
+      <w:bookmarkEnd w:id="20"/>
     </w:p>
     <w:p>
       <w:pPr>
@@ -5516,7 +5579,7 @@
       <w:pPr>
         <w:pStyle w:val="Heading2"/>
       </w:pPr>
-      <w:bookmarkStart w:id="20" w:name="_Toc211416508"/>
+      <w:bookmarkStart w:id="21" w:name="_Toc211416508"/>
       <w:r>
         <w:t>II.</w:t>
       </w:r>
@@ -5529,14 +5592,14 @@
       <w:r>
         <w:t xml:space="preserve"> e Sistemas de informação</w:t>
       </w:r>
-      <w:bookmarkEnd w:id="20"/>
+      <w:bookmarkEnd w:id="21"/>
     </w:p>
     <w:p/>
     <w:p>
       <w:pPr>
         <w:pStyle w:val="Heading2"/>
       </w:pPr>
-      <w:bookmarkStart w:id="21" w:name="_Toc211416509"/>
+      <w:bookmarkStart w:id="22" w:name="_Toc211416509"/>
       <w:r>
         <w:t>II</w:t>
       </w:r>
@@ -5561,50 +5624,50 @@
       <w:r>
         <w:t>Pessoas</w:t>
       </w:r>
-      <w:bookmarkEnd w:id="21"/>
+      <w:bookmarkEnd w:id="22"/>
     </w:p>
     <w:p/>
     <w:p>
       <w:pPr>
         <w:pStyle w:val="Heading2"/>
       </w:pPr>
-      <w:bookmarkStart w:id="22" w:name="_Toc211416510"/>
+      <w:bookmarkStart w:id="23" w:name="_Toc211416510"/>
       <w:r>
         <w:t>II.5 Promoção da produtividade</w:t>
       </w:r>
-      <w:bookmarkEnd w:id="22"/>
+      <w:bookmarkEnd w:id="23"/>
     </w:p>
     <w:p/>
     <w:p>
       <w:pPr>
         <w:pStyle w:val="Heading2"/>
       </w:pPr>
-      <w:bookmarkStart w:id="23" w:name="_Toc211416511"/>
+      <w:bookmarkStart w:id="24" w:name="_Toc211416511"/>
       <w:r>
         <w:t>II.6 Economia circular</w:t>
       </w:r>
-      <w:bookmarkEnd w:id="23"/>
+      <w:bookmarkEnd w:id="24"/>
     </w:p>
     <w:p/>
     <w:p>
       <w:pPr>
         <w:pStyle w:val="Heading2"/>
       </w:pPr>
-      <w:bookmarkStart w:id="24" w:name="_Toc211416512"/>
+      <w:bookmarkStart w:id="25" w:name="_Toc211416512"/>
       <w:r>
         <w:t xml:space="preserve">II.7 </w:t>
       </w:r>
       <w:r>
         <w:t>Marketing</w:t>
       </w:r>
-      <w:bookmarkEnd w:id="24"/>
+      <w:bookmarkEnd w:id="25"/>
     </w:p>
     <w:p/>
     <w:p>
       <w:pPr>
         <w:pStyle w:val="Heading2"/>
       </w:pPr>
-      <w:bookmarkStart w:id="25" w:name="_Toc211416513"/>
+      <w:bookmarkStart w:id="26" w:name="_Toc211416513"/>
       <w:r>
         <w:t>II.</w:t>
       </w:r>
@@ -5623,14 +5686,14 @@
       <w:r>
         <w:t>Financeira</w:t>
       </w:r>
-      <w:bookmarkEnd w:id="25"/>
+      <w:bookmarkEnd w:id="26"/>
     </w:p>
     <w:p/>
     <w:p>
       <w:pPr>
         <w:pStyle w:val="Heading2"/>
       </w:pPr>
-      <w:bookmarkStart w:id="26" w:name="_Toc211416514"/>
+      <w:bookmarkStart w:id="27" w:name="_Toc211416514"/>
       <w:r>
         <w:t>II.</w:t>
       </w:r>
@@ -5646,7 +5709,7 @@
       <w:r>
         <w:t xml:space="preserve"> e Indústria 4.0</w:t>
       </w:r>
-      <w:bookmarkEnd w:id="26"/>
+      <w:bookmarkEnd w:id="27"/>
     </w:p>
     <w:p/>
     <w:p>
@@ -5670,11 +5733,11 @@
           <w:szCs w:val="22"/>
         </w:rPr>
       </w:pPr>
-      <w:bookmarkStart w:id="27" w:name="_Toc211416515"/>
+      <w:bookmarkStart w:id="28" w:name="_Toc211416515"/>
       <w:r>
         <w:t>Parte III – Conclusão</w:t>
       </w:r>
-      <w:bookmarkEnd w:id="27"/>
+      <w:bookmarkEnd w:id="28"/>
     </w:p>
     <w:p>
       <w:pPr>
@@ -5687,22 +5750,22 @@
       <w:pPr>
         <w:pStyle w:val="Heading2"/>
       </w:pPr>
-      <w:bookmarkStart w:id="28" w:name="_Toc211416516"/>
+      <w:bookmarkStart w:id="29" w:name="_Toc211416516"/>
       <w:r>
         <w:t>III.1 Conclusão</w:t>
       </w:r>
-      <w:bookmarkEnd w:id="28"/>
+      <w:bookmarkEnd w:id="29"/>
     </w:p>
     <w:p/>
     <w:p>
       <w:pPr>
         <w:pStyle w:val="Heading2"/>
       </w:pPr>
-      <w:bookmarkStart w:id="29" w:name="_Toc211416517"/>
+      <w:bookmarkStart w:id="30" w:name="_Toc211416517"/>
       <w:r>
         <w:t>III.2 Sugestões de melhoria</w:t>
       </w:r>
-      <w:bookmarkEnd w:id="29"/>
+      <w:bookmarkEnd w:id="30"/>
     </w:p>
     <w:p>
       <w:pPr>
@@ -5712,13 +5775,13 @@
       <w:r>
         <w:br w:type="page"/>
       </w:r>
-      <w:bookmarkStart w:id="30" w:name="_Toc471979356"/>
-      <w:bookmarkStart w:id="31" w:name="_Toc211416518"/>
+      <w:bookmarkStart w:id="31" w:name="_Toc471979356"/>
+      <w:bookmarkStart w:id="32" w:name="_Toc211416518"/>
       <w:r>
         <w:t>Referências</w:t>
       </w:r>
-      <w:bookmarkEnd w:id="30"/>
       <w:bookmarkEnd w:id="31"/>
+      <w:bookmarkEnd w:id="32"/>
     </w:p>
     <w:p/>
     <w:p>
@@ -5729,16 +5792,16 @@
           <w:rFonts w:eastAsia="Arial Narrow"/>
         </w:rPr>
       </w:pPr>
-      <w:bookmarkStart w:id="32" w:name="_Toc471979357"/>
-      <w:bookmarkStart w:id="33" w:name="_Toc211416519"/>
+      <w:bookmarkStart w:id="33" w:name="_Toc471979357"/>
+      <w:bookmarkStart w:id="34" w:name="_Toc211416519"/>
       <w:r>
         <w:rPr>
           <w:rFonts w:eastAsia="Arial Narrow"/>
         </w:rPr>
         <w:t>Anexos</w:t>
       </w:r>
-      <w:bookmarkEnd w:id="32"/>
       <w:bookmarkEnd w:id="33"/>
+      <w:bookmarkEnd w:id="34"/>
       <w:r>
         <w:rPr>
           <w:rFonts w:eastAsia="Arial Narrow"/>

</xml_diff>

<commit_message>
US 2.3.4 - strategic planning details (#19)
</commit_message>
<xml_diff>
--- a/docs/client_analysis/report_APS.docx
+++ b/docs/client_analysis/report_APS.docx
@@ -4,18 +4,18 @@
   <w:body>
     <w:p>
       <w:pPr>
-        <w:pStyle w:val="BodyText"/>
+        <w:pStyle w:val="Corpodetexto"/>
       </w:pPr>
       <w:bookmarkStart w:id="0" w:name="bkRunHead"/>
     </w:p>
     <w:p>
       <w:pPr>
-        <w:pStyle w:val="BodyText"/>
-      </w:pPr>
-    </w:p>
-    <w:p>
-      <w:pPr>
-        <w:pStyle w:val="BodyText"/>
+        <w:pStyle w:val="Corpodetexto"/>
+      </w:pPr>
+    </w:p>
+    <w:p>
+      <w:pPr>
+        <w:pStyle w:val="Corpodetexto"/>
       </w:pPr>
       <w:r>
         <w:rPr>
@@ -84,7 +84,7 @@
     </w:p>
     <w:p>
       <w:pPr>
-        <w:pStyle w:val="BodyText"/>
+        <w:pStyle w:val="Corpodetexto"/>
         <w:jc w:val="center"/>
       </w:pPr>
       <w:r>
@@ -136,7 +136,7 @@
     </w:p>
     <w:p>
       <w:pPr>
-        <w:pStyle w:val="BodyText"/>
+        <w:pStyle w:val="Corpodetexto"/>
         <w:rPr>
           <w:rFonts w:asciiTheme="minorHAnsi" w:hAnsiTheme="minorHAnsi" w:cstheme="minorHAnsi"/>
         </w:rPr>
@@ -144,7 +144,7 @@
     </w:p>
     <w:p>
       <w:pPr>
-        <w:pStyle w:val="BodyText"/>
+        <w:pStyle w:val="Corpodetexto"/>
         <w:rPr>
           <w:rFonts w:asciiTheme="minorHAnsi" w:hAnsiTheme="minorHAnsi" w:cstheme="minorHAnsi"/>
         </w:rPr>
@@ -152,7 +152,7 @@
     </w:p>
     <w:p>
       <w:pPr>
-        <w:pStyle w:val="BodyText"/>
+        <w:pStyle w:val="Corpodetexto"/>
         <w:rPr>
           <w:rFonts w:asciiTheme="minorHAnsi" w:hAnsiTheme="minorHAnsi" w:cstheme="minorHAnsi"/>
         </w:rPr>
@@ -160,7 +160,7 @@
     </w:p>
     <w:p>
       <w:pPr>
-        <w:pStyle w:val="Title"/>
+        <w:pStyle w:val="Ttulo"/>
         <w:jc w:val="center"/>
         <w:rPr>
           <w:rFonts w:asciiTheme="minorHAnsi" w:hAnsiTheme="minorHAnsi" w:cstheme="minorHAnsi"/>
@@ -173,7 +173,7 @@
     </w:p>
     <w:p>
       <w:pPr>
-        <w:pStyle w:val="Title"/>
+        <w:pStyle w:val="Ttulo"/>
         <w:jc w:val="center"/>
         <w:rPr>
           <w:rFonts w:asciiTheme="minorHAnsi" w:hAnsiTheme="minorHAnsi" w:cstheme="minorHAnsi"/>
@@ -308,7 +308,7 @@
     </w:p>
     <w:p>
       <w:pPr>
-        <w:pStyle w:val="BodyText"/>
+        <w:pStyle w:val="Corpodetexto"/>
         <w:rPr>
           <w:rFonts w:asciiTheme="minorHAnsi" w:hAnsiTheme="minorHAnsi" w:cstheme="minorHAnsi"/>
         </w:rPr>
@@ -317,7 +317,7 @@
     <w:bookmarkEnd w:id="0"/>
     <w:p>
       <w:pPr>
-        <w:pStyle w:val="BodyText"/>
+        <w:pStyle w:val="Corpodetexto"/>
         <w:rPr>
           <w:rFonts w:asciiTheme="minorHAnsi" w:hAnsiTheme="minorHAnsi" w:cstheme="minorHAnsi"/>
         </w:rPr>
@@ -325,7 +325,7 @@
     </w:p>
     <w:p>
       <w:pPr>
-        <w:pStyle w:val="NoSpacing"/>
+        <w:pStyle w:val="SemEspaamento"/>
         <w:widowControl w:val="0"/>
         <w:spacing w:line="276" w:lineRule="auto"/>
         <w:jc w:val="center"/>
@@ -376,7 +376,7 @@
     </w:p>
     <w:p>
       <w:pPr>
-        <w:pStyle w:val="NoSpacing"/>
+        <w:pStyle w:val="SemEspaamento"/>
         <w:widowControl w:val="0"/>
         <w:spacing w:line="276" w:lineRule="auto"/>
         <w:jc w:val="center"/>
@@ -421,7 +421,7 @@
     </w:p>
     <w:p>
       <w:pPr>
-        <w:pStyle w:val="NoSpacing"/>
+        <w:pStyle w:val="SemEspaamento"/>
         <w:widowControl w:val="0"/>
         <w:spacing w:line="276" w:lineRule="auto"/>
         <w:jc w:val="center"/>
@@ -458,7 +458,7 @@
     </w:p>
     <w:p>
       <w:pPr>
-        <w:pStyle w:val="NoSpacing"/>
+        <w:pStyle w:val="SemEspaamento"/>
         <w:widowControl w:val="0"/>
         <w:spacing w:line="276" w:lineRule="auto"/>
         <w:jc w:val="center"/>
@@ -519,7 +519,7 @@
     </w:p>
     <w:p>
       <w:pPr>
-        <w:pStyle w:val="NoSpacing"/>
+        <w:pStyle w:val="SemEspaamento"/>
         <w:widowControl w:val="0"/>
         <w:spacing w:line="276" w:lineRule="auto"/>
         <w:jc w:val="center"/>
@@ -572,7 +572,7 @@
     </w:p>
     <w:p>
       <w:pPr>
-        <w:pStyle w:val="BodyText"/>
+        <w:pStyle w:val="Corpodetexto"/>
         <w:rPr>
           <w:rFonts w:asciiTheme="minorHAnsi" w:hAnsiTheme="minorHAnsi" w:cstheme="minorHAnsi"/>
           <w:sz w:val="24"/>
@@ -581,7 +581,7 @@
     </w:p>
     <w:p>
       <w:pPr>
-        <w:pStyle w:val="BodyText"/>
+        <w:pStyle w:val="Corpodetexto"/>
         <w:rPr>
           <w:rFonts w:asciiTheme="minorHAnsi" w:hAnsiTheme="minorHAnsi" w:cstheme="minorHAnsi"/>
         </w:rPr>
@@ -589,7 +589,7 @@
     </w:p>
     <w:p>
       <w:pPr>
-        <w:pStyle w:val="BodyText"/>
+        <w:pStyle w:val="Corpodetexto"/>
         <w:rPr>
           <w:rFonts w:asciiTheme="minorHAnsi" w:hAnsiTheme="minorHAnsi" w:cstheme="minorHAnsi"/>
         </w:rPr>
@@ -674,7 +674,7 @@
       <w:sdtContent>
         <w:p>
           <w:pPr>
-            <w:pStyle w:val="TOCHeading"/>
+            <w:pStyle w:val="Cabealhodondice"/>
             <w:rPr>
               <w:rFonts w:ascii="Calibri" w:hAnsi="Calibri" w:cs="Calibri"/>
               <w:b/>
@@ -693,7 +693,7 @@
         <w:p/>
         <w:p>
           <w:pPr>
-            <w:pStyle w:val="TOC1"/>
+            <w:pStyle w:val="ndice1"/>
             <w:tabs>
               <w:tab w:val="right" w:leader="dot" w:pos="9350"/>
             </w:tabs>
@@ -714,10 +714,10 @@
           <w:r>
             <w:fldChar w:fldCharType="separate"/>
           </w:r>
-          <w:hyperlink w:anchor="_Toc211416493" w:history="1">
-            <w:r>
-              <w:rPr>
-                <w:rStyle w:val="Hyperlink"/>
+          <w:hyperlink w:anchor="_Toc211417988" w:history="1">
+            <w:r>
+              <w:rPr>
+                <w:rStyle w:val="Hiperligao"/>
                 <w:noProof/>
                 <w:lang w:bidi="pt-PT"/>
               </w:rPr>
@@ -742,7 +742,7 @@
                 <w:noProof/>
                 <w:webHidden/>
               </w:rPr>
-              <w:instrText xml:space="preserve"> PAGEREF _Toc211416493 \h </w:instrText>
+              <w:instrText xml:space="preserve"> PAGEREF _Toc211417988 \h </w:instrText>
             </w:r>
             <w:r>
               <w:rPr>
@@ -775,7 +775,7 @@
         </w:p>
         <w:p>
           <w:pPr>
-            <w:pStyle w:val="TOC2"/>
+            <w:pStyle w:val="ndice2"/>
             <w:tabs>
               <w:tab w:val="right" w:leader="dot" w:pos="9350"/>
             </w:tabs>
@@ -787,10 +787,10 @@
               <w14:ligatures w14:val="standardContextual"/>
             </w:rPr>
           </w:pPr>
-          <w:hyperlink w:anchor="_Toc211416494" w:history="1">
-            <w:r>
-              <w:rPr>
-                <w:rStyle w:val="Hyperlink"/>
+          <w:hyperlink w:anchor="_Toc211417989" w:history="1">
+            <w:r>
+              <w:rPr>
+                <w:rStyle w:val="Hiperligao"/>
                 <w:noProof/>
                 <w:lang w:bidi="pt-PT"/>
               </w:rPr>
@@ -815,7 +815,7 @@
                 <w:noProof/>
                 <w:webHidden/>
               </w:rPr>
-              <w:instrText xml:space="preserve"> PAGEREF _Toc211416494 \h </w:instrText>
+              <w:instrText xml:space="preserve"> PAGEREF _Toc211417989 \h </w:instrText>
             </w:r>
             <w:r>
               <w:rPr>
@@ -848,7 +848,7 @@
         </w:p>
         <w:p>
           <w:pPr>
-            <w:pStyle w:val="TOC2"/>
+            <w:pStyle w:val="ndice2"/>
             <w:tabs>
               <w:tab w:val="right" w:leader="dot" w:pos="9350"/>
             </w:tabs>
@@ -860,10 +860,10 @@
               <w14:ligatures w14:val="standardContextual"/>
             </w:rPr>
           </w:pPr>
-          <w:hyperlink w:anchor="_Toc211416495" w:history="1">
-            <w:r>
-              <w:rPr>
-                <w:rStyle w:val="Hyperlink"/>
+          <w:hyperlink w:anchor="_Toc211417990" w:history="1">
+            <w:r>
+              <w:rPr>
+                <w:rStyle w:val="Hiperligao"/>
                 <w:noProof/>
               </w:rPr>
               <w:t>Opções Estratégicas para o Porto de Sines (2020-2030)</w:t>
@@ -887,7 +887,7 @@
                 <w:noProof/>
                 <w:webHidden/>
               </w:rPr>
-              <w:instrText xml:space="preserve"> PAGEREF _Toc211416495 \h </w:instrText>
+              <w:instrText xml:space="preserve"> PAGEREF _Toc211417990 \h </w:instrText>
             </w:r>
             <w:r>
               <w:rPr>
@@ -920,7 +920,7 @@
         </w:p>
         <w:p>
           <w:pPr>
-            <w:pStyle w:val="TOC2"/>
+            <w:pStyle w:val="ndice2"/>
             <w:tabs>
               <w:tab w:val="right" w:leader="dot" w:pos="9350"/>
             </w:tabs>
@@ -932,10 +932,10 @@
               <w14:ligatures w14:val="standardContextual"/>
             </w:rPr>
           </w:pPr>
-          <w:hyperlink w:anchor="_Toc211416496" w:history="1">
-            <w:r>
-              <w:rPr>
-                <w:rStyle w:val="Hyperlink"/>
+          <w:hyperlink w:anchor="_Toc211417991" w:history="1">
+            <w:r>
+              <w:rPr>
+                <w:rStyle w:val="Hiperligao"/>
                 <w:noProof/>
               </w:rPr>
               <w:t>Ligações e Hinterland</w:t>
@@ -959,7 +959,7 @@
                 <w:noProof/>
                 <w:webHidden/>
               </w:rPr>
-              <w:instrText xml:space="preserve"> PAGEREF _Toc211416496 \h </w:instrText>
+              <w:instrText xml:space="preserve"> PAGEREF _Toc211417991 \h </w:instrText>
             </w:r>
             <w:r>
               <w:rPr>
@@ -992,7 +992,7 @@
         </w:p>
         <w:p>
           <w:pPr>
-            <w:pStyle w:val="TOC2"/>
+            <w:pStyle w:val="ndice2"/>
             <w:tabs>
               <w:tab w:val="right" w:leader="dot" w:pos="9350"/>
             </w:tabs>
@@ -1004,10 +1004,10 @@
               <w14:ligatures w14:val="standardContextual"/>
             </w:rPr>
           </w:pPr>
-          <w:hyperlink w:anchor="_Toc211416497" w:history="1">
-            <w:r>
-              <w:rPr>
-                <w:rStyle w:val="Hyperlink"/>
+          <w:hyperlink w:anchor="_Toc211417992" w:history="1">
+            <w:r>
+              <w:rPr>
+                <w:rStyle w:val="Hiperligao"/>
                 <w:noProof/>
               </w:rPr>
               <w:t>Estatísticas</w:t>
@@ -1031,7 +1031,7 @@
                 <w:noProof/>
                 <w:webHidden/>
               </w:rPr>
-              <w:instrText xml:space="preserve"> PAGEREF _Toc211416497 \h </w:instrText>
+              <w:instrText xml:space="preserve"> PAGEREF _Toc211417992 \h </w:instrText>
             </w:r>
             <w:r>
               <w:rPr>
@@ -1064,7 +1064,7 @@
         </w:p>
         <w:p>
           <w:pPr>
-            <w:pStyle w:val="TOC3"/>
+            <w:pStyle w:val="ndice3"/>
             <w:tabs>
               <w:tab w:val="right" w:leader="dot" w:pos="9350"/>
             </w:tabs>
@@ -1076,10 +1076,10 @@
               <w14:ligatures w14:val="standardContextual"/>
             </w:rPr>
           </w:pPr>
-          <w:hyperlink w:anchor="_Toc211416498" w:history="1">
-            <w:r>
-              <w:rPr>
-                <w:rStyle w:val="Hyperlink"/>
+          <w:hyperlink w:anchor="_Toc211417993" w:history="1">
+            <w:r>
+              <w:rPr>
+                <w:rStyle w:val="Hiperligao"/>
                 <w:noProof/>
               </w:rPr>
               <w:t>Navios</w:t>
@@ -1103,7 +1103,7 @@
                 <w:noProof/>
                 <w:webHidden/>
               </w:rPr>
-              <w:instrText xml:space="preserve"> PAGEREF _Toc211416498 \h </w:instrText>
+              <w:instrText xml:space="preserve"> PAGEREF _Toc211417993 \h </w:instrText>
             </w:r>
             <w:r>
               <w:rPr>
@@ -1136,7 +1136,7 @@
         </w:p>
         <w:p>
           <w:pPr>
-            <w:pStyle w:val="TOC3"/>
+            <w:pStyle w:val="ndice3"/>
             <w:tabs>
               <w:tab w:val="right" w:leader="dot" w:pos="9350"/>
             </w:tabs>
@@ -1148,10 +1148,10 @@
               <w14:ligatures w14:val="standardContextual"/>
             </w:rPr>
           </w:pPr>
-          <w:hyperlink w:anchor="_Toc211416499" w:history="1">
-            <w:r>
-              <w:rPr>
-                <w:rStyle w:val="Hyperlink"/>
+          <w:hyperlink w:anchor="_Toc211417994" w:history="1">
+            <w:r>
+              <w:rPr>
+                <w:rStyle w:val="Hiperligao"/>
                 <w:noProof/>
               </w:rPr>
               <w:t>Mercadorias</w:t>
@@ -1175,7 +1175,7 @@
                 <w:noProof/>
                 <w:webHidden/>
               </w:rPr>
-              <w:instrText xml:space="preserve"> PAGEREF _Toc211416499 \h </w:instrText>
+              <w:instrText xml:space="preserve"> PAGEREF _Toc211417994 \h </w:instrText>
             </w:r>
             <w:r>
               <w:rPr>
@@ -1208,7 +1208,7 @@
         </w:p>
         <w:p>
           <w:pPr>
-            <w:pStyle w:val="TOC3"/>
+            <w:pStyle w:val="ndice3"/>
             <w:tabs>
               <w:tab w:val="right" w:leader="dot" w:pos="9350"/>
             </w:tabs>
@@ -1220,10 +1220,10 @@
               <w14:ligatures w14:val="standardContextual"/>
             </w:rPr>
           </w:pPr>
-          <w:hyperlink w:anchor="_Toc211416500" w:history="1">
-            <w:r>
-              <w:rPr>
-                <w:rStyle w:val="Hyperlink"/>
+          <w:hyperlink w:anchor="_Toc211417995" w:history="1">
+            <w:r>
+              <w:rPr>
+                <w:rStyle w:val="Hiperligao"/>
                 <w:noProof/>
               </w:rPr>
               <w:t>Passageiros</w:t>
@@ -1247,7 +1247,7 @@
                 <w:noProof/>
                 <w:webHidden/>
               </w:rPr>
-              <w:instrText xml:space="preserve"> PAGEREF _Toc211416500 \h </w:instrText>
+              <w:instrText xml:space="preserve"> PAGEREF _Toc211417995 \h </w:instrText>
             </w:r>
             <w:r>
               <w:rPr>
@@ -1280,7 +1280,7 @@
         </w:p>
         <w:p>
           <w:pPr>
-            <w:pStyle w:val="TOC1"/>
+            <w:pStyle w:val="ndice1"/>
             <w:tabs>
               <w:tab w:val="right" w:leader="dot" w:pos="9350"/>
             </w:tabs>
@@ -1292,10 +1292,10 @@
               <w14:ligatures w14:val="standardContextual"/>
             </w:rPr>
           </w:pPr>
-          <w:hyperlink w:anchor="_Toc211416501" w:history="1">
-            <w:r>
-              <w:rPr>
-                <w:rStyle w:val="Hyperlink"/>
+          <w:hyperlink w:anchor="_Toc211417996" w:history="1">
+            <w:r>
+              <w:rPr>
+                <w:rStyle w:val="Hiperligao"/>
                 <w:noProof/>
               </w:rPr>
               <w:t>Parte I – Introdução e estrutura do trabalho</w:t>
@@ -1319,7 +1319,7 @@
                 <w:noProof/>
                 <w:webHidden/>
               </w:rPr>
-              <w:instrText xml:space="preserve"> PAGEREF _Toc211416501 \h </w:instrText>
+              <w:instrText xml:space="preserve"> PAGEREF _Toc211417996 \h </w:instrText>
             </w:r>
             <w:r>
               <w:rPr>
@@ -1352,7 +1352,7 @@
         </w:p>
         <w:p>
           <w:pPr>
-            <w:pStyle w:val="TOC2"/>
+            <w:pStyle w:val="ndice2"/>
             <w:tabs>
               <w:tab w:val="right" w:leader="dot" w:pos="9350"/>
             </w:tabs>
@@ -1364,10 +1364,10 @@
               <w14:ligatures w14:val="standardContextual"/>
             </w:rPr>
           </w:pPr>
-          <w:hyperlink w:anchor="_Toc211416502" w:history="1">
-            <w:r>
-              <w:rPr>
-                <w:rStyle w:val="Hyperlink"/>
+          <w:hyperlink w:anchor="_Toc211417997" w:history="1">
+            <w:r>
+              <w:rPr>
+                <w:rStyle w:val="Hiperligao"/>
                 <w:noProof/>
               </w:rPr>
               <w:t>I.1 Caracterização da organização</w:t>
@@ -1391,7 +1391,7 @@
                 <w:noProof/>
                 <w:webHidden/>
               </w:rPr>
-              <w:instrText xml:space="preserve"> PAGEREF _Toc211416502 \h </w:instrText>
+              <w:instrText xml:space="preserve"> PAGEREF _Toc211417997 \h </w:instrText>
             </w:r>
             <w:r>
               <w:rPr>
@@ -1424,7 +1424,7 @@
         </w:p>
         <w:p>
           <w:pPr>
-            <w:pStyle w:val="TOC2"/>
+            <w:pStyle w:val="ndice2"/>
             <w:tabs>
               <w:tab w:val="right" w:leader="dot" w:pos="9350"/>
             </w:tabs>
@@ -1436,10 +1436,10 @@
               <w14:ligatures w14:val="standardContextual"/>
             </w:rPr>
           </w:pPr>
-          <w:hyperlink w:anchor="_Toc211416503" w:history="1">
-            <w:r>
-              <w:rPr>
-                <w:rStyle w:val="Hyperlink"/>
+          <w:hyperlink w:anchor="_Toc211417998" w:history="1">
+            <w:r>
+              <w:rPr>
+                <w:rStyle w:val="Hiperligao"/>
                 <w:noProof/>
               </w:rPr>
               <w:t>I.2 Fontes de informação</w:t>
@@ -1463,7 +1463,7 @@
                 <w:noProof/>
                 <w:webHidden/>
               </w:rPr>
-              <w:instrText xml:space="preserve"> PAGEREF _Toc211416503 \h </w:instrText>
+              <w:instrText xml:space="preserve"> PAGEREF _Toc211417998 \h </w:instrText>
             </w:r>
             <w:r>
               <w:rPr>
@@ -1496,7 +1496,7 @@
         </w:p>
         <w:p>
           <w:pPr>
-            <w:pStyle w:val="TOC1"/>
+            <w:pStyle w:val="ndice1"/>
             <w:tabs>
               <w:tab w:val="right" w:leader="dot" w:pos="9350"/>
             </w:tabs>
@@ -1508,10 +1508,10 @@
               <w14:ligatures w14:val="standardContextual"/>
             </w:rPr>
           </w:pPr>
-          <w:hyperlink w:anchor="_Toc211416504" w:history="1">
-            <w:r>
-              <w:rPr>
-                <w:rStyle w:val="Hyperlink"/>
+          <w:hyperlink w:anchor="_Toc211417999" w:history="1">
+            <w:r>
+              <w:rPr>
+                <w:rStyle w:val="Hiperligao"/>
                 <w:noProof/>
               </w:rPr>
               <w:t>Parte II – Desenvolvimento</w:t>
@@ -1535,7 +1535,7 @@
                 <w:noProof/>
                 <w:webHidden/>
               </w:rPr>
-              <w:instrText xml:space="preserve"> PAGEREF _Toc211416504 \h </w:instrText>
+              <w:instrText xml:space="preserve"> PAGEREF _Toc211417999 \h </w:instrText>
             </w:r>
             <w:r>
               <w:rPr>
@@ -1568,7 +1568,7 @@
         </w:p>
         <w:p>
           <w:pPr>
-            <w:pStyle w:val="TOC2"/>
+            <w:pStyle w:val="ndice2"/>
             <w:tabs>
               <w:tab w:val="right" w:leader="dot" w:pos="9350"/>
             </w:tabs>
@@ -1580,10 +1580,10 @@
               <w14:ligatures w14:val="standardContextual"/>
             </w:rPr>
           </w:pPr>
-          <w:hyperlink w:anchor="_Toc211416505" w:history="1">
-            <w:r>
-              <w:rPr>
-                <w:rStyle w:val="Hyperlink"/>
+          <w:hyperlink w:anchor="_Toc211418000" w:history="1">
+            <w:r>
+              <w:rPr>
+                <w:rStyle w:val="Hiperligao"/>
                 <w:noProof/>
               </w:rPr>
               <w:t>II.1 Organização</w:t>
@@ -1607,7 +1607,7 @@
                 <w:noProof/>
                 <w:webHidden/>
               </w:rPr>
-              <w:instrText xml:space="preserve"> PAGEREF _Toc211416505 \h </w:instrText>
+              <w:instrText xml:space="preserve"> PAGEREF _Toc211418000 \h </w:instrText>
             </w:r>
             <w:r>
               <w:rPr>
@@ -1640,7 +1640,7 @@
         </w:p>
         <w:p>
           <w:pPr>
-            <w:pStyle w:val="TOC3"/>
+            <w:pStyle w:val="ndice3"/>
             <w:tabs>
               <w:tab w:val="right" w:leader="dot" w:pos="9350"/>
             </w:tabs>
@@ -1652,10 +1652,10 @@
               <w14:ligatures w14:val="standardContextual"/>
             </w:rPr>
           </w:pPr>
-          <w:hyperlink w:anchor="_Toc211416506" w:history="1">
-            <w:r>
-              <w:rPr>
-                <w:rStyle w:val="Hyperlink"/>
+          <w:hyperlink w:anchor="_Toc211418001" w:history="1">
+            <w:r>
+              <w:rPr>
+                <w:rStyle w:val="Hiperligao"/>
                 <w:noProof/>
               </w:rPr>
               <w:t>Estrutura organizacional</w:t>
@@ -1679,7 +1679,7 @@
                 <w:noProof/>
                 <w:webHidden/>
               </w:rPr>
-              <w:instrText xml:space="preserve"> PAGEREF _Toc211416506 \h </w:instrText>
+              <w:instrText xml:space="preserve"> PAGEREF _Toc211418001 \h </w:instrText>
             </w:r>
             <w:r>
               <w:rPr>
@@ -1712,7 +1712,7 @@
         </w:p>
         <w:p>
           <w:pPr>
-            <w:pStyle w:val="TOC2"/>
+            <w:pStyle w:val="ndice3"/>
             <w:tabs>
               <w:tab w:val="right" w:leader="dot" w:pos="9350"/>
             </w:tabs>
@@ -1724,13 +1724,13 @@
               <w14:ligatures w14:val="standardContextual"/>
             </w:rPr>
           </w:pPr>
-          <w:hyperlink w:anchor="_Toc211416507" w:history="1">
-            <w:r>
-              <w:rPr>
-                <w:rStyle w:val="Hyperlink"/>
-                <w:noProof/>
-              </w:rPr>
-              <w:t>II.2 Planeamento</w:t>
+          <w:hyperlink w:anchor="_Toc211418002" w:history="1">
+            <w:r>
+              <w:rPr>
+                <w:rStyle w:val="Hiperligao"/>
+                <w:noProof/>
+              </w:rPr>
+              <w:t>Proposta de melhoria</w:t>
             </w:r>
             <w:r>
               <w:rPr>
@@ -1751,7 +1751,7 @@
                 <w:noProof/>
                 <w:webHidden/>
               </w:rPr>
-              <w:instrText xml:space="preserve"> PAGEREF _Toc211416507 \h </w:instrText>
+              <w:instrText xml:space="preserve"> PAGEREF _Toc211418002 \h </w:instrText>
             </w:r>
             <w:r>
               <w:rPr>
@@ -1784,7 +1784,7 @@
         </w:p>
         <w:p>
           <w:pPr>
-            <w:pStyle w:val="TOC2"/>
+            <w:pStyle w:val="ndice2"/>
             <w:tabs>
               <w:tab w:val="right" w:leader="dot" w:pos="9350"/>
             </w:tabs>
@@ -1796,13 +1796,13 @@
               <w14:ligatures w14:val="standardContextual"/>
             </w:rPr>
           </w:pPr>
-          <w:hyperlink w:anchor="_Toc211416508" w:history="1">
-            <w:r>
-              <w:rPr>
-                <w:rStyle w:val="Hyperlink"/>
-                <w:noProof/>
-              </w:rPr>
-              <w:t>II.3 Controlo e Sistemas de informação</w:t>
+          <w:hyperlink w:anchor="_Toc211418003" w:history="1">
+            <w:r>
+              <w:rPr>
+                <w:rStyle w:val="Hiperligao"/>
+                <w:noProof/>
+              </w:rPr>
+              <w:t>II.2 Planeamento</w:t>
             </w:r>
             <w:r>
               <w:rPr>
@@ -1823,7 +1823,7 @@
                 <w:noProof/>
                 <w:webHidden/>
               </w:rPr>
-              <w:instrText xml:space="preserve"> PAGEREF _Toc211416508 \h </w:instrText>
+              <w:instrText xml:space="preserve"> PAGEREF _Toc211418003 \h </w:instrText>
             </w:r>
             <w:r>
               <w:rPr>
@@ -1856,7 +1856,7 @@
         </w:p>
         <w:p>
           <w:pPr>
-            <w:pStyle w:val="TOC2"/>
+            <w:pStyle w:val="ndice2"/>
             <w:tabs>
               <w:tab w:val="right" w:leader="dot" w:pos="9350"/>
             </w:tabs>
@@ -1868,13 +1868,13 @@
               <w14:ligatures w14:val="standardContextual"/>
             </w:rPr>
           </w:pPr>
-          <w:hyperlink w:anchor="_Toc211416509" w:history="1">
-            <w:r>
-              <w:rPr>
-                <w:rStyle w:val="Hyperlink"/>
-                <w:noProof/>
-              </w:rPr>
-              <w:t>II. 4 Direção e Gestão de Pessoas</w:t>
+          <w:hyperlink w:anchor="_Toc211418004" w:history="1">
+            <w:r>
+              <w:rPr>
+                <w:rStyle w:val="Hiperligao"/>
+                <w:noProof/>
+              </w:rPr>
+              <w:t>II.3 Controlo e Sistemas de informação</w:t>
             </w:r>
             <w:r>
               <w:rPr>
@@ -1895,7 +1895,7 @@
                 <w:noProof/>
                 <w:webHidden/>
               </w:rPr>
-              <w:instrText xml:space="preserve"> PAGEREF _Toc211416509 \h </w:instrText>
+              <w:instrText xml:space="preserve"> PAGEREF _Toc211418004 \h </w:instrText>
             </w:r>
             <w:r>
               <w:rPr>
@@ -1915,7 +1915,7 @@
                 <w:noProof/>
                 <w:webHidden/>
               </w:rPr>
-              <w:t>17</w:t>
+              <w:t>18</w:t>
             </w:r>
             <w:r>
               <w:rPr>
@@ -1928,7 +1928,7 @@
         </w:p>
         <w:p>
           <w:pPr>
-            <w:pStyle w:val="TOC2"/>
+            <w:pStyle w:val="ndice2"/>
             <w:tabs>
               <w:tab w:val="right" w:leader="dot" w:pos="9350"/>
             </w:tabs>
@@ -1940,13 +1940,13 @@
               <w14:ligatures w14:val="standardContextual"/>
             </w:rPr>
           </w:pPr>
-          <w:hyperlink w:anchor="_Toc211416510" w:history="1">
-            <w:r>
-              <w:rPr>
-                <w:rStyle w:val="Hyperlink"/>
-                <w:noProof/>
-              </w:rPr>
-              <w:t>II.5 Promoção da produtividade</w:t>
+          <w:hyperlink w:anchor="_Toc211418005" w:history="1">
+            <w:r>
+              <w:rPr>
+                <w:rStyle w:val="Hiperligao"/>
+                <w:noProof/>
+              </w:rPr>
+              <w:t>II. 4 Direção e Gestão de Pessoas</w:t>
             </w:r>
             <w:r>
               <w:rPr>
@@ -1967,7 +1967,7 @@
                 <w:noProof/>
                 <w:webHidden/>
               </w:rPr>
-              <w:instrText xml:space="preserve"> PAGEREF _Toc211416510 \h </w:instrText>
+              <w:instrText xml:space="preserve"> PAGEREF _Toc211418005 \h </w:instrText>
             </w:r>
             <w:r>
               <w:rPr>
@@ -1987,7 +1987,7 @@
                 <w:noProof/>
                 <w:webHidden/>
               </w:rPr>
-              <w:t>17</w:t>
+              <w:t>18</w:t>
             </w:r>
             <w:r>
               <w:rPr>
@@ -2000,7 +2000,7 @@
         </w:p>
         <w:p>
           <w:pPr>
-            <w:pStyle w:val="TOC2"/>
+            <w:pStyle w:val="ndice2"/>
             <w:tabs>
               <w:tab w:val="right" w:leader="dot" w:pos="9350"/>
             </w:tabs>
@@ -2012,13 +2012,13 @@
               <w14:ligatures w14:val="standardContextual"/>
             </w:rPr>
           </w:pPr>
-          <w:hyperlink w:anchor="_Toc211416511" w:history="1">
-            <w:r>
-              <w:rPr>
-                <w:rStyle w:val="Hyperlink"/>
-                <w:noProof/>
-              </w:rPr>
-              <w:t>II.6 Economia circular</w:t>
+          <w:hyperlink w:anchor="_Toc211418006" w:history="1">
+            <w:r>
+              <w:rPr>
+                <w:rStyle w:val="Hiperligao"/>
+                <w:noProof/>
+              </w:rPr>
+              <w:t>II.5 Promoção da produtividade</w:t>
             </w:r>
             <w:r>
               <w:rPr>
@@ -2039,7 +2039,7 @@
                 <w:noProof/>
                 <w:webHidden/>
               </w:rPr>
-              <w:instrText xml:space="preserve"> PAGEREF _Toc211416511 \h </w:instrText>
+              <w:instrText xml:space="preserve"> PAGEREF _Toc211418006 \h </w:instrText>
             </w:r>
             <w:r>
               <w:rPr>
@@ -2059,7 +2059,7 @@
                 <w:noProof/>
                 <w:webHidden/>
               </w:rPr>
-              <w:t>17</w:t>
+              <w:t>18</w:t>
             </w:r>
             <w:r>
               <w:rPr>
@@ -2072,7 +2072,7 @@
         </w:p>
         <w:p>
           <w:pPr>
-            <w:pStyle w:val="TOC2"/>
+            <w:pStyle w:val="ndice2"/>
             <w:tabs>
               <w:tab w:val="right" w:leader="dot" w:pos="9350"/>
             </w:tabs>
@@ -2084,13 +2084,13 @@
               <w14:ligatures w14:val="standardContextual"/>
             </w:rPr>
           </w:pPr>
-          <w:hyperlink w:anchor="_Toc211416512" w:history="1">
-            <w:r>
-              <w:rPr>
-                <w:rStyle w:val="Hyperlink"/>
-                <w:noProof/>
-              </w:rPr>
-              <w:t>II.7 Marketing</w:t>
+          <w:hyperlink w:anchor="_Toc211418007" w:history="1">
+            <w:r>
+              <w:rPr>
+                <w:rStyle w:val="Hiperligao"/>
+                <w:noProof/>
+              </w:rPr>
+              <w:t>II.6 Economia circular</w:t>
             </w:r>
             <w:r>
               <w:rPr>
@@ -2111,7 +2111,7 @@
                 <w:noProof/>
                 <w:webHidden/>
               </w:rPr>
-              <w:instrText xml:space="preserve"> PAGEREF _Toc211416512 \h </w:instrText>
+              <w:instrText xml:space="preserve"> PAGEREF _Toc211418007 \h </w:instrText>
             </w:r>
             <w:r>
               <w:rPr>
@@ -2131,7 +2131,7 @@
                 <w:noProof/>
                 <w:webHidden/>
               </w:rPr>
-              <w:t>17</w:t>
+              <w:t>18</w:t>
             </w:r>
             <w:r>
               <w:rPr>
@@ -2144,7 +2144,7 @@
         </w:p>
         <w:p>
           <w:pPr>
-            <w:pStyle w:val="TOC2"/>
+            <w:pStyle w:val="ndice2"/>
             <w:tabs>
               <w:tab w:val="right" w:leader="dot" w:pos="9350"/>
             </w:tabs>
@@ -2156,13 +2156,13 @@
               <w14:ligatures w14:val="standardContextual"/>
             </w:rPr>
           </w:pPr>
-          <w:hyperlink w:anchor="_Toc211416513" w:history="1">
-            <w:r>
-              <w:rPr>
-                <w:rStyle w:val="Hyperlink"/>
-                <w:noProof/>
-              </w:rPr>
-              <w:t>II. 8 Gestão Financeira</w:t>
+          <w:hyperlink w:anchor="_Toc211418008" w:history="1">
+            <w:r>
+              <w:rPr>
+                <w:rStyle w:val="Hiperligao"/>
+                <w:noProof/>
+              </w:rPr>
+              <w:t>II.7 Marketing</w:t>
             </w:r>
             <w:r>
               <w:rPr>
@@ -2183,7 +2183,7 @@
                 <w:noProof/>
                 <w:webHidden/>
               </w:rPr>
-              <w:instrText xml:space="preserve"> PAGEREF _Toc211416513 \h </w:instrText>
+              <w:instrText xml:space="preserve"> PAGEREF _Toc211418008 \h </w:instrText>
             </w:r>
             <w:r>
               <w:rPr>
@@ -2203,7 +2203,7 @@
                 <w:noProof/>
                 <w:webHidden/>
               </w:rPr>
-              <w:t>17</w:t>
+              <w:t>18</w:t>
             </w:r>
             <w:r>
               <w:rPr>
@@ -2216,7 +2216,7 @@
         </w:p>
         <w:p>
           <w:pPr>
-            <w:pStyle w:val="TOC2"/>
+            <w:pStyle w:val="ndice2"/>
             <w:tabs>
               <w:tab w:val="right" w:leader="dot" w:pos="9350"/>
             </w:tabs>
@@ -2228,13 +2228,13 @@
               <w14:ligatures w14:val="standardContextual"/>
             </w:rPr>
           </w:pPr>
-          <w:hyperlink w:anchor="_Toc211416514" w:history="1">
-            <w:r>
-              <w:rPr>
-                <w:rStyle w:val="Hyperlink"/>
-                <w:noProof/>
-              </w:rPr>
-              <w:t>II.9 Gestão das Operações e Indústria 4.0</w:t>
+          <w:hyperlink w:anchor="_Toc211418009" w:history="1">
+            <w:r>
+              <w:rPr>
+                <w:rStyle w:val="Hiperligao"/>
+                <w:noProof/>
+              </w:rPr>
+              <w:t>II. 8 Gestão Financeira</w:t>
             </w:r>
             <w:r>
               <w:rPr>
@@ -2255,7 +2255,7 @@
                 <w:noProof/>
                 <w:webHidden/>
               </w:rPr>
-              <w:instrText xml:space="preserve"> PAGEREF _Toc211416514 \h </w:instrText>
+              <w:instrText xml:space="preserve"> PAGEREF _Toc211418009 \h </w:instrText>
             </w:r>
             <w:r>
               <w:rPr>
@@ -2275,7 +2275,7 @@
                 <w:noProof/>
                 <w:webHidden/>
               </w:rPr>
-              <w:t>17</w:t>
+              <w:t>18</w:t>
             </w:r>
             <w:r>
               <w:rPr>
@@ -2288,7 +2288,7 @@
         </w:p>
         <w:p>
           <w:pPr>
-            <w:pStyle w:val="TOC1"/>
+            <w:pStyle w:val="ndice2"/>
             <w:tabs>
               <w:tab w:val="right" w:leader="dot" w:pos="9350"/>
             </w:tabs>
@@ -2300,13 +2300,13 @@
               <w14:ligatures w14:val="standardContextual"/>
             </w:rPr>
           </w:pPr>
-          <w:hyperlink w:anchor="_Toc211416515" w:history="1">
-            <w:r>
-              <w:rPr>
-                <w:rStyle w:val="Hyperlink"/>
-                <w:noProof/>
-              </w:rPr>
-              <w:t>Parte III – Conclusão</w:t>
+          <w:hyperlink w:anchor="_Toc211418010" w:history="1">
+            <w:r>
+              <w:rPr>
+                <w:rStyle w:val="Hiperligao"/>
+                <w:noProof/>
+              </w:rPr>
+              <w:t>II.9 Gestão das Operações e Indústria 4.0</w:t>
             </w:r>
             <w:r>
               <w:rPr>
@@ -2327,7 +2327,7 @@
                 <w:noProof/>
                 <w:webHidden/>
               </w:rPr>
-              <w:instrText xml:space="preserve"> PAGEREF _Toc211416515 \h </w:instrText>
+              <w:instrText xml:space="preserve"> PAGEREF _Toc211418010 \h </w:instrText>
             </w:r>
             <w:r>
               <w:rPr>
@@ -2360,7 +2360,7 @@
         </w:p>
         <w:p>
           <w:pPr>
-            <w:pStyle w:val="TOC2"/>
+            <w:pStyle w:val="ndice1"/>
             <w:tabs>
               <w:tab w:val="right" w:leader="dot" w:pos="9350"/>
             </w:tabs>
@@ -2372,13 +2372,13 @@
               <w14:ligatures w14:val="standardContextual"/>
             </w:rPr>
           </w:pPr>
-          <w:hyperlink w:anchor="_Toc211416516" w:history="1">
-            <w:r>
-              <w:rPr>
-                <w:rStyle w:val="Hyperlink"/>
-                <w:noProof/>
-              </w:rPr>
-              <w:t>III.1 Conclusão</w:t>
+          <w:hyperlink w:anchor="_Toc211418011" w:history="1">
+            <w:r>
+              <w:rPr>
+                <w:rStyle w:val="Hiperligao"/>
+                <w:noProof/>
+              </w:rPr>
+              <w:t>Parte III – Conclusão</w:t>
             </w:r>
             <w:r>
               <w:rPr>
@@ -2399,7 +2399,7 @@
                 <w:noProof/>
                 <w:webHidden/>
               </w:rPr>
-              <w:instrText xml:space="preserve"> PAGEREF _Toc211416516 \h </w:instrText>
+              <w:instrText xml:space="preserve"> PAGEREF _Toc211418011 \h </w:instrText>
             </w:r>
             <w:r>
               <w:rPr>
@@ -2419,7 +2419,7 @@
                 <w:noProof/>
                 <w:webHidden/>
               </w:rPr>
-              <w:t>18</w:t>
+              <w:t>19</w:t>
             </w:r>
             <w:r>
               <w:rPr>
@@ -2432,7 +2432,7 @@
         </w:p>
         <w:p>
           <w:pPr>
-            <w:pStyle w:val="TOC2"/>
+            <w:pStyle w:val="ndice2"/>
             <w:tabs>
               <w:tab w:val="right" w:leader="dot" w:pos="9350"/>
             </w:tabs>
@@ -2444,13 +2444,13 @@
               <w14:ligatures w14:val="standardContextual"/>
             </w:rPr>
           </w:pPr>
-          <w:hyperlink w:anchor="_Toc211416517" w:history="1">
-            <w:r>
-              <w:rPr>
-                <w:rStyle w:val="Hyperlink"/>
-                <w:noProof/>
-              </w:rPr>
-              <w:t>III.2 Sugestões de melhoria</w:t>
+          <w:hyperlink w:anchor="_Toc211418012" w:history="1">
+            <w:r>
+              <w:rPr>
+                <w:rStyle w:val="Hiperligao"/>
+                <w:noProof/>
+              </w:rPr>
+              <w:t>III.1 Conclusão</w:t>
             </w:r>
             <w:r>
               <w:rPr>
@@ -2471,7 +2471,7 @@
                 <w:noProof/>
                 <w:webHidden/>
               </w:rPr>
-              <w:instrText xml:space="preserve"> PAGEREF _Toc211416517 \h </w:instrText>
+              <w:instrText xml:space="preserve"> PAGEREF _Toc211418012 \h </w:instrText>
             </w:r>
             <w:r>
               <w:rPr>
@@ -2491,7 +2491,7 @@
                 <w:noProof/>
                 <w:webHidden/>
               </w:rPr>
-              <w:t>18</w:t>
+              <w:t>19</w:t>
             </w:r>
             <w:r>
               <w:rPr>
@@ -2504,7 +2504,7 @@
         </w:p>
         <w:p>
           <w:pPr>
-            <w:pStyle w:val="TOC1"/>
+            <w:pStyle w:val="ndice2"/>
             <w:tabs>
               <w:tab w:val="right" w:leader="dot" w:pos="9350"/>
             </w:tabs>
@@ -2516,13 +2516,13 @@
               <w14:ligatures w14:val="standardContextual"/>
             </w:rPr>
           </w:pPr>
-          <w:hyperlink w:anchor="_Toc211416518" w:history="1">
-            <w:r>
-              <w:rPr>
-                <w:rStyle w:val="Hyperlink"/>
-                <w:noProof/>
-              </w:rPr>
-              <w:t>Referências</w:t>
+          <w:hyperlink w:anchor="_Toc211418013" w:history="1">
+            <w:r>
+              <w:rPr>
+                <w:rStyle w:val="Hiperligao"/>
+                <w:noProof/>
+              </w:rPr>
+              <w:t>III.2 Sugestões de melhoria</w:t>
             </w:r>
             <w:r>
               <w:rPr>
@@ -2543,7 +2543,7 @@
                 <w:noProof/>
                 <w:webHidden/>
               </w:rPr>
-              <w:instrText xml:space="preserve"> PAGEREF _Toc211416518 \h </w:instrText>
+              <w:instrText xml:space="preserve"> PAGEREF _Toc211418013 \h </w:instrText>
             </w:r>
             <w:r>
               <w:rPr>
@@ -2576,7 +2576,7 @@
         </w:p>
         <w:p>
           <w:pPr>
-            <w:pStyle w:val="TOC1"/>
+            <w:pStyle w:val="ndice1"/>
             <w:tabs>
               <w:tab w:val="right" w:leader="dot" w:pos="9350"/>
             </w:tabs>
@@ -2588,10 +2588,82 @@
               <w14:ligatures w14:val="standardContextual"/>
             </w:rPr>
           </w:pPr>
-          <w:hyperlink w:anchor="_Toc211416519" w:history="1">
-            <w:r>
-              <w:rPr>
-                <w:rStyle w:val="Hyperlink"/>
+          <w:hyperlink w:anchor="_Toc211418014" w:history="1">
+            <w:r>
+              <w:rPr>
+                <w:rStyle w:val="Hiperligao"/>
+                <w:noProof/>
+              </w:rPr>
+              <w:t>Referências</w:t>
+            </w:r>
+            <w:r>
+              <w:rPr>
+                <w:noProof/>
+                <w:webHidden/>
+              </w:rPr>
+              <w:tab/>
+            </w:r>
+            <w:r>
+              <w:rPr>
+                <w:noProof/>
+                <w:webHidden/>
+              </w:rPr>
+              <w:fldChar w:fldCharType="begin"/>
+            </w:r>
+            <w:r>
+              <w:rPr>
+                <w:noProof/>
+                <w:webHidden/>
+              </w:rPr>
+              <w:instrText xml:space="preserve"> PAGEREF _Toc211418014 \h </w:instrText>
+            </w:r>
+            <w:r>
+              <w:rPr>
+                <w:noProof/>
+                <w:webHidden/>
+              </w:rPr>
+            </w:r>
+            <w:r>
+              <w:rPr>
+                <w:noProof/>
+                <w:webHidden/>
+              </w:rPr>
+              <w:fldChar w:fldCharType="separate"/>
+            </w:r>
+            <w:r>
+              <w:rPr>
+                <w:noProof/>
+                <w:webHidden/>
+              </w:rPr>
+              <w:t>20</w:t>
+            </w:r>
+            <w:r>
+              <w:rPr>
+                <w:noProof/>
+                <w:webHidden/>
+              </w:rPr>
+              <w:fldChar w:fldCharType="end"/>
+            </w:r>
+          </w:hyperlink>
+        </w:p>
+        <w:p>
+          <w:pPr>
+            <w:pStyle w:val="ndice1"/>
+            <w:tabs>
+              <w:tab w:val="right" w:leader="dot" w:pos="9350"/>
+            </w:tabs>
+            <w:rPr>
+              <w:rFonts w:asciiTheme="minorHAnsi" w:eastAsiaTheme="minorEastAsia" w:hAnsiTheme="minorHAnsi" w:cstheme="minorBidi"/>
+              <w:noProof/>
+              <w:kern w:val="2"/>
+              <w:sz w:val="24"/>
+              <w14:ligatures w14:val="standardContextual"/>
+            </w:rPr>
+          </w:pPr>
+          <w:hyperlink w:anchor="_Toc211418015" w:history="1">
+            <w:r>
+              <w:rPr>
+                <w:rStyle w:val="Hiperligao"/>
                 <w:rFonts w:eastAsia="Arial Narrow"/>
                 <w:noProof/>
               </w:rPr>
@@ -2616,7 +2688,7 @@
                 <w:noProof/>
                 <w:webHidden/>
               </w:rPr>
-              <w:instrText xml:space="preserve"> PAGEREF _Toc211416519 \h </w:instrText>
+              <w:instrText xml:space="preserve"> PAGEREF _Toc211418015 \h </w:instrText>
             </w:r>
             <w:r>
               <w:rPr>
@@ -2636,7 +2708,7 @@
                 <w:noProof/>
                 <w:webHidden/>
               </w:rPr>
-              <w:t>19</w:t>
+              <w:t>20</w:t>
             </w:r>
             <w:r>
               <w:rPr>
@@ -2649,6 +2721,7 @@
         </w:p>
         <w:p>
           <w:r>
+            <w:lastRenderedPageBreak/>
             <w:fldChar w:fldCharType="end"/>
           </w:r>
         </w:p>
@@ -2685,7 +2758,7 @@
     </w:p>
     <w:p>
       <w:pPr>
-        <w:pStyle w:val="Heading1"/>
+        <w:pStyle w:val="Ttulo1"/>
         <w:spacing w:line="360" w:lineRule="auto"/>
         <w:jc w:val="both"/>
         <w:rPr>
@@ -2693,12 +2766,13 @@
           <w:lang w:bidi="pt-PT"/>
         </w:rPr>
       </w:pPr>
-      <w:bookmarkStart w:id="4" w:name="_Toc211416493"/>
+      <w:bookmarkStart w:id="4" w:name="_Toc211417988"/>
       <w:r>
         <w:rPr>
           <w:sz w:val="24"/>
           <w:lang w:bidi="pt-PT"/>
         </w:rPr>
+        <w:lastRenderedPageBreak/>
         <w:t>Índice de quadros, figuras, abreviaturas</w:t>
       </w:r>
       <w:bookmarkEnd w:id="3"/>
@@ -2713,12 +2787,12 @@
     </w:p>
     <w:p>
       <w:pPr>
-        <w:pStyle w:val="Heading2"/>
+        <w:pStyle w:val="Ttulo2"/>
         <w:rPr>
           <w:lang w:bidi="pt-PT"/>
         </w:rPr>
       </w:pPr>
-      <w:bookmarkStart w:id="5" w:name="_Toc211416494"/>
+      <w:bookmarkStart w:id="5" w:name="_Toc211417989"/>
       <w:r>
         <w:rPr>
           <w:lang w:bidi="pt-PT"/>
@@ -2788,7 +2862,7 @@
     </w:p>
     <w:p>
       <w:pPr>
-        <w:pStyle w:val="Caption"/>
+        <w:pStyle w:val="Legenda"/>
         <w:spacing w:line="276" w:lineRule="auto"/>
         <w:jc w:val="center"/>
         <w:rPr>
@@ -2842,9 +2916,9 @@
     <w:p/>
     <w:p>
       <w:pPr>
-        <w:pStyle w:val="Heading2"/>
-      </w:pPr>
-      <w:bookmarkStart w:id="6" w:name="_Toc211416495"/>
+        <w:pStyle w:val="Ttulo2"/>
+      </w:pPr>
+      <w:bookmarkStart w:id="6" w:name="_Toc211417990"/>
       <w:r>
         <w:t>Opções Estratégicas para o Porto de Sines</w:t>
       </w:r>
@@ -2919,7 +2993,7 @@
     </w:p>
     <w:p>
       <w:pPr>
-        <w:pStyle w:val="Caption"/>
+        <w:pStyle w:val="Legenda"/>
         <w:spacing w:line="276" w:lineRule="auto"/>
         <w:jc w:val="center"/>
         <w:rPr>
@@ -2972,7 +3046,7 @@
     </w:p>
     <w:p>
       <w:pPr>
-        <w:pStyle w:val="Caption"/>
+        <w:pStyle w:val="Legenda"/>
         <w:jc w:val="center"/>
         <w:rPr>
           <w:color w:val="auto"/>
@@ -2989,6 +3063,7 @@
         <w:rPr>
           <w:noProof/>
         </w:rPr>
+        <w:lastRenderedPageBreak/>
         <w:drawing>
           <wp:inline distT="0" distB="0" distL="0" distR="0" wp14:anchorId="592B524A" wp14:editId="2E889A6F">
             <wp:extent cx="5220000" cy="2818800"/>
@@ -3039,7 +3114,7 @@
     </w:p>
     <w:p>
       <w:pPr>
-        <w:pStyle w:val="Caption"/>
+        <w:pStyle w:val="Legenda"/>
         <w:spacing w:line="276" w:lineRule="auto"/>
         <w:jc w:val="center"/>
         <w:rPr>
@@ -3175,7 +3250,7 @@
     </w:p>
     <w:p>
       <w:pPr>
-        <w:pStyle w:val="Caption"/>
+        <w:pStyle w:val="Legenda"/>
         <w:spacing w:line="276" w:lineRule="auto"/>
         <w:jc w:val="center"/>
       </w:pPr>
@@ -3233,6 +3308,7 @@
         <w:rPr>
           <w:noProof/>
         </w:rPr>
+        <w:lastRenderedPageBreak/>
         <w:drawing>
           <wp:inline distT="0" distB="0" distL="0" distR="0" wp14:anchorId="1BF2137B" wp14:editId="159A1EB2">
             <wp:extent cx="5220000" cy="2002381"/>
@@ -3283,7 +3359,7 @@
     </w:p>
     <w:p>
       <w:pPr>
-        <w:pStyle w:val="Caption"/>
+        <w:pStyle w:val="Legenda"/>
         <w:spacing w:line="276" w:lineRule="auto"/>
         <w:jc w:val="center"/>
         <w:rPr>
@@ -3331,7 +3407,21 @@
         <w:rPr>
           <w:color w:val="auto"/>
         </w:rPr>
-        <w:t xml:space="preserve"> - Legacy (riscos estratégicos)</w:t>
+        <w:t xml:space="preserve"> - </w:t>
+      </w:r>
+      <w:proofErr w:type="spellStart"/>
+      <w:r>
+        <w:rPr>
+          <w:color w:val="auto"/>
+        </w:rPr>
+        <w:t>Legacy</w:t>
+      </w:r>
+      <w:proofErr w:type="spellEnd"/>
+      <w:r>
+        <w:rPr>
+          <w:color w:val="auto"/>
+        </w:rPr>
+        <w:t xml:space="preserve"> (riscos estratégicos)</w:t>
       </w:r>
     </w:p>
     <w:p>
@@ -3401,7 +3491,7 @@
     </w:p>
     <w:p>
       <w:pPr>
-        <w:pStyle w:val="Caption"/>
+        <w:pStyle w:val="Legenda"/>
         <w:spacing w:line="276" w:lineRule="auto"/>
         <w:jc w:val="center"/>
         <w:rPr>
@@ -3462,6 +3552,7 @@
         <w:rPr>
           <w:noProof/>
         </w:rPr>
+        <w:lastRenderedPageBreak/>
         <w:drawing>
           <wp:inline distT="0" distB="0" distL="0" distR="0" wp14:anchorId="74B1D955" wp14:editId="48224FE5">
             <wp:extent cx="3255837" cy="3060000"/>
@@ -3506,7 +3597,7 @@
     </w:p>
     <w:p>
       <w:pPr>
-        <w:pStyle w:val="Caption"/>
+        <w:pStyle w:val="Legenda"/>
         <w:spacing w:line="276" w:lineRule="auto"/>
         <w:jc w:val="center"/>
         <w:rPr>
@@ -3554,7 +3645,21 @@
         <w:rPr>
           <w:color w:val="auto"/>
         </w:rPr>
-        <w:t xml:space="preserve"> - Enablers de competitividade (recursos e competências)</w:t>
+        <w:t xml:space="preserve"> - </w:t>
+      </w:r>
+      <w:proofErr w:type="spellStart"/>
+      <w:r>
+        <w:rPr>
+          <w:color w:val="auto"/>
+        </w:rPr>
+        <w:t>Enablers</w:t>
+      </w:r>
+      <w:proofErr w:type="spellEnd"/>
+      <w:r>
+        <w:rPr>
+          <w:color w:val="auto"/>
+        </w:rPr>
+        <w:t xml:space="preserve"> de competitividade (recursos e competências)</w:t>
       </w:r>
     </w:p>
     <w:p/>
@@ -3637,7 +3742,7 @@
     </w:p>
     <w:p>
       <w:pPr>
-        <w:pStyle w:val="Caption"/>
+        <w:pStyle w:val="Legenda"/>
         <w:spacing w:line="276" w:lineRule="auto"/>
         <w:jc w:val="center"/>
         <w:rPr>
@@ -3685,7 +3790,21 @@
         <w:rPr>
           <w:color w:val="auto"/>
         </w:rPr>
-        <w:t xml:space="preserve"> - Visão dos Stakeholders (competitividade</w:t>
+        <w:t xml:space="preserve"> - Visão dos </w:t>
+      </w:r>
+      <w:proofErr w:type="spellStart"/>
+      <w:r>
+        <w:rPr>
+          <w:color w:val="auto"/>
+        </w:rPr>
+        <w:t>Stakeholders</w:t>
+      </w:r>
+      <w:proofErr w:type="spellEnd"/>
+      <w:r>
+        <w:rPr>
+          <w:color w:val="auto"/>
+        </w:rPr>
+        <w:t xml:space="preserve"> (competitividade</w:t>
       </w:r>
       <w:r>
         <w:rPr>
@@ -3755,7 +3874,7 @@
     </w:p>
     <w:p>
       <w:pPr>
-        <w:pStyle w:val="Caption"/>
+        <w:pStyle w:val="Legenda"/>
         <w:spacing w:line="276" w:lineRule="auto"/>
         <w:jc w:val="center"/>
         <w:rPr>
@@ -3803,7 +3922,21 @@
         <w:rPr>
           <w:color w:val="auto"/>
         </w:rPr>
-        <w:t xml:space="preserve"> - Visão dos Stakeholders (cooperação)</w:t>
+        <w:t xml:space="preserve"> - Visão dos </w:t>
+      </w:r>
+      <w:proofErr w:type="spellStart"/>
+      <w:r>
+        <w:rPr>
+          <w:color w:val="auto"/>
+        </w:rPr>
+        <w:t>Stakeholders</w:t>
+      </w:r>
+      <w:proofErr w:type="spellEnd"/>
+      <w:r>
+        <w:rPr>
+          <w:color w:val="auto"/>
+        </w:rPr>
+        <w:t xml:space="preserve"> (cooperação)</w:t>
       </w:r>
     </w:p>
     <w:p>
@@ -3816,6 +3949,7 @@
         <w:rPr>
           <w:noProof/>
         </w:rPr>
+        <w:lastRenderedPageBreak/>
         <w:drawing>
           <wp:inline distT="0" distB="0" distL="0" distR="0" wp14:anchorId="4B4F6653" wp14:editId="72D7B707">
             <wp:extent cx="5220000" cy="2475107"/>
@@ -3866,7 +4000,7 @@
     </w:p>
     <w:p>
       <w:pPr>
-        <w:pStyle w:val="Caption"/>
+        <w:pStyle w:val="Legenda"/>
         <w:spacing w:line="276" w:lineRule="auto"/>
         <w:jc w:val="center"/>
       </w:pPr>
@@ -3911,7 +4045,21 @@
         <w:rPr>
           <w:color w:val="auto"/>
         </w:rPr>
-        <w:t xml:space="preserve"> - Visão dos Stakeholders (expectativas)</w:t>
+        <w:t xml:space="preserve"> - Visão dos </w:t>
+      </w:r>
+      <w:proofErr w:type="spellStart"/>
+      <w:r>
+        <w:rPr>
+          <w:color w:val="auto"/>
+        </w:rPr>
+        <w:t>Stakeholders</w:t>
+      </w:r>
+      <w:proofErr w:type="spellEnd"/>
+      <w:r>
+        <w:rPr>
+          <w:color w:val="auto"/>
+        </w:rPr>
+        <w:t xml:space="preserve"> (expectativas)</w:t>
       </w:r>
     </w:p>
     <w:p>
@@ -3923,16 +4071,21 @@
     </w:p>
     <w:p>
       <w:pPr>
-        <w:pStyle w:val="Heading2"/>
-      </w:pPr>
-      <w:bookmarkStart w:id="7" w:name="_Toc211416496"/>
-      <w:r>
-        <w:t>Ligações e Hi</w:t>
+        <w:pStyle w:val="Ttulo2"/>
+      </w:pPr>
+      <w:bookmarkStart w:id="7" w:name="_Toc211417991"/>
+      <w:r>
+        <w:t xml:space="preserve">Ligações e </w:t>
+      </w:r>
+      <w:proofErr w:type="spellStart"/>
+      <w:r>
+        <w:t>Hi</w:t>
       </w:r>
       <w:r>
         <w:t>nterland</w:t>
       </w:r>
       <w:bookmarkEnd w:id="7"/>
+      <w:proofErr w:type="spellEnd"/>
     </w:p>
     <w:p>
       <w:pPr>
@@ -4013,7 +4166,7 @@
     </w:p>
     <w:p>
       <w:pPr>
-        <w:pStyle w:val="Caption"/>
+        <w:pStyle w:val="Legenda"/>
         <w:spacing w:line="276" w:lineRule="auto"/>
         <w:jc w:val="center"/>
         <w:rPr>
@@ -4061,7 +4214,21 @@
         <w:rPr>
           <w:color w:val="auto"/>
         </w:rPr>
-        <w:t xml:space="preserve"> - Ligações estratégicas do Porto de Sines: acessos marítimos globais e hinterland ibéric</w:t>
+        <w:t xml:space="preserve"> - Ligações estratégicas do Porto de Sines: acessos marítimos globais e </w:t>
+      </w:r>
+      <w:proofErr w:type="spellStart"/>
+      <w:r>
+        <w:rPr>
+          <w:color w:val="auto"/>
+        </w:rPr>
+        <w:t>hinterland</w:t>
+      </w:r>
+      <w:proofErr w:type="spellEnd"/>
+      <w:r>
+        <w:rPr>
+          <w:color w:val="auto"/>
+        </w:rPr>
+        <w:t xml:space="preserve"> ibéric</w:t>
       </w:r>
       <w:r>
         <w:rPr>
@@ -4072,7 +4239,7 @@
     </w:p>
     <w:p>
       <w:pPr>
-        <w:pStyle w:val="Caption"/>
+        <w:pStyle w:val="Legenda"/>
         <w:spacing w:line="276" w:lineRule="auto"/>
         <w:rPr>
           <w:color w:val="auto"/>
@@ -4081,37 +4248,38 @@
     </w:p>
     <w:p>
       <w:pPr>
-        <w:pStyle w:val="Heading2"/>
-      </w:pPr>
-    </w:p>
-    <w:p>
-      <w:pPr>
-        <w:pStyle w:val="Heading2"/>
-      </w:pPr>
-    </w:p>
-    <w:p>
-      <w:pPr>
-        <w:pStyle w:val="Heading2"/>
-      </w:pPr>
-    </w:p>
-    <w:p>
-      <w:pPr>
-        <w:pStyle w:val="Heading2"/>
-      </w:pPr>
-    </w:p>
-    <w:p>
-      <w:pPr>
-        <w:pStyle w:val="Heading2"/>
-      </w:pPr>
-      <w:bookmarkStart w:id="8" w:name="_Toc211416497"/>
-      <w:r>
+        <w:pStyle w:val="Ttulo2"/>
+      </w:pPr>
+    </w:p>
+    <w:p>
+      <w:pPr>
+        <w:pStyle w:val="Ttulo2"/>
+      </w:pPr>
+    </w:p>
+    <w:p>
+      <w:pPr>
+        <w:pStyle w:val="Ttulo2"/>
+      </w:pPr>
+    </w:p>
+    <w:p>
+      <w:pPr>
+        <w:pStyle w:val="Ttulo2"/>
+      </w:pPr>
+    </w:p>
+    <w:p>
+      <w:pPr>
+        <w:pStyle w:val="Ttulo2"/>
+      </w:pPr>
+      <w:bookmarkStart w:id="8" w:name="_Toc211417992"/>
+      <w:r>
+        <w:lastRenderedPageBreak/>
         <w:t>Estatísticas</w:t>
       </w:r>
       <w:bookmarkEnd w:id="8"/>
     </w:p>
     <w:p>
       <w:pPr>
-        <w:pStyle w:val="Heading3"/>
+        <w:pStyle w:val="Ttulo3"/>
         <w:rPr>
           <w:b/>
           <w:bCs/>
@@ -4120,7 +4288,7 @@
           <w:szCs w:val="20"/>
         </w:rPr>
       </w:pPr>
-      <w:bookmarkStart w:id="9" w:name="_Toc211416498"/>
+      <w:bookmarkStart w:id="9" w:name="_Toc211417993"/>
       <w:r>
         <w:rPr>
           <w:b/>
@@ -4197,7 +4365,7 @@
     </w:p>
     <w:p>
       <w:pPr>
-        <w:pStyle w:val="Caption"/>
+        <w:pStyle w:val="Legenda"/>
         <w:spacing w:line="276" w:lineRule="auto"/>
         <w:jc w:val="center"/>
         <w:rPr>
@@ -4268,7 +4436,7 @@
     </w:p>
     <w:p>
       <w:pPr>
-        <w:pStyle w:val="Caption"/>
+        <w:pStyle w:val="Legenda"/>
         <w:spacing w:line="276" w:lineRule="auto"/>
         <w:jc w:val="center"/>
         <w:rPr>
@@ -4330,7 +4498,7 @@
     </w:p>
     <w:p>
       <w:pPr>
-        <w:pStyle w:val="Caption"/>
+        <w:pStyle w:val="Legenda"/>
         <w:spacing w:line="276" w:lineRule="auto"/>
         <w:jc w:val="center"/>
         <w:rPr>
@@ -4398,6 +4566,7 @@
         <w:rPr>
           <w:noProof/>
         </w:rPr>
+        <w:lastRenderedPageBreak/>
         <w:drawing>
           <wp:inline distT="0" distB="0" distL="0" distR="0" wp14:anchorId="01CFF356" wp14:editId="12E4EBDB">
             <wp:extent cx="5220000" cy="2927327"/>
@@ -4442,7 +4611,7 @@
     </w:p>
     <w:p>
       <w:pPr>
-        <w:pStyle w:val="Caption"/>
+        <w:pStyle w:val="Legenda"/>
         <w:spacing w:line="276" w:lineRule="auto"/>
         <w:jc w:val="center"/>
         <w:rPr>
@@ -4502,7 +4671,7 @@
     <w:p/>
     <w:p>
       <w:pPr>
-        <w:pStyle w:val="Heading3"/>
+        <w:pStyle w:val="Ttulo3"/>
         <w:rPr>
           <w:b/>
           <w:bCs/>
@@ -4511,7 +4680,7 @@
           <w:szCs w:val="20"/>
         </w:rPr>
       </w:pPr>
-      <w:bookmarkStart w:id="10" w:name="_Toc211416499"/>
+      <w:bookmarkStart w:id="10" w:name="_Toc211417994"/>
       <w:r>
         <w:rPr>
           <w:b/>
@@ -4584,7 +4753,7 @@
     </w:p>
     <w:p>
       <w:pPr>
-        <w:pStyle w:val="Caption"/>
+        <w:pStyle w:val="Legenda"/>
         <w:spacing w:line="276" w:lineRule="auto"/>
         <w:jc w:val="center"/>
         <w:rPr>
@@ -4651,6 +4820,7 @@
         <w:rPr>
           <w:noProof/>
         </w:rPr>
+        <w:lastRenderedPageBreak/>
         <w:drawing>
           <wp:inline distT="0" distB="0" distL="0" distR="0" wp14:anchorId="6ECB99ED" wp14:editId="2042AAEB">
             <wp:extent cx="5220000" cy="2841283"/>
@@ -4701,7 +4871,7 @@
     </w:p>
     <w:p>
       <w:pPr>
-        <w:pStyle w:val="Caption"/>
+        <w:pStyle w:val="Legenda"/>
         <w:spacing w:line="276" w:lineRule="auto"/>
         <w:jc w:val="center"/>
         <w:rPr>
@@ -4818,7 +4988,7 @@
     </w:p>
     <w:p>
       <w:pPr>
-        <w:pStyle w:val="Caption"/>
+        <w:pStyle w:val="Legenda"/>
         <w:spacing w:line="276" w:lineRule="auto"/>
         <w:jc w:val="center"/>
         <w:rPr>
@@ -4903,7 +5073,7 @@
     </w:p>
     <w:p>
       <w:pPr>
-        <w:pStyle w:val="Heading3"/>
+        <w:pStyle w:val="Ttulo3"/>
         <w:rPr>
           <w:b/>
           <w:bCs/>
@@ -4912,7 +5082,7 @@
           <w:szCs w:val="20"/>
         </w:rPr>
       </w:pPr>
-      <w:bookmarkStart w:id="11" w:name="_Toc211416500"/>
+      <w:bookmarkStart w:id="11" w:name="_Toc211417995"/>
       <w:r>
         <w:rPr>
           <w:b/>
@@ -4921,6 +5091,7 @@
           <w:sz w:val="20"/>
           <w:szCs w:val="20"/>
         </w:rPr>
+        <w:lastRenderedPageBreak/>
         <w:t>Passageiros</w:t>
       </w:r>
       <w:bookmarkEnd w:id="11"/>
@@ -5004,7 +5175,7 @@
     </w:p>
     <w:p>
       <w:pPr>
-        <w:pStyle w:val="Caption"/>
+        <w:pStyle w:val="Legenda"/>
         <w:spacing w:line="276" w:lineRule="auto"/>
         <w:jc w:val="center"/>
         <w:rPr>
@@ -5082,7 +5253,7 @@
     <w:p/>
     <w:p>
       <w:pPr>
-        <w:pStyle w:val="Caption"/>
+        <w:pStyle w:val="Legenda"/>
         <w:spacing w:line="276" w:lineRule="auto"/>
         <w:jc w:val="center"/>
       </w:pPr>
@@ -5092,10 +5263,11 @@
     </w:p>
     <w:p>
       <w:pPr>
-        <w:pStyle w:val="Heading1"/>
-      </w:pPr>
-      <w:bookmarkStart w:id="12" w:name="_Toc211416501"/>
-      <w:r>
+        <w:pStyle w:val="Ttulo1"/>
+      </w:pPr>
+      <w:bookmarkStart w:id="12" w:name="_Toc211417996"/>
+      <w:r>
+        <w:lastRenderedPageBreak/>
         <w:t>Parte I – Introdução e estrutura do trabalho</w:t>
       </w:r>
       <w:bookmarkEnd w:id="12"/>
@@ -5103,9 +5275,9 @@
     <w:p/>
     <w:p>
       <w:pPr>
-        <w:pStyle w:val="Heading2"/>
-      </w:pPr>
-      <w:bookmarkStart w:id="13" w:name="_Toc211416502"/>
+        <w:pStyle w:val="Ttulo2"/>
+      </w:pPr>
+      <w:bookmarkStart w:id="13" w:name="_Toc211417997"/>
       <w:r>
         <w:t>I.1 Caracterização da organização</w:t>
       </w:r>
@@ -5118,7 +5290,15 @@
     </w:p>
     <w:p>
       <w:r>
-        <w:t>A APS tem como missão administrar, conservar e desenvolver os portos sob a sua responsabilidade, promovendo serviços eficientes, seguros e sustentáveis. O seu objetivo estratégico é consolidar o Porto de Sines como um hub logístico, energético e industrial de referência no Atlântico, enquanto reforça a importância dos Portos de Faro e Portimão como infraestruturas de apoio ao turismo de cruzeiros e ao transporte marítimo regional.</w:t>
+        <w:t xml:space="preserve">A APS tem como missão administrar, conservar e desenvolver os portos sob a sua responsabilidade, promovendo serviços eficientes, seguros e sustentáveis. O seu objetivo estratégico é consolidar o Porto de Sines como um </w:t>
+      </w:r>
+      <w:proofErr w:type="spellStart"/>
+      <w:r>
+        <w:t>hub</w:t>
+      </w:r>
+      <w:proofErr w:type="spellEnd"/>
+      <w:r>
+        <w:t xml:space="preserve"> logístico, energético e industrial de referência no Atlântico, enquanto reforça a importância dos Portos de Faro e Portimão como infraestruturas de apoio ao turismo de cruzeiros e ao transporte marítimo regional.</w:t>
       </w:r>
     </w:p>
     <w:p>
@@ -5138,12 +5318,37 @@
     </w:p>
     <w:p>
       <w:r>
-        <w:t>Em termos de indicadores-chave, o Porto de Sines movimenta anualmente mais de 50 milhões de toneladas de carga, representando uma parcela expressiva do comércio externo nacional. É líder em movimentação de contentores em Portugal, com cerca de 65% das operações correspondentes a transshipment (transbordo). A APS emprega cerca de 200 colaboradores, e o ecossistema portuário sob a sua administração envolve milhares de empregos indiretos.</w:t>
-      </w:r>
-    </w:p>
-    <w:p>
-      <w:r>
-        <w:t xml:space="preserve">Entre os seus principais parceiros e stakeholders encontram-se o Governo Português, as </w:t>
+        <w:t xml:space="preserve">Em termos de indicadores-chave, o Porto de Sines movimenta anualmente mais de 50 milhões de toneladas de carga, representando uma parcela expressiva do comércio externo nacional. É líder em movimentação de contentores em Portugal, com cerca de 65% das operações correspondentes a </w:t>
+      </w:r>
+      <w:proofErr w:type="spellStart"/>
+      <w:r>
+        <w:t>transshipment</w:t>
+      </w:r>
+      <w:proofErr w:type="spellEnd"/>
+      <w:r>
+        <w:t xml:space="preserve"> (transbordo). A APS emprega cerca de 200 colaboradores, e o ecossistema portuário sob a sua administração envolve milhares de empregos indiretos.</w:t>
+      </w:r>
+    </w:p>
+    <w:p>
+      <w:r>
+        <w:lastRenderedPageBreak/>
+        <w:t xml:space="preserve">Entre os seus principais parceiros e </w:t>
+      </w:r>
+      <w:proofErr w:type="spellStart"/>
+      <w:r>
+        <w:t>stakeholders</w:t>
+      </w:r>
+      <w:proofErr w:type="spellEnd"/>
+      <w:r>
+        <w:t xml:space="preserve"> encontram-se o Governo </w:t>
+      </w:r>
+      <w:proofErr w:type="gramStart"/>
+      <w:r>
+        <w:t>Português</w:t>
+      </w:r>
+      <w:proofErr w:type="gramEnd"/>
+      <w:r>
+        <w:t xml:space="preserve">, as </w:t>
       </w:r>
       <w:r>
         <w:t xml:space="preserve">concessionárias </w:t>
@@ -5152,7 +5357,15 @@
         <w:t>de</w:t>
       </w:r>
       <w:r>
-        <w:t xml:space="preserve"> terminais (como a PSA Sines e a REN Atlântico), empresas energéticas e industriais (Galp, Repsol, EDP, entre outras), operadores logísticos, municípios e entidades locais. A APS adota sistemas de gestão certificados nas áreas da qualidade, ambiente e segurança, seguindo normas internacionais (ISO 9001, ISO 14001, ISO 45001), e mantém políticas de compliance e transparência alinhadas com os princípios de bom governo corporativo.</w:t>
+        <w:t xml:space="preserve"> terminais (como a PSA Sines e a REN Atlântico), empresas energéticas e industriais (Galp, Repsol, EDP, entre outras), operadores logísticos, municípios e entidades locais. A APS adota sistemas de gestão certificados nas áreas da qualidade, ambiente e segurança, seguindo normas internacionais (ISO 9001, ISO 14001, ISO 45001), e mantém políticas de </w:t>
+      </w:r>
+      <w:proofErr w:type="spellStart"/>
+      <w:r>
+        <w:t>compliance</w:t>
+      </w:r>
+      <w:proofErr w:type="spellEnd"/>
+      <w:r>
+        <w:t xml:space="preserve"> e transparência alinhadas com os princípios de bom governo corporativo.</w:t>
       </w:r>
     </w:p>
     <w:p>
@@ -5163,9 +5376,9 @@
     <w:p/>
     <w:p>
       <w:pPr>
-        <w:pStyle w:val="Heading2"/>
-      </w:pPr>
-      <w:bookmarkStart w:id="14" w:name="_Toc211416503"/>
+        <w:pStyle w:val="Ttulo2"/>
+      </w:pPr>
+      <w:bookmarkStart w:id="14" w:name="_Toc211417998"/>
       <w:r>
         <w:t>I.2 Fontes de informação</w:t>
       </w:r>
@@ -5184,14 +5397,15 @@
     </w:p>
     <w:p>
       <w:pPr>
-        <w:pStyle w:val="Heading1"/>
+        <w:pStyle w:val="Ttulo1"/>
         <w:rPr>
           <w:rFonts w:cstheme="minorBidi"/>
           <w:szCs w:val="22"/>
         </w:rPr>
       </w:pPr>
-      <w:bookmarkStart w:id="15" w:name="_Toc211416504"/>
-      <w:r>
+      <w:bookmarkStart w:id="15" w:name="_Toc211417999"/>
+      <w:r>
+        <w:lastRenderedPageBreak/>
         <w:t xml:space="preserve">Parte II – </w:t>
       </w:r>
       <w:r>
@@ -5202,9 +5416,9 @@
     <w:p/>
     <w:p>
       <w:pPr>
-        <w:pStyle w:val="Heading2"/>
-      </w:pPr>
-      <w:bookmarkStart w:id="16" w:name="_Toc211416505"/>
+        <w:pStyle w:val="Ttulo2"/>
+      </w:pPr>
+      <w:bookmarkStart w:id="16" w:name="_Toc211418000"/>
       <w:r>
         <w:t>II.</w:t>
       </w:r>
@@ -5224,7 +5438,7 @@
     </w:p>
     <w:p>
       <w:pPr>
-        <w:pStyle w:val="Heading3"/>
+        <w:pStyle w:val="Ttulo3"/>
         <w:rPr>
           <w:b/>
           <w:bCs/>
@@ -5234,7 +5448,7 @@
         </w:rPr>
       </w:pPr>
       <w:bookmarkStart w:id="17" w:name="_Toc211333575"/>
-      <w:bookmarkStart w:id="18" w:name="_Toc211416506"/>
+      <w:bookmarkStart w:id="18" w:name="_Toc211418001"/>
       <w:r>
         <w:rPr>
           <w:b/>
@@ -5333,6 +5547,7 @@
     </w:p>
     <w:p>
       <w:r>
+        <w:lastRenderedPageBreak/>
         <w:t>No entanto, a estrutura formal ainda apresenta características de centralização decisória, com decisões estratégicas concentradas no Conselho de Administração. Apesar disso, há evidências de estruturas informais de cooperação entre direções, especialmente em projetos transversais (por exemplo, iniciativas de eficiência energética ou de transformação digital). Esta articulação informal tem contribuído para maior agilidade na resposta a desafios emergentes, como os associados à transição verde e à digitalização dos processos portuários.</w:t>
       </w:r>
     </w:p>
@@ -5347,7 +5562,7 @@
     <w:p/>
     <w:p>
       <w:pPr>
-        <w:pStyle w:val="Heading3"/>
+        <w:pStyle w:val="Ttulo3"/>
         <w:rPr>
           <w:b/>
           <w:bCs/>
@@ -5357,6 +5572,7 @@
         </w:rPr>
       </w:pPr>
       <w:bookmarkStart w:id="19" w:name="_Toc211333576"/>
+      <w:bookmarkStart w:id="20" w:name="_Toc211418002"/>
       <w:r>
         <w:rPr>
           <w:b/>
@@ -5368,6 +5584,7 @@
         <w:t>Proposta de melhoria</w:t>
       </w:r>
       <w:bookmarkEnd w:id="19"/>
+      <w:bookmarkEnd w:id="20"/>
     </w:p>
     <w:p>
       <w:r>
@@ -5463,6 +5680,7 @@
         </w:numPr>
       </w:pPr>
       <w:r>
+        <w:lastRenderedPageBreak/>
         <w:t>Justificação: A crescente exigência de relatórios de desempenho ambiental e indicadores logísticos requer competências analíticas avançadas.</w:t>
       </w:r>
     </w:p>
@@ -5474,7 +5692,31 @@
         </w:numPr>
       </w:pPr>
       <w:r>
-        <w:t>Ação recomendada: Recrutamento de analistas de dados e especialistas em ESG (Environmental, Social and Governance).</w:t>
+        <w:t>Ação recomendada: Recrutamento de analistas de dados e especialistas em ESG (</w:t>
+      </w:r>
+      <w:proofErr w:type="spellStart"/>
+      <w:r>
+        <w:t>Environmental</w:t>
+      </w:r>
+      <w:proofErr w:type="spellEnd"/>
+      <w:r>
+        <w:t xml:space="preserve">, Social </w:t>
+      </w:r>
+      <w:proofErr w:type="spellStart"/>
+      <w:r>
+        <w:t>and</w:t>
+      </w:r>
+      <w:proofErr w:type="spellEnd"/>
+      <w:r>
+        <w:t xml:space="preserve"> </w:t>
+      </w:r>
+      <w:proofErr w:type="spellStart"/>
+      <w:r>
+        <w:t>Governance</w:t>
+      </w:r>
+      <w:proofErr w:type="spellEnd"/>
+      <w:r>
+        <w:t>).</w:t>
       </w:r>
     </w:p>
     <w:p>
@@ -5541,9 +5783,9 @@
     <w:p/>
     <w:p>
       <w:pPr>
-        <w:pStyle w:val="Heading2"/>
-      </w:pPr>
-      <w:bookmarkStart w:id="20" w:name="_Toc211416507"/>
+        <w:pStyle w:val="Ttulo2"/>
+      </w:pPr>
+      <w:bookmarkStart w:id="21" w:name="_Toc211418003"/>
       <w:r>
         <w:t>II.</w:t>
       </w:r>
@@ -5556,7 +5798,20 @@
       <w:r>
         <w:t>Planeamento</w:t>
       </w:r>
-      <w:bookmarkEnd w:id="20"/>
+      <w:bookmarkEnd w:id="21"/>
+    </w:p>
+    <w:p>
+      <w:r>
+        <w:t>O planeamento estratégico da APS está alinhado com a Estratégia Nacional para o Mar 2030 e com as prioridades europeias de transição energética, digital e verde, definidas no Pacto Ecológico Europeu.</w:t>
+      </w:r>
+      <w:r>
+        <w:br/>
+        <w:t>Este planeamento define como eixos estruturantes a expansão e modernização das infraestruturas portuárias, o reforço da eficiência logística, a sustentabilidade ambiental e a inovação tecnológica.</w:t>
+      </w:r>
+      <w:r>
+        <w:br/>
+        <w:t>A APS procura integrar estes pilares através de investimentos em projetos como a ampliação do Terminal XXI, a criação do novo Terminal Vasco da Gama e a implementação de sistemas digitais integrados de gestão portuária, reforçando a sua posição como plataforma logística estratégica para o comércio atlântico e ibérico.</w:t>
+      </w:r>
     </w:p>
     <w:p>
       <w:pPr>
@@ -5567,20 +5822,31 @@
           <w:b/>
         </w:rPr>
       </w:pPr>
-      <w:r>
+    </w:p>
+    <w:p>
+      <w:pPr>
+        <w:spacing w:line="240" w:lineRule="auto"/>
+        <w:jc w:val="left"/>
         <w:rPr>
           <w:rFonts w:cs="Times New Roman"/>
           <w:b/>
         </w:rPr>
+      </w:pPr>
+      <w:r>
+        <w:rPr>
+          <w:rFonts w:cs="Times New Roman"/>
+          <w:b/>
+        </w:rPr>
         <w:br w:type="page"/>
       </w:r>
     </w:p>
     <w:p>
       <w:pPr>
-        <w:pStyle w:val="Heading2"/>
-      </w:pPr>
-      <w:bookmarkStart w:id="21" w:name="_Toc211416508"/>
-      <w:r>
+        <w:pStyle w:val="Ttulo2"/>
+      </w:pPr>
+      <w:bookmarkStart w:id="22" w:name="_Toc211418004"/>
+      <w:r>
+        <w:lastRenderedPageBreak/>
         <w:t>II.</w:t>
       </w:r>
       <w:r>
@@ -5592,14 +5858,14 @@
       <w:r>
         <w:t xml:space="preserve"> e Sistemas de informação</w:t>
       </w:r>
-      <w:bookmarkEnd w:id="21"/>
+      <w:bookmarkEnd w:id="22"/>
     </w:p>
     <w:p/>
     <w:p>
       <w:pPr>
-        <w:pStyle w:val="Heading2"/>
-      </w:pPr>
-      <w:bookmarkStart w:id="22" w:name="_Toc211416509"/>
+        <w:pStyle w:val="Ttulo2"/>
+      </w:pPr>
+      <w:bookmarkStart w:id="23" w:name="_Toc211418005"/>
       <w:r>
         <w:t>II</w:t>
       </w:r>
@@ -5624,50 +5890,50 @@
       <w:r>
         <w:t>Pessoas</w:t>
       </w:r>
-      <w:bookmarkEnd w:id="22"/>
+      <w:bookmarkEnd w:id="23"/>
     </w:p>
     <w:p/>
     <w:p>
       <w:pPr>
-        <w:pStyle w:val="Heading2"/>
-      </w:pPr>
-      <w:bookmarkStart w:id="23" w:name="_Toc211416510"/>
+        <w:pStyle w:val="Ttulo2"/>
+      </w:pPr>
+      <w:bookmarkStart w:id="24" w:name="_Toc211418006"/>
       <w:r>
         <w:t>II.5 Promoção da produtividade</w:t>
       </w:r>
-      <w:bookmarkEnd w:id="23"/>
+      <w:bookmarkEnd w:id="24"/>
     </w:p>
     <w:p/>
     <w:p>
       <w:pPr>
-        <w:pStyle w:val="Heading2"/>
-      </w:pPr>
-      <w:bookmarkStart w:id="24" w:name="_Toc211416511"/>
+        <w:pStyle w:val="Ttulo2"/>
+      </w:pPr>
+      <w:bookmarkStart w:id="25" w:name="_Toc211418007"/>
       <w:r>
         <w:t>II.6 Economia circular</w:t>
       </w:r>
-      <w:bookmarkEnd w:id="24"/>
+      <w:bookmarkEnd w:id="25"/>
     </w:p>
     <w:p/>
     <w:p>
       <w:pPr>
-        <w:pStyle w:val="Heading2"/>
-      </w:pPr>
-      <w:bookmarkStart w:id="25" w:name="_Toc211416512"/>
+        <w:pStyle w:val="Ttulo2"/>
+      </w:pPr>
+      <w:bookmarkStart w:id="26" w:name="_Toc211418008"/>
       <w:r>
         <w:t xml:space="preserve">II.7 </w:t>
       </w:r>
       <w:r>
         <w:t>Marketing</w:t>
       </w:r>
-      <w:bookmarkEnd w:id="25"/>
+      <w:bookmarkEnd w:id="26"/>
     </w:p>
     <w:p/>
     <w:p>
       <w:pPr>
-        <w:pStyle w:val="Heading2"/>
-      </w:pPr>
-      <w:bookmarkStart w:id="26" w:name="_Toc211416513"/>
+        <w:pStyle w:val="Ttulo2"/>
+      </w:pPr>
+      <w:bookmarkStart w:id="27" w:name="_Toc211418009"/>
       <w:r>
         <w:t>II.</w:t>
       </w:r>
@@ -5686,14 +5952,14 @@
       <w:r>
         <w:t>Financeira</w:t>
       </w:r>
-      <w:bookmarkEnd w:id="26"/>
+      <w:bookmarkEnd w:id="27"/>
     </w:p>
     <w:p/>
     <w:p>
       <w:pPr>
-        <w:pStyle w:val="Heading2"/>
-      </w:pPr>
-      <w:bookmarkStart w:id="27" w:name="_Toc211416514"/>
+        <w:pStyle w:val="Ttulo2"/>
+      </w:pPr>
+      <w:bookmarkStart w:id="28" w:name="_Toc211418010"/>
       <w:r>
         <w:t>II.</w:t>
       </w:r>
@@ -5709,7 +5975,7 @@
       <w:r>
         <w:t xml:space="preserve"> e Indústria 4.0</w:t>
       </w:r>
-      <w:bookmarkEnd w:id="27"/>
+      <w:bookmarkEnd w:id="28"/>
     </w:p>
     <w:p/>
     <w:p>
@@ -5727,17 +5993,18 @@
     </w:p>
     <w:p>
       <w:pPr>
-        <w:pStyle w:val="Heading1"/>
+        <w:pStyle w:val="Ttulo1"/>
         <w:rPr>
           <w:rFonts w:asciiTheme="minorHAnsi" w:hAnsiTheme="minorHAnsi" w:cstheme="minorBidi"/>
           <w:szCs w:val="22"/>
         </w:rPr>
       </w:pPr>
-      <w:bookmarkStart w:id="28" w:name="_Toc211416515"/>
-      <w:r>
+      <w:bookmarkStart w:id="29" w:name="_Toc211418011"/>
+      <w:r>
+        <w:lastRenderedPageBreak/>
         <w:t>Parte III – Conclusão</w:t>
       </w:r>
-      <w:bookmarkEnd w:id="28"/>
+      <w:bookmarkEnd w:id="29"/>
     </w:p>
     <w:p>
       <w:pPr>
@@ -5748,60 +6015,61 @@
     </w:p>
     <w:p>
       <w:pPr>
-        <w:pStyle w:val="Heading2"/>
-      </w:pPr>
-      <w:bookmarkStart w:id="29" w:name="_Toc211416516"/>
+        <w:pStyle w:val="Ttulo2"/>
+      </w:pPr>
+      <w:bookmarkStart w:id="30" w:name="_Toc211418012"/>
       <w:r>
         <w:t>III.1 Conclusão</w:t>
       </w:r>
-      <w:bookmarkEnd w:id="29"/>
+      <w:bookmarkEnd w:id="30"/>
     </w:p>
     <w:p/>
     <w:p>
       <w:pPr>
-        <w:pStyle w:val="Heading2"/>
-      </w:pPr>
-      <w:bookmarkStart w:id="30" w:name="_Toc211416517"/>
+        <w:pStyle w:val="Ttulo2"/>
+      </w:pPr>
+      <w:bookmarkStart w:id="31" w:name="_Toc211418013"/>
       <w:r>
         <w:t>III.2 Sugestões de melhoria</w:t>
       </w:r>
-      <w:bookmarkEnd w:id="30"/>
-    </w:p>
-    <w:p>
-      <w:pPr>
-        <w:pStyle w:val="Heading1"/>
+      <w:bookmarkEnd w:id="31"/>
+    </w:p>
+    <w:p>
+      <w:pPr>
+        <w:pStyle w:val="Ttulo1"/>
         <w:jc w:val="left"/>
       </w:pPr>
       <w:r>
         <w:br w:type="page"/>
       </w:r>
-      <w:bookmarkStart w:id="31" w:name="_Toc471979356"/>
-      <w:bookmarkStart w:id="32" w:name="_Toc211416518"/>
-      <w:r>
+      <w:bookmarkStart w:id="32" w:name="_Toc471979356"/>
+      <w:bookmarkStart w:id="33" w:name="_Toc211418014"/>
+      <w:r>
+        <w:lastRenderedPageBreak/>
         <w:t>Referências</w:t>
       </w:r>
-      <w:bookmarkEnd w:id="31"/>
       <w:bookmarkEnd w:id="32"/>
+      <w:bookmarkEnd w:id="33"/>
     </w:p>
     <w:p/>
     <w:p>
       <w:pPr>
-        <w:pStyle w:val="Heading1"/>
+        <w:pStyle w:val="Ttulo1"/>
         <w:jc w:val="left"/>
         <w:rPr>
           <w:rFonts w:eastAsia="Arial Narrow"/>
         </w:rPr>
       </w:pPr>
-      <w:bookmarkStart w:id="33" w:name="_Toc471979357"/>
-      <w:bookmarkStart w:id="34" w:name="_Toc211416519"/>
+      <w:bookmarkStart w:id="34" w:name="_Toc471979357"/>
+      <w:bookmarkStart w:id="35" w:name="_Toc211418015"/>
       <w:r>
         <w:rPr>
           <w:rFonts w:eastAsia="Arial Narrow"/>
         </w:rPr>
         <w:t>Anexos</w:t>
       </w:r>
-      <w:bookmarkEnd w:id="33"/>
       <w:bookmarkEnd w:id="34"/>
+      <w:bookmarkEnd w:id="35"/>
       <w:r>
         <w:rPr>
           <w:rFonts w:eastAsia="Arial Narrow"/>
@@ -5883,7 +6151,7 @@
         </w:tcPr>
         <w:p>
           <w:pPr>
-            <w:pStyle w:val="Footer"/>
+            <w:pStyle w:val="Rodap"/>
             <w:jc w:val="right"/>
             <w:rPr>
               <w:sz w:val="20"/>
@@ -5944,7 +6212,7 @@
         </w:tcPr>
         <w:p>
           <w:pPr>
-            <w:pStyle w:val="Header"/>
+            <w:pStyle w:val="Cabealho"/>
             <w:jc w:val="center"/>
             <w:rPr>
               <w:rFonts w:ascii="Calibri" w:hAnsi="Calibri"/>
@@ -6008,7 +6276,7 @@
   </w:tbl>
   <w:p>
     <w:pPr>
-      <w:pStyle w:val="Footer"/>
+      <w:pStyle w:val="Rodap"/>
       <w:rPr>
         <w:sz w:val="20"/>
         <w:szCs w:val="20"/>
@@ -10521,11 +10789,11 @@
       <w:szCs w:val="24"/>
     </w:rPr>
   </w:style>
-  <w:style w:type="paragraph" w:styleId="Heading1">
+  <w:style w:type="paragraph" w:styleId="Ttulo1">
     <w:name w:val="heading 1"/>
     <w:basedOn w:val="Normal"/>
     <w:next w:val="BodyText1"/>
-    <w:link w:val="Heading1Char1"/>
+    <w:link w:val="Ttulo1Carter"/>
     <w:qFormat/>
     <w:rsid w:val="00B731BA"/>
     <w:pPr>
@@ -10538,11 +10806,11 @@
       <w:b/>
     </w:rPr>
   </w:style>
-  <w:style w:type="paragraph" w:styleId="Heading2">
+  <w:style w:type="paragraph" w:styleId="Ttulo2">
     <w:name w:val="heading 2"/>
     <w:basedOn w:val="Normal"/>
     <w:next w:val="Normal"/>
-    <w:link w:val="Heading2Char"/>
+    <w:link w:val="Ttulo2Carter"/>
     <w:qFormat/>
     <w:rsid w:val="00B731BA"/>
     <w:pPr>
@@ -10554,11 +10822,11 @@
       <w:b/>
     </w:rPr>
   </w:style>
-  <w:style w:type="paragraph" w:styleId="Heading3">
+  <w:style w:type="paragraph" w:styleId="Ttulo3">
     <w:name w:val="heading 3"/>
     <w:basedOn w:val="Normal"/>
     <w:next w:val="Normal"/>
-    <w:link w:val="Heading3Char"/>
+    <w:link w:val="Ttulo3Carter"/>
     <w:unhideWhenUsed/>
     <w:qFormat/>
     <w:rsid w:val="007D2BCC"/>
@@ -10574,11 +10842,11 @@
       <w:sz w:val="24"/>
     </w:rPr>
   </w:style>
-  <w:style w:type="paragraph" w:styleId="Heading4">
+  <w:style w:type="paragraph" w:styleId="Ttulo4">
     <w:name w:val="heading 4"/>
     <w:basedOn w:val="Normal"/>
     <w:next w:val="Normal"/>
-    <w:link w:val="Heading4Char"/>
+    <w:link w:val="Ttulo4Carter"/>
     <w:semiHidden/>
     <w:unhideWhenUsed/>
     <w:qFormat/>
@@ -10596,13 +10864,13 @@
       <w:color w:val="365F91" w:themeColor="accent1" w:themeShade="BF"/>
     </w:rPr>
   </w:style>
-  <w:style w:type="character" w:default="1" w:styleId="DefaultParagraphFont">
+  <w:style w:type="character" w:default="1" w:styleId="Tipodeletrapredefinidodopargrafo">
     <w:name w:val="Default Paragraph Font"/>
     <w:uiPriority w:val="1"/>
     <w:semiHidden/>
     <w:unhideWhenUsed/>
   </w:style>
-  <w:style w:type="table" w:default="1" w:styleId="TableNormal">
+  <w:style w:type="table" w:default="1" w:styleId="Tabelanormal">
     <w:name w:val="Normal Table"/>
     <w:uiPriority w:val="99"/>
     <w:semiHidden/>
@@ -10617,13 +10885,13 @@
       </w:tblCellMar>
     </w:tblPr>
   </w:style>
-  <w:style w:type="numbering" w:default="1" w:styleId="NoList">
+  <w:style w:type="numbering" w:default="1" w:styleId="Semlista">
     <w:name w:val="No List"/>
     <w:uiPriority w:val="99"/>
     <w:semiHidden/>
     <w:unhideWhenUsed/>
   </w:style>
-  <w:style w:type="character" w:styleId="Hyperlink">
+  <w:style w:type="character" w:styleId="Hiperligao">
     <w:name w:val="Hyperlink"/>
     <w:uiPriority w:val="99"/>
     <w:rPr>
@@ -10631,7 +10899,7 @@
       <w:u w:val="single"/>
     </w:rPr>
   </w:style>
-  <w:style w:type="character" w:styleId="FollowedHyperlink">
+  <w:style w:type="character" w:styleId="Hiperligaovisitada">
     <w:name w:val="FollowedHyperlink"/>
     <w:rPr>
       <w:color w:val="800080"/>
@@ -10643,9 +10911,9 @@
     <w:basedOn w:val="Normal"/>
     <w:link w:val="BodyTextChar"/>
   </w:style>
-  <w:style w:type="character" w:customStyle="1" w:styleId="Heading1Char1">
-    <w:name w:val="Heading 1 Char1"/>
-    <w:link w:val="Heading1"/>
+  <w:style w:type="character" w:customStyle="1" w:styleId="Ttulo1Carter">
+    <w:name w:val="Título 1 Caráter"/>
+    <w:link w:val="Ttulo1"/>
     <w:rsid w:val="00B731BA"/>
     <w:rPr>
       <w:rFonts w:ascii="Calibri" w:hAnsi="Calibri"/>
@@ -10654,9 +10922,9 @@
       <w:szCs w:val="24"/>
     </w:rPr>
   </w:style>
-  <w:style w:type="character" w:customStyle="1" w:styleId="Heading2Char">
-    <w:name w:val="Heading 2 Char"/>
-    <w:link w:val="Heading2"/>
+  <w:style w:type="character" w:customStyle="1" w:styleId="Ttulo2Carter">
+    <w:name w:val="Título 2 Caráter"/>
+    <w:link w:val="Ttulo2"/>
     <w:rsid w:val="00B731BA"/>
     <w:rPr>
       <w:rFonts w:ascii="Calibri" w:hAnsi="Calibri"/>
@@ -10665,10 +10933,10 @@
       <w:szCs w:val="24"/>
     </w:rPr>
   </w:style>
-  <w:style w:type="paragraph" w:styleId="Header">
+  <w:style w:type="paragraph" w:styleId="Cabealho">
     <w:name w:val="header"/>
     <w:basedOn w:val="Normal"/>
-    <w:link w:val="HeaderChar"/>
+    <w:link w:val="CabealhoCarter"/>
     <w:uiPriority w:val="99"/>
     <w:pPr>
       <w:tabs>
@@ -10680,9 +10948,9 @@
       <w:rFonts w:ascii="Times New Roman" w:hAnsi="Times New Roman" w:cs="Times New Roman"/>
     </w:rPr>
   </w:style>
-  <w:style w:type="character" w:customStyle="1" w:styleId="HeaderChar">
-    <w:name w:val="Header Char"/>
-    <w:link w:val="Header"/>
+  <w:style w:type="character" w:customStyle="1" w:styleId="CabealhoCarter">
+    <w:name w:val="Cabeçalho Caráter"/>
+    <w:link w:val="Cabealho"/>
     <w:uiPriority w:val="99"/>
     <w:rPr>
       <w:rFonts w:cs="Times , serif"/>
@@ -10690,10 +10958,10 @@
       <w:szCs w:val="24"/>
     </w:rPr>
   </w:style>
-  <w:style w:type="paragraph" w:styleId="Footer">
+  <w:style w:type="paragraph" w:styleId="Rodap">
     <w:name w:val="footer"/>
     <w:basedOn w:val="Normal"/>
-    <w:link w:val="FooterChar"/>
+    <w:link w:val="RodapCarter"/>
     <w:uiPriority w:val="99"/>
     <w:pPr>
       <w:tabs>
@@ -10702,9 +10970,9 @@
       </w:tabs>
     </w:pPr>
   </w:style>
-  <w:style w:type="character" w:customStyle="1" w:styleId="FooterChar">
-    <w:name w:val="Footer Char"/>
-    <w:link w:val="Footer"/>
+  <w:style w:type="character" w:customStyle="1" w:styleId="RodapCarter">
+    <w:name w:val="Rodapé Caráter"/>
+    <w:link w:val="Rodap"/>
     <w:uiPriority w:val="99"/>
     <w:rPr>
       <w:rFonts w:cs="Times , serif"/>
@@ -10712,10 +10980,10 @@
       <w:szCs w:val="24"/>
     </w:rPr>
   </w:style>
-  <w:style w:type="paragraph" w:styleId="BodyText">
+  <w:style w:type="paragraph" w:styleId="Corpodetexto">
     <w:name w:val="Body Text"/>
     <w:basedOn w:val="Normal"/>
-    <w:link w:val="BodyTextChar1"/>
+    <w:link w:val="CorpodetextoCarter"/>
     <w:pPr>
       <w:spacing w:line="480" w:lineRule="auto"/>
       <w:ind w:firstLine="540"/>
@@ -10724,9 +10992,9 @@
       <w:rFonts w:ascii="Times New Roman" w:hAnsi="Times New Roman" w:cs="Times New Roman"/>
     </w:rPr>
   </w:style>
-  <w:style w:type="character" w:customStyle="1" w:styleId="BodyTextChar1">
-    <w:name w:val="Body Text Char1"/>
-    <w:link w:val="BodyText"/>
+  <w:style w:type="character" w:customStyle="1" w:styleId="CorpodetextoCarter">
+    <w:name w:val="Corpo de texto Caráter"/>
+    <w:link w:val="Corpodetexto"/>
     <w:rPr>
       <w:rFonts w:cs="Times , serif"/>
       <w:sz w:val="24"/>
@@ -10742,7 +11010,7 @@
       <w:lang w:val="pt-PT" w:eastAsia="pt-PT" w:bidi="pt-PT"/>
     </w:rPr>
   </w:style>
-  <w:style w:type="paragraph" w:styleId="BlockText">
+  <w:style w:type="paragraph" w:styleId="Textodebloco">
     <w:name w:val="Block Text"/>
     <w:basedOn w:val="BodyText1"/>
     <w:pPr>
@@ -10834,17 +11102,17 @@
       </w:tblCellMar>
     </w:tblPr>
   </w:style>
-  <w:style w:type="character" w:styleId="PageNumber">
+  <w:style w:type="character" w:styleId="Nmerodepgina">
     <w:name w:val="page number"/>
-    <w:basedOn w:val="DefaultParagraphFont"/>
+    <w:basedOn w:val="Tipodeletrapredefinidodopargrafo"/>
     <w:uiPriority w:val="99"/>
     <w:unhideWhenUsed/>
   </w:style>
-  <w:style w:type="paragraph" w:styleId="Title">
+  <w:style w:type="paragraph" w:styleId="Ttulo">
     <w:name w:val="Title"/>
     <w:basedOn w:val="Normal"/>
     <w:next w:val="Normal"/>
-    <w:link w:val="TitleChar"/>
+    <w:link w:val="TtuloCarter"/>
     <w:uiPriority w:val="10"/>
     <w:qFormat/>
     <w:rsid w:val="00E32082"/>
@@ -10861,9 +11129,9 @@
       <w:szCs w:val="60"/>
     </w:rPr>
   </w:style>
-  <w:style w:type="character" w:customStyle="1" w:styleId="TitleChar">
-    <w:name w:val="Title Char"/>
-    <w:link w:val="Title"/>
+  <w:style w:type="character" w:customStyle="1" w:styleId="TtuloCarter">
+    <w:name w:val="Título Caráter"/>
+    <w:link w:val="Ttulo"/>
     <w:uiPriority w:val="10"/>
     <w:rsid w:val="00E32082"/>
     <w:rPr>
@@ -10875,9 +11143,9 @@
       <w:szCs w:val="60"/>
     </w:rPr>
   </w:style>
-  <w:style w:type="table" w:styleId="TableGrid">
+  <w:style w:type="table" w:styleId="TabelacomGrelha">
     <w:name w:val="Table Grid"/>
-    <w:basedOn w:val="TableNormal"/>
+    <w:basedOn w:val="Tabelanormal"/>
     <w:rsid w:val="00E32082"/>
     <w:tblPr>
       <w:tblBorders>
@@ -10890,9 +11158,9 @@
       </w:tblBorders>
     </w:tblPr>
   </w:style>
-  <w:style w:type="character" w:customStyle="1" w:styleId="NoSpacingChar">
-    <w:name w:val="No Spacing Char"/>
-    <w:link w:val="NoSpacing"/>
+  <w:style w:type="character" w:customStyle="1" w:styleId="SemEspaamentoCarter">
+    <w:name w:val="Sem Espaçamento Caráter"/>
+    <w:link w:val="SemEspaamento"/>
     <w:uiPriority w:val="1"/>
     <w:locked/>
     <w:rsid w:val="00E32082"/>
@@ -10900,9 +11168,9 @@
       <w:rFonts w:ascii="Times New Roman" w:hAnsi="Times New Roman"/>
     </w:rPr>
   </w:style>
-  <w:style w:type="paragraph" w:styleId="NoSpacing">
+  <w:style w:type="paragraph" w:styleId="SemEspaamento">
     <w:name w:val="No Spacing"/>
-    <w:link w:val="NoSpacingChar"/>
+    <w:link w:val="SemEspaamentoCarter"/>
     <w:uiPriority w:val="1"/>
     <w:qFormat/>
     <w:rsid w:val="00E32082"/>
@@ -10910,9 +11178,9 @@
       <w:rFonts w:ascii="Times New Roman" w:hAnsi="Times New Roman"/>
     </w:rPr>
   </w:style>
-  <w:style w:type="paragraph" w:styleId="TOCHeading">
+  <w:style w:type="paragraph" w:styleId="Cabealhodondice">
     <w:name w:val="TOC Heading"/>
-    <w:basedOn w:val="Heading1"/>
+    <w:basedOn w:val="Ttulo1"/>
     <w:next w:val="Normal"/>
     <w:uiPriority w:val="39"/>
     <w:unhideWhenUsed/>
@@ -10934,7 +11202,7 @@
       <w:szCs w:val="28"/>
     </w:rPr>
   </w:style>
-  <w:style w:type="paragraph" w:styleId="TOC1">
+  <w:style w:type="paragraph" w:styleId="ndice1">
     <w:name w:val="toc 1"/>
     <w:basedOn w:val="Normal"/>
     <w:next w:val="Normal"/>
@@ -10942,7 +11210,7 @@
     <w:uiPriority w:val="39"/>
     <w:rsid w:val="004A6F4A"/>
   </w:style>
-  <w:style w:type="paragraph" w:styleId="TOC2">
+  <w:style w:type="paragraph" w:styleId="ndice2">
     <w:name w:val="toc 2"/>
     <w:basedOn w:val="Normal"/>
     <w:next w:val="Normal"/>
@@ -10953,7 +11221,7 @@
       <w:ind w:left="240"/>
     </w:pPr>
   </w:style>
-  <w:style w:type="paragraph" w:styleId="ListParagraph">
+  <w:style w:type="paragraph" w:styleId="PargrafodaLista">
     <w:name w:val="List Paragraph"/>
     <w:basedOn w:val="Normal"/>
     <w:uiPriority w:val="34"/>
@@ -10970,10 +11238,10 @@
       <w:szCs w:val="20"/>
     </w:rPr>
   </w:style>
-  <w:style w:type="paragraph" w:styleId="BalloonText">
+  <w:style w:type="paragraph" w:styleId="Textodebalo">
     <w:name w:val="Balloon Text"/>
     <w:basedOn w:val="Normal"/>
-    <w:link w:val="BalloonTextChar"/>
+    <w:link w:val="TextodebaloCarter"/>
     <w:rsid w:val="003B263F"/>
     <w:rPr>
       <w:rFonts w:ascii="Tahoma" w:hAnsi="Tahoma" w:cs="Tahoma"/>
@@ -10981,9 +11249,9 @@
       <w:szCs w:val="16"/>
     </w:rPr>
   </w:style>
-  <w:style w:type="character" w:customStyle="1" w:styleId="BalloonTextChar">
-    <w:name w:val="Balloon Text Char"/>
-    <w:link w:val="BalloonText"/>
+  <w:style w:type="character" w:customStyle="1" w:styleId="TextodebaloCarter">
+    <w:name w:val="Texto de balão Caráter"/>
+    <w:link w:val="Textodebalo"/>
     <w:rsid w:val="003B263F"/>
     <w:rPr>
       <w:rFonts w:ascii="Tahoma" w:hAnsi="Tahoma" w:cs="Tahoma"/>
@@ -10991,9 +11259,9 @@
       <w:szCs w:val="16"/>
     </w:rPr>
   </w:style>
-  <w:style w:type="character" w:styleId="CommentReference">
+  <w:style w:type="character" w:styleId="Refdecomentrio">
     <w:name w:val="annotation reference"/>
-    <w:basedOn w:val="DefaultParagraphFont"/>
+    <w:basedOn w:val="Tipodeletrapredefinidodopargrafo"/>
     <w:semiHidden/>
     <w:unhideWhenUsed/>
     <w:rsid w:val="00C811F8"/>
@@ -11002,10 +11270,10 @@
       <w:szCs w:val="16"/>
     </w:rPr>
   </w:style>
-  <w:style w:type="paragraph" w:styleId="CommentText">
+  <w:style w:type="paragraph" w:styleId="Textodecomentrio">
     <w:name w:val="annotation text"/>
     <w:basedOn w:val="Normal"/>
-    <w:link w:val="CommentTextChar"/>
+    <w:link w:val="TextodecomentrioCarter"/>
     <w:semiHidden/>
     <w:unhideWhenUsed/>
     <w:rsid w:val="00C811F8"/>
@@ -11017,21 +11285,21 @@
       <w:szCs w:val="20"/>
     </w:rPr>
   </w:style>
-  <w:style w:type="character" w:customStyle="1" w:styleId="CommentTextChar">
-    <w:name w:val="Comment Text Char"/>
-    <w:basedOn w:val="DefaultParagraphFont"/>
-    <w:link w:val="CommentText"/>
+  <w:style w:type="character" w:customStyle="1" w:styleId="TextodecomentrioCarter">
+    <w:name w:val="Texto de comentário Caráter"/>
+    <w:basedOn w:val="Tipodeletrapredefinidodopargrafo"/>
+    <w:link w:val="Textodecomentrio"/>
     <w:semiHidden/>
     <w:rsid w:val="00C811F8"/>
     <w:rPr>
       <w:rFonts w:ascii="Calibri" w:hAnsi="Calibri" w:cs="Times , serif"/>
     </w:rPr>
   </w:style>
-  <w:style w:type="paragraph" w:styleId="CommentSubject">
+  <w:style w:type="paragraph" w:styleId="Assuntodecomentrio">
     <w:name w:val="annotation subject"/>
-    <w:basedOn w:val="CommentText"/>
-    <w:next w:val="CommentText"/>
-    <w:link w:val="CommentSubjectChar"/>
+    <w:basedOn w:val="Textodecomentrio"/>
+    <w:next w:val="Textodecomentrio"/>
+    <w:link w:val="AssuntodecomentrioCarter"/>
     <w:semiHidden/>
     <w:unhideWhenUsed/>
     <w:rsid w:val="00C811F8"/>
@@ -11040,10 +11308,10 @@
       <w:bCs/>
     </w:rPr>
   </w:style>
-  <w:style w:type="character" w:customStyle="1" w:styleId="CommentSubjectChar">
-    <w:name w:val="Comment Subject Char"/>
-    <w:basedOn w:val="CommentTextChar"/>
-    <w:link w:val="CommentSubject"/>
+  <w:style w:type="character" w:customStyle="1" w:styleId="AssuntodecomentrioCarter">
+    <w:name w:val="Assunto de comentário Caráter"/>
+    <w:basedOn w:val="TextodecomentrioCarter"/>
+    <w:link w:val="Assuntodecomentrio"/>
     <w:semiHidden/>
     <w:rsid w:val="00C811F8"/>
     <w:rPr>
@@ -11052,10 +11320,10 @@
       <w:bCs/>
     </w:rPr>
   </w:style>
-  <w:style w:type="character" w:customStyle="1" w:styleId="Heading4Char">
-    <w:name w:val="Heading 4 Char"/>
-    <w:basedOn w:val="DefaultParagraphFont"/>
-    <w:link w:val="Heading4"/>
+  <w:style w:type="character" w:customStyle="1" w:styleId="Ttulo4Carter">
+    <w:name w:val="Título 4 Caráter"/>
+    <w:basedOn w:val="Tipodeletrapredefinidodopargrafo"/>
+    <w:link w:val="Ttulo4"/>
     <w:semiHidden/>
     <w:rsid w:val="00B66B05"/>
     <w:rPr>
@@ -11067,9 +11335,9 @@
       <w:szCs w:val="24"/>
     </w:rPr>
   </w:style>
-  <w:style w:type="character" w:styleId="UnresolvedMention">
+  <w:style w:type="character" w:styleId="MenoNoResolvida">
     <w:name w:val="Unresolved Mention"/>
-    <w:basedOn w:val="DefaultParagraphFont"/>
+    <w:basedOn w:val="Tipodeletrapredefinidodopargrafo"/>
     <w:uiPriority w:val="99"/>
     <w:semiHidden/>
     <w:unhideWhenUsed/>
@@ -11079,7 +11347,7 @@
       <w:shd w:val="clear" w:color="auto" w:fill="E1DFDD"/>
     </w:rPr>
   </w:style>
-  <w:style w:type="paragraph" w:styleId="Caption">
+  <w:style w:type="paragraph" w:styleId="Legenda">
     <w:name w:val="caption"/>
     <w:basedOn w:val="Normal"/>
     <w:next w:val="Normal"/>
@@ -11097,10 +11365,10 @@
       <w:szCs w:val="18"/>
     </w:rPr>
   </w:style>
-  <w:style w:type="character" w:customStyle="1" w:styleId="Heading3Char">
-    <w:name w:val="Heading 3 Char"/>
-    <w:basedOn w:val="DefaultParagraphFont"/>
-    <w:link w:val="Heading3"/>
+  <w:style w:type="character" w:customStyle="1" w:styleId="Ttulo3Carter">
+    <w:name w:val="Título 3 Caráter"/>
+    <w:basedOn w:val="Tipodeletrapredefinidodopargrafo"/>
+    <w:link w:val="Ttulo3"/>
     <w:rsid w:val="007D2BCC"/>
     <w:rPr>
       <w:rFonts w:asciiTheme="majorHAnsi" w:eastAsiaTheme="majorEastAsia" w:hAnsiTheme="majorHAnsi" w:cstheme="majorBidi"/>
@@ -11109,7 +11377,7 @@
       <w:szCs w:val="24"/>
     </w:rPr>
   </w:style>
-  <w:style w:type="paragraph" w:styleId="TOC3">
+  <w:style w:type="paragraph" w:styleId="ndice3">
     <w:name w:val="toc 3"/>
     <w:basedOn w:val="Normal"/>
     <w:next w:val="Normal"/>
@@ -11427,10 +11695,6 @@
 </file>
 
 <file path=customXml/item1.xml><?xml version="1.0" encoding="utf-8"?>
-<b:Sources xmlns:b="http://schemas.openxmlformats.org/officeDocument/2006/bibliography" xmlns="http://schemas.openxmlformats.org/officeDocument/2006/bibliography" SelectedStyle="\APA.XSL" StyleName="APA"/>
-</file>
-
-<file path=customXml/item2.xml><?xml version="1.0" encoding="utf-8"?>
 <ct:contentTypeSchema xmlns:ct="http://schemas.microsoft.com/office/2006/metadata/contentType" xmlns:ma="http://schemas.microsoft.com/office/2006/metadata/properties/metaAttributes" ct:_="" ma:_="" ma:contentTypeName="Documento" ma:contentTypeID="0x0101008F0F40A57A4B4943AE5F0D22A00E6876" ma:contentTypeVersion="7" ma:contentTypeDescription="Criar um novo documento." ma:contentTypeScope="" ma:versionID="0777f9d8bcaf4fa9f3f247f35de05543">
   <xsd:schema xmlns:xsd="http://www.w3.org/2001/XMLSchema" xmlns:xs="http://www.w3.org/2001/XMLSchema" xmlns:p="http://schemas.microsoft.com/office/2006/metadata/properties" xmlns:ns2="6e977478-40fc-4c96-9b59-58f9adc62218" targetNamespace="http://schemas.microsoft.com/office/2006/metadata/properties" ma:root="true" ma:fieldsID="6e1588d9447c950b5d06efd32159bf41" ns2:_="">
     <xsd:import namespace="6e977478-40fc-4c96-9b59-58f9adc62218"/>
@@ -11592,16 +11856,11 @@
 </ct:contentTypeSchema>
 </file>
 
-<file path=customXml/item3.xml><?xml version="1.0" encoding="utf-8"?>
-<?mso-contentType ?>
-<FormTemplates xmlns="http://schemas.microsoft.com/sharepoint/v3/contenttype/forms">
-  <Display>DocumentLibraryForm</Display>
-  <Edit>DocumentLibraryForm</Edit>
-  <New>DocumentLibraryForm</New>
-</FormTemplates>
+<file path=customXml/item2.xml><?xml version="1.0" encoding="utf-8"?>
+<b:Sources xmlns:b="http://schemas.openxmlformats.org/officeDocument/2006/bibliography" xmlns="http://schemas.openxmlformats.org/officeDocument/2006/bibliography" SelectedStyle="\APA.XSL" StyleName="APA"/>
 </file>
 
-<file path=customXml/item4.xml><?xml version="1.0" encoding="utf-8"?>
+<file path=customXml/item3.xml><?xml version="1.0" encoding="utf-8"?>
 <p:properties xmlns:p="http://schemas.microsoft.com/office/2006/metadata/properties" xmlns:xsi="http://www.w3.org/2001/XMLSchema-instance" xmlns:pc="http://schemas.microsoft.com/office/infopath/2007/PartnerControls">
   <documentManagement>
     <NotebookType xmlns="6e977478-40fc-4c96-9b59-58f9adc62218" xsi:nil="true"/>
@@ -11613,15 +11872,16 @@
 </p:properties>
 </file>
 
-<file path=customXml/itemProps1.xml><?xml version="1.0" encoding="utf-8"?>
-<ds:datastoreItem xmlns:ds="http://schemas.openxmlformats.org/officeDocument/2006/customXml" ds:itemID="{9C46D67E-02BF-4E37-8EF1-2391CC03D27F}">
-  <ds:schemaRefs>
-    <ds:schemaRef ds:uri="http://schemas.openxmlformats.org/officeDocument/2006/bibliography"/>
-  </ds:schemaRefs>
-</ds:datastoreItem>
+<file path=customXml/item4.xml><?xml version="1.0" encoding="utf-8"?>
+<?mso-contentType ?>
+<FormTemplates xmlns="http://schemas.microsoft.com/sharepoint/v3/contenttype/forms">
+  <Display>DocumentLibraryForm</Display>
+  <Edit>DocumentLibraryForm</Edit>
+  <New>DocumentLibraryForm</New>
+</FormTemplates>
 </file>
 
-<file path=customXml/itemProps2.xml><?xml version="1.0" encoding="utf-8"?>
+<file path=customXml/itemProps1.xml><?xml version="1.0" encoding="utf-8"?>
 <ds:datastoreItem xmlns:ds="http://schemas.openxmlformats.org/officeDocument/2006/customXml" ds:itemID="{F22FBF9B-697C-4384-8BA9-D9CACC814933}">
   <ds:schemaRefs>
     <ds:schemaRef ds:uri="http://schemas.microsoft.com/office/2006/metadata/contentType"/>
@@ -11639,15 +11899,15 @@
 </ds:datastoreItem>
 </file>
 
-<file path=customXml/itemProps3.xml><?xml version="1.0" encoding="utf-8"?>
-<ds:datastoreItem xmlns:ds="http://schemas.openxmlformats.org/officeDocument/2006/customXml" ds:itemID="{A8BEE9C3-75AD-4607-B106-1B44B05722EA}">
+<file path=customXml/itemProps2.xml><?xml version="1.0" encoding="utf-8"?>
+<ds:datastoreItem xmlns:ds="http://schemas.openxmlformats.org/officeDocument/2006/customXml" ds:itemID="{9C46D67E-02BF-4E37-8EF1-2391CC03D27F}">
   <ds:schemaRefs>
-    <ds:schemaRef ds:uri="http://schemas.microsoft.com/sharepoint/v3/contenttype/forms"/>
+    <ds:schemaRef ds:uri="http://schemas.openxmlformats.org/officeDocument/2006/bibliography"/>
   </ds:schemaRefs>
 </ds:datastoreItem>
 </file>
 
-<file path=customXml/itemProps4.xml><?xml version="1.0" encoding="utf-8"?>
+<file path=customXml/itemProps3.xml><?xml version="1.0" encoding="utf-8"?>
 <ds:datastoreItem xmlns:ds="http://schemas.openxmlformats.org/officeDocument/2006/customXml" ds:itemID="{A02BD9CC-6025-4F76-BD90-0F1427CF0A06}">
   <ds:schemaRefs>
     <ds:schemaRef ds:uri="http://schemas.microsoft.com/office/2006/metadata/properties"/>
@@ -11655,4 +11915,12 @@
     <ds:schemaRef ds:uri="6e977478-40fc-4c96-9b59-58f9adc62218"/>
   </ds:schemaRefs>
 </ds:datastoreItem>
+</file>
+
+<file path=customXml/itemProps4.xml><?xml version="1.0" encoding="utf-8"?>
+<ds:datastoreItem xmlns:ds="http://schemas.openxmlformats.org/officeDocument/2006/customXml" ds:itemID="{A8BEE9C3-75AD-4607-B106-1B44B05722EA}">
+  <ds:schemaRefs>
+    <ds:schemaRef ds:uri="http://schemas.microsoft.com/sharepoint/v3/contenttype/forms"/>
+  </ds:schemaRefs>
+</ds:datastoreItem>
 </file>
</xml_diff>

<commit_message>
US2.3.5 - add SMART objectives (#20)
</commit_message>
<xml_diff>
--- a/docs/client_analysis/report_APS.docx
+++ b/docs/client_analysis/report_APS.docx
@@ -5832,11 +5832,370 @@
           <w:b/>
         </w:rPr>
       </w:pPr>
-      <w:r>
+    </w:p>
+    <w:p>
+      <w:pPr>
+        <w:pStyle w:val="Ttulo3"/>
+        <w:rPr>
+          <w:b/>
+          <w:bCs/>
+          <w:color w:val="000000" w:themeColor="text1"/>
+          <w:sz w:val="20"/>
+          <w:szCs w:val="20"/>
+        </w:rPr>
+      </w:pPr>
+      <w:bookmarkStart w:id="22" w:name="_Toc211333578"/>
+      <w:r>
+        <w:rPr>
+          <w:b/>
+          <w:bCs/>
+          <w:color w:val="000000" w:themeColor="text1"/>
+          <w:sz w:val="20"/>
+          <w:szCs w:val="20"/>
+        </w:rPr>
+        <w:lastRenderedPageBreak/>
+        <w:t>Objetivos SMAR</w:t>
+      </w:r>
+      <w:r>
+        <w:rPr>
+          <w:b/>
+          <w:bCs/>
+          <w:color w:val="000000" w:themeColor="text1"/>
+          <w:sz w:val="20"/>
+          <w:szCs w:val="20"/>
+        </w:rPr>
+        <w:t>T</w:t>
+      </w:r>
+      <w:bookmarkEnd w:id="22"/>
+    </w:p>
+    <w:tbl>
+      <w:tblPr>
+        <w:tblStyle w:val="TabelacomGrelha"/>
+        <w:tblW w:w="0" w:type="auto"/>
+        <w:tblLook w:val="04A0" w:firstRow="1" w:lastRow="0" w:firstColumn="1" w:lastColumn="0" w:noHBand="0" w:noVBand="1"/>
+      </w:tblPr>
+      <w:tblGrid>
+        <w:gridCol w:w="1836"/>
+        <w:gridCol w:w="3253"/>
+        <w:gridCol w:w="4241"/>
+      </w:tblGrid>
+      <w:tr>
+        <w:tc>
+          <w:tcPr>
+            <w:tcW w:w="1838" w:type="dxa"/>
+            <w:tcBorders>
+              <w:top w:val="single" w:sz="12" w:space="0" w:color="auto"/>
+              <w:left w:val="single" w:sz="12" w:space="0" w:color="auto"/>
+              <w:bottom w:val="single" w:sz="12" w:space="0" w:color="auto"/>
+              <w:right w:val="single" w:sz="12" w:space="0" w:color="auto"/>
+            </w:tcBorders>
+            <w:vAlign w:val="center"/>
+          </w:tcPr>
+          <w:p>
+            <w:pPr>
+              <w:jc w:val="center"/>
+              <w:rPr>
+                <w:b/>
+                <w:bCs/>
+                <w:color w:val="000000" w:themeColor="text1"/>
+              </w:rPr>
+            </w:pPr>
+            <w:r>
+              <w:rPr>
+                <w:b/>
+                <w:bCs/>
+                <w:color w:val="000000" w:themeColor="text1"/>
+              </w:rPr>
+              <w:t>Nível de Gestão</w:t>
+            </w:r>
+          </w:p>
+        </w:tc>
+        <w:tc>
+          <w:tcPr>
+            <w:tcW w:w="3260" w:type="dxa"/>
+            <w:tcBorders>
+              <w:top w:val="single" w:sz="12" w:space="0" w:color="auto"/>
+              <w:left w:val="single" w:sz="12" w:space="0" w:color="auto"/>
+              <w:bottom w:val="single" w:sz="12" w:space="0" w:color="auto"/>
+              <w:right w:val="single" w:sz="12" w:space="0" w:color="auto"/>
+            </w:tcBorders>
+            <w:vAlign w:val="center"/>
+          </w:tcPr>
+          <w:p>
+            <w:pPr>
+              <w:jc w:val="center"/>
+              <w:rPr>
+                <w:b/>
+                <w:bCs/>
+                <w:color w:val="000000" w:themeColor="text1"/>
+              </w:rPr>
+            </w:pPr>
+            <w:r>
+              <w:rPr>
+                <w:b/>
+                <w:bCs/>
+                <w:color w:val="000000" w:themeColor="text1"/>
+              </w:rPr>
+              <w:t>Objetivo SMART</w:t>
+            </w:r>
+          </w:p>
+        </w:tc>
+        <w:tc>
+          <w:tcPr>
+            <w:tcW w:w="4252" w:type="dxa"/>
+            <w:tcBorders>
+              <w:top w:val="single" w:sz="12" w:space="0" w:color="auto"/>
+              <w:left w:val="single" w:sz="12" w:space="0" w:color="auto"/>
+              <w:bottom w:val="single" w:sz="12" w:space="0" w:color="auto"/>
+              <w:right w:val="single" w:sz="12" w:space="0" w:color="auto"/>
+            </w:tcBorders>
+            <w:vAlign w:val="center"/>
+          </w:tcPr>
+          <w:p>
+            <w:pPr>
+              <w:jc w:val="center"/>
+              <w:rPr>
+                <w:b/>
+                <w:bCs/>
+                <w:color w:val="000000" w:themeColor="text1"/>
+              </w:rPr>
+            </w:pPr>
+            <w:r>
+              <w:rPr>
+                <w:b/>
+                <w:bCs/>
+                <w:color w:val="000000" w:themeColor="text1"/>
+              </w:rPr>
+              <w:t>Justificação</w:t>
+            </w:r>
+          </w:p>
+        </w:tc>
+      </w:tr>
+      <w:tr>
+        <w:tc>
+          <w:tcPr>
+            <w:tcW w:w="1838" w:type="dxa"/>
+            <w:tcBorders>
+              <w:top w:val="single" w:sz="12" w:space="0" w:color="auto"/>
+              <w:left w:val="single" w:sz="12" w:space="0" w:color="auto"/>
+              <w:bottom w:val="single" w:sz="12" w:space="0" w:color="auto"/>
+              <w:right w:val="single" w:sz="12" w:space="0" w:color="auto"/>
+            </w:tcBorders>
+            <w:vAlign w:val="center"/>
+          </w:tcPr>
+          <w:p>
+            <w:pPr>
+              <w:jc w:val="center"/>
+              <w:rPr>
+                <w:b/>
+                <w:bCs/>
+                <w:color w:val="000000" w:themeColor="text1"/>
+              </w:rPr>
+            </w:pPr>
+            <w:r>
+              <w:rPr>
+                <w:b/>
+                <w:bCs/>
+                <w:color w:val="000000" w:themeColor="text1"/>
+              </w:rPr>
+              <w:t>Estratégico</w:t>
+            </w:r>
+          </w:p>
+        </w:tc>
+        <w:tc>
+          <w:tcPr>
+            <w:tcW w:w="3260" w:type="dxa"/>
+            <w:tcBorders>
+              <w:top w:val="single" w:sz="12" w:space="0" w:color="auto"/>
+              <w:left w:val="single" w:sz="12" w:space="0" w:color="auto"/>
+              <w:bottom w:val="single" w:sz="12" w:space="0" w:color="auto"/>
+              <w:right w:val="single" w:sz="12" w:space="0" w:color="auto"/>
+            </w:tcBorders>
+          </w:tcPr>
+          <w:p>
+            <w:r>
+              <w:t>Aumentar a capacidade total de movimentação de contentores para 4 milhões de TEU até 2030.</w:t>
+            </w:r>
+          </w:p>
+        </w:tc>
+        <w:tc>
+          <w:tcPr>
+            <w:tcW w:w="4252" w:type="dxa"/>
+            <w:tcBorders>
+              <w:top w:val="single" w:sz="12" w:space="0" w:color="auto"/>
+              <w:left w:val="single" w:sz="12" w:space="0" w:color="auto"/>
+              <w:bottom w:val="single" w:sz="12" w:space="0" w:color="auto"/>
+              <w:right w:val="single" w:sz="12" w:space="0" w:color="auto"/>
+            </w:tcBorders>
+          </w:tcPr>
+          <w:p>
+            <w:r>
+              <w:t xml:space="preserve">Reforçar o papel do Porto de Sines como </w:t>
+            </w:r>
+            <w:proofErr w:type="spellStart"/>
+            <w:r>
+              <w:t>hub</w:t>
+            </w:r>
+            <w:proofErr w:type="spellEnd"/>
+            <w:r>
+              <w:t xml:space="preserve"> logístico e energético do Atlântico.</w:t>
+            </w:r>
+          </w:p>
+        </w:tc>
+      </w:tr>
+      <w:tr>
+        <w:tc>
+          <w:tcPr>
+            <w:tcW w:w="1838" w:type="dxa"/>
+            <w:tcBorders>
+              <w:top w:val="single" w:sz="12" w:space="0" w:color="auto"/>
+              <w:left w:val="single" w:sz="12" w:space="0" w:color="auto"/>
+              <w:bottom w:val="single" w:sz="12" w:space="0" w:color="auto"/>
+              <w:right w:val="single" w:sz="12" w:space="0" w:color="auto"/>
+            </w:tcBorders>
+            <w:vAlign w:val="center"/>
+          </w:tcPr>
+          <w:p>
+            <w:pPr>
+              <w:jc w:val="center"/>
+              <w:rPr>
+                <w:b/>
+                <w:bCs/>
+                <w:color w:val="000000" w:themeColor="text1"/>
+              </w:rPr>
+            </w:pPr>
+            <w:r>
+              <w:rPr>
+                <w:b/>
+                <w:bCs/>
+                <w:color w:val="000000" w:themeColor="text1"/>
+              </w:rPr>
+              <w:t>Tático</w:t>
+            </w:r>
+          </w:p>
+        </w:tc>
+        <w:tc>
+          <w:tcPr>
+            <w:tcW w:w="3260" w:type="dxa"/>
+            <w:tcBorders>
+              <w:top w:val="single" w:sz="12" w:space="0" w:color="auto"/>
+              <w:left w:val="single" w:sz="12" w:space="0" w:color="auto"/>
+              <w:bottom w:val="single" w:sz="12" w:space="0" w:color="auto"/>
+              <w:right w:val="single" w:sz="12" w:space="0" w:color="auto"/>
+            </w:tcBorders>
+          </w:tcPr>
+          <w:p>
+            <w:r>
+              <w:t>Reduzir as emissões de CO₂ em 25% até 2028.</w:t>
+            </w:r>
+          </w:p>
+        </w:tc>
+        <w:tc>
+          <w:tcPr>
+            <w:tcW w:w="4252" w:type="dxa"/>
+            <w:tcBorders>
+              <w:top w:val="single" w:sz="12" w:space="0" w:color="auto"/>
+              <w:left w:val="single" w:sz="12" w:space="0" w:color="auto"/>
+              <w:bottom w:val="single" w:sz="12" w:space="0" w:color="auto"/>
+              <w:right w:val="single" w:sz="12" w:space="0" w:color="auto"/>
+            </w:tcBorders>
+          </w:tcPr>
+          <w:p>
+            <w:r>
+              <w:t>Cumprir metas ambientais nacionais e europeias, alinhadas à transição energética.</w:t>
+            </w:r>
+          </w:p>
+        </w:tc>
+      </w:tr>
+      <w:tr>
+        <w:tc>
+          <w:tcPr>
+            <w:tcW w:w="1838" w:type="dxa"/>
+            <w:tcBorders>
+              <w:top w:val="single" w:sz="12" w:space="0" w:color="auto"/>
+              <w:left w:val="single" w:sz="12" w:space="0" w:color="auto"/>
+              <w:bottom w:val="single" w:sz="12" w:space="0" w:color="auto"/>
+              <w:right w:val="single" w:sz="12" w:space="0" w:color="auto"/>
+            </w:tcBorders>
+            <w:vAlign w:val="center"/>
+          </w:tcPr>
+          <w:p>
+            <w:pPr>
+              <w:jc w:val="center"/>
+              <w:rPr>
+                <w:b/>
+                <w:bCs/>
+                <w:color w:val="000000" w:themeColor="text1"/>
+              </w:rPr>
+            </w:pPr>
+            <w:r>
+              <w:rPr>
+                <w:b/>
+                <w:bCs/>
+                <w:color w:val="000000" w:themeColor="text1"/>
+              </w:rPr>
+              <w:t>Operacional</w:t>
+            </w:r>
+          </w:p>
+        </w:tc>
+        <w:tc>
+          <w:tcPr>
+            <w:tcW w:w="3260" w:type="dxa"/>
+            <w:tcBorders>
+              <w:top w:val="single" w:sz="12" w:space="0" w:color="auto"/>
+              <w:left w:val="single" w:sz="12" w:space="0" w:color="auto"/>
+              <w:bottom w:val="single" w:sz="12" w:space="0" w:color="auto"/>
+              <w:right w:val="single" w:sz="12" w:space="0" w:color="auto"/>
+            </w:tcBorders>
+          </w:tcPr>
+          <w:p>
+            <w:r>
+              <w:t>Implementar até 2026 um sistema digital integrado de gestão portuária.</w:t>
+            </w:r>
+          </w:p>
+        </w:tc>
+        <w:tc>
+          <w:tcPr>
+            <w:tcW w:w="4252" w:type="dxa"/>
+            <w:tcBorders>
+              <w:top w:val="single" w:sz="12" w:space="0" w:color="auto"/>
+              <w:left w:val="single" w:sz="12" w:space="0" w:color="auto"/>
+              <w:bottom w:val="single" w:sz="12" w:space="0" w:color="auto"/>
+              <w:right w:val="single" w:sz="12" w:space="0" w:color="auto"/>
+            </w:tcBorders>
+          </w:tcPr>
+          <w:p>
+            <w:r>
+              <w:t>Modernizar processos, melhorar eficiência operacional e reduzir custos administrativos.</w:t>
+            </w:r>
+          </w:p>
+        </w:tc>
+      </w:tr>
+    </w:tbl>
+    <w:p>
+      <w:pPr>
+        <w:spacing w:line="240" w:lineRule="auto"/>
+        <w:jc w:val="left"/>
         <w:rPr>
           <w:rFonts w:cs="Times New Roman"/>
           <w:b/>
         </w:rPr>
+      </w:pPr>
+    </w:p>
+    <w:p>
+      <w:pPr>
+        <w:spacing w:line="240" w:lineRule="auto"/>
+        <w:jc w:val="left"/>
+        <w:rPr>
+          <w:rFonts w:cs="Times New Roman"/>
+          <w:b/>
+        </w:rPr>
+      </w:pPr>
+      <w:r>
+        <w:rPr>
+          <w:rFonts w:cs="Times New Roman"/>
+          <w:b/>
+        </w:rPr>
         <w:br w:type="page"/>
       </w:r>
     </w:p>
@@ -5844,7 +6203,7 @@
       <w:pPr>
         <w:pStyle w:val="Ttulo2"/>
       </w:pPr>
-      <w:bookmarkStart w:id="22" w:name="_Toc211418004"/>
+      <w:bookmarkStart w:id="23" w:name="_Toc211418004"/>
       <w:r>
         <w:lastRenderedPageBreak/>
         <w:t>II.</w:t>
@@ -5858,14 +6217,14 @@
       <w:r>
         <w:t xml:space="preserve"> e Sistemas de informação</w:t>
       </w:r>
-      <w:bookmarkEnd w:id="22"/>
+      <w:bookmarkEnd w:id="23"/>
     </w:p>
     <w:p/>
     <w:p>
       <w:pPr>
         <w:pStyle w:val="Ttulo2"/>
       </w:pPr>
-      <w:bookmarkStart w:id="23" w:name="_Toc211418005"/>
+      <w:bookmarkStart w:id="24" w:name="_Toc211418005"/>
       <w:r>
         <w:t>II</w:t>
       </w:r>
@@ -5890,50 +6249,50 @@
       <w:r>
         <w:t>Pessoas</w:t>
       </w:r>
-      <w:bookmarkEnd w:id="23"/>
+      <w:bookmarkEnd w:id="24"/>
     </w:p>
     <w:p/>
     <w:p>
       <w:pPr>
         <w:pStyle w:val="Ttulo2"/>
       </w:pPr>
-      <w:bookmarkStart w:id="24" w:name="_Toc211418006"/>
+      <w:bookmarkStart w:id="25" w:name="_Toc211418006"/>
       <w:r>
         <w:t>II.5 Promoção da produtividade</w:t>
       </w:r>
-      <w:bookmarkEnd w:id="24"/>
+      <w:bookmarkEnd w:id="25"/>
     </w:p>
     <w:p/>
     <w:p>
       <w:pPr>
         <w:pStyle w:val="Ttulo2"/>
       </w:pPr>
-      <w:bookmarkStart w:id="25" w:name="_Toc211418007"/>
+      <w:bookmarkStart w:id="26" w:name="_Toc211418007"/>
       <w:r>
         <w:t>II.6 Economia circular</w:t>
       </w:r>
-      <w:bookmarkEnd w:id="25"/>
+      <w:bookmarkEnd w:id="26"/>
     </w:p>
     <w:p/>
     <w:p>
       <w:pPr>
         <w:pStyle w:val="Ttulo2"/>
       </w:pPr>
-      <w:bookmarkStart w:id="26" w:name="_Toc211418008"/>
+      <w:bookmarkStart w:id="27" w:name="_Toc211418008"/>
       <w:r>
         <w:t xml:space="preserve">II.7 </w:t>
       </w:r>
       <w:r>
         <w:t>Marketing</w:t>
       </w:r>
-      <w:bookmarkEnd w:id="26"/>
+      <w:bookmarkEnd w:id="27"/>
     </w:p>
     <w:p/>
     <w:p>
       <w:pPr>
         <w:pStyle w:val="Ttulo2"/>
       </w:pPr>
-      <w:bookmarkStart w:id="27" w:name="_Toc211418009"/>
+      <w:bookmarkStart w:id="28" w:name="_Toc211418009"/>
       <w:r>
         <w:t>II.</w:t>
       </w:r>
@@ -5952,14 +6311,14 @@
       <w:r>
         <w:t>Financeira</w:t>
       </w:r>
-      <w:bookmarkEnd w:id="27"/>
+      <w:bookmarkEnd w:id="28"/>
     </w:p>
     <w:p/>
     <w:p>
       <w:pPr>
         <w:pStyle w:val="Ttulo2"/>
       </w:pPr>
-      <w:bookmarkStart w:id="28" w:name="_Toc211418010"/>
+      <w:bookmarkStart w:id="29" w:name="_Toc211418010"/>
       <w:r>
         <w:t>II.</w:t>
       </w:r>
@@ -5975,7 +6334,7 @@
       <w:r>
         <w:t xml:space="preserve"> e Indústria 4.0</w:t>
       </w:r>
-      <w:bookmarkEnd w:id="28"/>
+      <w:bookmarkEnd w:id="29"/>
     </w:p>
     <w:p/>
     <w:p>
@@ -5999,12 +6358,12 @@
           <w:szCs w:val="22"/>
         </w:rPr>
       </w:pPr>
-      <w:bookmarkStart w:id="29" w:name="_Toc211418011"/>
+      <w:bookmarkStart w:id="30" w:name="_Toc211418011"/>
       <w:r>
         <w:lastRenderedPageBreak/>
         <w:t>Parte III – Conclusão</w:t>
       </w:r>
-      <w:bookmarkEnd w:id="29"/>
+      <w:bookmarkEnd w:id="30"/>
     </w:p>
     <w:p>
       <w:pPr>
@@ -6017,22 +6376,22 @@
       <w:pPr>
         <w:pStyle w:val="Ttulo2"/>
       </w:pPr>
-      <w:bookmarkStart w:id="30" w:name="_Toc211418012"/>
+      <w:bookmarkStart w:id="31" w:name="_Toc211418012"/>
       <w:r>
         <w:t>III.1 Conclusão</w:t>
       </w:r>
-      <w:bookmarkEnd w:id="30"/>
+      <w:bookmarkEnd w:id="31"/>
     </w:p>
     <w:p/>
     <w:p>
       <w:pPr>
         <w:pStyle w:val="Ttulo2"/>
       </w:pPr>
-      <w:bookmarkStart w:id="31" w:name="_Toc211418013"/>
+      <w:bookmarkStart w:id="32" w:name="_Toc211418013"/>
       <w:r>
         <w:t>III.2 Sugestões de melhoria</w:t>
       </w:r>
-      <w:bookmarkEnd w:id="31"/>
+      <w:bookmarkEnd w:id="32"/>
     </w:p>
     <w:p>
       <w:pPr>
@@ -6042,14 +6401,14 @@
       <w:r>
         <w:br w:type="page"/>
       </w:r>
-      <w:bookmarkStart w:id="32" w:name="_Toc471979356"/>
-      <w:bookmarkStart w:id="33" w:name="_Toc211418014"/>
+      <w:bookmarkStart w:id="33" w:name="_Toc471979356"/>
+      <w:bookmarkStart w:id="34" w:name="_Toc211418014"/>
       <w:r>
         <w:lastRenderedPageBreak/>
         <w:t>Referências</w:t>
       </w:r>
-      <w:bookmarkEnd w:id="32"/>
       <w:bookmarkEnd w:id="33"/>
+      <w:bookmarkEnd w:id="34"/>
     </w:p>
     <w:p/>
     <w:p>
@@ -6060,16 +6419,16 @@
           <w:rFonts w:eastAsia="Arial Narrow"/>
         </w:rPr>
       </w:pPr>
-      <w:bookmarkStart w:id="34" w:name="_Toc471979357"/>
-      <w:bookmarkStart w:id="35" w:name="_Toc211418015"/>
+      <w:bookmarkStart w:id="35" w:name="_Toc471979357"/>
+      <w:bookmarkStart w:id="36" w:name="_Toc211418015"/>
       <w:r>
         <w:rPr>
           <w:rFonts w:eastAsia="Arial Narrow"/>
         </w:rPr>
         <w:t>Anexos</w:t>
       </w:r>
-      <w:bookmarkEnd w:id="34"/>
       <w:bookmarkEnd w:id="35"/>
+      <w:bookmarkEnd w:id="36"/>
       <w:r>
         <w:rPr>
           <w:rFonts w:eastAsia="Arial Narrow"/>
@@ -11857,7 +12216,12 @@
 </file>
 
 <file path=customXml/item2.xml><?xml version="1.0" encoding="utf-8"?>
-<b:Sources xmlns:b="http://schemas.openxmlformats.org/officeDocument/2006/bibliography" xmlns="http://schemas.openxmlformats.org/officeDocument/2006/bibliography" SelectedStyle="\APA.XSL" StyleName="APA"/>
+<?mso-contentType ?>
+<FormTemplates xmlns="http://schemas.microsoft.com/sharepoint/v3/contenttype/forms">
+  <Display>DocumentLibraryForm</Display>
+  <Edit>DocumentLibraryForm</Edit>
+  <New>DocumentLibraryForm</New>
+</FormTemplates>
 </file>
 
 <file path=customXml/item3.xml><?xml version="1.0" encoding="utf-8"?>
@@ -11873,12 +12237,7 @@
 </file>
 
 <file path=customXml/item4.xml><?xml version="1.0" encoding="utf-8"?>
-<?mso-contentType ?>
-<FormTemplates xmlns="http://schemas.microsoft.com/sharepoint/v3/contenttype/forms">
-  <Display>DocumentLibraryForm</Display>
-  <Edit>DocumentLibraryForm</Edit>
-  <New>DocumentLibraryForm</New>
-</FormTemplates>
+<b:Sources xmlns:b="http://schemas.openxmlformats.org/officeDocument/2006/bibliography" xmlns="http://schemas.openxmlformats.org/officeDocument/2006/bibliography" SelectedStyle="\APA.XSL" StyleName="APA"/>
 </file>
 
 <file path=customXml/itemProps1.xml><?xml version="1.0" encoding="utf-8"?>
@@ -11900,9 +12259,9 @@
 </file>
 
 <file path=customXml/itemProps2.xml><?xml version="1.0" encoding="utf-8"?>
-<ds:datastoreItem xmlns:ds="http://schemas.openxmlformats.org/officeDocument/2006/customXml" ds:itemID="{9C46D67E-02BF-4E37-8EF1-2391CC03D27F}">
+<ds:datastoreItem xmlns:ds="http://schemas.openxmlformats.org/officeDocument/2006/customXml" ds:itemID="{A8BEE9C3-75AD-4607-B106-1B44B05722EA}">
   <ds:schemaRefs>
-    <ds:schemaRef ds:uri="http://schemas.openxmlformats.org/officeDocument/2006/bibliography"/>
+    <ds:schemaRef ds:uri="http://schemas.microsoft.com/sharepoint/v3/contenttype/forms"/>
   </ds:schemaRefs>
 </ds:datastoreItem>
 </file>
@@ -11918,9 +12277,9 @@
 </file>
 
 <file path=customXml/itemProps4.xml><?xml version="1.0" encoding="utf-8"?>
-<ds:datastoreItem xmlns:ds="http://schemas.openxmlformats.org/officeDocument/2006/customXml" ds:itemID="{A8BEE9C3-75AD-4607-B106-1B44B05722EA}">
+<ds:datastoreItem xmlns:ds="http://schemas.openxmlformats.org/officeDocument/2006/customXml" ds:itemID="{9C46D67E-02BF-4E37-8EF1-2391CC03D27F}">
   <ds:schemaRefs>
-    <ds:schemaRef ds:uri="http://schemas.microsoft.com/sharepoint/v3/contenttype/forms"/>
+    <ds:schemaRef ds:uri="http://schemas.openxmlformats.org/officeDocument/2006/bibliography"/>
   </ds:schemaRefs>
 </ds:datastoreItem>
 </file>
</xml_diff>

<commit_message>
US 2.3.6 - add SWOT analysis for APS (#21)
</commit_message>
<xml_diff>
--- a/docs/client_analysis/report_APS.docx
+++ b/docs/client_analysis/report_APS.docx
@@ -6191,11 +6191,442 @@
           <w:b/>
         </w:rPr>
       </w:pPr>
-      <w:r>
+    </w:p>
+    <w:p>
+      <w:pPr>
+        <w:pStyle w:val="Ttulo3"/>
+        <w:rPr>
+          <w:b/>
+          <w:bCs/>
+          <w:color w:val="000000" w:themeColor="text1"/>
+          <w:sz w:val="20"/>
+          <w:szCs w:val="20"/>
+        </w:rPr>
+      </w:pPr>
+      <w:bookmarkStart w:id="23" w:name="_Toc211333579"/>
+      <w:r>
+        <w:rPr>
+          <w:b/>
+          <w:bCs/>
+          <w:color w:val="000000" w:themeColor="text1"/>
+          <w:sz w:val="20"/>
+          <w:szCs w:val="20"/>
+        </w:rPr>
+        <w:t>Análise SWOT</w:t>
+      </w:r>
+      <w:bookmarkEnd w:id="23"/>
+    </w:p>
+    <w:p>
+      <w:r>
+        <w:t xml:space="preserve">Com base nas metodologias PESTEL, </w:t>
+      </w:r>
+      <w:proofErr w:type="spellStart"/>
+      <w:r>
+        <w:t>Porter</w:t>
+      </w:r>
+      <w:proofErr w:type="spellEnd"/>
+      <w:r>
+        <w:t>, VRIO e Cadeia de Valor, foi realizada a seguinte análise SWOT para a APS:</w:t>
+      </w:r>
+    </w:p>
+    <w:tbl>
+      <w:tblPr>
+        <w:tblStyle w:val="TabelacomGrelha"/>
+        <w:tblW w:w="0" w:type="auto"/>
+        <w:tblLook w:val="04A0" w:firstRow="1" w:lastRow="0" w:firstColumn="1" w:lastColumn="0" w:noHBand="0" w:noVBand="1"/>
+      </w:tblPr>
+      <w:tblGrid>
+        <w:gridCol w:w="2335"/>
+        <w:gridCol w:w="6995"/>
+      </w:tblGrid>
+      <w:tr>
+        <w:tc>
+          <w:tcPr>
+            <w:tcW w:w="2337" w:type="dxa"/>
+            <w:vMerge w:val="restart"/>
+            <w:tcBorders>
+              <w:top w:val="single" w:sz="12" w:space="0" w:color="auto"/>
+              <w:left w:val="single" w:sz="12" w:space="0" w:color="auto"/>
+              <w:right w:val="single" w:sz="12" w:space="0" w:color="auto"/>
+            </w:tcBorders>
+            <w:vAlign w:val="center"/>
+          </w:tcPr>
+          <w:p>
+            <w:pPr>
+              <w:jc w:val="center"/>
+              <w:rPr>
+                <w:b/>
+                <w:bCs/>
+                <w:color w:val="000000" w:themeColor="text1"/>
+              </w:rPr>
+            </w:pPr>
+            <w:r>
+              <w:rPr>
+                <w:b/>
+                <w:bCs/>
+                <w:color w:val="000000" w:themeColor="text1"/>
+              </w:rPr>
+              <w:t>Forças (internas)</w:t>
+            </w:r>
+          </w:p>
+        </w:tc>
+        <w:tc>
+          <w:tcPr>
+            <w:tcW w:w="7013" w:type="dxa"/>
+            <w:tcBorders>
+              <w:top w:val="single" w:sz="12" w:space="0" w:color="auto"/>
+              <w:left w:val="single" w:sz="12" w:space="0" w:color="auto"/>
+              <w:right w:val="single" w:sz="12" w:space="0" w:color="auto"/>
+            </w:tcBorders>
+          </w:tcPr>
+          <w:p>
+            <w:r>
+              <w:t>Localização estratégica e infraestruturas modernas.</w:t>
+            </w:r>
+          </w:p>
+        </w:tc>
+      </w:tr>
+      <w:tr>
+        <w:tc>
+          <w:tcPr>
+            <w:tcW w:w="2337" w:type="dxa"/>
+            <w:vMerge/>
+            <w:tcBorders>
+              <w:left w:val="single" w:sz="12" w:space="0" w:color="auto"/>
+              <w:right w:val="single" w:sz="12" w:space="0" w:color="auto"/>
+            </w:tcBorders>
+            <w:vAlign w:val="center"/>
+          </w:tcPr>
+          <w:p>
+            <w:pPr>
+              <w:jc w:val="center"/>
+              <w:rPr>
+                <w:b/>
+                <w:bCs/>
+                <w:color w:val="000000" w:themeColor="text1"/>
+                <w:szCs w:val="22"/>
+              </w:rPr>
+            </w:pPr>
+          </w:p>
+        </w:tc>
+        <w:tc>
+          <w:tcPr>
+            <w:tcW w:w="7013" w:type="dxa"/>
+            <w:tcBorders>
+              <w:left w:val="single" w:sz="12" w:space="0" w:color="auto"/>
+              <w:right w:val="single" w:sz="12" w:space="0" w:color="auto"/>
+            </w:tcBorders>
+          </w:tcPr>
+          <w:p>
+            <w:r>
+              <w:t>Certificações ISO e parcerias internacionais sólidas.</w:t>
+            </w:r>
+          </w:p>
+        </w:tc>
+      </w:tr>
+      <w:tr>
+        <w:tc>
+          <w:tcPr>
+            <w:tcW w:w="2337" w:type="dxa"/>
+            <w:vMerge/>
+            <w:tcBorders>
+              <w:left w:val="single" w:sz="12" w:space="0" w:color="auto"/>
+              <w:bottom w:val="single" w:sz="12" w:space="0" w:color="auto"/>
+              <w:right w:val="single" w:sz="12" w:space="0" w:color="auto"/>
+            </w:tcBorders>
+            <w:vAlign w:val="center"/>
+          </w:tcPr>
+          <w:p>
+            <w:pPr>
+              <w:jc w:val="center"/>
+              <w:rPr>
+                <w:b/>
+                <w:bCs/>
+                <w:color w:val="000000" w:themeColor="text1"/>
+                <w:szCs w:val="22"/>
+              </w:rPr>
+            </w:pPr>
+          </w:p>
+        </w:tc>
+        <w:tc>
+          <w:tcPr>
+            <w:tcW w:w="7013" w:type="dxa"/>
+            <w:tcBorders>
+              <w:left w:val="single" w:sz="12" w:space="0" w:color="auto"/>
+              <w:bottom w:val="single" w:sz="12" w:space="0" w:color="auto"/>
+              <w:right w:val="single" w:sz="12" w:space="0" w:color="auto"/>
+            </w:tcBorders>
+          </w:tcPr>
+          <w:p>
+            <w:r>
+              <w:t>Ligação ferroviária em expansão (Corredor Sul).</w:t>
+            </w:r>
+          </w:p>
+        </w:tc>
+      </w:tr>
+      <w:tr>
+        <w:tc>
+          <w:tcPr>
+            <w:tcW w:w="2337" w:type="dxa"/>
+            <w:vMerge w:val="restart"/>
+            <w:tcBorders>
+              <w:top w:val="single" w:sz="12" w:space="0" w:color="auto"/>
+              <w:left w:val="single" w:sz="12" w:space="0" w:color="auto"/>
+              <w:right w:val="single" w:sz="12" w:space="0" w:color="auto"/>
+            </w:tcBorders>
+            <w:vAlign w:val="center"/>
+          </w:tcPr>
+          <w:p>
+            <w:pPr>
+              <w:jc w:val="center"/>
+              <w:rPr>
+                <w:b/>
+                <w:bCs/>
+                <w:color w:val="000000" w:themeColor="text1"/>
+                <w:szCs w:val="22"/>
+              </w:rPr>
+            </w:pPr>
+            <w:r>
+              <w:rPr>
+                <w:b/>
+                <w:bCs/>
+                <w:color w:val="000000" w:themeColor="text1"/>
+                <w:szCs w:val="22"/>
+              </w:rPr>
+              <w:t>Fraquezas (internas)</w:t>
+            </w:r>
+          </w:p>
+        </w:tc>
+        <w:tc>
+          <w:tcPr>
+            <w:tcW w:w="7013" w:type="dxa"/>
+            <w:tcBorders>
+              <w:top w:val="single" w:sz="12" w:space="0" w:color="auto"/>
+              <w:left w:val="single" w:sz="12" w:space="0" w:color="auto"/>
+              <w:right w:val="single" w:sz="12" w:space="0" w:color="auto"/>
+            </w:tcBorders>
+          </w:tcPr>
+          <w:p>
+            <w:r>
+              <w:t>Dependência do comércio energético e centralização decisória.</w:t>
+            </w:r>
+          </w:p>
+        </w:tc>
+      </w:tr>
+      <w:tr>
+        <w:trPr>
+          <w:trHeight w:val="401"/>
+        </w:trPr>
+        <w:tc>
+          <w:tcPr>
+            <w:tcW w:w="2337" w:type="dxa"/>
+            <w:vMerge/>
+            <w:tcBorders>
+              <w:left w:val="single" w:sz="12" w:space="0" w:color="auto"/>
+              <w:right w:val="single" w:sz="12" w:space="0" w:color="auto"/>
+            </w:tcBorders>
+            <w:vAlign w:val="center"/>
+          </w:tcPr>
+          <w:p>
+            <w:pPr>
+              <w:jc w:val="center"/>
+              <w:rPr>
+                <w:b/>
+                <w:bCs/>
+                <w:color w:val="000000" w:themeColor="text1"/>
+                <w:szCs w:val="22"/>
+              </w:rPr>
+            </w:pPr>
+          </w:p>
+        </w:tc>
+        <w:tc>
+          <w:tcPr>
+            <w:tcW w:w="7013" w:type="dxa"/>
+            <w:tcBorders>
+              <w:left w:val="single" w:sz="12" w:space="0" w:color="auto"/>
+              <w:right w:val="single" w:sz="12" w:space="0" w:color="auto"/>
+            </w:tcBorders>
+          </w:tcPr>
+          <w:p>
+            <w:r>
+              <w:t>Limitações de autonomia dos portos do Algarve.</w:t>
+            </w:r>
+          </w:p>
+        </w:tc>
+      </w:tr>
+      <w:tr>
+        <w:tc>
+          <w:tcPr>
+            <w:tcW w:w="2337" w:type="dxa"/>
+            <w:vMerge/>
+            <w:tcBorders>
+              <w:left w:val="single" w:sz="12" w:space="0" w:color="auto"/>
+              <w:bottom w:val="single" w:sz="12" w:space="0" w:color="auto"/>
+              <w:right w:val="single" w:sz="12" w:space="0" w:color="auto"/>
+            </w:tcBorders>
+            <w:vAlign w:val="center"/>
+          </w:tcPr>
+          <w:p>
+            <w:pPr>
+              <w:jc w:val="center"/>
+              <w:rPr>
+                <w:b/>
+                <w:bCs/>
+                <w:color w:val="000000" w:themeColor="text1"/>
+                <w:szCs w:val="22"/>
+              </w:rPr>
+            </w:pPr>
+          </w:p>
+        </w:tc>
+        <w:tc>
+          <w:tcPr>
+            <w:tcW w:w="7013" w:type="dxa"/>
+            <w:tcBorders>
+              <w:left w:val="single" w:sz="12" w:space="0" w:color="auto"/>
+              <w:bottom w:val="single" w:sz="12" w:space="0" w:color="auto"/>
+              <w:right w:val="single" w:sz="12" w:space="0" w:color="auto"/>
+            </w:tcBorders>
+          </w:tcPr>
+          <w:p>
+            <w:r>
+              <w:t>Baixa diversificação de receitas e vulnerabilidade ambiental.</w:t>
+            </w:r>
+          </w:p>
+        </w:tc>
+      </w:tr>
+      <w:tr>
+        <w:tc>
+          <w:tcPr>
+            <w:tcW w:w="2337" w:type="dxa"/>
+            <w:tcBorders>
+              <w:top w:val="single" w:sz="12" w:space="0" w:color="auto"/>
+              <w:left w:val="single" w:sz="12" w:space="0" w:color="auto"/>
+              <w:bottom w:val="single" w:sz="12" w:space="0" w:color="auto"/>
+              <w:right w:val="single" w:sz="12" w:space="0" w:color="auto"/>
+            </w:tcBorders>
+            <w:vAlign w:val="center"/>
+          </w:tcPr>
+          <w:p>
+            <w:pPr>
+              <w:jc w:val="center"/>
+              <w:rPr>
+                <w:b/>
+                <w:bCs/>
+                <w:color w:val="000000" w:themeColor="text1"/>
+                <w:szCs w:val="22"/>
+              </w:rPr>
+            </w:pPr>
+            <w:r>
+              <w:rPr>
+                <w:b/>
+                <w:bCs/>
+                <w:color w:val="000000" w:themeColor="text1"/>
+                <w:szCs w:val="22"/>
+              </w:rPr>
+              <w:t>Oportunidades</w:t>
+            </w:r>
+          </w:p>
+        </w:tc>
+        <w:tc>
+          <w:tcPr>
+            <w:tcW w:w="7013" w:type="dxa"/>
+            <w:tcBorders>
+              <w:top w:val="single" w:sz="12" w:space="0" w:color="auto"/>
+              <w:left w:val="single" w:sz="12" w:space="0" w:color="auto"/>
+              <w:bottom w:val="single" w:sz="12" w:space="0" w:color="auto"/>
+              <w:right w:val="single" w:sz="12" w:space="0" w:color="auto"/>
+            </w:tcBorders>
+          </w:tcPr>
+          <w:p>
+            <w:r>
+              <w:t xml:space="preserve">Expansão dos terminais, utilização de energias verdes, automação portuária e reforço da ligação ferroviária ao </w:t>
+            </w:r>
+            <w:proofErr w:type="spellStart"/>
+            <w:r>
+              <w:t>hinterland</w:t>
+            </w:r>
+            <w:proofErr w:type="spellEnd"/>
+            <w:r>
+              <w:t xml:space="preserve"> ibérico.</w:t>
+            </w:r>
+          </w:p>
+        </w:tc>
+      </w:tr>
+      <w:tr>
+        <w:tc>
+          <w:tcPr>
+            <w:tcW w:w="2337" w:type="dxa"/>
+            <w:tcBorders>
+              <w:top w:val="single" w:sz="12" w:space="0" w:color="auto"/>
+              <w:left w:val="single" w:sz="12" w:space="0" w:color="auto"/>
+              <w:bottom w:val="single" w:sz="12" w:space="0" w:color="auto"/>
+              <w:right w:val="single" w:sz="12" w:space="0" w:color="auto"/>
+            </w:tcBorders>
+            <w:vAlign w:val="center"/>
+          </w:tcPr>
+          <w:p>
+            <w:pPr>
+              <w:jc w:val="center"/>
+              <w:rPr>
+                <w:b/>
+                <w:bCs/>
+                <w:color w:val="000000" w:themeColor="text1"/>
+                <w:szCs w:val="22"/>
+              </w:rPr>
+            </w:pPr>
+            <w:r>
+              <w:rPr>
+                <w:b/>
+                <w:bCs/>
+                <w:color w:val="000000" w:themeColor="text1"/>
+                <w:szCs w:val="22"/>
+              </w:rPr>
+              <w:t>Ameaças</w:t>
+            </w:r>
+          </w:p>
+        </w:tc>
+        <w:tc>
+          <w:tcPr>
+            <w:tcW w:w="7013" w:type="dxa"/>
+            <w:tcBorders>
+              <w:top w:val="single" w:sz="12" w:space="0" w:color="auto"/>
+              <w:left w:val="single" w:sz="12" w:space="0" w:color="auto"/>
+              <w:bottom w:val="single" w:sz="12" w:space="0" w:color="auto"/>
+              <w:right w:val="single" w:sz="12" w:space="0" w:color="auto"/>
+            </w:tcBorders>
+          </w:tcPr>
+          <w:p>
+            <w:r>
+              <w:t>Concorrência de portos espanhóis, instabilidade económica global e exigências ambientais da União Europeia.</w:t>
+            </w:r>
+          </w:p>
+        </w:tc>
+      </w:tr>
+    </w:tbl>
+    <w:p>
+      <w:pPr>
+        <w:spacing w:line="240" w:lineRule="auto"/>
+        <w:jc w:val="left"/>
         <w:rPr>
           <w:rFonts w:cs="Times New Roman"/>
           <w:b/>
         </w:rPr>
+      </w:pPr>
+    </w:p>
+    <w:p>
+      <w:pPr>
+        <w:spacing w:line="240" w:lineRule="auto"/>
+        <w:jc w:val="left"/>
+        <w:rPr>
+          <w:rFonts w:cs="Times New Roman"/>
+          <w:b/>
+        </w:rPr>
+      </w:pPr>
+      <w:r>
+        <w:rPr>
+          <w:rFonts w:cs="Times New Roman"/>
+          <w:b/>
+        </w:rPr>
         <w:br w:type="page"/>
       </w:r>
     </w:p>
@@ -6203,7 +6634,7 @@
       <w:pPr>
         <w:pStyle w:val="Ttulo2"/>
       </w:pPr>
-      <w:bookmarkStart w:id="23" w:name="_Toc211418004"/>
+      <w:bookmarkStart w:id="24" w:name="_Toc211418004"/>
       <w:r>
         <w:lastRenderedPageBreak/>
         <w:t>II.</w:t>
@@ -6217,14 +6648,14 @@
       <w:r>
         <w:t xml:space="preserve"> e Sistemas de informação</w:t>
       </w:r>
-      <w:bookmarkEnd w:id="23"/>
+      <w:bookmarkEnd w:id="24"/>
     </w:p>
     <w:p/>
     <w:p>
       <w:pPr>
         <w:pStyle w:val="Ttulo2"/>
       </w:pPr>
-      <w:bookmarkStart w:id="24" w:name="_Toc211418005"/>
+      <w:bookmarkStart w:id="25" w:name="_Toc211418005"/>
       <w:r>
         <w:t>II</w:t>
       </w:r>
@@ -6249,50 +6680,50 @@
       <w:r>
         <w:t>Pessoas</w:t>
       </w:r>
-      <w:bookmarkEnd w:id="24"/>
+      <w:bookmarkEnd w:id="25"/>
     </w:p>
     <w:p/>
     <w:p>
       <w:pPr>
         <w:pStyle w:val="Ttulo2"/>
       </w:pPr>
-      <w:bookmarkStart w:id="25" w:name="_Toc211418006"/>
+      <w:bookmarkStart w:id="26" w:name="_Toc211418006"/>
       <w:r>
         <w:t>II.5 Promoção da produtividade</w:t>
       </w:r>
-      <w:bookmarkEnd w:id="25"/>
+      <w:bookmarkEnd w:id="26"/>
     </w:p>
     <w:p/>
     <w:p>
       <w:pPr>
         <w:pStyle w:val="Ttulo2"/>
       </w:pPr>
-      <w:bookmarkStart w:id="26" w:name="_Toc211418007"/>
+      <w:bookmarkStart w:id="27" w:name="_Toc211418007"/>
       <w:r>
         <w:t>II.6 Economia circular</w:t>
       </w:r>
-      <w:bookmarkEnd w:id="26"/>
+      <w:bookmarkEnd w:id="27"/>
     </w:p>
     <w:p/>
     <w:p>
       <w:pPr>
         <w:pStyle w:val="Ttulo2"/>
       </w:pPr>
-      <w:bookmarkStart w:id="27" w:name="_Toc211418008"/>
+      <w:bookmarkStart w:id="28" w:name="_Toc211418008"/>
       <w:r>
         <w:t xml:space="preserve">II.7 </w:t>
       </w:r>
       <w:r>
         <w:t>Marketing</w:t>
       </w:r>
-      <w:bookmarkEnd w:id="27"/>
+      <w:bookmarkEnd w:id="28"/>
     </w:p>
     <w:p/>
     <w:p>
       <w:pPr>
         <w:pStyle w:val="Ttulo2"/>
       </w:pPr>
-      <w:bookmarkStart w:id="28" w:name="_Toc211418009"/>
+      <w:bookmarkStart w:id="29" w:name="_Toc211418009"/>
       <w:r>
         <w:t>II.</w:t>
       </w:r>
@@ -6311,14 +6742,14 @@
       <w:r>
         <w:t>Financeira</w:t>
       </w:r>
-      <w:bookmarkEnd w:id="28"/>
+      <w:bookmarkEnd w:id="29"/>
     </w:p>
     <w:p/>
     <w:p>
       <w:pPr>
         <w:pStyle w:val="Ttulo2"/>
       </w:pPr>
-      <w:bookmarkStart w:id="29" w:name="_Toc211418010"/>
+      <w:bookmarkStart w:id="30" w:name="_Toc211418010"/>
       <w:r>
         <w:t>II.</w:t>
       </w:r>
@@ -6334,7 +6765,7 @@
       <w:r>
         <w:t xml:space="preserve"> e Indústria 4.0</w:t>
       </w:r>
-      <w:bookmarkEnd w:id="29"/>
+      <w:bookmarkEnd w:id="30"/>
     </w:p>
     <w:p/>
     <w:p>
@@ -6358,12 +6789,12 @@
           <w:szCs w:val="22"/>
         </w:rPr>
       </w:pPr>
-      <w:bookmarkStart w:id="30" w:name="_Toc211418011"/>
+      <w:bookmarkStart w:id="31" w:name="_Toc211418011"/>
       <w:r>
         <w:lastRenderedPageBreak/>
         <w:t>Parte III – Conclusão</w:t>
       </w:r>
-      <w:bookmarkEnd w:id="30"/>
+      <w:bookmarkEnd w:id="31"/>
     </w:p>
     <w:p>
       <w:pPr>
@@ -6376,22 +6807,22 @@
       <w:pPr>
         <w:pStyle w:val="Ttulo2"/>
       </w:pPr>
-      <w:bookmarkStart w:id="31" w:name="_Toc211418012"/>
+      <w:bookmarkStart w:id="32" w:name="_Toc211418012"/>
       <w:r>
         <w:t>III.1 Conclusão</w:t>
       </w:r>
-      <w:bookmarkEnd w:id="31"/>
+      <w:bookmarkEnd w:id="32"/>
     </w:p>
     <w:p/>
     <w:p>
       <w:pPr>
         <w:pStyle w:val="Ttulo2"/>
       </w:pPr>
-      <w:bookmarkStart w:id="32" w:name="_Toc211418013"/>
+      <w:bookmarkStart w:id="33" w:name="_Toc211418013"/>
       <w:r>
         <w:t>III.2 Sugestões de melhoria</w:t>
       </w:r>
-      <w:bookmarkEnd w:id="32"/>
+      <w:bookmarkEnd w:id="33"/>
     </w:p>
     <w:p>
       <w:pPr>
@@ -6401,14 +6832,14 @@
       <w:r>
         <w:br w:type="page"/>
       </w:r>
-      <w:bookmarkStart w:id="33" w:name="_Toc471979356"/>
-      <w:bookmarkStart w:id="34" w:name="_Toc211418014"/>
+      <w:bookmarkStart w:id="34" w:name="_Toc471979356"/>
+      <w:bookmarkStart w:id="35" w:name="_Toc211418014"/>
       <w:r>
         <w:lastRenderedPageBreak/>
         <w:t>Referências</w:t>
       </w:r>
-      <w:bookmarkEnd w:id="33"/>
       <w:bookmarkEnd w:id="34"/>
+      <w:bookmarkEnd w:id="35"/>
     </w:p>
     <w:p/>
     <w:p>
@@ -6419,16 +6850,16 @@
           <w:rFonts w:eastAsia="Arial Narrow"/>
         </w:rPr>
       </w:pPr>
-      <w:bookmarkStart w:id="35" w:name="_Toc471979357"/>
-      <w:bookmarkStart w:id="36" w:name="_Toc211418015"/>
+      <w:bookmarkStart w:id="36" w:name="_Toc471979357"/>
+      <w:bookmarkStart w:id="37" w:name="_Toc211418015"/>
       <w:r>
         <w:rPr>
           <w:rFonts w:eastAsia="Arial Narrow"/>
         </w:rPr>
         <w:t>Anexos</w:t>
       </w:r>
-      <w:bookmarkEnd w:id="35"/>
       <w:bookmarkEnd w:id="36"/>
+      <w:bookmarkEnd w:id="37"/>
       <w:r>
         <w:rPr>
           <w:rFonts w:eastAsia="Arial Narrow"/>
@@ -12054,6 +12485,15 @@
 </file>
 
 <file path=customXml/item1.xml><?xml version="1.0" encoding="utf-8"?>
+<?mso-contentType ?>
+<FormTemplates xmlns="http://schemas.microsoft.com/sharepoint/v3/contenttype/forms">
+  <Display>DocumentLibraryForm</Display>
+  <Edit>DocumentLibraryForm</Edit>
+  <New>DocumentLibraryForm</New>
+</FormTemplates>
+</file>
+
+<file path=customXml/item2.xml><?xml version="1.0" encoding="utf-8"?>
 <ct:contentTypeSchema xmlns:ct="http://schemas.microsoft.com/office/2006/metadata/contentType" xmlns:ma="http://schemas.microsoft.com/office/2006/metadata/properties/metaAttributes" ct:_="" ma:_="" ma:contentTypeName="Documento" ma:contentTypeID="0x0101008F0F40A57A4B4943AE5F0D22A00E6876" ma:contentTypeVersion="7" ma:contentTypeDescription="Criar um novo documento." ma:contentTypeScope="" ma:versionID="0777f9d8bcaf4fa9f3f247f35de05543">
   <xsd:schema xmlns:xsd="http://www.w3.org/2001/XMLSchema" xmlns:xs="http://www.w3.org/2001/XMLSchema" xmlns:p="http://schemas.microsoft.com/office/2006/metadata/properties" xmlns:ns2="6e977478-40fc-4c96-9b59-58f9adc62218" targetNamespace="http://schemas.microsoft.com/office/2006/metadata/properties" ma:root="true" ma:fieldsID="6e1588d9447c950b5d06efd32159bf41" ns2:_="">
     <xsd:import namespace="6e977478-40fc-4c96-9b59-58f9adc62218"/>
@@ -12215,16 +12655,11 @@
 </ct:contentTypeSchema>
 </file>
 
-<file path=customXml/item2.xml><?xml version="1.0" encoding="utf-8"?>
-<?mso-contentType ?>
-<FormTemplates xmlns="http://schemas.microsoft.com/sharepoint/v3/contenttype/forms">
-  <Display>DocumentLibraryForm</Display>
-  <Edit>DocumentLibraryForm</Edit>
-  <New>DocumentLibraryForm</New>
-</FormTemplates>
+<file path=customXml/item3.xml><?xml version="1.0" encoding="utf-8"?>
+<b:Sources xmlns:b="http://schemas.openxmlformats.org/officeDocument/2006/bibliography" xmlns="http://schemas.openxmlformats.org/officeDocument/2006/bibliography" SelectedStyle="\APA.XSL" StyleName="APA"/>
 </file>
 
-<file path=customXml/item3.xml><?xml version="1.0" encoding="utf-8"?>
+<file path=customXml/item4.xml><?xml version="1.0" encoding="utf-8"?>
 <p:properties xmlns:p="http://schemas.microsoft.com/office/2006/metadata/properties" xmlns:xsi="http://www.w3.org/2001/XMLSchema-instance" xmlns:pc="http://schemas.microsoft.com/office/infopath/2007/PartnerControls">
   <documentManagement>
     <NotebookType xmlns="6e977478-40fc-4c96-9b59-58f9adc62218" xsi:nil="true"/>
@@ -12236,11 +12671,15 @@
 </p:properties>
 </file>
 
-<file path=customXml/item4.xml><?xml version="1.0" encoding="utf-8"?>
-<b:Sources xmlns:b="http://schemas.openxmlformats.org/officeDocument/2006/bibliography" xmlns="http://schemas.openxmlformats.org/officeDocument/2006/bibliography" SelectedStyle="\APA.XSL" StyleName="APA"/>
+<file path=customXml/itemProps1.xml><?xml version="1.0" encoding="utf-8"?>
+<ds:datastoreItem xmlns:ds="http://schemas.openxmlformats.org/officeDocument/2006/customXml" ds:itemID="{A8BEE9C3-75AD-4607-B106-1B44B05722EA}">
+  <ds:schemaRefs>
+    <ds:schemaRef ds:uri="http://schemas.microsoft.com/sharepoint/v3/contenttype/forms"/>
+  </ds:schemaRefs>
+</ds:datastoreItem>
 </file>
 
-<file path=customXml/itemProps1.xml><?xml version="1.0" encoding="utf-8"?>
+<file path=customXml/itemProps2.xml><?xml version="1.0" encoding="utf-8"?>
 <ds:datastoreItem xmlns:ds="http://schemas.openxmlformats.org/officeDocument/2006/customXml" ds:itemID="{F22FBF9B-697C-4384-8BA9-D9CACC814933}">
   <ds:schemaRefs>
     <ds:schemaRef ds:uri="http://schemas.microsoft.com/office/2006/metadata/contentType"/>
@@ -12258,15 +12697,15 @@
 </ds:datastoreItem>
 </file>
 
-<file path=customXml/itemProps2.xml><?xml version="1.0" encoding="utf-8"?>
-<ds:datastoreItem xmlns:ds="http://schemas.openxmlformats.org/officeDocument/2006/customXml" ds:itemID="{A8BEE9C3-75AD-4607-B106-1B44B05722EA}">
+<file path=customXml/itemProps3.xml><?xml version="1.0" encoding="utf-8"?>
+<ds:datastoreItem xmlns:ds="http://schemas.openxmlformats.org/officeDocument/2006/customXml" ds:itemID="{9C46D67E-02BF-4E37-8EF1-2391CC03D27F}">
   <ds:schemaRefs>
-    <ds:schemaRef ds:uri="http://schemas.microsoft.com/sharepoint/v3/contenttype/forms"/>
+    <ds:schemaRef ds:uri="http://schemas.openxmlformats.org/officeDocument/2006/bibliography"/>
   </ds:schemaRefs>
 </ds:datastoreItem>
 </file>
 
-<file path=customXml/itemProps3.xml><?xml version="1.0" encoding="utf-8"?>
+<file path=customXml/itemProps4.xml><?xml version="1.0" encoding="utf-8"?>
 <ds:datastoreItem xmlns:ds="http://schemas.openxmlformats.org/officeDocument/2006/customXml" ds:itemID="{A02BD9CC-6025-4F76-BD90-0F1427CF0A06}">
   <ds:schemaRefs>
     <ds:schemaRef ds:uri="http://schemas.microsoft.com/office/2006/metadata/properties"/>
@@ -12274,12 +12713,4 @@
     <ds:schemaRef ds:uri="6e977478-40fc-4c96-9b59-58f9adc62218"/>
   </ds:schemaRefs>
 </ds:datastoreItem>
-</file>
-
-<file path=customXml/itemProps4.xml><?xml version="1.0" encoding="utf-8"?>
-<ds:datastoreItem xmlns:ds="http://schemas.openxmlformats.org/officeDocument/2006/customXml" ds:itemID="{9C46D67E-02BF-4E37-8EF1-2391CC03D27F}">
-  <ds:schemaRefs>
-    <ds:schemaRef ds:uri="http://schemas.openxmlformats.org/officeDocument/2006/bibliography"/>
-  </ds:schemaRefs>
-</ds:datastoreItem>
 </file>
</xml_diff>

<commit_message>
US 2.3.7 - add strategic proposals for sustainability and digital transformation in APS report (#22)
</commit_message>
<xml_diff>
--- a/docs/client_analysis/report_APS.docx
+++ b/docs/client_analysis/report_APS.docx
@@ -714,7 +714,7 @@
           <w:r>
             <w:fldChar w:fldCharType="separate"/>
           </w:r>
-          <w:hyperlink w:anchor="_Toc211417988" w:history="1">
+          <w:hyperlink w:anchor="_Toc211418559" w:history="1">
             <w:r>
               <w:rPr>
                 <w:rStyle w:val="Hiperligao"/>
@@ -742,7 +742,7 @@
                 <w:noProof/>
                 <w:webHidden/>
               </w:rPr>
-              <w:instrText xml:space="preserve"> PAGEREF _Toc211417988 \h </w:instrText>
+              <w:instrText xml:space="preserve"> PAGEREF _Toc211418559 \h </w:instrText>
             </w:r>
             <w:r>
               <w:rPr>
@@ -787,7 +787,7 @@
               <w14:ligatures w14:val="standardContextual"/>
             </w:rPr>
           </w:pPr>
-          <w:hyperlink w:anchor="_Toc211417989" w:history="1">
+          <w:hyperlink w:anchor="_Toc211418560" w:history="1">
             <w:r>
               <w:rPr>
                 <w:rStyle w:val="Hiperligao"/>
@@ -815,7 +815,7 @@
                 <w:noProof/>
                 <w:webHidden/>
               </w:rPr>
-              <w:instrText xml:space="preserve"> PAGEREF _Toc211417989 \h </w:instrText>
+              <w:instrText xml:space="preserve"> PAGEREF _Toc211418560 \h </w:instrText>
             </w:r>
             <w:r>
               <w:rPr>
@@ -860,7 +860,7 @@
               <w14:ligatures w14:val="standardContextual"/>
             </w:rPr>
           </w:pPr>
-          <w:hyperlink w:anchor="_Toc211417990" w:history="1">
+          <w:hyperlink w:anchor="_Toc211418561" w:history="1">
             <w:r>
               <w:rPr>
                 <w:rStyle w:val="Hiperligao"/>
@@ -887,7 +887,7 @@
                 <w:noProof/>
                 <w:webHidden/>
               </w:rPr>
-              <w:instrText xml:space="preserve"> PAGEREF _Toc211417990 \h </w:instrText>
+              <w:instrText xml:space="preserve"> PAGEREF _Toc211418561 \h </w:instrText>
             </w:r>
             <w:r>
               <w:rPr>
@@ -932,7 +932,7 @@
               <w14:ligatures w14:val="standardContextual"/>
             </w:rPr>
           </w:pPr>
-          <w:hyperlink w:anchor="_Toc211417991" w:history="1">
+          <w:hyperlink w:anchor="_Toc211418562" w:history="1">
             <w:r>
               <w:rPr>
                 <w:rStyle w:val="Hiperligao"/>
@@ -959,7 +959,7 @@
                 <w:noProof/>
                 <w:webHidden/>
               </w:rPr>
-              <w:instrText xml:space="preserve"> PAGEREF _Toc211417991 \h </w:instrText>
+              <w:instrText xml:space="preserve"> PAGEREF _Toc211418562 \h </w:instrText>
             </w:r>
             <w:r>
               <w:rPr>
@@ -1004,7 +1004,7 @@
               <w14:ligatures w14:val="standardContextual"/>
             </w:rPr>
           </w:pPr>
-          <w:hyperlink w:anchor="_Toc211417992" w:history="1">
+          <w:hyperlink w:anchor="_Toc211418563" w:history="1">
             <w:r>
               <w:rPr>
                 <w:rStyle w:val="Hiperligao"/>
@@ -1031,7 +1031,7 @@
                 <w:noProof/>
                 <w:webHidden/>
               </w:rPr>
-              <w:instrText xml:space="preserve"> PAGEREF _Toc211417992 \h </w:instrText>
+              <w:instrText xml:space="preserve"> PAGEREF _Toc211418563 \h </w:instrText>
             </w:r>
             <w:r>
               <w:rPr>
@@ -1076,7 +1076,7 @@
               <w14:ligatures w14:val="standardContextual"/>
             </w:rPr>
           </w:pPr>
-          <w:hyperlink w:anchor="_Toc211417993" w:history="1">
+          <w:hyperlink w:anchor="_Toc211418564" w:history="1">
             <w:r>
               <w:rPr>
                 <w:rStyle w:val="Hiperligao"/>
@@ -1103,7 +1103,7 @@
                 <w:noProof/>
                 <w:webHidden/>
               </w:rPr>
-              <w:instrText xml:space="preserve"> PAGEREF _Toc211417993 \h </w:instrText>
+              <w:instrText xml:space="preserve"> PAGEREF _Toc211418564 \h </w:instrText>
             </w:r>
             <w:r>
               <w:rPr>
@@ -1148,7 +1148,7 @@
               <w14:ligatures w14:val="standardContextual"/>
             </w:rPr>
           </w:pPr>
-          <w:hyperlink w:anchor="_Toc211417994" w:history="1">
+          <w:hyperlink w:anchor="_Toc211418565" w:history="1">
             <w:r>
               <w:rPr>
                 <w:rStyle w:val="Hiperligao"/>
@@ -1175,7 +1175,7 @@
                 <w:noProof/>
                 <w:webHidden/>
               </w:rPr>
-              <w:instrText xml:space="preserve"> PAGEREF _Toc211417994 \h </w:instrText>
+              <w:instrText xml:space="preserve"> PAGEREF _Toc211418565 \h </w:instrText>
             </w:r>
             <w:r>
               <w:rPr>
@@ -1220,7 +1220,7 @@
               <w14:ligatures w14:val="standardContextual"/>
             </w:rPr>
           </w:pPr>
-          <w:hyperlink w:anchor="_Toc211417995" w:history="1">
+          <w:hyperlink w:anchor="_Toc211418566" w:history="1">
             <w:r>
               <w:rPr>
                 <w:rStyle w:val="Hiperligao"/>
@@ -1247,7 +1247,7 @@
                 <w:noProof/>
                 <w:webHidden/>
               </w:rPr>
-              <w:instrText xml:space="preserve"> PAGEREF _Toc211417995 \h </w:instrText>
+              <w:instrText xml:space="preserve"> PAGEREF _Toc211418566 \h </w:instrText>
             </w:r>
             <w:r>
               <w:rPr>
@@ -1292,7 +1292,7 @@
               <w14:ligatures w14:val="standardContextual"/>
             </w:rPr>
           </w:pPr>
-          <w:hyperlink w:anchor="_Toc211417996" w:history="1">
+          <w:hyperlink w:anchor="_Toc211418567" w:history="1">
             <w:r>
               <w:rPr>
                 <w:rStyle w:val="Hiperligao"/>
@@ -1319,7 +1319,7 @@
                 <w:noProof/>
                 <w:webHidden/>
               </w:rPr>
-              <w:instrText xml:space="preserve"> PAGEREF _Toc211417996 \h </w:instrText>
+              <w:instrText xml:space="preserve"> PAGEREF _Toc211418567 \h </w:instrText>
             </w:r>
             <w:r>
               <w:rPr>
@@ -1364,7 +1364,7 @@
               <w14:ligatures w14:val="standardContextual"/>
             </w:rPr>
           </w:pPr>
-          <w:hyperlink w:anchor="_Toc211417997" w:history="1">
+          <w:hyperlink w:anchor="_Toc211418568" w:history="1">
             <w:r>
               <w:rPr>
                 <w:rStyle w:val="Hiperligao"/>
@@ -1391,7 +1391,7 @@
                 <w:noProof/>
                 <w:webHidden/>
               </w:rPr>
-              <w:instrText xml:space="preserve"> PAGEREF _Toc211417997 \h </w:instrText>
+              <w:instrText xml:space="preserve"> PAGEREF _Toc211418568 \h </w:instrText>
             </w:r>
             <w:r>
               <w:rPr>
@@ -1436,7 +1436,7 @@
               <w14:ligatures w14:val="standardContextual"/>
             </w:rPr>
           </w:pPr>
-          <w:hyperlink w:anchor="_Toc211417998" w:history="1">
+          <w:hyperlink w:anchor="_Toc211418569" w:history="1">
             <w:r>
               <w:rPr>
                 <w:rStyle w:val="Hiperligao"/>
@@ -1463,7 +1463,7 @@
                 <w:noProof/>
                 <w:webHidden/>
               </w:rPr>
-              <w:instrText xml:space="preserve"> PAGEREF _Toc211417998 \h </w:instrText>
+              <w:instrText xml:space="preserve"> PAGEREF _Toc211418569 \h </w:instrText>
             </w:r>
             <w:r>
               <w:rPr>
@@ -1508,7 +1508,7 @@
               <w14:ligatures w14:val="standardContextual"/>
             </w:rPr>
           </w:pPr>
-          <w:hyperlink w:anchor="_Toc211417999" w:history="1">
+          <w:hyperlink w:anchor="_Toc211418570" w:history="1">
             <w:r>
               <w:rPr>
                 <w:rStyle w:val="Hiperligao"/>
@@ -1535,7 +1535,7 @@
                 <w:noProof/>
                 <w:webHidden/>
               </w:rPr>
-              <w:instrText xml:space="preserve"> PAGEREF _Toc211417999 \h </w:instrText>
+              <w:instrText xml:space="preserve"> PAGEREF _Toc211418570 \h </w:instrText>
             </w:r>
             <w:r>
               <w:rPr>
@@ -1580,7 +1580,7 @@
               <w14:ligatures w14:val="standardContextual"/>
             </w:rPr>
           </w:pPr>
-          <w:hyperlink w:anchor="_Toc211418000" w:history="1">
+          <w:hyperlink w:anchor="_Toc211418571" w:history="1">
             <w:r>
               <w:rPr>
                 <w:rStyle w:val="Hiperligao"/>
@@ -1607,7 +1607,7 @@
                 <w:noProof/>
                 <w:webHidden/>
               </w:rPr>
-              <w:instrText xml:space="preserve"> PAGEREF _Toc211418000 \h </w:instrText>
+              <w:instrText xml:space="preserve"> PAGEREF _Toc211418571 \h </w:instrText>
             </w:r>
             <w:r>
               <w:rPr>
@@ -1652,7 +1652,7 @@
               <w14:ligatures w14:val="standardContextual"/>
             </w:rPr>
           </w:pPr>
-          <w:hyperlink w:anchor="_Toc211418001" w:history="1">
+          <w:hyperlink w:anchor="_Toc211418572" w:history="1">
             <w:r>
               <w:rPr>
                 <w:rStyle w:val="Hiperligao"/>
@@ -1679,7 +1679,7 @@
                 <w:noProof/>
                 <w:webHidden/>
               </w:rPr>
-              <w:instrText xml:space="preserve"> PAGEREF _Toc211418001 \h </w:instrText>
+              <w:instrText xml:space="preserve"> PAGEREF _Toc211418572 \h </w:instrText>
             </w:r>
             <w:r>
               <w:rPr>
@@ -1724,7 +1724,7 @@
               <w14:ligatures w14:val="standardContextual"/>
             </w:rPr>
           </w:pPr>
-          <w:hyperlink w:anchor="_Toc211418002" w:history="1">
+          <w:hyperlink w:anchor="_Toc211418573" w:history="1">
             <w:r>
               <w:rPr>
                 <w:rStyle w:val="Hiperligao"/>
@@ -1751,7 +1751,7 @@
                 <w:noProof/>
                 <w:webHidden/>
               </w:rPr>
-              <w:instrText xml:space="preserve"> PAGEREF _Toc211418002 \h </w:instrText>
+              <w:instrText xml:space="preserve"> PAGEREF _Toc211418573 \h </w:instrText>
             </w:r>
             <w:r>
               <w:rPr>
@@ -1796,7 +1796,7 @@
               <w14:ligatures w14:val="standardContextual"/>
             </w:rPr>
           </w:pPr>
-          <w:hyperlink w:anchor="_Toc211418003" w:history="1">
+          <w:hyperlink w:anchor="_Toc211418574" w:history="1">
             <w:r>
               <w:rPr>
                 <w:rStyle w:val="Hiperligao"/>
@@ -1823,7 +1823,7 @@
                 <w:noProof/>
                 <w:webHidden/>
               </w:rPr>
-              <w:instrText xml:space="preserve"> PAGEREF _Toc211418003 \h </w:instrText>
+              <w:instrText xml:space="preserve"> PAGEREF _Toc211418574 \h </w:instrText>
             </w:r>
             <w:r>
               <w:rPr>
@@ -1844,6 +1844,294 @@
                 <w:webHidden/>
               </w:rPr>
               <w:t>17</w:t>
+            </w:r>
+            <w:r>
+              <w:rPr>
+                <w:noProof/>
+                <w:webHidden/>
+              </w:rPr>
+              <w:fldChar w:fldCharType="end"/>
+            </w:r>
+          </w:hyperlink>
+        </w:p>
+        <w:p>
+          <w:pPr>
+            <w:pStyle w:val="ndice3"/>
+            <w:tabs>
+              <w:tab w:val="right" w:leader="dot" w:pos="9350"/>
+            </w:tabs>
+            <w:rPr>
+              <w:rFonts w:asciiTheme="minorHAnsi" w:eastAsiaTheme="minorEastAsia" w:hAnsiTheme="minorHAnsi" w:cstheme="minorBidi"/>
+              <w:noProof/>
+              <w:kern w:val="2"/>
+              <w:sz w:val="24"/>
+              <w14:ligatures w14:val="standardContextual"/>
+            </w:rPr>
+          </w:pPr>
+          <w:hyperlink w:anchor="_Toc211418575" w:history="1">
+            <w:r>
+              <w:rPr>
+                <w:rStyle w:val="Hiperligao"/>
+                <w:noProof/>
+              </w:rPr>
+              <w:t>Objetivos SMART</w:t>
+            </w:r>
+            <w:r>
+              <w:rPr>
+                <w:noProof/>
+                <w:webHidden/>
+              </w:rPr>
+              <w:tab/>
+            </w:r>
+            <w:r>
+              <w:rPr>
+                <w:noProof/>
+                <w:webHidden/>
+              </w:rPr>
+              <w:fldChar w:fldCharType="begin"/>
+            </w:r>
+            <w:r>
+              <w:rPr>
+                <w:noProof/>
+                <w:webHidden/>
+              </w:rPr>
+              <w:instrText xml:space="preserve"> PAGEREF _Toc211418575 \h </w:instrText>
+            </w:r>
+            <w:r>
+              <w:rPr>
+                <w:noProof/>
+                <w:webHidden/>
+              </w:rPr>
+            </w:r>
+            <w:r>
+              <w:rPr>
+                <w:noProof/>
+                <w:webHidden/>
+              </w:rPr>
+              <w:fldChar w:fldCharType="separate"/>
+            </w:r>
+            <w:r>
+              <w:rPr>
+                <w:noProof/>
+                <w:webHidden/>
+              </w:rPr>
+              <w:t>18</w:t>
+            </w:r>
+            <w:r>
+              <w:rPr>
+                <w:noProof/>
+                <w:webHidden/>
+              </w:rPr>
+              <w:fldChar w:fldCharType="end"/>
+            </w:r>
+          </w:hyperlink>
+        </w:p>
+        <w:p>
+          <w:pPr>
+            <w:pStyle w:val="ndice3"/>
+            <w:tabs>
+              <w:tab w:val="right" w:leader="dot" w:pos="9350"/>
+            </w:tabs>
+            <w:rPr>
+              <w:rFonts w:asciiTheme="minorHAnsi" w:eastAsiaTheme="minorEastAsia" w:hAnsiTheme="minorHAnsi" w:cstheme="minorBidi"/>
+              <w:noProof/>
+              <w:kern w:val="2"/>
+              <w:sz w:val="24"/>
+              <w14:ligatures w14:val="standardContextual"/>
+            </w:rPr>
+          </w:pPr>
+          <w:hyperlink w:anchor="_Toc211418576" w:history="1">
+            <w:r>
+              <w:rPr>
+                <w:rStyle w:val="Hiperligao"/>
+                <w:noProof/>
+              </w:rPr>
+              <w:t>Análise SWOT</w:t>
+            </w:r>
+            <w:r>
+              <w:rPr>
+                <w:noProof/>
+                <w:webHidden/>
+              </w:rPr>
+              <w:tab/>
+            </w:r>
+            <w:r>
+              <w:rPr>
+                <w:noProof/>
+                <w:webHidden/>
+              </w:rPr>
+              <w:fldChar w:fldCharType="begin"/>
+            </w:r>
+            <w:r>
+              <w:rPr>
+                <w:noProof/>
+                <w:webHidden/>
+              </w:rPr>
+              <w:instrText xml:space="preserve"> PAGEREF _Toc211418576 \h </w:instrText>
+            </w:r>
+            <w:r>
+              <w:rPr>
+                <w:noProof/>
+                <w:webHidden/>
+              </w:rPr>
+            </w:r>
+            <w:r>
+              <w:rPr>
+                <w:noProof/>
+                <w:webHidden/>
+              </w:rPr>
+              <w:fldChar w:fldCharType="separate"/>
+            </w:r>
+            <w:r>
+              <w:rPr>
+                <w:noProof/>
+                <w:webHidden/>
+              </w:rPr>
+              <w:t>18</w:t>
+            </w:r>
+            <w:r>
+              <w:rPr>
+                <w:noProof/>
+                <w:webHidden/>
+              </w:rPr>
+              <w:fldChar w:fldCharType="end"/>
+            </w:r>
+          </w:hyperlink>
+        </w:p>
+        <w:p>
+          <w:pPr>
+            <w:pStyle w:val="ndice3"/>
+            <w:tabs>
+              <w:tab w:val="right" w:leader="dot" w:pos="9350"/>
+            </w:tabs>
+            <w:rPr>
+              <w:rFonts w:asciiTheme="minorHAnsi" w:eastAsiaTheme="minorEastAsia" w:hAnsiTheme="minorHAnsi" w:cstheme="minorBidi"/>
+              <w:noProof/>
+              <w:kern w:val="2"/>
+              <w:sz w:val="24"/>
+              <w14:ligatures w14:val="standardContextual"/>
+            </w:rPr>
+          </w:pPr>
+          <w:hyperlink w:anchor="_Toc211418577" w:history="1">
+            <w:r>
+              <w:rPr>
+                <w:rStyle w:val="Hiperligao"/>
+                <w:noProof/>
+              </w:rPr>
+              <w:t>Propostas Estratégica 1 - Sustentabilidade e Eficiência Energética</w:t>
+            </w:r>
+            <w:r>
+              <w:rPr>
+                <w:noProof/>
+                <w:webHidden/>
+              </w:rPr>
+              <w:tab/>
+            </w:r>
+            <w:r>
+              <w:rPr>
+                <w:noProof/>
+                <w:webHidden/>
+              </w:rPr>
+              <w:fldChar w:fldCharType="begin"/>
+            </w:r>
+            <w:r>
+              <w:rPr>
+                <w:noProof/>
+                <w:webHidden/>
+              </w:rPr>
+              <w:instrText xml:space="preserve"> PAGEREF _Toc211418577 \h </w:instrText>
+            </w:r>
+            <w:r>
+              <w:rPr>
+                <w:noProof/>
+                <w:webHidden/>
+              </w:rPr>
+            </w:r>
+            <w:r>
+              <w:rPr>
+                <w:noProof/>
+                <w:webHidden/>
+              </w:rPr>
+              <w:fldChar w:fldCharType="separate"/>
+            </w:r>
+            <w:r>
+              <w:rPr>
+                <w:noProof/>
+                <w:webHidden/>
+              </w:rPr>
+              <w:t>18</w:t>
+            </w:r>
+            <w:r>
+              <w:rPr>
+                <w:noProof/>
+                <w:webHidden/>
+              </w:rPr>
+              <w:fldChar w:fldCharType="end"/>
+            </w:r>
+          </w:hyperlink>
+        </w:p>
+        <w:p>
+          <w:pPr>
+            <w:pStyle w:val="ndice3"/>
+            <w:tabs>
+              <w:tab w:val="right" w:leader="dot" w:pos="9350"/>
+            </w:tabs>
+            <w:rPr>
+              <w:rFonts w:asciiTheme="minorHAnsi" w:eastAsiaTheme="minorEastAsia" w:hAnsiTheme="minorHAnsi" w:cstheme="minorBidi"/>
+              <w:noProof/>
+              <w:kern w:val="2"/>
+              <w:sz w:val="24"/>
+              <w14:ligatures w14:val="standardContextual"/>
+            </w:rPr>
+          </w:pPr>
+          <w:hyperlink w:anchor="_Toc211418578" w:history="1">
+            <w:r>
+              <w:rPr>
+                <w:rStyle w:val="Hiperligao"/>
+                <w:noProof/>
+              </w:rPr>
+              <w:t>Propostas Estratégica 2 - Transformação Digital e Inovação Tecnológica</w:t>
+            </w:r>
+            <w:r>
+              <w:rPr>
+                <w:noProof/>
+                <w:webHidden/>
+              </w:rPr>
+              <w:tab/>
+            </w:r>
+            <w:r>
+              <w:rPr>
+                <w:noProof/>
+                <w:webHidden/>
+              </w:rPr>
+              <w:fldChar w:fldCharType="begin"/>
+            </w:r>
+            <w:r>
+              <w:rPr>
+                <w:noProof/>
+                <w:webHidden/>
+              </w:rPr>
+              <w:instrText xml:space="preserve"> PAGEREF _Toc211418578 \h </w:instrText>
+            </w:r>
+            <w:r>
+              <w:rPr>
+                <w:noProof/>
+                <w:webHidden/>
+              </w:rPr>
+            </w:r>
+            <w:r>
+              <w:rPr>
+                <w:noProof/>
+                <w:webHidden/>
+              </w:rPr>
+              <w:fldChar w:fldCharType="separate"/>
+            </w:r>
+            <w:r>
+              <w:rPr>
+                <w:noProof/>
+                <w:webHidden/>
+              </w:rPr>
+              <w:t>20</w:t>
             </w:r>
             <w:r>
               <w:rPr>
@@ -1868,7 +2156,7 @@
               <w14:ligatures w14:val="standardContextual"/>
             </w:rPr>
           </w:pPr>
-          <w:hyperlink w:anchor="_Toc211418004" w:history="1">
+          <w:hyperlink w:anchor="_Toc211418579" w:history="1">
             <w:r>
               <w:rPr>
                 <w:rStyle w:val="Hiperligao"/>
@@ -1895,7 +2183,7 @@
                 <w:noProof/>
                 <w:webHidden/>
               </w:rPr>
-              <w:instrText xml:space="preserve"> PAGEREF _Toc211418004 \h </w:instrText>
+              <w:instrText xml:space="preserve"> PAGEREF _Toc211418579 \h </w:instrText>
             </w:r>
             <w:r>
               <w:rPr>
@@ -1915,7 +2203,7 @@
                 <w:noProof/>
                 <w:webHidden/>
               </w:rPr>
-              <w:t>18</w:t>
+              <w:t>22</w:t>
             </w:r>
             <w:r>
               <w:rPr>
@@ -1940,7 +2228,7 @@
               <w14:ligatures w14:val="standardContextual"/>
             </w:rPr>
           </w:pPr>
-          <w:hyperlink w:anchor="_Toc211418005" w:history="1">
+          <w:hyperlink w:anchor="_Toc211418580" w:history="1">
             <w:r>
               <w:rPr>
                 <w:rStyle w:val="Hiperligao"/>
@@ -1967,7 +2255,7 @@
                 <w:noProof/>
                 <w:webHidden/>
               </w:rPr>
-              <w:instrText xml:space="preserve"> PAGEREF _Toc211418005 \h </w:instrText>
+              <w:instrText xml:space="preserve"> PAGEREF _Toc211418580 \h </w:instrText>
             </w:r>
             <w:r>
               <w:rPr>
@@ -1987,7 +2275,7 @@
                 <w:noProof/>
                 <w:webHidden/>
               </w:rPr>
-              <w:t>18</w:t>
+              <w:t>22</w:t>
             </w:r>
             <w:r>
               <w:rPr>
@@ -2012,7 +2300,7 @@
               <w14:ligatures w14:val="standardContextual"/>
             </w:rPr>
           </w:pPr>
-          <w:hyperlink w:anchor="_Toc211418006" w:history="1">
+          <w:hyperlink w:anchor="_Toc211418581" w:history="1">
             <w:r>
               <w:rPr>
                 <w:rStyle w:val="Hiperligao"/>
@@ -2039,7 +2327,7 @@
                 <w:noProof/>
                 <w:webHidden/>
               </w:rPr>
-              <w:instrText xml:space="preserve"> PAGEREF _Toc211418006 \h </w:instrText>
+              <w:instrText xml:space="preserve"> PAGEREF _Toc211418581 \h </w:instrText>
             </w:r>
             <w:r>
               <w:rPr>
@@ -2059,7 +2347,7 @@
                 <w:noProof/>
                 <w:webHidden/>
               </w:rPr>
-              <w:t>18</w:t>
+              <w:t>22</w:t>
             </w:r>
             <w:r>
               <w:rPr>
@@ -2084,7 +2372,7 @@
               <w14:ligatures w14:val="standardContextual"/>
             </w:rPr>
           </w:pPr>
-          <w:hyperlink w:anchor="_Toc211418007" w:history="1">
+          <w:hyperlink w:anchor="_Toc211418582" w:history="1">
             <w:r>
               <w:rPr>
                 <w:rStyle w:val="Hiperligao"/>
@@ -2111,7 +2399,7 @@
                 <w:noProof/>
                 <w:webHidden/>
               </w:rPr>
-              <w:instrText xml:space="preserve"> PAGEREF _Toc211418007 \h </w:instrText>
+              <w:instrText xml:space="preserve"> PAGEREF _Toc211418582 \h </w:instrText>
             </w:r>
             <w:r>
               <w:rPr>
@@ -2131,7 +2419,7 @@
                 <w:noProof/>
                 <w:webHidden/>
               </w:rPr>
-              <w:t>18</w:t>
+              <w:t>22</w:t>
             </w:r>
             <w:r>
               <w:rPr>
@@ -2156,7 +2444,7 @@
               <w14:ligatures w14:val="standardContextual"/>
             </w:rPr>
           </w:pPr>
-          <w:hyperlink w:anchor="_Toc211418008" w:history="1">
+          <w:hyperlink w:anchor="_Toc211418583" w:history="1">
             <w:r>
               <w:rPr>
                 <w:rStyle w:val="Hiperligao"/>
@@ -2183,7 +2471,7 @@
                 <w:noProof/>
                 <w:webHidden/>
               </w:rPr>
-              <w:instrText xml:space="preserve"> PAGEREF _Toc211418008 \h </w:instrText>
+              <w:instrText xml:space="preserve"> PAGEREF _Toc211418583 \h </w:instrText>
             </w:r>
             <w:r>
               <w:rPr>
@@ -2203,7 +2491,7 @@
                 <w:noProof/>
                 <w:webHidden/>
               </w:rPr>
-              <w:t>18</w:t>
+              <w:t>22</w:t>
             </w:r>
             <w:r>
               <w:rPr>
@@ -2228,7 +2516,7 @@
               <w14:ligatures w14:val="standardContextual"/>
             </w:rPr>
           </w:pPr>
-          <w:hyperlink w:anchor="_Toc211418009" w:history="1">
+          <w:hyperlink w:anchor="_Toc211418584" w:history="1">
             <w:r>
               <w:rPr>
                 <w:rStyle w:val="Hiperligao"/>
@@ -2255,7 +2543,7 @@
                 <w:noProof/>
                 <w:webHidden/>
               </w:rPr>
-              <w:instrText xml:space="preserve"> PAGEREF _Toc211418009 \h </w:instrText>
+              <w:instrText xml:space="preserve"> PAGEREF _Toc211418584 \h </w:instrText>
             </w:r>
             <w:r>
               <w:rPr>
@@ -2275,7 +2563,7 @@
                 <w:noProof/>
                 <w:webHidden/>
               </w:rPr>
-              <w:t>18</w:t>
+              <w:t>22</w:t>
             </w:r>
             <w:r>
               <w:rPr>
@@ -2300,7 +2588,7 @@
               <w14:ligatures w14:val="standardContextual"/>
             </w:rPr>
           </w:pPr>
-          <w:hyperlink w:anchor="_Toc211418010" w:history="1">
+          <w:hyperlink w:anchor="_Toc211418585" w:history="1">
             <w:r>
               <w:rPr>
                 <w:rStyle w:val="Hiperligao"/>
@@ -2327,7 +2615,7 @@
                 <w:noProof/>
                 <w:webHidden/>
               </w:rPr>
-              <w:instrText xml:space="preserve"> PAGEREF _Toc211418010 \h </w:instrText>
+              <w:instrText xml:space="preserve"> PAGEREF _Toc211418585 \h </w:instrText>
             </w:r>
             <w:r>
               <w:rPr>
@@ -2347,7 +2635,7 @@
                 <w:noProof/>
                 <w:webHidden/>
               </w:rPr>
-              <w:t>18</w:t>
+              <w:t>22</w:t>
             </w:r>
             <w:r>
               <w:rPr>
@@ -2372,7 +2660,7 @@
               <w14:ligatures w14:val="standardContextual"/>
             </w:rPr>
           </w:pPr>
-          <w:hyperlink w:anchor="_Toc211418011" w:history="1">
+          <w:hyperlink w:anchor="_Toc211418586" w:history="1">
             <w:r>
               <w:rPr>
                 <w:rStyle w:val="Hiperligao"/>
@@ -2399,7 +2687,7 @@
                 <w:noProof/>
                 <w:webHidden/>
               </w:rPr>
-              <w:instrText xml:space="preserve"> PAGEREF _Toc211418011 \h </w:instrText>
+              <w:instrText xml:space="preserve"> PAGEREF _Toc211418586 \h </w:instrText>
             </w:r>
             <w:r>
               <w:rPr>
@@ -2419,7 +2707,7 @@
                 <w:noProof/>
                 <w:webHidden/>
               </w:rPr>
-              <w:t>19</w:t>
+              <w:t>23</w:t>
             </w:r>
             <w:r>
               <w:rPr>
@@ -2444,7 +2732,7 @@
               <w14:ligatures w14:val="standardContextual"/>
             </w:rPr>
           </w:pPr>
-          <w:hyperlink w:anchor="_Toc211418012" w:history="1">
+          <w:hyperlink w:anchor="_Toc211418587" w:history="1">
             <w:r>
               <w:rPr>
                 <w:rStyle w:val="Hiperligao"/>
@@ -2471,7 +2759,7 @@
                 <w:noProof/>
                 <w:webHidden/>
               </w:rPr>
-              <w:instrText xml:space="preserve"> PAGEREF _Toc211418012 \h </w:instrText>
+              <w:instrText xml:space="preserve"> PAGEREF _Toc211418587 \h </w:instrText>
             </w:r>
             <w:r>
               <w:rPr>
@@ -2491,7 +2779,7 @@
                 <w:noProof/>
                 <w:webHidden/>
               </w:rPr>
-              <w:t>19</w:t>
+              <w:t>23</w:t>
             </w:r>
             <w:r>
               <w:rPr>
@@ -2516,7 +2804,7 @@
               <w14:ligatures w14:val="standardContextual"/>
             </w:rPr>
           </w:pPr>
-          <w:hyperlink w:anchor="_Toc211418013" w:history="1">
+          <w:hyperlink w:anchor="_Toc211418588" w:history="1">
             <w:r>
               <w:rPr>
                 <w:rStyle w:val="Hiperligao"/>
@@ -2543,7 +2831,7 @@
                 <w:noProof/>
                 <w:webHidden/>
               </w:rPr>
-              <w:instrText xml:space="preserve"> PAGEREF _Toc211418013 \h </w:instrText>
+              <w:instrText xml:space="preserve"> PAGEREF _Toc211418588 \h </w:instrText>
             </w:r>
             <w:r>
               <w:rPr>
@@ -2563,7 +2851,7 @@
                 <w:noProof/>
                 <w:webHidden/>
               </w:rPr>
-              <w:t>19</w:t>
+              <w:t>23</w:t>
             </w:r>
             <w:r>
               <w:rPr>
@@ -2588,7 +2876,7 @@
               <w14:ligatures w14:val="standardContextual"/>
             </w:rPr>
           </w:pPr>
-          <w:hyperlink w:anchor="_Toc211418014" w:history="1">
+          <w:hyperlink w:anchor="_Toc211418589" w:history="1">
             <w:r>
               <w:rPr>
                 <w:rStyle w:val="Hiperligao"/>
@@ -2615,7 +2903,7 @@
                 <w:noProof/>
                 <w:webHidden/>
               </w:rPr>
-              <w:instrText xml:space="preserve"> PAGEREF _Toc211418014 \h </w:instrText>
+              <w:instrText xml:space="preserve"> PAGEREF _Toc211418589 \h </w:instrText>
             </w:r>
             <w:r>
               <w:rPr>
@@ -2635,7 +2923,7 @@
                 <w:noProof/>
                 <w:webHidden/>
               </w:rPr>
-              <w:t>20</w:t>
+              <w:t>24</w:t>
             </w:r>
             <w:r>
               <w:rPr>
@@ -2660,7 +2948,7 @@
               <w14:ligatures w14:val="standardContextual"/>
             </w:rPr>
           </w:pPr>
-          <w:hyperlink w:anchor="_Toc211418015" w:history="1">
+          <w:hyperlink w:anchor="_Toc211418590" w:history="1">
             <w:r>
               <w:rPr>
                 <w:rStyle w:val="Hiperligao"/>
@@ -2688,7 +2976,7 @@
                 <w:noProof/>
                 <w:webHidden/>
               </w:rPr>
-              <w:instrText xml:space="preserve"> PAGEREF _Toc211418015 \h </w:instrText>
+              <w:instrText xml:space="preserve"> PAGEREF _Toc211418590 \h </w:instrText>
             </w:r>
             <w:r>
               <w:rPr>
@@ -2708,7 +2996,7 @@
                 <w:noProof/>
                 <w:webHidden/>
               </w:rPr>
-              <w:t>20</w:t>
+              <w:t>24</w:t>
             </w:r>
             <w:r>
               <w:rPr>
@@ -2721,7 +3009,6 @@
         </w:p>
         <w:p>
           <w:r>
-            <w:lastRenderedPageBreak/>
             <w:fldChar w:fldCharType="end"/>
           </w:r>
         </w:p>
@@ -2766,7 +3053,7 @@
           <w:lang w:bidi="pt-PT"/>
         </w:rPr>
       </w:pPr>
-      <w:bookmarkStart w:id="4" w:name="_Toc211417988"/>
+      <w:bookmarkStart w:id="4" w:name="_Toc211418559"/>
       <w:r>
         <w:rPr>
           <w:sz w:val="24"/>
@@ -2792,7 +3079,7 @@
           <w:lang w:bidi="pt-PT"/>
         </w:rPr>
       </w:pPr>
-      <w:bookmarkStart w:id="5" w:name="_Toc211417989"/>
+      <w:bookmarkStart w:id="5" w:name="_Toc211418560"/>
       <w:r>
         <w:rPr>
           <w:lang w:bidi="pt-PT"/>
@@ -2918,7 +3205,7 @@
       <w:pPr>
         <w:pStyle w:val="Ttulo2"/>
       </w:pPr>
-      <w:bookmarkStart w:id="6" w:name="_Toc211417990"/>
+      <w:bookmarkStart w:id="6" w:name="_Toc211418561"/>
       <w:r>
         <w:t>Opções Estratégicas para o Porto de Sines</w:t>
       </w:r>
@@ -4073,7 +4360,7 @@
       <w:pPr>
         <w:pStyle w:val="Ttulo2"/>
       </w:pPr>
-      <w:bookmarkStart w:id="7" w:name="_Toc211417991"/>
+      <w:bookmarkStart w:id="7" w:name="_Toc211418562"/>
       <w:r>
         <w:t xml:space="preserve">Ligações e </w:t>
       </w:r>
@@ -4270,7 +4557,7 @@
       <w:pPr>
         <w:pStyle w:val="Ttulo2"/>
       </w:pPr>
-      <w:bookmarkStart w:id="8" w:name="_Toc211417992"/>
+      <w:bookmarkStart w:id="8" w:name="_Toc211418563"/>
       <w:r>
         <w:lastRenderedPageBreak/>
         <w:t>Estatísticas</w:t>
@@ -4288,7 +4575,7 @@
           <w:szCs w:val="20"/>
         </w:rPr>
       </w:pPr>
-      <w:bookmarkStart w:id="9" w:name="_Toc211417993"/>
+      <w:bookmarkStart w:id="9" w:name="_Toc211418564"/>
       <w:r>
         <w:rPr>
           <w:b/>
@@ -4680,7 +4967,7 @@
           <w:szCs w:val="20"/>
         </w:rPr>
       </w:pPr>
-      <w:bookmarkStart w:id="10" w:name="_Toc211417994"/>
+      <w:bookmarkStart w:id="10" w:name="_Toc211418565"/>
       <w:r>
         <w:rPr>
           <w:b/>
@@ -5082,7 +5369,7 @@
           <w:szCs w:val="20"/>
         </w:rPr>
       </w:pPr>
-      <w:bookmarkStart w:id="11" w:name="_Toc211417995"/>
+      <w:bookmarkStart w:id="11" w:name="_Toc211418566"/>
       <w:r>
         <w:rPr>
           <w:b/>
@@ -5265,7 +5552,7 @@
       <w:pPr>
         <w:pStyle w:val="Ttulo1"/>
       </w:pPr>
-      <w:bookmarkStart w:id="12" w:name="_Toc211417996"/>
+      <w:bookmarkStart w:id="12" w:name="_Toc211418567"/>
       <w:r>
         <w:lastRenderedPageBreak/>
         <w:t>Parte I – Introdução e estrutura do trabalho</w:t>
@@ -5277,7 +5564,7 @@
       <w:pPr>
         <w:pStyle w:val="Ttulo2"/>
       </w:pPr>
-      <w:bookmarkStart w:id="13" w:name="_Toc211417997"/>
+      <w:bookmarkStart w:id="13" w:name="_Toc211418568"/>
       <w:r>
         <w:t>I.1 Caracterização da organização</w:t>
       </w:r>
@@ -5378,7 +5665,7 @@
       <w:pPr>
         <w:pStyle w:val="Ttulo2"/>
       </w:pPr>
-      <w:bookmarkStart w:id="14" w:name="_Toc211417998"/>
+      <w:bookmarkStart w:id="14" w:name="_Toc211418569"/>
       <w:r>
         <w:t>I.2 Fontes de informação</w:t>
       </w:r>
@@ -5403,7 +5690,7 @@
           <w:szCs w:val="22"/>
         </w:rPr>
       </w:pPr>
-      <w:bookmarkStart w:id="15" w:name="_Toc211417999"/>
+      <w:bookmarkStart w:id="15" w:name="_Toc211418570"/>
       <w:r>
         <w:lastRenderedPageBreak/>
         <w:t xml:space="preserve">Parte II – </w:t>
@@ -5418,7 +5705,7 @@
       <w:pPr>
         <w:pStyle w:val="Ttulo2"/>
       </w:pPr>
-      <w:bookmarkStart w:id="16" w:name="_Toc211418000"/>
+      <w:bookmarkStart w:id="16" w:name="_Toc211418571"/>
       <w:r>
         <w:t>II.</w:t>
       </w:r>
@@ -5448,7 +5735,7 @@
         </w:rPr>
       </w:pPr>
       <w:bookmarkStart w:id="17" w:name="_Toc211333575"/>
-      <w:bookmarkStart w:id="18" w:name="_Toc211418001"/>
+      <w:bookmarkStart w:id="18" w:name="_Toc211418572"/>
       <w:r>
         <w:rPr>
           <w:b/>
@@ -5572,7 +5859,7 @@
         </w:rPr>
       </w:pPr>
       <w:bookmarkStart w:id="19" w:name="_Toc211333576"/>
-      <w:bookmarkStart w:id="20" w:name="_Toc211418002"/>
+      <w:bookmarkStart w:id="20" w:name="_Toc211418573"/>
       <w:r>
         <w:rPr>
           <w:b/>
@@ -5785,7 +6072,7 @@
       <w:pPr>
         <w:pStyle w:val="Ttulo2"/>
       </w:pPr>
-      <w:bookmarkStart w:id="21" w:name="_Toc211418003"/>
+      <w:bookmarkStart w:id="21" w:name="_Toc211418574"/>
       <w:r>
         <w:t>II.</w:t>
       </w:r>
@@ -5845,6 +6132,7 @@
         </w:rPr>
       </w:pPr>
       <w:bookmarkStart w:id="22" w:name="_Toc211333578"/>
+      <w:bookmarkStart w:id="23" w:name="_Toc211418575"/>
       <w:r>
         <w:rPr>
           <w:b/>
@@ -5867,6 +6155,7 @@
         <w:t>T</w:t>
       </w:r>
       <w:bookmarkEnd w:id="22"/>
+      <w:bookmarkEnd w:id="23"/>
     </w:p>
     <w:tbl>
       <w:tblPr>
@@ -6203,7 +6492,8 @@
           <w:szCs w:val="20"/>
         </w:rPr>
       </w:pPr>
-      <w:bookmarkStart w:id="23" w:name="_Toc211333579"/>
+      <w:bookmarkStart w:id="24" w:name="_Toc211333579"/>
+      <w:bookmarkStart w:id="25" w:name="_Toc211418576"/>
       <w:r>
         <w:rPr>
           <w:b/>
@@ -6214,7 +6504,8 @@
         </w:rPr>
         <w:t>Análise SWOT</w:t>
       </w:r>
-      <w:bookmarkEnd w:id="23"/>
+      <w:bookmarkEnd w:id="24"/>
+      <w:bookmarkEnd w:id="25"/>
     </w:p>
     <w:p>
       <w:r>
@@ -6622,11 +6913,1264 @@
           <w:b/>
         </w:rPr>
       </w:pPr>
-      <w:r>
+    </w:p>
+    <w:p>
+      <w:pPr>
+        <w:pStyle w:val="Ttulo3"/>
+        <w:rPr>
+          <w:b/>
+          <w:bCs/>
+          <w:color w:val="000000" w:themeColor="text1"/>
+          <w:sz w:val="20"/>
+          <w:szCs w:val="20"/>
+        </w:rPr>
+      </w:pPr>
+      <w:bookmarkStart w:id="26" w:name="_Toc211333580"/>
+      <w:bookmarkStart w:id="27" w:name="_Toc211418577"/>
+      <w:r>
+        <w:rPr>
+          <w:b/>
+          <w:bCs/>
+          <w:color w:val="000000" w:themeColor="text1"/>
+          <w:sz w:val="20"/>
+          <w:szCs w:val="20"/>
+        </w:rPr>
+        <w:t xml:space="preserve">Propostas </w:t>
+      </w:r>
+      <w:r>
+        <w:rPr>
+          <w:b/>
+          <w:bCs/>
+          <w:color w:val="000000" w:themeColor="text1"/>
+          <w:sz w:val="20"/>
+          <w:szCs w:val="20"/>
+        </w:rPr>
+        <w:t>E</w:t>
+      </w:r>
+      <w:r>
+        <w:rPr>
+          <w:b/>
+          <w:bCs/>
+          <w:color w:val="000000" w:themeColor="text1"/>
+          <w:sz w:val="20"/>
+          <w:szCs w:val="20"/>
+        </w:rPr>
+        <w:t>stratégic</w:t>
+      </w:r>
+      <w:r>
+        <w:rPr>
+          <w:b/>
+          <w:bCs/>
+          <w:color w:val="000000" w:themeColor="text1"/>
+          <w:sz w:val="20"/>
+          <w:szCs w:val="20"/>
+        </w:rPr>
+        <w:t xml:space="preserve">a 1 - </w:t>
+      </w:r>
+      <w:r>
+        <w:rPr>
+          <w:b/>
+          <w:bCs/>
+          <w:color w:val="000000" w:themeColor="text1"/>
+          <w:sz w:val="20"/>
+          <w:szCs w:val="20"/>
+        </w:rPr>
+        <w:t>Sustentabilidade e Eficiência Energética</w:t>
+      </w:r>
+      <w:bookmarkEnd w:id="26"/>
+      <w:bookmarkEnd w:id="27"/>
+    </w:p>
+    <w:p>
+      <w:pPr>
+        <w:pStyle w:val="PargrafodaLista"/>
+        <w:numPr>
+          <w:ilvl w:val="0"/>
+          <w:numId w:val="30"/>
+        </w:numPr>
+        <w:rPr>
+          <w:b/>
+          <w:bCs/>
+        </w:rPr>
+      </w:pPr>
+      <w:r>
+        <w:rPr>
+          <w:b/>
+          <w:bCs/>
+        </w:rPr>
+        <w:t>Estratégia Proposta:</w:t>
+      </w:r>
+    </w:p>
+    <w:p>
+      <w:pPr>
+        <w:ind w:left="360"/>
+      </w:pPr>
+      <w:r>
+        <w:t>Reforçar a sustentabilidade ambiental e a eficiência energética nos portos sob administração da APS, promovendo operações portuárias com menores emissões e maior responsabilidade ambiental até 2030.</w:t>
+      </w:r>
+    </w:p>
+    <w:p>
+      <w:pPr>
+        <w:pStyle w:val="PargrafodaLista"/>
+        <w:numPr>
+          <w:ilvl w:val="0"/>
+          <w:numId w:val="30"/>
+        </w:numPr>
+        <w:rPr>
+          <w:b/>
+          <w:bCs/>
+        </w:rPr>
+      </w:pPr>
+      <w:r>
+        <w:rPr>
+          <w:b/>
+          <w:bCs/>
+        </w:rPr>
+        <w:lastRenderedPageBreak/>
+        <w:t>Justificação:</w:t>
+      </w:r>
+    </w:p>
+    <w:p>
+      <w:pPr>
+        <w:ind w:firstLine="360"/>
+      </w:pPr>
+      <w:r>
+        <w:t>Esta estratégia responde a dois dos principais vetores identificados na análise SWOT:</w:t>
+      </w:r>
+    </w:p>
+    <w:p>
+      <w:pPr>
+        <w:ind w:firstLine="360"/>
+      </w:pPr>
+      <w:r>
+        <w:rPr>
+          <w:u w:val="single"/>
+        </w:rPr>
+        <w:t>Ameaça</w:t>
+      </w:r>
+      <w:r>
+        <w:t xml:space="preserve"> </w:t>
+      </w:r>
+      <w:r>
+        <w:t>-</w:t>
+      </w:r>
+      <w:r>
+        <w:t xml:space="preserve"> crescente pressão das normas ambientais europeias e nacionais.</w:t>
+      </w:r>
+    </w:p>
+    <w:p>
+      <w:pPr>
+        <w:ind w:firstLine="360"/>
+      </w:pPr>
+      <w:r>
+        <w:rPr>
+          <w:u w:val="single"/>
+        </w:rPr>
+        <w:t>Oportunidade</w:t>
+      </w:r>
+      <w:r>
+        <w:t xml:space="preserve"> </w:t>
+      </w:r>
+      <w:r>
+        <w:t xml:space="preserve">- </w:t>
+      </w:r>
+      <w:r>
+        <w:t>transição energética e potencial para liderança na adoção de práticas verdes.</w:t>
+      </w:r>
+    </w:p>
+    <w:p>
+      <w:pPr>
+        <w:ind w:left="360"/>
+      </w:pPr>
+      <w:r>
+        <w:t>Além disso, reforça o compromisso da APS com os Objetivos de Desenvolvimento Sustentável (ODS) e com a Estratégia Nacional para o Mar 2030, consolidando a sua imagem de porto sustentável e competitivo.</w:t>
+      </w:r>
+    </w:p>
+    <w:p/>
+    <w:p>
+      <w:pPr>
+        <w:pStyle w:val="PargrafodaLista"/>
+        <w:numPr>
+          <w:ilvl w:val="0"/>
+          <w:numId w:val="30"/>
+        </w:numPr>
+        <w:rPr>
+          <w:b/>
+          <w:bCs/>
+        </w:rPr>
+      </w:pPr>
+      <w:r>
+        <w:rPr>
+          <w:b/>
+          <w:bCs/>
+        </w:rPr>
+        <w:t>Objetivos Táticos:</w:t>
+      </w:r>
+    </w:p>
+    <w:p>
+      <w:pPr>
+        <w:ind w:left="360"/>
+      </w:pPr>
+      <w:r>
+        <w:t xml:space="preserve">1. </w:t>
+      </w:r>
+      <w:r>
+        <w:t>Reduzir o consumo energético das infraestruturas portuárias através da modernização de equipamentos e sistemas.</w:t>
+      </w:r>
+    </w:p>
+    <w:p>
+      <w:pPr>
+        <w:ind w:left="360"/>
+      </w:pPr>
+      <w:r>
+        <w:t xml:space="preserve">2. </w:t>
+      </w:r>
+      <w:r>
+        <w:t>Implementar sistemas de monitorização ambiental em tempo real, para controlo de emissões e qualidade da água.</w:t>
+      </w:r>
+    </w:p>
+    <w:p>
+      <w:pPr>
+        <w:ind w:left="360"/>
+      </w:pPr>
+      <w:r>
+        <w:t xml:space="preserve">3. </w:t>
+      </w:r>
+      <w:r>
+        <w:t>Aumentar a produção e utilização de energia proveniente de fontes renováveis nas áreas portuárias.</w:t>
+      </w:r>
+    </w:p>
+    <w:p>
+      <w:pPr>
+        <w:ind w:left="360"/>
+      </w:pPr>
+    </w:p>
+    <w:p>
+      <w:pPr>
+        <w:pStyle w:val="PargrafodaLista"/>
+        <w:numPr>
+          <w:ilvl w:val="0"/>
+          <w:numId w:val="30"/>
+        </w:numPr>
+        <w:rPr>
+          <w:b/>
+          <w:bCs/>
+        </w:rPr>
+      </w:pPr>
+      <w:r>
+        <w:rPr>
+          <w:b/>
+          <w:bCs/>
+        </w:rPr>
+        <w:t>Objetivos Operacionais e Ações Associadas:</w:t>
+      </w:r>
+    </w:p>
+    <w:tbl>
+      <w:tblPr>
+        <w:tblStyle w:val="TabelacomGrelha"/>
+        <w:tblW w:w="0" w:type="auto"/>
+        <w:tblLook w:val="04A0" w:firstRow="1" w:lastRow="0" w:firstColumn="1" w:lastColumn="0" w:noHBand="0" w:noVBand="1"/>
+      </w:tblPr>
+      <w:tblGrid>
+        <w:gridCol w:w="2824"/>
+        <w:gridCol w:w="2830"/>
+        <w:gridCol w:w="3676"/>
+      </w:tblGrid>
+      <w:tr>
+        <w:tc>
+          <w:tcPr>
+            <w:tcW w:w="2830" w:type="dxa"/>
+            <w:tcBorders>
+              <w:top w:val="single" w:sz="12" w:space="0" w:color="auto"/>
+              <w:left w:val="single" w:sz="12" w:space="0" w:color="auto"/>
+              <w:bottom w:val="single" w:sz="12" w:space="0" w:color="auto"/>
+              <w:right w:val="single" w:sz="12" w:space="0" w:color="auto"/>
+            </w:tcBorders>
+          </w:tcPr>
+          <w:p>
+            <w:pPr>
+              <w:jc w:val="center"/>
+              <w:rPr>
+                <w:b/>
+                <w:bCs/>
+                <w:color w:val="000000" w:themeColor="text1"/>
+              </w:rPr>
+            </w:pPr>
+            <w:r>
+              <w:rPr>
+                <w:b/>
+                <w:bCs/>
+                <w:color w:val="000000" w:themeColor="text1"/>
+              </w:rPr>
+              <w:t>Objetivo Operacional</w:t>
+            </w:r>
+          </w:p>
+        </w:tc>
+        <w:tc>
+          <w:tcPr>
+            <w:tcW w:w="2835" w:type="dxa"/>
+            <w:tcBorders>
+              <w:top w:val="single" w:sz="12" w:space="0" w:color="auto"/>
+              <w:left w:val="single" w:sz="12" w:space="0" w:color="auto"/>
+              <w:bottom w:val="single" w:sz="12" w:space="0" w:color="auto"/>
+              <w:right w:val="single" w:sz="12" w:space="0" w:color="auto"/>
+            </w:tcBorders>
+          </w:tcPr>
+          <w:p>
+            <w:pPr>
+              <w:jc w:val="center"/>
+              <w:rPr>
+                <w:b/>
+                <w:bCs/>
+                <w:color w:val="000000" w:themeColor="text1"/>
+              </w:rPr>
+            </w:pPr>
+            <w:r>
+              <w:rPr>
+                <w:b/>
+                <w:bCs/>
+                <w:color w:val="000000" w:themeColor="text1"/>
+              </w:rPr>
+              <w:t>Ações Principais</w:t>
+            </w:r>
+          </w:p>
+        </w:tc>
+        <w:tc>
+          <w:tcPr>
+            <w:tcW w:w="3685" w:type="dxa"/>
+            <w:tcBorders>
+              <w:top w:val="single" w:sz="12" w:space="0" w:color="auto"/>
+              <w:left w:val="single" w:sz="12" w:space="0" w:color="auto"/>
+              <w:bottom w:val="single" w:sz="12" w:space="0" w:color="auto"/>
+              <w:right w:val="single" w:sz="12" w:space="0" w:color="auto"/>
+            </w:tcBorders>
+          </w:tcPr>
+          <w:p>
+            <w:pPr>
+              <w:jc w:val="center"/>
+              <w:rPr>
+                <w:b/>
+                <w:bCs/>
+                <w:color w:val="000000" w:themeColor="text1"/>
+              </w:rPr>
+            </w:pPr>
+            <w:r>
+              <w:rPr>
+                <w:b/>
+                <w:bCs/>
+                <w:color w:val="000000" w:themeColor="text1"/>
+              </w:rPr>
+              <w:t>Recursos Necessários</w:t>
+            </w:r>
+          </w:p>
+        </w:tc>
+      </w:tr>
+      <w:tr>
+        <w:tc>
+          <w:tcPr>
+            <w:tcW w:w="2830" w:type="dxa"/>
+            <w:tcBorders>
+              <w:top w:val="single" w:sz="12" w:space="0" w:color="auto"/>
+              <w:left w:val="single" w:sz="12" w:space="0" w:color="auto"/>
+              <w:right w:val="single" w:sz="12" w:space="0" w:color="auto"/>
+            </w:tcBorders>
+          </w:tcPr>
+          <w:p>
+            <w:r>
+              <w:t>1.1. Instalar painéis solares nas áreas administrativas e operacionais do Porto de Sines</w:t>
+            </w:r>
+          </w:p>
+        </w:tc>
+        <w:tc>
+          <w:tcPr>
+            <w:tcW w:w="2835" w:type="dxa"/>
+            <w:tcBorders>
+              <w:top w:val="single" w:sz="12" w:space="0" w:color="auto"/>
+              <w:left w:val="single" w:sz="12" w:space="0" w:color="auto"/>
+              <w:right w:val="single" w:sz="12" w:space="0" w:color="auto"/>
+            </w:tcBorders>
+          </w:tcPr>
+          <w:p>
+            <w:r>
+              <w:t>Projeto e instalação de painéis fotovoltaicos</w:t>
+            </w:r>
+          </w:p>
+        </w:tc>
+        <w:tc>
+          <w:tcPr>
+            <w:tcW w:w="3685" w:type="dxa"/>
+            <w:tcBorders>
+              <w:top w:val="single" w:sz="12" w:space="0" w:color="auto"/>
+              <w:left w:val="single" w:sz="12" w:space="0" w:color="auto"/>
+              <w:right w:val="single" w:sz="12" w:space="0" w:color="auto"/>
+            </w:tcBorders>
+          </w:tcPr>
+          <w:p>
+            <w:r>
+              <w:t>Investimento em infraestrutura energética, contratação de empresa especializada, licenciamento ambiental</w:t>
+            </w:r>
+          </w:p>
+        </w:tc>
+      </w:tr>
+      <w:tr>
+        <w:tc>
+          <w:tcPr>
+            <w:tcW w:w="2830" w:type="dxa"/>
+            <w:tcBorders>
+              <w:left w:val="single" w:sz="12" w:space="0" w:color="auto"/>
+              <w:right w:val="single" w:sz="12" w:space="0" w:color="auto"/>
+            </w:tcBorders>
+          </w:tcPr>
+          <w:p>
+            <w:r>
+              <w:t>1.2. Modernizar a iluminação portuária com tecnologia LED inteligente</w:t>
+            </w:r>
+          </w:p>
+        </w:tc>
+        <w:tc>
+          <w:tcPr>
+            <w:tcW w:w="2835" w:type="dxa"/>
+            <w:tcBorders>
+              <w:left w:val="single" w:sz="12" w:space="0" w:color="auto"/>
+              <w:right w:val="single" w:sz="12" w:space="0" w:color="auto"/>
+            </w:tcBorders>
+          </w:tcPr>
+          <w:p>
+            <w:r>
+              <w:t>Substituição gradual das luminárias</w:t>
+            </w:r>
+          </w:p>
+        </w:tc>
+        <w:tc>
+          <w:tcPr>
+            <w:tcW w:w="3685" w:type="dxa"/>
+            <w:tcBorders>
+              <w:left w:val="single" w:sz="12" w:space="0" w:color="auto"/>
+              <w:right w:val="single" w:sz="12" w:space="0" w:color="auto"/>
+            </w:tcBorders>
+          </w:tcPr>
+          <w:p>
+            <w:r>
+              <w:t>Equipamentos LED, software de controlo, técnicos de eletricidade</w:t>
+            </w:r>
+          </w:p>
+        </w:tc>
+      </w:tr>
+      <w:tr>
+        <w:tc>
+          <w:tcPr>
+            <w:tcW w:w="2830" w:type="dxa"/>
+            <w:tcBorders>
+              <w:left w:val="single" w:sz="12" w:space="0" w:color="auto"/>
+              <w:right w:val="single" w:sz="12" w:space="0" w:color="auto"/>
+            </w:tcBorders>
+          </w:tcPr>
+          <w:p>
+            <w:r>
+              <w:t>2.1. Criar plataforma digital de monitorização ambiental</w:t>
+            </w:r>
+          </w:p>
+        </w:tc>
+        <w:tc>
+          <w:tcPr>
+            <w:tcW w:w="2835" w:type="dxa"/>
+            <w:tcBorders>
+              <w:left w:val="single" w:sz="12" w:space="0" w:color="auto"/>
+              <w:right w:val="single" w:sz="12" w:space="0" w:color="auto"/>
+            </w:tcBorders>
+          </w:tcPr>
+          <w:p>
+            <w:r>
+              <w:t xml:space="preserve">Desenvolvimento de sistema </w:t>
+            </w:r>
+            <w:proofErr w:type="spellStart"/>
+            <w:r>
+              <w:t>IoT</w:t>
+            </w:r>
+            <w:proofErr w:type="spellEnd"/>
+            <w:r>
+              <w:t xml:space="preserve"> e </w:t>
+            </w:r>
+            <w:proofErr w:type="spellStart"/>
+            <w:r>
+              <w:t>dashboard</w:t>
+            </w:r>
+            <w:proofErr w:type="spellEnd"/>
+            <w:r>
+              <w:t xml:space="preserve"> analítico</w:t>
+            </w:r>
+          </w:p>
+        </w:tc>
+        <w:tc>
+          <w:tcPr>
+            <w:tcW w:w="3685" w:type="dxa"/>
+            <w:tcBorders>
+              <w:left w:val="single" w:sz="12" w:space="0" w:color="auto"/>
+              <w:right w:val="single" w:sz="12" w:space="0" w:color="auto"/>
+            </w:tcBorders>
+          </w:tcPr>
+          <w:p>
+            <w:r>
+              <w:t>Equipa de TI, sensores ambientais, servidores</w:t>
+            </w:r>
+          </w:p>
+        </w:tc>
+      </w:tr>
+      <w:tr>
+        <w:tc>
+          <w:tcPr>
+            <w:tcW w:w="2830" w:type="dxa"/>
+            <w:tcBorders>
+              <w:left w:val="single" w:sz="12" w:space="0" w:color="auto"/>
+              <w:bottom w:val="single" w:sz="12" w:space="0" w:color="auto"/>
+              <w:right w:val="single" w:sz="12" w:space="0" w:color="auto"/>
+            </w:tcBorders>
+          </w:tcPr>
+          <w:p>
+            <w:r>
+              <w:t>3.1. Estabelecer parcerias com empresas de energia verde</w:t>
+            </w:r>
+          </w:p>
+        </w:tc>
+        <w:tc>
+          <w:tcPr>
+            <w:tcW w:w="2835" w:type="dxa"/>
+            <w:tcBorders>
+              <w:left w:val="single" w:sz="12" w:space="0" w:color="auto"/>
+              <w:bottom w:val="single" w:sz="12" w:space="0" w:color="auto"/>
+              <w:right w:val="single" w:sz="12" w:space="0" w:color="auto"/>
+            </w:tcBorders>
+          </w:tcPr>
+          <w:p>
+            <w:r>
+              <w:t>Negociação de contratos de fornecimento sustentável</w:t>
+            </w:r>
+          </w:p>
+        </w:tc>
+        <w:tc>
+          <w:tcPr>
+            <w:tcW w:w="3685" w:type="dxa"/>
+            <w:tcBorders>
+              <w:left w:val="single" w:sz="12" w:space="0" w:color="auto"/>
+              <w:bottom w:val="single" w:sz="12" w:space="0" w:color="auto"/>
+              <w:right w:val="single" w:sz="12" w:space="0" w:color="auto"/>
+            </w:tcBorders>
+          </w:tcPr>
+          <w:p>
+            <w:r>
+              <w:t>Equipa jurídica e de sustentabilidade, orçamento para transição energética</w:t>
+            </w:r>
+          </w:p>
+        </w:tc>
+      </w:tr>
+    </w:tbl>
+    <w:p>
+      <w:pPr>
+        <w:rPr>
+          <w:b/>
+          <w:bCs/>
+        </w:rPr>
+      </w:pPr>
+    </w:p>
+    <w:p>
+      <w:pPr>
+        <w:pStyle w:val="PargrafodaLista"/>
+        <w:numPr>
+          <w:ilvl w:val="0"/>
+          <w:numId w:val="30"/>
+        </w:numPr>
+        <w:rPr>
+          <w:b/>
+          <w:bCs/>
+        </w:rPr>
+      </w:pPr>
+      <w:r>
+        <w:rPr>
+          <w:b/>
+          <w:bCs/>
+        </w:rPr>
+        <w:lastRenderedPageBreak/>
+        <w:t>Resultados Esperados:</w:t>
+      </w:r>
+    </w:p>
+    <w:p>
+      <w:pPr>
+        <w:ind w:firstLine="360"/>
+      </w:pPr>
+      <w:r>
+        <w:t>Redução de 25% do consumo energético até 2028.</w:t>
+      </w:r>
+    </w:p>
+    <w:p>
+      <w:pPr>
+        <w:ind w:firstLine="360"/>
+      </w:pPr>
+      <w:r>
+        <w:t>Diminuição da pegada de carbono e aumento da eficiência operacional.</w:t>
+      </w:r>
+    </w:p>
+    <w:p>
+      <w:pPr>
+        <w:ind w:firstLine="360"/>
+      </w:pPr>
+      <w:r>
+        <w:t>Reforço da imagem pública da APS como Porto ambientalmente responsável.</w:t>
+      </w:r>
+    </w:p>
+    <w:p/>
+    <w:p>
+      <w:pPr>
+        <w:pStyle w:val="Ttulo3"/>
+        <w:rPr>
+          <w:b/>
+          <w:bCs/>
+          <w:color w:val="000000" w:themeColor="text1"/>
+          <w:sz w:val="20"/>
+          <w:szCs w:val="20"/>
+        </w:rPr>
+      </w:pPr>
+      <w:bookmarkStart w:id="28" w:name="_Toc211333581"/>
+      <w:bookmarkStart w:id="29" w:name="_Toc211418578"/>
+      <w:r>
+        <w:rPr>
+          <w:b/>
+          <w:bCs/>
+          <w:color w:val="000000" w:themeColor="text1"/>
+          <w:sz w:val="20"/>
+          <w:szCs w:val="20"/>
+        </w:rPr>
+        <w:t xml:space="preserve">Propostas </w:t>
+      </w:r>
+      <w:r>
+        <w:rPr>
+          <w:b/>
+          <w:bCs/>
+          <w:color w:val="000000" w:themeColor="text1"/>
+          <w:sz w:val="20"/>
+          <w:szCs w:val="20"/>
+        </w:rPr>
+        <w:t>E</w:t>
+      </w:r>
+      <w:r>
+        <w:rPr>
+          <w:b/>
+          <w:bCs/>
+          <w:color w:val="000000" w:themeColor="text1"/>
+          <w:sz w:val="20"/>
+          <w:szCs w:val="20"/>
+        </w:rPr>
+        <w:t>stratégic</w:t>
+      </w:r>
+      <w:r>
+        <w:rPr>
+          <w:b/>
+          <w:bCs/>
+          <w:color w:val="000000" w:themeColor="text1"/>
+          <w:sz w:val="20"/>
+          <w:szCs w:val="20"/>
+        </w:rPr>
+        <w:t xml:space="preserve">a 2 - </w:t>
+      </w:r>
+      <w:r>
+        <w:rPr>
+          <w:b/>
+          <w:bCs/>
+          <w:color w:val="000000" w:themeColor="text1"/>
+          <w:sz w:val="20"/>
+          <w:szCs w:val="20"/>
+        </w:rPr>
+        <w:t>Transformação Digital e Inovação Tecnológica</w:t>
+      </w:r>
+      <w:bookmarkEnd w:id="28"/>
+      <w:bookmarkEnd w:id="29"/>
+    </w:p>
+    <w:p>
+      <w:pPr>
+        <w:pStyle w:val="PargrafodaLista"/>
+        <w:numPr>
+          <w:ilvl w:val="0"/>
+          <w:numId w:val="30"/>
+        </w:numPr>
+        <w:rPr>
+          <w:b/>
+          <w:bCs/>
+        </w:rPr>
+      </w:pPr>
+      <w:r>
+        <w:rPr>
+          <w:b/>
+          <w:bCs/>
+        </w:rPr>
+        <w:t>Estratégia Proposta:</w:t>
+      </w:r>
+    </w:p>
+    <w:p>
+      <w:pPr>
+        <w:ind w:left="360"/>
+      </w:pPr>
+      <w:r>
+        <w:t>Promover a transformação digital dos processos portuários da APS, aumentando a eficiência operacional, a integração com as cadeias logísticas internacionais e a segurança digital até 2028.</w:t>
+      </w:r>
+    </w:p>
+    <w:p>
+      <w:pPr>
+        <w:ind w:left="360"/>
+      </w:pPr>
+    </w:p>
+    <w:p>
+      <w:pPr>
+        <w:pStyle w:val="PargrafodaLista"/>
+        <w:numPr>
+          <w:ilvl w:val="0"/>
+          <w:numId w:val="30"/>
+        </w:numPr>
+        <w:rPr>
+          <w:b/>
+          <w:bCs/>
+        </w:rPr>
+      </w:pPr>
+      <w:r>
+        <w:rPr>
+          <w:b/>
+          <w:bCs/>
+        </w:rPr>
+        <w:t>Justificação:</w:t>
+      </w:r>
+    </w:p>
+    <w:p>
+      <w:pPr>
+        <w:ind w:firstLine="360"/>
+      </w:pPr>
+      <w:r>
+        <w:t>Deriva de fatores internos e externos identificados na SWOT:</w:t>
+      </w:r>
+    </w:p>
+    <w:p>
+      <w:pPr>
+        <w:ind w:firstLine="360"/>
+      </w:pPr>
+      <w:r>
+        <w:rPr>
+          <w:u w:val="single"/>
+        </w:rPr>
+        <w:t>Fraqueza</w:t>
+      </w:r>
+      <w:r>
+        <w:t xml:space="preserve"> </w:t>
+      </w:r>
+      <w:r>
+        <w:t>-</w:t>
+      </w:r>
+      <w:r>
+        <w:t xml:space="preserve"> estrutura ainda parcialmente centralizada e dependência de processos manuais.</w:t>
+      </w:r>
+    </w:p>
+    <w:p>
+      <w:pPr>
+        <w:ind w:firstLine="360"/>
+      </w:pPr>
+      <w:r>
+        <w:rPr>
+          <w:u w:val="single"/>
+        </w:rPr>
+        <w:t>Oportunidade</w:t>
+      </w:r>
+      <w:r>
+        <w:t xml:space="preserve"> </w:t>
+      </w:r>
+      <w:r>
+        <w:t>-</w:t>
+      </w:r>
+      <w:r>
+        <w:t xml:space="preserve"> digitalização e automação portuária em expansão na Europa.</w:t>
+      </w:r>
+    </w:p>
+    <w:p>
+      <w:pPr>
+        <w:ind w:left="360"/>
+      </w:pPr>
+      <w:r>
+        <w:t xml:space="preserve">A digitalização é uma prioridade tanto para a Estratégia Nacional para o Mar 2030 como para a agenda europeia dos </w:t>
+      </w:r>
+      <w:proofErr w:type="spellStart"/>
+      <w:r>
+        <w:t>Smart</w:t>
+      </w:r>
+      <w:proofErr w:type="spellEnd"/>
+      <w:r>
+        <w:t xml:space="preserve"> </w:t>
+      </w:r>
+      <w:proofErr w:type="spellStart"/>
+      <w:r>
+        <w:t>Ports</w:t>
+      </w:r>
+      <w:proofErr w:type="spellEnd"/>
+      <w:r>
+        <w:t>, permitindo maior integração logística e competitividade.</w:t>
+      </w:r>
+    </w:p>
+    <w:p/>
+    <w:p>
+      <w:pPr>
+        <w:pStyle w:val="PargrafodaLista"/>
+        <w:numPr>
+          <w:ilvl w:val="0"/>
+          <w:numId w:val="30"/>
+        </w:numPr>
+        <w:rPr>
+          <w:b/>
+          <w:bCs/>
+        </w:rPr>
+      </w:pPr>
+      <w:r>
+        <w:rPr>
+          <w:b/>
+          <w:bCs/>
+        </w:rPr>
+        <w:t>Objetivos Táticos:</w:t>
+      </w:r>
+    </w:p>
+    <w:p>
+      <w:pPr>
+        <w:ind w:left="360"/>
+      </w:pPr>
+      <w:r>
+        <w:t xml:space="preserve">1. </w:t>
+      </w:r>
+      <w:r>
+        <w:t>Digitalizar processos administrativos e operacionais, reduzindo o uso de papel e o tempo de execução.</w:t>
+      </w:r>
+    </w:p>
+    <w:p>
+      <w:pPr>
+        <w:ind w:left="360"/>
+      </w:pPr>
+      <w:r>
+        <w:t xml:space="preserve">2. </w:t>
+      </w:r>
+      <w:r>
+        <w:t>Integrar sistemas de gestão portuária com parceiros logísticos e entidades alfandegárias.</w:t>
+      </w:r>
+    </w:p>
+    <w:p>
+      <w:pPr>
+        <w:ind w:left="360"/>
+      </w:pPr>
+      <w:r>
+        <w:t xml:space="preserve">3. </w:t>
+      </w:r>
+      <w:r>
+        <w:t xml:space="preserve">Reforçar a </w:t>
+      </w:r>
+      <w:proofErr w:type="spellStart"/>
+      <w:r>
+        <w:t>cibersegurança</w:t>
+      </w:r>
+      <w:proofErr w:type="spellEnd"/>
+      <w:r>
+        <w:t xml:space="preserve"> e a proteção de dados nas infraestruturas digitais da APS.</w:t>
+      </w:r>
+    </w:p>
+    <w:p>
+      <w:pPr>
+        <w:ind w:left="360"/>
+      </w:pPr>
+    </w:p>
+    <w:p>
+      <w:pPr>
+        <w:pStyle w:val="PargrafodaLista"/>
+        <w:numPr>
+          <w:ilvl w:val="0"/>
+          <w:numId w:val="30"/>
+        </w:numPr>
+        <w:rPr>
+          <w:b/>
+          <w:bCs/>
+        </w:rPr>
+      </w:pPr>
+      <w:r>
+        <w:rPr>
+          <w:b/>
+          <w:bCs/>
+        </w:rPr>
+        <w:t>Objetivos Operacionais e Ações Associadas:</w:t>
+      </w:r>
+    </w:p>
+    <w:tbl>
+      <w:tblPr>
+        <w:tblStyle w:val="TabelacomGrelha"/>
+        <w:tblW w:w="0" w:type="auto"/>
+        <w:tblLook w:val="04A0" w:firstRow="1" w:lastRow="0" w:firstColumn="1" w:lastColumn="0" w:noHBand="0" w:noVBand="1"/>
+      </w:tblPr>
+      <w:tblGrid>
+        <w:gridCol w:w="3388"/>
+        <w:gridCol w:w="3395"/>
+        <w:gridCol w:w="2547"/>
+      </w:tblGrid>
+      <w:tr>
+        <w:tc>
+          <w:tcPr>
+            <w:tcW w:w="3397" w:type="dxa"/>
+            <w:tcBorders>
+              <w:top w:val="single" w:sz="12" w:space="0" w:color="auto"/>
+              <w:left w:val="single" w:sz="12" w:space="0" w:color="auto"/>
+              <w:bottom w:val="single" w:sz="12" w:space="0" w:color="auto"/>
+              <w:right w:val="single" w:sz="12" w:space="0" w:color="auto"/>
+            </w:tcBorders>
+          </w:tcPr>
+          <w:p>
+            <w:pPr>
+              <w:jc w:val="center"/>
+              <w:rPr>
+                <w:b/>
+                <w:bCs/>
+                <w:color w:val="000000" w:themeColor="text1"/>
+              </w:rPr>
+            </w:pPr>
+            <w:r>
+              <w:rPr>
+                <w:b/>
+                <w:bCs/>
+                <w:color w:val="000000" w:themeColor="text1"/>
+              </w:rPr>
+              <w:t>Objetivo Operacional</w:t>
+            </w:r>
+          </w:p>
+        </w:tc>
+        <w:tc>
+          <w:tcPr>
+            <w:tcW w:w="3402" w:type="dxa"/>
+            <w:tcBorders>
+              <w:top w:val="single" w:sz="12" w:space="0" w:color="auto"/>
+              <w:left w:val="single" w:sz="12" w:space="0" w:color="auto"/>
+              <w:bottom w:val="single" w:sz="12" w:space="0" w:color="auto"/>
+              <w:right w:val="single" w:sz="12" w:space="0" w:color="auto"/>
+            </w:tcBorders>
+          </w:tcPr>
+          <w:p>
+            <w:pPr>
+              <w:jc w:val="center"/>
+              <w:rPr>
+                <w:b/>
+                <w:bCs/>
+                <w:color w:val="000000" w:themeColor="text1"/>
+              </w:rPr>
+            </w:pPr>
+            <w:r>
+              <w:rPr>
+                <w:b/>
+                <w:bCs/>
+                <w:color w:val="000000" w:themeColor="text1"/>
+              </w:rPr>
+              <w:t>Ações Principais</w:t>
+            </w:r>
+          </w:p>
+        </w:tc>
+        <w:tc>
+          <w:tcPr>
+            <w:tcW w:w="2551" w:type="dxa"/>
+            <w:tcBorders>
+              <w:top w:val="single" w:sz="12" w:space="0" w:color="auto"/>
+              <w:left w:val="single" w:sz="12" w:space="0" w:color="auto"/>
+              <w:bottom w:val="single" w:sz="12" w:space="0" w:color="auto"/>
+              <w:right w:val="single" w:sz="12" w:space="0" w:color="auto"/>
+            </w:tcBorders>
+          </w:tcPr>
+          <w:p>
+            <w:pPr>
+              <w:jc w:val="center"/>
+              <w:rPr>
+                <w:b/>
+                <w:bCs/>
+                <w:color w:val="000000" w:themeColor="text1"/>
+              </w:rPr>
+            </w:pPr>
+            <w:r>
+              <w:rPr>
+                <w:b/>
+                <w:bCs/>
+                <w:color w:val="000000" w:themeColor="text1"/>
+              </w:rPr>
+              <w:t>Recursos Necessários</w:t>
+            </w:r>
+          </w:p>
+        </w:tc>
+      </w:tr>
+      <w:tr>
+        <w:tc>
+          <w:tcPr>
+            <w:tcW w:w="3397" w:type="dxa"/>
+            <w:tcBorders>
+              <w:top w:val="single" w:sz="12" w:space="0" w:color="auto"/>
+              <w:left w:val="single" w:sz="12" w:space="0" w:color="auto"/>
+              <w:right w:val="single" w:sz="12" w:space="0" w:color="auto"/>
+            </w:tcBorders>
+          </w:tcPr>
+          <w:p>
+            <w:r>
+              <w:t xml:space="preserve">1.1. </w:t>
+            </w:r>
+            <w:r>
+              <w:t xml:space="preserve">Implementar um sistema integrado de gestão documental e </w:t>
+            </w:r>
+            <w:proofErr w:type="spellStart"/>
+            <w:r>
+              <w:t>workflow</w:t>
+            </w:r>
+            <w:proofErr w:type="spellEnd"/>
+            <w:r>
+              <w:t xml:space="preserve"> digita</w:t>
+            </w:r>
+            <w:r>
+              <w:t>l</w:t>
+            </w:r>
+          </w:p>
+        </w:tc>
+        <w:tc>
+          <w:tcPr>
+            <w:tcW w:w="3402" w:type="dxa"/>
+            <w:tcBorders>
+              <w:top w:val="single" w:sz="12" w:space="0" w:color="auto"/>
+              <w:left w:val="single" w:sz="12" w:space="0" w:color="auto"/>
+              <w:right w:val="single" w:sz="12" w:space="0" w:color="auto"/>
+            </w:tcBorders>
+          </w:tcPr>
+          <w:p>
+            <w:r>
+              <w:t>Aquisição e personalização de software ERP/SGD; formação dos utilizadores</w:t>
+            </w:r>
+          </w:p>
+        </w:tc>
+        <w:tc>
+          <w:tcPr>
+            <w:tcW w:w="2551" w:type="dxa"/>
+            <w:tcBorders>
+              <w:top w:val="single" w:sz="12" w:space="0" w:color="auto"/>
+              <w:left w:val="single" w:sz="12" w:space="0" w:color="auto"/>
+              <w:right w:val="single" w:sz="12" w:space="0" w:color="auto"/>
+            </w:tcBorders>
+          </w:tcPr>
+          <w:p>
+            <w:r>
+              <w:t>Software, equipa de TI, consultores externos</w:t>
+            </w:r>
+          </w:p>
+        </w:tc>
+      </w:tr>
+      <w:tr>
+        <w:tc>
+          <w:tcPr>
+            <w:tcW w:w="3397" w:type="dxa"/>
+            <w:tcBorders>
+              <w:left w:val="single" w:sz="12" w:space="0" w:color="auto"/>
+              <w:right w:val="single" w:sz="12" w:space="0" w:color="auto"/>
+            </w:tcBorders>
+          </w:tcPr>
+          <w:p>
+            <w:r>
+              <w:lastRenderedPageBreak/>
+              <w:t>2.1.</w:t>
+            </w:r>
+            <w:r>
+              <w:t xml:space="preserve"> </w:t>
+            </w:r>
+            <w:r>
+              <w:t>Criar plataforma interoperável de troca de dados (</w:t>
+            </w:r>
+            <w:proofErr w:type="spellStart"/>
+            <w:r>
+              <w:t>Port</w:t>
+            </w:r>
+            <w:proofErr w:type="spellEnd"/>
+            <w:r>
+              <w:t xml:space="preserve"> </w:t>
+            </w:r>
+            <w:proofErr w:type="spellStart"/>
+            <w:r>
+              <w:t>Community</w:t>
+            </w:r>
+            <w:proofErr w:type="spellEnd"/>
+            <w:r>
+              <w:t xml:space="preserve"> </w:t>
+            </w:r>
+            <w:proofErr w:type="spellStart"/>
+            <w:r>
+              <w:t>System</w:t>
+            </w:r>
+            <w:proofErr w:type="spellEnd"/>
+            <w:r>
+              <w:t>)</w:t>
+            </w:r>
+          </w:p>
+        </w:tc>
+        <w:tc>
+          <w:tcPr>
+            <w:tcW w:w="3402" w:type="dxa"/>
+            <w:tcBorders>
+              <w:left w:val="single" w:sz="12" w:space="0" w:color="auto"/>
+              <w:right w:val="single" w:sz="12" w:space="0" w:color="auto"/>
+            </w:tcBorders>
+          </w:tcPr>
+          <w:p>
+            <w:r>
+              <w:t>Desenvolvimento de plataforma de integração logística</w:t>
+            </w:r>
+          </w:p>
+        </w:tc>
+        <w:tc>
+          <w:tcPr>
+            <w:tcW w:w="2551" w:type="dxa"/>
+            <w:tcBorders>
+              <w:left w:val="single" w:sz="12" w:space="0" w:color="auto"/>
+              <w:right w:val="single" w:sz="12" w:space="0" w:color="auto"/>
+            </w:tcBorders>
+          </w:tcPr>
+          <w:p>
+            <w:r>
+              <w:t xml:space="preserve">Programadores, analistas de sistemas, servidores e </w:t>
+            </w:r>
+            <w:proofErr w:type="spellStart"/>
+            <w:r>
+              <w:t>APIs</w:t>
+            </w:r>
+            <w:proofErr w:type="spellEnd"/>
+            <w:r>
+              <w:t xml:space="preserve"> seguras</w:t>
+            </w:r>
+          </w:p>
+        </w:tc>
+      </w:tr>
+      <w:tr>
+        <w:tc>
+          <w:tcPr>
+            <w:tcW w:w="3397" w:type="dxa"/>
+            <w:tcBorders>
+              <w:left w:val="single" w:sz="12" w:space="0" w:color="auto"/>
+              <w:bottom w:val="single" w:sz="12" w:space="0" w:color="auto"/>
+              <w:right w:val="single" w:sz="12" w:space="0" w:color="auto"/>
+            </w:tcBorders>
+          </w:tcPr>
+          <w:p>
+            <w:r>
+              <w:t xml:space="preserve">3.1. Reforçar </w:t>
+            </w:r>
+            <w:proofErr w:type="spellStart"/>
+            <w:r>
+              <w:t>cibersegurança</w:t>
+            </w:r>
+            <w:proofErr w:type="spellEnd"/>
+            <w:r>
+              <w:t xml:space="preserve"> e boas práticas digitais</w:t>
+            </w:r>
+          </w:p>
+        </w:tc>
+        <w:tc>
+          <w:tcPr>
+            <w:tcW w:w="3402" w:type="dxa"/>
+            <w:tcBorders>
+              <w:left w:val="single" w:sz="12" w:space="0" w:color="auto"/>
+              <w:bottom w:val="single" w:sz="12" w:space="0" w:color="auto"/>
+              <w:right w:val="single" w:sz="12" w:space="0" w:color="auto"/>
+            </w:tcBorders>
+          </w:tcPr>
+          <w:p>
+            <w:r>
+              <w:t>Auditorias de segurança, formação contínua e plano de resposta a incidentes</w:t>
+            </w:r>
+          </w:p>
+        </w:tc>
+        <w:tc>
+          <w:tcPr>
+            <w:tcW w:w="2551" w:type="dxa"/>
+            <w:tcBorders>
+              <w:left w:val="single" w:sz="12" w:space="0" w:color="auto"/>
+              <w:bottom w:val="single" w:sz="12" w:space="0" w:color="auto"/>
+              <w:right w:val="single" w:sz="12" w:space="0" w:color="auto"/>
+            </w:tcBorders>
+          </w:tcPr>
+          <w:p>
+            <w:r>
+              <w:t>Consultores de segurança, ferramentas de monitorização, equipa interna de TI</w:t>
+            </w:r>
+          </w:p>
+        </w:tc>
+      </w:tr>
+    </w:tbl>
+    <w:p>
+      <w:pPr>
+        <w:rPr>
+          <w:b/>
+          <w:bCs/>
+        </w:rPr>
+      </w:pPr>
+    </w:p>
+    <w:p>
+      <w:pPr>
+        <w:pStyle w:val="PargrafodaLista"/>
+        <w:numPr>
+          <w:ilvl w:val="0"/>
+          <w:numId w:val="30"/>
+        </w:numPr>
+        <w:rPr>
+          <w:b/>
+          <w:bCs/>
+        </w:rPr>
+      </w:pPr>
+      <w:r>
+        <w:rPr>
+          <w:b/>
+          <w:bCs/>
+        </w:rPr>
+        <w:t>R</w:t>
+      </w:r>
+      <w:r>
+        <w:rPr>
+          <w:b/>
+          <w:bCs/>
+        </w:rPr>
+        <w:t>esultados Esperados:</w:t>
+      </w:r>
+    </w:p>
+    <w:p>
+      <w:pPr>
+        <w:ind w:firstLine="360"/>
+      </w:pPr>
+      <w:r>
+        <w:t>Aumento da eficiência e transparência dos processos portuários.</w:t>
+      </w:r>
+    </w:p>
+    <w:p>
+      <w:pPr>
+        <w:ind w:firstLine="360"/>
+      </w:pPr>
+      <w:r>
+        <w:t>Melhoria da interoperabilidade logística e da comunicação com parceiros internacionais.</w:t>
+      </w:r>
+    </w:p>
+    <w:p>
+      <w:pPr>
+        <w:ind w:firstLine="360"/>
+      </w:pPr>
+      <w:r>
+        <w:t>Fortalecimento da resiliência digital e da segurança dos sistemas críticos da APS</w:t>
+      </w:r>
+      <w:r>
+        <w:t>.</w:t>
+      </w:r>
+    </w:p>
+    <w:p>
+      <w:pPr>
+        <w:spacing w:line="240" w:lineRule="auto"/>
+        <w:jc w:val="left"/>
         <w:rPr>
           <w:rFonts w:cs="Times New Roman"/>
           <w:b/>
         </w:rPr>
+      </w:pPr>
+      <w:r>
+        <w:rPr>
+          <w:rFonts w:cs="Times New Roman"/>
+          <w:b/>
+        </w:rPr>
         <w:br w:type="page"/>
       </w:r>
     </w:p>
@@ -6634,7 +8178,7 @@
       <w:pPr>
         <w:pStyle w:val="Ttulo2"/>
       </w:pPr>
-      <w:bookmarkStart w:id="24" w:name="_Toc211418004"/>
+      <w:bookmarkStart w:id="30" w:name="_Toc211418579"/>
       <w:r>
         <w:lastRenderedPageBreak/>
         <w:t>II.</w:t>
@@ -6648,14 +8192,14 @@
       <w:r>
         <w:t xml:space="preserve"> e Sistemas de informação</w:t>
       </w:r>
-      <w:bookmarkEnd w:id="24"/>
+      <w:bookmarkEnd w:id="30"/>
     </w:p>
     <w:p/>
     <w:p>
       <w:pPr>
         <w:pStyle w:val="Ttulo2"/>
       </w:pPr>
-      <w:bookmarkStart w:id="25" w:name="_Toc211418005"/>
+      <w:bookmarkStart w:id="31" w:name="_Toc211418580"/>
       <w:r>
         <w:t>II</w:t>
       </w:r>
@@ -6680,50 +8224,50 @@
       <w:r>
         <w:t>Pessoas</w:t>
       </w:r>
-      <w:bookmarkEnd w:id="25"/>
+      <w:bookmarkEnd w:id="31"/>
     </w:p>
     <w:p/>
     <w:p>
       <w:pPr>
         <w:pStyle w:val="Ttulo2"/>
       </w:pPr>
-      <w:bookmarkStart w:id="26" w:name="_Toc211418006"/>
+      <w:bookmarkStart w:id="32" w:name="_Toc211418581"/>
       <w:r>
         <w:t>II.5 Promoção da produtividade</w:t>
       </w:r>
-      <w:bookmarkEnd w:id="26"/>
+      <w:bookmarkEnd w:id="32"/>
     </w:p>
     <w:p/>
     <w:p>
       <w:pPr>
         <w:pStyle w:val="Ttulo2"/>
       </w:pPr>
-      <w:bookmarkStart w:id="27" w:name="_Toc211418007"/>
+      <w:bookmarkStart w:id="33" w:name="_Toc211418582"/>
       <w:r>
         <w:t>II.6 Economia circular</w:t>
       </w:r>
-      <w:bookmarkEnd w:id="27"/>
+      <w:bookmarkEnd w:id="33"/>
     </w:p>
     <w:p/>
     <w:p>
       <w:pPr>
         <w:pStyle w:val="Ttulo2"/>
       </w:pPr>
-      <w:bookmarkStart w:id="28" w:name="_Toc211418008"/>
+      <w:bookmarkStart w:id="34" w:name="_Toc211418583"/>
       <w:r>
         <w:t xml:space="preserve">II.7 </w:t>
       </w:r>
       <w:r>
         <w:t>Marketing</w:t>
       </w:r>
-      <w:bookmarkEnd w:id="28"/>
+      <w:bookmarkEnd w:id="34"/>
     </w:p>
     <w:p/>
     <w:p>
       <w:pPr>
         <w:pStyle w:val="Ttulo2"/>
       </w:pPr>
-      <w:bookmarkStart w:id="29" w:name="_Toc211418009"/>
+      <w:bookmarkStart w:id="35" w:name="_Toc211418584"/>
       <w:r>
         <w:t>II.</w:t>
       </w:r>
@@ -6742,14 +8286,14 @@
       <w:r>
         <w:t>Financeira</w:t>
       </w:r>
-      <w:bookmarkEnd w:id="29"/>
+      <w:bookmarkEnd w:id="35"/>
     </w:p>
     <w:p/>
     <w:p>
       <w:pPr>
         <w:pStyle w:val="Ttulo2"/>
       </w:pPr>
-      <w:bookmarkStart w:id="30" w:name="_Toc211418010"/>
+      <w:bookmarkStart w:id="36" w:name="_Toc211418585"/>
       <w:r>
         <w:t>II.</w:t>
       </w:r>
@@ -6765,7 +8309,7 @@
       <w:r>
         <w:t xml:space="preserve"> e Indústria 4.0</w:t>
       </w:r>
-      <w:bookmarkEnd w:id="30"/>
+      <w:bookmarkEnd w:id="36"/>
     </w:p>
     <w:p/>
     <w:p>
@@ -6789,12 +8333,12 @@
           <w:szCs w:val="22"/>
         </w:rPr>
       </w:pPr>
-      <w:bookmarkStart w:id="31" w:name="_Toc211418011"/>
+      <w:bookmarkStart w:id="37" w:name="_Toc211418586"/>
       <w:r>
         <w:lastRenderedPageBreak/>
         <w:t>Parte III – Conclusão</w:t>
       </w:r>
-      <w:bookmarkEnd w:id="31"/>
+      <w:bookmarkEnd w:id="37"/>
     </w:p>
     <w:p>
       <w:pPr>
@@ -6807,22 +8351,22 @@
       <w:pPr>
         <w:pStyle w:val="Ttulo2"/>
       </w:pPr>
-      <w:bookmarkStart w:id="32" w:name="_Toc211418012"/>
+      <w:bookmarkStart w:id="38" w:name="_Toc211418587"/>
       <w:r>
         <w:t>III.1 Conclusão</w:t>
       </w:r>
-      <w:bookmarkEnd w:id="32"/>
+      <w:bookmarkEnd w:id="38"/>
     </w:p>
     <w:p/>
     <w:p>
       <w:pPr>
         <w:pStyle w:val="Ttulo2"/>
       </w:pPr>
-      <w:bookmarkStart w:id="33" w:name="_Toc211418013"/>
+      <w:bookmarkStart w:id="39" w:name="_Toc211418588"/>
       <w:r>
         <w:t>III.2 Sugestões de melhoria</w:t>
       </w:r>
-      <w:bookmarkEnd w:id="33"/>
+      <w:bookmarkEnd w:id="39"/>
     </w:p>
     <w:p>
       <w:pPr>
@@ -6832,14 +8376,14 @@
       <w:r>
         <w:br w:type="page"/>
       </w:r>
-      <w:bookmarkStart w:id="34" w:name="_Toc471979356"/>
-      <w:bookmarkStart w:id="35" w:name="_Toc211418014"/>
+      <w:bookmarkStart w:id="40" w:name="_Toc471979356"/>
+      <w:bookmarkStart w:id="41" w:name="_Toc211418589"/>
       <w:r>
         <w:lastRenderedPageBreak/>
         <w:t>Referências</w:t>
       </w:r>
-      <w:bookmarkEnd w:id="34"/>
-      <w:bookmarkEnd w:id="35"/>
+      <w:bookmarkEnd w:id="40"/>
+      <w:bookmarkEnd w:id="41"/>
     </w:p>
     <w:p/>
     <w:p>
@@ -6850,16 +8394,16 @@
           <w:rFonts w:eastAsia="Arial Narrow"/>
         </w:rPr>
       </w:pPr>
-      <w:bookmarkStart w:id="36" w:name="_Toc471979357"/>
-      <w:bookmarkStart w:id="37" w:name="_Toc211418015"/>
+      <w:bookmarkStart w:id="42" w:name="_Toc471979357"/>
+      <w:bookmarkStart w:id="43" w:name="_Toc211418590"/>
       <w:r>
         <w:rPr>
           <w:rFonts w:eastAsia="Arial Narrow"/>
         </w:rPr>
         <w:t>Anexos</w:t>
       </w:r>
-      <w:bookmarkEnd w:id="36"/>
-      <w:bookmarkEnd w:id="37"/>
+      <w:bookmarkEnd w:id="42"/>
+      <w:bookmarkEnd w:id="43"/>
       <w:r>
         <w:rPr>
           <w:rFonts w:eastAsia="Arial Narrow"/>
@@ -12485,12 +14029,7 @@
 </file>
 
 <file path=customXml/item1.xml><?xml version="1.0" encoding="utf-8"?>
-<?mso-contentType ?>
-<FormTemplates xmlns="http://schemas.microsoft.com/sharepoint/v3/contenttype/forms">
-  <Display>DocumentLibraryForm</Display>
-  <Edit>DocumentLibraryForm</Edit>
-  <New>DocumentLibraryForm</New>
-</FormTemplates>
+<b:Sources xmlns:b="http://schemas.openxmlformats.org/officeDocument/2006/bibliography" xmlns="http://schemas.openxmlformats.org/officeDocument/2006/bibliography" SelectedStyle="\APA.XSL" StyleName="APA"/>
 </file>
 
 <file path=customXml/item2.xml><?xml version="1.0" encoding="utf-8"?>
@@ -12656,7 +14195,12 @@
 </file>
 
 <file path=customXml/item3.xml><?xml version="1.0" encoding="utf-8"?>
-<b:Sources xmlns:b="http://schemas.openxmlformats.org/officeDocument/2006/bibliography" xmlns="http://schemas.openxmlformats.org/officeDocument/2006/bibliography" SelectedStyle="\APA.XSL" StyleName="APA"/>
+<?mso-contentType ?>
+<FormTemplates xmlns="http://schemas.microsoft.com/sharepoint/v3/contenttype/forms">
+  <Display>DocumentLibraryForm</Display>
+  <Edit>DocumentLibraryForm</Edit>
+  <New>DocumentLibraryForm</New>
+</FormTemplates>
 </file>
 
 <file path=customXml/item4.xml><?xml version="1.0" encoding="utf-8"?>
@@ -12672,9 +14216,9 @@
 </file>
 
 <file path=customXml/itemProps1.xml><?xml version="1.0" encoding="utf-8"?>
-<ds:datastoreItem xmlns:ds="http://schemas.openxmlformats.org/officeDocument/2006/customXml" ds:itemID="{A8BEE9C3-75AD-4607-B106-1B44B05722EA}">
+<ds:datastoreItem xmlns:ds="http://schemas.openxmlformats.org/officeDocument/2006/customXml" ds:itemID="{9C46D67E-02BF-4E37-8EF1-2391CC03D27F}">
   <ds:schemaRefs>
-    <ds:schemaRef ds:uri="http://schemas.microsoft.com/sharepoint/v3/contenttype/forms"/>
+    <ds:schemaRef ds:uri="http://schemas.openxmlformats.org/officeDocument/2006/bibliography"/>
   </ds:schemaRefs>
 </ds:datastoreItem>
 </file>
@@ -12698,9 +14242,9 @@
 </file>
 
 <file path=customXml/itemProps3.xml><?xml version="1.0" encoding="utf-8"?>
-<ds:datastoreItem xmlns:ds="http://schemas.openxmlformats.org/officeDocument/2006/customXml" ds:itemID="{9C46D67E-02BF-4E37-8EF1-2391CC03D27F}">
+<ds:datastoreItem xmlns:ds="http://schemas.openxmlformats.org/officeDocument/2006/customXml" ds:itemID="{A8BEE9C3-75AD-4607-B106-1B44B05722EA}">
   <ds:schemaRefs>
-    <ds:schemaRef ds:uri="http://schemas.openxmlformats.org/officeDocument/2006/bibliography"/>
+    <ds:schemaRef ds:uri="http://schemas.microsoft.com/sharepoint/v3/contenttype/forms"/>
   </ds:schemaRefs>
 </ds:datastoreItem>
 </file>

</xml_diff>

<commit_message>
US 2.3.2 - organizational structure updates (#17)
</commit_message>
<xml_diff>
--- a/docs/client_analysis/report_APS.docx
+++ b/docs/client_analysis/report_APS.docx
@@ -3463,33 +3463,21 @@
         </w:rPr>
       </w:pPr>
       <w:r>
-        <w:rPr>
-          <w:i/>
-          <w:iCs/>
-        </w:rPr>
         <w:fldChar w:fldCharType="begin"/>
       </w:r>
       <w:r>
-        <w:rPr>
-          <w:i/>
-          <w:iCs/>
-        </w:rPr>
         <w:instrText xml:space="preserve"> TOC \h \z \c "Figura" </w:instrText>
       </w:r>
       <w:r>
-        <w:rPr>
-          <w:i/>
-          <w:iCs/>
-        </w:rPr>
         <w:fldChar w:fldCharType="separate"/>
       </w:r>
-      <w:hyperlink w:anchor="_Toc211605331" w:history="1">
+      <w:hyperlink w:anchor="_Toc211611355" w:history="1">
         <w:r>
           <w:rPr>
             <w:rStyle w:val="Hiperligao"/>
             <w:noProof/>
           </w:rPr>
-          <w:t>Figura 1 - Estrutura Organizacional</w:t>
+          <w:t>Figura 1 – Serviços regulares de carga contentorizada do Terminal XXI</w:t>
         </w:r>
         <w:r>
           <w:rPr>
@@ -3510,7 +3498,7 @@
             <w:noProof/>
             <w:webHidden/>
           </w:rPr>
-          <w:instrText xml:space="preserve"> PAGEREF _Toc211605331 \h </w:instrText>
+          <w:instrText xml:space="preserve"> PAGEREF _Toc211611355 \h </w:instrText>
         </w:r>
         <w:r>
           <w:rPr>
@@ -3555,13 +3543,13 @@
           <w14:ligatures w14:val="standardContextual"/>
         </w:rPr>
       </w:pPr>
-      <w:hyperlink w:anchor="_Toc211605332" w:history="1">
+      <w:hyperlink w:anchor="_Toc211611356" w:history="1">
         <w:r>
           <w:rPr>
             <w:rStyle w:val="Hiperligao"/>
             <w:noProof/>
           </w:rPr>
-          <w:t>Figura 2 - Sistemas Portuários (conectividade)</w:t>
+          <w:t>Figura 2 - Estrutura Organizacional</w:t>
         </w:r>
         <w:r>
           <w:rPr>
@@ -3582,7 +3570,7 @@
             <w:noProof/>
             <w:webHidden/>
           </w:rPr>
-          <w:instrText xml:space="preserve"> PAGEREF _Toc211605332 \h </w:instrText>
+          <w:instrText xml:space="preserve"> PAGEREF _Toc211611356 \h </w:instrText>
         </w:r>
         <w:r>
           <w:rPr>
@@ -3602,7 +3590,7 @@
             <w:noProof/>
             <w:webHidden/>
           </w:rPr>
-          <w:t>17</w:t>
+          <w:t>9</w:t>
         </w:r>
         <w:r>
           <w:rPr>
@@ -3627,13 +3615,13 @@
           <w14:ligatures w14:val="standardContextual"/>
         </w:rPr>
       </w:pPr>
-      <w:hyperlink w:anchor="_Toc211605333" w:history="1">
+      <w:hyperlink w:anchor="_Toc211611357" w:history="1">
         <w:r>
           <w:rPr>
             <w:rStyle w:val="Hiperligao"/>
             <w:noProof/>
           </w:rPr>
-          <w:t>Figura 3 - Sistemas Portuários (comunidade)</w:t>
+          <w:t>Figura 3 - Sistemas Portuários (conectividade)</w:t>
         </w:r>
         <w:r>
           <w:rPr>
@@ -3654,7 +3642,7 @@
             <w:noProof/>
             <w:webHidden/>
           </w:rPr>
-          <w:instrText xml:space="preserve"> PAGEREF _Toc211605333 \h </w:instrText>
+          <w:instrText xml:space="preserve"> PAGEREF _Toc211611357 \h </w:instrText>
         </w:r>
         <w:r>
           <w:rPr>
@@ -3699,13 +3687,13 @@
           <w14:ligatures w14:val="standardContextual"/>
         </w:rPr>
       </w:pPr>
-      <w:hyperlink w:anchor="_Toc211605334" w:history="1">
+      <w:hyperlink w:anchor="_Toc211611358" w:history="1">
         <w:r>
           <w:rPr>
             <w:rStyle w:val="Hiperligao"/>
             <w:noProof/>
           </w:rPr>
-          <w:t>Figura 4 - Iniciativas Estratégicas</w:t>
+          <w:t>Figura 4 - Sistemas Portuários (comunidade)</w:t>
         </w:r>
         <w:r>
           <w:rPr>
@@ -3726,79 +3714,7 @@
             <w:noProof/>
             <w:webHidden/>
           </w:rPr>
-          <w:instrText xml:space="preserve"> PAGEREF _Toc211605334 \h </w:instrText>
-        </w:r>
-        <w:r>
-          <w:rPr>
-            <w:noProof/>
-            <w:webHidden/>
-          </w:rPr>
-        </w:r>
-        <w:r>
-          <w:rPr>
-            <w:noProof/>
-            <w:webHidden/>
-          </w:rPr>
-          <w:fldChar w:fldCharType="separate"/>
-        </w:r>
-        <w:r>
-          <w:rPr>
-            <w:noProof/>
-            <w:webHidden/>
-          </w:rPr>
-          <w:t>18</w:t>
-        </w:r>
-        <w:r>
-          <w:rPr>
-            <w:noProof/>
-            <w:webHidden/>
-          </w:rPr>
-          <w:fldChar w:fldCharType="end"/>
-        </w:r>
-      </w:hyperlink>
-    </w:p>
-    <w:p>
-      <w:pPr>
-        <w:pStyle w:val="ndicedeilustraes"/>
-        <w:tabs>
-          <w:tab w:val="right" w:leader="dot" w:pos="9350"/>
-        </w:tabs>
-        <w:rPr>
-          <w:rFonts w:asciiTheme="minorHAnsi" w:eastAsiaTheme="minorEastAsia" w:hAnsiTheme="minorHAnsi" w:cstheme="minorBidi"/>
-          <w:noProof/>
-          <w:kern w:val="2"/>
-          <w:sz w:val="24"/>
-          <w14:ligatures w14:val="standardContextual"/>
-        </w:rPr>
-      </w:pPr>
-      <w:hyperlink w:anchor="_Toc211605335" w:history="1">
-        <w:r>
-          <w:rPr>
-            <w:rStyle w:val="Hiperligao"/>
-            <w:noProof/>
-          </w:rPr>
-          <w:t>Figura 5 - Legacy (riscos estratégicos)</w:t>
-        </w:r>
-        <w:r>
-          <w:rPr>
-            <w:noProof/>
-            <w:webHidden/>
-          </w:rPr>
-          <w:tab/>
-        </w:r>
-        <w:r>
-          <w:rPr>
-            <w:noProof/>
-            <w:webHidden/>
-          </w:rPr>
-          <w:fldChar w:fldCharType="begin"/>
-        </w:r>
-        <w:r>
-          <w:rPr>
-            <w:noProof/>
-            <w:webHidden/>
-          </w:rPr>
-          <w:instrText xml:space="preserve"> PAGEREF _Toc211605335 \h </w:instrText>
+          <w:instrText xml:space="preserve"> PAGEREF _Toc211611358 \h </w:instrText>
         </w:r>
         <w:r>
           <w:rPr>
@@ -3843,13 +3759,13 @@
           <w14:ligatures w14:val="standardContextual"/>
         </w:rPr>
       </w:pPr>
-      <w:hyperlink w:anchor="_Toc211605336" w:history="1">
+      <w:hyperlink w:anchor="_Toc211611359" w:history="1">
         <w:r>
           <w:rPr>
             <w:rStyle w:val="Hiperligao"/>
             <w:noProof/>
           </w:rPr>
-          <w:t>Figura 6 - Oportunidades (valor potencial)</w:t>
+          <w:t>Figura 5 - Iniciativas Estratégicas</w:t>
         </w:r>
         <w:r>
           <w:rPr>
@@ -3870,7 +3786,7 @@
             <w:noProof/>
             <w:webHidden/>
           </w:rPr>
-          <w:instrText xml:space="preserve"> PAGEREF _Toc211605336 \h </w:instrText>
+          <w:instrText xml:space="preserve"> PAGEREF _Toc211611359 \h </w:instrText>
         </w:r>
         <w:r>
           <w:rPr>
@@ -3915,13 +3831,13 @@
           <w14:ligatures w14:val="standardContextual"/>
         </w:rPr>
       </w:pPr>
-      <w:hyperlink w:anchor="_Toc211605337" w:history="1">
+      <w:hyperlink w:anchor="_Toc211611360" w:history="1">
         <w:r>
           <w:rPr>
             <w:rStyle w:val="Hiperligao"/>
             <w:noProof/>
           </w:rPr>
-          <w:t>Figura 7 - Enablers de competitividade (recursos e competências)</w:t>
+          <w:t>Figura 6 - Legacy (riscos estratégicos)</w:t>
         </w:r>
         <w:r>
           <w:rPr>
@@ -3942,7 +3858,7 @@
             <w:noProof/>
             <w:webHidden/>
           </w:rPr>
-          <w:instrText xml:space="preserve"> PAGEREF _Toc211605337 \h </w:instrText>
+          <w:instrText xml:space="preserve"> PAGEREF _Toc211611360 \h </w:instrText>
         </w:r>
         <w:r>
           <w:rPr>
@@ -3987,13 +3903,13 @@
           <w14:ligatures w14:val="standardContextual"/>
         </w:rPr>
       </w:pPr>
-      <w:hyperlink w:anchor="_Toc211605338" w:history="1">
+      <w:hyperlink w:anchor="_Toc211611361" w:history="1">
         <w:r>
           <w:rPr>
             <w:rStyle w:val="Hiperligao"/>
             <w:noProof/>
           </w:rPr>
-          <w:t>Figura 8 - Visão dos Stakeholders (competitividade)</w:t>
+          <w:t>Figura 7 - Oportunidades (valor potencial)</w:t>
         </w:r>
         <w:r>
           <w:rPr>
@@ -4014,7 +3930,7 @@
             <w:noProof/>
             <w:webHidden/>
           </w:rPr>
-          <w:instrText xml:space="preserve"> PAGEREF _Toc211605338 \h </w:instrText>
+          <w:instrText xml:space="preserve"> PAGEREF _Toc211611361 \h </w:instrText>
         </w:r>
         <w:r>
           <w:rPr>
@@ -4059,13 +3975,13 @@
           <w14:ligatures w14:val="standardContextual"/>
         </w:rPr>
       </w:pPr>
-      <w:hyperlink w:anchor="_Toc211605339" w:history="1">
+      <w:hyperlink w:anchor="_Toc211611362" w:history="1">
         <w:r>
           <w:rPr>
             <w:rStyle w:val="Hiperligao"/>
             <w:noProof/>
           </w:rPr>
-          <w:t>Figura 9 - Visão dos Stakeholders (cooperação)</w:t>
+          <w:t>Figura 8 - Enablers de competitividade (recursos e competências)</w:t>
         </w:r>
         <w:r>
           <w:rPr>
@@ -4086,79 +4002,7 @@
             <w:noProof/>
             <w:webHidden/>
           </w:rPr>
-          <w:instrText xml:space="preserve"> PAGEREF _Toc211605339 \h </w:instrText>
-        </w:r>
-        <w:r>
-          <w:rPr>
-            <w:noProof/>
-            <w:webHidden/>
-          </w:rPr>
-        </w:r>
-        <w:r>
-          <w:rPr>
-            <w:noProof/>
-            <w:webHidden/>
-          </w:rPr>
-          <w:fldChar w:fldCharType="separate"/>
-        </w:r>
-        <w:r>
-          <w:rPr>
-            <w:noProof/>
-            <w:webHidden/>
-          </w:rPr>
-          <w:t>20</w:t>
-        </w:r>
-        <w:r>
-          <w:rPr>
-            <w:noProof/>
-            <w:webHidden/>
-          </w:rPr>
-          <w:fldChar w:fldCharType="end"/>
-        </w:r>
-      </w:hyperlink>
-    </w:p>
-    <w:p>
-      <w:pPr>
-        <w:pStyle w:val="ndicedeilustraes"/>
-        <w:tabs>
-          <w:tab w:val="right" w:leader="dot" w:pos="9350"/>
-        </w:tabs>
-        <w:rPr>
-          <w:rFonts w:asciiTheme="minorHAnsi" w:eastAsiaTheme="minorEastAsia" w:hAnsiTheme="minorHAnsi" w:cstheme="minorBidi"/>
-          <w:noProof/>
-          <w:kern w:val="2"/>
-          <w:sz w:val="24"/>
-          <w14:ligatures w14:val="standardContextual"/>
-        </w:rPr>
-      </w:pPr>
-      <w:hyperlink w:anchor="_Toc211605340" w:history="1">
-        <w:r>
-          <w:rPr>
-            <w:rStyle w:val="Hiperligao"/>
-            <w:noProof/>
-          </w:rPr>
-          <w:t>Figura 10 - Visão dos Stakeholders (expectativas)</w:t>
-        </w:r>
-        <w:r>
-          <w:rPr>
-            <w:noProof/>
-            <w:webHidden/>
-          </w:rPr>
-          <w:tab/>
-        </w:r>
-        <w:r>
-          <w:rPr>
-            <w:noProof/>
-            <w:webHidden/>
-          </w:rPr>
-          <w:fldChar w:fldCharType="begin"/>
-        </w:r>
-        <w:r>
-          <w:rPr>
-            <w:noProof/>
-            <w:webHidden/>
-          </w:rPr>
-          <w:instrText xml:space="preserve"> PAGEREF _Toc211605340 \h </w:instrText>
+          <w:instrText xml:space="preserve"> PAGEREF _Toc211611362 \h </w:instrText>
         </w:r>
         <w:r>
           <w:rPr>
@@ -4203,13 +4047,13 @@
           <w14:ligatures w14:val="standardContextual"/>
         </w:rPr>
       </w:pPr>
-      <w:hyperlink w:anchor="_Toc211605341" w:history="1">
+      <w:hyperlink w:anchor="_Toc211611363" w:history="1">
         <w:r>
           <w:rPr>
             <w:rStyle w:val="Hiperligao"/>
             <w:noProof/>
           </w:rPr>
-          <w:t>Figura 11 - Ligações estratégicas do Porto de Sines: acessos marítimos globais e hinterland ibérico</w:t>
+          <w:t>Figura 9 - Visão dos Stakeholders (competitividade)</w:t>
         </w:r>
         <w:r>
           <w:rPr>
@@ -4230,7 +4074,7 @@
             <w:noProof/>
             <w:webHidden/>
           </w:rPr>
-          <w:instrText xml:space="preserve"> PAGEREF _Toc211605341 \h </w:instrText>
+          <w:instrText xml:space="preserve"> PAGEREF _Toc211611363 \h </w:instrText>
         </w:r>
         <w:r>
           <w:rPr>
@@ -4275,13 +4119,13 @@
           <w14:ligatures w14:val="standardContextual"/>
         </w:rPr>
       </w:pPr>
-      <w:hyperlink w:anchor="_Toc211605342" w:history="1">
+      <w:hyperlink w:anchor="_Toc211611364" w:history="1">
         <w:r>
           <w:rPr>
             <w:rStyle w:val="Hiperligao"/>
             <w:noProof/>
           </w:rPr>
-          <w:t>Figura 12 – Evolução do movimento de navios no Porto de Sines (1978-2021)</w:t>
+          <w:t>Figura 10 - Visão dos Stakeholders (cooperação)</w:t>
         </w:r>
         <w:r>
           <w:rPr>
@@ -4302,7 +4146,7 @@
             <w:noProof/>
             <w:webHidden/>
           </w:rPr>
-          <w:instrText xml:space="preserve"> PAGEREF _Toc211605342 \h </w:instrText>
+          <w:instrText xml:space="preserve"> PAGEREF _Toc211611364 \h </w:instrText>
         </w:r>
         <w:r>
           <w:rPr>
@@ -4347,13 +4191,13 @@
           <w14:ligatures w14:val="standardContextual"/>
         </w:rPr>
       </w:pPr>
-      <w:hyperlink w:anchor="_Toc211605343" w:history="1">
+      <w:hyperlink w:anchor="_Toc211611365" w:history="1">
         <w:r>
           <w:rPr>
             <w:rStyle w:val="Hiperligao"/>
             <w:noProof/>
           </w:rPr>
-          <w:t>Figura 13 - Evolução do movimento de navios no Porto de Faro (2000-2021)</w:t>
+          <w:t>Figura 11 - Visão dos Stakeholders (expectativas)</w:t>
         </w:r>
         <w:r>
           <w:rPr>
@@ -4374,7 +4218,7 @@
             <w:noProof/>
             <w:webHidden/>
           </w:rPr>
-          <w:instrText xml:space="preserve"> PAGEREF _Toc211605343 \h </w:instrText>
+          <w:instrText xml:space="preserve"> PAGEREF _Toc211611365 \h </w:instrText>
         </w:r>
         <w:r>
           <w:rPr>
@@ -4419,13 +4263,13 @@
           <w14:ligatures w14:val="standardContextual"/>
         </w:rPr>
       </w:pPr>
-      <w:hyperlink w:anchor="_Toc211605344" w:history="1">
+      <w:hyperlink w:anchor="_Toc211611366" w:history="1">
         <w:r>
           <w:rPr>
             <w:rStyle w:val="Hiperligao"/>
             <w:noProof/>
           </w:rPr>
-          <w:t>Figura 14 - Evolução do movimento de navios no Porto de Portimão (2000-2021)</w:t>
+          <w:t>Figura 12 - Ligações estratégicas do Porto de Sines: acessos marítimos globais e hinterland ibérico</w:t>
         </w:r>
         <w:r>
           <w:rPr>
@@ -4446,7 +4290,7 @@
             <w:noProof/>
             <w:webHidden/>
           </w:rPr>
-          <w:instrText xml:space="preserve"> PAGEREF _Toc211605344 \h </w:instrText>
+          <w:instrText xml:space="preserve"> PAGEREF _Toc211611366 \h </w:instrText>
         </w:r>
         <w:r>
           <w:rPr>
@@ -4491,13 +4335,13 @@
           <w14:ligatures w14:val="standardContextual"/>
         </w:rPr>
       </w:pPr>
-      <w:hyperlink w:anchor="_Toc211605345" w:history="1">
+      <w:hyperlink w:anchor="_Toc211611367" w:history="1">
         <w:r>
           <w:rPr>
             <w:rStyle w:val="Hiperligao"/>
             <w:noProof/>
           </w:rPr>
-          <w:t>Figura 15 - Evolução das mercadorias movimentadas no Porto de Sines (1978-2021)</w:t>
+          <w:t>Figura 13 – Evolução do movimento de navios no Porto de Sines (1978-2021)</w:t>
         </w:r>
         <w:r>
           <w:rPr>
@@ -4518,7 +4362,7 @@
             <w:noProof/>
             <w:webHidden/>
           </w:rPr>
-          <w:instrText xml:space="preserve"> PAGEREF _Toc211605345 \h </w:instrText>
+          <w:instrText xml:space="preserve"> PAGEREF _Toc211611367 \h </w:instrText>
         </w:r>
         <w:r>
           <w:rPr>
@@ -4563,13 +4407,13 @@
           <w14:ligatures w14:val="standardContextual"/>
         </w:rPr>
       </w:pPr>
-      <w:hyperlink w:anchor="_Toc211605346" w:history="1">
+      <w:hyperlink w:anchor="_Toc211611368" w:history="1">
         <w:r>
           <w:rPr>
             <w:rStyle w:val="Hiperligao"/>
             <w:noProof/>
           </w:rPr>
-          <w:t>Figura 16 - Evolução das mercadorias movimentadas no Porto de Faro (2000-2021)</w:t>
+          <w:t>Figura 14 - Evolução do movimento de navios no Porto de Faro (2000-2021)</w:t>
         </w:r>
         <w:r>
           <w:rPr>
@@ -4590,7 +4434,7 @@
             <w:noProof/>
             <w:webHidden/>
           </w:rPr>
-          <w:instrText xml:space="preserve"> PAGEREF _Toc211605346 \h </w:instrText>
+          <w:instrText xml:space="preserve"> PAGEREF _Toc211611368 \h </w:instrText>
         </w:r>
         <w:r>
           <w:rPr>
@@ -4635,13 +4479,13 @@
           <w14:ligatures w14:val="standardContextual"/>
         </w:rPr>
       </w:pPr>
-      <w:hyperlink w:anchor="_Toc211605347" w:history="1">
+      <w:hyperlink w:anchor="_Toc211611369" w:history="1">
         <w:r>
           <w:rPr>
             <w:rStyle w:val="Hiperligao"/>
             <w:noProof/>
           </w:rPr>
-          <w:t>Figura 17 - Evolução das mercadorias movimentadas no Porto de Portimão (2000-2021)</w:t>
+          <w:t>Figura 15 - Evolução do movimento de navios no Porto de Portimão (2000-2021)</w:t>
         </w:r>
         <w:r>
           <w:rPr>
@@ -4662,7 +4506,7 @@
             <w:noProof/>
             <w:webHidden/>
           </w:rPr>
-          <w:instrText xml:space="preserve"> PAGEREF _Toc211605347 \h </w:instrText>
+          <w:instrText xml:space="preserve"> PAGEREF _Toc211611369 \h </w:instrText>
         </w:r>
         <w:r>
           <w:rPr>
@@ -4707,13 +4551,13 @@
           <w14:ligatures w14:val="standardContextual"/>
         </w:rPr>
       </w:pPr>
-      <w:hyperlink w:anchor="_Toc211605348" w:history="1">
+      <w:hyperlink w:anchor="_Toc211611370" w:history="1">
         <w:r>
           <w:rPr>
             <w:rStyle w:val="Hiperligao"/>
             <w:noProof/>
           </w:rPr>
-          <w:t>Figura 18 - Evolução do movimento de passageiros no Porto de Portimão (2004-2020)</w:t>
+          <w:t>Figura 16 - Evolução das mercadorias movimentadas no Porto de Sines (1978-2021)</w:t>
         </w:r>
         <w:r>
           <w:rPr>
@@ -4734,7 +4578,7 @@
             <w:noProof/>
             <w:webHidden/>
           </w:rPr>
-          <w:instrText xml:space="preserve"> PAGEREF _Toc211605348 \h </w:instrText>
+          <w:instrText xml:space="preserve"> PAGEREF _Toc211611370 \h </w:instrText>
         </w:r>
         <w:r>
           <w:rPr>
@@ -4767,13 +4611,227 @@
     </w:p>
     <w:p>
       <w:pPr>
+        <w:pStyle w:val="ndicedeilustraes"/>
+        <w:tabs>
+          <w:tab w:val="right" w:leader="dot" w:pos="9350"/>
+        </w:tabs>
+        <w:rPr>
+          <w:rFonts w:asciiTheme="minorHAnsi" w:eastAsiaTheme="minorEastAsia" w:hAnsiTheme="minorHAnsi" w:cstheme="minorBidi"/>
+          <w:noProof/>
+          <w:kern w:val="2"/>
+          <w:sz w:val="24"/>
+          <w14:ligatures w14:val="standardContextual"/>
+        </w:rPr>
+      </w:pPr>
+      <w:hyperlink w:anchor="_Toc211611371" w:history="1">
+        <w:r>
+          <w:rPr>
+            <w:rStyle w:val="Hiperligao"/>
+            <w:noProof/>
+          </w:rPr>
+          <w:t>Figura 17 - Evolução das mercadorias movimentadas no Porto de Faro (2000-2021)</w:t>
+        </w:r>
+        <w:r>
+          <w:rPr>
+            <w:noProof/>
+            <w:webHidden/>
+          </w:rPr>
+          <w:tab/>
+        </w:r>
+        <w:r>
+          <w:rPr>
+            <w:noProof/>
+            <w:webHidden/>
+          </w:rPr>
+          <w:fldChar w:fldCharType="begin"/>
+        </w:r>
+        <w:r>
+          <w:rPr>
+            <w:noProof/>
+            <w:webHidden/>
+          </w:rPr>
+          <w:instrText xml:space="preserve"> PAGEREF _Toc211611371 \h </w:instrText>
+        </w:r>
+        <w:r>
+          <w:rPr>
+            <w:noProof/>
+            <w:webHidden/>
+          </w:rPr>
+        </w:r>
+        <w:r>
+          <w:rPr>
+            <w:noProof/>
+            <w:webHidden/>
+          </w:rPr>
+          <w:fldChar w:fldCharType="separate"/>
+        </w:r>
+        <w:r>
+          <w:rPr>
+            <w:noProof/>
+            <w:webHidden/>
+          </w:rPr>
+          <w:t>25</w:t>
+        </w:r>
+        <w:r>
+          <w:rPr>
+            <w:noProof/>
+            <w:webHidden/>
+          </w:rPr>
+          <w:fldChar w:fldCharType="end"/>
+        </w:r>
+      </w:hyperlink>
+    </w:p>
+    <w:p>
+      <w:pPr>
+        <w:pStyle w:val="ndicedeilustraes"/>
+        <w:tabs>
+          <w:tab w:val="right" w:leader="dot" w:pos="9350"/>
+        </w:tabs>
+        <w:rPr>
+          <w:rFonts w:asciiTheme="minorHAnsi" w:eastAsiaTheme="minorEastAsia" w:hAnsiTheme="minorHAnsi" w:cstheme="minorBidi"/>
+          <w:noProof/>
+          <w:kern w:val="2"/>
+          <w:sz w:val="24"/>
+          <w14:ligatures w14:val="standardContextual"/>
+        </w:rPr>
+      </w:pPr>
+      <w:hyperlink w:anchor="_Toc211611372" w:history="1">
+        <w:r>
+          <w:rPr>
+            <w:rStyle w:val="Hiperligao"/>
+            <w:noProof/>
+          </w:rPr>
+          <w:t>Figura 18 - Evolução das mercadorias movimentadas no Porto de Portimão (2000-2021)</w:t>
+        </w:r>
+        <w:r>
+          <w:rPr>
+            <w:noProof/>
+            <w:webHidden/>
+          </w:rPr>
+          <w:tab/>
+        </w:r>
+        <w:r>
+          <w:rPr>
+            <w:noProof/>
+            <w:webHidden/>
+          </w:rPr>
+          <w:fldChar w:fldCharType="begin"/>
+        </w:r>
+        <w:r>
+          <w:rPr>
+            <w:noProof/>
+            <w:webHidden/>
+          </w:rPr>
+          <w:instrText xml:space="preserve"> PAGEREF _Toc211611372 \h </w:instrText>
+        </w:r>
+        <w:r>
+          <w:rPr>
+            <w:noProof/>
+            <w:webHidden/>
+          </w:rPr>
+        </w:r>
+        <w:r>
+          <w:rPr>
+            <w:noProof/>
+            <w:webHidden/>
+          </w:rPr>
+          <w:fldChar w:fldCharType="separate"/>
+        </w:r>
+        <w:r>
+          <w:rPr>
+            <w:noProof/>
+            <w:webHidden/>
+          </w:rPr>
+          <w:t>26</w:t>
+        </w:r>
+        <w:r>
+          <w:rPr>
+            <w:noProof/>
+            <w:webHidden/>
+          </w:rPr>
+          <w:fldChar w:fldCharType="end"/>
+        </w:r>
+      </w:hyperlink>
+    </w:p>
+    <w:p>
+      <w:pPr>
+        <w:pStyle w:val="ndicedeilustraes"/>
+        <w:tabs>
+          <w:tab w:val="right" w:leader="dot" w:pos="9350"/>
+        </w:tabs>
+        <w:rPr>
+          <w:rFonts w:asciiTheme="minorHAnsi" w:eastAsiaTheme="minorEastAsia" w:hAnsiTheme="minorHAnsi" w:cstheme="minorBidi"/>
+          <w:noProof/>
+          <w:kern w:val="2"/>
+          <w:sz w:val="24"/>
+          <w14:ligatures w14:val="standardContextual"/>
+        </w:rPr>
+      </w:pPr>
+      <w:hyperlink w:anchor="_Toc211611373" w:history="1">
+        <w:r>
+          <w:rPr>
+            <w:rStyle w:val="Hiperligao"/>
+            <w:noProof/>
+          </w:rPr>
+          <w:t>Figura 19 - Evolução do movimento de passageiros no Porto de Portimão (2004-2020)</w:t>
+        </w:r>
+        <w:r>
+          <w:rPr>
+            <w:noProof/>
+            <w:webHidden/>
+          </w:rPr>
+          <w:tab/>
+        </w:r>
+        <w:r>
+          <w:rPr>
+            <w:noProof/>
+            <w:webHidden/>
+          </w:rPr>
+          <w:fldChar w:fldCharType="begin"/>
+        </w:r>
+        <w:r>
+          <w:rPr>
+            <w:noProof/>
+            <w:webHidden/>
+          </w:rPr>
+          <w:instrText xml:space="preserve"> PAGEREF _Toc211611373 \h </w:instrText>
+        </w:r>
+        <w:r>
+          <w:rPr>
+            <w:noProof/>
+            <w:webHidden/>
+          </w:rPr>
+        </w:r>
+        <w:r>
+          <w:rPr>
+            <w:noProof/>
+            <w:webHidden/>
+          </w:rPr>
+          <w:fldChar w:fldCharType="separate"/>
+        </w:r>
+        <w:r>
+          <w:rPr>
+            <w:noProof/>
+            <w:webHidden/>
+          </w:rPr>
+          <w:t>27</w:t>
+        </w:r>
+        <w:r>
+          <w:rPr>
+            <w:noProof/>
+            <w:webHidden/>
+          </w:rPr>
+          <w:fldChar w:fldCharType="end"/>
+        </w:r>
+      </w:hyperlink>
+    </w:p>
+    <w:p>
+      <w:pPr>
         <w:pStyle w:val="Legenda"/>
         <w:spacing w:line="276" w:lineRule="auto"/>
       </w:pPr>
       <w:r>
         <w:rPr>
-          <w:i w:val="0"/>
-          <w:iCs w:val="0"/>
           <w:color w:val="auto"/>
           <w:sz w:val="22"/>
           <w:szCs w:val="24"/>
@@ -4825,8 +4883,14 @@
       </w:r>
     </w:p>
     <w:p>
-      <w:r>
-        <w:t>Kt - Q</w:t>
+      <w:proofErr w:type="spellStart"/>
+      <w:r>
+        <w:lastRenderedPageBreak/>
+        <w:t>Kt</w:t>
+      </w:r>
+      <w:proofErr w:type="spellEnd"/>
+      <w:r>
+        <w:t xml:space="preserve"> - Q</w:t>
       </w:r>
       <w:r>
         <w:t>uilotonelada</w:t>
@@ -4840,19 +4904,47 @@
     </w:p>
     <w:p>
       <w:r>
-        <w:lastRenderedPageBreak/>
         <w:t xml:space="preserve">TMS - </w:t>
       </w:r>
       <w:r>
-        <w:t>Terminal Multipurpose</w:t>
-      </w:r>
+        <w:t xml:space="preserve">Terminal </w:t>
+      </w:r>
+      <w:proofErr w:type="spellStart"/>
+      <w:r>
+        <w:t>Multipurpose</w:t>
+      </w:r>
+      <w:proofErr w:type="spellEnd"/>
       <w:r>
         <w:t>;</w:t>
       </w:r>
     </w:p>
     <w:p>
       <w:r>
-        <w:t>ISO – International Organization for Standardization (</w:t>
+        <w:t xml:space="preserve">ISO – </w:t>
+      </w:r>
+      <w:proofErr w:type="spellStart"/>
+      <w:r>
+        <w:t>International</w:t>
+      </w:r>
+      <w:proofErr w:type="spellEnd"/>
+      <w:r>
+        <w:t xml:space="preserve"> </w:t>
+      </w:r>
+      <w:proofErr w:type="spellStart"/>
+      <w:r>
+        <w:t>Organization</w:t>
+      </w:r>
+      <w:proofErr w:type="spellEnd"/>
+      <w:r>
+        <w:t xml:space="preserve"> for </w:t>
+      </w:r>
+      <w:proofErr w:type="spellStart"/>
+      <w:r>
+        <w:t>Standardization</w:t>
+      </w:r>
+      <w:proofErr w:type="spellEnd"/>
+      <w:r>
+        <w:t xml:space="preserve"> (</w:t>
       </w:r>
       <w:r>
         <w:t>Organização Internacional de Normalização</w:t>
@@ -4882,9 +4974,27 @@
       <w:r>
         <w:t xml:space="preserve">- </w:t>
       </w:r>
-      <w:r>
-        <w:t>Environmental, Social and Governance</w:t>
-      </w:r>
+      <w:proofErr w:type="spellStart"/>
+      <w:r>
+        <w:t>Environmental</w:t>
+      </w:r>
+      <w:proofErr w:type="spellEnd"/>
+      <w:r>
+        <w:t xml:space="preserve">, Social </w:t>
+      </w:r>
+      <w:proofErr w:type="spellStart"/>
+      <w:r>
+        <w:t>and</w:t>
+      </w:r>
+      <w:proofErr w:type="spellEnd"/>
+      <w:r>
+        <w:t xml:space="preserve"> </w:t>
+      </w:r>
+      <w:proofErr w:type="spellStart"/>
+      <w:r>
+        <w:t>Governance</w:t>
+      </w:r>
+      <w:proofErr w:type="spellEnd"/>
       <w:r>
         <w:t xml:space="preserve"> (</w:t>
       </w:r>
@@ -4902,8 +5012,37 @@
       <w:r>
         <w:t xml:space="preserve">SWOT - </w:t>
       </w:r>
-      <w:r>
-        <w:t>Strengths, Weaknesses, Opportunities e Threats </w:t>
+      <w:proofErr w:type="spellStart"/>
+      <w:r>
+        <w:t>Strengths</w:t>
+      </w:r>
+      <w:proofErr w:type="spellEnd"/>
+      <w:r>
+        <w:t>, </w:t>
+      </w:r>
+      <w:proofErr w:type="spellStart"/>
+      <w:r>
+        <w:t>Weaknesses</w:t>
+      </w:r>
+      <w:proofErr w:type="spellEnd"/>
+      <w:r>
+        <w:t>, </w:t>
+      </w:r>
+      <w:proofErr w:type="spellStart"/>
+      <w:r>
+        <w:t>Opportunities</w:t>
+      </w:r>
+      <w:proofErr w:type="spellEnd"/>
+      <w:r>
+        <w:t> e </w:t>
+      </w:r>
+      <w:proofErr w:type="spellStart"/>
+      <w:r>
+        <w:t>Threats</w:t>
+      </w:r>
+      <w:proofErr w:type="spellEnd"/>
+      <w:r>
+        <w:t> </w:t>
       </w:r>
       <w:r>
         <w:t>(Forças, Fraquezas, Oportunidades, Ameaças)</w:t>
@@ -4931,8 +5070,21 @@
         <w:t xml:space="preserve"> - L</w:t>
       </w:r>
       <w:r>
-        <w:t>ight-emitting diode</w:t>
-      </w:r>
+        <w:t>ight-</w:t>
+      </w:r>
+      <w:proofErr w:type="spellStart"/>
+      <w:r>
+        <w:t>emitting</w:t>
+      </w:r>
+      <w:proofErr w:type="spellEnd"/>
+      <w:r>
+        <w:t xml:space="preserve"> </w:t>
+      </w:r>
+      <w:proofErr w:type="spellStart"/>
+      <w:r>
+        <w:t>diode</w:t>
+      </w:r>
+      <w:proofErr w:type="spellEnd"/>
       <w:r>
         <w:t xml:space="preserve"> (Díodo emissor de luz)</w:t>
       </w:r>
@@ -4941,15 +5093,30 @@
       </w:r>
     </w:p>
     <w:p>
+      <w:proofErr w:type="spellStart"/>
       <w:r>
         <w:t>IoT</w:t>
       </w:r>
+      <w:proofErr w:type="spellEnd"/>
       <w:r>
         <w:t xml:space="preserve"> -</w:t>
       </w:r>
       <w:r>
-        <w:t> Internet of Things</w:t>
-      </w:r>
+        <w:t xml:space="preserve"> Internet </w:t>
+      </w:r>
+      <w:proofErr w:type="spellStart"/>
+      <w:r>
+        <w:t>of</w:t>
+      </w:r>
+      <w:proofErr w:type="spellEnd"/>
+      <w:r>
+        <w:t xml:space="preserve"> </w:t>
+      </w:r>
+      <w:proofErr w:type="spellStart"/>
+      <w:r>
+        <w:t>Things</w:t>
+      </w:r>
+      <w:proofErr w:type="spellEnd"/>
       <w:r>
         <w:t xml:space="preserve"> (Internet das coisas)</w:t>
       </w:r>
@@ -5004,8 +5171,8 @@
           <w:b/>
           <w:bCs/>
           <w:color w:val="auto"/>
-          <w:sz w:val="20"/>
-          <w:szCs w:val="20"/>
+          <w:sz w:val="22"/>
+          <w:szCs w:val="22"/>
         </w:rPr>
       </w:pPr>
       <w:bookmarkStart w:id="9" w:name="_Toc211610912"/>
@@ -5014,8 +5181,8 @@
           <w:b/>
           <w:bCs/>
           <w:color w:val="auto"/>
-          <w:sz w:val="20"/>
-          <w:szCs w:val="20"/>
+          <w:sz w:val="22"/>
+          <w:szCs w:val="22"/>
         </w:rPr>
         <w:t>Enquadramento Institucional</w:t>
       </w:r>
@@ -5038,8 +5205,8 @@
           <w:b/>
           <w:bCs/>
           <w:color w:val="auto"/>
-          <w:sz w:val="20"/>
-          <w:szCs w:val="20"/>
+          <w:sz w:val="22"/>
+          <w:szCs w:val="22"/>
         </w:rPr>
       </w:pPr>
       <w:bookmarkStart w:id="10" w:name="_Toc211610913"/>
@@ -5048,8 +5215,8 @@
           <w:b/>
           <w:bCs/>
           <w:color w:val="auto"/>
-          <w:sz w:val="20"/>
-          <w:szCs w:val="20"/>
+          <w:sz w:val="22"/>
+          <w:szCs w:val="22"/>
         </w:rPr>
         <w:t>Missão e Objetivos Estratégicos</w:t>
       </w:r>
@@ -5068,7 +5235,15 @@
     </w:p>
     <w:p>
       <w:r>
-        <w:t>O seu objetivo estratégico é consolidar o Porto de Sines como um hub logístico, energético e industrial de referência no Atlântico, enquanto reforça a importância dos Portos de Faro e Portimão como infraestruturas de apoio ao turismo de cruzeiros e ao transporte marítimo regional.</w:t>
+        <w:t xml:space="preserve">O seu objetivo estratégico é consolidar o Porto de Sines como um </w:t>
+      </w:r>
+      <w:proofErr w:type="spellStart"/>
+      <w:r>
+        <w:t>hub</w:t>
+      </w:r>
+      <w:proofErr w:type="spellEnd"/>
+      <w:r>
+        <w:t xml:space="preserve"> logístico, energético e industrial de referência no Atlântico, enquanto reforça a importância dos Portos de Faro e Portimão como infraestruturas de apoio ao turismo de cruzeiros e ao transporte marítimo regional.</w:t>
       </w:r>
     </w:p>
     <w:p>
@@ -5078,8 +5253,8 @@
           <w:b/>
           <w:bCs/>
           <w:color w:val="auto"/>
-          <w:sz w:val="20"/>
-          <w:szCs w:val="20"/>
+          <w:sz w:val="22"/>
+          <w:szCs w:val="22"/>
         </w:rPr>
       </w:pPr>
       <w:bookmarkStart w:id="11" w:name="_Toc211610914"/>
@@ -5088,8 +5263,8 @@
           <w:b/>
           <w:bCs/>
           <w:color w:val="auto"/>
-          <w:sz w:val="20"/>
-          <w:szCs w:val="20"/>
+          <w:sz w:val="22"/>
+          <w:szCs w:val="22"/>
         </w:rPr>
         <w:t>Porto de Sines: Papel e Infraestruturas</w:t>
       </w:r>
@@ -5112,8 +5287,8 @@
           <w:b/>
           <w:bCs/>
           <w:color w:val="auto"/>
-          <w:sz w:val="20"/>
-          <w:szCs w:val="20"/>
+          <w:sz w:val="22"/>
+          <w:szCs w:val="22"/>
         </w:rPr>
       </w:pPr>
       <w:bookmarkStart w:id="12" w:name="_Toc211610915"/>
@@ -5122,8 +5297,8 @@
           <w:b/>
           <w:bCs/>
           <w:color w:val="auto"/>
-          <w:sz w:val="20"/>
-          <w:szCs w:val="20"/>
+          <w:sz w:val="22"/>
+          <w:szCs w:val="22"/>
         </w:rPr>
         <w:t>Indicadores-chave e Atividade Recente</w:t>
       </w:r>
@@ -5693,7 +5868,15 @@
           </w:tcPr>
           <w:p>
             <w:r>
-              <w:t>Granéis Líquidos (unidade: kt)</w:t>
+              <w:t xml:space="preserve">Granéis Líquidos (unidade: </w:t>
+            </w:r>
+            <w:proofErr w:type="spellStart"/>
+            <w:r>
+              <w:t>kt</w:t>
+            </w:r>
+            <w:proofErr w:type="spellEnd"/>
+            <w:r>
+              <w:t>)</w:t>
             </w:r>
           </w:p>
         </w:tc>
@@ -5783,7 +5966,15 @@
           </w:tcPr>
           <w:p>
             <w:r>
-              <w:t>Granéis Sólidos (unidade: kt)</w:t>
+              <w:t xml:space="preserve">Granéis Sólidos (unidade: </w:t>
+            </w:r>
+            <w:proofErr w:type="spellStart"/>
+            <w:r>
+              <w:t>kt</w:t>
+            </w:r>
+            <w:proofErr w:type="spellEnd"/>
+            <w:r>
+              <w:t>)</w:t>
             </w:r>
           </w:p>
         </w:tc>
@@ -5873,7 +6064,15 @@
           </w:tcPr>
           <w:p>
             <w:r>
-              <w:t>Carga Geral Contentorizada (unidade: kt)</w:t>
+              <w:t xml:space="preserve">Carga Geral Contentorizada (unidade: </w:t>
+            </w:r>
+            <w:proofErr w:type="spellStart"/>
+            <w:r>
+              <w:t>kt</w:t>
+            </w:r>
+            <w:proofErr w:type="spellEnd"/>
+            <w:r>
+              <w:t>)</w:t>
             </w:r>
           </w:p>
         </w:tc>
@@ -5966,7 +6165,15 @@
           </w:tcPr>
           <w:p>
             <w:r>
-              <w:t>Carga Geral Fracionada (unidade: kt)</w:t>
+              <w:t xml:space="preserve">Carga Geral Fracionada (unidade: </w:t>
+            </w:r>
+            <w:proofErr w:type="spellStart"/>
+            <w:r>
+              <w:t>kt</w:t>
+            </w:r>
+            <w:proofErr w:type="spellEnd"/>
+            <w:r>
+              <w:t>)</w:t>
             </w:r>
           </w:p>
         </w:tc>
@@ -6058,8 +6265,21 @@
             <w:hideMark/>
           </w:tcPr>
           <w:p>
-            <w:r>
-              <w:t>Ro-Ro (unidade: kt)</w:t>
+            <w:proofErr w:type="spellStart"/>
+            <w:r>
+              <w:t>Ro-Ro</w:t>
+            </w:r>
+            <w:proofErr w:type="spellEnd"/>
+            <w:r>
+              <w:t xml:space="preserve"> (unidade: </w:t>
+            </w:r>
+            <w:proofErr w:type="spellStart"/>
+            <w:r>
+              <w:t>kt</w:t>
+            </w:r>
+            <w:proofErr w:type="spellEnd"/>
+            <w:r>
+              <w:t>)</w:t>
             </w:r>
           </w:p>
         </w:tc>
@@ -6177,7 +6397,15 @@
               <w:t xml:space="preserve">TOTAL Sines </w:t>
             </w:r>
             <w:r>
-              <w:t>(unidade: kt)</w:t>
+              <w:t xml:space="preserve">(unidade: </w:t>
+            </w:r>
+            <w:proofErr w:type="spellStart"/>
+            <w:r>
+              <w:t>kt</w:t>
+            </w:r>
+            <w:proofErr w:type="spellEnd"/>
+            <w:r>
+              <w:t>)</w:t>
             </w:r>
           </w:p>
         </w:tc>
@@ -6328,20 +6556,30 @@
           <w:b/>
           <w:bCs/>
           <w:color w:val="auto"/>
-          <w:sz w:val="20"/>
-          <w:szCs w:val="20"/>
-        </w:rPr>
-      </w:pPr>
-      <w:bookmarkStart w:id="13" w:name="_Toc211610916"/>
+          <w:sz w:val="22"/>
+          <w:szCs w:val="22"/>
+        </w:rPr>
+      </w:pPr>
       <w:r>
         <w:rPr>
           <w:b/>
           <w:bCs/>
           <w:color w:val="auto"/>
-          <w:sz w:val="20"/>
-          <w:szCs w:val="20"/>
-        </w:rPr>
-        <w:t>Principais Mercados e Parceiros Internacionais</w:t>
+          <w:sz w:val="22"/>
+          <w:szCs w:val="22"/>
+        </w:rPr>
+        <w:t xml:space="preserve">Principais </w:t>
+      </w:r>
+      <w:bookmarkStart w:id="13" w:name="_Toc211610916"/>
+      <w:r>
+        <w:rPr>
+          <w:b/>
+          <w:bCs/>
+          <w:color w:val="auto"/>
+          <w:sz w:val="22"/>
+          <w:szCs w:val="22"/>
+        </w:rPr>
+        <w:t>Mercados e Parceiros Internacionais</w:t>
       </w:r>
       <w:bookmarkEnd w:id="13"/>
     </w:p>
@@ -6462,7 +6700,23 @@
         <w:t>:</w:t>
       </w:r>
       <w:r>
-        <w:t xml:space="preserve"> exportação de animais vivos para Israel, pellets de madeira para França e Reino Unido, e sílica para Espanha, além de transhipment de pás eólicas e receção de gesso e ureia.</w:t>
+        <w:t xml:space="preserve"> exportação de animais vivos para Israel, </w:t>
+      </w:r>
+      <w:proofErr w:type="spellStart"/>
+      <w:r>
+        <w:t>pellets</w:t>
+      </w:r>
+      <w:proofErr w:type="spellEnd"/>
+      <w:r>
+        <w:t xml:space="preserve"> de madeira para França e Reino Unido, e sílica para Espanha, além de </w:t>
+      </w:r>
+      <w:proofErr w:type="spellStart"/>
+      <w:r>
+        <w:t>transhipment</w:t>
+      </w:r>
+      <w:proofErr w:type="spellEnd"/>
+      <w:r>
+        <w:t xml:space="preserve"> de pás eólicas e receção de gesso e ureia.</w:t>
       </w:r>
     </w:p>
     <w:p>
@@ -6532,7 +6786,7 @@
           <w:noProof/>
         </w:rPr>
         <w:drawing>
-          <wp:inline distT="0" distB="0" distL="0" distR="0" wp14:anchorId="68B4EA67" wp14:editId="6EF6FCFF">
+          <wp:inline distT="0" distB="0" distL="0" distR="0" wp14:anchorId="68B4EA67" wp14:editId="63682785">
             <wp:extent cx="5226685" cy="3020060"/>
             <wp:effectExtent l="19050" t="19050" r="12065" b="27940"/>
             <wp:docPr id="1965649793" name="Imagem 6" descr="Uma imagem com texto, mapa, captura de ecrã, diagrama&#10;&#10;Os conteúdos gerados por IA podem estar incorretos."/>
@@ -6591,6 +6845,7 @@
           <w:color w:val="auto"/>
         </w:rPr>
       </w:pPr>
+      <w:bookmarkStart w:id="14" w:name="_Toc211611355"/>
       <w:r>
         <w:rPr>
           <w:color w:val="auto"/>
@@ -6646,6 +6901,7 @@
         </w:rPr>
         <w:t>Serviços regulares de carga contentorizada do Terminal XXI</w:t>
       </w:r>
+      <w:bookmarkEnd w:id="14"/>
     </w:p>
     <w:p/>
     <w:p>
@@ -6653,7 +6909,15 @@
         <w:spacing w:after="0" w:line="360" w:lineRule="auto"/>
       </w:pPr>
       <w:r>
-        <w:t>O Porto Comercial de Faro tem uma utilização pontual, enquanto o Porto de Portimão foca-se no setor de cruzeiros, recebendo navios de passageiros provenientes de portos como Lisboa, Funchal, Vigo, Cádiz e Gibraltar.</w:t>
+        <w:t xml:space="preserve">O Porto Comercial de Faro tem uma utilização pontual, enquanto o Porto de Portimão foca-se no setor de cruzeiros, recebendo navios de passageiros provenientes de portos como Lisboa, Funchal, Vigo, </w:t>
+      </w:r>
+      <w:proofErr w:type="spellStart"/>
+      <w:r>
+        <w:t>Cádiz</w:t>
+      </w:r>
+      <w:proofErr w:type="spellEnd"/>
+      <w:r>
+        <w:t xml:space="preserve"> e Gibraltar.</w:t>
       </w:r>
     </w:p>
     <w:p>
@@ -6661,7 +6925,15 @@
         <w:spacing w:after="0" w:line="360" w:lineRule="auto"/>
       </w:pPr>
       <w:r>
-        <w:t>Estes dados reforçam a relevância estratégica da APS na economia nacional, como principal hub logístico e energético português, com forte integração nos mercados internacionais.</w:t>
+        <w:t xml:space="preserve">Estes dados reforçam a relevância estratégica da APS na economia nacional, como principal </w:t>
+      </w:r>
+      <w:proofErr w:type="spellStart"/>
+      <w:r>
+        <w:t>hub</w:t>
+      </w:r>
+      <w:proofErr w:type="spellEnd"/>
+      <w:r>
+        <w:t xml:space="preserve"> logístico e energético português, com forte integração nos mercados internacionais.</w:t>
       </w:r>
     </w:p>
     <w:p/>
@@ -6670,11 +6942,11 @@
       <w:pPr>
         <w:pStyle w:val="Ttulo2"/>
       </w:pPr>
-      <w:bookmarkStart w:id="14" w:name="_Toc211610917"/>
+      <w:bookmarkStart w:id="15" w:name="_Toc211610917"/>
       <w:r>
         <w:t>I.2 Fontes de informação</w:t>
       </w:r>
-      <w:bookmarkEnd w:id="14"/>
+      <w:bookmarkEnd w:id="15"/>
     </w:p>
     <w:p>
       <w:pPr>
@@ -6690,7 +6962,7 @@
           <w:szCs w:val="22"/>
         </w:rPr>
       </w:pPr>
-      <w:bookmarkStart w:id="15" w:name="_Toc211610918"/>
+      <w:bookmarkStart w:id="16" w:name="_Toc211610918"/>
       <w:r>
         <w:lastRenderedPageBreak/>
         <w:t xml:space="preserve">Parte II – </w:t>
@@ -6698,17 +6970,17 @@
       <w:r>
         <w:t>Desenvolvimento</w:t>
       </w:r>
-      <w:bookmarkEnd w:id="15"/>
+      <w:bookmarkEnd w:id="16"/>
     </w:p>
     <w:p>
       <w:pPr>
         <w:pStyle w:val="Ttulo2"/>
       </w:pPr>
-      <w:bookmarkStart w:id="16" w:name="_Toc211610919"/>
+      <w:bookmarkStart w:id="17" w:name="_Toc211610919"/>
       <w:r>
         <w:t>II.1 Organização</w:t>
       </w:r>
-      <w:bookmarkEnd w:id="16"/>
+      <w:bookmarkEnd w:id="17"/>
       <w:r>
         <w:t xml:space="preserve"> </w:t>
       </w:r>
@@ -6720,22 +6992,22 @@
           <w:b/>
           <w:bCs/>
           <w:color w:val="auto"/>
-          <w:sz w:val="20"/>
-          <w:szCs w:val="20"/>
-        </w:rPr>
-      </w:pPr>
-      <w:bookmarkStart w:id="17" w:name="_Toc211610920"/>
+          <w:sz w:val="22"/>
+          <w:szCs w:val="22"/>
+        </w:rPr>
+      </w:pPr>
+      <w:bookmarkStart w:id="18" w:name="_Toc211610920"/>
       <w:r>
         <w:rPr>
           <w:b/>
           <w:bCs/>
           <w:color w:val="auto"/>
-          <w:sz w:val="20"/>
-          <w:szCs w:val="20"/>
+          <w:sz w:val="22"/>
+          <w:szCs w:val="22"/>
         </w:rPr>
         <w:t>Estrutura organizacional</w:t>
       </w:r>
-      <w:bookmarkEnd w:id="17"/>
+      <w:bookmarkEnd w:id="18"/>
     </w:p>
     <w:p>
       <w:r>
@@ -6874,7 +7146,7 @@
           <w:color w:val="auto"/>
         </w:rPr>
       </w:pPr>
-      <w:bookmarkStart w:id="18" w:name="_Toc211605331"/>
+      <w:bookmarkStart w:id="19" w:name="_Toc211611356"/>
       <w:r>
         <w:rPr>
           <w:color w:val="auto"/>
@@ -6918,7 +7190,7 @@
         </w:rPr>
         <w:t xml:space="preserve"> - Estrutura Organizacional</w:t>
       </w:r>
-      <w:bookmarkEnd w:id="18"/>
+      <w:bookmarkEnd w:id="19"/>
     </w:p>
     <w:p>
       <w:r>
@@ -6957,35 +7229,27 @@
     </w:p>
     <w:p>
       <w:pPr>
+        <w:pStyle w:val="Ttulo3"/>
         <w:rPr>
           <w:b/>
           <w:bCs/>
-        </w:rPr>
-      </w:pPr>
-    </w:p>
-    <w:p>
-      <w:pPr>
-        <w:pStyle w:val="Ttulo3"/>
+          <w:color w:val="auto"/>
+          <w:sz w:val="22"/>
+          <w:szCs w:val="22"/>
+        </w:rPr>
+      </w:pPr>
+      <w:bookmarkStart w:id="20" w:name="_Toc211610921"/>
+      <w:r>
         <w:rPr>
           <w:b/>
           <w:bCs/>
           <w:color w:val="auto"/>
-          <w:sz w:val="20"/>
-          <w:szCs w:val="20"/>
-        </w:rPr>
-      </w:pPr>
-      <w:bookmarkStart w:id="19" w:name="_Toc211610921"/>
-      <w:r>
-        <w:rPr>
-          <w:b/>
-          <w:bCs/>
-          <w:color w:val="auto"/>
-          <w:sz w:val="20"/>
-          <w:szCs w:val="20"/>
+          <w:sz w:val="22"/>
+          <w:szCs w:val="22"/>
         </w:rPr>
         <w:t>Proposta de melhoria</w:t>
       </w:r>
-      <w:bookmarkEnd w:id="19"/>
+      <w:bookmarkEnd w:id="20"/>
     </w:p>
     <w:p>
       <w:r>
@@ -7042,15 +7306,15 @@
         <w:rPr>
           <w:u w:val="single"/>
         </w:rPr>
+        <w:t>Impacto esperado:</w:t>
+      </w:r>
+      <w:r>
+        <w:t xml:space="preserve"> Maior coerência entre os sistemas tecnológicos, aumento da eficiência dos fluxos informacionais e suporte direto à inovação portuária.</w:t>
+      </w:r>
+    </w:p>
+    <w:p>
+      <w:r>
         <w:lastRenderedPageBreak/>
-        <w:t>Impacto esperado:</w:t>
-      </w:r>
-      <w:r>
-        <w:t xml:space="preserve"> Maior coerência entre os sistemas tecnológicos, aumento da eficiência dos fluxos informacionais e suporte direto à inovação portuária.</w:t>
-      </w:r>
-    </w:p>
-    <w:p>
-      <w:r>
         <w:t>2. Descentralização controlada da tomada de decisão operacional</w:t>
       </w:r>
     </w:p>
@@ -7118,7 +7382,16 @@
         </w:numPr>
       </w:pPr>
       <w:r>
-        <w:t>Justificação: A crescente exigência de relatórios de desempenho ambiental e indicadores logísticos requer competências analíticas avançadas.</w:t>
+        <w:rPr>
+          <w:u w:val="single"/>
+        </w:rPr>
+        <w:t>Justificação:</w:t>
+      </w:r>
+      <w:r>
+        <w:t xml:space="preserve"> </w:t>
+      </w:r>
+      <w:r>
+        <w:t>A crescente exigência de relatórios de desempenho ambiental e indicadores logísticos requer competências analíticas avançadas.</w:t>
       </w:r>
     </w:p>
     <w:p>
@@ -7129,7 +7402,13 @@
         </w:numPr>
       </w:pPr>
       <w:r>
-        <w:t>Ação recomendada: Recrutamento de analistas de dados e especialistas em ESG</w:t>
+        <w:rPr>
+          <w:u w:val="single"/>
+        </w:rPr>
+        <w:t>Ação recomendada:</w:t>
+      </w:r>
+      <w:r>
+        <w:t xml:space="preserve"> Recrutamento de analistas de dados e especialistas em ESG</w:t>
       </w:r>
       <w:r>
         <w:t>.</w:t>
@@ -7143,7 +7422,13 @@
         </w:numPr>
       </w:pPr>
       <w:r>
-        <w:t>Impacto esperado: Melhoria da qualidade da informação estratégica e fortalecimento da reputação institucional.</w:t>
+        <w:rPr>
+          <w:u w:val="single"/>
+        </w:rPr>
+        <w:t>Impacto esperado:</w:t>
+      </w:r>
+      <w:r>
+        <w:t xml:space="preserve"> Melhoria da qualidade da informação estratégica e fortalecimento da reputação institucional.</w:t>
       </w:r>
     </w:p>
     <w:p>
@@ -7219,11 +7504,11 @@
       <w:pPr>
         <w:pStyle w:val="Ttulo2"/>
       </w:pPr>
-      <w:bookmarkStart w:id="20" w:name="_Toc211610922"/>
+      <w:bookmarkStart w:id="21" w:name="_Toc211610922"/>
       <w:r>
         <w:t>II.2 Planeamento</w:t>
       </w:r>
-      <w:bookmarkEnd w:id="20"/>
+      <w:bookmarkEnd w:id="21"/>
     </w:p>
     <w:p>
       <w:r>
@@ -7231,17 +7516,16 @@
       </w:r>
       <w:r>
         <w:br/>
+        <w:t>Este planeamento define como eixos estruturantes a expansão e modernização das infraestruturas portuárias, o reforço da eficiência logística, a sustentabilidade ambiental e a inovação tecnológica.</w:t>
+      </w:r>
+      <w:r>
+        <w:br/>
       </w:r>
       <w:r>
         <w:lastRenderedPageBreak/>
-        <w:t>Este planeamento define como eixos estruturantes a expansão e modernização das infraestruturas portuárias, o reforço da eficiência logística, a sustentabilidade ambiental e a inovação tecnológica.</w:t>
-      </w:r>
-      <w:r>
-        <w:br/>
         <w:t>A APS procura integrar estes pilares através de investimentos em projetos como a ampliação do Terminal XXI, a criação do novo Terminal Vasco da Gama e a implementação de sistemas digitais integrados de gestão portuária, reforçando a sua posição como plataforma logística estratégica para o comércio atlântico e ibérico.</w:t>
       </w:r>
     </w:p>
-    <w:p/>
     <w:p>
       <w:pPr>
         <w:pStyle w:val="Ttulo3"/>
@@ -7249,32 +7533,22 @@
           <w:b/>
           <w:bCs/>
           <w:color w:val="000000" w:themeColor="text1"/>
-          <w:sz w:val="20"/>
-          <w:szCs w:val="20"/>
-        </w:rPr>
-      </w:pPr>
-      <w:bookmarkStart w:id="21" w:name="_Toc211610923"/>
+          <w:sz w:val="22"/>
+          <w:szCs w:val="22"/>
+        </w:rPr>
+      </w:pPr>
+      <w:bookmarkStart w:id="22" w:name="_Toc211610923"/>
       <w:r>
         <w:rPr>
           <w:b/>
           <w:bCs/>
           <w:color w:val="000000" w:themeColor="text1"/>
-          <w:sz w:val="20"/>
-          <w:szCs w:val="20"/>
-        </w:rPr>
-        <w:t>Objetivos SMAR</w:t>
-      </w:r>
-      <w:r>
-        <w:rPr>
-          <w:b/>
-          <w:bCs/>
-          <w:color w:val="000000" w:themeColor="text1"/>
-          <w:sz w:val="20"/>
-          <w:szCs w:val="20"/>
-        </w:rPr>
-        <w:t>T</w:t>
-      </w:r>
-      <w:bookmarkEnd w:id="21"/>
+          <w:sz w:val="22"/>
+          <w:szCs w:val="22"/>
+        </w:rPr>
+        <w:t>Objetivos SMART</w:t>
+      </w:r>
+      <w:bookmarkEnd w:id="22"/>
     </w:p>
     <w:tbl>
       <w:tblPr>
@@ -7438,7 +7712,15 @@
           </w:tcPr>
           <w:p>
             <w:r>
-              <w:t>Reforçar o papel do Porto de Sines como hub logístico e energético do Atlântico.</w:t>
+              <w:t xml:space="preserve">Reforçar o papel do Porto de Sines como </w:t>
+            </w:r>
+            <w:proofErr w:type="spellStart"/>
+            <w:r>
+              <w:t>hub</w:t>
+            </w:r>
+            <w:proofErr w:type="spellEnd"/>
+            <w:r>
+              <w:t xml:space="preserve"> logístico e energético do Atlântico.</w:t>
             </w:r>
           </w:p>
         </w:tc>
@@ -7580,22 +7862,22 @@
           <w:b/>
           <w:bCs/>
           <w:color w:val="000000" w:themeColor="text1"/>
-          <w:sz w:val="20"/>
-          <w:szCs w:val="20"/>
-        </w:rPr>
-      </w:pPr>
-      <w:bookmarkStart w:id="22" w:name="_Toc211610924"/>
+          <w:sz w:val="22"/>
+          <w:szCs w:val="22"/>
+        </w:rPr>
+      </w:pPr>
+      <w:bookmarkStart w:id="23" w:name="_Toc211610924"/>
       <w:r>
         <w:rPr>
           <w:b/>
           <w:bCs/>
           <w:color w:val="000000" w:themeColor="text1"/>
-          <w:sz w:val="20"/>
-          <w:szCs w:val="20"/>
+          <w:sz w:val="22"/>
+          <w:szCs w:val="22"/>
         </w:rPr>
         <w:t>Análise SWOT</w:t>
       </w:r>
-      <w:bookmarkEnd w:id="22"/>
+      <w:bookmarkEnd w:id="23"/>
     </w:p>
     <w:p>
       <w:r>
@@ -7618,7 +7900,7 @@
       <w:tr>
         <w:tc>
           <w:tcPr>
-            <w:tcW w:w="2337" w:type="dxa"/>
+            <w:tcW w:w="2335" w:type="dxa"/>
             <w:vMerge w:val="restart"/>
             <w:tcBorders>
               <w:top w:val="single" w:sz="12" w:space="0" w:color="auto"/>
@@ -7648,7 +7930,7 @@
         </w:tc>
         <w:tc>
           <w:tcPr>
-            <w:tcW w:w="7013" w:type="dxa"/>
+            <w:tcW w:w="6995" w:type="dxa"/>
             <w:tcBorders>
               <w:top w:val="single" w:sz="12" w:space="0" w:color="auto"/>
               <w:left w:val="single" w:sz="12" w:space="0" w:color="auto"/>
@@ -7665,7 +7947,7 @@
       <w:tr>
         <w:tc>
           <w:tcPr>
-            <w:tcW w:w="2337" w:type="dxa"/>
+            <w:tcW w:w="2335" w:type="dxa"/>
             <w:vMerge/>
             <w:tcBorders>
               <w:left w:val="single" w:sz="12" w:space="0" w:color="auto"/>
@@ -7687,7 +7969,7 @@
         </w:tc>
         <w:tc>
           <w:tcPr>
-            <w:tcW w:w="7013" w:type="dxa"/>
+            <w:tcW w:w="6995" w:type="dxa"/>
             <w:tcBorders>
               <w:left w:val="single" w:sz="12" w:space="0" w:color="auto"/>
               <w:right w:val="single" w:sz="12" w:space="0" w:color="auto"/>
@@ -7703,7 +7985,7 @@
       <w:tr>
         <w:tc>
           <w:tcPr>
-            <w:tcW w:w="2337" w:type="dxa"/>
+            <w:tcW w:w="2335" w:type="dxa"/>
             <w:vMerge/>
             <w:tcBorders>
               <w:left w:val="single" w:sz="12" w:space="0" w:color="auto"/>
@@ -7726,7 +8008,7 @@
         </w:tc>
         <w:tc>
           <w:tcPr>
-            <w:tcW w:w="7013" w:type="dxa"/>
+            <w:tcW w:w="6995" w:type="dxa"/>
             <w:tcBorders>
               <w:left w:val="single" w:sz="12" w:space="0" w:color="auto"/>
               <w:bottom w:val="single" w:sz="12" w:space="0" w:color="auto"/>
@@ -7743,7 +8025,7 @@
       <w:tr>
         <w:tc>
           <w:tcPr>
-            <w:tcW w:w="2337" w:type="dxa"/>
+            <w:tcW w:w="2335" w:type="dxa"/>
             <w:vMerge w:val="restart"/>
             <w:tcBorders>
               <w:top w:val="single" w:sz="12" w:space="0" w:color="auto"/>
@@ -7775,7 +8057,7 @@
         </w:tc>
         <w:tc>
           <w:tcPr>
-            <w:tcW w:w="7013" w:type="dxa"/>
+            <w:tcW w:w="6995" w:type="dxa"/>
             <w:tcBorders>
               <w:top w:val="single" w:sz="12" w:space="0" w:color="auto"/>
               <w:left w:val="single" w:sz="12" w:space="0" w:color="auto"/>
@@ -7795,7 +8077,7 @@
         </w:trPr>
         <w:tc>
           <w:tcPr>
-            <w:tcW w:w="2337" w:type="dxa"/>
+            <w:tcW w:w="2335" w:type="dxa"/>
             <w:vMerge/>
             <w:tcBorders>
               <w:left w:val="single" w:sz="12" w:space="0" w:color="auto"/>
@@ -7817,7 +8099,7 @@
         </w:tc>
         <w:tc>
           <w:tcPr>
-            <w:tcW w:w="7013" w:type="dxa"/>
+            <w:tcW w:w="6995" w:type="dxa"/>
             <w:tcBorders>
               <w:left w:val="single" w:sz="12" w:space="0" w:color="auto"/>
               <w:right w:val="single" w:sz="12" w:space="0" w:color="auto"/>
@@ -7833,7 +8115,7 @@
       <w:tr>
         <w:tc>
           <w:tcPr>
-            <w:tcW w:w="2337" w:type="dxa"/>
+            <w:tcW w:w="2335" w:type="dxa"/>
             <w:vMerge/>
             <w:tcBorders>
               <w:left w:val="single" w:sz="12" w:space="0" w:color="auto"/>
@@ -7856,7 +8138,7 @@
         </w:tc>
         <w:tc>
           <w:tcPr>
-            <w:tcW w:w="7013" w:type="dxa"/>
+            <w:tcW w:w="6995" w:type="dxa"/>
             <w:tcBorders>
               <w:left w:val="single" w:sz="12" w:space="0" w:color="auto"/>
               <w:bottom w:val="single" w:sz="12" w:space="0" w:color="auto"/>
@@ -7873,7 +8155,7 @@
       <w:tr>
         <w:tc>
           <w:tcPr>
-            <w:tcW w:w="2337" w:type="dxa"/>
+            <w:tcW w:w="2335" w:type="dxa"/>
             <w:tcBorders>
               <w:top w:val="single" w:sz="12" w:space="0" w:color="auto"/>
               <w:left w:val="single" w:sz="12" w:space="0" w:color="auto"/>
@@ -7905,7 +8187,7 @@
         </w:tc>
         <w:tc>
           <w:tcPr>
-            <w:tcW w:w="7013" w:type="dxa"/>
+            <w:tcW w:w="6995" w:type="dxa"/>
             <w:tcBorders>
               <w:top w:val="single" w:sz="12" w:space="0" w:color="auto"/>
               <w:left w:val="single" w:sz="12" w:space="0" w:color="auto"/>
@@ -7915,7 +8197,15 @@
           </w:tcPr>
           <w:p>
             <w:r>
-              <w:t>Expansão dos terminais, utilização de energias verdes, automação portuária e reforço da ligação ferroviária ao hinterland ibérico.</w:t>
+              <w:t xml:space="preserve">Expansão dos terminais, utilização de energias verdes, automação portuária e reforço da ligação ferroviária ao </w:t>
+            </w:r>
+            <w:proofErr w:type="spellStart"/>
+            <w:r>
+              <w:t>hinterland</w:t>
+            </w:r>
+            <w:proofErr w:type="spellEnd"/>
+            <w:r>
+              <w:t xml:space="preserve"> ibérico.</w:t>
             </w:r>
           </w:p>
         </w:tc>
@@ -7923,7 +8213,7 @@
       <w:tr>
         <w:tc>
           <w:tcPr>
-            <w:tcW w:w="2337" w:type="dxa"/>
+            <w:tcW w:w="2335" w:type="dxa"/>
             <w:tcBorders>
               <w:top w:val="single" w:sz="12" w:space="0" w:color="auto"/>
               <w:left w:val="single" w:sz="12" w:space="0" w:color="auto"/>
@@ -7955,7 +8245,7 @@
         </w:tc>
         <w:tc>
           <w:tcPr>
-            <w:tcW w:w="7013" w:type="dxa"/>
+            <w:tcW w:w="6995" w:type="dxa"/>
             <w:tcBorders>
               <w:top w:val="single" w:sz="12" w:space="0" w:color="auto"/>
               <w:left w:val="single" w:sz="12" w:space="0" w:color="auto"/>
@@ -7978,12 +8268,16 @@
           <w:b/>
           <w:bCs/>
           <w:color w:val="000000" w:themeColor="text1"/>
-          <w:sz w:val="20"/>
-          <w:szCs w:val="20"/>
-        </w:rPr>
-      </w:pPr>
-      <w:bookmarkStart w:id="23" w:name="_Toc211610925"/>
-      <w:r>
+          <w:sz w:val="22"/>
+          <w:szCs w:val="22"/>
+        </w:rPr>
+      </w:pPr>
+      <w:bookmarkStart w:id="24" w:name="_Toc211610925"/>
+    </w:p>
+    <w:p/>
+    <w:p>
+      <w:pPr>
+        <w:pStyle w:val="Ttulo3"/>
         <w:rPr>
           <w:b/>
           <w:bCs/>
@@ -7991,50 +8285,19 @@
           <w:sz w:val="20"/>
           <w:szCs w:val="20"/>
         </w:rPr>
-        <w:lastRenderedPageBreak/>
-        <w:t xml:space="preserve">Propostas </w:t>
-      </w:r>
+      </w:pPr>
       <w:r>
         <w:rPr>
           <w:b/>
           <w:bCs/>
           <w:color w:val="000000" w:themeColor="text1"/>
-          <w:sz w:val="20"/>
-          <w:szCs w:val="20"/>
-        </w:rPr>
-        <w:t>E</w:t>
-      </w:r>
-      <w:r>
-        <w:rPr>
-          <w:b/>
-          <w:bCs/>
-          <w:color w:val="000000" w:themeColor="text1"/>
-          <w:sz w:val="20"/>
-          <w:szCs w:val="20"/>
-        </w:rPr>
-        <w:t>stratégic</w:t>
-      </w:r>
-      <w:r>
-        <w:rPr>
-          <w:b/>
-          <w:bCs/>
-          <w:color w:val="000000" w:themeColor="text1"/>
-          <w:sz w:val="20"/>
-          <w:szCs w:val="20"/>
-        </w:rPr>
-        <w:t xml:space="preserve">a 1 - </w:t>
-      </w:r>
-      <w:r>
-        <w:rPr>
-          <w:b/>
-          <w:bCs/>
-          <w:color w:val="000000" w:themeColor="text1"/>
-          <w:sz w:val="20"/>
-          <w:szCs w:val="20"/>
-        </w:rPr>
-        <w:t>Sustentabilidade e Eficiência Energética</w:t>
-      </w:r>
-      <w:bookmarkEnd w:id="23"/>
+          <w:sz w:val="22"/>
+          <w:szCs w:val="22"/>
+        </w:rPr>
+        <w:lastRenderedPageBreak/>
+        <w:t>Propostas Estratégica 1 - Sustentabilidade e Eficiência Energética</w:t>
+      </w:r>
+      <w:bookmarkEnd w:id="24"/>
     </w:p>
     <w:p>
       <w:pPr>
@@ -8064,7 +8327,6 @@
         <w:t>Reforçar a sustentabilidade ambiental e a eficiência energética nos portos sob administração da APS, promovendo operações portuárias com menores emissões e maior responsabilidade ambiental até 2030.</w:t>
       </w:r>
     </w:p>
-    <w:p/>
     <w:p>
       <w:pPr>
         <w:pStyle w:val="PargrafodaLista"/>
@@ -8141,7 +8403,6 @@
         <w:t>Além disso, reforça o compromisso da APS com os Objetivos de Desenvolvimento Sustentável e com a Estratégia Nacional para o Mar 2030, consolidando a sua imagem de porto sustentável e competitivo.</w:t>
       </w:r>
     </w:p>
-    <w:p/>
     <w:p>
       <w:pPr>
         <w:pStyle w:val="PargrafodaLista"/>
@@ -8194,11 +8455,6 @@
       <w:r>
         <w:t>Aumentar a produção e utilização de energia proveniente de fontes renováveis nas áreas portuárias.</w:t>
       </w:r>
-    </w:p>
-    <w:p>
-      <w:pPr>
-        <w:ind w:left="360"/>
-      </w:pPr>
     </w:p>
     <w:p>
       <w:pPr>
@@ -8378,7 +8634,6 @@
           </w:tcPr>
           <w:p>
             <w:r>
-              <w:lastRenderedPageBreak/>
               <w:t>1.2. Modernizar a iluminação portuária com tecnologia LED inteligente</w:t>
             </w:r>
           </w:p>
@@ -8437,7 +8692,23 @@
           </w:tcPr>
           <w:p>
             <w:r>
-              <w:t>Desenvolvimento de sistema IoT e dashboard analítico</w:t>
+              <w:t xml:space="preserve">Desenvolvimento de sistema </w:t>
+            </w:r>
+            <w:proofErr w:type="spellStart"/>
+            <w:r>
+              <w:t>IoT</w:t>
+            </w:r>
+            <w:proofErr w:type="spellEnd"/>
+            <w:r>
+              <w:t xml:space="preserve"> e </w:t>
+            </w:r>
+            <w:proofErr w:type="spellStart"/>
+            <w:r>
+              <w:t>dashboard</w:t>
+            </w:r>
+            <w:proofErr w:type="spellEnd"/>
+            <w:r>
+              <w:t xml:space="preserve"> analítico</w:t>
             </w:r>
           </w:p>
         </w:tc>
@@ -8468,6 +8739,7 @@
           </w:tcPr>
           <w:p>
             <w:r>
+              <w:lastRenderedPageBreak/>
               <w:t>3.1. Estabelecer parcerias com empresas de energia verde</w:t>
             </w:r>
           </w:p>
@@ -8506,14 +8778,6 @@
     </w:tbl>
     <w:p>
       <w:pPr>
-        <w:rPr>
-          <w:b/>
-          <w:bCs/>
-        </w:rPr>
-      </w:pPr>
-    </w:p>
-    <w:p>
-      <w:pPr>
         <w:pStyle w:val="PargrafodaLista"/>
         <w:numPr>
           <w:ilvl w:val="0"/>
@@ -8557,7 +8821,6 @@
       </w:r>
     </w:p>
     <w:p/>
-    <w:p/>
     <w:p>
       <w:pPr>
         <w:pStyle w:val="Ttulo3"/>
@@ -8565,62 +8828,22 @@
           <w:b/>
           <w:bCs/>
           <w:color w:val="000000" w:themeColor="text1"/>
-          <w:sz w:val="20"/>
-          <w:szCs w:val="20"/>
-        </w:rPr>
-      </w:pPr>
-      <w:bookmarkStart w:id="24" w:name="_Toc211610926"/>
+          <w:sz w:val="22"/>
+          <w:szCs w:val="22"/>
+        </w:rPr>
+      </w:pPr>
+      <w:bookmarkStart w:id="25" w:name="_Toc211610926"/>
       <w:r>
         <w:rPr>
           <w:b/>
           <w:bCs/>
           <w:color w:val="000000" w:themeColor="text1"/>
-          <w:sz w:val="20"/>
-          <w:szCs w:val="20"/>
-        </w:rPr>
-        <w:t xml:space="preserve">Propostas </w:t>
-      </w:r>
-      <w:r>
-        <w:rPr>
-          <w:b/>
-          <w:bCs/>
-          <w:color w:val="000000" w:themeColor="text1"/>
-          <w:sz w:val="20"/>
-          <w:szCs w:val="20"/>
-        </w:rPr>
-        <w:t>E</w:t>
-      </w:r>
-      <w:r>
-        <w:rPr>
-          <w:b/>
-          <w:bCs/>
-          <w:color w:val="000000" w:themeColor="text1"/>
-          <w:sz w:val="20"/>
-          <w:szCs w:val="20"/>
-        </w:rPr>
-        <w:t>stratégic</w:t>
-      </w:r>
-      <w:r>
-        <w:rPr>
-          <w:b/>
-          <w:bCs/>
-          <w:color w:val="000000" w:themeColor="text1"/>
-          <w:sz w:val="20"/>
-          <w:szCs w:val="20"/>
-        </w:rPr>
-        <w:t xml:space="preserve">a 2 - </w:t>
-      </w:r>
-      <w:r>
-        <w:rPr>
-          <w:b/>
-          <w:bCs/>
-          <w:color w:val="000000" w:themeColor="text1"/>
-          <w:sz w:val="20"/>
-          <w:szCs w:val="20"/>
-        </w:rPr>
-        <w:t>Transformação Digital e Inovação Tecnológica</w:t>
-      </w:r>
-      <w:bookmarkEnd w:id="24"/>
+          <w:sz w:val="22"/>
+          <w:szCs w:val="22"/>
+        </w:rPr>
+        <w:t>Propostas Estratégica 2 - Transformação Digital e Inovação Tecnológica</w:t>
+      </w:r>
+      <w:bookmarkEnd w:id="25"/>
     </w:p>
     <w:p>
       <w:pPr>
@@ -8652,11 +8875,6 @@
     </w:p>
     <w:p>
       <w:pPr>
-        <w:ind w:left="360"/>
-      </w:pPr>
-    </w:p>
-    <w:p>
-      <w:pPr>
         <w:pStyle w:val="PargrafodaLista"/>
         <w:numPr>
           <w:ilvl w:val="0"/>
@@ -8728,10 +8946,25 @@
         <w:ind w:left="360"/>
       </w:pPr>
       <w:r>
-        <w:t>A digitalização é uma prioridade tanto para a Estratégia Nacional para o Mar 2030 como para a agenda europeia dos Smart Ports, permitindo maior integração logística e competitividade.</w:t>
-      </w:r>
-    </w:p>
-    <w:p/>
+        <w:t xml:space="preserve">A digitalização é uma prioridade tanto para a Estratégia Nacional para o Mar 2030 como para a agenda europeia dos </w:t>
+      </w:r>
+      <w:proofErr w:type="spellStart"/>
+      <w:r>
+        <w:t>Smart</w:t>
+      </w:r>
+      <w:proofErr w:type="spellEnd"/>
+      <w:r>
+        <w:t xml:space="preserve"> </w:t>
+      </w:r>
+      <w:proofErr w:type="spellStart"/>
+      <w:r>
+        <w:t>Ports</w:t>
+      </w:r>
+      <w:proofErr w:type="spellEnd"/>
+      <w:r>
+        <w:t>, permitindo maior integração logística e competitividade.</w:t>
+      </w:r>
+    </w:p>
     <w:p>
       <w:pPr>
         <w:pStyle w:val="PargrafodaLista"/>
@@ -8757,7 +8990,6 @@
         <w:ind w:left="360"/>
       </w:pPr>
       <w:r>
-        <w:lastRenderedPageBreak/>
         <w:t xml:space="preserve">1. </w:t>
       </w:r>
       <w:r>
@@ -8783,13 +9015,16 @@
         <w:t xml:space="preserve">3. </w:t>
       </w:r>
       <w:r>
-        <w:t>Reforçar a cibersegurança e a proteção de dados nas infraestruturas digitais da APS.</w:t>
-      </w:r>
-    </w:p>
-    <w:p>
-      <w:pPr>
-        <w:ind w:left="360"/>
-      </w:pPr>
+        <w:t xml:space="preserve">Reforçar a </w:t>
+      </w:r>
+      <w:proofErr w:type="spellStart"/>
+      <w:r>
+        <w:t>cibersegurança</w:t>
+      </w:r>
+      <w:proofErr w:type="spellEnd"/>
+      <w:r>
+        <w:t xml:space="preserve"> e a proteção de dados nas infraestruturas digitais da APS.</w:t>
+      </w:r>
     </w:p>
     <w:p>
       <w:pPr>
@@ -8926,7 +9161,15 @@
               <w:t xml:space="preserve">1.1. </w:t>
             </w:r>
             <w:r>
-              <w:t>Implementar um sistema integrado de gestão documental e workflow digita</w:t>
+              <w:t xml:space="preserve">Implementar um sistema integrado de gestão documental e </w:t>
+            </w:r>
+            <w:proofErr w:type="spellStart"/>
+            <w:r>
+              <w:t>workflow</w:t>
+            </w:r>
+            <w:proofErr w:type="spellEnd"/>
+            <w:r>
+              <w:t xml:space="preserve"> digita</w:t>
             </w:r>
             <w:r>
               <w:t>l</w:t>
@@ -8975,13 +9218,38 @@
           </w:tcPr>
           <w:p>
             <w:r>
+              <w:lastRenderedPageBreak/>
               <w:t>2.1.</w:t>
             </w:r>
             <w:r>
               <w:t xml:space="preserve"> </w:t>
             </w:r>
             <w:r>
-              <w:t>Criar plataforma interoperável de troca de dados (Port Community System)</w:t>
+              <w:t>Criar plataforma interoperável de troca de dados (</w:t>
+            </w:r>
+            <w:proofErr w:type="spellStart"/>
+            <w:r>
+              <w:t>Port</w:t>
+            </w:r>
+            <w:proofErr w:type="spellEnd"/>
+            <w:r>
+              <w:t xml:space="preserve"> </w:t>
+            </w:r>
+            <w:proofErr w:type="spellStart"/>
+            <w:r>
+              <w:t>Community</w:t>
+            </w:r>
+            <w:proofErr w:type="spellEnd"/>
+            <w:r>
+              <w:t xml:space="preserve"> </w:t>
+            </w:r>
+            <w:proofErr w:type="spellStart"/>
+            <w:r>
+              <w:t>System</w:t>
+            </w:r>
+            <w:proofErr w:type="spellEnd"/>
+            <w:r>
+              <w:t>)</w:t>
             </w:r>
           </w:p>
         </w:tc>
@@ -9009,7 +9277,15 @@
           </w:tcPr>
           <w:p>
             <w:r>
-              <w:t>Programadores, analistas de sistemas, servidores e APIs seguras</w:t>
+              <w:t xml:space="preserve">Programadores, analistas de sistemas, servidores e </w:t>
+            </w:r>
+            <w:proofErr w:type="spellStart"/>
+            <w:r>
+              <w:t>APIs</w:t>
+            </w:r>
+            <w:proofErr w:type="spellEnd"/>
+            <w:r>
+              <w:t xml:space="preserve"> seguras</w:t>
             </w:r>
           </w:p>
         </w:tc>
@@ -9026,7 +9302,15 @@
           </w:tcPr>
           <w:p>
             <w:r>
-              <w:t>3.1. Reforçar cibersegurança e boas práticas digitais</w:t>
+              <w:t xml:space="preserve">3.1. Reforçar </w:t>
+            </w:r>
+            <w:proofErr w:type="spellStart"/>
+            <w:r>
+              <w:t>cibersegurança</w:t>
+            </w:r>
+            <w:proofErr w:type="spellEnd"/>
+            <w:r>
+              <w:t xml:space="preserve"> e boas práticas digitais</w:t>
             </w:r>
           </w:p>
         </w:tc>
@@ -9064,14 +9348,6 @@
     </w:tbl>
     <w:p>
       <w:pPr>
-        <w:rPr>
-          <w:b/>
-          <w:bCs/>
-        </w:rPr>
-      </w:pPr>
-    </w:p>
-    <w:p>
-      <w:pPr>
         <w:pStyle w:val="PargrafodaLista"/>
         <w:numPr>
           <w:ilvl w:val="0"/>
@@ -9142,12 +9418,12 @@
       <w:pPr>
         <w:pStyle w:val="Ttulo2"/>
       </w:pPr>
-      <w:bookmarkStart w:id="25" w:name="_Toc211610927"/>
+      <w:bookmarkStart w:id="26" w:name="_Toc211610927"/>
       <w:r>
         <w:lastRenderedPageBreak/>
         <w:t>II.3 Controlo e Sistemas de informação</w:t>
       </w:r>
-      <w:bookmarkEnd w:id="25"/>
+      <w:bookmarkEnd w:id="26"/>
     </w:p>
     <w:p/>
     <w:p/>
@@ -9155,7 +9431,7 @@
       <w:pPr>
         <w:pStyle w:val="Ttulo2"/>
       </w:pPr>
-      <w:bookmarkStart w:id="26" w:name="_Toc211610928"/>
+      <w:bookmarkStart w:id="27" w:name="_Toc211610928"/>
       <w:r>
         <w:t>II.</w:t>
       </w:r>
@@ -9165,7 +9441,7 @@
       <w:r>
         <w:t>4 Direção e Gestão de Pessoas</w:t>
       </w:r>
-      <w:bookmarkEnd w:id="26"/>
+      <w:bookmarkEnd w:id="27"/>
     </w:p>
     <w:p/>
     <w:p/>
@@ -9173,11 +9449,11 @@
       <w:pPr>
         <w:pStyle w:val="Ttulo2"/>
       </w:pPr>
-      <w:bookmarkStart w:id="27" w:name="_Toc211610929"/>
+      <w:bookmarkStart w:id="28" w:name="_Toc211610929"/>
       <w:r>
         <w:t>II.5 Promoção da produtividade</w:t>
       </w:r>
-      <w:bookmarkEnd w:id="27"/>
+      <w:bookmarkEnd w:id="28"/>
     </w:p>
     <w:p/>
     <w:p/>
@@ -9185,11 +9461,11 @@
       <w:pPr>
         <w:pStyle w:val="Ttulo2"/>
       </w:pPr>
-      <w:bookmarkStart w:id="28" w:name="_Toc211610930"/>
+      <w:bookmarkStart w:id="29" w:name="_Toc211610930"/>
       <w:r>
         <w:t>II.6 Economia circular</w:t>
       </w:r>
-      <w:bookmarkEnd w:id="28"/>
+      <w:bookmarkEnd w:id="29"/>
     </w:p>
     <w:p/>
     <w:p/>
@@ -9197,14 +9473,14 @@
       <w:pPr>
         <w:pStyle w:val="Ttulo2"/>
       </w:pPr>
-      <w:bookmarkStart w:id="29" w:name="_Toc211610931"/>
+      <w:bookmarkStart w:id="30" w:name="_Toc211610931"/>
       <w:r>
         <w:t xml:space="preserve">II.7 </w:t>
       </w:r>
       <w:r>
         <w:t>Marketing</w:t>
       </w:r>
-      <w:bookmarkEnd w:id="29"/>
+      <w:bookmarkEnd w:id="30"/>
     </w:p>
     <w:p/>
     <w:p/>
@@ -9212,7 +9488,7 @@
       <w:pPr>
         <w:pStyle w:val="Ttulo2"/>
       </w:pPr>
-      <w:bookmarkStart w:id="30" w:name="_Toc211610932"/>
+      <w:bookmarkStart w:id="31" w:name="_Toc211610932"/>
       <w:r>
         <w:t>II.</w:t>
       </w:r>
@@ -9222,7 +9498,7 @@
       <w:r>
         <w:t>8 Gestão Financeira</w:t>
       </w:r>
-      <w:bookmarkEnd w:id="30"/>
+      <w:bookmarkEnd w:id="31"/>
     </w:p>
     <w:p/>
     <w:p/>
@@ -9230,11 +9506,11 @@
       <w:pPr>
         <w:pStyle w:val="Ttulo2"/>
       </w:pPr>
-      <w:bookmarkStart w:id="31" w:name="_Toc211610933"/>
+      <w:bookmarkStart w:id="32" w:name="_Toc211610933"/>
       <w:r>
         <w:t>II.9 Gestão das Operações e Indústria 4.0</w:t>
       </w:r>
-      <w:bookmarkEnd w:id="31"/>
+      <w:bookmarkEnd w:id="32"/>
     </w:p>
     <w:p/>
     <w:p>
@@ -9258,22 +9534,22 @@
           <w:szCs w:val="22"/>
         </w:rPr>
       </w:pPr>
-      <w:bookmarkStart w:id="32" w:name="_Toc211610934"/>
+      <w:bookmarkStart w:id="33" w:name="_Toc211610934"/>
       <w:r>
         <w:lastRenderedPageBreak/>
         <w:t>Parte III – Conclusão</w:t>
       </w:r>
-      <w:bookmarkEnd w:id="32"/>
+      <w:bookmarkEnd w:id="33"/>
     </w:p>
     <w:p>
       <w:pPr>
         <w:pStyle w:val="Ttulo2"/>
       </w:pPr>
-      <w:bookmarkStart w:id="33" w:name="_Toc211610935"/>
+      <w:bookmarkStart w:id="34" w:name="_Toc211610935"/>
       <w:r>
         <w:t>III.1 Conclusão</w:t>
       </w:r>
-      <w:bookmarkEnd w:id="33"/>
+      <w:bookmarkEnd w:id="34"/>
     </w:p>
     <w:p/>
     <w:p/>
@@ -9281,11 +9557,11 @@
       <w:pPr>
         <w:pStyle w:val="Ttulo2"/>
       </w:pPr>
-      <w:bookmarkStart w:id="34" w:name="_Toc211610936"/>
+      <w:bookmarkStart w:id="35" w:name="_Toc211610936"/>
       <w:r>
         <w:t>III.2 Sugestões de melhoria</w:t>
       </w:r>
-      <w:bookmarkEnd w:id="34"/>
+      <w:bookmarkEnd w:id="35"/>
     </w:p>
     <w:p>
       <w:pPr>
@@ -9295,14 +9571,14 @@
       <w:r>
         <w:br w:type="page"/>
       </w:r>
-      <w:bookmarkStart w:id="35" w:name="_Toc471979356"/>
-      <w:bookmarkStart w:id="36" w:name="_Toc211610937"/>
+      <w:bookmarkStart w:id="36" w:name="_Toc471979356"/>
+      <w:bookmarkStart w:id="37" w:name="_Toc211610937"/>
       <w:r>
         <w:lastRenderedPageBreak/>
         <w:t>Referências</w:t>
       </w:r>
-      <w:bookmarkEnd w:id="35"/>
       <w:bookmarkEnd w:id="36"/>
+      <w:bookmarkEnd w:id="37"/>
     </w:p>
     <w:p>
       <w:pPr>
@@ -9395,16 +9671,16 @@
           <w:rFonts w:eastAsia="Arial Narrow"/>
         </w:rPr>
       </w:pPr>
-      <w:bookmarkStart w:id="37" w:name="_Toc471979357"/>
-      <w:bookmarkStart w:id="38" w:name="_Toc211610938"/>
+      <w:bookmarkStart w:id="38" w:name="_Toc471979357"/>
+      <w:bookmarkStart w:id="39" w:name="_Toc211610938"/>
       <w:r>
         <w:rPr>
           <w:rFonts w:eastAsia="Arial Narrow"/>
         </w:rPr>
         <w:t>Anexos</w:t>
       </w:r>
-      <w:bookmarkEnd w:id="37"/>
       <w:bookmarkEnd w:id="38"/>
+      <w:bookmarkEnd w:id="39"/>
       <w:r>
         <w:rPr>
           <w:rFonts w:eastAsia="Arial Narrow"/>
@@ -9416,11 +9692,11 @@
       <w:pPr>
         <w:pStyle w:val="Ttulo2"/>
       </w:pPr>
-      <w:bookmarkStart w:id="39" w:name="_Toc211610939"/>
+      <w:bookmarkStart w:id="40" w:name="_Toc211610939"/>
       <w:r>
         <w:t>Opções Estratégicas para o Porto de Sines (2020-2030)</w:t>
       </w:r>
-      <w:bookmarkEnd w:id="39"/>
+      <w:bookmarkEnd w:id="40"/>
     </w:p>
     <w:p>
       <w:pPr>
@@ -9489,7 +9765,7 @@
           <w:color w:val="auto"/>
         </w:rPr>
       </w:pPr>
-      <w:bookmarkStart w:id="40" w:name="_Toc211605332"/>
+      <w:bookmarkStart w:id="41" w:name="_Toc211611357"/>
       <w:r>
         <w:rPr>
           <w:color w:val="auto"/>
@@ -9533,7 +9809,7 @@
         </w:rPr>
         <w:t xml:space="preserve"> - Sistemas Portuários (conectividade)</w:t>
       </w:r>
-      <w:bookmarkEnd w:id="40"/>
+      <w:bookmarkEnd w:id="41"/>
     </w:p>
     <w:p>
       <w:pPr>
@@ -9611,7 +9887,7 @@
           <w:color w:val="auto"/>
         </w:rPr>
       </w:pPr>
-      <w:bookmarkStart w:id="41" w:name="_Toc211605333"/>
+      <w:bookmarkStart w:id="42" w:name="_Toc211611358"/>
       <w:r>
         <w:rPr>
           <w:color w:val="auto"/>
@@ -9655,7 +9931,7 @@
         </w:rPr>
         <w:t xml:space="preserve"> - Sistemas Portuários (comunidade)</w:t>
       </w:r>
-      <w:bookmarkEnd w:id="41"/>
+      <w:bookmarkEnd w:id="42"/>
     </w:p>
     <w:p>
       <w:pPr>
@@ -9746,7 +10022,7 @@
         <w:spacing w:line="276" w:lineRule="auto"/>
         <w:jc w:val="center"/>
       </w:pPr>
-      <w:bookmarkStart w:id="42" w:name="_Toc211605334"/>
+      <w:bookmarkStart w:id="43" w:name="_Toc211611359"/>
       <w:r>
         <w:rPr>
           <w:color w:val="auto"/>
@@ -9790,7 +10066,7 @@
         </w:rPr>
         <w:t xml:space="preserve"> - Iniciativas Estratégicas</w:t>
       </w:r>
-      <w:bookmarkEnd w:id="42"/>
+      <w:bookmarkEnd w:id="43"/>
     </w:p>
     <w:p>
       <w:pPr>
@@ -9860,7 +10136,7 @@
           <w:color w:val="auto"/>
         </w:rPr>
       </w:pPr>
-      <w:bookmarkStart w:id="43" w:name="_Toc211605335"/>
+      <w:bookmarkStart w:id="44" w:name="_Toc211611360"/>
       <w:r>
         <w:rPr>
           <w:color w:val="auto"/>
@@ -9902,9 +10178,23 @@
         <w:rPr>
           <w:color w:val="auto"/>
         </w:rPr>
-        <w:t xml:space="preserve"> - Legacy (riscos estratégicos)</w:t>
-      </w:r>
-      <w:bookmarkEnd w:id="43"/>
+        <w:t xml:space="preserve"> - </w:t>
+      </w:r>
+      <w:proofErr w:type="spellStart"/>
+      <w:r>
+        <w:rPr>
+          <w:color w:val="auto"/>
+        </w:rPr>
+        <w:t>Legacy</w:t>
+      </w:r>
+      <w:proofErr w:type="spellEnd"/>
+      <w:r>
+        <w:rPr>
+          <w:color w:val="auto"/>
+        </w:rPr>
+        <w:t xml:space="preserve"> (riscos estratégicos)</w:t>
+      </w:r>
+      <w:bookmarkEnd w:id="44"/>
     </w:p>
     <w:p>
       <w:pPr>
@@ -9980,7 +10270,7 @@
           <w:color w:val="auto"/>
         </w:rPr>
       </w:pPr>
-      <w:bookmarkStart w:id="44" w:name="_Toc211605336"/>
+      <w:bookmarkStart w:id="45" w:name="_Toc211611361"/>
       <w:r>
         <w:rPr>
           <w:color w:val="auto"/>
@@ -10024,7 +10314,7 @@
         </w:rPr>
         <w:t xml:space="preserve"> - Oportunidades (valor potencial)</w:t>
       </w:r>
-      <w:bookmarkEnd w:id="44"/>
+      <w:bookmarkEnd w:id="45"/>
     </w:p>
     <w:p>
       <w:pPr>
@@ -10088,7 +10378,7 @@
           <w:color w:val="auto"/>
         </w:rPr>
       </w:pPr>
-      <w:bookmarkStart w:id="45" w:name="_Toc211605337"/>
+      <w:bookmarkStart w:id="46" w:name="_Toc211611362"/>
       <w:r>
         <w:rPr>
           <w:color w:val="auto"/>
@@ -10130,9 +10420,23 @@
         <w:rPr>
           <w:color w:val="auto"/>
         </w:rPr>
-        <w:t xml:space="preserve"> - Enablers de competitividade (recursos e competências)</w:t>
-      </w:r>
-      <w:bookmarkEnd w:id="45"/>
+        <w:t xml:space="preserve"> - </w:t>
+      </w:r>
+      <w:proofErr w:type="spellStart"/>
+      <w:r>
+        <w:rPr>
+          <w:color w:val="auto"/>
+        </w:rPr>
+        <w:t>Enablers</w:t>
+      </w:r>
+      <w:proofErr w:type="spellEnd"/>
+      <w:r>
+        <w:rPr>
+          <w:color w:val="auto"/>
+        </w:rPr>
+        <w:t xml:space="preserve"> de competitividade (recursos e competências)</w:t>
+      </w:r>
+      <w:bookmarkEnd w:id="46"/>
     </w:p>
     <w:p/>
     <w:p>
@@ -10221,7 +10525,7 @@
           <w:color w:val="auto"/>
         </w:rPr>
       </w:pPr>
-      <w:bookmarkStart w:id="46" w:name="_Toc211605338"/>
+      <w:bookmarkStart w:id="47" w:name="_Toc211611363"/>
       <w:r>
         <w:rPr>
           <w:color w:val="auto"/>
@@ -10263,7 +10567,21 @@
         <w:rPr>
           <w:color w:val="auto"/>
         </w:rPr>
-        <w:t xml:space="preserve"> - Visão dos Stakeholders (competitividade</w:t>
+        <w:t xml:space="preserve"> - Visão dos </w:t>
+      </w:r>
+      <w:proofErr w:type="spellStart"/>
+      <w:r>
+        <w:rPr>
+          <w:color w:val="auto"/>
+        </w:rPr>
+        <w:t>Stakeholders</w:t>
+      </w:r>
+      <w:proofErr w:type="spellEnd"/>
+      <w:r>
+        <w:rPr>
+          <w:color w:val="auto"/>
+        </w:rPr>
+        <w:t xml:space="preserve"> (competitividade</w:t>
       </w:r>
       <w:r>
         <w:rPr>
@@ -10271,7 +10589,7 @@
         </w:rPr>
         <w:t>)</w:t>
       </w:r>
-      <w:bookmarkEnd w:id="46"/>
+      <w:bookmarkEnd w:id="47"/>
     </w:p>
     <w:p/>
     <w:p>
@@ -10342,7 +10660,7 @@
           <w:color w:val="auto"/>
         </w:rPr>
       </w:pPr>
-      <w:bookmarkStart w:id="47" w:name="_Toc211605339"/>
+      <w:bookmarkStart w:id="48" w:name="_Toc211611364"/>
       <w:r>
         <w:rPr>
           <w:color w:val="auto"/>
@@ -10384,9 +10702,23 @@
         <w:rPr>
           <w:color w:val="auto"/>
         </w:rPr>
-        <w:t xml:space="preserve"> - Visão dos Stakeholders (cooperação)</w:t>
-      </w:r>
-      <w:bookmarkEnd w:id="47"/>
+        <w:t xml:space="preserve"> - Visão dos </w:t>
+      </w:r>
+      <w:proofErr w:type="spellStart"/>
+      <w:r>
+        <w:rPr>
+          <w:color w:val="auto"/>
+        </w:rPr>
+        <w:t>Stakeholders</w:t>
+      </w:r>
+      <w:proofErr w:type="spellEnd"/>
+      <w:r>
+        <w:rPr>
+          <w:color w:val="auto"/>
+        </w:rPr>
+        <w:t xml:space="preserve"> (cooperação)</w:t>
+      </w:r>
+      <w:bookmarkEnd w:id="48"/>
     </w:p>
     <w:p>
       <w:pPr>
@@ -10452,7 +10784,7 @@
         <w:spacing w:line="276" w:lineRule="auto"/>
         <w:jc w:val="center"/>
       </w:pPr>
-      <w:bookmarkStart w:id="48" w:name="_Toc211605340"/>
+      <w:bookmarkStart w:id="49" w:name="_Toc211611365"/>
       <w:r>
         <w:rPr>
           <w:color w:val="auto"/>
@@ -10494,9 +10826,23 @@
         <w:rPr>
           <w:color w:val="auto"/>
         </w:rPr>
-        <w:t xml:space="preserve"> - Visão dos Stakeholders (expectativas)</w:t>
-      </w:r>
-      <w:bookmarkEnd w:id="48"/>
+        <w:t xml:space="preserve"> - Visão dos </w:t>
+      </w:r>
+      <w:proofErr w:type="spellStart"/>
+      <w:r>
+        <w:rPr>
+          <w:color w:val="auto"/>
+        </w:rPr>
+        <w:t>Stakeholders</w:t>
+      </w:r>
+      <w:proofErr w:type="spellEnd"/>
+      <w:r>
+        <w:rPr>
+          <w:color w:val="auto"/>
+        </w:rPr>
+        <w:t xml:space="preserve"> (expectativas)</w:t>
+      </w:r>
+      <w:bookmarkEnd w:id="49"/>
     </w:p>
     <w:p>
       <w:pPr>
@@ -10509,11 +10855,16 @@
       <w:pPr>
         <w:pStyle w:val="Ttulo2"/>
       </w:pPr>
-      <w:bookmarkStart w:id="49" w:name="_Toc211610940"/>
-      <w:r>
-        <w:t>Ligações e Hinterland</w:t>
-      </w:r>
-      <w:bookmarkEnd w:id="49"/>
+      <w:bookmarkStart w:id="50" w:name="_Toc211610940"/>
+      <w:r>
+        <w:t xml:space="preserve">Ligações e </w:t>
+      </w:r>
+      <w:proofErr w:type="spellStart"/>
+      <w:r>
+        <w:t>Hinterland</w:t>
+      </w:r>
+      <w:bookmarkEnd w:id="50"/>
+      <w:proofErr w:type="spellEnd"/>
     </w:p>
     <w:p>
       <w:pPr>
@@ -10602,7 +10953,7 @@
           <w:color w:val="auto"/>
         </w:rPr>
       </w:pPr>
-      <w:bookmarkStart w:id="50" w:name="_Toc211605341"/>
+      <w:bookmarkStart w:id="51" w:name="_Toc211611366"/>
       <w:r>
         <w:rPr>
           <w:color w:val="auto"/>
@@ -10644,7 +10995,21 @@
         <w:rPr>
           <w:color w:val="auto"/>
         </w:rPr>
-        <w:t xml:space="preserve"> - Ligações estratégicas do Porto de Sines: acessos marítimos globais e hinterland ibéric</w:t>
+        <w:t xml:space="preserve"> - Ligações estratégicas do Porto de Sines: acessos marítimos globais e </w:t>
+      </w:r>
+      <w:proofErr w:type="spellStart"/>
+      <w:r>
+        <w:rPr>
+          <w:color w:val="auto"/>
+        </w:rPr>
+        <w:t>hinterland</w:t>
+      </w:r>
+      <w:proofErr w:type="spellEnd"/>
+      <w:r>
+        <w:rPr>
+          <w:color w:val="auto"/>
+        </w:rPr>
+        <w:t xml:space="preserve"> ibéric</w:t>
       </w:r>
       <w:r>
         <w:rPr>
@@ -10652,7 +11017,7 @@
         </w:rPr>
         <w:t>o</w:t>
       </w:r>
-      <w:bookmarkEnd w:id="50"/>
+      <w:bookmarkEnd w:id="51"/>
     </w:p>
     <w:p>
       <w:pPr>
@@ -10687,11 +11052,11 @@
       <w:pPr>
         <w:pStyle w:val="Ttulo2"/>
       </w:pPr>
-      <w:bookmarkStart w:id="51" w:name="_Toc211610941"/>
+      <w:bookmarkStart w:id="52" w:name="_Toc211610941"/>
       <w:r>
         <w:t>Estatísticas</w:t>
       </w:r>
-      <w:bookmarkEnd w:id="51"/>
+      <w:bookmarkEnd w:id="52"/>
     </w:p>
     <w:p>
       <w:pPr>
@@ -10704,7 +11069,7 @@
           <w:szCs w:val="20"/>
         </w:rPr>
       </w:pPr>
-      <w:bookmarkStart w:id="52" w:name="_Toc211610942"/>
+      <w:bookmarkStart w:id="53" w:name="_Toc211610942"/>
       <w:r>
         <w:rPr>
           <w:b/>
@@ -10715,7 +11080,7 @@
         </w:rPr>
         <w:t>Navios</w:t>
       </w:r>
-      <w:bookmarkEnd w:id="52"/>
+      <w:bookmarkEnd w:id="53"/>
     </w:p>
     <w:p>
       <w:pPr>
@@ -10778,7 +11143,7 @@
           <w:color w:val="auto"/>
         </w:rPr>
       </w:pPr>
-      <w:bookmarkStart w:id="53" w:name="_Toc211605342"/>
+      <w:bookmarkStart w:id="54" w:name="_Toc211611367"/>
       <w:r>
         <w:rPr>
           <w:color w:val="auto"/>
@@ -10828,7 +11193,7 @@
         </w:rPr>
         <w:t xml:space="preserve"> (1978-2021)</w:t>
       </w:r>
-      <w:bookmarkEnd w:id="53"/>
+      <w:bookmarkEnd w:id="54"/>
     </w:p>
     <w:p>
       <w:pPr>
@@ -10901,7 +11266,7 @@
           <w:color w:val="auto"/>
         </w:rPr>
       </w:pPr>
-      <w:bookmarkStart w:id="54" w:name="_Toc211605343"/>
+      <w:bookmarkStart w:id="55" w:name="_Toc211611368"/>
       <w:r>
         <w:rPr>
           <w:color w:val="auto"/>
@@ -10951,7 +11316,7 @@
         </w:rPr>
         <w:t xml:space="preserve"> (2000-2021)</w:t>
       </w:r>
-      <w:bookmarkEnd w:id="54"/>
+      <w:bookmarkEnd w:id="55"/>
     </w:p>
     <w:p/>
     <w:p>
@@ -11015,7 +11380,7 @@
           <w:color w:val="auto"/>
         </w:rPr>
       </w:pPr>
-      <w:bookmarkStart w:id="55" w:name="_Toc211605344"/>
+      <w:bookmarkStart w:id="56" w:name="_Toc211611369"/>
       <w:r>
         <w:rPr>
           <w:color w:val="auto"/>
@@ -11065,7 +11430,7 @@
         </w:rPr>
         <w:t xml:space="preserve"> (2000-2021)</w:t>
       </w:r>
-      <w:bookmarkEnd w:id="55"/>
+      <w:bookmarkEnd w:id="56"/>
     </w:p>
     <w:p/>
     <w:p>
@@ -11079,7 +11444,7 @@
           <w:szCs w:val="20"/>
         </w:rPr>
       </w:pPr>
-      <w:bookmarkStart w:id="56" w:name="_Toc211610943"/>
+      <w:bookmarkStart w:id="57" w:name="_Toc211610943"/>
       <w:r>
         <w:rPr>
           <w:b/>
@@ -11091,7 +11456,7 @@
         <w:lastRenderedPageBreak/>
         <w:t>Mercadorias</w:t>
       </w:r>
-      <w:bookmarkEnd w:id="56"/>
+      <w:bookmarkEnd w:id="57"/>
     </w:p>
     <w:p>
       <w:pPr>
@@ -11160,7 +11525,7 @@
           <w:color w:val="auto"/>
         </w:rPr>
       </w:pPr>
-      <w:bookmarkStart w:id="57" w:name="_Toc211605345"/>
+      <w:bookmarkStart w:id="58" w:name="_Toc211611370"/>
       <w:r>
         <w:rPr>
           <w:color w:val="auto"/>
@@ -11210,7 +11575,7 @@
         </w:rPr>
         <w:t xml:space="preserve"> (1978-2021)</w:t>
       </w:r>
-      <w:bookmarkEnd w:id="57"/>
+      <w:bookmarkEnd w:id="58"/>
     </w:p>
     <w:p>
       <w:pPr>
@@ -11279,7 +11644,7 @@
           <w:color w:val="auto"/>
         </w:rPr>
       </w:pPr>
-      <w:bookmarkStart w:id="58" w:name="_Toc211605346"/>
+      <w:bookmarkStart w:id="59" w:name="_Toc211611371"/>
       <w:r>
         <w:rPr>
           <w:color w:val="auto"/>
@@ -11323,7 +11688,7 @@
         </w:rPr>
         <w:t xml:space="preserve"> - Evolução das mercadorias movimentadas no Porto de Faro (2000-2021)</w:t>
       </w:r>
-      <w:bookmarkEnd w:id="58"/>
+      <w:bookmarkEnd w:id="59"/>
       <w:r>
         <w:rPr>
           <w:color w:val="auto"/>
@@ -11399,7 +11764,7 @@
           <w:color w:val="auto"/>
         </w:rPr>
       </w:pPr>
-      <w:bookmarkStart w:id="59" w:name="_Toc211605347"/>
+      <w:bookmarkStart w:id="60" w:name="_Toc211611372"/>
       <w:r>
         <w:rPr>
           <w:color w:val="auto"/>
@@ -11443,7 +11808,7 @@
         </w:rPr>
         <w:t xml:space="preserve"> - Evolução das mercadorias movimentadas no Porto de Portimão (2000-2021)</w:t>
       </w:r>
-      <w:bookmarkEnd w:id="59"/>
+      <w:bookmarkEnd w:id="60"/>
     </w:p>
     <w:p>
       <w:pPr>
@@ -11488,7 +11853,7 @@
           <w:szCs w:val="20"/>
         </w:rPr>
       </w:pPr>
-      <w:bookmarkStart w:id="60" w:name="_Toc211610944"/>
+      <w:bookmarkStart w:id="61" w:name="_Toc211610944"/>
       <w:r>
         <w:rPr>
           <w:b/>
@@ -11500,7 +11865,7 @@
         <w:lastRenderedPageBreak/>
         <w:t>Passageiros</w:t>
       </w:r>
-      <w:bookmarkEnd w:id="60"/>
+      <w:bookmarkEnd w:id="61"/>
     </w:p>
     <w:p>
       <w:pPr>
@@ -11588,7 +11953,7 @@
           <w:color w:val="auto"/>
         </w:rPr>
       </w:pPr>
-      <w:bookmarkStart w:id="61" w:name="_Toc211605348"/>
+      <w:bookmarkStart w:id="62" w:name="_Toc211611373"/>
       <w:r>
         <w:rPr>
           <w:color w:val="auto"/>
@@ -11656,7 +12021,7 @@
         </w:rPr>
         <w:t xml:space="preserve"> de passageiros no Porto de Portimão (2004-2020)</w:t>
       </w:r>
-      <w:bookmarkEnd w:id="61"/>
+      <w:bookmarkEnd w:id="62"/>
     </w:p>
     <w:p>
       <w:pPr>
@@ -16914,6 +17279,7 @@
   <w:style w:type="character" w:default="1" w:styleId="Tipodeletrapredefinidodopargrafo">
     <w:name w:val="Default Paragraph Font"/>
     <w:uiPriority w:val="1"/>
+    <w:semiHidden/>
     <w:unhideWhenUsed/>
   </w:style>
   <w:style w:type="table" w:default="1" w:styleId="Tabelanormal">
@@ -17787,12 +18153,7 @@
 </file>
 
 <file path=customXml/item2.xml><?xml version="1.0" encoding="utf-8"?>
-<?mso-contentType ?>
-<FormTemplates xmlns="http://schemas.microsoft.com/sharepoint/v3/contenttype/forms">
-  <Display>DocumentLibraryForm</Display>
-  <Edit>DocumentLibraryForm</Edit>
-  <New>DocumentLibraryForm</New>
-</FormTemplates>
+<b:Sources xmlns:b="http://schemas.openxmlformats.org/officeDocument/2006/bibliography" xmlns="http://schemas.openxmlformats.org/officeDocument/2006/bibliography" SelectedStyle="\APA.XSL" StyleName="APA"/>
 </file>
 
 <file path=customXml/item3.xml><?xml version="1.0" encoding="utf-8"?>
@@ -17958,7 +18319,12 @@
 </file>
 
 <file path=customXml/item4.xml><?xml version="1.0" encoding="utf-8"?>
-<b:Sources xmlns:b="http://schemas.openxmlformats.org/officeDocument/2006/bibliography" xmlns="http://schemas.openxmlformats.org/officeDocument/2006/bibliography" SelectedStyle="\APA.XSL" StyleName="APA"/>
+<?mso-contentType ?>
+<FormTemplates xmlns="http://schemas.microsoft.com/sharepoint/v3/contenttype/forms">
+  <Display>DocumentLibraryForm</Display>
+  <Edit>DocumentLibraryForm</Edit>
+  <New>DocumentLibraryForm</New>
+</FormTemplates>
 </file>
 
 <file path=customXml/itemProps1.xml><?xml version="1.0" encoding="utf-8"?>
@@ -17972,9 +18338,9 @@
 </file>
 
 <file path=customXml/itemProps2.xml><?xml version="1.0" encoding="utf-8"?>
-<ds:datastoreItem xmlns:ds="http://schemas.openxmlformats.org/officeDocument/2006/customXml" ds:itemID="{A8BEE9C3-75AD-4607-B106-1B44B05722EA}">
+<ds:datastoreItem xmlns:ds="http://schemas.openxmlformats.org/officeDocument/2006/customXml" ds:itemID="{9C46D67E-02BF-4E37-8EF1-2391CC03D27F}">
   <ds:schemaRefs>
-    <ds:schemaRef ds:uri="http://schemas.microsoft.com/sharepoint/v3/contenttype/forms"/>
+    <ds:schemaRef ds:uri="http://schemas.openxmlformats.org/officeDocument/2006/bibliography"/>
   </ds:schemaRefs>
 </ds:datastoreItem>
 </file>
@@ -17998,9 +18364,9 @@
 </file>
 
 <file path=customXml/itemProps4.xml><?xml version="1.0" encoding="utf-8"?>
-<ds:datastoreItem xmlns:ds="http://schemas.openxmlformats.org/officeDocument/2006/customXml" ds:itemID="{9C46D67E-02BF-4E37-8EF1-2391CC03D27F}">
+<ds:datastoreItem xmlns:ds="http://schemas.openxmlformats.org/officeDocument/2006/customXml" ds:itemID="{A8BEE9C3-75AD-4607-B106-1B44B05722EA}">
   <ds:schemaRefs>
-    <ds:schemaRef ds:uri="http://schemas.openxmlformats.org/officeDocument/2006/bibliography"/>
+    <ds:schemaRef ds:uri="http://schemas.microsoft.com/sharepoint/v3/contenttype/forms"/>
   </ds:schemaRefs>
 </ds:datastoreItem>
 </file>
</xml_diff>

<commit_message>
US 2.2.3 - implementation of DockConfiguration (#4)
</commit_message>
<xml_diff>
--- a/docs/client_analysis/report_APS.docx
+++ b/docs/client_analysis/report_APS.docx
@@ -614,7 +614,7 @@
           <w:r>
             <w:fldChar w:fldCharType="separate"/>
           </w:r>
-          <w:hyperlink w:anchor="_Toc211610907" w:history="1">
+          <w:hyperlink w:anchor="_Toc211616092" w:history="1">
             <w:r>
               <w:rPr>
                 <w:rStyle w:val="Hiperligao"/>
@@ -642,7 +642,7 @@
                 <w:noProof/>
                 <w:webHidden/>
               </w:rPr>
-              <w:instrText xml:space="preserve"> PAGEREF _Toc211610907 \h </w:instrText>
+              <w:instrText xml:space="preserve"> PAGEREF _Toc211616092 \h </w:instrText>
             </w:r>
             <w:r>
               <w:rPr>
@@ -687,7 +687,7 @@
               <w14:ligatures w14:val="standardContextual"/>
             </w:rPr>
           </w:pPr>
-          <w:hyperlink w:anchor="_Toc211610908" w:history="1">
+          <w:hyperlink w:anchor="_Toc211616093" w:history="1">
             <w:r>
               <w:rPr>
                 <w:rStyle w:val="Hiperligao"/>
@@ -715,7 +715,7 @@
                 <w:noProof/>
                 <w:webHidden/>
               </w:rPr>
-              <w:instrText xml:space="preserve"> PAGEREF _Toc211610908 \h </w:instrText>
+              <w:instrText xml:space="preserve"> PAGEREF _Toc211616093 \h </w:instrText>
             </w:r>
             <w:r>
               <w:rPr>
@@ -760,7 +760,7 @@
               <w14:ligatures w14:val="standardContextual"/>
             </w:rPr>
           </w:pPr>
-          <w:hyperlink w:anchor="_Toc211610909" w:history="1">
+          <w:hyperlink w:anchor="_Toc211616094" w:history="1">
             <w:r>
               <w:rPr>
                 <w:rStyle w:val="Hiperligao"/>
@@ -787,7 +787,7 @@
                 <w:noProof/>
                 <w:webHidden/>
               </w:rPr>
-              <w:instrText xml:space="preserve"> PAGEREF _Toc211610909 \h </w:instrText>
+              <w:instrText xml:space="preserve"> PAGEREF _Toc211616094 \h </w:instrText>
             </w:r>
             <w:r>
               <w:rPr>
@@ -832,7 +832,7 @@
               <w14:ligatures w14:val="standardContextual"/>
             </w:rPr>
           </w:pPr>
-          <w:hyperlink w:anchor="_Toc211610910" w:history="1">
+          <w:hyperlink w:anchor="_Toc211616095" w:history="1">
             <w:r>
               <w:rPr>
                 <w:rStyle w:val="Hiperligao"/>
@@ -859,7 +859,7 @@
                 <w:noProof/>
                 <w:webHidden/>
               </w:rPr>
-              <w:instrText xml:space="preserve"> PAGEREF _Toc211610910 \h </w:instrText>
+              <w:instrText xml:space="preserve"> PAGEREF _Toc211616095 \h </w:instrText>
             </w:r>
             <w:r>
               <w:rPr>
@@ -904,7 +904,7 @@
               <w14:ligatures w14:val="standardContextual"/>
             </w:rPr>
           </w:pPr>
-          <w:hyperlink w:anchor="_Toc211610911" w:history="1">
+          <w:hyperlink w:anchor="_Toc211616096" w:history="1">
             <w:r>
               <w:rPr>
                 <w:rStyle w:val="Hiperligao"/>
@@ -931,7 +931,7 @@
                 <w:noProof/>
                 <w:webHidden/>
               </w:rPr>
-              <w:instrText xml:space="preserve"> PAGEREF _Toc211610911 \h </w:instrText>
+              <w:instrText xml:space="preserve"> PAGEREF _Toc211616096 \h </w:instrText>
             </w:r>
             <w:r>
               <w:rPr>
@@ -976,7 +976,7 @@
               <w14:ligatures w14:val="standardContextual"/>
             </w:rPr>
           </w:pPr>
-          <w:hyperlink w:anchor="_Toc211610912" w:history="1">
+          <w:hyperlink w:anchor="_Toc211616097" w:history="1">
             <w:r>
               <w:rPr>
                 <w:rStyle w:val="Hiperligao"/>
@@ -1005,7 +1005,7 @@
                 <w:noProof/>
                 <w:webHidden/>
               </w:rPr>
-              <w:instrText xml:space="preserve"> PAGEREF _Toc211610912 \h </w:instrText>
+              <w:instrText xml:space="preserve"> PAGEREF _Toc211616097 \h </w:instrText>
             </w:r>
             <w:r>
               <w:rPr>
@@ -1050,7 +1050,7 @@
               <w14:ligatures w14:val="standardContextual"/>
             </w:rPr>
           </w:pPr>
-          <w:hyperlink w:anchor="_Toc211610913" w:history="1">
+          <w:hyperlink w:anchor="_Toc211616098" w:history="1">
             <w:r>
               <w:rPr>
                 <w:rStyle w:val="Hiperligao"/>
@@ -1079,7 +1079,7 @@
                 <w:noProof/>
                 <w:webHidden/>
               </w:rPr>
-              <w:instrText xml:space="preserve"> PAGEREF _Toc211610913 \h </w:instrText>
+              <w:instrText xml:space="preserve"> PAGEREF _Toc211616098 \h </w:instrText>
             </w:r>
             <w:r>
               <w:rPr>
@@ -1124,7 +1124,7 @@
               <w14:ligatures w14:val="standardContextual"/>
             </w:rPr>
           </w:pPr>
-          <w:hyperlink w:anchor="_Toc211610914" w:history="1">
+          <w:hyperlink w:anchor="_Toc211616099" w:history="1">
             <w:r>
               <w:rPr>
                 <w:rStyle w:val="Hiperligao"/>
@@ -1153,7 +1153,7 @@
                 <w:noProof/>
                 <w:webHidden/>
               </w:rPr>
-              <w:instrText xml:space="preserve"> PAGEREF _Toc211610914 \h </w:instrText>
+              <w:instrText xml:space="preserve"> PAGEREF _Toc211616099 \h </w:instrText>
             </w:r>
             <w:r>
               <w:rPr>
@@ -1198,7 +1198,7 @@
               <w14:ligatures w14:val="standardContextual"/>
             </w:rPr>
           </w:pPr>
-          <w:hyperlink w:anchor="_Toc211610915" w:history="1">
+          <w:hyperlink w:anchor="_Toc211616100" w:history="1">
             <w:r>
               <w:rPr>
                 <w:rStyle w:val="Hiperligao"/>
@@ -1227,7 +1227,7 @@
                 <w:noProof/>
                 <w:webHidden/>
               </w:rPr>
-              <w:instrText xml:space="preserve"> PAGEREF _Toc211610915 \h </w:instrText>
+              <w:instrText xml:space="preserve"> PAGEREF _Toc211616100 \h </w:instrText>
             </w:r>
             <w:r>
               <w:rPr>
@@ -1272,7 +1272,7 @@
               <w14:ligatures w14:val="standardContextual"/>
             </w:rPr>
           </w:pPr>
-          <w:hyperlink w:anchor="_Toc211610916" w:history="1">
+          <w:hyperlink w:anchor="_Toc211616101" w:history="1">
             <w:r>
               <w:rPr>
                 <w:rStyle w:val="Hiperligao"/>
@@ -1301,7 +1301,7 @@
                 <w:noProof/>
                 <w:webHidden/>
               </w:rPr>
-              <w:instrText xml:space="preserve"> PAGEREF _Toc211610916 \h </w:instrText>
+              <w:instrText xml:space="preserve"> PAGEREF _Toc211616101 \h </w:instrText>
             </w:r>
             <w:r>
               <w:rPr>
@@ -1346,7 +1346,7 @@
               <w14:ligatures w14:val="standardContextual"/>
             </w:rPr>
           </w:pPr>
-          <w:hyperlink w:anchor="_Toc211610917" w:history="1">
+          <w:hyperlink w:anchor="_Toc211616102" w:history="1">
             <w:r>
               <w:rPr>
                 <w:rStyle w:val="Hiperligao"/>
@@ -1373,7 +1373,7 @@
                 <w:noProof/>
                 <w:webHidden/>
               </w:rPr>
-              <w:instrText xml:space="preserve"> PAGEREF _Toc211610917 \h </w:instrText>
+              <w:instrText xml:space="preserve"> PAGEREF _Toc211616102 \h </w:instrText>
             </w:r>
             <w:r>
               <w:rPr>
@@ -1418,7 +1418,7 @@
               <w14:ligatures w14:val="standardContextual"/>
             </w:rPr>
           </w:pPr>
-          <w:hyperlink w:anchor="_Toc211610918" w:history="1">
+          <w:hyperlink w:anchor="_Toc211616103" w:history="1">
             <w:r>
               <w:rPr>
                 <w:rStyle w:val="Hiperligao"/>
@@ -1445,7 +1445,7 @@
                 <w:noProof/>
                 <w:webHidden/>
               </w:rPr>
-              <w:instrText xml:space="preserve"> PAGEREF _Toc211610918 \h </w:instrText>
+              <w:instrText xml:space="preserve"> PAGEREF _Toc211616103 \h </w:instrText>
             </w:r>
             <w:r>
               <w:rPr>
@@ -1465,7 +1465,7 @@
                 <w:noProof/>
                 <w:webHidden/>
               </w:rPr>
-              <w:t>10</w:t>
+              <w:t>9</w:t>
             </w:r>
             <w:r>
               <w:rPr>
@@ -1490,7 +1490,7 @@
               <w14:ligatures w14:val="standardContextual"/>
             </w:rPr>
           </w:pPr>
-          <w:hyperlink w:anchor="_Toc211610919" w:history="1">
+          <w:hyperlink w:anchor="_Toc211616104" w:history="1">
             <w:r>
               <w:rPr>
                 <w:rStyle w:val="Hiperligao"/>
@@ -1517,7 +1517,7 @@
                 <w:noProof/>
                 <w:webHidden/>
               </w:rPr>
-              <w:instrText xml:space="preserve"> PAGEREF _Toc211610919 \h </w:instrText>
+              <w:instrText xml:space="preserve"> PAGEREF _Toc211616104 \h </w:instrText>
             </w:r>
             <w:r>
               <w:rPr>
@@ -1537,7 +1537,7 @@
                 <w:noProof/>
                 <w:webHidden/>
               </w:rPr>
-              <w:t>10</w:t>
+              <w:t>9</w:t>
             </w:r>
             <w:r>
               <w:rPr>
@@ -1562,7 +1562,7 @@
               <w14:ligatures w14:val="standardContextual"/>
             </w:rPr>
           </w:pPr>
-          <w:hyperlink w:anchor="_Toc211610920" w:history="1">
+          <w:hyperlink w:anchor="_Toc211616105" w:history="1">
             <w:r>
               <w:rPr>
                 <w:rStyle w:val="Hiperligao"/>
@@ -1591,7 +1591,7 @@
                 <w:noProof/>
                 <w:webHidden/>
               </w:rPr>
-              <w:instrText xml:space="preserve"> PAGEREF _Toc211610920 \h </w:instrText>
+              <w:instrText xml:space="preserve"> PAGEREF _Toc211616105 \h </w:instrText>
             </w:r>
             <w:r>
               <w:rPr>
@@ -1611,7 +1611,7 @@
                 <w:noProof/>
                 <w:webHidden/>
               </w:rPr>
-              <w:t>10</w:t>
+              <w:t>9</w:t>
             </w:r>
             <w:r>
               <w:rPr>
@@ -1636,7 +1636,7 @@
               <w14:ligatures w14:val="standardContextual"/>
             </w:rPr>
           </w:pPr>
-          <w:hyperlink w:anchor="_Toc211610921" w:history="1">
+          <w:hyperlink w:anchor="_Toc211616106" w:history="1">
             <w:r>
               <w:rPr>
                 <w:rStyle w:val="Hiperligao"/>
@@ -1665,7 +1665,7 @@
                 <w:noProof/>
                 <w:webHidden/>
               </w:rPr>
-              <w:instrText xml:space="preserve"> PAGEREF _Toc211610921 \h </w:instrText>
+              <w:instrText xml:space="preserve"> PAGEREF _Toc211616106 \h </w:instrText>
             </w:r>
             <w:r>
               <w:rPr>
@@ -1685,7 +1685,7 @@
                 <w:noProof/>
                 <w:webHidden/>
               </w:rPr>
-              <w:t>11</w:t>
+              <w:t>10</w:t>
             </w:r>
             <w:r>
               <w:rPr>
@@ -1710,7 +1710,7 @@
               <w14:ligatures w14:val="standardContextual"/>
             </w:rPr>
           </w:pPr>
-          <w:hyperlink w:anchor="_Toc211610922" w:history="1">
+          <w:hyperlink w:anchor="_Toc211616107" w:history="1">
             <w:r>
               <w:rPr>
                 <w:rStyle w:val="Hiperligao"/>
@@ -1737,7 +1737,7 @@
                 <w:noProof/>
                 <w:webHidden/>
               </w:rPr>
-              <w:instrText xml:space="preserve"> PAGEREF _Toc211610922 \h </w:instrText>
+              <w:instrText xml:space="preserve"> PAGEREF _Toc211616107 \h </w:instrText>
             </w:r>
             <w:r>
               <w:rPr>
@@ -1757,7 +1757,7 @@
                 <w:noProof/>
                 <w:webHidden/>
               </w:rPr>
-              <w:t>12</w:t>
+              <w:t>11</w:t>
             </w:r>
             <w:r>
               <w:rPr>
@@ -1782,7 +1782,7 @@
               <w14:ligatures w14:val="standardContextual"/>
             </w:rPr>
           </w:pPr>
-          <w:hyperlink w:anchor="_Toc211610923" w:history="1">
+          <w:hyperlink w:anchor="_Toc211616108" w:history="1">
             <w:r>
               <w:rPr>
                 <w:rStyle w:val="Hiperligao"/>
@@ -1811,7 +1811,7 @@
                 <w:noProof/>
                 <w:webHidden/>
               </w:rPr>
-              <w:instrText xml:space="preserve"> PAGEREF _Toc211610923 \h </w:instrText>
+              <w:instrText xml:space="preserve"> PAGEREF _Toc211616108 \h </w:instrText>
             </w:r>
             <w:r>
               <w:rPr>
@@ -1831,7 +1831,7 @@
                 <w:noProof/>
                 <w:webHidden/>
               </w:rPr>
-              <w:t>13</w:t>
+              <w:t>12</w:t>
             </w:r>
             <w:r>
               <w:rPr>
@@ -1856,7 +1856,7 @@
               <w14:ligatures w14:val="standardContextual"/>
             </w:rPr>
           </w:pPr>
-          <w:hyperlink w:anchor="_Toc211610924" w:history="1">
+          <w:hyperlink w:anchor="_Toc211616109" w:history="1">
             <w:r>
               <w:rPr>
                 <w:rStyle w:val="Hiperligao"/>
@@ -1885,7 +1885,7 @@
                 <w:noProof/>
                 <w:webHidden/>
               </w:rPr>
-              <w:instrText xml:space="preserve"> PAGEREF _Toc211610924 \h </w:instrText>
+              <w:instrText xml:space="preserve"> PAGEREF _Toc211616109 \h </w:instrText>
             </w:r>
             <w:r>
               <w:rPr>
@@ -1905,7 +1905,7 @@
                 <w:noProof/>
                 <w:webHidden/>
               </w:rPr>
-              <w:t>13</w:t>
+              <w:t>12</w:t>
             </w:r>
             <w:r>
               <w:rPr>
@@ -1930,7 +1930,7 @@
               <w14:ligatures w14:val="standardContextual"/>
             </w:rPr>
           </w:pPr>
-          <w:hyperlink w:anchor="_Toc211610925" w:history="1">
+          <w:hyperlink w:anchor="_Toc211616110" w:history="1">
             <w:r>
               <w:rPr>
                 <w:rStyle w:val="Hiperligao"/>
@@ -1959,7 +1959,7 @@
                 <w:noProof/>
                 <w:webHidden/>
               </w:rPr>
-              <w:instrText xml:space="preserve"> PAGEREF _Toc211610925 \h </w:instrText>
+              <w:instrText xml:space="preserve"> PAGEREF _Toc211616110 \h </w:instrText>
             </w:r>
             <w:r>
               <w:rPr>
@@ -1979,7 +1979,7 @@
                 <w:noProof/>
                 <w:webHidden/>
               </w:rPr>
-              <w:t>14</w:t>
+              <w:t>13</w:t>
             </w:r>
             <w:r>
               <w:rPr>
@@ -2004,7 +2004,7 @@
               <w14:ligatures w14:val="standardContextual"/>
             </w:rPr>
           </w:pPr>
-          <w:hyperlink w:anchor="_Toc211610926" w:history="1">
+          <w:hyperlink w:anchor="_Toc211616111" w:history="1">
             <w:r>
               <w:rPr>
                 <w:rStyle w:val="Hiperligao"/>
@@ -2033,7 +2033,7 @@
                 <w:noProof/>
                 <w:webHidden/>
               </w:rPr>
-              <w:instrText xml:space="preserve"> PAGEREF _Toc211610926 \h </w:instrText>
+              <w:instrText xml:space="preserve"> PAGEREF _Toc211616111 \h </w:instrText>
             </w:r>
             <w:r>
               <w:rPr>
@@ -2053,7 +2053,7 @@
                 <w:noProof/>
                 <w:webHidden/>
               </w:rPr>
-              <w:t>15</w:t>
+              <w:t>14</w:t>
             </w:r>
             <w:r>
               <w:rPr>
@@ -2078,7 +2078,7 @@
               <w14:ligatures w14:val="standardContextual"/>
             </w:rPr>
           </w:pPr>
-          <w:hyperlink w:anchor="_Toc211610927" w:history="1">
+          <w:hyperlink w:anchor="_Toc211616112" w:history="1">
             <w:r>
               <w:rPr>
                 <w:rStyle w:val="Hiperligao"/>
@@ -2105,7 +2105,7 @@
                 <w:noProof/>
                 <w:webHidden/>
               </w:rPr>
-              <w:instrText xml:space="preserve"> PAGEREF _Toc211610927 \h </w:instrText>
+              <w:instrText xml:space="preserve"> PAGEREF _Toc211616112 \h </w:instrText>
             </w:r>
             <w:r>
               <w:rPr>
@@ -2125,7 +2125,7 @@
                 <w:noProof/>
                 <w:webHidden/>
               </w:rPr>
-              <w:t>17</w:t>
+              <w:t>16</w:t>
             </w:r>
             <w:r>
               <w:rPr>
@@ -2150,7 +2150,7 @@
               <w14:ligatures w14:val="standardContextual"/>
             </w:rPr>
           </w:pPr>
-          <w:hyperlink w:anchor="_Toc211610928" w:history="1">
+          <w:hyperlink w:anchor="_Toc211616113" w:history="1">
             <w:r>
               <w:rPr>
                 <w:rStyle w:val="Hiperligao"/>
@@ -2177,7 +2177,7 @@
                 <w:noProof/>
                 <w:webHidden/>
               </w:rPr>
-              <w:instrText xml:space="preserve"> PAGEREF _Toc211610928 \h </w:instrText>
+              <w:instrText xml:space="preserve"> PAGEREF _Toc211616113 \h </w:instrText>
             </w:r>
             <w:r>
               <w:rPr>
@@ -2197,7 +2197,7 @@
                 <w:noProof/>
                 <w:webHidden/>
               </w:rPr>
-              <w:t>17</w:t>
+              <w:t>16</w:t>
             </w:r>
             <w:r>
               <w:rPr>
@@ -2222,7 +2222,7 @@
               <w14:ligatures w14:val="standardContextual"/>
             </w:rPr>
           </w:pPr>
-          <w:hyperlink w:anchor="_Toc211610929" w:history="1">
+          <w:hyperlink w:anchor="_Toc211616114" w:history="1">
             <w:r>
               <w:rPr>
                 <w:rStyle w:val="Hiperligao"/>
@@ -2249,7 +2249,7 @@
                 <w:noProof/>
                 <w:webHidden/>
               </w:rPr>
-              <w:instrText xml:space="preserve"> PAGEREF _Toc211610929 \h </w:instrText>
+              <w:instrText xml:space="preserve"> PAGEREF _Toc211616114 \h </w:instrText>
             </w:r>
             <w:r>
               <w:rPr>
@@ -2269,7 +2269,7 @@
                 <w:noProof/>
                 <w:webHidden/>
               </w:rPr>
-              <w:t>17</w:t>
+              <w:t>16</w:t>
             </w:r>
             <w:r>
               <w:rPr>
@@ -2294,7 +2294,7 @@
               <w14:ligatures w14:val="standardContextual"/>
             </w:rPr>
           </w:pPr>
-          <w:hyperlink w:anchor="_Toc211610930" w:history="1">
+          <w:hyperlink w:anchor="_Toc211616115" w:history="1">
             <w:r>
               <w:rPr>
                 <w:rStyle w:val="Hiperligao"/>
@@ -2321,7 +2321,7 @@
                 <w:noProof/>
                 <w:webHidden/>
               </w:rPr>
-              <w:instrText xml:space="preserve"> PAGEREF _Toc211610930 \h </w:instrText>
+              <w:instrText xml:space="preserve"> PAGEREF _Toc211616115 \h </w:instrText>
             </w:r>
             <w:r>
               <w:rPr>
@@ -2341,7 +2341,7 @@
                 <w:noProof/>
                 <w:webHidden/>
               </w:rPr>
-              <w:t>17</w:t>
+              <w:t>16</w:t>
             </w:r>
             <w:r>
               <w:rPr>
@@ -2366,7 +2366,7 @@
               <w14:ligatures w14:val="standardContextual"/>
             </w:rPr>
           </w:pPr>
-          <w:hyperlink w:anchor="_Toc211610931" w:history="1">
+          <w:hyperlink w:anchor="_Toc211616116" w:history="1">
             <w:r>
               <w:rPr>
                 <w:rStyle w:val="Hiperligao"/>
@@ -2393,7 +2393,7 @@
                 <w:noProof/>
                 <w:webHidden/>
               </w:rPr>
-              <w:instrText xml:space="preserve"> PAGEREF _Toc211610931 \h </w:instrText>
+              <w:instrText xml:space="preserve"> PAGEREF _Toc211616116 \h </w:instrText>
             </w:r>
             <w:r>
               <w:rPr>
@@ -2413,7 +2413,7 @@
                 <w:noProof/>
                 <w:webHidden/>
               </w:rPr>
-              <w:t>17</w:t>
+              <w:t>16</w:t>
             </w:r>
             <w:r>
               <w:rPr>
@@ -2438,7 +2438,7 @@
               <w14:ligatures w14:val="standardContextual"/>
             </w:rPr>
           </w:pPr>
-          <w:hyperlink w:anchor="_Toc211610932" w:history="1">
+          <w:hyperlink w:anchor="_Toc211616117" w:history="1">
             <w:r>
               <w:rPr>
                 <w:rStyle w:val="Hiperligao"/>
@@ -2465,7 +2465,7 @@
                 <w:noProof/>
                 <w:webHidden/>
               </w:rPr>
-              <w:instrText xml:space="preserve"> PAGEREF _Toc211610932 \h </w:instrText>
+              <w:instrText xml:space="preserve"> PAGEREF _Toc211616117 \h </w:instrText>
             </w:r>
             <w:r>
               <w:rPr>
@@ -2485,7 +2485,7 @@
                 <w:noProof/>
                 <w:webHidden/>
               </w:rPr>
-              <w:t>17</w:t>
+              <w:t>16</w:t>
             </w:r>
             <w:r>
               <w:rPr>
@@ -2510,7 +2510,7 @@
               <w14:ligatures w14:val="standardContextual"/>
             </w:rPr>
           </w:pPr>
-          <w:hyperlink w:anchor="_Toc211610933" w:history="1">
+          <w:hyperlink w:anchor="_Toc211616118" w:history="1">
             <w:r>
               <w:rPr>
                 <w:rStyle w:val="Hiperligao"/>
@@ -2537,7 +2537,7 @@
                 <w:noProof/>
                 <w:webHidden/>
               </w:rPr>
-              <w:instrText xml:space="preserve"> PAGEREF _Toc211610933 \h </w:instrText>
+              <w:instrText xml:space="preserve"> PAGEREF _Toc211616118 \h </w:instrText>
             </w:r>
             <w:r>
               <w:rPr>
@@ -2557,7 +2557,7 @@
                 <w:noProof/>
                 <w:webHidden/>
               </w:rPr>
-              <w:t>17</w:t>
+              <w:t>16</w:t>
             </w:r>
             <w:r>
               <w:rPr>
@@ -2582,7 +2582,7 @@
               <w14:ligatures w14:val="standardContextual"/>
             </w:rPr>
           </w:pPr>
-          <w:hyperlink w:anchor="_Toc211610934" w:history="1">
+          <w:hyperlink w:anchor="_Toc211616119" w:history="1">
             <w:r>
               <w:rPr>
                 <w:rStyle w:val="Hiperligao"/>
@@ -2609,7 +2609,7 @@
                 <w:noProof/>
                 <w:webHidden/>
               </w:rPr>
-              <w:instrText xml:space="preserve"> PAGEREF _Toc211610934 \h </w:instrText>
+              <w:instrText xml:space="preserve"> PAGEREF _Toc211616119 \h </w:instrText>
             </w:r>
             <w:r>
               <w:rPr>
@@ -2629,7 +2629,7 @@
                 <w:noProof/>
                 <w:webHidden/>
               </w:rPr>
-              <w:t>18</w:t>
+              <w:t>17</w:t>
             </w:r>
             <w:r>
               <w:rPr>
@@ -2654,7 +2654,7 @@
               <w14:ligatures w14:val="standardContextual"/>
             </w:rPr>
           </w:pPr>
-          <w:hyperlink w:anchor="_Toc211610935" w:history="1">
+          <w:hyperlink w:anchor="_Toc211616120" w:history="1">
             <w:r>
               <w:rPr>
                 <w:rStyle w:val="Hiperligao"/>
@@ -2681,7 +2681,7 @@
                 <w:noProof/>
                 <w:webHidden/>
               </w:rPr>
-              <w:instrText xml:space="preserve"> PAGEREF _Toc211610935 \h </w:instrText>
+              <w:instrText xml:space="preserve"> PAGEREF _Toc211616120 \h </w:instrText>
             </w:r>
             <w:r>
               <w:rPr>
@@ -2701,7 +2701,7 @@
                 <w:noProof/>
                 <w:webHidden/>
               </w:rPr>
-              <w:t>18</w:t>
+              <w:t>17</w:t>
             </w:r>
             <w:r>
               <w:rPr>
@@ -2726,7 +2726,7 @@
               <w14:ligatures w14:val="standardContextual"/>
             </w:rPr>
           </w:pPr>
-          <w:hyperlink w:anchor="_Toc211610936" w:history="1">
+          <w:hyperlink w:anchor="_Toc211616121" w:history="1">
             <w:r>
               <w:rPr>
                 <w:rStyle w:val="Hiperligao"/>
@@ -2753,7 +2753,7 @@
                 <w:noProof/>
                 <w:webHidden/>
               </w:rPr>
-              <w:instrText xml:space="preserve"> PAGEREF _Toc211610936 \h </w:instrText>
+              <w:instrText xml:space="preserve"> PAGEREF _Toc211616121 \h </w:instrText>
             </w:r>
             <w:r>
               <w:rPr>
@@ -2773,7 +2773,7 @@
                 <w:noProof/>
                 <w:webHidden/>
               </w:rPr>
-              <w:t>18</w:t>
+              <w:t>17</w:t>
             </w:r>
             <w:r>
               <w:rPr>
@@ -2798,7 +2798,7 @@
               <w14:ligatures w14:val="standardContextual"/>
             </w:rPr>
           </w:pPr>
-          <w:hyperlink w:anchor="_Toc211610937" w:history="1">
+          <w:hyperlink w:anchor="_Toc211616122" w:history="1">
             <w:r>
               <w:rPr>
                 <w:rStyle w:val="Hiperligao"/>
@@ -2825,7 +2825,7 @@
                 <w:noProof/>
                 <w:webHidden/>
               </w:rPr>
-              <w:instrText xml:space="preserve"> PAGEREF _Toc211610937 \h </w:instrText>
+              <w:instrText xml:space="preserve"> PAGEREF _Toc211616122 \h </w:instrText>
             </w:r>
             <w:r>
               <w:rPr>
@@ -2845,7 +2845,7 @@
                 <w:noProof/>
                 <w:webHidden/>
               </w:rPr>
-              <w:t>19</w:t>
+              <w:t>18</w:t>
             </w:r>
             <w:r>
               <w:rPr>
@@ -2870,7 +2870,7 @@
               <w14:ligatures w14:val="standardContextual"/>
             </w:rPr>
           </w:pPr>
-          <w:hyperlink w:anchor="_Toc211610938" w:history="1">
+          <w:hyperlink w:anchor="_Toc211616123" w:history="1">
             <w:r>
               <w:rPr>
                 <w:rStyle w:val="Hiperligao"/>
@@ -2898,7 +2898,7 @@
                 <w:noProof/>
                 <w:webHidden/>
               </w:rPr>
-              <w:instrText xml:space="preserve"> PAGEREF _Toc211610938 \h </w:instrText>
+              <w:instrText xml:space="preserve"> PAGEREF _Toc211616123 \h </w:instrText>
             </w:r>
             <w:r>
               <w:rPr>
@@ -2918,7 +2918,7 @@
                 <w:noProof/>
                 <w:webHidden/>
               </w:rPr>
-              <w:t>19</w:t>
+              <w:t>18</w:t>
             </w:r>
             <w:r>
               <w:rPr>
@@ -2943,7 +2943,7 @@
               <w14:ligatures w14:val="standardContextual"/>
             </w:rPr>
           </w:pPr>
-          <w:hyperlink w:anchor="_Toc211610939" w:history="1">
+          <w:hyperlink w:anchor="_Toc211616124" w:history="1">
             <w:r>
               <w:rPr>
                 <w:rStyle w:val="Hiperligao"/>
@@ -2970,7 +2970,7 @@
                 <w:noProof/>
                 <w:webHidden/>
               </w:rPr>
-              <w:instrText xml:space="preserve"> PAGEREF _Toc211610939 \h </w:instrText>
+              <w:instrText xml:space="preserve"> PAGEREF _Toc211616124 \h </w:instrText>
             </w:r>
             <w:r>
               <w:rPr>
@@ -2990,7 +2990,7 @@
                 <w:noProof/>
                 <w:webHidden/>
               </w:rPr>
-              <w:t>19</w:t>
+              <w:t>18</w:t>
             </w:r>
             <w:r>
               <w:rPr>
@@ -3015,7 +3015,7 @@
               <w14:ligatures w14:val="standardContextual"/>
             </w:rPr>
           </w:pPr>
-          <w:hyperlink w:anchor="_Toc211610940" w:history="1">
+          <w:hyperlink w:anchor="_Toc211616125" w:history="1">
             <w:r>
               <w:rPr>
                 <w:rStyle w:val="Hiperligao"/>
@@ -3042,7 +3042,7 @@
                 <w:noProof/>
                 <w:webHidden/>
               </w:rPr>
-              <w:instrText xml:space="preserve"> PAGEREF _Toc211610940 \h </w:instrText>
+              <w:instrText xml:space="preserve"> PAGEREF _Toc211616125 \h </w:instrText>
             </w:r>
             <w:r>
               <w:rPr>
@@ -3062,7 +3062,7 @@
                 <w:noProof/>
                 <w:webHidden/>
               </w:rPr>
-              <w:t>23</w:t>
+              <w:t>22</w:t>
             </w:r>
             <w:r>
               <w:rPr>
@@ -3087,7 +3087,7 @@
               <w14:ligatures w14:val="standardContextual"/>
             </w:rPr>
           </w:pPr>
-          <w:hyperlink w:anchor="_Toc211610941" w:history="1">
+          <w:hyperlink w:anchor="_Toc211616126" w:history="1">
             <w:r>
               <w:rPr>
                 <w:rStyle w:val="Hiperligao"/>
@@ -3114,7 +3114,7 @@
                 <w:noProof/>
                 <w:webHidden/>
               </w:rPr>
-              <w:instrText xml:space="preserve"> PAGEREF _Toc211610941 \h </w:instrText>
+              <w:instrText xml:space="preserve"> PAGEREF _Toc211616126 \h </w:instrText>
             </w:r>
             <w:r>
               <w:rPr>
@@ -3134,7 +3134,7 @@
                 <w:noProof/>
                 <w:webHidden/>
               </w:rPr>
-              <w:t>24</w:t>
+              <w:t>23</w:t>
             </w:r>
             <w:r>
               <w:rPr>
@@ -3159,7 +3159,7 @@
               <w14:ligatures w14:val="standardContextual"/>
             </w:rPr>
           </w:pPr>
-          <w:hyperlink w:anchor="_Toc211610942" w:history="1">
+          <w:hyperlink w:anchor="_Toc211616127" w:history="1">
             <w:r>
               <w:rPr>
                 <w:rStyle w:val="Hiperligao"/>
@@ -3188,7 +3188,7 @@
                 <w:noProof/>
                 <w:webHidden/>
               </w:rPr>
-              <w:instrText xml:space="preserve"> PAGEREF _Toc211610942 \h </w:instrText>
+              <w:instrText xml:space="preserve"> PAGEREF _Toc211616127 \h </w:instrText>
             </w:r>
             <w:r>
               <w:rPr>
@@ -3208,7 +3208,7 @@
                 <w:noProof/>
                 <w:webHidden/>
               </w:rPr>
-              <w:t>24</w:t>
+              <w:t>23</w:t>
             </w:r>
             <w:r>
               <w:rPr>
@@ -3233,7 +3233,7 @@
               <w14:ligatures w14:val="standardContextual"/>
             </w:rPr>
           </w:pPr>
-          <w:hyperlink w:anchor="_Toc211610943" w:history="1">
+          <w:hyperlink w:anchor="_Toc211616128" w:history="1">
             <w:r>
               <w:rPr>
                 <w:rStyle w:val="Hiperligao"/>
@@ -3262,7 +3262,7 @@
                 <w:noProof/>
                 <w:webHidden/>
               </w:rPr>
-              <w:instrText xml:space="preserve"> PAGEREF _Toc211610943 \h </w:instrText>
+              <w:instrText xml:space="preserve"> PAGEREF _Toc211616128 \h </w:instrText>
             </w:r>
             <w:r>
               <w:rPr>
@@ -3282,7 +3282,7 @@
                 <w:noProof/>
                 <w:webHidden/>
               </w:rPr>
-              <w:t>26</w:t>
+              <w:t>25</w:t>
             </w:r>
             <w:r>
               <w:rPr>
@@ -3307,7 +3307,7 @@
               <w14:ligatures w14:val="standardContextual"/>
             </w:rPr>
           </w:pPr>
-          <w:hyperlink w:anchor="_Toc211610944" w:history="1">
+          <w:hyperlink w:anchor="_Toc211616129" w:history="1">
             <w:r>
               <w:rPr>
                 <w:rStyle w:val="Hiperligao"/>
@@ -3336,7 +3336,7 @@
                 <w:noProof/>
                 <w:webHidden/>
               </w:rPr>
-              <w:instrText xml:space="preserve"> PAGEREF _Toc211610944 \h </w:instrText>
+              <w:instrText xml:space="preserve"> PAGEREF _Toc211616129 \h </w:instrText>
             </w:r>
             <w:r>
               <w:rPr>
@@ -3356,7 +3356,7 @@
                 <w:noProof/>
                 <w:webHidden/>
               </w:rPr>
-              <w:t>28</w:t>
+              <w:t>27</w:t>
             </w:r>
             <w:r>
               <w:rPr>
@@ -3413,7 +3413,7 @@
           <w:lang w:bidi="pt-PT"/>
         </w:rPr>
       </w:pPr>
-      <w:bookmarkStart w:id="4" w:name="_Toc211610907"/>
+      <w:bookmarkStart w:id="4" w:name="_Toc211616092"/>
       <w:r>
         <w:rPr>
           <w:sz w:val="24"/>
@@ -3439,7 +3439,7 @@
           <w:lang w:bidi="pt-PT"/>
         </w:rPr>
       </w:pPr>
-      <w:bookmarkStart w:id="5" w:name="_Toc211610908"/>
+      <w:bookmarkStart w:id="5" w:name="_Toc211616093"/>
       <w:r>
         <w:rPr>
           <w:lang w:bidi="pt-PT"/>
@@ -4843,7 +4843,7 @@
       <w:pPr>
         <w:pStyle w:val="Ttulo2"/>
       </w:pPr>
-      <w:bookmarkStart w:id="6" w:name="_Toc211610909"/>
+      <w:bookmarkStart w:id="6" w:name="_Toc211616094"/>
       <w:r>
         <w:t>Abreviaturas</w:t>
       </w:r>
@@ -4980,72 +4980,137 @@
       </w:r>
       <w:proofErr w:type="spellEnd"/>
       <w:r>
-        <w:t xml:space="preserve">, Social </w:t>
+        <w:t xml:space="preserve">, Social and </w:t>
       </w:r>
       <w:proofErr w:type="spellStart"/>
       <w:r>
-        <w:t>and</w:t>
+        <w:t>Governance</w:t>
       </w:r>
       <w:proofErr w:type="spellEnd"/>
       <w:r>
+        <w:t xml:space="preserve"> (</w:t>
+      </w:r>
+      <w:r>
+        <w:t>Ambiental, Social e Governança</w:t>
+      </w:r>
+      <w:r>
+        <w:t>)</w:t>
+      </w:r>
+      <w:r>
+        <w:t>;</w:t>
+      </w:r>
+    </w:p>
+    <w:p>
+      <w:r>
+        <w:t xml:space="preserve">SWOT - </w:t>
+      </w:r>
+      <w:proofErr w:type="spellStart"/>
+      <w:r>
+        <w:t>Strengths</w:t>
+      </w:r>
+      <w:proofErr w:type="spellEnd"/>
+      <w:r>
+        <w:t>, </w:t>
+      </w:r>
+      <w:proofErr w:type="spellStart"/>
+      <w:r>
+        <w:t>Weaknesses</w:t>
+      </w:r>
+      <w:proofErr w:type="spellEnd"/>
+      <w:r>
+        <w:t>, </w:t>
+      </w:r>
+      <w:proofErr w:type="spellStart"/>
+      <w:r>
+        <w:t>Opportunities</w:t>
+      </w:r>
+      <w:proofErr w:type="spellEnd"/>
+      <w:r>
+        <w:t> e </w:t>
+      </w:r>
+      <w:proofErr w:type="spellStart"/>
+      <w:r>
+        <w:t>Threats</w:t>
+      </w:r>
+      <w:proofErr w:type="spellEnd"/>
+      <w:r>
+        <w:t> </w:t>
+      </w:r>
+      <w:r>
+        <w:t>(Forças, Fraquezas, Oportunidades, Ameaças)</w:t>
+      </w:r>
+      <w:r>
+        <w:t>;</w:t>
+      </w:r>
+    </w:p>
+    <w:p>
+      <w:r>
+        <w:t xml:space="preserve">ODS - </w:t>
+      </w:r>
+      <w:r>
+        <w:t>Objetivos de Desenvolvimento Sustentável</w:t>
+      </w:r>
+      <w:r>
+        <w:t>;</w:t>
+      </w:r>
+    </w:p>
+    <w:p>
+      <w:r>
+        <w:t>LED</w:t>
+      </w:r>
+      <w:r>
+        <w:t xml:space="preserve"> - L</w:t>
+      </w:r>
+      <w:r>
+        <w:t>ight-</w:t>
+      </w:r>
+      <w:proofErr w:type="spellStart"/>
+      <w:r>
+        <w:t>emitting</w:t>
+      </w:r>
+      <w:proofErr w:type="spellEnd"/>
+      <w:r>
         <w:t xml:space="preserve"> </w:t>
       </w:r>
       <w:proofErr w:type="spellStart"/>
       <w:r>
-        <w:t>Governance</w:t>
+        <w:t>diode</w:t>
       </w:r>
       <w:proofErr w:type="spellEnd"/>
       <w:r>
-        <w:t xml:space="preserve"> (</w:t>
-      </w:r>
-      <w:r>
-        <w:t>Ambiental, Social e Governança</w:t>
-      </w:r>
-      <w:r>
-        <w:t>)</w:t>
+        <w:t xml:space="preserve"> (Díodo emissor de luz)</w:t>
       </w:r>
       <w:r>
         <w:t>;</w:t>
       </w:r>
     </w:p>
     <w:p>
-      <w:r>
-        <w:t xml:space="preserve">SWOT - </w:t>
-      </w:r>
       <w:proofErr w:type="spellStart"/>
       <w:r>
-        <w:t>Strengths</w:t>
+        <w:t>IoT</w:t>
       </w:r>
       <w:proofErr w:type="spellEnd"/>
       <w:r>
-        <w:t>, </w:t>
+        <w:t xml:space="preserve"> -</w:t>
+      </w:r>
+      <w:r>
+        <w:t xml:space="preserve"> Internet </w:t>
       </w:r>
       <w:proofErr w:type="spellStart"/>
       <w:r>
-        <w:t>Weaknesses</w:t>
+        <w:t>of</w:t>
       </w:r>
       <w:proofErr w:type="spellEnd"/>
       <w:r>
-        <w:t>, </w:t>
+        <w:t xml:space="preserve"> </w:t>
       </w:r>
       <w:proofErr w:type="spellStart"/>
       <w:r>
-        <w:t>Opportunities</w:t>
+        <w:t>Things</w:t>
       </w:r>
       <w:proofErr w:type="spellEnd"/>
       <w:r>
-        <w:t> e </w:t>
-      </w:r>
-      <w:proofErr w:type="spellStart"/>
-      <w:r>
-        <w:t>Threats</w:t>
-      </w:r>
-      <w:proofErr w:type="spellEnd"/>
-      <w:r>
-        <w:t> </w:t>
-      </w:r>
-      <w:r>
-        <w:t>(Forças, Fraquezas, Oportunidades, Ameaças)</w:t>
+        <w:t xml:space="preserve"> (Internet das coisas)</w:t>
       </w:r>
       <w:r>
         <w:t>;</w:t>
@@ -5053,10 +5118,13 @@
     </w:p>
     <w:p>
       <w:r>
-        <w:t xml:space="preserve">ODS - </w:t>
-      </w:r>
-      <w:r>
-        <w:t>Objetivos de Desenvolvimento Sustentável</w:t>
+        <w:t xml:space="preserve">TEU </w:t>
+      </w:r>
+      <w:r>
+        <w:t>-</w:t>
+      </w:r>
+      <w:r>
+        <w:t xml:space="preserve"> 1 Unidade equivalente a 20 pés</w:t>
       </w:r>
       <w:r>
         <w:t>;</w:t>
@@ -5064,82 +5132,6 @@
     </w:p>
     <w:p>
       <w:r>
-        <w:t>LED</w:t>
-      </w:r>
-      <w:r>
-        <w:t xml:space="preserve"> - L</w:t>
-      </w:r>
-      <w:r>
-        <w:t>ight-</w:t>
-      </w:r>
-      <w:proofErr w:type="spellStart"/>
-      <w:r>
-        <w:t>emitting</w:t>
-      </w:r>
-      <w:proofErr w:type="spellEnd"/>
-      <w:r>
-        <w:t xml:space="preserve"> </w:t>
-      </w:r>
-      <w:proofErr w:type="spellStart"/>
-      <w:r>
-        <w:t>diode</w:t>
-      </w:r>
-      <w:proofErr w:type="spellEnd"/>
-      <w:r>
-        <w:t xml:space="preserve"> (Díodo emissor de luz)</w:t>
-      </w:r>
-      <w:r>
-        <w:t>;</w:t>
-      </w:r>
-    </w:p>
-    <w:p>
-      <w:proofErr w:type="spellStart"/>
-      <w:r>
-        <w:t>IoT</w:t>
-      </w:r>
-      <w:proofErr w:type="spellEnd"/>
-      <w:r>
-        <w:t xml:space="preserve"> -</w:t>
-      </w:r>
-      <w:r>
-        <w:t xml:space="preserve"> Internet </w:t>
-      </w:r>
-      <w:proofErr w:type="spellStart"/>
-      <w:r>
-        <w:t>of</w:t>
-      </w:r>
-      <w:proofErr w:type="spellEnd"/>
-      <w:r>
-        <w:t xml:space="preserve"> </w:t>
-      </w:r>
-      <w:proofErr w:type="spellStart"/>
-      <w:r>
-        <w:t>Things</w:t>
-      </w:r>
-      <w:proofErr w:type="spellEnd"/>
-      <w:r>
-        <w:t xml:space="preserve"> (Internet das coisas)</w:t>
-      </w:r>
-      <w:r>
-        <w:t>;</w:t>
-      </w:r>
-    </w:p>
-    <w:p>
-      <w:r>
-        <w:t xml:space="preserve">TEU </w:t>
-      </w:r>
-      <w:r>
-        <w:t>-</w:t>
-      </w:r>
-      <w:r>
-        <w:t xml:space="preserve"> 1 Unidade equivalente a 20 pés</w:t>
-      </w:r>
-      <w:r>
-        <w:t>;</w:t>
-      </w:r>
-    </w:p>
-    <w:p>
-      <w:r>
         <w:br w:type="page"/>
       </w:r>
     </w:p>
@@ -5147,7 +5139,7 @@
       <w:pPr>
         <w:pStyle w:val="Ttulo1"/>
       </w:pPr>
-      <w:bookmarkStart w:id="7" w:name="_Toc211610910"/>
+      <w:bookmarkStart w:id="7" w:name="_Toc211616095"/>
       <w:r>
         <w:lastRenderedPageBreak/>
         <w:t>Parte I – Introdução e estrutura do trabalho</w:t>
@@ -5158,7 +5150,7 @@
       <w:pPr>
         <w:pStyle w:val="Ttulo2"/>
       </w:pPr>
-      <w:bookmarkStart w:id="8" w:name="_Toc211610911"/>
+      <w:bookmarkStart w:id="8" w:name="_Toc211616096"/>
       <w:r>
         <w:t>I.1 Caracterização da organização</w:t>
       </w:r>
@@ -5175,7 +5167,7 @@
           <w:szCs w:val="22"/>
         </w:rPr>
       </w:pPr>
-      <w:bookmarkStart w:id="9" w:name="_Toc211610912"/>
+      <w:bookmarkStart w:id="9" w:name="_Toc211616097"/>
       <w:r>
         <w:rPr>
           <w:b/>
@@ -5209,7 +5201,7 @@
           <w:szCs w:val="22"/>
         </w:rPr>
       </w:pPr>
-      <w:bookmarkStart w:id="10" w:name="_Toc211610913"/>
+      <w:bookmarkStart w:id="10" w:name="_Toc211616098"/>
       <w:r>
         <w:rPr>
           <w:b/>
@@ -5257,7 +5249,7 @@
           <w:szCs w:val="22"/>
         </w:rPr>
       </w:pPr>
-      <w:bookmarkStart w:id="11" w:name="_Toc211610914"/>
+      <w:bookmarkStart w:id="11" w:name="_Toc211616099"/>
       <w:r>
         <w:rPr>
           <w:b/>
@@ -5277,7 +5269,13 @@
     </w:p>
     <w:p>
       <w:r>
-        <w:t>Integra ainda a ZALSINES – Zona Industrial e Logística de Sines –, com mais de 2.000 hectares, que apoia atividades industriais e logísticas complementares.</w:t>
+        <w:t>Integra ainda a ZALSINES</w:t>
+      </w:r>
+      <w:r>
+        <w:t xml:space="preserve">, </w:t>
+      </w:r>
+      <w:r>
+        <w:t>com mais de 2.000 hectares, que apoia atividades industriais e logísticas complementares.</w:t>
       </w:r>
     </w:p>
     <w:p>
@@ -5291,7 +5289,7 @@
           <w:szCs w:val="22"/>
         </w:rPr>
       </w:pPr>
-      <w:bookmarkStart w:id="12" w:name="_Toc211610915"/>
+      <w:bookmarkStart w:id="12" w:name="_Toc211616100"/>
       <w:r>
         <w:rPr>
           <w:b/>
@@ -6560,6 +6558,7 @@
           <w:szCs w:val="22"/>
         </w:rPr>
       </w:pPr>
+      <w:bookmarkStart w:id="13" w:name="_Toc211616101"/>
       <w:r>
         <w:rPr>
           <w:b/>
@@ -6568,18 +6567,7 @@
           <w:sz w:val="22"/>
           <w:szCs w:val="22"/>
         </w:rPr>
-        <w:t xml:space="preserve">Principais </w:t>
-      </w:r>
-      <w:bookmarkStart w:id="13" w:name="_Toc211610916"/>
-      <w:r>
-        <w:rPr>
-          <w:b/>
-          <w:bCs/>
-          <w:color w:val="auto"/>
-          <w:sz w:val="22"/>
-          <w:szCs w:val="22"/>
-        </w:rPr>
-        <w:t>Mercados e Parceiros Internacionais</w:t>
+        <w:t>Principais Mercados e Parceiros Internacionais</w:t>
       </w:r>
       <w:bookmarkEnd w:id="13"/>
     </w:p>
@@ -6786,7 +6774,7 @@
           <w:noProof/>
         </w:rPr>
         <w:drawing>
-          <wp:inline distT="0" distB="0" distL="0" distR="0" wp14:anchorId="68B4EA67" wp14:editId="63682785">
+          <wp:inline distT="0" distB="0" distL="0" distR="0" wp14:anchorId="68B4EA67" wp14:editId="65851DD7">
             <wp:extent cx="5226685" cy="3020060"/>
             <wp:effectExtent l="19050" t="19050" r="12065" b="27940"/>
             <wp:docPr id="1965649793" name="Imagem 6" descr="Uma imagem com texto, mapa, captura de ecrã, diagrama&#10;&#10;Os conteúdos gerados por IA podem estar incorretos."/>
@@ -6936,18 +6924,6 @@
         <w:t xml:space="preserve"> logístico e energético português, com forte integração nos mercados internacionais.</w:t>
       </w:r>
     </w:p>
-    <w:p/>
-    <w:p/>
-    <w:p>
-      <w:pPr>
-        <w:pStyle w:val="Ttulo2"/>
-      </w:pPr>
-      <w:bookmarkStart w:id="15" w:name="_Toc211610917"/>
-      <w:r>
-        <w:t>I.2 Fontes de informação</w:t>
-      </w:r>
-      <w:bookmarkEnd w:id="15"/>
-    </w:p>
     <w:p>
       <w:pPr>
         <w:spacing w:line="240" w:lineRule="auto"/>
@@ -6956,13 +6932,25 @@
     </w:p>
     <w:p>
       <w:pPr>
+        <w:jc w:val="left"/>
+        <w:rPr>
+          <w:rFonts w:cs="Times New Roman"/>
+          <w:b/>
+        </w:rPr>
+      </w:pPr>
+      <w:bookmarkStart w:id="15" w:name="_Toc211616103"/>
+      <w:r>
+        <w:br w:type="page"/>
+      </w:r>
+    </w:p>
+    <w:p>
+      <w:pPr>
         <w:pStyle w:val="Ttulo1"/>
         <w:rPr>
           <w:rFonts w:cstheme="minorBidi"/>
           <w:szCs w:val="22"/>
         </w:rPr>
       </w:pPr>
-      <w:bookmarkStart w:id="16" w:name="_Toc211610918"/>
       <w:r>
         <w:lastRenderedPageBreak/>
         <w:t xml:space="preserve">Parte II – </w:t>
@@ -6970,17 +6958,17 @@
       <w:r>
         <w:t>Desenvolvimento</w:t>
       </w:r>
+      <w:bookmarkEnd w:id="15"/>
+    </w:p>
+    <w:p>
+      <w:pPr>
+        <w:pStyle w:val="Ttulo2"/>
+      </w:pPr>
+      <w:bookmarkStart w:id="16" w:name="_Toc211616104"/>
+      <w:r>
+        <w:t>II.1 Organização</w:t>
+      </w:r>
       <w:bookmarkEnd w:id="16"/>
-    </w:p>
-    <w:p>
-      <w:pPr>
-        <w:pStyle w:val="Ttulo2"/>
-      </w:pPr>
-      <w:bookmarkStart w:id="17" w:name="_Toc211610919"/>
-      <w:r>
-        <w:t>II.1 Organização</w:t>
-      </w:r>
-      <w:bookmarkEnd w:id="17"/>
       <w:r>
         <w:t xml:space="preserve"> </w:t>
       </w:r>
@@ -6996,7 +6984,7 @@
           <w:szCs w:val="22"/>
         </w:rPr>
       </w:pPr>
-      <w:bookmarkStart w:id="18" w:name="_Toc211610920"/>
+      <w:bookmarkStart w:id="17" w:name="_Toc211616105"/>
       <w:r>
         <w:rPr>
           <w:b/>
@@ -7007,7 +6995,7 @@
         </w:rPr>
         <w:t>Estrutura organizacional</w:t>
       </w:r>
-      <w:bookmarkEnd w:id="18"/>
+      <w:bookmarkEnd w:id="17"/>
     </w:p>
     <w:p>
       <w:r>
@@ -7146,7 +7134,7 @@
           <w:color w:val="auto"/>
         </w:rPr>
       </w:pPr>
-      <w:bookmarkStart w:id="19" w:name="_Toc211611356"/>
+      <w:bookmarkStart w:id="18" w:name="_Toc211611356"/>
       <w:r>
         <w:rPr>
           <w:color w:val="auto"/>
@@ -7190,7 +7178,7 @@
         </w:rPr>
         <w:t xml:space="preserve"> - Estrutura Organizacional</w:t>
       </w:r>
-      <w:bookmarkEnd w:id="19"/>
+      <w:bookmarkEnd w:id="18"/>
     </w:p>
     <w:p>
       <w:r>
@@ -7238,7 +7226,7 @@
           <w:szCs w:val="22"/>
         </w:rPr>
       </w:pPr>
-      <w:bookmarkStart w:id="20" w:name="_Toc211610921"/>
+      <w:bookmarkStart w:id="19" w:name="_Toc211616106"/>
       <w:r>
         <w:rPr>
           <w:b/>
@@ -7249,7 +7237,7 @@
         </w:rPr>
         <w:t>Proposta de melhoria</w:t>
       </w:r>
-      <w:bookmarkEnd w:id="20"/>
+      <w:bookmarkEnd w:id="19"/>
     </w:p>
     <w:p>
       <w:r>
@@ -7504,11 +7492,11 @@
       <w:pPr>
         <w:pStyle w:val="Ttulo2"/>
       </w:pPr>
-      <w:bookmarkStart w:id="21" w:name="_Toc211610922"/>
+      <w:bookmarkStart w:id="20" w:name="_Toc211616107"/>
       <w:r>
         <w:t>II.2 Planeamento</w:t>
       </w:r>
-      <w:bookmarkEnd w:id="21"/>
+      <w:bookmarkEnd w:id="20"/>
     </w:p>
     <w:p>
       <w:r>
@@ -7537,7 +7525,7 @@
           <w:szCs w:val="22"/>
         </w:rPr>
       </w:pPr>
-      <w:bookmarkStart w:id="22" w:name="_Toc211610923"/>
+      <w:bookmarkStart w:id="21" w:name="_Toc211616108"/>
       <w:r>
         <w:rPr>
           <w:b/>
@@ -7548,7 +7536,7 @@
         </w:rPr>
         <w:t>Objetivos SMART</w:t>
       </w:r>
-      <w:bookmarkEnd w:id="22"/>
+      <w:bookmarkEnd w:id="21"/>
     </w:p>
     <w:tbl>
       <w:tblPr>
@@ -7866,7 +7854,7 @@
           <w:szCs w:val="22"/>
         </w:rPr>
       </w:pPr>
-      <w:bookmarkStart w:id="23" w:name="_Toc211610924"/>
+      <w:bookmarkStart w:id="22" w:name="_Toc211616109"/>
       <w:r>
         <w:rPr>
           <w:b/>
@@ -7877,7 +7865,7 @@
         </w:rPr>
         <w:t>Análise SWOT</w:t>
       </w:r>
-      <w:bookmarkEnd w:id="23"/>
+      <w:bookmarkEnd w:id="22"/>
     </w:p>
     <w:p>
       <w:r>
@@ -8272,7 +8260,6 @@
           <w:szCs w:val="22"/>
         </w:rPr>
       </w:pPr>
-      <w:bookmarkStart w:id="24" w:name="_Toc211610925"/>
     </w:p>
     <w:p/>
     <w:p>
@@ -8286,6 +8273,7 @@
           <w:szCs w:val="20"/>
         </w:rPr>
       </w:pPr>
+      <w:bookmarkStart w:id="23" w:name="_Toc211616110"/>
       <w:r>
         <w:rPr>
           <w:b/>
@@ -8297,7 +8285,7 @@
         <w:lastRenderedPageBreak/>
         <w:t>Propostas Estratégica 1 - Sustentabilidade e Eficiência Energética</w:t>
       </w:r>
-      <w:bookmarkEnd w:id="24"/>
+      <w:bookmarkEnd w:id="23"/>
     </w:p>
     <w:p>
       <w:pPr>
@@ -8832,7 +8820,7 @@
           <w:szCs w:val="22"/>
         </w:rPr>
       </w:pPr>
-      <w:bookmarkStart w:id="25" w:name="_Toc211610926"/>
+      <w:bookmarkStart w:id="24" w:name="_Toc211616111"/>
       <w:r>
         <w:rPr>
           <w:b/>
@@ -8843,7 +8831,7 @@
         </w:rPr>
         <w:t>Propostas Estratégica 2 - Transformação Digital e Inovação Tecnológica</w:t>
       </w:r>
-      <w:bookmarkEnd w:id="25"/>
+      <w:bookmarkEnd w:id="24"/>
     </w:p>
     <w:p>
       <w:pPr>
@@ -9418,12 +9406,12 @@
       <w:pPr>
         <w:pStyle w:val="Ttulo2"/>
       </w:pPr>
-      <w:bookmarkStart w:id="26" w:name="_Toc211610927"/>
+      <w:bookmarkStart w:id="25" w:name="_Toc211616112"/>
       <w:r>
         <w:lastRenderedPageBreak/>
         <w:t>II.3 Controlo e Sistemas de informação</w:t>
       </w:r>
-      <w:bookmarkEnd w:id="26"/>
+      <w:bookmarkEnd w:id="25"/>
     </w:p>
     <w:p/>
     <w:p/>
@@ -9431,7 +9419,7 @@
       <w:pPr>
         <w:pStyle w:val="Ttulo2"/>
       </w:pPr>
-      <w:bookmarkStart w:id="27" w:name="_Toc211610928"/>
+      <w:bookmarkStart w:id="26" w:name="_Toc211616113"/>
       <w:r>
         <w:t>II.</w:t>
       </w:r>
@@ -9441,7 +9429,7 @@
       <w:r>
         <w:t>4 Direção e Gestão de Pessoas</w:t>
       </w:r>
-      <w:bookmarkEnd w:id="27"/>
+      <w:bookmarkEnd w:id="26"/>
     </w:p>
     <w:p/>
     <w:p/>
@@ -9449,11 +9437,11 @@
       <w:pPr>
         <w:pStyle w:val="Ttulo2"/>
       </w:pPr>
-      <w:bookmarkStart w:id="28" w:name="_Toc211610929"/>
+      <w:bookmarkStart w:id="27" w:name="_Toc211616114"/>
       <w:r>
         <w:t>II.5 Promoção da produtividade</w:t>
       </w:r>
-      <w:bookmarkEnd w:id="28"/>
+      <w:bookmarkEnd w:id="27"/>
     </w:p>
     <w:p/>
     <w:p/>
@@ -9461,11 +9449,11 @@
       <w:pPr>
         <w:pStyle w:val="Ttulo2"/>
       </w:pPr>
-      <w:bookmarkStart w:id="29" w:name="_Toc211610930"/>
+      <w:bookmarkStart w:id="28" w:name="_Toc211616115"/>
       <w:r>
         <w:t>II.6 Economia circular</w:t>
       </w:r>
-      <w:bookmarkEnd w:id="29"/>
+      <w:bookmarkEnd w:id="28"/>
     </w:p>
     <w:p/>
     <w:p/>
@@ -9473,14 +9461,14 @@
       <w:pPr>
         <w:pStyle w:val="Ttulo2"/>
       </w:pPr>
-      <w:bookmarkStart w:id="30" w:name="_Toc211610931"/>
+      <w:bookmarkStart w:id="29" w:name="_Toc211616116"/>
       <w:r>
         <w:t xml:space="preserve">II.7 </w:t>
       </w:r>
       <w:r>
         <w:t>Marketing</w:t>
       </w:r>
-      <w:bookmarkEnd w:id="30"/>
+      <w:bookmarkEnd w:id="29"/>
     </w:p>
     <w:p/>
     <w:p/>
@@ -9488,7 +9476,7 @@
       <w:pPr>
         <w:pStyle w:val="Ttulo2"/>
       </w:pPr>
-      <w:bookmarkStart w:id="31" w:name="_Toc211610932"/>
+      <w:bookmarkStart w:id="30" w:name="_Toc211616117"/>
       <w:r>
         <w:t>II.</w:t>
       </w:r>
@@ -9498,7 +9486,7 @@
       <w:r>
         <w:t>8 Gestão Financeira</w:t>
       </w:r>
-      <w:bookmarkEnd w:id="31"/>
+      <w:bookmarkEnd w:id="30"/>
     </w:p>
     <w:p/>
     <w:p/>
@@ -9506,11 +9494,11 @@
       <w:pPr>
         <w:pStyle w:val="Ttulo2"/>
       </w:pPr>
-      <w:bookmarkStart w:id="32" w:name="_Toc211610933"/>
+      <w:bookmarkStart w:id="31" w:name="_Toc211616118"/>
       <w:r>
         <w:t>II.9 Gestão das Operações e Indústria 4.0</w:t>
       </w:r>
-      <w:bookmarkEnd w:id="32"/>
+      <w:bookmarkEnd w:id="31"/>
     </w:p>
     <w:p/>
     <w:p>
@@ -9534,22 +9522,22 @@
           <w:szCs w:val="22"/>
         </w:rPr>
       </w:pPr>
-      <w:bookmarkStart w:id="33" w:name="_Toc211610934"/>
+      <w:bookmarkStart w:id="32" w:name="_Toc211616119"/>
       <w:r>
         <w:lastRenderedPageBreak/>
         <w:t>Parte III – Conclusão</w:t>
       </w:r>
+      <w:bookmarkEnd w:id="32"/>
+    </w:p>
+    <w:p>
+      <w:pPr>
+        <w:pStyle w:val="Ttulo2"/>
+      </w:pPr>
+      <w:bookmarkStart w:id="33" w:name="_Toc211616120"/>
+      <w:r>
+        <w:t>III.1 Conclusão</w:t>
+      </w:r>
       <w:bookmarkEnd w:id="33"/>
-    </w:p>
-    <w:p>
-      <w:pPr>
-        <w:pStyle w:val="Ttulo2"/>
-      </w:pPr>
-      <w:bookmarkStart w:id="34" w:name="_Toc211610935"/>
-      <w:r>
-        <w:t>III.1 Conclusão</w:t>
-      </w:r>
-      <w:bookmarkEnd w:id="34"/>
     </w:p>
     <w:p/>
     <w:p/>
@@ -9557,11 +9545,11 @@
       <w:pPr>
         <w:pStyle w:val="Ttulo2"/>
       </w:pPr>
-      <w:bookmarkStart w:id="35" w:name="_Toc211610936"/>
+      <w:bookmarkStart w:id="34" w:name="_Toc211616121"/>
       <w:r>
         <w:t>III.2 Sugestões de melhoria</w:t>
       </w:r>
-      <w:bookmarkEnd w:id="35"/>
+      <w:bookmarkEnd w:id="34"/>
     </w:p>
     <w:p>
       <w:pPr>
@@ -9571,14 +9559,14 @@
       <w:r>
         <w:br w:type="page"/>
       </w:r>
-      <w:bookmarkStart w:id="36" w:name="_Toc471979356"/>
-      <w:bookmarkStart w:id="37" w:name="_Toc211610937"/>
+      <w:bookmarkStart w:id="35" w:name="_Toc471979356"/>
+      <w:bookmarkStart w:id="36" w:name="_Toc211616122"/>
       <w:r>
         <w:lastRenderedPageBreak/>
         <w:t>Referências</w:t>
       </w:r>
+      <w:bookmarkEnd w:id="35"/>
       <w:bookmarkEnd w:id="36"/>
-      <w:bookmarkEnd w:id="37"/>
     </w:p>
     <w:p>
       <w:pPr>
@@ -9671,32 +9659,32 @@
           <w:rFonts w:eastAsia="Arial Narrow"/>
         </w:rPr>
       </w:pPr>
-      <w:bookmarkStart w:id="38" w:name="_Toc471979357"/>
-      <w:bookmarkStart w:id="39" w:name="_Toc211610938"/>
+      <w:bookmarkStart w:id="37" w:name="_Toc471979357"/>
+      <w:bookmarkStart w:id="38" w:name="_Toc211616123"/>
       <w:r>
         <w:rPr>
           <w:rFonts w:eastAsia="Arial Narrow"/>
         </w:rPr>
         <w:t>Anexos</w:t>
       </w:r>
+      <w:bookmarkEnd w:id="37"/>
       <w:bookmarkEnd w:id="38"/>
+      <w:r>
+        <w:rPr>
+          <w:rFonts w:eastAsia="Arial Narrow"/>
+        </w:rPr>
+        <w:t xml:space="preserve"> </w:t>
+      </w:r>
+    </w:p>
+    <w:p>
+      <w:pPr>
+        <w:pStyle w:val="Ttulo2"/>
+      </w:pPr>
+      <w:bookmarkStart w:id="39" w:name="_Toc211616124"/>
+      <w:r>
+        <w:t>Opções Estratégicas para o Porto de Sines (2020-2030)</w:t>
+      </w:r>
       <w:bookmarkEnd w:id="39"/>
-      <w:r>
-        <w:rPr>
-          <w:rFonts w:eastAsia="Arial Narrow"/>
-        </w:rPr>
-        <w:t xml:space="preserve"> </w:t>
-      </w:r>
-    </w:p>
-    <w:p>
-      <w:pPr>
-        <w:pStyle w:val="Ttulo2"/>
-      </w:pPr>
-      <w:bookmarkStart w:id="40" w:name="_Toc211610939"/>
-      <w:r>
-        <w:t>Opções Estratégicas para o Porto de Sines (2020-2030)</w:t>
-      </w:r>
-      <w:bookmarkEnd w:id="40"/>
     </w:p>
     <w:p>
       <w:pPr>
@@ -9765,7 +9753,7 @@
           <w:color w:val="auto"/>
         </w:rPr>
       </w:pPr>
-      <w:bookmarkStart w:id="41" w:name="_Toc211611357"/>
+      <w:bookmarkStart w:id="40" w:name="_Toc211611357"/>
       <w:r>
         <w:rPr>
           <w:color w:val="auto"/>
@@ -9809,7 +9797,7 @@
         </w:rPr>
         <w:t xml:space="preserve"> - Sistemas Portuários (conectividade)</w:t>
       </w:r>
-      <w:bookmarkEnd w:id="41"/>
+      <w:bookmarkEnd w:id="40"/>
     </w:p>
     <w:p>
       <w:pPr>
@@ -9887,7 +9875,7 @@
           <w:color w:val="auto"/>
         </w:rPr>
       </w:pPr>
-      <w:bookmarkStart w:id="42" w:name="_Toc211611358"/>
+      <w:bookmarkStart w:id="41" w:name="_Toc211611358"/>
       <w:r>
         <w:rPr>
           <w:color w:val="auto"/>
@@ -9931,7 +9919,7 @@
         </w:rPr>
         <w:t xml:space="preserve"> - Sistemas Portuários (comunidade)</w:t>
       </w:r>
-      <w:bookmarkEnd w:id="42"/>
+      <w:bookmarkEnd w:id="41"/>
     </w:p>
     <w:p>
       <w:pPr>
@@ -10022,7 +10010,7 @@
         <w:spacing w:line="276" w:lineRule="auto"/>
         <w:jc w:val="center"/>
       </w:pPr>
-      <w:bookmarkStart w:id="43" w:name="_Toc211611359"/>
+      <w:bookmarkStart w:id="42" w:name="_Toc211611359"/>
       <w:r>
         <w:rPr>
           <w:color w:val="auto"/>
@@ -10066,7 +10054,7 @@
         </w:rPr>
         <w:t xml:space="preserve"> - Iniciativas Estratégicas</w:t>
       </w:r>
-      <w:bookmarkEnd w:id="43"/>
+      <w:bookmarkEnd w:id="42"/>
     </w:p>
     <w:p>
       <w:pPr>
@@ -10136,7 +10124,7 @@
           <w:color w:val="auto"/>
         </w:rPr>
       </w:pPr>
-      <w:bookmarkStart w:id="44" w:name="_Toc211611360"/>
+      <w:bookmarkStart w:id="43" w:name="_Toc211611360"/>
       <w:r>
         <w:rPr>
           <w:color w:val="auto"/>
@@ -10194,7 +10182,7 @@
         </w:rPr>
         <w:t xml:space="preserve"> (riscos estratégicos)</w:t>
       </w:r>
-      <w:bookmarkEnd w:id="44"/>
+      <w:bookmarkEnd w:id="43"/>
     </w:p>
     <w:p>
       <w:pPr>
@@ -10270,7 +10258,7 @@
           <w:color w:val="auto"/>
         </w:rPr>
       </w:pPr>
-      <w:bookmarkStart w:id="45" w:name="_Toc211611361"/>
+      <w:bookmarkStart w:id="44" w:name="_Toc211611361"/>
       <w:r>
         <w:rPr>
           <w:color w:val="auto"/>
@@ -10314,7 +10302,7 @@
         </w:rPr>
         <w:t xml:space="preserve"> - Oportunidades (valor potencial)</w:t>
       </w:r>
-      <w:bookmarkEnd w:id="45"/>
+      <w:bookmarkEnd w:id="44"/>
     </w:p>
     <w:p>
       <w:pPr>
@@ -10378,7 +10366,7 @@
           <w:color w:val="auto"/>
         </w:rPr>
       </w:pPr>
-      <w:bookmarkStart w:id="46" w:name="_Toc211611362"/>
+      <w:bookmarkStart w:id="45" w:name="_Toc211611362"/>
       <w:r>
         <w:rPr>
           <w:color w:val="auto"/>
@@ -10436,7 +10424,7 @@
         </w:rPr>
         <w:t xml:space="preserve"> de competitividade (recursos e competências)</w:t>
       </w:r>
-      <w:bookmarkEnd w:id="46"/>
+      <w:bookmarkEnd w:id="45"/>
     </w:p>
     <w:p/>
     <w:p>
@@ -10525,7 +10513,7 @@
           <w:color w:val="auto"/>
         </w:rPr>
       </w:pPr>
-      <w:bookmarkStart w:id="47" w:name="_Toc211611363"/>
+      <w:bookmarkStart w:id="46" w:name="_Toc211611363"/>
       <w:r>
         <w:rPr>
           <w:color w:val="auto"/>
@@ -10589,7 +10577,7 @@
         </w:rPr>
         <w:t>)</w:t>
       </w:r>
-      <w:bookmarkEnd w:id="47"/>
+      <w:bookmarkEnd w:id="46"/>
     </w:p>
     <w:p/>
     <w:p>
@@ -10660,7 +10648,7 @@
           <w:color w:val="auto"/>
         </w:rPr>
       </w:pPr>
-      <w:bookmarkStart w:id="48" w:name="_Toc211611364"/>
+      <w:bookmarkStart w:id="47" w:name="_Toc211611364"/>
       <w:r>
         <w:rPr>
           <w:color w:val="auto"/>
@@ -10718,7 +10706,7 @@
         </w:rPr>
         <w:t xml:space="preserve"> (cooperação)</w:t>
       </w:r>
-      <w:bookmarkEnd w:id="48"/>
+      <w:bookmarkEnd w:id="47"/>
     </w:p>
     <w:p>
       <w:pPr>
@@ -10784,7 +10772,7 @@
         <w:spacing w:line="276" w:lineRule="auto"/>
         <w:jc w:val="center"/>
       </w:pPr>
-      <w:bookmarkStart w:id="49" w:name="_Toc211611365"/>
+      <w:bookmarkStart w:id="48" w:name="_Toc211611365"/>
       <w:r>
         <w:rPr>
           <w:color w:val="auto"/>
@@ -10842,7 +10830,7 @@
         </w:rPr>
         <w:t xml:space="preserve"> (expectativas)</w:t>
       </w:r>
-      <w:bookmarkEnd w:id="49"/>
+      <w:bookmarkEnd w:id="48"/>
     </w:p>
     <w:p>
       <w:pPr>
@@ -10855,7 +10843,7 @@
       <w:pPr>
         <w:pStyle w:val="Ttulo2"/>
       </w:pPr>
-      <w:bookmarkStart w:id="50" w:name="_Toc211610940"/>
+      <w:bookmarkStart w:id="49" w:name="_Toc211616125"/>
       <w:r>
         <w:t xml:space="preserve">Ligações e </w:t>
       </w:r>
@@ -10863,7 +10851,7 @@
       <w:r>
         <w:t>Hinterland</w:t>
       </w:r>
-      <w:bookmarkEnd w:id="50"/>
+      <w:bookmarkEnd w:id="49"/>
       <w:proofErr w:type="spellEnd"/>
     </w:p>
     <w:p>
@@ -10953,7 +10941,7 @@
           <w:color w:val="auto"/>
         </w:rPr>
       </w:pPr>
-      <w:bookmarkStart w:id="51" w:name="_Toc211611366"/>
+      <w:bookmarkStart w:id="50" w:name="_Toc211611366"/>
       <w:r>
         <w:rPr>
           <w:color w:val="auto"/>
@@ -11017,7 +11005,7 @@
         </w:rPr>
         <w:t>o</w:t>
       </w:r>
-      <w:bookmarkEnd w:id="51"/>
+      <w:bookmarkEnd w:id="50"/>
     </w:p>
     <w:p>
       <w:pPr>
@@ -11052,11 +11040,11 @@
       <w:pPr>
         <w:pStyle w:val="Ttulo2"/>
       </w:pPr>
-      <w:bookmarkStart w:id="52" w:name="_Toc211610941"/>
+      <w:bookmarkStart w:id="51" w:name="_Toc211616126"/>
       <w:r>
         <w:t>Estatísticas</w:t>
       </w:r>
-      <w:bookmarkEnd w:id="52"/>
+      <w:bookmarkEnd w:id="51"/>
     </w:p>
     <w:p>
       <w:pPr>
@@ -11069,7 +11057,7 @@
           <w:szCs w:val="20"/>
         </w:rPr>
       </w:pPr>
-      <w:bookmarkStart w:id="53" w:name="_Toc211610942"/>
+      <w:bookmarkStart w:id="52" w:name="_Toc211616127"/>
       <w:r>
         <w:rPr>
           <w:b/>
@@ -11080,7 +11068,7 @@
         </w:rPr>
         <w:t>Navios</w:t>
       </w:r>
-      <w:bookmarkEnd w:id="53"/>
+      <w:bookmarkEnd w:id="52"/>
     </w:p>
     <w:p>
       <w:pPr>
@@ -11143,7 +11131,7 @@
           <w:color w:val="auto"/>
         </w:rPr>
       </w:pPr>
-      <w:bookmarkStart w:id="54" w:name="_Toc211611367"/>
+      <w:bookmarkStart w:id="53" w:name="_Toc211611367"/>
       <w:r>
         <w:rPr>
           <w:color w:val="auto"/>
@@ -11193,7 +11181,7 @@
         </w:rPr>
         <w:t xml:space="preserve"> (1978-2021)</w:t>
       </w:r>
-      <w:bookmarkEnd w:id="54"/>
+      <w:bookmarkEnd w:id="53"/>
     </w:p>
     <w:p>
       <w:pPr>
@@ -11266,7 +11254,7 @@
           <w:color w:val="auto"/>
         </w:rPr>
       </w:pPr>
-      <w:bookmarkStart w:id="55" w:name="_Toc211611368"/>
+      <w:bookmarkStart w:id="54" w:name="_Toc211611368"/>
       <w:r>
         <w:rPr>
           <w:color w:val="auto"/>
@@ -11316,7 +11304,7 @@
         </w:rPr>
         <w:t xml:space="preserve"> (2000-2021)</w:t>
       </w:r>
-      <w:bookmarkEnd w:id="55"/>
+      <w:bookmarkEnd w:id="54"/>
     </w:p>
     <w:p/>
     <w:p>
@@ -11380,7 +11368,7 @@
           <w:color w:val="auto"/>
         </w:rPr>
       </w:pPr>
-      <w:bookmarkStart w:id="56" w:name="_Toc211611369"/>
+      <w:bookmarkStart w:id="55" w:name="_Toc211611369"/>
       <w:r>
         <w:rPr>
           <w:color w:val="auto"/>
@@ -11430,7 +11418,7 @@
         </w:rPr>
         <w:t xml:space="preserve"> (2000-2021)</w:t>
       </w:r>
-      <w:bookmarkEnd w:id="56"/>
+      <w:bookmarkEnd w:id="55"/>
     </w:p>
     <w:p/>
     <w:p>
@@ -11444,7 +11432,7 @@
           <w:szCs w:val="20"/>
         </w:rPr>
       </w:pPr>
-      <w:bookmarkStart w:id="57" w:name="_Toc211610943"/>
+      <w:bookmarkStart w:id="56" w:name="_Toc211616128"/>
       <w:r>
         <w:rPr>
           <w:b/>
@@ -11456,7 +11444,7 @@
         <w:lastRenderedPageBreak/>
         <w:t>Mercadorias</w:t>
       </w:r>
-      <w:bookmarkEnd w:id="57"/>
+      <w:bookmarkEnd w:id="56"/>
     </w:p>
     <w:p>
       <w:pPr>
@@ -11525,7 +11513,7 @@
           <w:color w:val="auto"/>
         </w:rPr>
       </w:pPr>
-      <w:bookmarkStart w:id="58" w:name="_Toc211611370"/>
+      <w:bookmarkStart w:id="57" w:name="_Toc211611370"/>
       <w:r>
         <w:rPr>
           <w:color w:val="auto"/>
@@ -11575,7 +11563,7 @@
         </w:rPr>
         <w:t xml:space="preserve"> (1978-2021)</w:t>
       </w:r>
-      <w:bookmarkEnd w:id="58"/>
+      <w:bookmarkEnd w:id="57"/>
     </w:p>
     <w:p>
       <w:pPr>
@@ -11644,7 +11632,7 @@
           <w:color w:val="auto"/>
         </w:rPr>
       </w:pPr>
-      <w:bookmarkStart w:id="59" w:name="_Toc211611371"/>
+      <w:bookmarkStart w:id="58" w:name="_Toc211611371"/>
       <w:r>
         <w:rPr>
           <w:color w:val="auto"/>
@@ -11688,7 +11676,7 @@
         </w:rPr>
         <w:t xml:space="preserve"> - Evolução das mercadorias movimentadas no Porto de Faro (2000-2021)</w:t>
       </w:r>
-      <w:bookmarkEnd w:id="59"/>
+      <w:bookmarkEnd w:id="58"/>
       <w:r>
         <w:rPr>
           <w:color w:val="auto"/>
@@ -11764,7 +11752,7 @@
           <w:color w:val="auto"/>
         </w:rPr>
       </w:pPr>
-      <w:bookmarkStart w:id="60" w:name="_Toc211611372"/>
+      <w:bookmarkStart w:id="59" w:name="_Toc211611372"/>
       <w:r>
         <w:rPr>
           <w:color w:val="auto"/>
@@ -11808,7 +11796,7 @@
         </w:rPr>
         <w:t xml:space="preserve"> - Evolução das mercadorias movimentadas no Porto de Portimão (2000-2021)</w:t>
       </w:r>
-      <w:bookmarkEnd w:id="60"/>
+      <w:bookmarkEnd w:id="59"/>
     </w:p>
     <w:p>
       <w:pPr>
@@ -11853,7 +11841,7 @@
           <w:szCs w:val="20"/>
         </w:rPr>
       </w:pPr>
-      <w:bookmarkStart w:id="61" w:name="_Toc211610944"/>
+      <w:bookmarkStart w:id="60" w:name="_Toc211616129"/>
       <w:r>
         <w:rPr>
           <w:b/>
@@ -11865,7 +11853,7 @@
         <w:lastRenderedPageBreak/>
         <w:t>Passageiros</w:t>
       </w:r>
-      <w:bookmarkEnd w:id="61"/>
+      <w:bookmarkEnd w:id="60"/>
     </w:p>
     <w:p>
       <w:pPr>
@@ -11953,7 +11941,7 @@
           <w:color w:val="auto"/>
         </w:rPr>
       </w:pPr>
-      <w:bookmarkStart w:id="62" w:name="_Toc211611373"/>
+      <w:bookmarkStart w:id="61" w:name="_Toc211611373"/>
       <w:r>
         <w:rPr>
           <w:color w:val="auto"/>
@@ -12021,7 +12009,7 @@
         </w:rPr>
         <w:t xml:space="preserve"> de passageiros no Porto de Portimão (2004-2020)</w:t>
       </w:r>
-      <w:bookmarkEnd w:id="62"/>
+      <w:bookmarkEnd w:id="61"/>
     </w:p>
     <w:p>
       <w:pPr>
@@ -18141,6 +18129,10 @@
 </file>
 
 <file path=customXml/item1.xml><?xml version="1.0" encoding="utf-8"?>
+<b:Sources xmlns:b="http://schemas.openxmlformats.org/officeDocument/2006/bibliography" xmlns="http://schemas.openxmlformats.org/officeDocument/2006/bibliography" SelectedStyle="\APA.XSL" StyleName="APA"/>
+</file>
+
+<file path=customXml/item2.xml><?xml version="1.0" encoding="utf-8"?>
 <p:properties xmlns:p="http://schemas.microsoft.com/office/2006/metadata/properties" xmlns:xsi="http://www.w3.org/2001/XMLSchema-instance" xmlns:pc="http://schemas.microsoft.com/office/infopath/2007/PartnerControls">
   <documentManagement>
     <NotebookType xmlns="6e977478-40fc-4c96-9b59-58f9adc62218" xsi:nil="true"/>
@@ -18152,11 +18144,16 @@
 </p:properties>
 </file>
 
-<file path=customXml/item2.xml><?xml version="1.0" encoding="utf-8"?>
-<b:Sources xmlns:b="http://schemas.openxmlformats.org/officeDocument/2006/bibliography" xmlns="http://schemas.openxmlformats.org/officeDocument/2006/bibliography" SelectedStyle="\APA.XSL" StyleName="APA"/>
+<file path=customXml/item3.xml><?xml version="1.0" encoding="utf-8"?>
+<?mso-contentType ?>
+<FormTemplates xmlns="http://schemas.microsoft.com/sharepoint/v3/contenttype/forms">
+  <Display>DocumentLibraryForm</Display>
+  <Edit>DocumentLibraryForm</Edit>
+  <New>DocumentLibraryForm</New>
+</FormTemplates>
 </file>
 
-<file path=customXml/item3.xml><?xml version="1.0" encoding="utf-8"?>
+<file path=customXml/item4.xml><?xml version="1.0" encoding="utf-8"?>
 <ct:contentTypeSchema xmlns:ct="http://schemas.microsoft.com/office/2006/metadata/contentType" xmlns:ma="http://schemas.microsoft.com/office/2006/metadata/properties/metaAttributes" ct:_="" ma:_="" ma:contentTypeName="Documento" ma:contentTypeID="0x0101008F0F40A57A4B4943AE5F0D22A00E6876" ma:contentTypeVersion="7" ma:contentTypeDescription="Criar um novo documento." ma:contentTypeScope="" ma:versionID="0777f9d8bcaf4fa9f3f247f35de05543">
   <xsd:schema xmlns:xsd="http://www.w3.org/2001/XMLSchema" xmlns:xs="http://www.w3.org/2001/XMLSchema" xmlns:p="http://schemas.microsoft.com/office/2006/metadata/properties" xmlns:ns2="6e977478-40fc-4c96-9b59-58f9adc62218" targetNamespace="http://schemas.microsoft.com/office/2006/metadata/properties" ma:root="true" ma:fieldsID="6e1588d9447c950b5d06efd32159bf41" ns2:_="">
     <xsd:import namespace="6e977478-40fc-4c96-9b59-58f9adc62218"/>
@@ -18318,16 +18315,15 @@
 </ct:contentTypeSchema>
 </file>
 
-<file path=customXml/item4.xml><?xml version="1.0" encoding="utf-8"?>
-<?mso-contentType ?>
-<FormTemplates xmlns="http://schemas.microsoft.com/sharepoint/v3/contenttype/forms">
-  <Display>DocumentLibraryForm</Display>
-  <Edit>DocumentLibraryForm</Edit>
-  <New>DocumentLibraryForm</New>
-</FormTemplates>
+<file path=customXml/itemProps1.xml><?xml version="1.0" encoding="utf-8"?>
+<ds:datastoreItem xmlns:ds="http://schemas.openxmlformats.org/officeDocument/2006/customXml" ds:itemID="{9C46D67E-02BF-4E37-8EF1-2391CC03D27F}">
+  <ds:schemaRefs>
+    <ds:schemaRef ds:uri="http://schemas.openxmlformats.org/officeDocument/2006/bibliography"/>
+  </ds:schemaRefs>
+</ds:datastoreItem>
 </file>
 
-<file path=customXml/itemProps1.xml><?xml version="1.0" encoding="utf-8"?>
+<file path=customXml/itemProps2.xml><?xml version="1.0" encoding="utf-8"?>
 <ds:datastoreItem xmlns:ds="http://schemas.openxmlformats.org/officeDocument/2006/customXml" ds:itemID="{A02BD9CC-6025-4F76-BD90-0F1427CF0A06}">
   <ds:schemaRefs>
     <ds:schemaRef ds:uri="http://schemas.microsoft.com/office/2006/metadata/properties"/>
@@ -18337,15 +18333,15 @@
 </ds:datastoreItem>
 </file>
 
-<file path=customXml/itemProps2.xml><?xml version="1.0" encoding="utf-8"?>
-<ds:datastoreItem xmlns:ds="http://schemas.openxmlformats.org/officeDocument/2006/customXml" ds:itemID="{9C46D67E-02BF-4E37-8EF1-2391CC03D27F}">
+<file path=customXml/itemProps3.xml><?xml version="1.0" encoding="utf-8"?>
+<ds:datastoreItem xmlns:ds="http://schemas.openxmlformats.org/officeDocument/2006/customXml" ds:itemID="{A8BEE9C3-75AD-4607-B106-1B44B05722EA}">
   <ds:schemaRefs>
-    <ds:schemaRef ds:uri="http://schemas.openxmlformats.org/officeDocument/2006/bibliography"/>
+    <ds:schemaRef ds:uri="http://schemas.microsoft.com/sharepoint/v3/contenttype/forms"/>
   </ds:schemaRefs>
 </ds:datastoreItem>
 </file>
 
-<file path=customXml/itemProps3.xml><?xml version="1.0" encoding="utf-8"?>
+<file path=customXml/itemProps4.xml><?xml version="1.0" encoding="utf-8"?>
 <ds:datastoreItem xmlns:ds="http://schemas.openxmlformats.org/officeDocument/2006/customXml" ds:itemID="{F22FBF9B-697C-4384-8BA9-D9CACC814933}">
   <ds:schemaRefs>
     <ds:schemaRef ds:uri="http://schemas.microsoft.com/office/2006/metadata/contentType"/>
@@ -18361,12 +18357,4 @@
     <ds:schemaRef ds:uri="http://schemas.microsoft.com/internal/obd"/>
   </ds:schemaRefs>
 </ds:datastoreItem>
-</file>
-
-<file path=customXml/itemProps4.xml><?xml version="1.0" encoding="utf-8"?>
-<ds:datastoreItem xmlns:ds="http://schemas.openxmlformats.org/officeDocument/2006/customXml" ds:itemID="{A8BEE9C3-75AD-4607-B106-1B44B05722EA}">
-  <ds:schemaRefs>
-    <ds:schemaRef ds:uri="http://schemas.microsoft.com/sharepoint/v3/contenttype/forms"/>
-  </ds:schemaRefs>
-</ds:datastoreItem>
 </file>
</xml_diff>

<commit_message>
US 2.3.6 - correction SWOT analysis for APS (#21)
</commit_message>
<xml_diff>
--- a/docs/client_analysis/report_APS.docx
+++ b/docs/client_analysis/report_APS.docx
@@ -6579,7 +6579,7 @@
           <w:noProof/>
         </w:rPr>
         <w:drawing>
-          <wp:inline distT="0" distB="0" distL="0" distR="0" wp14:anchorId="68B4EA67" wp14:editId="39D36553">
+          <wp:inline distT="0" distB="0" distL="0" distR="0" wp14:anchorId="68B4EA67" wp14:editId="538FA032">
             <wp:extent cx="5226685" cy="3020060"/>
             <wp:effectExtent l="19050" t="19050" r="12065" b="27940"/>
             <wp:docPr id="1965649793" name="Imagem 6" descr="Uma imagem com texto, mapa, captura de ecrã, diagrama&#10;&#10;Os conteúdos gerados por IA podem estar incorretos."/>
@@ -7636,7 +7636,7 @@
                 <w:bCs/>
                 <w:color w:val="000000" w:themeColor="text1"/>
               </w:rPr>
-              <w:t>Forças (internas)</w:t>
+              <w:t>Pontos fortes</w:t>
             </w:r>
           </w:p>
         </w:tc>
@@ -7763,7 +7763,7 @@
                 <w:color w:val="000000" w:themeColor="text1"/>
                 <w:szCs w:val="22"/>
               </w:rPr>
-              <w:t>Fraquezas (internas)</w:t>
+              <w:t>Pontos fracos</w:t>
             </w:r>
           </w:p>
         </w:tc>
@@ -17668,6 +17668,10 @@
 </file>
 
 <file path=customXml/item1.xml><?xml version="1.0" encoding="utf-8"?>
+<b:Sources xmlns:b="http://schemas.openxmlformats.org/officeDocument/2006/bibliography" xmlns="http://schemas.openxmlformats.org/officeDocument/2006/bibliography" SelectedStyle="\APA.XSL" StyleName="APA"/>
+</file>
+
+<file path=customXml/item2.xml><?xml version="1.0" encoding="utf-8"?>
 <p:properties xmlns:p="http://schemas.microsoft.com/office/2006/metadata/properties" xmlns:xsi="http://www.w3.org/2001/XMLSchema-instance" xmlns:pc="http://schemas.microsoft.com/office/infopath/2007/PartnerControls">
   <documentManagement>
     <NotebookType xmlns="6e977478-40fc-4c96-9b59-58f9adc62218" xsi:nil="true"/>
@@ -17679,11 +17683,16 @@
 </p:properties>
 </file>
 
-<file path=customXml/item2.xml><?xml version="1.0" encoding="utf-8"?>
-<b:Sources xmlns:b="http://schemas.openxmlformats.org/officeDocument/2006/bibliography" xmlns="http://schemas.openxmlformats.org/officeDocument/2006/bibliography" SelectedStyle="\APA.XSL" StyleName="APA"/>
+<file path=customXml/item3.xml><?xml version="1.0" encoding="utf-8"?>
+<?mso-contentType ?>
+<FormTemplates xmlns="http://schemas.microsoft.com/sharepoint/v3/contenttype/forms">
+  <Display>DocumentLibraryForm</Display>
+  <Edit>DocumentLibraryForm</Edit>
+  <New>DocumentLibraryForm</New>
+</FormTemplates>
 </file>
 
-<file path=customXml/item3.xml><?xml version="1.0" encoding="utf-8"?>
+<file path=customXml/item4.xml><?xml version="1.0" encoding="utf-8"?>
 <ct:contentTypeSchema xmlns:ct="http://schemas.microsoft.com/office/2006/metadata/contentType" xmlns:ma="http://schemas.microsoft.com/office/2006/metadata/properties/metaAttributes" ct:_="" ma:_="" ma:contentTypeName="Documento" ma:contentTypeID="0x0101008F0F40A57A4B4943AE5F0D22A00E6876" ma:contentTypeVersion="7" ma:contentTypeDescription="Criar um novo documento." ma:contentTypeScope="" ma:versionID="0777f9d8bcaf4fa9f3f247f35de05543">
   <xsd:schema xmlns:xsd="http://www.w3.org/2001/XMLSchema" xmlns:xs="http://www.w3.org/2001/XMLSchema" xmlns:p="http://schemas.microsoft.com/office/2006/metadata/properties" xmlns:ns2="6e977478-40fc-4c96-9b59-58f9adc62218" targetNamespace="http://schemas.microsoft.com/office/2006/metadata/properties" ma:root="true" ma:fieldsID="6e1588d9447c950b5d06efd32159bf41" ns2:_="">
     <xsd:import namespace="6e977478-40fc-4c96-9b59-58f9adc62218"/>
@@ -17845,16 +17854,15 @@
 </ct:contentTypeSchema>
 </file>
 
-<file path=customXml/item4.xml><?xml version="1.0" encoding="utf-8"?>
-<?mso-contentType ?>
-<FormTemplates xmlns="http://schemas.microsoft.com/sharepoint/v3/contenttype/forms">
-  <Display>DocumentLibraryForm</Display>
-  <Edit>DocumentLibraryForm</Edit>
-  <New>DocumentLibraryForm</New>
-</FormTemplates>
+<file path=customXml/itemProps1.xml><?xml version="1.0" encoding="utf-8"?>
+<ds:datastoreItem xmlns:ds="http://schemas.openxmlformats.org/officeDocument/2006/customXml" ds:itemID="{9C46D67E-02BF-4E37-8EF1-2391CC03D27F}">
+  <ds:schemaRefs>
+    <ds:schemaRef ds:uri="http://schemas.openxmlformats.org/officeDocument/2006/bibliography"/>
+  </ds:schemaRefs>
+</ds:datastoreItem>
 </file>
 
-<file path=customXml/itemProps1.xml><?xml version="1.0" encoding="utf-8"?>
+<file path=customXml/itemProps2.xml><?xml version="1.0" encoding="utf-8"?>
 <ds:datastoreItem xmlns:ds="http://schemas.openxmlformats.org/officeDocument/2006/customXml" ds:itemID="{A02BD9CC-6025-4F76-BD90-0F1427CF0A06}">
   <ds:schemaRefs>
     <ds:schemaRef ds:uri="http://schemas.microsoft.com/office/2006/metadata/properties"/>
@@ -17864,15 +17872,15 @@
 </ds:datastoreItem>
 </file>
 
-<file path=customXml/itemProps2.xml><?xml version="1.0" encoding="utf-8"?>
-<ds:datastoreItem xmlns:ds="http://schemas.openxmlformats.org/officeDocument/2006/customXml" ds:itemID="{9C46D67E-02BF-4E37-8EF1-2391CC03D27F}">
+<file path=customXml/itemProps3.xml><?xml version="1.0" encoding="utf-8"?>
+<ds:datastoreItem xmlns:ds="http://schemas.openxmlformats.org/officeDocument/2006/customXml" ds:itemID="{A8BEE9C3-75AD-4607-B106-1B44B05722EA}">
   <ds:schemaRefs>
-    <ds:schemaRef ds:uri="http://schemas.openxmlformats.org/officeDocument/2006/bibliography"/>
+    <ds:schemaRef ds:uri="http://schemas.microsoft.com/sharepoint/v3/contenttype/forms"/>
   </ds:schemaRefs>
 </ds:datastoreItem>
 </file>
 
-<file path=customXml/itemProps3.xml><?xml version="1.0" encoding="utf-8"?>
+<file path=customXml/itemProps4.xml><?xml version="1.0" encoding="utf-8"?>
 <ds:datastoreItem xmlns:ds="http://schemas.openxmlformats.org/officeDocument/2006/customXml" ds:itemID="{F22FBF9B-697C-4384-8BA9-D9CACC814933}">
   <ds:schemaRefs>
     <ds:schemaRef ds:uri="http://schemas.microsoft.com/office/2006/metadata/contentType"/>
@@ -17888,12 +17896,4 @@
     <ds:schemaRef ds:uri="http://schemas.microsoft.com/internal/obd"/>
   </ds:schemaRefs>
 </ds:datastoreItem>
-</file>
-
-<file path=customXml/itemProps4.xml><?xml version="1.0" encoding="utf-8"?>
-<ds:datastoreItem xmlns:ds="http://schemas.openxmlformats.org/officeDocument/2006/customXml" ds:itemID="{A8BEE9C3-75AD-4607-B106-1B44B05722EA}">
-  <ds:schemaRefs>
-    <ds:schemaRef ds:uri="http://schemas.microsoft.com/sharepoint/v3/contenttype/forms"/>
-  </ds:schemaRefs>
-</ds:datastoreItem>
 </file>
</xml_diff>

<commit_message>
US 2.3.7 - update strategic proposals for sustainability and digital transformation in APS report (#22)
</commit_message>
<xml_diff>
--- a/docs/client_analysis/report_APS.docx
+++ b/docs/client_analysis/report_APS.docx
@@ -6579,7 +6579,7 @@
           <w:noProof/>
         </w:rPr>
         <w:drawing>
-          <wp:inline distT="0" distB="0" distL="0" distR="0" wp14:anchorId="68B4EA67" wp14:editId="538FA032">
+          <wp:inline distT="0" distB="0" distL="0" distR="0" wp14:anchorId="68B4EA67" wp14:editId="32EE1FD7">
             <wp:extent cx="5226685" cy="3020060"/>
             <wp:effectExtent l="19050" t="19050" r="12065" b="27940"/>
             <wp:docPr id="1965649793" name="Imagem 6" descr="Uma imagem com texto, mapa, captura de ecrã, diagrama&#10;&#10;Os conteúdos gerados por IA podem estar incorretos."/>
@@ -7965,18 +7965,6 @@
         </w:tc>
       </w:tr>
     </w:tbl>
-    <w:p>
-      <w:pPr>
-        <w:pStyle w:val="Ttulo3"/>
-        <w:rPr>
-          <w:b/>
-          <w:bCs/>
-          <w:color w:val="000000" w:themeColor="text1"/>
-          <w:sz w:val="22"/>
-          <w:szCs w:val="22"/>
-        </w:rPr>
-      </w:pPr>
-    </w:p>
     <w:p/>
     <w:p>
       <w:pPr>
@@ -9016,20 +9004,6 @@
       </w:r>
     </w:p>
     <w:p/>
-    <w:p>
-      <w:pPr>
-        <w:spacing w:line="240" w:lineRule="auto"/>
-        <w:jc w:val="left"/>
-        <w:rPr>
-          <w:rFonts w:cs="Times New Roman"/>
-          <w:b/>
-        </w:rPr>
-      </w:pPr>
-      <w:r>
-        <w:lastRenderedPageBreak/>
-        <w:br w:type="page"/>
-      </w:r>
-    </w:p>
     <w:p>
       <w:pPr>
         <w:pStyle w:val="Ttulo2"/>
@@ -17672,27 +17646,6 @@
 </file>
 
 <file path=customXml/item2.xml><?xml version="1.0" encoding="utf-8"?>
-<p:properties xmlns:p="http://schemas.microsoft.com/office/2006/metadata/properties" xmlns:xsi="http://www.w3.org/2001/XMLSchema-instance" xmlns:pc="http://schemas.microsoft.com/office/infopath/2007/PartnerControls">
-  <documentManagement>
-    <NotebookType xmlns="6e977478-40fc-4c96-9b59-58f9adc62218" xsi:nil="true"/>
-    <AppVersion xmlns="6e977478-40fc-4c96-9b59-58f9adc62218" xsi:nil="true"/>
-    <TeamsChannelId xmlns="6e977478-40fc-4c96-9b59-58f9adc62218" xsi:nil="true"/>
-    <FolderType xmlns="6e977478-40fc-4c96-9b59-58f9adc62218" xsi:nil="true"/>
-    <CultureName xmlns="6e977478-40fc-4c96-9b59-58f9adc62218" xsi:nil="true"/>
-  </documentManagement>
-</p:properties>
-</file>
-
-<file path=customXml/item3.xml><?xml version="1.0" encoding="utf-8"?>
-<?mso-contentType ?>
-<FormTemplates xmlns="http://schemas.microsoft.com/sharepoint/v3/contenttype/forms">
-  <Display>DocumentLibraryForm</Display>
-  <Edit>DocumentLibraryForm</Edit>
-  <New>DocumentLibraryForm</New>
-</FormTemplates>
-</file>
-
-<file path=customXml/item4.xml><?xml version="1.0" encoding="utf-8"?>
 <ct:contentTypeSchema xmlns:ct="http://schemas.microsoft.com/office/2006/metadata/contentType" xmlns:ma="http://schemas.microsoft.com/office/2006/metadata/properties/metaAttributes" ct:_="" ma:_="" ma:contentTypeName="Documento" ma:contentTypeID="0x0101008F0F40A57A4B4943AE5F0D22A00E6876" ma:contentTypeVersion="7" ma:contentTypeDescription="Criar um novo documento." ma:contentTypeScope="" ma:versionID="0777f9d8bcaf4fa9f3f247f35de05543">
   <xsd:schema xmlns:xsd="http://www.w3.org/2001/XMLSchema" xmlns:xs="http://www.w3.org/2001/XMLSchema" xmlns:p="http://schemas.microsoft.com/office/2006/metadata/properties" xmlns:ns2="6e977478-40fc-4c96-9b59-58f9adc62218" targetNamespace="http://schemas.microsoft.com/office/2006/metadata/properties" ma:root="true" ma:fieldsID="6e1588d9447c950b5d06efd32159bf41" ns2:_="">
     <xsd:import namespace="6e977478-40fc-4c96-9b59-58f9adc62218"/>
@@ -17854,6 +17807,27 @@
 </ct:contentTypeSchema>
 </file>
 
+<file path=customXml/item3.xml><?xml version="1.0" encoding="utf-8"?>
+<?mso-contentType ?>
+<FormTemplates xmlns="http://schemas.microsoft.com/sharepoint/v3/contenttype/forms">
+  <Display>DocumentLibraryForm</Display>
+  <Edit>DocumentLibraryForm</Edit>
+  <New>DocumentLibraryForm</New>
+</FormTemplates>
+</file>
+
+<file path=customXml/item4.xml><?xml version="1.0" encoding="utf-8"?>
+<p:properties xmlns:p="http://schemas.microsoft.com/office/2006/metadata/properties" xmlns:xsi="http://www.w3.org/2001/XMLSchema-instance" xmlns:pc="http://schemas.microsoft.com/office/infopath/2007/PartnerControls">
+  <documentManagement>
+    <NotebookType xmlns="6e977478-40fc-4c96-9b59-58f9adc62218" xsi:nil="true"/>
+    <AppVersion xmlns="6e977478-40fc-4c96-9b59-58f9adc62218" xsi:nil="true"/>
+    <TeamsChannelId xmlns="6e977478-40fc-4c96-9b59-58f9adc62218" xsi:nil="true"/>
+    <FolderType xmlns="6e977478-40fc-4c96-9b59-58f9adc62218" xsi:nil="true"/>
+    <CultureName xmlns="6e977478-40fc-4c96-9b59-58f9adc62218" xsi:nil="true"/>
+  </documentManagement>
+</p:properties>
+</file>
+
 <file path=customXml/itemProps1.xml><?xml version="1.0" encoding="utf-8"?>
 <ds:datastoreItem xmlns:ds="http://schemas.openxmlformats.org/officeDocument/2006/customXml" ds:itemID="{9C46D67E-02BF-4E37-8EF1-2391CC03D27F}">
   <ds:schemaRefs>
@@ -17863,24 +17837,6 @@
 </file>
 
 <file path=customXml/itemProps2.xml><?xml version="1.0" encoding="utf-8"?>
-<ds:datastoreItem xmlns:ds="http://schemas.openxmlformats.org/officeDocument/2006/customXml" ds:itemID="{A02BD9CC-6025-4F76-BD90-0F1427CF0A06}">
-  <ds:schemaRefs>
-    <ds:schemaRef ds:uri="http://schemas.microsoft.com/office/2006/metadata/properties"/>
-    <ds:schemaRef ds:uri="http://schemas.microsoft.com/office/infopath/2007/PartnerControls"/>
-    <ds:schemaRef ds:uri="6e977478-40fc-4c96-9b59-58f9adc62218"/>
-  </ds:schemaRefs>
-</ds:datastoreItem>
-</file>
-
-<file path=customXml/itemProps3.xml><?xml version="1.0" encoding="utf-8"?>
-<ds:datastoreItem xmlns:ds="http://schemas.openxmlformats.org/officeDocument/2006/customXml" ds:itemID="{A8BEE9C3-75AD-4607-B106-1B44B05722EA}">
-  <ds:schemaRefs>
-    <ds:schemaRef ds:uri="http://schemas.microsoft.com/sharepoint/v3/contenttype/forms"/>
-  </ds:schemaRefs>
-</ds:datastoreItem>
-</file>
-
-<file path=customXml/itemProps4.xml><?xml version="1.0" encoding="utf-8"?>
 <ds:datastoreItem xmlns:ds="http://schemas.openxmlformats.org/officeDocument/2006/customXml" ds:itemID="{F22FBF9B-697C-4384-8BA9-D9CACC814933}">
   <ds:schemaRefs>
     <ds:schemaRef ds:uri="http://schemas.microsoft.com/office/2006/metadata/contentType"/>
@@ -17896,4 +17852,22 @@
     <ds:schemaRef ds:uri="http://schemas.microsoft.com/internal/obd"/>
   </ds:schemaRefs>
 </ds:datastoreItem>
+</file>
+
+<file path=customXml/itemProps3.xml><?xml version="1.0" encoding="utf-8"?>
+<ds:datastoreItem xmlns:ds="http://schemas.openxmlformats.org/officeDocument/2006/customXml" ds:itemID="{A8BEE9C3-75AD-4607-B106-1B44B05722EA}">
+  <ds:schemaRefs>
+    <ds:schemaRef ds:uri="http://schemas.microsoft.com/sharepoint/v3/contenttype/forms"/>
+  </ds:schemaRefs>
+</ds:datastoreItem>
+</file>
+
+<file path=customXml/itemProps4.xml><?xml version="1.0" encoding="utf-8"?>
+<ds:datastoreItem xmlns:ds="http://schemas.openxmlformats.org/officeDocument/2006/customXml" ds:itemID="{A02BD9CC-6025-4F76-BD90-0F1427CF0A06}">
+  <ds:schemaRefs>
+    <ds:schemaRef ds:uri="http://schemas.microsoft.com/office/2006/metadata/properties"/>
+    <ds:schemaRef ds:uri="http://schemas.microsoft.com/office/infopath/2007/PartnerControls"/>
+    <ds:schemaRef ds:uri="6e977478-40fc-4c96-9b59-58f9adc62218"/>
+  </ds:schemaRefs>
+</ds:datastoreItem>
 </file>
</xml_diff>

<commit_message>
US 2.3.4 - correction planning details (#19)
</commit_message>
<xml_diff>
--- a/docs/client_analysis/report_APS.docx
+++ b/docs/client_analysis/report_APS.docx
@@ -4883,9 +4883,14 @@
       </w:r>
     </w:p>
     <w:p>
+      <w:proofErr w:type="spellStart"/>
       <w:r>
         <w:lastRenderedPageBreak/>
-        <w:t>Kt - Q</w:t>
+        <w:t>Kt</w:t>
+      </w:r>
+      <w:proofErr w:type="spellEnd"/>
+      <w:r>
+        <w:t xml:space="preserve"> - Q</w:t>
       </w:r>
       <w:r>
         <w:t>uilotonelada</w:t>
@@ -4902,15 +4907,44 @@
         <w:t xml:space="preserve">TMS - </w:t>
       </w:r>
       <w:r>
-        <w:t>Terminal Multipurpose</w:t>
-      </w:r>
+        <w:t xml:space="preserve">Terminal </w:t>
+      </w:r>
+      <w:proofErr w:type="spellStart"/>
+      <w:r>
+        <w:t>Multipurpose</w:t>
+      </w:r>
+      <w:proofErr w:type="spellEnd"/>
       <w:r>
         <w:t>;</w:t>
       </w:r>
     </w:p>
     <w:p>
       <w:r>
-        <w:t>ISO – International Organization for Standardization (</w:t>
+        <w:t xml:space="preserve">ISO – </w:t>
+      </w:r>
+      <w:proofErr w:type="spellStart"/>
+      <w:r>
+        <w:t>International</w:t>
+      </w:r>
+      <w:proofErr w:type="spellEnd"/>
+      <w:r>
+        <w:t xml:space="preserve"> </w:t>
+      </w:r>
+      <w:proofErr w:type="spellStart"/>
+      <w:r>
+        <w:t>Organization</w:t>
+      </w:r>
+      <w:proofErr w:type="spellEnd"/>
+      <w:r>
+        <w:t xml:space="preserve"> for </w:t>
+      </w:r>
+      <w:proofErr w:type="spellStart"/>
+      <w:r>
+        <w:t>Standardization</w:t>
+      </w:r>
+      <w:proofErr w:type="spellEnd"/>
+      <w:r>
+        <w:t xml:space="preserve"> (</w:t>
       </w:r>
       <w:r>
         <w:t>Organização Internacional de Normalização</w:t>
@@ -4940,9 +4974,27 @@
       <w:r>
         <w:t xml:space="preserve">- </w:t>
       </w:r>
-      <w:r>
-        <w:t>Environmental, Social and Governance</w:t>
-      </w:r>
+      <w:proofErr w:type="spellStart"/>
+      <w:r>
+        <w:t>Environmental</w:t>
+      </w:r>
+      <w:proofErr w:type="spellEnd"/>
+      <w:r>
+        <w:t xml:space="preserve">, Social </w:t>
+      </w:r>
+      <w:proofErr w:type="spellStart"/>
+      <w:r>
+        <w:t>and</w:t>
+      </w:r>
+      <w:proofErr w:type="spellEnd"/>
+      <w:r>
+        <w:t xml:space="preserve"> </w:t>
+      </w:r>
+      <w:proofErr w:type="spellStart"/>
+      <w:r>
+        <w:t>Governance</w:t>
+      </w:r>
+      <w:proofErr w:type="spellEnd"/>
       <w:r>
         <w:t xml:space="preserve"> (</w:t>
       </w:r>
@@ -4960,8 +5012,37 @@
       <w:r>
         <w:t xml:space="preserve">SWOT - </w:t>
       </w:r>
-      <w:r>
-        <w:t>Strengths, Weaknesses, Opportunities e Threats </w:t>
+      <w:proofErr w:type="spellStart"/>
+      <w:r>
+        <w:t>Strengths</w:t>
+      </w:r>
+      <w:proofErr w:type="spellEnd"/>
+      <w:r>
+        <w:t>, </w:t>
+      </w:r>
+      <w:proofErr w:type="spellStart"/>
+      <w:r>
+        <w:t>Weaknesses</w:t>
+      </w:r>
+      <w:proofErr w:type="spellEnd"/>
+      <w:r>
+        <w:t>, </w:t>
+      </w:r>
+      <w:proofErr w:type="spellStart"/>
+      <w:r>
+        <w:t>Opportunities</w:t>
+      </w:r>
+      <w:proofErr w:type="spellEnd"/>
+      <w:r>
+        <w:t> e </w:t>
+      </w:r>
+      <w:proofErr w:type="spellStart"/>
+      <w:r>
+        <w:t>Threats</w:t>
+      </w:r>
+      <w:proofErr w:type="spellEnd"/>
+      <w:r>
+        <w:t> </w:t>
       </w:r>
       <w:r>
         <w:t>(Forças, Fraquezas, Oportunidades, Ameaças)</w:t>
@@ -4989,8 +5070,21 @@
         <w:t xml:space="preserve"> - L</w:t>
       </w:r>
       <w:r>
-        <w:t>ight-emitting diode</w:t>
-      </w:r>
+        <w:t>ight-</w:t>
+      </w:r>
+      <w:proofErr w:type="spellStart"/>
+      <w:r>
+        <w:t>emitting</w:t>
+      </w:r>
+      <w:proofErr w:type="spellEnd"/>
+      <w:r>
+        <w:t xml:space="preserve"> </w:t>
+      </w:r>
+      <w:proofErr w:type="spellStart"/>
+      <w:r>
+        <w:t>diode</w:t>
+      </w:r>
+      <w:proofErr w:type="spellEnd"/>
       <w:r>
         <w:t xml:space="preserve"> (Díodo emissor de luz)</w:t>
       </w:r>
@@ -4999,15 +5093,30 @@
       </w:r>
     </w:p>
     <w:p>
+      <w:proofErr w:type="spellStart"/>
       <w:r>
         <w:t>IoT</w:t>
       </w:r>
+      <w:proofErr w:type="spellEnd"/>
       <w:r>
         <w:t xml:space="preserve"> -</w:t>
       </w:r>
       <w:r>
-        <w:t> Internet of Things</w:t>
-      </w:r>
+        <w:t xml:space="preserve"> Internet </w:t>
+      </w:r>
+      <w:proofErr w:type="spellStart"/>
+      <w:r>
+        <w:t>of</w:t>
+      </w:r>
+      <w:proofErr w:type="spellEnd"/>
+      <w:r>
+        <w:t xml:space="preserve"> </w:t>
+      </w:r>
+      <w:proofErr w:type="spellStart"/>
+      <w:r>
+        <w:t>Things</w:t>
+      </w:r>
+      <w:proofErr w:type="spellEnd"/>
       <w:r>
         <w:t xml:space="preserve"> (Internet das coisas)</w:t>
       </w:r>
@@ -5126,7 +5235,15 @@
     </w:p>
     <w:p>
       <w:r>
-        <w:t>O seu objetivo estratégico é consolidar o Porto de Sines como um hub logístico, energético e industrial de referência no Atlântico, enquanto reforça a importância dos Portos de Faro e Portimão como infraestruturas de apoio ao turismo de cruzeiros e ao transporte marítimo regional.</w:t>
+        <w:t xml:space="preserve">O seu objetivo estratégico é consolidar o Porto de Sines como um </w:t>
+      </w:r>
+      <w:proofErr w:type="spellStart"/>
+      <w:r>
+        <w:t>hub</w:t>
+      </w:r>
+      <w:proofErr w:type="spellEnd"/>
+      <w:r>
+        <w:t xml:space="preserve"> logístico, energético e industrial de referência no Atlântico, enquanto reforça a importância dos Portos de Faro e Portimão como infraestruturas de apoio ao turismo de cruzeiros e ao transporte marítimo regional.</w:t>
       </w:r>
     </w:p>
     <w:p>
@@ -5757,7 +5874,15 @@
           </w:tcPr>
           <w:p>
             <w:r>
-              <w:t>Granéis Líquidos (unidade: kt)</w:t>
+              <w:t xml:space="preserve">Granéis Líquidos (unidade: </w:t>
+            </w:r>
+            <w:proofErr w:type="spellStart"/>
+            <w:r>
+              <w:t>kt</w:t>
+            </w:r>
+            <w:proofErr w:type="spellEnd"/>
+            <w:r>
+              <w:t>)</w:t>
             </w:r>
           </w:p>
         </w:tc>
@@ -5847,7 +5972,15 @@
           </w:tcPr>
           <w:p>
             <w:r>
-              <w:t>Granéis Sólidos (unidade: kt)</w:t>
+              <w:t xml:space="preserve">Granéis Sólidos (unidade: </w:t>
+            </w:r>
+            <w:proofErr w:type="spellStart"/>
+            <w:r>
+              <w:t>kt</w:t>
+            </w:r>
+            <w:proofErr w:type="spellEnd"/>
+            <w:r>
+              <w:t>)</w:t>
             </w:r>
           </w:p>
         </w:tc>
@@ -5937,7 +6070,15 @@
           </w:tcPr>
           <w:p>
             <w:r>
-              <w:t>Carga Geral Contentorizada (unidade: kt)</w:t>
+              <w:t xml:space="preserve">Carga Geral Contentorizada (unidade: </w:t>
+            </w:r>
+            <w:proofErr w:type="spellStart"/>
+            <w:r>
+              <w:t>kt</w:t>
+            </w:r>
+            <w:proofErr w:type="spellEnd"/>
+            <w:r>
+              <w:t>)</w:t>
             </w:r>
           </w:p>
         </w:tc>
@@ -6030,7 +6171,15 @@
           </w:tcPr>
           <w:p>
             <w:r>
-              <w:t>Carga Geral Fracionada (unidade: kt)</w:t>
+              <w:t xml:space="preserve">Carga Geral Fracionada (unidade: </w:t>
+            </w:r>
+            <w:proofErr w:type="spellStart"/>
+            <w:r>
+              <w:t>kt</w:t>
+            </w:r>
+            <w:proofErr w:type="spellEnd"/>
+            <w:r>
+              <w:t>)</w:t>
             </w:r>
           </w:p>
         </w:tc>
@@ -6122,8 +6271,21 @@
             <w:hideMark/>
           </w:tcPr>
           <w:p>
-            <w:r>
-              <w:t>Ro-Ro (unidade: kt)</w:t>
+            <w:proofErr w:type="spellStart"/>
+            <w:r>
+              <w:t>Ro-Ro</w:t>
+            </w:r>
+            <w:proofErr w:type="spellEnd"/>
+            <w:r>
+              <w:t xml:space="preserve"> (unidade: </w:t>
+            </w:r>
+            <w:proofErr w:type="spellStart"/>
+            <w:r>
+              <w:t>kt</w:t>
+            </w:r>
+            <w:proofErr w:type="spellEnd"/>
+            <w:r>
+              <w:t>)</w:t>
             </w:r>
           </w:p>
         </w:tc>
@@ -6241,7 +6403,15 @@
               <w:t xml:space="preserve">TOTAL Sines </w:t>
             </w:r>
             <w:r>
-              <w:t>(unidade: kt)</w:t>
+              <w:t xml:space="preserve">(unidade: </w:t>
+            </w:r>
+            <w:proofErr w:type="spellStart"/>
+            <w:r>
+              <w:t>kt</w:t>
+            </w:r>
+            <w:proofErr w:type="spellEnd"/>
+            <w:r>
+              <w:t>)</w:t>
             </w:r>
           </w:p>
         </w:tc>
@@ -6526,7 +6696,23 @@
         <w:t>:</w:t>
       </w:r>
       <w:r>
-        <w:t xml:space="preserve"> exportação de animais vivos para Israel, pellets de madeira para França e Reino Unido, e sílica para Espanha, além de transhipment de pás eólicas e receção de gesso e ureia.</w:t>
+        <w:t xml:space="preserve"> exportação de animais vivos para Israel, </w:t>
+      </w:r>
+      <w:proofErr w:type="spellStart"/>
+      <w:r>
+        <w:t>pellets</w:t>
+      </w:r>
+      <w:proofErr w:type="spellEnd"/>
+      <w:r>
+        <w:t xml:space="preserve"> de madeira para França e Reino Unido, e sílica para Espanha, além de </w:t>
+      </w:r>
+      <w:proofErr w:type="spellStart"/>
+      <w:r>
+        <w:t>transhipment</w:t>
+      </w:r>
+      <w:proofErr w:type="spellEnd"/>
+      <w:r>
+        <w:t xml:space="preserve"> de pás eólicas e receção de gesso e ureia.</w:t>
       </w:r>
     </w:p>
     <w:p>
@@ -6579,7 +6765,7 @@
           <w:noProof/>
         </w:rPr>
         <w:drawing>
-          <wp:inline distT="0" distB="0" distL="0" distR="0" wp14:anchorId="68B4EA67" wp14:editId="32EE1FD7">
+          <wp:inline distT="0" distB="0" distL="0" distR="0" wp14:anchorId="68B4EA67" wp14:editId="41AD26BA">
             <wp:extent cx="5226685" cy="3020060"/>
             <wp:effectExtent l="19050" t="19050" r="12065" b="27940"/>
             <wp:docPr id="1965649793" name="Imagem 6" descr="Uma imagem com texto, mapa, captura de ecrã, diagrama&#10;&#10;Os conteúdos gerados por IA podem estar incorretos."/>
@@ -6702,7 +6888,15 @@
         <w:spacing w:after="0" w:line="360" w:lineRule="auto"/>
       </w:pPr>
       <w:r>
-        <w:t>O Porto Comercial de Faro tem uma utilização pontual, enquanto o Porto de Portimão foca-se no setor de cruzeiros, recebendo navios de passageiros provenientes de portos como Lisboa, Funchal, Vigo, Cádiz e Gibraltar.</w:t>
+        <w:t xml:space="preserve">O Porto Comercial de Faro tem uma utilização pontual, enquanto o Porto de Portimão foca-se no setor de cruzeiros, recebendo navios de passageiros provenientes de portos como Lisboa, Funchal, Vigo, </w:t>
+      </w:r>
+      <w:proofErr w:type="spellStart"/>
+      <w:r>
+        <w:t>Cádiz</w:t>
+      </w:r>
+      <w:proofErr w:type="spellEnd"/>
+      <w:r>
+        <w:t xml:space="preserve"> e Gibraltar.</w:t>
       </w:r>
     </w:p>
     <w:p>
@@ -6710,7 +6904,15 @@
         <w:spacing w:after="0" w:line="360" w:lineRule="auto"/>
       </w:pPr>
       <w:r>
-        <w:t>Estes dados reforçam a relevância estratégica da APS na economia nacional, como principal hub logístico e energético português, com forte integração nos mercados internacionais.</w:t>
+        <w:t xml:space="preserve">Estes dados reforçam a relevância estratégica da APS na economia nacional, como principal </w:t>
+      </w:r>
+      <w:proofErr w:type="spellStart"/>
+      <w:r>
+        <w:t>hub</w:t>
+      </w:r>
+      <w:proofErr w:type="spellEnd"/>
+      <w:r>
+        <w:t xml:space="preserve"> logístico e energético português, com forte integração nos mercados internacionais.</w:t>
       </w:r>
     </w:p>
     <w:p>
@@ -7233,16 +7435,28 @@
       <w:bookmarkEnd w:id="20"/>
     </w:p>
     <w:p>
-      <w:r>
-        <w:t>O planeamento estratégico da APS está alinhado com a Estratégia Nacional para o Mar 2030 e com as prioridades europeias de transição energética, digital e verde, definidas no Pacto Ecológico Europeu.</w:t>
-      </w:r>
-      <w:r>
-        <w:br/>
-        <w:t>Este planeamento define como eixos estruturantes a expansão e modernização das infraestruturas portuárias, o reforço da eficiência logística, a sustentabilidade ambiental e a inovação tecnológica.</w:t>
-      </w:r>
-      <w:r>
-        <w:br/>
+      <w:bookmarkStart w:id="21" w:name="_Toc211616108"/>
+      <w:r>
+        <w:t>O planeamento estratégico da APS está alinhado com a Estratégia Nacional para o Mar 2030 e com as prioridades europeias de transição energética, digital e verde, definidas no Pacto Ecológico Europeu. Este planeamento define como eixos estruturantes a expansão e modernização das infraestruturas portuárias, o reforço da eficiência logística, a sustentabilidade ambiental e a inovação tecnológica.</w:t>
+      </w:r>
+    </w:p>
+    <w:p>
+      <w:r>
         <w:t>A APS procura integrar estes pilares através de investimentos em projetos como a ampliação do Terminal XXI, a criação do novo Terminal Vasco da Gama e a implementação de sistemas digitais integrados de gestão portuária, reforçando a sua posição como plataforma logística estratégica para o comércio atlântico e ibérico.</w:t>
+      </w:r>
+    </w:p>
+    <w:p>
+      <w:r>
+        <w:t>Este planeamento estratégico reflete a visão da APS de afirmar-se como uma plataforma logística de referência no Atlântico e na Península Ibérica, sustentando a sua missão de promover o desenvolvimento portuário através da modernização, eficiência e sustentabilidade. Os seus valores — inovação tecnológica, responsabilidade ambiental e excelência operacional — orientam a sua cultura organizacional e guiam a tomada de decisão estratégica.</w:t>
+      </w:r>
+    </w:p>
+    <w:p>
+      <w:r>
+        <w:t xml:space="preserve">Desta forma, observa-se uma forte coerência entre a visão, missão e valores da APS, evidenciando uma orientação cultural baseada na sustentabilidade, na inovação e na integração com as políticas nacionais e </w:t>
+      </w:r>
+      <w:r>
+        <w:lastRenderedPageBreak/>
+        <w:t>europeias. Essa coerência reforça o posicionamento da APS como um agente essencial na transição energética e digital do setor portuário português.</w:t>
       </w:r>
     </w:p>
     <w:p>
@@ -7256,7 +7470,6 @@
           <w:szCs w:val="22"/>
         </w:rPr>
       </w:pPr>
-      <w:bookmarkStart w:id="21" w:name="_Toc211616108"/>
       <w:r>
         <w:rPr>
           <w:b/>
@@ -7431,7 +7644,15 @@
           </w:tcPr>
           <w:p>
             <w:r>
-              <w:t>Reforçar o papel do Porto de Sines como hub logístico e energético do Atlântico.</w:t>
+              <w:t xml:space="preserve">Reforçar o papel do Porto de Sines como </w:t>
+            </w:r>
+            <w:proofErr w:type="spellStart"/>
+            <w:r>
+              <w:t>hub</w:t>
+            </w:r>
+            <w:proofErr w:type="spellEnd"/>
+            <w:r>
+              <w:t xml:space="preserve"> logístico e energético do Atlântico.</w:t>
             </w:r>
           </w:p>
         </w:tc>
@@ -7463,7 +7684,6 @@
                 <w:bCs/>
                 <w:color w:val="000000" w:themeColor="text1"/>
               </w:rPr>
-              <w:lastRenderedPageBreak/>
               <w:t>Tático</w:t>
             </w:r>
           </w:p>
@@ -7909,7 +8129,15 @@
           </w:tcPr>
           <w:p>
             <w:r>
-              <w:t>Expansão dos terminais, utilização de energias verdes, automação portuária e reforço da ligação ferroviária ao hinterland ibérico.</w:t>
+              <w:t xml:space="preserve">Expansão dos terminais, utilização de energias verdes, automação portuária e reforço da ligação ferroviária ao </w:t>
+            </w:r>
+            <w:proofErr w:type="spellStart"/>
+            <w:r>
+              <w:t>hinterland</w:t>
+            </w:r>
+            <w:proofErr w:type="spellEnd"/>
+            <w:r>
+              <w:t xml:space="preserve"> ibérico.</w:t>
             </w:r>
           </w:p>
         </w:tc>
@@ -8015,6 +8243,7 @@
         <w:ind w:left="360"/>
       </w:pPr>
       <w:r>
+        <w:lastRenderedPageBreak/>
         <w:t>Reforçar a sustentabilidade ambiental e a eficiência energética nos portos sob administração da APS, promovendo operações portuárias com menores emissões e maior responsabilidade ambiental até 2030.</w:t>
       </w:r>
     </w:p>
@@ -8091,7 +8320,6 @@
         <w:ind w:left="360"/>
       </w:pPr>
       <w:r>
-        <w:lastRenderedPageBreak/>
         <w:t>Além disso, reforça o compromisso da APS com os Objetivos de Desenvolvimento Sustentável e com a Estratégia Nacional para o Mar 2030, consolidando a sua imagem de porto sustentável e competitivo.</w:t>
       </w:r>
     </w:p>
@@ -8384,7 +8612,23 @@
           </w:tcPr>
           <w:p>
             <w:r>
-              <w:t>Desenvolvimento de sistema IoT e dashboard analítico</w:t>
+              <w:t xml:space="preserve">Desenvolvimento de sistema </w:t>
+            </w:r>
+            <w:proofErr w:type="spellStart"/>
+            <w:r>
+              <w:t>IoT</w:t>
+            </w:r>
+            <w:proofErr w:type="spellEnd"/>
+            <w:r>
+              <w:t xml:space="preserve"> e </w:t>
+            </w:r>
+            <w:proofErr w:type="spellStart"/>
+            <w:r>
+              <w:t>dashboard</w:t>
+            </w:r>
+            <w:proofErr w:type="spellEnd"/>
+            <w:r>
+              <w:t xml:space="preserve"> analítico</w:t>
             </w:r>
           </w:p>
         </w:tc>
@@ -8468,6 +8712,7 @@
           <w:b/>
           <w:bCs/>
         </w:rPr>
+        <w:lastRenderedPageBreak/>
         <w:t>Resultados Esperados:</w:t>
       </w:r>
     </w:p>
@@ -8545,7 +8790,6 @@
         <w:ind w:left="360"/>
       </w:pPr>
       <w:r>
-        <w:lastRenderedPageBreak/>
         <w:t>Promover a transformação digital dos processos portuários da APS, aumentando a eficiência operacional, a integração com as cadeias logísticas internacionais e a segurança digital até 2028.</w:t>
       </w:r>
     </w:p>
@@ -8622,7 +8866,23 @@
         <w:ind w:left="360"/>
       </w:pPr>
       <w:r>
-        <w:t>A digitalização é uma prioridade tanto para a Estratégia Nacional para o Mar 2030 como para a agenda europeia dos Smart Ports, permitindo maior integração logística e competitividade.</w:t>
+        <w:t xml:space="preserve">A digitalização é uma prioridade tanto para a Estratégia Nacional para o Mar 2030 como para a agenda europeia dos </w:t>
+      </w:r>
+      <w:proofErr w:type="spellStart"/>
+      <w:r>
+        <w:t>Smart</w:t>
+      </w:r>
+      <w:proofErr w:type="spellEnd"/>
+      <w:r>
+        <w:t xml:space="preserve"> </w:t>
+      </w:r>
+      <w:proofErr w:type="spellStart"/>
+      <w:r>
+        <w:t>Ports</w:t>
+      </w:r>
+      <w:proofErr w:type="spellEnd"/>
+      <w:r>
+        <w:t>, permitindo maior integração logística e competitividade.</w:t>
       </w:r>
     </w:p>
     <w:p>
@@ -8675,7 +8935,15 @@
         <w:t xml:space="preserve">3. </w:t>
       </w:r>
       <w:r>
-        <w:t>Reforçar a cibersegurança e a proteção de dados nas infraestruturas digitais da APS.</w:t>
+        <w:t xml:space="preserve">Reforçar a </w:t>
+      </w:r>
+      <w:proofErr w:type="spellStart"/>
+      <w:r>
+        <w:t>cibersegurança</w:t>
+      </w:r>
+      <w:proofErr w:type="spellEnd"/>
+      <w:r>
+        <w:t xml:space="preserve"> e a proteção de dados nas infraestruturas digitais da APS.</w:t>
       </w:r>
     </w:p>
     <w:p>
@@ -8813,7 +9081,15 @@
               <w:t xml:space="preserve">1.1. </w:t>
             </w:r>
             <w:r>
-              <w:t>Implementar um sistema integrado de gestão documental e workflow digita</w:t>
+              <w:t xml:space="preserve">Implementar um sistema integrado de gestão documental e </w:t>
+            </w:r>
+            <w:proofErr w:type="spellStart"/>
+            <w:r>
+              <w:t>workflow</w:t>
+            </w:r>
+            <w:proofErr w:type="spellEnd"/>
+            <w:r>
+              <w:t xml:space="preserve"> digita</w:t>
             </w:r>
             <w:r>
               <w:t>l</w:t>
@@ -8868,7 +9144,31 @@
               <w:t xml:space="preserve"> </w:t>
             </w:r>
             <w:r>
-              <w:t>Criar plataforma interoperável de troca de dados (Port Community System)</w:t>
+              <w:t>Criar plataforma interoperável de troca de dados (</w:t>
+            </w:r>
+            <w:proofErr w:type="spellStart"/>
+            <w:r>
+              <w:t>Port</w:t>
+            </w:r>
+            <w:proofErr w:type="spellEnd"/>
+            <w:r>
+              <w:t xml:space="preserve"> </w:t>
+            </w:r>
+            <w:proofErr w:type="spellStart"/>
+            <w:r>
+              <w:t>Community</w:t>
+            </w:r>
+            <w:proofErr w:type="spellEnd"/>
+            <w:r>
+              <w:t xml:space="preserve"> </w:t>
+            </w:r>
+            <w:proofErr w:type="spellStart"/>
+            <w:r>
+              <w:t>System</w:t>
+            </w:r>
+            <w:proofErr w:type="spellEnd"/>
+            <w:r>
+              <w:t>)</w:t>
             </w:r>
           </w:p>
         </w:tc>
@@ -8896,7 +9196,15 @@
           </w:tcPr>
           <w:p>
             <w:r>
-              <w:t>Programadores, analistas de sistemas, servidores e APIs seguras</w:t>
+              <w:t xml:space="preserve">Programadores, analistas de sistemas, servidores e </w:t>
+            </w:r>
+            <w:proofErr w:type="spellStart"/>
+            <w:r>
+              <w:t>APIs</w:t>
+            </w:r>
+            <w:proofErr w:type="spellEnd"/>
+            <w:r>
+              <w:t xml:space="preserve"> seguras</w:t>
             </w:r>
           </w:p>
         </w:tc>
@@ -8913,7 +9221,16 @@
           </w:tcPr>
           <w:p>
             <w:r>
-              <w:t>3.1. Reforçar cibersegurança e boas práticas digitais</w:t>
+              <w:lastRenderedPageBreak/>
+              <w:t xml:space="preserve">3.1. Reforçar </w:t>
+            </w:r>
+            <w:proofErr w:type="spellStart"/>
+            <w:r>
+              <w:t>cibersegurança</w:t>
+            </w:r>
+            <w:proofErr w:type="spellEnd"/>
+            <w:r>
+              <w:t xml:space="preserve"> e boas práticas digitais</w:t>
             </w:r>
           </w:p>
         </w:tc>
@@ -9010,7 +9327,6 @@
       </w:pPr>
       <w:bookmarkStart w:id="25" w:name="_Toc211616112"/>
       <w:r>
-        <w:lastRenderedPageBreak/>
         <w:t>II.3 Controlo e Sistemas de informação</w:t>
       </w:r>
       <w:bookmarkEnd w:id="25"/>
@@ -9768,7 +10084,21 @@
         <w:rPr>
           <w:color w:val="auto"/>
         </w:rPr>
-        <w:t xml:space="preserve"> - Legacy (riscos estratégicos)</w:t>
+        <w:t xml:space="preserve"> - </w:t>
+      </w:r>
+      <w:proofErr w:type="spellStart"/>
+      <w:r>
+        <w:rPr>
+          <w:color w:val="auto"/>
+        </w:rPr>
+        <w:t>Legacy</w:t>
+      </w:r>
+      <w:proofErr w:type="spellEnd"/>
+      <w:r>
+        <w:rPr>
+          <w:color w:val="auto"/>
+        </w:rPr>
+        <w:t xml:space="preserve"> (riscos estratégicos)</w:t>
       </w:r>
       <w:bookmarkEnd w:id="43"/>
     </w:p>
@@ -9996,7 +10326,21 @@
         <w:rPr>
           <w:color w:val="auto"/>
         </w:rPr>
-        <w:t xml:space="preserve"> - Enablers de competitividade (recursos e competências)</w:t>
+        <w:t xml:space="preserve"> - </w:t>
+      </w:r>
+      <w:proofErr w:type="spellStart"/>
+      <w:r>
+        <w:rPr>
+          <w:color w:val="auto"/>
+        </w:rPr>
+        <w:t>Enablers</w:t>
+      </w:r>
+      <w:proofErr w:type="spellEnd"/>
+      <w:r>
+        <w:rPr>
+          <w:color w:val="auto"/>
+        </w:rPr>
+        <w:t xml:space="preserve"> de competitividade (recursos e competências)</w:t>
       </w:r>
       <w:bookmarkEnd w:id="45"/>
     </w:p>
@@ -10129,7 +10473,21 @@
         <w:rPr>
           <w:color w:val="auto"/>
         </w:rPr>
-        <w:t xml:space="preserve"> - Visão dos Stakeholders (competitividade</w:t>
+        <w:t xml:space="preserve"> - Visão dos </w:t>
+      </w:r>
+      <w:proofErr w:type="spellStart"/>
+      <w:r>
+        <w:rPr>
+          <w:color w:val="auto"/>
+        </w:rPr>
+        <w:t>Stakeholders</w:t>
+      </w:r>
+      <w:proofErr w:type="spellEnd"/>
+      <w:r>
+        <w:rPr>
+          <w:color w:val="auto"/>
+        </w:rPr>
+        <w:t xml:space="preserve"> (competitividade</w:t>
       </w:r>
       <w:r>
         <w:rPr>
@@ -10250,7 +10608,21 @@
         <w:rPr>
           <w:color w:val="auto"/>
         </w:rPr>
-        <w:t xml:space="preserve"> - Visão dos Stakeholders (cooperação)</w:t>
+        <w:t xml:space="preserve"> - Visão dos </w:t>
+      </w:r>
+      <w:proofErr w:type="spellStart"/>
+      <w:r>
+        <w:rPr>
+          <w:color w:val="auto"/>
+        </w:rPr>
+        <w:t>Stakeholders</w:t>
+      </w:r>
+      <w:proofErr w:type="spellEnd"/>
+      <w:r>
+        <w:rPr>
+          <w:color w:val="auto"/>
+        </w:rPr>
+        <w:t xml:space="preserve"> (cooperação)</w:t>
       </w:r>
       <w:bookmarkEnd w:id="47"/>
     </w:p>
@@ -10360,7 +10732,21 @@
         <w:rPr>
           <w:color w:val="auto"/>
         </w:rPr>
-        <w:t xml:space="preserve"> - Visão dos Stakeholders (expectativas)</w:t>
+        <w:t xml:space="preserve"> - Visão dos </w:t>
+      </w:r>
+      <w:proofErr w:type="spellStart"/>
+      <w:r>
+        <w:rPr>
+          <w:color w:val="auto"/>
+        </w:rPr>
+        <w:t>Stakeholders</w:t>
+      </w:r>
+      <w:proofErr w:type="spellEnd"/>
+      <w:r>
+        <w:rPr>
+          <w:color w:val="auto"/>
+        </w:rPr>
+        <w:t xml:space="preserve"> (expectativas)</w:t>
       </w:r>
       <w:bookmarkEnd w:id="48"/>
     </w:p>
@@ -10377,9 +10763,14 @@
       </w:pPr>
       <w:bookmarkStart w:id="49" w:name="_Toc211616125"/>
       <w:r>
-        <w:t>Ligações e Hinterland</w:t>
+        <w:t xml:space="preserve">Ligações e </w:t>
+      </w:r>
+      <w:proofErr w:type="spellStart"/>
+      <w:r>
+        <w:t>Hinterland</w:t>
       </w:r>
       <w:bookmarkEnd w:id="49"/>
+      <w:proofErr w:type="spellEnd"/>
     </w:p>
     <w:p>
       <w:pPr>
@@ -10510,7 +10901,21 @@
         <w:rPr>
           <w:color w:val="auto"/>
         </w:rPr>
-        <w:t xml:space="preserve"> - Ligações estratégicas do Porto de Sines: acessos marítimos globais e hinterland ibéric</w:t>
+        <w:t xml:space="preserve"> - Ligações estratégicas do Porto de Sines: acessos marítimos globais e </w:t>
+      </w:r>
+      <w:proofErr w:type="spellStart"/>
+      <w:r>
+        <w:rPr>
+          <w:color w:val="auto"/>
+        </w:rPr>
+        <w:t>hinterland</w:t>
+      </w:r>
+      <w:proofErr w:type="spellEnd"/>
+      <w:r>
+        <w:rPr>
+          <w:color w:val="auto"/>
+        </w:rPr>
+        <w:t xml:space="preserve"> ibéric</w:t>
       </w:r>
       <w:r>
         <w:rPr>
@@ -16780,7 +17185,6 @@
   <w:style w:type="character" w:default="1" w:styleId="Tipodeletrapredefinidodopargrafo">
     <w:name w:val="Default Paragraph Font"/>
     <w:uiPriority w:val="1"/>
-    <w:semiHidden/>
     <w:unhideWhenUsed/>
   </w:style>
   <w:style w:type="table" w:default="1" w:styleId="Tabelanormal">
@@ -17646,6 +18050,27 @@
 </file>
 
 <file path=customXml/item2.xml><?xml version="1.0" encoding="utf-8"?>
+<p:properties xmlns:p="http://schemas.microsoft.com/office/2006/metadata/properties" xmlns:xsi="http://www.w3.org/2001/XMLSchema-instance" xmlns:pc="http://schemas.microsoft.com/office/infopath/2007/PartnerControls">
+  <documentManagement>
+    <NotebookType xmlns="6e977478-40fc-4c96-9b59-58f9adc62218" xsi:nil="true"/>
+    <AppVersion xmlns="6e977478-40fc-4c96-9b59-58f9adc62218" xsi:nil="true"/>
+    <TeamsChannelId xmlns="6e977478-40fc-4c96-9b59-58f9adc62218" xsi:nil="true"/>
+    <FolderType xmlns="6e977478-40fc-4c96-9b59-58f9adc62218" xsi:nil="true"/>
+    <CultureName xmlns="6e977478-40fc-4c96-9b59-58f9adc62218" xsi:nil="true"/>
+  </documentManagement>
+</p:properties>
+</file>
+
+<file path=customXml/item3.xml><?xml version="1.0" encoding="utf-8"?>
+<?mso-contentType ?>
+<FormTemplates xmlns="http://schemas.microsoft.com/sharepoint/v3/contenttype/forms">
+  <Display>DocumentLibraryForm</Display>
+  <Edit>DocumentLibraryForm</Edit>
+  <New>DocumentLibraryForm</New>
+</FormTemplates>
+</file>
+
+<file path=customXml/item4.xml><?xml version="1.0" encoding="utf-8"?>
 <ct:contentTypeSchema xmlns:ct="http://schemas.microsoft.com/office/2006/metadata/contentType" xmlns:ma="http://schemas.microsoft.com/office/2006/metadata/properties/metaAttributes" ct:_="" ma:_="" ma:contentTypeName="Documento" ma:contentTypeID="0x0101008F0F40A57A4B4943AE5F0D22A00E6876" ma:contentTypeVersion="7" ma:contentTypeDescription="Criar um novo documento." ma:contentTypeScope="" ma:versionID="0777f9d8bcaf4fa9f3f247f35de05543">
   <xsd:schema xmlns:xsd="http://www.w3.org/2001/XMLSchema" xmlns:xs="http://www.w3.org/2001/XMLSchema" xmlns:p="http://schemas.microsoft.com/office/2006/metadata/properties" xmlns:ns2="6e977478-40fc-4c96-9b59-58f9adc62218" targetNamespace="http://schemas.microsoft.com/office/2006/metadata/properties" ma:root="true" ma:fieldsID="6e1588d9447c950b5d06efd32159bf41" ns2:_="">
     <xsd:import namespace="6e977478-40fc-4c96-9b59-58f9adc62218"/>
@@ -17807,27 +18232,6 @@
 </ct:contentTypeSchema>
 </file>
 
-<file path=customXml/item3.xml><?xml version="1.0" encoding="utf-8"?>
-<?mso-contentType ?>
-<FormTemplates xmlns="http://schemas.microsoft.com/sharepoint/v3/contenttype/forms">
-  <Display>DocumentLibraryForm</Display>
-  <Edit>DocumentLibraryForm</Edit>
-  <New>DocumentLibraryForm</New>
-</FormTemplates>
-</file>
-
-<file path=customXml/item4.xml><?xml version="1.0" encoding="utf-8"?>
-<p:properties xmlns:p="http://schemas.microsoft.com/office/2006/metadata/properties" xmlns:xsi="http://www.w3.org/2001/XMLSchema-instance" xmlns:pc="http://schemas.microsoft.com/office/infopath/2007/PartnerControls">
-  <documentManagement>
-    <NotebookType xmlns="6e977478-40fc-4c96-9b59-58f9adc62218" xsi:nil="true"/>
-    <AppVersion xmlns="6e977478-40fc-4c96-9b59-58f9adc62218" xsi:nil="true"/>
-    <TeamsChannelId xmlns="6e977478-40fc-4c96-9b59-58f9adc62218" xsi:nil="true"/>
-    <FolderType xmlns="6e977478-40fc-4c96-9b59-58f9adc62218" xsi:nil="true"/>
-    <CultureName xmlns="6e977478-40fc-4c96-9b59-58f9adc62218" xsi:nil="true"/>
-  </documentManagement>
-</p:properties>
-</file>
-
 <file path=customXml/itemProps1.xml><?xml version="1.0" encoding="utf-8"?>
 <ds:datastoreItem xmlns:ds="http://schemas.openxmlformats.org/officeDocument/2006/customXml" ds:itemID="{9C46D67E-02BF-4E37-8EF1-2391CC03D27F}">
   <ds:schemaRefs>
@@ -17837,6 +18241,24 @@
 </file>
 
 <file path=customXml/itemProps2.xml><?xml version="1.0" encoding="utf-8"?>
+<ds:datastoreItem xmlns:ds="http://schemas.openxmlformats.org/officeDocument/2006/customXml" ds:itemID="{A02BD9CC-6025-4F76-BD90-0F1427CF0A06}">
+  <ds:schemaRefs>
+    <ds:schemaRef ds:uri="http://schemas.microsoft.com/office/2006/metadata/properties"/>
+    <ds:schemaRef ds:uri="http://schemas.microsoft.com/office/infopath/2007/PartnerControls"/>
+    <ds:schemaRef ds:uri="6e977478-40fc-4c96-9b59-58f9adc62218"/>
+  </ds:schemaRefs>
+</ds:datastoreItem>
+</file>
+
+<file path=customXml/itemProps3.xml><?xml version="1.0" encoding="utf-8"?>
+<ds:datastoreItem xmlns:ds="http://schemas.openxmlformats.org/officeDocument/2006/customXml" ds:itemID="{A8BEE9C3-75AD-4607-B106-1B44B05722EA}">
+  <ds:schemaRefs>
+    <ds:schemaRef ds:uri="http://schemas.microsoft.com/sharepoint/v3/contenttype/forms"/>
+  </ds:schemaRefs>
+</ds:datastoreItem>
+</file>
+
+<file path=customXml/itemProps4.xml><?xml version="1.0" encoding="utf-8"?>
 <ds:datastoreItem xmlns:ds="http://schemas.openxmlformats.org/officeDocument/2006/customXml" ds:itemID="{F22FBF9B-697C-4384-8BA9-D9CACC814933}">
   <ds:schemaRefs>
     <ds:schemaRef ds:uri="http://schemas.microsoft.com/office/2006/metadata/contentType"/>
@@ -17852,22 +18274,4 @@
     <ds:schemaRef ds:uri="http://schemas.microsoft.com/internal/obd"/>
   </ds:schemaRefs>
 </ds:datastoreItem>
-</file>
-
-<file path=customXml/itemProps3.xml><?xml version="1.0" encoding="utf-8"?>
-<ds:datastoreItem xmlns:ds="http://schemas.openxmlformats.org/officeDocument/2006/customXml" ds:itemID="{A8BEE9C3-75AD-4607-B106-1B44B05722EA}">
-  <ds:schemaRefs>
-    <ds:schemaRef ds:uri="http://schemas.microsoft.com/sharepoint/v3/contenttype/forms"/>
-  </ds:schemaRefs>
-</ds:datastoreItem>
-</file>
-
-<file path=customXml/itemProps4.xml><?xml version="1.0" encoding="utf-8"?>
-<ds:datastoreItem xmlns:ds="http://schemas.openxmlformats.org/officeDocument/2006/customXml" ds:itemID="{A02BD9CC-6025-4F76-BD90-0F1427CF0A06}">
-  <ds:schemaRefs>
-    <ds:schemaRef ds:uri="http://schemas.microsoft.com/office/2006/metadata/properties"/>
-    <ds:schemaRef ds:uri="http://schemas.microsoft.com/office/infopath/2007/PartnerControls"/>
-    <ds:schemaRef ds:uri="6e977478-40fc-4c96-9b59-58f9adc62218"/>
-  </ds:schemaRefs>
-</ds:datastoreItem>
 </file>
</xml_diff>

<commit_message>
US 2.3.7 - corrections (#22)
</commit_message>
<xml_diff>
--- a/docs/client_analysis/report_APS.docx
+++ b/docs/client_analysis/report_APS.docx
@@ -614,7 +614,7 @@
           <w:r>
             <w:fldChar w:fldCharType="separate"/>
           </w:r>
-          <w:hyperlink w:anchor="_Toc211616092" w:history="1">
+          <w:hyperlink w:anchor="_Toc212402196" w:history="1">
             <w:r>
               <w:rPr>
                 <w:rStyle w:val="Hiperligao"/>
@@ -642,7 +642,7 @@
                 <w:noProof/>
                 <w:webHidden/>
               </w:rPr>
-              <w:instrText xml:space="preserve"> PAGEREF _Toc211616092 \h </w:instrText>
+              <w:instrText xml:space="preserve"> PAGEREF _Toc212402196 \h </w:instrText>
             </w:r>
             <w:r>
               <w:rPr>
@@ -687,7 +687,7 @@
               <w14:ligatures w14:val="standardContextual"/>
             </w:rPr>
           </w:pPr>
-          <w:hyperlink w:anchor="_Toc211616093" w:history="1">
+          <w:hyperlink w:anchor="_Toc212402197" w:history="1">
             <w:r>
               <w:rPr>
                 <w:rStyle w:val="Hiperligao"/>
@@ -715,7 +715,7 @@
                 <w:noProof/>
                 <w:webHidden/>
               </w:rPr>
-              <w:instrText xml:space="preserve"> PAGEREF _Toc211616093 \h </w:instrText>
+              <w:instrText xml:space="preserve"> PAGEREF _Toc212402197 \h </w:instrText>
             </w:r>
             <w:r>
               <w:rPr>
@@ -760,7 +760,7 @@
               <w14:ligatures w14:val="standardContextual"/>
             </w:rPr>
           </w:pPr>
-          <w:hyperlink w:anchor="_Toc211616094" w:history="1">
+          <w:hyperlink w:anchor="_Toc212402198" w:history="1">
             <w:r>
               <w:rPr>
                 <w:rStyle w:val="Hiperligao"/>
@@ -787,7 +787,7 @@
                 <w:noProof/>
                 <w:webHidden/>
               </w:rPr>
-              <w:instrText xml:space="preserve"> PAGEREF _Toc211616094 \h </w:instrText>
+              <w:instrText xml:space="preserve"> PAGEREF _Toc212402198 \h </w:instrText>
             </w:r>
             <w:r>
               <w:rPr>
@@ -832,7 +832,7 @@
               <w14:ligatures w14:val="standardContextual"/>
             </w:rPr>
           </w:pPr>
-          <w:hyperlink w:anchor="_Toc211616095" w:history="1">
+          <w:hyperlink w:anchor="_Toc212402199" w:history="1">
             <w:r>
               <w:rPr>
                 <w:rStyle w:val="Hiperligao"/>
@@ -859,7 +859,7 @@
                 <w:noProof/>
                 <w:webHidden/>
               </w:rPr>
-              <w:instrText xml:space="preserve"> PAGEREF _Toc211616095 \h </w:instrText>
+              <w:instrText xml:space="preserve"> PAGEREF _Toc212402199 \h </w:instrText>
             </w:r>
             <w:r>
               <w:rPr>
@@ -904,7 +904,7 @@
               <w14:ligatures w14:val="standardContextual"/>
             </w:rPr>
           </w:pPr>
-          <w:hyperlink w:anchor="_Toc211616096" w:history="1">
+          <w:hyperlink w:anchor="_Toc212402200" w:history="1">
             <w:r>
               <w:rPr>
                 <w:rStyle w:val="Hiperligao"/>
@@ -931,7 +931,7 @@
                 <w:noProof/>
                 <w:webHidden/>
               </w:rPr>
-              <w:instrText xml:space="preserve"> PAGEREF _Toc211616096 \h </w:instrText>
+              <w:instrText xml:space="preserve"> PAGEREF _Toc212402200 \h </w:instrText>
             </w:r>
             <w:r>
               <w:rPr>
@@ -976,7 +976,7 @@
               <w14:ligatures w14:val="standardContextual"/>
             </w:rPr>
           </w:pPr>
-          <w:hyperlink w:anchor="_Toc211616097" w:history="1">
+          <w:hyperlink w:anchor="_Toc212402201" w:history="1">
             <w:r>
               <w:rPr>
                 <w:rStyle w:val="Hiperligao"/>
@@ -1005,7 +1005,7 @@
                 <w:noProof/>
                 <w:webHidden/>
               </w:rPr>
-              <w:instrText xml:space="preserve"> PAGEREF _Toc211616097 \h </w:instrText>
+              <w:instrText xml:space="preserve"> PAGEREF _Toc212402201 \h </w:instrText>
             </w:r>
             <w:r>
               <w:rPr>
@@ -1050,7 +1050,7 @@
               <w14:ligatures w14:val="standardContextual"/>
             </w:rPr>
           </w:pPr>
-          <w:hyperlink w:anchor="_Toc211616098" w:history="1">
+          <w:hyperlink w:anchor="_Toc212402202" w:history="1">
             <w:r>
               <w:rPr>
                 <w:rStyle w:val="Hiperligao"/>
@@ -1079,7 +1079,7 @@
                 <w:noProof/>
                 <w:webHidden/>
               </w:rPr>
-              <w:instrText xml:space="preserve"> PAGEREF _Toc211616098 \h </w:instrText>
+              <w:instrText xml:space="preserve"> PAGEREF _Toc212402202 \h </w:instrText>
             </w:r>
             <w:r>
               <w:rPr>
@@ -1124,7 +1124,7 @@
               <w14:ligatures w14:val="standardContextual"/>
             </w:rPr>
           </w:pPr>
-          <w:hyperlink w:anchor="_Toc211616099" w:history="1">
+          <w:hyperlink w:anchor="_Toc212402203" w:history="1">
             <w:r>
               <w:rPr>
                 <w:rStyle w:val="Hiperligao"/>
@@ -1153,7 +1153,7 @@
                 <w:noProof/>
                 <w:webHidden/>
               </w:rPr>
-              <w:instrText xml:space="preserve"> PAGEREF _Toc211616099 \h </w:instrText>
+              <w:instrText xml:space="preserve"> PAGEREF _Toc212402203 \h </w:instrText>
             </w:r>
             <w:r>
               <w:rPr>
@@ -1198,7 +1198,7 @@
               <w14:ligatures w14:val="standardContextual"/>
             </w:rPr>
           </w:pPr>
-          <w:hyperlink w:anchor="_Toc211616100" w:history="1">
+          <w:hyperlink w:anchor="_Toc212402204" w:history="1">
             <w:r>
               <w:rPr>
                 <w:rStyle w:val="Hiperligao"/>
@@ -1227,7 +1227,7 @@
                 <w:noProof/>
                 <w:webHidden/>
               </w:rPr>
-              <w:instrText xml:space="preserve"> PAGEREF _Toc211616100 \h </w:instrText>
+              <w:instrText xml:space="preserve"> PAGEREF _Toc212402204 \h </w:instrText>
             </w:r>
             <w:r>
               <w:rPr>
@@ -1272,7 +1272,7 @@
               <w14:ligatures w14:val="standardContextual"/>
             </w:rPr>
           </w:pPr>
-          <w:hyperlink w:anchor="_Toc211616101" w:history="1">
+          <w:hyperlink w:anchor="_Toc212402205" w:history="1">
             <w:r>
               <w:rPr>
                 <w:rStyle w:val="Hiperligao"/>
@@ -1301,7 +1301,7 @@
                 <w:noProof/>
                 <w:webHidden/>
               </w:rPr>
-              <w:instrText xml:space="preserve"> PAGEREF _Toc211616101 \h </w:instrText>
+              <w:instrText xml:space="preserve"> PAGEREF _Toc212402205 \h </w:instrText>
             </w:r>
             <w:r>
               <w:rPr>
@@ -1322,6 +1322,78 @@
                 <w:webHidden/>
               </w:rPr>
               <w:t>7</w:t>
+            </w:r>
+            <w:r>
+              <w:rPr>
+                <w:noProof/>
+                <w:webHidden/>
+              </w:rPr>
+              <w:fldChar w:fldCharType="end"/>
+            </w:r>
+          </w:hyperlink>
+        </w:p>
+        <w:p>
+          <w:pPr>
+            <w:pStyle w:val="ndice1"/>
+            <w:tabs>
+              <w:tab w:val="right" w:leader="dot" w:pos="9350"/>
+            </w:tabs>
+            <w:rPr>
+              <w:rFonts w:asciiTheme="minorHAnsi" w:eastAsiaTheme="minorEastAsia" w:hAnsiTheme="minorHAnsi" w:cstheme="minorBidi"/>
+              <w:noProof/>
+              <w:kern w:val="2"/>
+              <w:sz w:val="24"/>
+              <w14:ligatures w14:val="standardContextual"/>
+            </w:rPr>
+          </w:pPr>
+          <w:hyperlink w:anchor="_Toc212402206" w:history="1">
+            <w:r>
+              <w:rPr>
+                <w:rStyle w:val="Hiperligao"/>
+                <w:noProof/>
+              </w:rPr>
+              <w:t>Parte II – Desenvolvimento</w:t>
+            </w:r>
+            <w:r>
+              <w:rPr>
+                <w:noProof/>
+                <w:webHidden/>
+              </w:rPr>
+              <w:tab/>
+            </w:r>
+            <w:r>
+              <w:rPr>
+                <w:noProof/>
+                <w:webHidden/>
+              </w:rPr>
+              <w:fldChar w:fldCharType="begin"/>
+            </w:r>
+            <w:r>
+              <w:rPr>
+                <w:noProof/>
+                <w:webHidden/>
+              </w:rPr>
+              <w:instrText xml:space="preserve"> PAGEREF _Toc212402206 \h </w:instrText>
+            </w:r>
+            <w:r>
+              <w:rPr>
+                <w:noProof/>
+                <w:webHidden/>
+              </w:rPr>
+            </w:r>
+            <w:r>
+              <w:rPr>
+                <w:noProof/>
+                <w:webHidden/>
+              </w:rPr>
+              <w:fldChar w:fldCharType="separate"/>
+            </w:r>
+            <w:r>
+              <w:rPr>
+                <w:noProof/>
+                <w:webHidden/>
+              </w:rPr>
+              <w:t>9</w:t>
             </w:r>
             <w:r>
               <w:rPr>
@@ -1346,13 +1418,13 @@
               <w14:ligatures w14:val="standardContextual"/>
             </w:rPr>
           </w:pPr>
-          <w:hyperlink w:anchor="_Toc211616102" w:history="1">
+          <w:hyperlink w:anchor="_Toc212402207" w:history="1">
             <w:r>
               <w:rPr>
                 <w:rStyle w:val="Hiperligao"/>
                 <w:noProof/>
               </w:rPr>
-              <w:t>I.2 Fontes de informação</w:t>
+              <w:t>II.1 Organização</w:t>
             </w:r>
             <w:r>
               <w:rPr>
@@ -1373,7 +1445,7 @@
                 <w:noProof/>
                 <w:webHidden/>
               </w:rPr>
-              <w:instrText xml:space="preserve"> PAGEREF _Toc211616102 \h </w:instrText>
+              <w:instrText xml:space="preserve"> PAGEREF _Toc212402207 \h </w:instrText>
             </w:r>
             <w:r>
               <w:rPr>
@@ -1393,7 +1465,1027 @@
                 <w:noProof/>
                 <w:webHidden/>
               </w:rPr>
-              <w:t>8</w:t>
+              <w:t>9</w:t>
+            </w:r>
+            <w:r>
+              <w:rPr>
+                <w:noProof/>
+                <w:webHidden/>
+              </w:rPr>
+              <w:fldChar w:fldCharType="end"/>
+            </w:r>
+          </w:hyperlink>
+        </w:p>
+        <w:p>
+          <w:pPr>
+            <w:pStyle w:val="ndice3"/>
+            <w:tabs>
+              <w:tab w:val="right" w:leader="dot" w:pos="9350"/>
+            </w:tabs>
+            <w:rPr>
+              <w:rFonts w:asciiTheme="minorHAnsi" w:eastAsiaTheme="minorEastAsia" w:hAnsiTheme="minorHAnsi" w:cstheme="minorBidi"/>
+              <w:noProof/>
+              <w:kern w:val="2"/>
+              <w:sz w:val="24"/>
+              <w14:ligatures w14:val="standardContextual"/>
+            </w:rPr>
+          </w:pPr>
+          <w:hyperlink w:anchor="_Toc212402208" w:history="1">
+            <w:r>
+              <w:rPr>
+                <w:rStyle w:val="Hiperligao"/>
+                <w:b/>
+                <w:bCs/>
+                <w:noProof/>
+              </w:rPr>
+              <w:t>Estrutura organizacional</w:t>
+            </w:r>
+            <w:r>
+              <w:rPr>
+                <w:noProof/>
+                <w:webHidden/>
+              </w:rPr>
+              <w:tab/>
+            </w:r>
+            <w:r>
+              <w:rPr>
+                <w:noProof/>
+                <w:webHidden/>
+              </w:rPr>
+              <w:fldChar w:fldCharType="begin"/>
+            </w:r>
+            <w:r>
+              <w:rPr>
+                <w:noProof/>
+                <w:webHidden/>
+              </w:rPr>
+              <w:instrText xml:space="preserve"> PAGEREF _Toc212402208 \h </w:instrText>
+            </w:r>
+            <w:r>
+              <w:rPr>
+                <w:noProof/>
+                <w:webHidden/>
+              </w:rPr>
+            </w:r>
+            <w:r>
+              <w:rPr>
+                <w:noProof/>
+                <w:webHidden/>
+              </w:rPr>
+              <w:fldChar w:fldCharType="separate"/>
+            </w:r>
+            <w:r>
+              <w:rPr>
+                <w:noProof/>
+                <w:webHidden/>
+              </w:rPr>
+              <w:t>9</w:t>
+            </w:r>
+            <w:r>
+              <w:rPr>
+                <w:noProof/>
+                <w:webHidden/>
+              </w:rPr>
+              <w:fldChar w:fldCharType="end"/>
+            </w:r>
+          </w:hyperlink>
+        </w:p>
+        <w:p>
+          <w:pPr>
+            <w:pStyle w:val="ndice3"/>
+            <w:tabs>
+              <w:tab w:val="right" w:leader="dot" w:pos="9350"/>
+            </w:tabs>
+            <w:rPr>
+              <w:rFonts w:asciiTheme="minorHAnsi" w:eastAsiaTheme="minorEastAsia" w:hAnsiTheme="minorHAnsi" w:cstheme="minorBidi"/>
+              <w:noProof/>
+              <w:kern w:val="2"/>
+              <w:sz w:val="24"/>
+              <w14:ligatures w14:val="standardContextual"/>
+            </w:rPr>
+          </w:pPr>
+          <w:hyperlink w:anchor="_Toc212402209" w:history="1">
+            <w:r>
+              <w:rPr>
+                <w:rStyle w:val="Hiperligao"/>
+                <w:b/>
+                <w:bCs/>
+                <w:noProof/>
+              </w:rPr>
+              <w:t>Proposta de melhoria</w:t>
+            </w:r>
+            <w:r>
+              <w:rPr>
+                <w:noProof/>
+                <w:webHidden/>
+              </w:rPr>
+              <w:tab/>
+            </w:r>
+            <w:r>
+              <w:rPr>
+                <w:noProof/>
+                <w:webHidden/>
+              </w:rPr>
+              <w:fldChar w:fldCharType="begin"/>
+            </w:r>
+            <w:r>
+              <w:rPr>
+                <w:noProof/>
+                <w:webHidden/>
+              </w:rPr>
+              <w:instrText xml:space="preserve"> PAGEREF _Toc212402209 \h </w:instrText>
+            </w:r>
+            <w:r>
+              <w:rPr>
+                <w:noProof/>
+                <w:webHidden/>
+              </w:rPr>
+            </w:r>
+            <w:r>
+              <w:rPr>
+                <w:noProof/>
+                <w:webHidden/>
+              </w:rPr>
+              <w:fldChar w:fldCharType="separate"/>
+            </w:r>
+            <w:r>
+              <w:rPr>
+                <w:noProof/>
+                <w:webHidden/>
+              </w:rPr>
+              <w:t>10</w:t>
+            </w:r>
+            <w:r>
+              <w:rPr>
+                <w:noProof/>
+                <w:webHidden/>
+              </w:rPr>
+              <w:fldChar w:fldCharType="end"/>
+            </w:r>
+          </w:hyperlink>
+        </w:p>
+        <w:p>
+          <w:pPr>
+            <w:pStyle w:val="ndice2"/>
+            <w:tabs>
+              <w:tab w:val="right" w:leader="dot" w:pos="9350"/>
+            </w:tabs>
+            <w:rPr>
+              <w:rFonts w:asciiTheme="minorHAnsi" w:eastAsiaTheme="minorEastAsia" w:hAnsiTheme="minorHAnsi" w:cstheme="minorBidi"/>
+              <w:noProof/>
+              <w:kern w:val="2"/>
+              <w:sz w:val="24"/>
+              <w14:ligatures w14:val="standardContextual"/>
+            </w:rPr>
+          </w:pPr>
+          <w:hyperlink w:anchor="_Toc212402210" w:history="1">
+            <w:r>
+              <w:rPr>
+                <w:rStyle w:val="Hiperligao"/>
+                <w:noProof/>
+              </w:rPr>
+              <w:t>II.2 Planeamento</w:t>
+            </w:r>
+            <w:r>
+              <w:rPr>
+                <w:noProof/>
+                <w:webHidden/>
+              </w:rPr>
+              <w:tab/>
+            </w:r>
+            <w:r>
+              <w:rPr>
+                <w:noProof/>
+                <w:webHidden/>
+              </w:rPr>
+              <w:fldChar w:fldCharType="begin"/>
+            </w:r>
+            <w:r>
+              <w:rPr>
+                <w:noProof/>
+                <w:webHidden/>
+              </w:rPr>
+              <w:instrText xml:space="preserve"> PAGEREF _Toc212402210 \h </w:instrText>
+            </w:r>
+            <w:r>
+              <w:rPr>
+                <w:noProof/>
+                <w:webHidden/>
+              </w:rPr>
+            </w:r>
+            <w:r>
+              <w:rPr>
+                <w:noProof/>
+                <w:webHidden/>
+              </w:rPr>
+              <w:fldChar w:fldCharType="separate"/>
+            </w:r>
+            <w:r>
+              <w:rPr>
+                <w:noProof/>
+                <w:webHidden/>
+              </w:rPr>
+              <w:t>11</w:t>
+            </w:r>
+            <w:r>
+              <w:rPr>
+                <w:noProof/>
+                <w:webHidden/>
+              </w:rPr>
+              <w:fldChar w:fldCharType="end"/>
+            </w:r>
+          </w:hyperlink>
+        </w:p>
+        <w:p>
+          <w:pPr>
+            <w:pStyle w:val="ndice3"/>
+            <w:tabs>
+              <w:tab w:val="right" w:leader="dot" w:pos="9350"/>
+            </w:tabs>
+            <w:rPr>
+              <w:rFonts w:asciiTheme="minorHAnsi" w:eastAsiaTheme="minorEastAsia" w:hAnsiTheme="minorHAnsi" w:cstheme="minorBidi"/>
+              <w:noProof/>
+              <w:kern w:val="2"/>
+              <w:sz w:val="24"/>
+              <w14:ligatures w14:val="standardContextual"/>
+            </w:rPr>
+          </w:pPr>
+          <w:hyperlink w:anchor="_Toc212402211" w:history="1">
+            <w:r>
+              <w:rPr>
+                <w:rStyle w:val="Hiperligao"/>
+                <w:b/>
+                <w:bCs/>
+                <w:noProof/>
+              </w:rPr>
+              <w:t>Objetivos SMART</w:t>
+            </w:r>
+            <w:r>
+              <w:rPr>
+                <w:noProof/>
+                <w:webHidden/>
+              </w:rPr>
+              <w:tab/>
+            </w:r>
+            <w:r>
+              <w:rPr>
+                <w:noProof/>
+                <w:webHidden/>
+              </w:rPr>
+              <w:fldChar w:fldCharType="begin"/>
+            </w:r>
+            <w:r>
+              <w:rPr>
+                <w:noProof/>
+                <w:webHidden/>
+              </w:rPr>
+              <w:instrText xml:space="preserve"> PAGEREF _Toc212402211 \h </w:instrText>
+            </w:r>
+            <w:r>
+              <w:rPr>
+                <w:noProof/>
+                <w:webHidden/>
+              </w:rPr>
+            </w:r>
+            <w:r>
+              <w:rPr>
+                <w:noProof/>
+                <w:webHidden/>
+              </w:rPr>
+              <w:fldChar w:fldCharType="separate"/>
+            </w:r>
+            <w:r>
+              <w:rPr>
+                <w:noProof/>
+                <w:webHidden/>
+              </w:rPr>
+              <w:t>12</w:t>
+            </w:r>
+            <w:r>
+              <w:rPr>
+                <w:noProof/>
+                <w:webHidden/>
+              </w:rPr>
+              <w:fldChar w:fldCharType="end"/>
+            </w:r>
+          </w:hyperlink>
+        </w:p>
+        <w:p>
+          <w:pPr>
+            <w:pStyle w:val="ndice3"/>
+            <w:tabs>
+              <w:tab w:val="right" w:leader="dot" w:pos="9350"/>
+            </w:tabs>
+            <w:rPr>
+              <w:rFonts w:asciiTheme="minorHAnsi" w:eastAsiaTheme="minorEastAsia" w:hAnsiTheme="minorHAnsi" w:cstheme="minorBidi"/>
+              <w:noProof/>
+              <w:kern w:val="2"/>
+              <w:sz w:val="24"/>
+              <w14:ligatures w14:val="standardContextual"/>
+            </w:rPr>
+          </w:pPr>
+          <w:hyperlink w:anchor="_Toc212402212" w:history="1">
+            <w:r>
+              <w:rPr>
+                <w:rStyle w:val="Hiperligao"/>
+                <w:b/>
+                <w:bCs/>
+                <w:noProof/>
+              </w:rPr>
+              <w:t>Análise SWOT</w:t>
+            </w:r>
+            <w:r>
+              <w:rPr>
+                <w:noProof/>
+                <w:webHidden/>
+              </w:rPr>
+              <w:tab/>
+            </w:r>
+            <w:r>
+              <w:rPr>
+                <w:noProof/>
+                <w:webHidden/>
+              </w:rPr>
+              <w:fldChar w:fldCharType="begin"/>
+            </w:r>
+            <w:r>
+              <w:rPr>
+                <w:noProof/>
+                <w:webHidden/>
+              </w:rPr>
+              <w:instrText xml:space="preserve"> PAGEREF _Toc212402212 \h </w:instrText>
+            </w:r>
+            <w:r>
+              <w:rPr>
+                <w:noProof/>
+                <w:webHidden/>
+              </w:rPr>
+            </w:r>
+            <w:r>
+              <w:rPr>
+                <w:noProof/>
+                <w:webHidden/>
+              </w:rPr>
+              <w:fldChar w:fldCharType="separate"/>
+            </w:r>
+            <w:r>
+              <w:rPr>
+                <w:noProof/>
+                <w:webHidden/>
+              </w:rPr>
+              <w:t>12</w:t>
+            </w:r>
+            <w:r>
+              <w:rPr>
+                <w:noProof/>
+                <w:webHidden/>
+              </w:rPr>
+              <w:fldChar w:fldCharType="end"/>
+            </w:r>
+          </w:hyperlink>
+        </w:p>
+        <w:p>
+          <w:pPr>
+            <w:pStyle w:val="ndice3"/>
+            <w:tabs>
+              <w:tab w:val="right" w:leader="dot" w:pos="9350"/>
+            </w:tabs>
+            <w:rPr>
+              <w:rFonts w:asciiTheme="minorHAnsi" w:eastAsiaTheme="minorEastAsia" w:hAnsiTheme="minorHAnsi" w:cstheme="minorBidi"/>
+              <w:noProof/>
+              <w:kern w:val="2"/>
+              <w:sz w:val="24"/>
+              <w14:ligatures w14:val="standardContextual"/>
+            </w:rPr>
+          </w:pPr>
+          <w:hyperlink w:anchor="_Toc212402213" w:history="1">
+            <w:r>
+              <w:rPr>
+                <w:rStyle w:val="Hiperligao"/>
+                <w:b/>
+                <w:bCs/>
+                <w:noProof/>
+              </w:rPr>
+              <w:t>Propostas Estratégica 1 - Sustentabilidade e Eficiência Energética</w:t>
+            </w:r>
+            <w:r>
+              <w:rPr>
+                <w:noProof/>
+                <w:webHidden/>
+              </w:rPr>
+              <w:tab/>
+            </w:r>
+            <w:r>
+              <w:rPr>
+                <w:noProof/>
+                <w:webHidden/>
+              </w:rPr>
+              <w:fldChar w:fldCharType="begin"/>
+            </w:r>
+            <w:r>
+              <w:rPr>
+                <w:noProof/>
+                <w:webHidden/>
+              </w:rPr>
+              <w:instrText xml:space="preserve"> PAGEREF _Toc212402213 \h </w:instrText>
+            </w:r>
+            <w:r>
+              <w:rPr>
+                <w:noProof/>
+                <w:webHidden/>
+              </w:rPr>
+            </w:r>
+            <w:r>
+              <w:rPr>
+                <w:noProof/>
+                <w:webHidden/>
+              </w:rPr>
+              <w:fldChar w:fldCharType="separate"/>
+            </w:r>
+            <w:r>
+              <w:rPr>
+                <w:noProof/>
+                <w:webHidden/>
+              </w:rPr>
+              <w:t>12</w:t>
+            </w:r>
+            <w:r>
+              <w:rPr>
+                <w:noProof/>
+                <w:webHidden/>
+              </w:rPr>
+              <w:fldChar w:fldCharType="end"/>
+            </w:r>
+          </w:hyperlink>
+        </w:p>
+        <w:p>
+          <w:pPr>
+            <w:pStyle w:val="ndice3"/>
+            <w:tabs>
+              <w:tab w:val="right" w:leader="dot" w:pos="9350"/>
+            </w:tabs>
+            <w:rPr>
+              <w:rFonts w:asciiTheme="minorHAnsi" w:eastAsiaTheme="minorEastAsia" w:hAnsiTheme="minorHAnsi" w:cstheme="minorBidi"/>
+              <w:noProof/>
+              <w:kern w:val="2"/>
+              <w:sz w:val="24"/>
+              <w14:ligatures w14:val="standardContextual"/>
+            </w:rPr>
+          </w:pPr>
+          <w:hyperlink w:anchor="_Toc212402214" w:history="1">
+            <w:r>
+              <w:rPr>
+                <w:rStyle w:val="Hiperligao"/>
+                <w:b/>
+                <w:bCs/>
+                <w:noProof/>
+              </w:rPr>
+              <w:t>Propostas Estratégica 2 - Transformação Digital e Inovação Tecnológica</w:t>
+            </w:r>
+            <w:r>
+              <w:rPr>
+                <w:noProof/>
+                <w:webHidden/>
+              </w:rPr>
+              <w:tab/>
+            </w:r>
+            <w:r>
+              <w:rPr>
+                <w:noProof/>
+                <w:webHidden/>
+              </w:rPr>
+              <w:fldChar w:fldCharType="begin"/>
+            </w:r>
+            <w:r>
+              <w:rPr>
+                <w:noProof/>
+                <w:webHidden/>
+              </w:rPr>
+              <w:instrText xml:space="preserve"> PAGEREF _Toc212402214 \h </w:instrText>
+            </w:r>
+            <w:r>
+              <w:rPr>
+                <w:noProof/>
+                <w:webHidden/>
+              </w:rPr>
+            </w:r>
+            <w:r>
+              <w:rPr>
+                <w:noProof/>
+                <w:webHidden/>
+              </w:rPr>
+              <w:fldChar w:fldCharType="separate"/>
+            </w:r>
+            <w:r>
+              <w:rPr>
+                <w:noProof/>
+                <w:webHidden/>
+              </w:rPr>
+              <w:t>14</w:t>
+            </w:r>
+            <w:r>
+              <w:rPr>
+                <w:noProof/>
+                <w:webHidden/>
+              </w:rPr>
+              <w:fldChar w:fldCharType="end"/>
+            </w:r>
+          </w:hyperlink>
+        </w:p>
+        <w:p>
+          <w:pPr>
+            <w:pStyle w:val="ndice2"/>
+            <w:tabs>
+              <w:tab w:val="right" w:leader="dot" w:pos="9350"/>
+            </w:tabs>
+            <w:rPr>
+              <w:rFonts w:asciiTheme="minorHAnsi" w:eastAsiaTheme="minorEastAsia" w:hAnsiTheme="minorHAnsi" w:cstheme="minorBidi"/>
+              <w:noProof/>
+              <w:kern w:val="2"/>
+              <w:sz w:val="24"/>
+              <w14:ligatures w14:val="standardContextual"/>
+            </w:rPr>
+          </w:pPr>
+          <w:hyperlink w:anchor="_Toc212402215" w:history="1">
+            <w:r>
+              <w:rPr>
+                <w:rStyle w:val="Hiperligao"/>
+                <w:noProof/>
+              </w:rPr>
+              <w:t>II.3 Controlo e Sistemas de informação</w:t>
+            </w:r>
+            <w:r>
+              <w:rPr>
+                <w:noProof/>
+                <w:webHidden/>
+              </w:rPr>
+              <w:tab/>
+            </w:r>
+            <w:r>
+              <w:rPr>
+                <w:noProof/>
+                <w:webHidden/>
+              </w:rPr>
+              <w:fldChar w:fldCharType="begin"/>
+            </w:r>
+            <w:r>
+              <w:rPr>
+                <w:noProof/>
+                <w:webHidden/>
+              </w:rPr>
+              <w:instrText xml:space="preserve"> PAGEREF _Toc212402215 \h </w:instrText>
+            </w:r>
+            <w:r>
+              <w:rPr>
+                <w:noProof/>
+                <w:webHidden/>
+              </w:rPr>
+            </w:r>
+            <w:r>
+              <w:rPr>
+                <w:noProof/>
+                <w:webHidden/>
+              </w:rPr>
+              <w:fldChar w:fldCharType="separate"/>
+            </w:r>
+            <w:r>
+              <w:rPr>
+                <w:noProof/>
+                <w:webHidden/>
+              </w:rPr>
+              <w:t>15</w:t>
+            </w:r>
+            <w:r>
+              <w:rPr>
+                <w:noProof/>
+                <w:webHidden/>
+              </w:rPr>
+              <w:fldChar w:fldCharType="end"/>
+            </w:r>
+          </w:hyperlink>
+        </w:p>
+        <w:p>
+          <w:pPr>
+            <w:pStyle w:val="ndice2"/>
+            <w:tabs>
+              <w:tab w:val="right" w:leader="dot" w:pos="9350"/>
+            </w:tabs>
+            <w:rPr>
+              <w:rFonts w:asciiTheme="minorHAnsi" w:eastAsiaTheme="minorEastAsia" w:hAnsiTheme="minorHAnsi" w:cstheme="minorBidi"/>
+              <w:noProof/>
+              <w:kern w:val="2"/>
+              <w:sz w:val="24"/>
+              <w14:ligatures w14:val="standardContextual"/>
+            </w:rPr>
+          </w:pPr>
+          <w:hyperlink w:anchor="_Toc212402216" w:history="1">
+            <w:r>
+              <w:rPr>
+                <w:rStyle w:val="Hiperligao"/>
+                <w:noProof/>
+              </w:rPr>
+              <w:t>II. 4 Direção e Gestão de Pessoas</w:t>
+            </w:r>
+            <w:r>
+              <w:rPr>
+                <w:noProof/>
+                <w:webHidden/>
+              </w:rPr>
+              <w:tab/>
+            </w:r>
+            <w:r>
+              <w:rPr>
+                <w:noProof/>
+                <w:webHidden/>
+              </w:rPr>
+              <w:fldChar w:fldCharType="begin"/>
+            </w:r>
+            <w:r>
+              <w:rPr>
+                <w:noProof/>
+                <w:webHidden/>
+              </w:rPr>
+              <w:instrText xml:space="preserve"> PAGEREF _Toc212402216 \h </w:instrText>
+            </w:r>
+            <w:r>
+              <w:rPr>
+                <w:noProof/>
+                <w:webHidden/>
+              </w:rPr>
+            </w:r>
+            <w:r>
+              <w:rPr>
+                <w:noProof/>
+                <w:webHidden/>
+              </w:rPr>
+              <w:fldChar w:fldCharType="separate"/>
+            </w:r>
+            <w:r>
+              <w:rPr>
+                <w:noProof/>
+                <w:webHidden/>
+              </w:rPr>
+              <w:t>15</w:t>
+            </w:r>
+            <w:r>
+              <w:rPr>
+                <w:noProof/>
+                <w:webHidden/>
+              </w:rPr>
+              <w:fldChar w:fldCharType="end"/>
+            </w:r>
+          </w:hyperlink>
+        </w:p>
+        <w:p>
+          <w:pPr>
+            <w:pStyle w:val="ndice2"/>
+            <w:tabs>
+              <w:tab w:val="right" w:leader="dot" w:pos="9350"/>
+            </w:tabs>
+            <w:rPr>
+              <w:rFonts w:asciiTheme="minorHAnsi" w:eastAsiaTheme="minorEastAsia" w:hAnsiTheme="minorHAnsi" w:cstheme="minorBidi"/>
+              <w:noProof/>
+              <w:kern w:val="2"/>
+              <w:sz w:val="24"/>
+              <w14:ligatures w14:val="standardContextual"/>
+            </w:rPr>
+          </w:pPr>
+          <w:hyperlink w:anchor="_Toc212402217" w:history="1">
+            <w:r>
+              <w:rPr>
+                <w:rStyle w:val="Hiperligao"/>
+                <w:noProof/>
+              </w:rPr>
+              <w:t>II.5 Promoção da produtividade</w:t>
+            </w:r>
+            <w:r>
+              <w:rPr>
+                <w:noProof/>
+                <w:webHidden/>
+              </w:rPr>
+              <w:tab/>
+            </w:r>
+            <w:r>
+              <w:rPr>
+                <w:noProof/>
+                <w:webHidden/>
+              </w:rPr>
+              <w:fldChar w:fldCharType="begin"/>
+            </w:r>
+            <w:r>
+              <w:rPr>
+                <w:noProof/>
+                <w:webHidden/>
+              </w:rPr>
+              <w:instrText xml:space="preserve"> PAGEREF _Toc212402217 \h </w:instrText>
+            </w:r>
+            <w:r>
+              <w:rPr>
+                <w:noProof/>
+                <w:webHidden/>
+              </w:rPr>
+            </w:r>
+            <w:r>
+              <w:rPr>
+                <w:noProof/>
+                <w:webHidden/>
+              </w:rPr>
+              <w:fldChar w:fldCharType="separate"/>
+            </w:r>
+            <w:r>
+              <w:rPr>
+                <w:noProof/>
+                <w:webHidden/>
+              </w:rPr>
+              <w:t>15</w:t>
+            </w:r>
+            <w:r>
+              <w:rPr>
+                <w:noProof/>
+                <w:webHidden/>
+              </w:rPr>
+              <w:fldChar w:fldCharType="end"/>
+            </w:r>
+          </w:hyperlink>
+        </w:p>
+        <w:p>
+          <w:pPr>
+            <w:pStyle w:val="ndice2"/>
+            <w:tabs>
+              <w:tab w:val="right" w:leader="dot" w:pos="9350"/>
+            </w:tabs>
+            <w:rPr>
+              <w:rFonts w:asciiTheme="minorHAnsi" w:eastAsiaTheme="minorEastAsia" w:hAnsiTheme="minorHAnsi" w:cstheme="minorBidi"/>
+              <w:noProof/>
+              <w:kern w:val="2"/>
+              <w:sz w:val="24"/>
+              <w14:ligatures w14:val="standardContextual"/>
+            </w:rPr>
+          </w:pPr>
+          <w:hyperlink w:anchor="_Toc212402218" w:history="1">
+            <w:r>
+              <w:rPr>
+                <w:rStyle w:val="Hiperligao"/>
+                <w:noProof/>
+              </w:rPr>
+              <w:t>II.6 Economia circular</w:t>
+            </w:r>
+            <w:r>
+              <w:rPr>
+                <w:noProof/>
+                <w:webHidden/>
+              </w:rPr>
+              <w:tab/>
+            </w:r>
+            <w:r>
+              <w:rPr>
+                <w:noProof/>
+                <w:webHidden/>
+              </w:rPr>
+              <w:fldChar w:fldCharType="begin"/>
+            </w:r>
+            <w:r>
+              <w:rPr>
+                <w:noProof/>
+                <w:webHidden/>
+              </w:rPr>
+              <w:instrText xml:space="preserve"> PAGEREF _Toc212402218 \h </w:instrText>
+            </w:r>
+            <w:r>
+              <w:rPr>
+                <w:noProof/>
+                <w:webHidden/>
+              </w:rPr>
+            </w:r>
+            <w:r>
+              <w:rPr>
+                <w:noProof/>
+                <w:webHidden/>
+              </w:rPr>
+              <w:fldChar w:fldCharType="separate"/>
+            </w:r>
+            <w:r>
+              <w:rPr>
+                <w:noProof/>
+                <w:webHidden/>
+              </w:rPr>
+              <w:t>15</w:t>
+            </w:r>
+            <w:r>
+              <w:rPr>
+                <w:noProof/>
+                <w:webHidden/>
+              </w:rPr>
+              <w:fldChar w:fldCharType="end"/>
+            </w:r>
+          </w:hyperlink>
+        </w:p>
+        <w:p>
+          <w:pPr>
+            <w:pStyle w:val="ndice2"/>
+            <w:tabs>
+              <w:tab w:val="right" w:leader="dot" w:pos="9350"/>
+            </w:tabs>
+            <w:rPr>
+              <w:rFonts w:asciiTheme="minorHAnsi" w:eastAsiaTheme="minorEastAsia" w:hAnsiTheme="minorHAnsi" w:cstheme="minorBidi"/>
+              <w:noProof/>
+              <w:kern w:val="2"/>
+              <w:sz w:val="24"/>
+              <w14:ligatures w14:val="standardContextual"/>
+            </w:rPr>
+          </w:pPr>
+          <w:hyperlink w:anchor="_Toc212402219" w:history="1">
+            <w:r>
+              <w:rPr>
+                <w:rStyle w:val="Hiperligao"/>
+                <w:noProof/>
+              </w:rPr>
+              <w:t>II.7 Marketing</w:t>
+            </w:r>
+            <w:r>
+              <w:rPr>
+                <w:noProof/>
+                <w:webHidden/>
+              </w:rPr>
+              <w:tab/>
+            </w:r>
+            <w:r>
+              <w:rPr>
+                <w:noProof/>
+                <w:webHidden/>
+              </w:rPr>
+              <w:fldChar w:fldCharType="begin"/>
+            </w:r>
+            <w:r>
+              <w:rPr>
+                <w:noProof/>
+                <w:webHidden/>
+              </w:rPr>
+              <w:instrText xml:space="preserve"> PAGEREF _Toc212402219 \h </w:instrText>
+            </w:r>
+            <w:r>
+              <w:rPr>
+                <w:noProof/>
+                <w:webHidden/>
+              </w:rPr>
+            </w:r>
+            <w:r>
+              <w:rPr>
+                <w:noProof/>
+                <w:webHidden/>
+              </w:rPr>
+              <w:fldChar w:fldCharType="separate"/>
+            </w:r>
+            <w:r>
+              <w:rPr>
+                <w:noProof/>
+                <w:webHidden/>
+              </w:rPr>
+              <w:t>15</w:t>
+            </w:r>
+            <w:r>
+              <w:rPr>
+                <w:noProof/>
+                <w:webHidden/>
+              </w:rPr>
+              <w:fldChar w:fldCharType="end"/>
+            </w:r>
+          </w:hyperlink>
+        </w:p>
+        <w:p>
+          <w:pPr>
+            <w:pStyle w:val="ndice2"/>
+            <w:tabs>
+              <w:tab w:val="right" w:leader="dot" w:pos="9350"/>
+            </w:tabs>
+            <w:rPr>
+              <w:rFonts w:asciiTheme="minorHAnsi" w:eastAsiaTheme="minorEastAsia" w:hAnsiTheme="minorHAnsi" w:cstheme="minorBidi"/>
+              <w:noProof/>
+              <w:kern w:val="2"/>
+              <w:sz w:val="24"/>
+              <w14:ligatures w14:val="standardContextual"/>
+            </w:rPr>
+          </w:pPr>
+          <w:hyperlink w:anchor="_Toc212402220" w:history="1">
+            <w:r>
+              <w:rPr>
+                <w:rStyle w:val="Hiperligao"/>
+                <w:noProof/>
+              </w:rPr>
+              <w:t>II. 8 Gestão Financeira</w:t>
+            </w:r>
+            <w:r>
+              <w:rPr>
+                <w:noProof/>
+                <w:webHidden/>
+              </w:rPr>
+              <w:tab/>
+            </w:r>
+            <w:r>
+              <w:rPr>
+                <w:noProof/>
+                <w:webHidden/>
+              </w:rPr>
+              <w:fldChar w:fldCharType="begin"/>
+            </w:r>
+            <w:r>
+              <w:rPr>
+                <w:noProof/>
+                <w:webHidden/>
+              </w:rPr>
+              <w:instrText xml:space="preserve"> PAGEREF _Toc212402220 \h </w:instrText>
+            </w:r>
+            <w:r>
+              <w:rPr>
+                <w:noProof/>
+                <w:webHidden/>
+              </w:rPr>
+            </w:r>
+            <w:r>
+              <w:rPr>
+                <w:noProof/>
+                <w:webHidden/>
+              </w:rPr>
+              <w:fldChar w:fldCharType="separate"/>
+            </w:r>
+            <w:r>
+              <w:rPr>
+                <w:noProof/>
+                <w:webHidden/>
+              </w:rPr>
+              <w:t>15</w:t>
+            </w:r>
+            <w:r>
+              <w:rPr>
+                <w:noProof/>
+                <w:webHidden/>
+              </w:rPr>
+              <w:fldChar w:fldCharType="end"/>
+            </w:r>
+          </w:hyperlink>
+        </w:p>
+        <w:p>
+          <w:pPr>
+            <w:pStyle w:val="ndice2"/>
+            <w:tabs>
+              <w:tab w:val="right" w:leader="dot" w:pos="9350"/>
+            </w:tabs>
+            <w:rPr>
+              <w:rFonts w:asciiTheme="minorHAnsi" w:eastAsiaTheme="minorEastAsia" w:hAnsiTheme="minorHAnsi" w:cstheme="minorBidi"/>
+              <w:noProof/>
+              <w:kern w:val="2"/>
+              <w:sz w:val="24"/>
+              <w14:ligatures w14:val="standardContextual"/>
+            </w:rPr>
+          </w:pPr>
+          <w:hyperlink w:anchor="_Toc212402221" w:history="1">
+            <w:r>
+              <w:rPr>
+                <w:rStyle w:val="Hiperligao"/>
+                <w:noProof/>
+              </w:rPr>
+              <w:t>II.9 Gestão das Operações e Indústria 4.0</w:t>
+            </w:r>
+            <w:r>
+              <w:rPr>
+                <w:noProof/>
+                <w:webHidden/>
+              </w:rPr>
+              <w:tab/>
+            </w:r>
+            <w:r>
+              <w:rPr>
+                <w:noProof/>
+                <w:webHidden/>
+              </w:rPr>
+              <w:fldChar w:fldCharType="begin"/>
+            </w:r>
+            <w:r>
+              <w:rPr>
+                <w:noProof/>
+                <w:webHidden/>
+              </w:rPr>
+              <w:instrText xml:space="preserve"> PAGEREF _Toc212402221 \h </w:instrText>
+            </w:r>
+            <w:r>
+              <w:rPr>
+                <w:noProof/>
+                <w:webHidden/>
+              </w:rPr>
+            </w:r>
+            <w:r>
+              <w:rPr>
+                <w:noProof/>
+                <w:webHidden/>
+              </w:rPr>
+              <w:fldChar w:fldCharType="separate"/>
+            </w:r>
+            <w:r>
+              <w:rPr>
+                <w:noProof/>
+                <w:webHidden/>
+              </w:rPr>
+              <w:t>16</w:t>
             </w:r>
             <w:r>
               <w:rPr>
@@ -1418,13 +2510,13 @@
               <w14:ligatures w14:val="standardContextual"/>
             </w:rPr>
           </w:pPr>
-          <w:hyperlink w:anchor="_Toc211616103" w:history="1">
+          <w:hyperlink w:anchor="_Toc212402222" w:history="1">
             <w:r>
               <w:rPr>
                 <w:rStyle w:val="Hiperligao"/>
                 <w:noProof/>
               </w:rPr>
-              <w:t>Parte II – Desenvolvimento</w:t>
+              <w:t>Parte III – Conclusão</w:t>
             </w:r>
             <w:r>
               <w:rPr>
@@ -1445,7 +2537,7 @@
                 <w:noProof/>
                 <w:webHidden/>
               </w:rPr>
-              <w:instrText xml:space="preserve"> PAGEREF _Toc211616103 \h </w:instrText>
+              <w:instrText xml:space="preserve"> PAGEREF _Toc212402222 \h </w:instrText>
             </w:r>
             <w:r>
               <w:rPr>
@@ -1465,7 +2557,7 @@
                 <w:noProof/>
                 <w:webHidden/>
               </w:rPr>
-              <w:t>9</w:t>
+              <w:t>17</w:t>
             </w:r>
             <w:r>
               <w:rPr>
@@ -1490,13 +2582,13 @@
               <w14:ligatures w14:val="standardContextual"/>
             </w:rPr>
           </w:pPr>
-          <w:hyperlink w:anchor="_Toc211616104" w:history="1">
+          <w:hyperlink w:anchor="_Toc212402223" w:history="1">
             <w:r>
               <w:rPr>
                 <w:rStyle w:val="Hiperligao"/>
                 <w:noProof/>
               </w:rPr>
-              <w:t>II.1 Organização</w:t>
+              <w:t>III.1 Conclusão</w:t>
             </w:r>
             <w:r>
               <w:rPr>
@@ -1517,7 +2609,7 @@
                 <w:noProof/>
                 <w:webHidden/>
               </w:rPr>
-              <w:instrText xml:space="preserve"> PAGEREF _Toc211616104 \h </w:instrText>
+              <w:instrText xml:space="preserve"> PAGEREF _Toc212402223 \h </w:instrText>
             </w:r>
             <w:r>
               <w:rPr>
@@ -1537,7 +2629,440 @@
                 <w:noProof/>
                 <w:webHidden/>
               </w:rPr>
-              <w:t>9</w:t>
+              <w:t>17</w:t>
+            </w:r>
+            <w:r>
+              <w:rPr>
+                <w:noProof/>
+                <w:webHidden/>
+              </w:rPr>
+              <w:fldChar w:fldCharType="end"/>
+            </w:r>
+          </w:hyperlink>
+        </w:p>
+        <w:p>
+          <w:pPr>
+            <w:pStyle w:val="ndice2"/>
+            <w:tabs>
+              <w:tab w:val="right" w:leader="dot" w:pos="9350"/>
+            </w:tabs>
+            <w:rPr>
+              <w:rFonts w:asciiTheme="minorHAnsi" w:eastAsiaTheme="minorEastAsia" w:hAnsiTheme="minorHAnsi" w:cstheme="minorBidi"/>
+              <w:noProof/>
+              <w:kern w:val="2"/>
+              <w:sz w:val="24"/>
+              <w14:ligatures w14:val="standardContextual"/>
+            </w:rPr>
+          </w:pPr>
+          <w:hyperlink w:anchor="_Toc212402224" w:history="1">
+            <w:r>
+              <w:rPr>
+                <w:rStyle w:val="Hiperligao"/>
+                <w:noProof/>
+              </w:rPr>
+              <w:t>III.2 Sugestões de melhoria</w:t>
+            </w:r>
+            <w:r>
+              <w:rPr>
+                <w:noProof/>
+                <w:webHidden/>
+              </w:rPr>
+              <w:tab/>
+            </w:r>
+            <w:r>
+              <w:rPr>
+                <w:noProof/>
+                <w:webHidden/>
+              </w:rPr>
+              <w:fldChar w:fldCharType="begin"/>
+            </w:r>
+            <w:r>
+              <w:rPr>
+                <w:noProof/>
+                <w:webHidden/>
+              </w:rPr>
+              <w:instrText xml:space="preserve"> PAGEREF _Toc212402224 \h </w:instrText>
+            </w:r>
+            <w:r>
+              <w:rPr>
+                <w:noProof/>
+                <w:webHidden/>
+              </w:rPr>
+            </w:r>
+            <w:r>
+              <w:rPr>
+                <w:noProof/>
+                <w:webHidden/>
+              </w:rPr>
+              <w:fldChar w:fldCharType="separate"/>
+            </w:r>
+            <w:r>
+              <w:rPr>
+                <w:noProof/>
+                <w:webHidden/>
+              </w:rPr>
+              <w:t>17</w:t>
+            </w:r>
+            <w:r>
+              <w:rPr>
+                <w:noProof/>
+                <w:webHidden/>
+              </w:rPr>
+              <w:fldChar w:fldCharType="end"/>
+            </w:r>
+          </w:hyperlink>
+        </w:p>
+        <w:p>
+          <w:pPr>
+            <w:pStyle w:val="ndice1"/>
+            <w:tabs>
+              <w:tab w:val="right" w:leader="dot" w:pos="9350"/>
+            </w:tabs>
+            <w:rPr>
+              <w:rFonts w:asciiTheme="minorHAnsi" w:eastAsiaTheme="minorEastAsia" w:hAnsiTheme="minorHAnsi" w:cstheme="minorBidi"/>
+              <w:noProof/>
+              <w:kern w:val="2"/>
+              <w:sz w:val="24"/>
+              <w14:ligatures w14:val="standardContextual"/>
+            </w:rPr>
+          </w:pPr>
+          <w:hyperlink w:anchor="_Toc212402225" w:history="1">
+            <w:r>
+              <w:rPr>
+                <w:rStyle w:val="Hiperligao"/>
+                <w:noProof/>
+              </w:rPr>
+              <w:t>Referências</w:t>
+            </w:r>
+            <w:r>
+              <w:rPr>
+                <w:noProof/>
+                <w:webHidden/>
+              </w:rPr>
+              <w:tab/>
+            </w:r>
+            <w:r>
+              <w:rPr>
+                <w:noProof/>
+                <w:webHidden/>
+              </w:rPr>
+              <w:fldChar w:fldCharType="begin"/>
+            </w:r>
+            <w:r>
+              <w:rPr>
+                <w:noProof/>
+                <w:webHidden/>
+              </w:rPr>
+              <w:instrText xml:space="preserve"> PAGEREF _Toc212402225 \h </w:instrText>
+            </w:r>
+            <w:r>
+              <w:rPr>
+                <w:noProof/>
+                <w:webHidden/>
+              </w:rPr>
+            </w:r>
+            <w:r>
+              <w:rPr>
+                <w:noProof/>
+                <w:webHidden/>
+              </w:rPr>
+              <w:fldChar w:fldCharType="separate"/>
+            </w:r>
+            <w:r>
+              <w:rPr>
+                <w:noProof/>
+                <w:webHidden/>
+              </w:rPr>
+              <w:t>18</w:t>
+            </w:r>
+            <w:r>
+              <w:rPr>
+                <w:noProof/>
+                <w:webHidden/>
+              </w:rPr>
+              <w:fldChar w:fldCharType="end"/>
+            </w:r>
+          </w:hyperlink>
+        </w:p>
+        <w:p>
+          <w:pPr>
+            <w:pStyle w:val="ndice1"/>
+            <w:tabs>
+              <w:tab w:val="right" w:leader="dot" w:pos="9350"/>
+            </w:tabs>
+            <w:rPr>
+              <w:rFonts w:asciiTheme="minorHAnsi" w:eastAsiaTheme="minorEastAsia" w:hAnsiTheme="minorHAnsi" w:cstheme="minorBidi"/>
+              <w:noProof/>
+              <w:kern w:val="2"/>
+              <w:sz w:val="24"/>
+              <w14:ligatures w14:val="standardContextual"/>
+            </w:rPr>
+          </w:pPr>
+          <w:hyperlink w:anchor="_Toc212402226" w:history="1">
+            <w:r>
+              <w:rPr>
+                <w:rStyle w:val="Hiperligao"/>
+                <w:rFonts w:eastAsia="Arial Narrow"/>
+                <w:noProof/>
+              </w:rPr>
+              <w:t>Anexos</w:t>
+            </w:r>
+            <w:r>
+              <w:rPr>
+                <w:noProof/>
+                <w:webHidden/>
+              </w:rPr>
+              <w:tab/>
+            </w:r>
+            <w:r>
+              <w:rPr>
+                <w:noProof/>
+                <w:webHidden/>
+              </w:rPr>
+              <w:fldChar w:fldCharType="begin"/>
+            </w:r>
+            <w:r>
+              <w:rPr>
+                <w:noProof/>
+                <w:webHidden/>
+              </w:rPr>
+              <w:instrText xml:space="preserve"> PAGEREF _Toc212402226 \h </w:instrText>
+            </w:r>
+            <w:r>
+              <w:rPr>
+                <w:noProof/>
+                <w:webHidden/>
+              </w:rPr>
+            </w:r>
+            <w:r>
+              <w:rPr>
+                <w:noProof/>
+                <w:webHidden/>
+              </w:rPr>
+              <w:fldChar w:fldCharType="separate"/>
+            </w:r>
+            <w:r>
+              <w:rPr>
+                <w:noProof/>
+                <w:webHidden/>
+              </w:rPr>
+              <w:t>18</w:t>
+            </w:r>
+            <w:r>
+              <w:rPr>
+                <w:noProof/>
+                <w:webHidden/>
+              </w:rPr>
+              <w:fldChar w:fldCharType="end"/>
+            </w:r>
+          </w:hyperlink>
+        </w:p>
+        <w:p>
+          <w:pPr>
+            <w:pStyle w:val="ndice2"/>
+            <w:tabs>
+              <w:tab w:val="right" w:leader="dot" w:pos="9350"/>
+            </w:tabs>
+            <w:rPr>
+              <w:rFonts w:asciiTheme="minorHAnsi" w:eastAsiaTheme="minorEastAsia" w:hAnsiTheme="minorHAnsi" w:cstheme="minorBidi"/>
+              <w:noProof/>
+              <w:kern w:val="2"/>
+              <w:sz w:val="24"/>
+              <w14:ligatures w14:val="standardContextual"/>
+            </w:rPr>
+          </w:pPr>
+          <w:hyperlink w:anchor="_Toc212402227" w:history="1">
+            <w:r>
+              <w:rPr>
+                <w:rStyle w:val="Hiperligao"/>
+                <w:noProof/>
+              </w:rPr>
+              <w:t>Opções Estratégicas para o Porto de Sines (2020-2030)</w:t>
+            </w:r>
+            <w:r>
+              <w:rPr>
+                <w:noProof/>
+                <w:webHidden/>
+              </w:rPr>
+              <w:tab/>
+            </w:r>
+            <w:r>
+              <w:rPr>
+                <w:noProof/>
+                <w:webHidden/>
+              </w:rPr>
+              <w:fldChar w:fldCharType="begin"/>
+            </w:r>
+            <w:r>
+              <w:rPr>
+                <w:noProof/>
+                <w:webHidden/>
+              </w:rPr>
+              <w:instrText xml:space="preserve"> PAGEREF _Toc212402227 \h </w:instrText>
+            </w:r>
+            <w:r>
+              <w:rPr>
+                <w:noProof/>
+                <w:webHidden/>
+              </w:rPr>
+            </w:r>
+            <w:r>
+              <w:rPr>
+                <w:noProof/>
+                <w:webHidden/>
+              </w:rPr>
+              <w:fldChar w:fldCharType="separate"/>
+            </w:r>
+            <w:r>
+              <w:rPr>
+                <w:noProof/>
+                <w:webHidden/>
+              </w:rPr>
+              <w:t>18</w:t>
+            </w:r>
+            <w:r>
+              <w:rPr>
+                <w:noProof/>
+                <w:webHidden/>
+              </w:rPr>
+              <w:fldChar w:fldCharType="end"/>
+            </w:r>
+          </w:hyperlink>
+        </w:p>
+        <w:p>
+          <w:pPr>
+            <w:pStyle w:val="ndice2"/>
+            <w:tabs>
+              <w:tab w:val="right" w:leader="dot" w:pos="9350"/>
+            </w:tabs>
+            <w:rPr>
+              <w:rFonts w:asciiTheme="minorHAnsi" w:eastAsiaTheme="minorEastAsia" w:hAnsiTheme="minorHAnsi" w:cstheme="minorBidi"/>
+              <w:noProof/>
+              <w:kern w:val="2"/>
+              <w:sz w:val="24"/>
+              <w14:ligatures w14:val="standardContextual"/>
+            </w:rPr>
+          </w:pPr>
+          <w:hyperlink w:anchor="_Toc212402228" w:history="1">
+            <w:r>
+              <w:rPr>
+                <w:rStyle w:val="Hiperligao"/>
+                <w:noProof/>
+              </w:rPr>
+              <w:t>Ligações e Hinterland</w:t>
+            </w:r>
+            <w:r>
+              <w:rPr>
+                <w:noProof/>
+                <w:webHidden/>
+              </w:rPr>
+              <w:tab/>
+            </w:r>
+            <w:r>
+              <w:rPr>
+                <w:noProof/>
+                <w:webHidden/>
+              </w:rPr>
+              <w:fldChar w:fldCharType="begin"/>
+            </w:r>
+            <w:r>
+              <w:rPr>
+                <w:noProof/>
+                <w:webHidden/>
+              </w:rPr>
+              <w:instrText xml:space="preserve"> PAGEREF _Toc212402228 \h </w:instrText>
+            </w:r>
+            <w:r>
+              <w:rPr>
+                <w:noProof/>
+                <w:webHidden/>
+              </w:rPr>
+            </w:r>
+            <w:r>
+              <w:rPr>
+                <w:noProof/>
+                <w:webHidden/>
+              </w:rPr>
+              <w:fldChar w:fldCharType="separate"/>
+            </w:r>
+            <w:r>
+              <w:rPr>
+                <w:noProof/>
+                <w:webHidden/>
+              </w:rPr>
+              <w:t>22</w:t>
+            </w:r>
+            <w:r>
+              <w:rPr>
+                <w:noProof/>
+                <w:webHidden/>
+              </w:rPr>
+              <w:fldChar w:fldCharType="end"/>
+            </w:r>
+          </w:hyperlink>
+        </w:p>
+        <w:p>
+          <w:pPr>
+            <w:pStyle w:val="ndice2"/>
+            <w:tabs>
+              <w:tab w:val="right" w:leader="dot" w:pos="9350"/>
+            </w:tabs>
+            <w:rPr>
+              <w:rFonts w:asciiTheme="minorHAnsi" w:eastAsiaTheme="minorEastAsia" w:hAnsiTheme="minorHAnsi" w:cstheme="minorBidi"/>
+              <w:noProof/>
+              <w:kern w:val="2"/>
+              <w:sz w:val="24"/>
+              <w14:ligatures w14:val="standardContextual"/>
+            </w:rPr>
+          </w:pPr>
+          <w:hyperlink w:anchor="_Toc212402229" w:history="1">
+            <w:r>
+              <w:rPr>
+                <w:rStyle w:val="Hiperligao"/>
+                <w:noProof/>
+              </w:rPr>
+              <w:t>Estatísticas</w:t>
+            </w:r>
+            <w:r>
+              <w:rPr>
+                <w:noProof/>
+                <w:webHidden/>
+              </w:rPr>
+              <w:tab/>
+            </w:r>
+            <w:r>
+              <w:rPr>
+                <w:noProof/>
+                <w:webHidden/>
+              </w:rPr>
+              <w:fldChar w:fldCharType="begin"/>
+            </w:r>
+            <w:r>
+              <w:rPr>
+                <w:noProof/>
+                <w:webHidden/>
+              </w:rPr>
+              <w:instrText xml:space="preserve"> PAGEREF _Toc212402229 \h </w:instrText>
+            </w:r>
+            <w:r>
+              <w:rPr>
+                <w:noProof/>
+                <w:webHidden/>
+              </w:rPr>
+            </w:r>
+            <w:r>
+              <w:rPr>
+                <w:noProof/>
+                <w:webHidden/>
+              </w:rPr>
+              <w:fldChar w:fldCharType="separate"/>
+            </w:r>
+            <w:r>
+              <w:rPr>
+                <w:noProof/>
+                <w:webHidden/>
+              </w:rPr>
+              <w:t>23</w:t>
             </w:r>
             <w:r>
               <w:rPr>
@@ -1562,7 +3087,7 @@
               <w14:ligatures w14:val="standardContextual"/>
             </w:rPr>
           </w:pPr>
-          <w:hyperlink w:anchor="_Toc211616105" w:history="1">
+          <w:hyperlink w:anchor="_Toc212402230" w:history="1">
             <w:r>
               <w:rPr>
                 <w:rStyle w:val="Hiperligao"/>
@@ -1570,7 +3095,7 @@
                 <w:bCs/>
                 <w:noProof/>
               </w:rPr>
-              <w:t>Estrutura organizacional</w:t>
+              <w:t>Navios</w:t>
             </w:r>
             <w:r>
               <w:rPr>
@@ -1591,7 +3116,7 @@
                 <w:noProof/>
                 <w:webHidden/>
               </w:rPr>
-              <w:instrText xml:space="preserve"> PAGEREF _Toc211616105 \h </w:instrText>
+              <w:instrText xml:space="preserve"> PAGEREF _Toc212402230 \h </w:instrText>
             </w:r>
             <w:r>
               <w:rPr>
@@ -1611,7 +3136,7 @@
                 <w:noProof/>
                 <w:webHidden/>
               </w:rPr>
-              <w:t>9</w:t>
+              <w:t>23</w:t>
             </w:r>
             <w:r>
               <w:rPr>
@@ -1636,7 +3161,7 @@
               <w14:ligatures w14:val="standardContextual"/>
             </w:rPr>
           </w:pPr>
-          <w:hyperlink w:anchor="_Toc211616106" w:history="1">
+          <w:hyperlink w:anchor="_Toc212402231" w:history="1">
             <w:r>
               <w:rPr>
                 <w:rStyle w:val="Hiperligao"/>
@@ -1644,7 +3169,7 @@
                 <w:bCs/>
                 <w:noProof/>
               </w:rPr>
-              <w:t>Proposta de melhoria</w:t>
+              <w:t>Mercadorias</w:t>
             </w:r>
             <w:r>
               <w:rPr>
@@ -1665,7 +3190,7 @@
                 <w:noProof/>
                 <w:webHidden/>
               </w:rPr>
-              <w:instrText xml:space="preserve"> PAGEREF _Toc211616106 \h </w:instrText>
+              <w:instrText xml:space="preserve"> PAGEREF _Toc212402231 \h </w:instrText>
             </w:r>
             <w:r>
               <w:rPr>
@@ -1685,79 +3210,7 @@
                 <w:noProof/>
                 <w:webHidden/>
               </w:rPr>
-              <w:t>10</w:t>
-            </w:r>
-            <w:r>
-              <w:rPr>
-                <w:noProof/>
-                <w:webHidden/>
-              </w:rPr>
-              <w:fldChar w:fldCharType="end"/>
-            </w:r>
-          </w:hyperlink>
-        </w:p>
-        <w:p>
-          <w:pPr>
-            <w:pStyle w:val="ndice2"/>
-            <w:tabs>
-              <w:tab w:val="right" w:leader="dot" w:pos="9350"/>
-            </w:tabs>
-            <w:rPr>
-              <w:rFonts w:asciiTheme="minorHAnsi" w:eastAsiaTheme="minorEastAsia" w:hAnsiTheme="minorHAnsi" w:cstheme="minorBidi"/>
-              <w:noProof/>
-              <w:kern w:val="2"/>
-              <w:sz w:val="24"/>
-              <w14:ligatures w14:val="standardContextual"/>
-            </w:rPr>
-          </w:pPr>
-          <w:hyperlink w:anchor="_Toc211616107" w:history="1">
-            <w:r>
-              <w:rPr>
-                <w:rStyle w:val="Hiperligao"/>
-                <w:noProof/>
-              </w:rPr>
-              <w:t>II.2 Planeamento</w:t>
-            </w:r>
-            <w:r>
-              <w:rPr>
-                <w:noProof/>
-                <w:webHidden/>
-              </w:rPr>
-              <w:tab/>
-            </w:r>
-            <w:r>
-              <w:rPr>
-                <w:noProof/>
-                <w:webHidden/>
-              </w:rPr>
-              <w:fldChar w:fldCharType="begin"/>
-            </w:r>
-            <w:r>
-              <w:rPr>
-                <w:noProof/>
-                <w:webHidden/>
-              </w:rPr>
-              <w:instrText xml:space="preserve"> PAGEREF _Toc211616107 \h </w:instrText>
-            </w:r>
-            <w:r>
-              <w:rPr>
-                <w:noProof/>
-                <w:webHidden/>
-              </w:rPr>
-            </w:r>
-            <w:r>
-              <w:rPr>
-                <w:noProof/>
-                <w:webHidden/>
-              </w:rPr>
-              <w:fldChar w:fldCharType="separate"/>
-            </w:r>
-            <w:r>
-              <w:rPr>
-                <w:noProof/>
-                <w:webHidden/>
-              </w:rPr>
-              <w:t>11</w:t>
+              <w:t>25</w:t>
             </w:r>
             <w:r>
               <w:rPr>
@@ -1782,7 +3235,7 @@
               <w14:ligatures w14:val="standardContextual"/>
             </w:rPr>
           </w:pPr>
-          <w:hyperlink w:anchor="_Toc211616108" w:history="1">
+          <w:hyperlink w:anchor="_Toc212402232" w:history="1">
             <w:r>
               <w:rPr>
                 <w:rStyle w:val="Hiperligao"/>
@@ -1790,7 +3243,7 @@
                 <w:bCs/>
                 <w:noProof/>
               </w:rPr>
-              <w:t>Objetivos SMART</w:t>
+              <w:t>Passageiros</w:t>
             </w:r>
             <w:r>
               <w:rPr>
@@ -1811,1532 +3264,7 @@
                 <w:noProof/>
                 <w:webHidden/>
               </w:rPr>
-              <w:instrText xml:space="preserve"> PAGEREF _Toc211616108 \h </w:instrText>
-            </w:r>
-            <w:r>
-              <w:rPr>
-                <w:noProof/>
-                <w:webHidden/>
-              </w:rPr>
-            </w:r>
-            <w:r>
-              <w:rPr>
-                <w:noProof/>
-                <w:webHidden/>
-              </w:rPr>
-              <w:fldChar w:fldCharType="separate"/>
-            </w:r>
-            <w:r>
-              <w:rPr>
-                <w:noProof/>
-                <w:webHidden/>
-              </w:rPr>
-              <w:t>12</w:t>
-            </w:r>
-            <w:r>
-              <w:rPr>
-                <w:noProof/>
-                <w:webHidden/>
-              </w:rPr>
-              <w:fldChar w:fldCharType="end"/>
-            </w:r>
-          </w:hyperlink>
-        </w:p>
-        <w:p>
-          <w:pPr>
-            <w:pStyle w:val="ndice3"/>
-            <w:tabs>
-              <w:tab w:val="right" w:leader="dot" w:pos="9350"/>
-            </w:tabs>
-            <w:rPr>
-              <w:rFonts w:asciiTheme="minorHAnsi" w:eastAsiaTheme="minorEastAsia" w:hAnsiTheme="minorHAnsi" w:cstheme="minorBidi"/>
-              <w:noProof/>
-              <w:kern w:val="2"/>
-              <w:sz w:val="24"/>
-              <w14:ligatures w14:val="standardContextual"/>
-            </w:rPr>
-          </w:pPr>
-          <w:hyperlink w:anchor="_Toc211616109" w:history="1">
-            <w:r>
-              <w:rPr>
-                <w:rStyle w:val="Hiperligao"/>
-                <w:b/>
-                <w:bCs/>
-                <w:noProof/>
-              </w:rPr>
-              <w:t>Análise SWOT</w:t>
-            </w:r>
-            <w:r>
-              <w:rPr>
-                <w:noProof/>
-                <w:webHidden/>
-              </w:rPr>
-              <w:tab/>
-            </w:r>
-            <w:r>
-              <w:rPr>
-                <w:noProof/>
-                <w:webHidden/>
-              </w:rPr>
-              <w:fldChar w:fldCharType="begin"/>
-            </w:r>
-            <w:r>
-              <w:rPr>
-                <w:noProof/>
-                <w:webHidden/>
-              </w:rPr>
-              <w:instrText xml:space="preserve"> PAGEREF _Toc211616109 \h </w:instrText>
-            </w:r>
-            <w:r>
-              <w:rPr>
-                <w:noProof/>
-                <w:webHidden/>
-              </w:rPr>
-            </w:r>
-            <w:r>
-              <w:rPr>
-                <w:noProof/>
-                <w:webHidden/>
-              </w:rPr>
-              <w:fldChar w:fldCharType="separate"/>
-            </w:r>
-            <w:r>
-              <w:rPr>
-                <w:noProof/>
-                <w:webHidden/>
-              </w:rPr>
-              <w:t>12</w:t>
-            </w:r>
-            <w:r>
-              <w:rPr>
-                <w:noProof/>
-                <w:webHidden/>
-              </w:rPr>
-              <w:fldChar w:fldCharType="end"/>
-            </w:r>
-          </w:hyperlink>
-        </w:p>
-        <w:p>
-          <w:pPr>
-            <w:pStyle w:val="ndice3"/>
-            <w:tabs>
-              <w:tab w:val="right" w:leader="dot" w:pos="9350"/>
-            </w:tabs>
-            <w:rPr>
-              <w:rFonts w:asciiTheme="minorHAnsi" w:eastAsiaTheme="minorEastAsia" w:hAnsiTheme="minorHAnsi" w:cstheme="minorBidi"/>
-              <w:noProof/>
-              <w:kern w:val="2"/>
-              <w:sz w:val="24"/>
-              <w14:ligatures w14:val="standardContextual"/>
-            </w:rPr>
-          </w:pPr>
-          <w:hyperlink w:anchor="_Toc211616110" w:history="1">
-            <w:r>
-              <w:rPr>
-                <w:rStyle w:val="Hiperligao"/>
-                <w:b/>
-                <w:bCs/>
-                <w:noProof/>
-              </w:rPr>
-              <w:t>Propostas Estratégica 1 - Sustentabilidade e Eficiência Energética</w:t>
-            </w:r>
-            <w:r>
-              <w:rPr>
-                <w:noProof/>
-                <w:webHidden/>
-              </w:rPr>
-              <w:tab/>
-            </w:r>
-            <w:r>
-              <w:rPr>
-                <w:noProof/>
-                <w:webHidden/>
-              </w:rPr>
-              <w:fldChar w:fldCharType="begin"/>
-            </w:r>
-            <w:r>
-              <w:rPr>
-                <w:noProof/>
-                <w:webHidden/>
-              </w:rPr>
-              <w:instrText xml:space="preserve"> PAGEREF _Toc211616110 \h </w:instrText>
-            </w:r>
-            <w:r>
-              <w:rPr>
-                <w:noProof/>
-                <w:webHidden/>
-              </w:rPr>
-            </w:r>
-            <w:r>
-              <w:rPr>
-                <w:noProof/>
-                <w:webHidden/>
-              </w:rPr>
-              <w:fldChar w:fldCharType="separate"/>
-            </w:r>
-            <w:r>
-              <w:rPr>
-                <w:noProof/>
-                <w:webHidden/>
-              </w:rPr>
-              <w:t>13</w:t>
-            </w:r>
-            <w:r>
-              <w:rPr>
-                <w:noProof/>
-                <w:webHidden/>
-              </w:rPr>
-              <w:fldChar w:fldCharType="end"/>
-            </w:r>
-          </w:hyperlink>
-        </w:p>
-        <w:p>
-          <w:pPr>
-            <w:pStyle w:val="ndice3"/>
-            <w:tabs>
-              <w:tab w:val="right" w:leader="dot" w:pos="9350"/>
-            </w:tabs>
-            <w:rPr>
-              <w:rFonts w:asciiTheme="minorHAnsi" w:eastAsiaTheme="minorEastAsia" w:hAnsiTheme="minorHAnsi" w:cstheme="minorBidi"/>
-              <w:noProof/>
-              <w:kern w:val="2"/>
-              <w:sz w:val="24"/>
-              <w14:ligatures w14:val="standardContextual"/>
-            </w:rPr>
-          </w:pPr>
-          <w:hyperlink w:anchor="_Toc211616111" w:history="1">
-            <w:r>
-              <w:rPr>
-                <w:rStyle w:val="Hiperligao"/>
-                <w:b/>
-                <w:bCs/>
-                <w:noProof/>
-              </w:rPr>
-              <w:t>Propostas Estratégica 2 - Transformação Digital e Inovação Tecnológica</w:t>
-            </w:r>
-            <w:r>
-              <w:rPr>
-                <w:noProof/>
-                <w:webHidden/>
-              </w:rPr>
-              <w:tab/>
-            </w:r>
-            <w:r>
-              <w:rPr>
-                <w:noProof/>
-                <w:webHidden/>
-              </w:rPr>
-              <w:fldChar w:fldCharType="begin"/>
-            </w:r>
-            <w:r>
-              <w:rPr>
-                <w:noProof/>
-                <w:webHidden/>
-              </w:rPr>
-              <w:instrText xml:space="preserve"> PAGEREF _Toc211616111 \h </w:instrText>
-            </w:r>
-            <w:r>
-              <w:rPr>
-                <w:noProof/>
-                <w:webHidden/>
-              </w:rPr>
-            </w:r>
-            <w:r>
-              <w:rPr>
-                <w:noProof/>
-                <w:webHidden/>
-              </w:rPr>
-              <w:fldChar w:fldCharType="separate"/>
-            </w:r>
-            <w:r>
-              <w:rPr>
-                <w:noProof/>
-                <w:webHidden/>
-              </w:rPr>
-              <w:t>14</w:t>
-            </w:r>
-            <w:r>
-              <w:rPr>
-                <w:noProof/>
-                <w:webHidden/>
-              </w:rPr>
-              <w:fldChar w:fldCharType="end"/>
-            </w:r>
-          </w:hyperlink>
-        </w:p>
-        <w:p>
-          <w:pPr>
-            <w:pStyle w:val="ndice2"/>
-            <w:tabs>
-              <w:tab w:val="right" w:leader="dot" w:pos="9350"/>
-            </w:tabs>
-            <w:rPr>
-              <w:rFonts w:asciiTheme="minorHAnsi" w:eastAsiaTheme="minorEastAsia" w:hAnsiTheme="minorHAnsi" w:cstheme="minorBidi"/>
-              <w:noProof/>
-              <w:kern w:val="2"/>
-              <w:sz w:val="24"/>
-              <w14:ligatures w14:val="standardContextual"/>
-            </w:rPr>
-          </w:pPr>
-          <w:hyperlink w:anchor="_Toc211616112" w:history="1">
-            <w:r>
-              <w:rPr>
-                <w:rStyle w:val="Hiperligao"/>
-                <w:noProof/>
-              </w:rPr>
-              <w:t>II.3 Controlo e Sistemas de informação</w:t>
-            </w:r>
-            <w:r>
-              <w:rPr>
-                <w:noProof/>
-                <w:webHidden/>
-              </w:rPr>
-              <w:tab/>
-            </w:r>
-            <w:r>
-              <w:rPr>
-                <w:noProof/>
-                <w:webHidden/>
-              </w:rPr>
-              <w:fldChar w:fldCharType="begin"/>
-            </w:r>
-            <w:r>
-              <w:rPr>
-                <w:noProof/>
-                <w:webHidden/>
-              </w:rPr>
-              <w:instrText xml:space="preserve"> PAGEREF _Toc211616112 \h </w:instrText>
-            </w:r>
-            <w:r>
-              <w:rPr>
-                <w:noProof/>
-                <w:webHidden/>
-              </w:rPr>
-            </w:r>
-            <w:r>
-              <w:rPr>
-                <w:noProof/>
-                <w:webHidden/>
-              </w:rPr>
-              <w:fldChar w:fldCharType="separate"/>
-            </w:r>
-            <w:r>
-              <w:rPr>
-                <w:noProof/>
-                <w:webHidden/>
-              </w:rPr>
-              <w:t>16</w:t>
-            </w:r>
-            <w:r>
-              <w:rPr>
-                <w:noProof/>
-                <w:webHidden/>
-              </w:rPr>
-              <w:fldChar w:fldCharType="end"/>
-            </w:r>
-          </w:hyperlink>
-        </w:p>
-        <w:p>
-          <w:pPr>
-            <w:pStyle w:val="ndice2"/>
-            <w:tabs>
-              <w:tab w:val="right" w:leader="dot" w:pos="9350"/>
-            </w:tabs>
-            <w:rPr>
-              <w:rFonts w:asciiTheme="minorHAnsi" w:eastAsiaTheme="minorEastAsia" w:hAnsiTheme="minorHAnsi" w:cstheme="minorBidi"/>
-              <w:noProof/>
-              <w:kern w:val="2"/>
-              <w:sz w:val="24"/>
-              <w14:ligatures w14:val="standardContextual"/>
-            </w:rPr>
-          </w:pPr>
-          <w:hyperlink w:anchor="_Toc211616113" w:history="1">
-            <w:r>
-              <w:rPr>
-                <w:rStyle w:val="Hiperligao"/>
-                <w:noProof/>
-              </w:rPr>
-              <w:t>II. 4 Direção e Gestão de Pessoas</w:t>
-            </w:r>
-            <w:r>
-              <w:rPr>
-                <w:noProof/>
-                <w:webHidden/>
-              </w:rPr>
-              <w:tab/>
-            </w:r>
-            <w:r>
-              <w:rPr>
-                <w:noProof/>
-                <w:webHidden/>
-              </w:rPr>
-              <w:fldChar w:fldCharType="begin"/>
-            </w:r>
-            <w:r>
-              <w:rPr>
-                <w:noProof/>
-                <w:webHidden/>
-              </w:rPr>
-              <w:instrText xml:space="preserve"> PAGEREF _Toc211616113 \h </w:instrText>
-            </w:r>
-            <w:r>
-              <w:rPr>
-                <w:noProof/>
-                <w:webHidden/>
-              </w:rPr>
-            </w:r>
-            <w:r>
-              <w:rPr>
-                <w:noProof/>
-                <w:webHidden/>
-              </w:rPr>
-              <w:fldChar w:fldCharType="separate"/>
-            </w:r>
-            <w:r>
-              <w:rPr>
-                <w:noProof/>
-                <w:webHidden/>
-              </w:rPr>
-              <w:t>16</w:t>
-            </w:r>
-            <w:r>
-              <w:rPr>
-                <w:noProof/>
-                <w:webHidden/>
-              </w:rPr>
-              <w:fldChar w:fldCharType="end"/>
-            </w:r>
-          </w:hyperlink>
-        </w:p>
-        <w:p>
-          <w:pPr>
-            <w:pStyle w:val="ndice2"/>
-            <w:tabs>
-              <w:tab w:val="right" w:leader="dot" w:pos="9350"/>
-            </w:tabs>
-            <w:rPr>
-              <w:rFonts w:asciiTheme="minorHAnsi" w:eastAsiaTheme="minorEastAsia" w:hAnsiTheme="minorHAnsi" w:cstheme="minorBidi"/>
-              <w:noProof/>
-              <w:kern w:val="2"/>
-              <w:sz w:val="24"/>
-              <w14:ligatures w14:val="standardContextual"/>
-            </w:rPr>
-          </w:pPr>
-          <w:hyperlink w:anchor="_Toc211616114" w:history="1">
-            <w:r>
-              <w:rPr>
-                <w:rStyle w:val="Hiperligao"/>
-                <w:noProof/>
-              </w:rPr>
-              <w:t>II.5 Promoção da produtividade</w:t>
-            </w:r>
-            <w:r>
-              <w:rPr>
-                <w:noProof/>
-                <w:webHidden/>
-              </w:rPr>
-              <w:tab/>
-            </w:r>
-            <w:r>
-              <w:rPr>
-                <w:noProof/>
-                <w:webHidden/>
-              </w:rPr>
-              <w:fldChar w:fldCharType="begin"/>
-            </w:r>
-            <w:r>
-              <w:rPr>
-                <w:noProof/>
-                <w:webHidden/>
-              </w:rPr>
-              <w:instrText xml:space="preserve"> PAGEREF _Toc211616114 \h </w:instrText>
-            </w:r>
-            <w:r>
-              <w:rPr>
-                <w:noProof/>
-                <w:webHidden/>
-              </w:rPr>
-            </w:r>
-            <w:r>
-              <w:rPr>
-                <w:noProof/>
-                <w:webHidden/>
-              </w:rPr>
-              <w:fldChar w:fldCharType="separate"/>
-            </w:r>
-            <w:r>
-              <w:rPr>
-                <w:noProof/>
-                <w:webHidden/>
-              </w:rPr>
-              <w:t>16</w:t>
-            </w:r>
-            <w:r>
-              <w:rPr>
-                <w:noProof/>
-                <w:webHidden/>
-              </w:rPr>
-              <w:fldChar w:fldCharType="end"/>
-            </w:r>
-          </w:hyperlink>
-        </w:p>
-        <w:p>
-          <w:pPr>
-            <w:pStyle w:val="ndice2"/>
-            <w:tabs>
-              <w:tab w:val="right" w:leader="dot" w:pos="9350"/>
-            </w:tabs>
-            <w:rPr>
-              <w:rFonts w:asciiTheme="minorHAnsi" w:eastAsiaTheme="minorEastAsia" w:hAnsiTheme="minorHAnsi" w:cstheme="minorBidi"/>
-              <w:noProof/>
-              <w:kern w:val="2"/>
-              <w:sz w:val="24"/>
-              <w14:ligatures w14:val="standardContextual"/>
-            </w:rPr>
-          </w:pPr>
-          <w:hyperlink w:anchor="_Toc211616115" w:history="1">
-            <w:r>
-              <w:rPr>
-                <w:rStyle w:val="Hiperligao"/>
-                <w:noProof/>
-              </w:rPr>
-              <w:t>II.6 Economia circular</w:t>
-            </w:r>
-            <w:r>
-              <w:rPr>
-                <w:noProof/>
-                <w:webHidden/>
-              </w:rPr>
-              <w:tab/>
-            </w:r>
-            <w:r>
-              <w:rPr>
-                <w:noProof/>
-                <w:webHidden/>
-              </w:rPr>
-              <w:fldChar w:fldCharType="begin"/>
-            </w:r>
-            <w:r>
-              <w:rPr>
-                <w:noProof/>
-                <w:webHidden/>
-              </w:rPr>
-              <w:instrText xml:space="preserve"> PAGEREF _Toc211616115 \h </w:instrText>
-            </w:r>
-            <w:r>
-              <w:rPr>
-                <w:noProof/>
-                <w:webHidden/>
-              </w:rPr>
-            </w:r>
-            <w:r>
-              <w:rPr>
-                <w:noProof/>
-                <w:webHidden/>
-              </w:rPr>
-              <w:fldChar w:fldCharType="separate"/>
-            </w:r>
-            <w:r>
-              <w:rPr>
-                <w:noProof/>
-                <w:webHidden/>
-              </w:rPr>
-              <w:t>16</w:t>
-            </w:r>
-            <w:r>
-              <w:rPr>
-                <w:noProof/>
-                <w:webHidden/>
-              </w:rPr>
-              <w:fldChar w:fldCharType="end"/>
-            </w:r>
-          </w:hyperlink>
-        </w:p>
-        <w:p>
-          <w:pPr>
-            <w:pStyle w:val="ndice2"/>
-            <w:tabs>
-              <w:tab w:val="right" w:leader="dot" w:pos="9350"/>
-            </w:tabs>
-            <w:rPr>
-              <w:rFonts w:asciiTheme="minorHAnsi" w:eastAsiaTheme="minorEastAsia" w:hAnsiTheme="minorHAnsi" w:cstheme="minorBidi"/>
-              <w:noProof/>
-              <w:kern w:val="2"/>
-              <w:sz w:val="24"/>
-              <w14:ligatures w14:val="standardContextual"/>
-            </w:rPr>
-          </w:pPr>
-          <w:hyperlink w:anchor="_Toc211616116" w:history="1">
-            <w:r>
-              <w:rPr>
-                <w:rStyle w:val="Hiperligao"/>
-                <w:noProof/>
-              </w:rPr>
-              <w:t>II.7 Marketing</w:t>
-            </w:r>
-            <w:r>
-              <w:rPr>
-                <w:noProof/>
-                <w:webHidden/>
-              </w:rPr>
-              <w:tab/>
-            </w:r>
-            <w:r>
-              <w:rPr>
-                <w:noProof/>
-                <w:webHidden/>
-              </w:rPr>
-              <w:fldChar w:fldCharType="begin"/>
-            </w:r>
-            <w:r>
-              <w:rPr>
-                <w:noProof/>
-                <w:webHidden/>
-              </w:rPr>
-              <w:instrText xml:space="preserve"> PAGEREF _Toc211616116 \h </w:instrText>
-            </w:r>
-            <w:r>
-              <w:rPr>
-                <w:noProof/>
-                <w:webHidden/>
-              </w:rPr>
-            </w:r>
-            <w:r>
-              <w:rPr>
-                <w:noProof/>
-                <w:webHidden/>
-              </w:rPr>
-              <w:fldChar w:fldCharType="separate"/>
-            </w:r>
-            <w:r>
-              <w:rPr>
-                <w:noProof/>
-                <w:webHidden/>
-              </w:rPr>
-              <w:t>16</w:t>
-            </w:r>
-            <w:r>
-              <w:rPr>
-                <w:noProof/>
-                <w:webHidden/>
-              </w:rPr>
-              <w:fldChar w:fldCharType="end"/>
-            </w:r>
-          </w:hyperlink>
-        </w:p>
-        <w:p>
-          <w:pPr>
-            <w:pStyle w:val="ndice2"/>
-            <w:tabs>
-              <w:tab w:val="right" w:leader="dot" w:pos="9350"/>
-            </w:tabs>
-            <w:rPr>
-              <w:rFonts w:asciiTheme="minorHAnsi" w:eastAsiaTheme="minorEastAsia" w:hAnsiTheme="minorHAnsi" w:cstheme="minorBidi"/>
-              <w:noProof/>
-              <w:kern w:val="2"/>
-              <w:sz w:val="24"/>
-              <w14:ligatures w14:val="standardContextual"/>
-            </w:rPr>
-          </w:pPr>
-          <w:hyperlink w:anchor="_Toc211616117" w:history="1">
-            <w:r>
-              <w:rPr>
-                <w:rStyle w:val="Hiperligao"/>
-                <w:noProof/>
-              </w:rPr>
-              <w:t>II. 8 Gestão Financeira</w:t>
-            </w:r>
-            <w:r>
-              <w:rPr>
-                <w:noProof/>
-                <w:webHidden/>
-              </w:rPr>
-              <w:tab/>
-            </w:r>
-            <w:r>
-              <w:rPr>
-                <w:noProof/>
-                <w:webHidden/>
-              </w:rPr>
-              <w:fldChar w:fldCharType="begin"/>
-            </w:r>
-            <w:r>
-              <w:rPr>
-                <w:noProof/>
-                <w:webHidden/>
-              </w:rPr>
-              <w:instrText xml:space="preserve"> PAGEREF _Toc211616117 \h </w:instrText>
-            </w:r>
-            <w:r>
-              <w:rPr>
-                <w:noProof/>
-                <w:webHidden/>
-              </w:rPr>
-            </w:r>
-            <w:r>
-              <w:rPr>
-                <w:noProof/>
-                <w:webHidden/>
-              </w:rPr>
-              <w:fldChar w:fldCharType="separate"/>
-            </w:r>
-            <w:r>
-              <w:rPr>
-                <w:noProof/>
-                <w:webHidden/>
-              </w:rPr>
-              <w:t>16</w:t>
-            </w:r>
-            <w:r>
-              <w:rPr>
-                <w:noProof/>
-                <w:webHidden/>
-              </w:rPr>
-              <w:fldChar w:fldCharType="end"/>
-            </w:r>
-          </w:hyperlink>
-        </w:p>
-        <w:p>
-          <w:pPr>
-            <w:pStyle w:val="ndice2"/>
-            <w:tabs>
-              <w:tab w:val="right" w:leader="dot" w:pos="9350"/>
-            </w:tabs>
-            <w:rPr>
-              <w:rFonts w:asciiTheme="minorHAnsi" w:eastAsiaTheme="minorEastAsia" w:hAnsiTheme="minorHAnsi" w:cstheme="minorBidi"/>
-              <w:noProof/>
-              <w:kern w:val="2"/>
-              <w:sz w:val="24"/>
-              <w14:ligatures w14:val="standardContextual"/>
-            </w:rPr>
-          </w:pPr>
-          <w:hyperlink w:anchor="_Toc211616118" w:history="1">
-            <w:r>
-              <w:rPr>
-                <w:rStyle w:val="Hiperligao"/>
-                <w:noProof/>
-              </w:rPr>
-              <w:t>II.9 Gestão das Operações e Indústria 4.0</w:t>
-            </w:r>
-            <w:r>
-              <w:rPr>
-                <w:noProof/>
-                <w:webHidden/>
-              </w:rPr>
-              <w:tab/>
-            </w:r>
-            <w:r>
-              <w:rPr>
-                <w:noProof/>
-                <w:webHidden/>
-              </w:rPr>
-              <w:fldChar w:fldCharType="begin"/>
-            </w:r>
-            <w:r>
-              <w:rPr>
-                <w:noProof/>
-                <w:webHidden/>
-              </w:rPr>
-              <w:instrText xml:space="preserve"> PAGEREF _Toc211616118 \h </w:instrText>
-            </w:r>
-            <w:r>
-              <w:rPr>
-                <w:noProof/>
-                <w:webHidden/>
-              </w:rPr>
-            </w:r>
-            <w:r>
-              <w:rPr>
-                <w:noProof/>
-                <w:webHidden/>
-              </w:rPr>
-              <w:fldChar w:fldCharType="separate"/>
-            </w:r>
-            <w:r>
-              <w:rPr>
-                <w:noProof/>
-                <w:webHidden/>
-              </w:rPr>
-              <w:t>16</w:t>
-            </w:r>
-            <w:r>
-              <w:rPr>
-                <w:noProof/>
-                <w:webHidden/>
-              </w:rPr>
-              <w:fldChar w:fldCharType="end"/>
-            </w:r>
-          </w:hyperlink>
-        </w:p>
-        <w:p>
-          <w:pPr>
-            <w:pStyle w:val="ndice1"/>
-            <w:tabs>
-              <w:tab w:val="right" w:leader="dot" w:pos="9350"/>
-            </w:tabs>
-            <w:rPr>
-              <w:rFonts w:asciiTheme="minorHAnsi" w:eastAsiaTheme="minorEastAsia" w:hAnsiTheme="minorHAnsi" w:cstheme="minorBidi"/>
-              <w:noProof/>
-              <w:kern w:val="2"/>
-              <w:sz w:val="24"/>
-              <w14:ligatures w14:val="standardContextual"/>
-            </w:rPr>
-          </w:pPr>
-          <w:hyperlink w:anchor="_Toc211616119" w:history="1">
-            <w:r>
-              <w:rPr>
-                <w:rStyle w:val="Hiperligao"/>
-                <w:noProof/>
-              </w:rPr>
-              <w:t>Parte III – Conclusão</w:t>
-            </w:r>
-            <w:r>
-              <w:rPr>
-                <w:noProof/>
-                <w:webHidden/>
-              </w:rPr>
-              <w:tab/>
-            </w:r>
-            <w:r>
-              <w:rPr>
-                <w:noProof/>
-                <w:webHidden/>
-              </w:rPr>
-              <w:fldChar w:fldCharType="begin"/>
-            </w:r>
-            <w:r>
-              <w:rPr>
-                <w:noProof/>
-                <w:webHidden/>
-              </w:rPr>
-              <w:instrText xml:space="preserve"> PAGEREF _Toc211616119 \h </w:instrText>
-            </w:r>
-            <w:r>
-              <w:rPr>
-                <w:noProof/>
-                <w:webHidden/>
-              </w:rPr>
-            </w:r>
-            <w:r>
-              <w:rPr>
-                <w:noProof/>
-                <w:webHidden/>
-              </w:rPr>
-              <w:fldChar w:fldCharType="separate"/>
-            </w:r>
-            <w:r>
-              <w:rPr>
-                <w:noProof/>
-                <w:webHidden/>
-              </w:rPr>
-              <w:t>17</w:t>
-            </w:r>
-            <w:r>
-              <w:rPr>
-                <w:noProof/>
-                <w:webHidden/>
-              </w:rPr>
-              <w:fldChar w:fldCharType="end"/>
-            </w:r>
-          </w:hyperlink>
-        </w:p>
-        <w:p>
-          <w:pPr>
-            <w:pStyle w:val="ndice2"/>
-            <w:tabs>
-              <w:tab w:val="right" w:leader="dot" w:pos="9350"/>
-            </w:tabs>
-            <w:rPr>
-              <w:rFonts w:asciiTheme="minorHAnsi" w:eastAsiaTheme="minorEastAsia" w:hAnsiTheme="minorHAnsi" w:cstheme="minorBidi"/>
-              <w:noProof/>
-              <w:kern w:val="2"/>
-              <w:sz w:val="24"/>
-              <w14:ligatures w14:val="standardContextual"/>
-            </w:rPr>
-          </w:pPr>
-          <w:hyperlink w:anchor="_Toc211616120" w:history="1">
-            <w:r>
-              <w:rPr>
-                <w:rStyle w:val="Hiperligao"/>
-                <w:noProof/>
-              </w:rPr>
-              <w:t>III.1 Conclusão</w:t>
-            </w:r>
-            <w:r>
-              <w:rPr>
-                <w:noProof/>
-                <w:webHidden/>
-              </w:rPr>
-              <w:tab/>
-            </w:r>
-            <w:r>
-              <w:rPr>
-                <w:noProof/>
-                <w:webHidden/>
-              </w:rPr>
-              <w:fldChar w:fldCharType="begin"/>
-            </w:r>
-            <w:r>
-              <w:rPr>
-                <w:noProof/>
-                <w:webHidden/>
-              </w:rPr>
-              <w:instrText xml:space="preserve"> PAGEREF _Toc211616120 \h </w:instrText>
-            </w:r>
-            <w:r>
-              <w:rPr>
-                <w:noProof/>
-                <w:webHidden/>
-              </w:rPr>
-            </w:r>
-            <w:r>
-              <w:rPr>
-                <w:noProof/>
-                <w:webHidden/>
-              </w:rPr>
-              <w:fldChar w:fldCharType="separate"/>
-            </w:r>
-            <w:r>
-              <w:rPr>
-                <w:noProof/>
-                <w:webHidden/>
-              </w:rPr>
-              <w:t>17</w:t>
-            </w:r>
-            <w:r>
-              <w:rPr>
-                <w:noProof/>
-                <w:webHidden/>
-              </w:rPr>
-              <w:fldChar w:fldCharType="end"/>
-            </w:r>
-          </w:hyperlink>
-        </w:p>
-        <w:p>
-          <w:pPr>
-            <w:pStyle w:val="ndice2"/>
-            <w:tabs>
-              <w:tab w:val="right" w:leader="dot" w:pos="9350"/>
-            </w:tabs>
-            <w:rPr>
-              <w:rFonts w:asciiTheme="minorHAnsi" w:eastAsiaTheme="minorEastAsia" w:hAnsiTheme="minorHAnsi" w:cstheme="minorBidi"/>
-              <w:noProof/>
-              <w:kern w:val="2"/>
-              <w:sz w:val="24"/>
-              <w14:ligatures w14:val="standardContextual"/>
-            </w:rPr>
-          </w:pPr>
-          <w:hyperlink w:anchor="_Toc211616121" w:history="1">
-            <w:r>
-              <w:rPr>
-                <w:rStyle w:val="Hiperligao"/>
-                <w:noProof/>
-              </w:rPr>
-              <w:t>III.2 Sugestões de melhoria</w:t>
-            </w:r>
-            <w:r>
-              <w:rPr>
-                <w:noProof/>
-                <w:webHidden/>
-              </w:rPr>
-              <w:tab/>
-            </w:r>
-            <w:r>
-              <w:rPr>
-                <w:noProof/>
-                <w:webHidden/>
-              </w:rPr>
-              <w:fldChar w:fldCharType="begin"/>
-            </w:r>
-            <w:r>
-              <w:rPr>
-                <w:noProof/>
-                <w:webHidden/>
-              </w:rPr>
-              <w:instrText xml:space="preserve"> PAGEREF _Toc211616121 \h </w:instrText>
-            </w:r>
-            <w:r>
-              <w:rPr>
-                <w:noProof/>
-                <w:webHidden/>
-              </w:rPr>
-            </w:r>
-            <w:r>
-              <w:rPr>
-                <w:noProof/>
-                <w:webHidden/>
-              </w:rPr>
-              <w:fldChar w:fldCharType="separate"/>
-            </w:r>
-            <w:r>
-              <w:rPr>
-                <w:noProof/>
-                <w:webHidden/>
-              </w:rPr>
-              <w:t>17</w:t>
-            </w:r>
-            <w:r>
-              <w:rPr>
-                <w:noProof/>
-                <w:webHidden/>
-              </w:rPr>
-              <w:fldChar w:fldCharType="end"/>
-            </w:r>
-          </w:hyperlink>
-        </w:p>
-        <w:p>
-          <w:pPr>
-            <w:pStyle w:val="ndice1"/>
-            <w:tabs>
-              <w:tab w:val="right" w:leader="dot" w:pos="9350"/>
-            </w:tabs>
-            <w:rPr>
-              <w:rFonts w:asciiTheme="minorHAnsi" w:eastAsiaTheme="minorEastAsia" w:hAnsiTheme="minorHAnsi" w:cstheme="minorBidi"/>
-              <w:noProof/>
-              <w:kern w:val="2"/>
-              <w:sz w:val="24"/>
-              <w14:ligatures w14:val="standardContextual"/>
-            </w:rPr>
-          </w:pPr>
-          <w:hyperlink w:anchor="_Toc211616122" w:history="1">
-            <w:r>
-              <w:rPr>
-                <w:rStyle w:val="Hiperligao"/>
-                <w:noProof/>
-              </w:rPr>
-              <w:t>Referências</w:t>
-            </w:r>
-            <w:r>
-              <w:rPr>
-                <w:noProof/>
-                <w:webHidden/>
-              </w:rPr>
-              <w:tab/>
-            </w:r>
-            <w:r>
-              <w:rPr>
-                <w:noProof/>
-                <w:webHidden/>
-              </w:rPr>
-              <w:fldChar w:fldCharType="begin"/>
-            </w:r>
-            <w:r>
-              <w:rPr>
-                <w:noProof/>
-                <w:webHidden/>
-              </w:rPr>
-              <w:instrText xml:space="preserve"> PAGEREF _Toc211616122 \h </w:instrText>
-            </w:r>
-            <w:r>
-              <w:rPr>
-                <w:noProof/>
-                <w:webHidden/>
-              </w:rPr>
-            </w:r>
-            <w:r>
-              <w:rPr>
-                <w:noProof/>
-                <w:webHidden/>
-              </w:rPr>
-              <w:fldChar w:fldCharType="separate"/>
-            </w:r>
-            <w:r>
-              <w:rPr>
-                <w:noProof/>
-                <w:webHidden/>
-              </w:rPr>
-              <w:t>18</w:t>
-            </w:r>
-            <w:r>
-              <w:rPr>
-                <w:noProof/>
-                <w:webHidden/>
-              </w:rPr>
-              <w:fldChar w:fldCharType="end"/>
-            </w:r>
-          </w:hyperlink>
-        </w:p>
-        <w:p>
-          <w:pPr>
-            <w:pStyle w:val="ndice1"/>
-            <w:tabs>
-              <w:tab w:val="right" w:leader="dot" w:pos="9350"/>
-            </w:tabs>
-            <w:rPr>
-              <w:rFonts w:asciiTheme="minorHAnsi" w:eastAsiaTheme="minorEastAsia" w:hAnsiTheme="minorHAnsi" w:cstheme="minorBidi"/>
-              <w:noProof/>
-              <w:kern w:val="2"/>
-              <w:sz w:val="24"/>
-              <w14:ligatures w14:val="standardContextual"/>
-            </w:rPr>
-          </w:pPr>
-          <w:hyperlink w:anchor="_Toc211616123" w:history="1">
-            <w:r>
-              <w:rPr>
-                <w:rStyle w:val="Hiperligao"/>
-                <w:rFonts w:eastAsia="Arial Narrow"/>
-                <w:noProof/>
-              </w:rPr>
-              <w:t>Anexos</w:t>
-            </w:r>
-            <w:r>
-              <w:rPr>
-                <w:noProof/>
-                <w:webHidden/>
-              </w:rPr>
-              <w:tab/>
-            </w:r>
-            <w:r>
-              <w:rPr>
-                <w:noProof/>
-                <w:webHidden/>
-              </w:rPr>
-              <w:fldChar w:fldCharType="begin"/>
-            </w:r>
-            <w:r>
-              <w:rPr>
-                <w:noProof/>
-                <w:webHidden/>
-              </w:rPr>
-              <w:instrText xml:space="preserve"> PAGEREF _Toc211616123 \h </w:instrText>
-            </w:r>
-            <w:r>
-              <w:rPr>
-                <w:noProof/>
-                <w:webHidden/>
-              </w:rPr>
-            </w:r>
-            <w:r>
-              <w:rPr>
-                <w:noProof/>
-                <w:webHidden/>
-              </w:rPr>
-              <w:fldChar w:fldCharType="separate"/>
-            </w:r>
-            <w:r>
-              <w:rPr>
-                <w:noProof/>
-                <w:webHidden/>
-              </w:rPr>
-              <w:t>18</w:t>
-            </w:r>
-            <w:r>
-              <w:rPr>
-                <w:noProof/>
-                <w:webHidden/>
-              </w:rPr>
-              <w:fldChar w:fldCharType="end"/>
-            </w:r>
-          </w:hyperlink>
-        </w:p>
-        <w:p>
-          <w:pPr>
-            <w:pStyle w:val="ndice2"/>
-            <w:tabs>
-              <w:tab w:val="right" w:leader="dot" w:pos="9350"/>
-            </w:tabs>
-            <w:rPr>
-              <w:rFonts w:asciiTheme="minorHAnsi" w:eastAsiaTheme="minorEastAsia" w:hAnsiTheme="minorHAnsi" w:cstheme="minorBidi"/>
-              <w:noProof/>
-              <w:kern w:val="2"/>
-              <w:sz w:val="24"/>
-              <w14:ligatures w14:val="standardContextual"/>
-            </w:rPr>
-          </w:pPr>
-          <w:hyperlink w:anchor="_Toc211616124" w:history="1">
-            <w:r>
-              <w:rPr>
-                <w:rStyle w:val="Hiperligao"/>
-                <w:noProof/>
-              </w:rPr>
-              <w:t>Opções Estratégicas para o Porto de Sines (2020-2030)</w:t>
-            </w:r>
-            <w:r>
-              <w:rPr>
-                <w:noProof/>
-                <w:webHidden/>
-              </w:rPr>
-              <w:tab/>
-            </w:r>
-            <w:r>
-              <w:rPr>
-                <w:noProof/>
-                <w:webHidden/>
-              </w:rPr>
-              <w:fldChar w:fldCharType="begin"/>
-            </w:r>
-            <w:r>
-              <w:rPr>
-                <w:noProof/>
-                <w:webHidden/>
-              </w:rPr>
-              <w:instrText xml:space="preserve"> PAGEREF _Toc211616124 \h </w:instrText>
-            </w:r>
-            <w:r>
-              <w:rPr>
-                <w:noProof/>
-                <w:webHidden/>
-              </w:rPr>
-            </w:r>
-            <w:r>
-              <w:rPr>
-                <w:noProof/>
-                <w:webHidden/>
-              </w:rPr>
-              <w:fldChar w:fldCharType="separate"/>
-            </w:r>
-            <w:r>
-              <w:rPr>
-                <w:noProof/>
-                <w:webHidden/>
-              </w:rPr>
-              <w:t>18</w:t>
-            </w:r>
-            <w:r>
-              <w:rPr>
-                <w:noProof/>
-                <w:webHidden/>
-              </w:rPr>
-              <w:fldChar w:fldCharType="end"/>
-            </w:r>
-          </w:hyperlink>
-        </w:p>
-        <w:p>
-          <w:pPr>
-            <w:pStyle w:val="ndice2"/>
-            <w:tabs>
-              <w:tab w:val="right" w:leader="dot" w:pos="9350"/>
-            </w:tabs>
-            <w:rPr>
-              <w:rFonts w:asciiTheme="minorHAnsi" w:eastAsiaTheme="minorEastAsia" w:hAnsiTheme="minorHAnsi" w:cstheme="minorBidi"/>
-              <w:noProof/>
-              <w:kern w:val="2"/>
-              <w:sz w:val="24"/>
-              <w14:ligatures w14:val="standardContextual"/>
-            </w:rPr>
-          </w:pPr>
-          <w:hyperlink w:anchor="_Toc211616125" w:history="1">
-            <w:r>
-              <w:rPr>
-                <w:rStyle w:val="Hiperligao"/>
-                <w:noProof/>
-              </w:rPr>
-              <w:t>Ligações e Hinterland</w:t>
-            </w:r>
-            <w:r>
-              <w:rPr>
-                <w:noProof/>
-                <w:webHidden/>
-              </w:rPr>
-              <w:tab/>
-            </w:r>
-            <w:r>
-              <w:rPr>
-                <w:noProof/>
-                <w:webHidden/>
-              </w:rPr>
-              <w:fldChar w:fldCharType="begin"/>
-            </w:r>
-            <w:r>
-              <w:rPr>
-                <w:noProof/>
-                <w:webHidden/>
-              </w:rPr>
-              <w:instrText xml:space="preserve"> PAGEREF _Toc211616125 \h </w:instrText>
-            </w:r>
-            <w:r>
-              <w:rPr>
-                <w:noProof/>
-                <w:webHidden/>
-              </w:rPr>
-            </w:r>
-            <w:r>
-              <w:rPr>
-                <w:noProof/>
-                <w:webHidden/>
-              </w:rPr>
-              <w:fldChar w:fldCharType="separate"/>
-            </w:r>
-            <w:r>
-              <w:rPr>
-                <w:noProof/>
-                <w:webHidden/>
-              </w:rPr>
-              <w:t>22</w:t>
-            </w:r>
-            <w:r>
-              <w:rPr>
-                <w:noProof/>
-                <w:webHidden/>
-              </w:rPr>
-              <w:fldChar w:fldCharType="end"/>
-            </w:r>
-          </w:hyperlink>
-        </w:p>
-        <w:p>
-          <w:pPr>
-            <w:pStyle w:val="ndice2"/>
-            <w:tabs>
-              <w:tab w:val="right" w:leader="dot" w:pos="9350"/>
-            </w:tabs>
-            <w:rPr>
-              <w:rFonts w:asciiTheme="minorHAnsi" w:eastAsiaTheme="minorEastAsia" w:hAnsiTheme="minorHAnsi" w:cstheme="minorBidi"/>
-              <w:noProof/>
-              <w:kern w:val="2"/>
-              <w:sz w:val="24"/>
-              <w14:ligatures w14:val="standardContextual"/>
-            </w:rPr>
-          </w:pPr>
-          <w:hyperlink w:anchor="_Toc211616126" w:history="1">
-            <w:r>
-              <w:rPr>
-                <w:rStyle w:val="Hiperligao"/>
-                <w:noProof/>
-              </w:rPr>
-              <w:t>Estatísticas</w:t>
-            </w:r>
-            <w:r>
-              <w:rPr>
-                <w:noProof/>
-                <w:webHidden/>
-              </w:rPr>
-              <w:tab/>
-            </w:r>
-            <w:r>
-              <w:rPr>
-                <w:noProof/>
-                <w:webHidden/>
-              </w:rPr>
-              <w:fldChar w:fldCharType="begin"/>
-            </w:r>
-            <w:r>
-              <w:rPr>
-                <w:noProof/>
-                <w:webHidden/>
-              </w:rPr>
-              <w:instrText xml:space="preserve"> PAGEREF _Toc211616126 \h </w:instrText>
-            </w:r>
-            <w:r>
-              <w:rPr>
-                <w:noProof/>
-                <w:webHidden/>
-              </w:rPr>
-            </w:r>
-            <w:r>
-              <w:rPr>
-                <w:noProof/>
-                <w:webHidden/>
-              </w:rPr>
-              <w:fldChar w:fldCharType="separate"/>
-            </w:r>
-            <w:r>
-              <w:rPr>
-                <w:noProof/>
-                <w:webHidden/>
-              </w:rPr>
-              <w:t>23</w:t>
-            </w:r>
-            <w:r>
-              <w:rPr>
-                <w:noProof/>
-                <w:webHidden/>
-              </w:rPr>
-              <w:fldChar w:fldCharType="end"/>
-            </w:r>
-          </w:hyperlink>
-        </w:p>
-        <w:p>
-          <w:pPr>
-            <w:pStyle w:val="ndice3"/>
-            <w:tabs>
-              <w:tab w:val="right" w:leader="dot" w:pos="9350"/>
-            </w:tabs>
-            <w:rPr>
-              <w:rFonts w:asciiTheme="minorHAnsi" w:eastAsiaTheme="minorEastAsia" w:hAnsiTheme="minorHAnsi" w:cstheme="minorBidi"/>
-              <w:noProof/>
-              <w:kern w:val="2"/>
-              <w:sz w:val="24"/>
-              <w14:ligatures w14:val="standardContextual"/>
-            </w:rPr>
-          </w:pPr>
-          <w:hyperlink w:anchor="_Toc211616127" w:history="1">
-            <w:r>
-              <w:rPr>
-                <w:rStyle w:val="Hiperligao"/>
-                <w:b/>
-                <w:bCs/>
-                <w:noProof/>
-              </w:rPr>
-              <w:t>Navios</w:t>
-            </w:r>
-            <w:r>
-              <w:rPr>
-                <w:noProof/>
-                <w:webHidden/>
-              </w:rPr>
-              <w:tab/>
-            </w:r>
-            <w:r>
-              <w:rPr>
-                <w:noProof/>
-                <w:webHidden/>
-              </w:rPr>
-              <w:fldChar w:fldCharType="begin"/>
-            </w:r>
-            <w:r>
-              <w:rPr>
-                <w:noProof/>
-                <w:webHidden/>
-              </w:rPr>
-              <w:instrText xml:space="preserve"> PAGEREF _Toc211616127 \h </w:instrText>
-            </w:r>
-            <w:r>
-              <w:rPr>
-                <w:noProof/>
-                <w:webHidden/>
-              </w:rPr>
-            </w:r>
-            <w:r>
-              <w:rPr>
-                <w:noProof/>
-                <w:webHidden/>
-              </w:rPr>
-              <w:fldChar w:fldCharType="separate"/>
-            </w:r>
-            <w:r>
-              <w:rPr>
-                <w:noProof/>
-                <w:webHidden/>
-              </w:rPr>
-              <w:t>23</w:t>
-            </w:r>
-            <w:r>
-              <w:rPr>
-                <w:noProof/>
-                <w:webHidden/>
-              </w:rPr>
-              <w:fldChar w:fldCharType="end"/>
-            </w:r>
-          </w:hyperlink>
-        </w:p>
-        <w:p>
-          <w:pPr>
-            <w:pStyle w:val="ndice3"/>
-            <w:tabs>
-              <w:tab w:val="right" w:leader="dot" w:pos="9350"/>
-            </w:tabs>
-            <w:rPr>
-              <w:rFonts w:asciiTheme="minorHAnsi" w:eastAsiaTheme="minorEastAsia" w:hAnsiTheme="minorHAnsi" w:cstheme="minorBidi"/>
-              <w:noProof/>
-              <w:kern w:val="2"/>
-              <w:sz w:val="24"/>
-              <w14:ligatures w14:val="standardContextual"/>
-            </w:rPr>
-          </w:pPr>
-          <w:hyperlink w:anchor="_Toc211616128" w:history="1">
-            <w:r>
-              <w:rPr>
-                <w:rStyle w:val="Hiperligao"/>
-                <w:b/>
-                <w:bCs/>
-                <w:noProof/>
-              </w:rPr>
-              <w:t>Mercadorias</w:t>
-            </w:r>
-            <w:r>
-              <w:rPr>
-                <w:noProof/>
-                <w:webHidden/>
-              </w:rPr>
-              <w:tab/>
-            </w:r>
-            <w:r>
-              <w:rPr>
-                <w:noProof/>
-                <w:webHidden/>
-              </w:rPr>
-              <w:fldChar w:fldCharType="begin"/>
-            </w:r>
-            <w:r>
-              <w:rPr>
-                <w:noProof/>
-                <w:webHidden/>
-              </w:rPr>
-              <w:instrText xml:space="preserve"> PAGEREF _Toc211616128 \h </w:instrText>
-            </w:r>
-            <w:r>
-              <w:rPr>
-                <w:noProof/>
-                <w:webHidden/>
-              </w:rPr>
-            </w:r>
-            <w:r>
-              <w:rPr>
-                <w:noProof/>
-                <w:webHidden/>
-              </w:rPr>
-              <w:fldChar w:fldCharType="separate"/>
-            </w:r>
-            <w:r>
-              <w:rPr>
-                <w:noProof/>
-                <w:webHidden/>
-              </w:rPr>
-              <w:t>25</w:t>
-            </w:r>
-            <w:r>
-              <w:rPr>
-                <w:noProof/>
-                <w:webHidden/>
-              </w:rPr>
-              <w:fldChar w:fldCharType="end"/>
-            </w:r>
-          </w:hyperlink>
-        </w:p>
-        <w:p>
-          <w:pPr>
-            <w:pStyle w:val="ndice3"/>
-            <w:tabs>
-              <w:tab w:val="right" w:leader="dot" w:pos="9350"/>
-            </w:tabs>
-            <w:rPr>
-              <w:rFonts w:asciiTheme="minorHAnsi" w:eastAsiaTheme="minorEastAsia" w:hAnsiTheme="minorHAnsi" w:cstheme="minorBidi"/>
-              <w:noProof/>
-              <w:kern w:val="2"/>
-              <w:sz w:val="24"/>
-              <w14:ligatures w14:val="standardContextual"/>
-            </w:rPr>
-          </w:pPr>
-          <w:hyperlink w:anchor="_Toc211616129" w:history="1">
-            <w:r>
-              <w:rPr>
-                <w:rStyle w:val="Hiperligao"/>
-                <w:b/>
-                <w:bCs/>
-                <w:noProof/>
-              </w:rPr>
-              <w:t>Passageiros</w:t>
-            </w:r>
-            <w:r>
-              <w:rPr>
-                <w:noProof/>
-                <w:webHidden/>
-              </w:rPr>
-              <w:tab/>
-            </w:r>
-            <w:r>
-              <w:rPr>
-                <w:noProof/>
-                <w:webHidden/>
-              </w:rPr>
-              <w:fldChar w:fldCharType="begin"/>
-            </w:r>
-            <w:r>
-              <w:rPr>
-                <w:noProof/>
-                <w:webHidden/>
-              </w:rPr>
-              <w:instrText xml:space="preserve"> PAGEREF _Toc211616129 \h </w:instrText>
+              <w:instrText xml:space="preserve"> PAGEREF _Toc212402232 \h </w:instrText>
             </w:r>
             <w:r>
               <w:rPr>
@@ -3413,7 +3341,7 @@
           <w:lang w:bidi="pt-PT"/>
         </w:rPr>
       </w:pPr>
-      <w:bookmarkStart w:id="4" w:name="_Toc211616092"/>
+      <w:bookmarkStart w:id="4" w:name="_Toc212402196"/>
       <w:r>
         <w:rPr>
           <w:sz w:val="24"/>
@@ -3439,7 +3367,7 @@
           <w:lang w:bidi="pt-PT"/>
         </w:rPr>
       </w:pPr>
-      <w:bookmarkStart w:id="5" w:name="_Toc211616093"/>
+      <w:bookmarkStart w:id="5" w:name="_Toc212402197"/>
       <w:r>
         <w:rPr>
           <w:lang w:bidi="pt-PT"/>
@@ -4843,7 +4771,7 @@
       <w:pPr>
         <w:pStyle w:val="Ttulo2"/>
       </w:pPr>
-      <w:bookmarkStart w:id="6" w:name="_Toc211616094"/>
+      <w:bookmarkStart w:id="6" w:name="_Toc212402198"/>
       <w:r>
         <w:t>Abreviaturas</w:t>
       </w:r>
@@ -4883,14 +4811,9 @@
       </w:r>
     </w:p>
     <w:p>
-      <w:proofErr w:type="spellStart"/>
       <w:r>
         <w:lastRenderedPageBreak/>
-        <w:t>Kt</w:t>
-      </w:r>
-      <w:proofErr w:type="spellEnd"/>
-      <w:r>
-        <w:t xml:space="preserve"> - Q</w:t>
+        <w:t>Kt - Q</w:t>
       </w:r>
       <w:r>
         <w:t>uilotonelada</w:t>
@@ -4907,102 +4830,69 @@
         <w:t xml:space="preserve">TMS - </w:t>
       </w:r>
       <w:r>
-        <w:t xml:space="preserve">Terminal </w:t>
-      </w:r>
-      <w:proofErr w:type="spellStart"/>
-      <w:r>
-        <w:t>Multipurpose</w:t>
-      </w:r>
-      <w:proofErr w:type="spellEnd"/>
+        <w:t>Terminal Multipurpose</w:t>
+      </w:r>
       <w:r>
         <w:t>;</w:t>
       </w:r>
     </w:p>
     <w:p>
       <w:r>
-        <w:t xml:space="preserve">ISO – </w:t>
-      </w:r>
-      <w:proofErr w:type="spellStart"/>
-      <w:r>
-        <w:t>International</w:t>
-      </w:r>
-      <w:proofErr w:type="spellEnd"/>
-      <w:r>
-        <w:t xml:space="preserve"> </w:t>
-      </w:r>
-      <w:proofErr w:type="spellStart"/>
-      <w:r>
-        <w:t>Organization</w:t>
-      </w:r>
-      <w:proofErr w:type="spellEnd"/>
-      <w:r>
-        <w:t xml:space="preserve"> for </w:t>
-      </w:r>
-      <w:proofErr w:type="spellStart"/>
-      <w:r>
-        <w:t>Standardization</w:t>
-      </w:r>
-      <w:proofErr w:type="spellEnd"/>
+        <w:t>ISO – International Organization for Standardization (</w:t>
+      </w:r>
+      <w:r>
+        <w:t>Organização Internacional de Normalização</w:t>
+      </w:r>
+      <w:r>
+        <w:t>)</w:t>
+      </w:r>
+      <w:r>
+        <w:t xml:space="preserve">; </w:t>
+      </w:r>
+    </w:p>
+    <w:p>
+      <w:r>
+        <w:t xml:space="preserve">UTD - </w:t>
+      </w:r>
+      <w:r>
+        <w:t>Unidade de Transformação Digital</w:t>
+      </w:r>
+      <w:r>
+        <w:t>;</w:t>
+      </w:r>
+    </w:p>
+    <w:p>
+      <w:r>
+        <w:t xml:space="preserve">ESG </w:t>
+      </w:r>
+      <w:r>
+        <w:t xml:space="preserve">- </w:t>
+      </w:r>
+      <w:r>
+        <w:t>Environmental, Social and Governance</w:t>
+      </w:r>
       <w:r>
         <w:t xml:space="preserve"> (</w:t>
       </w:r>
       <w:r>
-        <w:t>Organização Internacional de Normalização</w:t>
+        <w:t>Ambiental, Social e Governança</w:t>
       </w:r>
       <w:r>
         <w:t>)</w:t>
       </w:r>
       <w:r>
-        <w:t xml:space="preserve">; </w:t>
-      </w:r>
-    </w:p>
-    <w:p>
-      <w:r>
-        <w:t xml:space="preserve">UTD - </w:t>
-      </w:r>
-      <w:r>
-        <w:t>Unidade de Transformação Digital</w:t>
-      </w:r>
-      <w:r>
         <w:t>;</w:t>
       </w:r>
     </w:p>
     <w:p>
       <w:r>
-        <w:t xml:space="preserve">ESG </w:t>
-      </w:r>
-      <w:r>
-        <w:t xml:space="preserve">- </w:t>
-      </w:r>
-      <w:proofErr w:type="spellStart"/>
-      <w:r>
-        <w:t>Environmental</w:t>
-      </w:r>
-      <w:proofErr w:type="spellEnd"/>
-      <w:r>
-        <w:t xml:space="preserve">, Social </w:t>
-      </w:r>
-      <w:proofErr w:type="spellStart"/>
-      <w:r>
-        <w:t>and</w:t>
-      </w:r>
-      <w:proofErr w:type="spellEnd"/>
-      <w:r>
-        <w:t xml:space="preserve"> </w:t>
-      </w:r>
-      <w:proofErr w:type="spellStart"/>
-      <w:r>
-        <w:t>Governance</w:t>
-      </w:r>
-      <w:proofErr w:type="spellEnd"/>
-      <w:r>
-        <w:t xml:space="preserve"> (</w:t>
-      </w:r>
-      <w:r>
-        <w:t>Ambiental, Social e Governança</w:t>
-      </w:r>
-      <w:r>
-        <w:t>)</w:t>
+        <w:t xml:space="preserve">SWOT - </w:t>
+      </w:r>
+      <w:r>
+        <w:t>Strengths, Weaknesses, Opportunities e Threats </w:t>
+      </w:r>
+      <w:r>
+        <w:t>(Forças, Fraquezas, Oportunidades, Ameaças)</w:t>
       </w:r>
       <w:r>
         <w:t>;</w:t>
@@ -5010,42 +4900,10 @@
     </w:p>
     <w:p>
       <w:r>
-        <w:t xml:space="preserve">SWOT - </w:t>
-      </w:r>
-      <w:proofErr w:type="spellStart"/>
-      <w:r>
-        <w:t>Strengths</w:t>
-      </w:r>
-      <w:proofErr w:type="spellEnd"/>
-      <w:r>
-        <w:t>, </w:t>
-      </w:r>
-      <w:proofErr w:type="spellStart"/>
-      <w:r>
-        <w:t>Weaknesses</w:t>
-      </w:r>
-      <w:proofErr w:type="spellEnd"/>
-      <w:r>
-        <w:t>, </w:t>
-      </w:r>
-      <w:proofErr w:type="spellStart"/>
-      <w:r>
-        <w:t>Opportunities</w:t>
-      </w:r>
-      <w:proofErr w:type="spellEnd"/>
-      <w:r>
-        <w:t> e </w:t>
-      </w:r>
-      <w:proofErr w:type="spellStart"/>
-      <w:r>
-        <w:t>Threats</w:t>
-      </w:r>
-      <w:proofErr w:type="spellEnd"/>
-      <w:r>
-        <w:t> </w:t>
-      </w:r>
-      <w:r>
-        <w:t>(Forças, Fraquezas, Oportunidades, Ameaças)</w:t>
+        <w:t xml:space="preserve">ODS - </w:t>
+      </w:r>
+      <w:r>
+        <w:t>Objetivos de Desenvolvimento Sustentável</w:t>
       </w:r>
       <w:r>
         <w:t>;</w:t>
@@ -5053,10 +4911,16 @@
     </w:p>
     <w:p>
       <w:r>
-        <w:t xml:space="preserve">ODS - </w:t>
-      </w:r>
-      <w:r>
-        <w:t>Objetivos de Desenvolvimento Sustentável</w:t>
+        <w:t>LED</w:t>
+      </w:r>
+      <w:r>
+        <w:t xml:space="preserve"> - L</w:t>
+      </w:r>
+      <w:r>
+        <w:t>ight-emitting diode</w:t>
+      </w:r>
+      <w:r>
+        <w:t xml:space="preserve"> (Díodo emissor de luz)</w:t>
       </w:r>
       <w:r>
         <w:t>;</w:t>
@@ -5064,61 +4928,30 @@
     </w:p>
     <w:p>
       <w:r>
-        <w:t>LED</w:t>
-      </w:r>
-      <w:r>
-        <w:t xml:space="preserve"> - L</w:t>
-      </w:r>
-      <w:r>
-        <w:t>ight-</w:t>
-      </w:r>
-      <w:proofErr w:type="spellStart"/>
-      <w:r>
-        <w:t>emitting</w:t>
-      </w:r>
-      <w:proofErr w:type="spellEnd"/>
-      <w:r>
-        <w:t xml:space="preserve"> </w:t>
-      </w:r>
-      <w:proofErr w:type="spellStart"/>
-      <w:r>
-        <w:t>diode</w:t>
-      </w:r>
-      <w:proofErr w:type="spellEnd"/>
-      <w:r>
-        <w:t xml:space="preserve"> (Díodo emissor de luz)</w:t>
+        <w:t>IoT</w:t>
+      </w:r>
+      <w:r>
+        <w:t xml:space="preserve"> -</w:t>
+      </w:r>
+      <w:r>
+        <w:t> Internet of Things</w:t>
+      </w:r>
+      <w:r>
+        <w:t xml:space="preserve"> (Internet das coisas)</w:t>
       </w:r>
       <w:r>
         <w:t>;</w:t>
       </w:r>
     </w:p>
     <w:p>
-      <w:proofErr w:type="spellStart"/>
-      <w:r>
-        <w:t>IoT</w:t>
-      </w:r>
-      <w:proofErr w:type="spellEnd"/>
-      <w:r>
-        <w:t xml:space="preserve"> -</w:t>
-      </w:r>
-      <w:r>
-        <w:t xml:space="preserve"> Internet </w:t>
-      </w:r>
-      <w:proofErr w:type="spellStart"/>
-      <w:r>
-        <w:t>of</w:t>
-      </w:r>
-      <w:proofErr w:type="spellEnd"/>
-      <w:r>
-        <w:t xml:space="preserve"> </w:t>
-      </w:r>
-      <w:proofErr w:type="spellStart"/>
-      <w:r>
-        <w:t>Things</w:t>
-      </w:r>
-      <w:proofErr w:type="spellEnd"/>
-      <w:r>
-        <w:t xml:space="preserve"> (Internet das coisas)</w:t>
+      <w:r>
+        <w:t xml:space="preserve">TEU </w:t>
+      </w:r>
+      <w:r>
+        <w:t>-</w:t>
+      </w:r>
+      <w:r>
+        <w:t xml:space="preserve"> 1 Unidade equivalente a 20 pés</w:t>
       </w:r>
       <w:r>
         <w:t>;</w:t>
@@ -5126,20 +4959,6 @@
     </w:p>
     <w:p>
       <w:r>
-        <w:t xml:space="preserve">TEU </w:t>
-      </w:r>
-      <w:r>
-        <w:t>-</w:t>
-      </w:r>
-      <w:r>
-        <w:t xml:space="preserve"> 1 Unidade equivalente a 20 pés</w:t>
-      </w:r>
-      <w:r>
-        <w:t>;</w:t>
-      </w:r>
-    </w:p>
-    <w:p>
-      <w:r>
         <w:br w:type="page"/>
       </w:r>
     </w:p>
@@ -5147,7 +4966,7 @@
       <w:pPr>
         <w:pStyle w:val="Ttulo1"/>
       </w:pPr>
-      <w:bookmarkStart w:id="7" w:name="_Toc211616095"/>
+      <w:bookmarkStart w:id="7" w:name="_Toc212402199"/>
       <w:r>
         <w:lastRenderedPageBreak/>
         <w:t>Parte I – Introdução e estrutura do trabalho</w:t>
@@ -5158,7 +4977,7 @@
       <w:pPr>
         <w:pStyle w:val="Ttulo2"/>
       </w:pPr>
-      <w:bookmarkStart w:id="8" w:name="_Toc211616096"/>
+      <w:bookmarkStart w:id="8" w:name="_Toc212402200"/>
       <w:r>
         <w:t>I.1 Caracterização da organização</w:t>
       </w:r>
@@ -5175,7 +4994,7 @@
           <w:szCs w:val="22"/>
         </w:rPr>
       </w:pPr>
-      <w:bookmarkStart w:id="9" w:name="_Toc211616097"/>
+      <w:bookmarkStart w:id="9" w:name="_Toc212402201"/>
       <w:r>
         <w:rPr>
           <w:b/>
@@ -5209,7 +5028,7 @@
           <w:szCs w:val="22"/>
         </w:rPr>
       </w:pPr>
-      <w:bookmarkStart w:id="10" w:name="_Toc211616098"/>
+      <w:bookmarkStart w:id="10" w:name="_Toc212402202"/>
       <w:r>
         <w:rPr>
           <w:b/>
@@ -5235,15 +5054,7 @@
     </w:p>
     <w:p>
       <w:r>
-        <w:t xml:space="preserve">O seu objetivo estratégico é consolidar o Porto de Sines como um </w:t>
-      </w:r>
-      <w:proofErr w:type="spellStart"/>
-      <w:r>
-        <w:t>hub</w:t>
-      </w:r>
-      <w:proofErr w:type="spellEnd"/>
-      <w:r>
-        <w:t xml:space="preserve"> logístico, energético e industrial de referência no Atlântico, enquanto reforça a importância dos Portos de Faro e Portimão como infraestruturas de apoio ao turismo de cruzeiros e ao transporte marítimo regional.</w:t>
+        <w:t>O seu objetivo estratégico é consolidar o Porto de Sines como um hub logístico, energético e industrial de referência no Atlântico, enquanto reforça a importância dos Portos de Faro e Portimão como infraestruturas de apoio ao turismo de cruzeiros e ao transporte marítimo regional.</w:t>
       </w:r>
     </w:p>
     <w:p>
@@ -5257,7 +5068,7 @@
           <w:szCs w:val="22"/>
         </w:rPr>
       </w:pPr>
-      <w:bookmarkStart w:id="11" w:name="_Toc211616099"/>
+      <w:bookmarkStart w:id="11" w:name="_Toc212402203"/>
       <w:r>
         <w:rPr>
           <w:b/>
@@ -5297,7 +5108,7 @@
           <w:szCs w:val="22"/>
         </w:rPr>
       </w:pPr>
-      <w:bookmarkStart w:id="12" w:name="_Toc211616100"/>
+      <w:bookmarkStart w:id="12" w:name="_Toc212402204"/>
       <w:r>
         <w:rPr>
           <w:b/>
@@ -5874,15 +5685,7 @@
           </w:tcPr>
           <w:p>
             <w:r>
-              <w:t xml:space="preserve">Granéis Líquidos (unidade: </w:t>
-            </w:r>
-            <w:proofErr w:type="spellStart"/>
-            <w:r>
-              <w:t>kt</w:t>
-            </w:r>
-            <w:proofErr w:type="spellEnd"/>
-            <w:r>
-              <w:t>)</w:t>
+              <w:t>Granéis Líquidos (unidade: kt)</w:t>
             </w:r>
           </w:p>
         </w:tc>
@@ -5972,15 +5775,7 @@
           </w:tcPr>
           <w:p>
             <w:r>
-              <w:t xml:space="preserve">Granéis Sólidos (unidade: </w:t>
-            </w:r>
-            <w:proofErr w:type="spellStart"/>
-            <w:r>
-              <w:t>kt</w:t>
-            </w:r>
-            <w:proofErr w:type="spellEnd"/>
-            <w:r>
-              <w:t>)</w:t>
+              <w:t>Granéis Sólidos (unidade: kt)</w:t>
             </w:r>
           </w:p>
         </w:tc>
@@ -6070,15 +5865,7 @@
           </w:tcPr>
           <w:p>
             <w:r>
-              <w:t xml:space="preserve">Carga Geral Contentorizada (unidade: </w:t>
-            </w:r>
-            <w:proofErr w:type="spellStart"/>
-            <w:r>
-              <w:t>kt</w:t>
-            </w:r>
-            <w:proofErr w:type="spellEnd"/>
-            <w:r>
-              <w:t>)</w:t>
+              <w:t>Carga Geral Contentorizada (unidade: kt)</w:t>
             </w:r>
           </w:p>
         </w:tc>
@@ -6171,15 +5958,7 @@
           </w:tcPr>
           <w:p>
             <w:r>
-              <w:t xml:space="preserve">Carga Geral Fracionada (unidade: </w:t>
-            </w:r>
-            <w:proofErr w:type="spellStart"/>
-            <w:r>
-              <w:t>kt</w:t>
-            </w:r>
-            <w:proofErr w:type="spellEnd"/>
-            <w:r>
-              <w:t>)</w:t>
+              <w:t>Carga Geral Fracionada (unidade: kt)</w:t>
             </w:r>
           </w:p>
         </w:tc>
@@ -6271,21 +6050,8 @@
             <w:hideMark/>
           </w:tcPr>
           <w:p>
-            <w:proofErr w:type="spellStart"/>
-            <w:r>
-              <w:t>Ro-Ro</w:t>
-            </w:r>
-            <w:proofErr w:type="spellEnd"/>
-            <w:r>
-              <w:t xml:space="preserve"> (unidade: </w:t>
-            </w:r>
-            <w:proofErr w:type="spellStart"/>
-            <w:r>
-              <w:t>kt</w:t>
-            </w:r>
-            <w:proofErr w:type="spellEnd"/>
-            <w:r>
-              <w:t>)</w:t>
+            <w:r>
+              <w:t>Ro-Ro (unidade: kt)</w:t>
             </w:r>
           </w:p>
         </w:tc>
@@ -6403,15 +6169,7 @@
               <w:t xml:space="preserve">TOTAL Sines </w:t>
             </w:r>
             <w:r>
-              <w:t xml:space="preserve">(unidade: </w:t>
-            </w:r>
-            <w:proofErr w:type="spellStart"/>
-            <w:r>
-              <w:t>kt</w:t>
-            </w:r>
-            <w:proofErr w:type="spellEnd"/>
-            <w:r>
-              <w:t>)</w:t>
+              <w:t>(unidade: kt)</w:t>
             </w:r>
           </w:p>
         </w:tc>
@@ -6566,7 +6324,7 @@
           <w:szCs w:val="22"/>
         </w:rPr>
       </w:pPr>
-      <w:bookmarkStart w:id="13" w:name="_Toc211616101"/>
+      <w:bookmarkStart w:id="13" w:name="_Toc212402205"/>
       <w:r>
         <w:rPr>
           <w:b/>
@@ -6696,23 +6454,7 @@
         <w:t>:</w:t>
       </w:r>
       <w:r>
-        <w:t xml:space="preserve"> exportação de animais vivos para Israel, </w:t>
-      </w:r>
-      <w:proofErr w:type="spellStart"/>
-      <w:r>
-        <w:t>pellets</w:t>
-      </w:r>
-      <w:proofErr w:type="spellEnd"/>
-      <w:r>
-        <w:t xml:space="preserve"> de madeira para França e Reino Unido, e sílica para Espanha, além de </w:t>
-      </w:r>
-      <w:proofErr w:type="spellStart"/>
-      <w:r>
-        <w:t>transhipment</w:t>
-      </w:r>
-      <w:proofErr w:type="spellEnd"/>
-      <w:r>
-        <w:t xml:space="preserve"> de pás eólicas e receção de gesso e ureia.</w:t>
+        <w:t xml:space="preserve"> exportação de animais vivos para Israel, pellets de madeira para França e Reino Unido, e sílica para Espanha, além de transhipment de pás eólicas e receção de gesso e ureia.</w:t>
       </w:r>
     </w:p>
     <w:p>
@@ -6765,7 +6507,7 @@
           <w:noProof/>
         </w:rPr>
         <w:drawing>
-          <wp:inline distT="0" distB="0" distL="0" distR="0" wp14:anchorId="68B4EA67" wp14:editId="41AD26BA">
+          <wp:inline distT="0" distB="0" distL="0" distR="0" wp14:anchorId="68B4EA67" wp14:editId="629EA3D1">
             <wp:extent cx="5226685" cy="3020060"/>
             <wp:effectExtent l="19050" t="19050" r="12065" b="27940"/>
             <wp:docPr id="1965649793" name="Imagem 6" descr="Uma imagem com texto, mapa, captura de ecrã, diagrama&#10;&#10;Os conteúdos gerados por IA podem estar incorretos."/>
@@ -6888,15 +6630,7 @@
         <w:spacing w:after="0" w:line="360" w:lineRule="auto"/>
       </w:pPr>
       <w:r>
-        <w:t xml:space="preserve">O Porto Comercial de Faro tem uma utilização pontual, enquanto o Porto de Portimão foca-se no setor de cruzeiros, recebendo navios de passageiros provenientes de portos como Lisboa, Funchal, Vigo, </w:t>
-      </w:r>
-      <w:proofErr w:type="spellStart"/>
-      <w:r>
-        <w:t>Cádiz</w:t>
-      </w:r>
-      <w:proofErr w:type="spellEnd"/>
-      <w:r>
-        <w:t xml:space="preserve"> e Gibraltar.</w:t>
+        <w:t>O Porto Comercial de Faro tem uma utilização pontual, enquanto o Porto de Portimão foca-se no setor de cruzeiros, recebendo navios de passageiros provenientes de portos como Lisboa, Funchal, Vigo, Cádiz e Gibraltar.</w:t>
       </w:r>
     </w:p>
     <w:p>
@@ -6904,15 +6638,7 @@
         <w:spacing w:after="0" w:line="360" w:lineRule="auto"/>
       </w:pPr>
       <w:r>
-        <w:t xml:space="preserve">Estes dados reforçam a relevância estratégica da APS na economia nacional, como principal </w:t>
-      </w:r>
-      <w:proofErr w:type="spellStart"/>
-      <w:r>
-        <w:t>hub</w:t>
-      </w:r>
-      <w:proofErr w:type="spellEnd"/>
-      <w:r>
-        <w:t xml:space="preserve"> logístico e energético português, com forte integração nos mercados internacionais.</w:t>
+        <w:t>Estes dados reforçam a relevância estratégica da APS na economia nacional, como principal hub logístico e energético português, com forte integração nos mercados internacionais.</w:t>
       </w:r>
     </w:p>
     <w:p>
@@ -6929,7 +6655,6 @@
           <w:b/>
         </w:rPr>
       </w:pPr>
-      <w:bookmarkStart w:id="15" w:name="_Toc211616103"/>
       <w:r>
         <w:br w:type="page"/>
       </w:r>
@@ -6942,6 +6667,7 @@
           <w:szCs w:val="22"/>
         </w:rPr>
       </w:pPr>
+      <w:bookmarkStart w:id="15" w:name="_Toc212402206"/>
       <w:r>
         <w:lastRenderedPageBreak/>
         <w:t xml:space="preserve">Parte II – </w:t>
@@ -6955,7 +6681,7 @@
       <w:pPr>
         <w:pStyle w:val="Ttulo2"/>
       </w:pPr>
-      <w:bookmarkStart w:id="16" w:name="_Toc211616104"/>
+      <w:bookmarkStart w:id="16" w:name="_Toc212402207"/>
       <w:r>
         <w:t>II.1 Organização</w:t>
       </w:r>
@@ -6975,7 +6701,7 @@
           <w:szCs w:val="22"/>
         </w:rPr>
       </w:pPr>
-      <w:bookmarkStart w:id="17" w:name="_Toc211616105"/>
+      <w:bookmarkStart w:id="17" w:name="_Toc212402208"/>
       <w:r>
         <w:rPr>
           <w:b/>
@@ -7218,7 +6944,7 @@
           <w:szCs w:val="22"/>
         </w:rPr>
       </w:pPr>
-      <w:bookmarkStart w:id="19" w:name="_Toc211616106"/>
+      <w:bookmarkStart w:id="19" w:name="_Toc212402209"/>
       <w:r>
         <w:rPr>
           <w:b/>
@@ -7428,14 +7154,13 @@
       <w:pPr>
         <w:pStyle w:val="Ttulo2"/>
       </w:pPr>
-      <w:bookmarkStart w:id="20" w:name="_Toc211616107"/>
+      <w:bookmarkStart w:id="20" w:name="_Toc212402210"/>
       <w:r>
         <w:t>II.2 Planeamento</w:t>
       </w:r>
       <w:bookmarkEnd w:id="20"/>
     </w:p>
     <w:p>
-      <w:bookmarkStart w:id="21" w:name="_Toc211616108"/>
       <w:r>
         <w:t>O planeamento estratégico da APS está alinhado com a Estratégia Nacional para o Mar 2030 e com as prioridades europeias de transição energética, digital e verde, definidas no Pacto Ecológico Europeu. Este planeamento define como eixos estruturantes a expansão e modernização das infraestruturas portuárias, o reforço da eficiência logística, a sustentabilidade ambiental e a inovação tecnológica.</w:t>
       </w:r>
@@ -7470,6 +7195,7 @@
           <w:szCs w:val="22"/>
         </w:rPr>
       </w:pPr>
+      <w:bookmarkStart w:id="21" w:name="_Toc212402211"/>
       <w:r>
         <w:rPr>
           <w:b/>
@@ -7644,15 +7370,7 @@
           </w:tcPr>
           <w:p>
             <w:r>
-              <w:t xml:space="preserve">Reforçar o papel do Porto de Sines como </w:t>
-            </w:r>
-            <w:proofErr w:type="spellStart"/>
-            <w:r>
-              <w:t>hub</w:t>
-            </w:r>
-            <w:proofErr w:type="spellEnd"/>
-            <w:r>
-              <w:t xml:space="preserve"> logístico e energético do Atlântico.</w:t>
+              <w:t>Reforçar o papel do Porto de Sines como hub logístico e energético do Atlântico.</w:t>
             </w:r>
           </w:p>
         </w:tc>
@@ -7798,7 +7516,7 @@
           <w:szCs w:val="22"/>
         </w:rPr>
       </w:pPr>
-      <w:bookmarkStart w:id="22" w:name="_Toc211616109"/>
+      <w:bookmarkStart w:id="22" w:name="_Toc212402212"/>
       <w:r>
         <w:rPr>
           <w:b/>
@@ -8129,15 +7847,7 @@
           </w:tcPr>
           <w:p>
             <w:r>
-              <w:t xml:space="preserve">Expansão dos terminais, utilização de energias verdes, automação portuária e reforço da ligação ferroviária ao </w:t>
-            </w:r>
-            <w:proofErr w:type="spellStart"/>
-            <w:r>
-              <w:t>hinterland</w:t>
-            </w:r>
-            <w:proofErr w:type="spellEnd"/>
-            <w:r>
-              <w:t xml:space="preserve"> ibérico.</w:t>
+              <w:t>Expansão dos terminais, utilização de energias verdes, automação portuária e reforço da ligação ferroviária ao hinterland ibérico.</w:t>
             </w:r>
           </w:p>
         </w:tc>
@@ -8205,7 +7915,7 @@
           <w:szCs w:val="20"/>
         </w:rPr>
       </w:pPr>
-      <w:bookmarkStart w:id="23" w:name="_Toc211616110"/>
+      <w:bookmarkStart w:id="23" w:name="_Toc212402213"/>
       <w:r>
         <w:rPr>
           <w:b/>
@@ -8612,23 +8322,7 @@
           </w:tcPr>
           <w:p>
             <w:r>
-              <w:t xml:space="preserve">Desenvolvimento de sistema </w:t>
-            </w:r>
-            <w:proofErr w:type="spellStart"/>
-            <w:r>
-              <w:t>IoT</w:t>
-            </w:r>
-            <w:proofErr w:type="spellEnd"/>
-            <w:r>
-              <w:t xml:space="preserve"> e </w:t>
-            </w:r>
-            <w:proofErr w:type="spellStart"/>
-            <w:r>
-              <w:t>dashboard</w:t>
-            </w:r>
-            <w:proofErr w:type="spellEnd"/>
-            <w:r>
-              <w:t xml:space="preserve"> analítico</w:t>
+              <w:t>Desenvolvimento de sistema IoT e dashboard analítico</w:t>
             </w:r>
           </w:p>
         </w:tc>
@@ -8752,7 +8446,7 @@
           <w:szCs w:val="22"/>
         </w:rPr>
       </w:pPr>
-      <w:bookmarkStart w:id="24" w:name="_Toc211616111"/>
+      <w:bookmarkStart w:id="24" w:name="_Toc212402214"/>
       <w:r>
         <w:rPr>
           <w:b/>
@@ -8829,7 +8523,7 @@
         <w:rPr>
           <w:u w:val="single"/>
         </w:rPr>
-        <w:t>Fraqueza</w:t>
+        <w:t>Ponto fraco</w:t>
       </w:r>
       <w:r>
         <w:t xml:space="preserve"> </w:t>
@@ -8866,23 +8560,7 @@
         <w:ind w:left="360"/>
       </w:pPr>
       <w:r>
-        <w:t xml:space="preserve">A digitalização é uma prioridade tanto para a Estratégia Nacional para o Mar 2030 como para a agenda europeia dos </w:t>
-      </w:r>
-      <w:proofErr w:type="spellStart"/>
-      <w:r>
-        <w:t>Smart</w:t>
-      </w:r>
-      <w:proofErr w:type="spellEnd"/>
-      <w:r>
-        <w:t xml:space="preserve"> </w:t>
-      </w:r>
-      <w:proofErr w:type="spellStart"/>
-      <w:r>
-        <w:t>Ports</w:t>
-      </w:r>
-      <w:proofErr w:type="spellEnd"/>
-      <w:r>
-        <w:t>, permitindo maior integração logística e competitividade.</w:t>
+        <w:t>A digitalização é uma prioridade tanto para a Estratégia Nacional para o Mar 2030 como para a agenda europeia dos Smart Ports, permitindo maior integração logística e competitividade.</w:t>
       </w:r>
     </w:p>
     <w:p>
@@ -8935,15 +8613,7 @@
         <w:t xml:space="preserve">3. </w:t>
       </w:r>
       <w:r>
-        <w:t xml:space="preserve">Reforçar a </w:t>
-      </w:r>
-      <w:proofErr w:type="spellStart"/>
-      <w:r>
-        <w:t>cibersegurança</w:t>
-      </w:r>
-      <w:proofErr w:type="spellEnd"/>
-      <w:r>
-        <w:t xml:space="preserve"> e a proteção de dados nas infraestruturas digitais da APS.</w:t>
+        <w:t>Reforçar a cibersegurança e a proteção de dados nas infraestruturas digitais da APS.</w:t>
       </w:r>
     </w:p>
     <w:p>
@@ -9081,15 +8751,7 @@
               <w:t xml:space="preserve">1.1. </w:t>
             </w:r>
             <w:r>
-              <w:t xml:space="preserve">Implementar um sistema integrado de gestão documental e </w:t>
-            </w:r>
-            <w:proofErr w:type="spellStart"/>
-            <w:r>
-              <w:t>workflow</w:t>
-            </w:r>
-            <w:proofErr w:type="spellEnd"/>
-            <w:r>
-              <w:t xml:space="preserve"> digita</w:t>
+              <w:t>Implementar um sistema integrado de gestão documental e workflow digita</w:t>
             </w:r>
             <w:r>
               <w:t>l</w:t>
@@ -9144,31 +8806,7 @@
               <w:t xml:space="preserve"> </w:t>
             </w:r>
             <w:r>
-              <w:t>Criar plataforma interoperável de troca de dados (</w:t>
-            </w:r>
-            <w:proofErr w:type="spellStart"/>
-            <w:r>
-              <w:t>Port</w:t>
-            </w:r>
-            <w:proofErr w:type="spellEnd"/>
-            <w:r>
-              <w:t xml:space="preserve"> </w:t>
-            </w:r>
-            <w:proofErr w:type="spellStart"/>
-            <w:r>
-              <w:t>Community</w:t>
-            </w:r>
-            <w:proofErr w:type="spellEnd"/>
-            <w:r>
-              <w:t xml:space="preserve"> </w:t>
-            </w:r>
-            <w:proofErr w:type="spellStart"/>
-            <w:r>
-              <w:t>System</w:t>
-            </w:r>
-            <w:proofErr w:type="spellEnd"/>
-            <w:r>
-              <w:t>)</w:t>
+              <w:t>Criar plataforma interoperável de troca de dados (Port Community System)</w:t>
             </w:r>
           </w:p>
         </w:tc>
@@ -9196,15 +8834,7 @@
           </w:tcPr>
           <w:p>
             <w:r>
-              <w:t xml:space="preserve">Programadores, analistas de sistemas, servidores e </w:t>
-            </w:r>
-            <w:proofErr w:type="spellStart"/>
-            <w:r>
-              <w:t>APIs</w:t>
-            </w:r>
-            <w:proofErr w:type="spellEnd"/>
-            <w:r>
-              <w:t xml:space="preserve"> seguras</w:t>
+              <w:t>Programadores, analistas de sistemas, servidores e APIs seguras</w:t>
             </w:r>
           </w:p>
         </w:tc>
@@ -9222,15 +8852,7 @@
           <w:p>
             <w:r>
               <w:lastRenderedPageBreak/>
-              <w:t xml:space="preserve">3.1. Reforçar </w:t>
-            </w:r>
-            <w:proofErr w:type="spellStart"/>
-            <w:r>
-              <w:t>cibersegurança</w:t>
-            </w:r>
-            <w:proofErr w:type="spellEnd"/>
-            <w:r>
-              <w:t xml:space="preserve"> e boas práticas digitais</w:t>
+              <w:t>3.1. Reforçar cibersegurança e boas práticas digitais</w:t>
             </w:r>
           </w:p>
         </w:tc>
@@ -9325,7 +8947,7 @@
       <w:pPr>
         <w:pStyle w:val="Ttulo2"/>
       </w:pPr>
-      <w:bookmarkStart w:id="25" w:name="_Toc211616112"/>
+      <w:bookmarkStart w:id="25" w:name="_Toc212402215"/>
       <w:r>
         <w:t>II.3 Controlo e Sistemas de informação</w:t>
       </w:r>
@@ -9337,7 +8959,7 @@
       <w:pPr>
         <w:pStyle w:val="Ttulo2"/>
       </w:pPr>
-      <w:bookmarkStart w:id="26" w:name="_Toc211616113"/>
+      <w:bookmarkStart w:id="26" w:name="_Toc212402216"/>
       <w:r>
         <w:t>II.</w:t>
       </w:r>
@@ -9355,7 +8977,7 @@
       <w:pPr>
         <w:pStyle w:val="Ttulo2"/>
       </w:pPr>
-      <w:bookmarkStart w:id="27" w:name="_Toc211616114"/>
+      <w:bookmarkStart w:id="27" w:name="_Toc212402217"/>
       <w:r>
         <w:t>II.5 Promoção da produtividade</w:t>
       </w:r>
@@ -9367,7 +8989,7 @@
       <w:pPr>
         <w:pStyle w:val="Ttulo2"/>
       </w:pPr>
-      <w:bookmarkStart w:id="28" w:name="_Toc211616115"/>
+      <w:bookmarkStart w:id="28" w:name="_Toc212402218"/>
       <w:r>
         <w:t>II.6 Economia circular</w:t>
       </w:r>
@@ -9379,7 +9001,7 @@
       <w:pPr>
         <w:pStyle w:val="Ttulo2"/>
       </w:pPr>
-      <w:bookmarkStart w:id="29" w:name="_Toc211616116"/>
+      <w:bookmarkStart w:id="29" w:name="_Toc212402219"/>
       <w:r>
         <w:t xml:space="preserve">II.7 </w:t>
       </w:r>
@@ -9394,7 +9016,7 @@
       <w:pPr>
         <w:pStyle w:val="Ttulo2"/>
       </w:pPr>
-      <w:bookmarkStart w:id="30" w:name="_Toc211616117"/>
+      <w:bookmarkStart w:id="30" w:name="_Toc212402220"/>
       <w:r>
         <w:t>II.</w:t>
       </w:r>
@@ -9412,7 +9034,7 @@
       <w:pPr>
         <w:pStyle w:val="Ttulo2"/>
       </w:pPr>
-      <w:bookmarkStart w:id="31" w:name="_Toc211616118"/>
+      <w:bookmarkStart w:id="31" w:name="_Toc212402221"/>
       <w:r>
         <w:t>II.9 Gestão das Operações e Indústria 4.0</w:t>
       </w:r>
@@ -9440,7 +9062,7 @@
           <w:szCs w:val="22"/>
         </w:rPr>
       </w:pPr>
-      <w:bookmarkStart w:id="32" w:name="_Toc211616119"/>
+      <w:bookmarkStart w:id="32" w:name="_Toc212402222"/>
       <w:r>
         <w:lastRenderedPageBreak/>
         <w:t>Parte III – Conclusão</w:t>
@@ -9451,7 +9073,7 @@
       <w:pPr>
         <w:pStyle w:val="Ttulo2"/>
       </w:pPr>
-      <w:bookmarkStart w:id="33" w:name="_Toc211616120"/>
+      <w:bookmarkStart w:id="33" w:name="_Toc212402223"/>
       <w:r>
         <w:t>III.1 Conclusão</w:t>
       </w:r>
@@ -9463,7 +9085,7 @@
       <w:pPr>
         <w:pStyle w:val="Ttulo2"/>
       </w:pPr>
-      <w:bookmarkStart w:id="34" w:name="_Toc211616121"/>
+      <w:bookmarkStart w:id="34" w:name="_Toc212402224"/>
       <w:r>
         <w:t>III.2 Sugestões de melhoria</w:t>
       </w:r>
@@ -9478,7 +9100,7 @@
         <w:br w:type="page"/>
       </w:r>
       <w:bookmarkStart w:id="35" w:name="_Toc471979356"/>
-      <w:bookmarkStart w:id="36" w:name="_Toc211616122"/>
+      <w:bookmarkStart w:id="36" w:name="_Toc212402225"/>
       <w:r>
         <w:lastRenderedPageBreak/>
         <w:t>Referências</w:t>
@@ -9578,7 +9200,7 @@
         </w:rPr>
       </w:pPr>
       <w:bookmarkStart w:id="37" w:name="_Toc471979357"/>
-      <w:bookmarkStart w:id="38" w:name="_Toc211616123"/>
+      <w:bookmarkStart w:id="38" w:name="_Toc212402226"/>
       <w:r>
         <w:rPr>
           <w:rFonts w:eastAsia="Arial Narrow"/>
@@ -9598,7 +9220,7 @@
       <w:pPr>
         <w:pStyle w:val="Ttulo2"/>
       </w:pPr>
-      <w:bookmarkStart w:id="39" w:name="_Toc211616124"/>
+      <w:bookmarkStart w:id="39" w:name="_Toc212402227"/>
       <w:r>
         <w:t>Opções Estratégicas para o Porto de Sines (2020-2030)</w:t>
       </w:r>
@@ -10084,21 +9706,7 @@
         <w:rPr>
           <w:color w:val="auto"/>
         </w:rPr>
-        <w:t xml:space="preserve"> - </w:t>
-      </w:r>
-      <w:proofErr w:type="spellStart"/>
-      <w:r>
-        <w:rPr>
-          <w:color w:val="auto"/>
-        </w:rPr>
-        <w:t>Legacy</w:t>
-      </w:r>
-      <w:proofErr w:type="spellEnd"/>
-      <w:r>
-        <w:rPr>
-          <w:color w:val="auto"/>
-        </w:rPr>
-        <w:t xml:space="preserve"> (riscos estratégicos)</w:t>
+        <w:t xml:space="preserve"> - Legacy (riscos estratégicos)</w:t>
       </w:r>
       <w:bookmarkEnd w:id="43"/>
     </w:p>
@@ -10326,21 +9934,7 @@
         <w:rPr>
           <w:color w:val="auto"/>
         </w:rPr>
-        <w:t xml:space="preserve"> - </w:t>
-      </w:r>
-      <w:proofErr w:type="spellStart"/>
-      <w:r>
-        <w:rPr>
-          <w:color w:val="auto"/>
-        </w:rPr>
-        <w:t>Enablers</w:t>
-      </w:r>
-      <w:proofErr w:type="spellEnd"/>
-      <w:r>
-        <w:rPr>
-          <w:color w:val="auto"/>
-        </w:rPr>
-        <w:t xml:space="preserve"> de competitividade (recursos e competências)</w:t>
+        <w:t xml:space="preserve"> - Enablers de competitividade (recursos e competências)</w:t>
       </w:r>
       <w:bookmarkEnd w:id="45"/>
     </w:p>
@@ -10473,21 +10067,7 @@
         <w:rPr>
           <w:color w:val="auto"/>
         </w:rPr>
-        <w:t xml:space="preserve"> - Visão dos </w:t>
-      </w:r>
-      <w:proofErr w:type="spellStart"/>
-      <w:r>
-        <w:rPr>
-          <w:color w:val="auto"/>
-        </w:rPr>
-        <w:t>Stakeholders</w:t>
-      </w:r>
-      <w:proofErr w:type="spellEnd"/>
-      <w:r>
-        <w:rPr>
-          <w:color w:val="auto"/>
-        </w:rPr>
-        <w:t xml:space="preserve"> (competitividade</w:t>
+        <w:t xml:space="preserve"> - Visão dos Stakeholders (competitividade</w:t>
       </w:r>
       <w:r>
         <w:rPr>
@@ -10608,21 +10188,7 @@
         <w:rPr>
           <w:color w:val="auto"/>
         </w:rPr>
-        <w:t xml:space="preserve"> - Visão dos </w:t>
-      </w:r>
-      <w:proofErr w:type="spellStart"/>
-      <w:r>
-        <w:rPr>
-          <w:color w:val="auto"/>
-        </w:rPr>
-        <w:t>Stakeholders</w:t>
-      </w:r>
-      <w:proofErr w:type="spellEnd"/>
-      <w:r>
-        <w:rPr>
-          <w:color w:val="auto"/>
-        </w:rPr>
-        <w:t xml:space="preserve"> (cooperação)</w:t>
+        <w:t xml:space="preserve"> - Visão dos Stakeholders (cooperação)</w:t>
       </w:r>
       <w:bookmarkEnd w:id="47"/>
     </w:p>
@@ -10732,21 +10298,7 @@
         <w:rPr>
           <w:color w:val="auto"/>
         </w:rPr>
-        <w:t xml:space="preserve"> - Visão dos </w:t>
-      </w:r>
-      <w:proofErr w:type="spellStart"/>
-      <w:r>
-        <w:rPr>
-          <w:color w:val="auto"/>
-        </w:rPr>
-        <w:t>Stakeholders</w:t>
-      </w:r>
-      <w:proofErr w:type="spellEnd"/>
-      <w:r>
-        <w:rPr>
-          <w:color w:val="auto"/>
-        </w:rPr>
-        <w:t xml:space="preserve"> (expectativas)</w:t>
+        <w:t xml:space="preserve"> - Visão dos Stakeholders (expectativas)</w:t>
       </w:r>
       <w:bookmarkEnd w:id="48"/>
     </w:p>
@@ -10761,16 +10313,11 @@
       <w:pPr>
         <w:pStyle w:val="Ttulo2"/>
       </w:pPr>
-      <w:bookmarkStart w:id="49" w:name="_Toc211616125"/>
-      <w:r>
-        <w:t xml:space="preserve">Ligações e </w:t>
-      </w:r>
-      <w:proofErr w:type="spellStart"/>
-      <w:r>
-        <w:t>Hinterland</w:t>
+      <w:bookmarkStart w:id="49" w:name="_Toc212402228"/>
+      <w:r>
+        <w:t>Ligações e Hinterland</w:t>
       </w:r>
       <w:bookmarkEnd w:id="49"/>
-      <w:proofErr w:type="spellEnd"/>
     </w:p>
     <w:p>
       <w:pPr>
@@ -10901,21 +10448,7 @@
         <w:rPr>
           <w:color w:val="auto"/>
         </w:rPr>
-        <w:t xml:space="preserve"> - Ligações estratégicas do Porto de Sines: acessos marítimos globais e </w:t>
-      </w:r>
-      <w:proofErr w:type="spellStart"/>
-      <w:r>
-        <w:rPr>
-          <w:color w:val="auto"/>
-        </w:rPr>
-        <w:t>hinterland</w:t>
-      </w:r>
-      <w:proofErr w:type="spellEnd"/>
-      <w:r>
-        <w:rPr>
-          <w:color w:val="auto"/>
-        </w:rPr>
-        <w:t xml:space="preserve"> ibéric</w:t>
+        <w:t xml:space="preserve"> - Ligações estratégicas do Porto de Sines: acessos marítimos globais e hinterland ibéric</w:t>
       </w:r>
       <w:r>
         <w:rPr>
@@ -10958,7 +10491,7 @@
       <w:pPr>
         <w:pStyle w:val="Ttulo2"/>
       </w:pPr>
-      <w:bookmarkStart w:id="51" w:name="_Toc211616126"/>
+      <w:bookmarkStart w:id="51" w:name="_Toc212402229"/>
       <w:r>
         <w:t>Estatísticas</w:t>
       </w:r>
@@ -10975,7 +10508,7 @@
           <w:szCs w:val="20"/>
         </w:rPr>
       </w:pPr>
-      <w:bookmarkStart w:id="52" w:name="_Toc211616127"/>
+      <w:bookmarkStart w:id="52" w:name="_Toc212402230"/>
       <w:r>
         <w:rPr>
           <w:b/>
@@ -11350,7 +10883,7 @@
           <w:szCs w:val="20"/>
         </w:rPr>
       </w:pPr>
-      <w:bookmarkStart w:id="56" w:name="_Toc211616128"/>
+      <w:bookmarkStart w:id="56" w:name="_Toc212402231"/>
       <w:r>
         <w:rPr>
           <w:b/>
@@ -11759,7 +11292,7 @@
           <w:szCs w:val="20"/>
         </w:rPr>
       </w:pPr>
-      <w:bookmarkStart w:id="60" w:name="_Toc211616129"/>
+      <w:bookmarkStart w:id="60" w:name="_Toc212402232"/>
       <w:r>
         <w:rPr>
           <w:b/>
@@ -17185,6 +16718,7 @@
   <w:style w:type="character" w:default="1" w:styleId="Tipodeletrapredefinidodopargrafo">
     <w:name w:val="Default Paragraph Font"/>
     <w:uiPriority w:val="1"/>
+    <w:semiHidden/>
     <w:unhideWhenUsed/>
   </w:style>
   <w:style w:type="table" w:default="1" w:styleId="Tabelanormal">
@@ -18046,10 +17580,6 @@
 </file>
 
 <file path=customXml/item1.xml><?xml version="1.0" encoding="utf-8"?>
-<b:Sources xmlns:b="http://schemas.openxmlformats.org/officeDocument/2006/bibliography" xmlns="http://schemas.openxmlformats.org/officeDocument/2006/bibliography" SelectedStyle="\APA.XSL" StyleName="APA"/>
-</file>
-
-<file path=customXml/item2.xml><?xml version="1.0" encoding="utf-8"?>
 <p:properties xmlns:p="http://schemas.microsoft.com/office/2006/metadata/properties" xmlns:xsi="http://www.w3.org/2001/XMLSchema-instance" xmlns:pc="http://schemas.microsoft.com/office/infopath/2007/PartnerControls">
   <documentManagement>
     <NotebookType xmlns="6e977478-40fc-4c96-9b59-58f9adc62218" xsi:nil="true"/>
@@ -18061,16 +17591,11 @@
 </p:properties>
 </file>
 
-<file path=customXml/item3.xml><?xml version="1.0" encoding="utf-8"?>
-<?mso-contentType ?>
-<FormTemplates xmlns="http://schemas.microsoft.com/sharepoint/v3/contenttype/forms">
-  <Display>DocumentLibraryForm</Display>
-  <Edit>DocumentLibraryForm</Edit>
-  <New>DocumentLibraryForm</New>
-</FormTemplates>
+<file path=customXml/item2.xml><?xml version="1.0" encoding="utf-8"?>
+<b:Sources xmlns:b="http://schemas.openxmlformats.org/officeDocument/2006/bibliography" xmlns="http://schemas.openxmlformats.org/officeDocument/2006/bibliography" SelectedStyle="\APA.XSL" StyleName="APA"/>
 </file>
 
-<file path=customXml/item4.xml><?xml version="1.0" encoding="utf-8"?>
+<file path=customXml/item3.xml><?xml version="1.0" encoding="utf-8"?>
 <ct:contentTypeSchema xmlns:ct="http://schemas.microsoft.com/office/2006/metadata/contentType" xmlns:ma="http://schemas.microsoft.com/office/2006/metadata/properties/metaAttributes" ct:_="" ma:_="" ma:contentTypeName="Documento" ma:contentTypeID="0x0101008F0F40A57A4B4943AE5F0D22A00E6876" ma:contentTypeVersion="7" ma:contentTypeDescription="Criar um novo documento." ma:contentTypeScope="" ma:versionID="0777f9d8bcaf4fa9f3f247f35de05543">
   <xsd:schema xmlns:xsd="http://www.w3.org/2001/XMLSchema" xmlns:xs="http://www.w3.org/2001/XMLSchema" xmlns:p="http://schemas.microsoft.com/office/2006/metadata/properties" xmlns:ns2="6e977478-40fc-4c96-9b59-58f9adc62218" targetNamespace="http://schemas.microsoft.com/office/2006/metadata/properties" ma:root="true" ma:fieldsID="6e1588d9447c950b5d06efd32159bf41" ns2:_="">
     <xsd:import namespace="6e977478-40fc-4c96-9b59-58f9adc62218"/>
@@ -18232,15 +17757,16 @@
 </ct:contentTypeSchema>
 </file>
 
-<file path=customXml/itemProps1.xml><?xml version="1.0" encoding="utf-8"?>
-<ds:datastoreItem xmlns:ds="http://schemas.openxmlformats.org/officeDocument/2006/customXml" ds:itemID="{9C46D67E-02BF-4E37-8EF1-2391CC03D27F}">
-  <ds:schemaRefs>
-    <ds:schemaRef ds:uri="http://schemas.openxmlformats.org/officeDocument/2006/bibliography"/>
-  </ds:schemaRefs>
-</ds:datastoreItem>
+<file path=customXml/item4.xml><?xml version="1.0" encoding="utf-8"?>
+<?mso-contentType ?>
+<FormTemplates xmlns="http://schemas.microsoft.com/sharepoint/v3/contenttype/forms">
+  <Display>DocumentLibraryForm</Display>
+  <Edit>DocumentLibraryForm</Edit>
+  <New>DocumentLibraryForm</New>
+</FormTemplates>
 </file>
 
-<file path=customXml/itemProps2.xml><?xml version="1.0" encoding="utf-8"?>
+<file path=customXml/itemProps1.xml><?xml version="1.0" encoding="utf-8"?>
 <ds:datastoreItem xmlns:ds="http://schemas.openxmlformats.org/officeDocument/2006/customXml" ds:itemID="{A02BD9CC-6025-4F76-BD90-0F1427CF0A06}">
   <ds:schemaRefs>
     <ds:schemaRef ds:uri="http://schemas.microsoft.com/office/2006/metadata/properties"/>
@@ -18250,15 +17776,15 @@
 </ds:datastoreItem>
 </file>
 
-<file path=customXml/itemProps3.xml><?xml version="1.0" encoding="utf-8"?>
-<ds:datastoreItem xmlns:ds="http://schemas.openxmlformats.org/officeDocument/2006/customXml" ds:itemID="{A8BEE9C3-75AD-4607-B106-1B44B05722EA}">
+<file path=customXml/itemProps2.xml><?xml version="1.0" encoding="utf-8"?>
+<ds:datastoreItem xmlns:ds="http://schemas.openxmlformats.org/officeDocument/2006/customXml" ds:itemID="{9C46D67E-02BF-4E37-8EF1-2391CC03D27F}">
   <ds:schemaRefs>
-    <ds:schemaRef ds:uri="http://schemas.microsoft.com/sharepoint/v3/contenttype/forms"/>
+    <ds:schemaRef ds:uri="http://schemas.openxmlformats.org/officeDocument/2006/bibliography"/>
   </ds:schemaRefs>
 </ds:datastoreItem>
 </file>
 
-<file path=customXml/itemProps4.xml><?xml version="1.0" encoding="utf-8"?>
+<file path=customXml/itemProps3.xml><?xml version="1.0" encoding="utf-8"?>
 <ds:datastoreItem xmlns:ds="http://schemas.openxmlformats.org/officeDocument/2006/customXml" ds:itemID="{F22FBF9B-697C-4384-8BA9-D9CACC814933}">
   <ds:schemaRefs>
     <ds:schemaRef ds:uri="http://schemas.microsoft.com/office/2006/metadata/contentType"/>
@@ -18274,4 +17800,12 @@
     <ds:schemaRef ds:uri="http://schemas.microsoft.com/internal/obd"/>
   </ds:schemaRefs>
 </ds:datastoreItem>
+</file>
+
+<file path=customXml/itemProps4.xml><?xml version="1.0" encoding="utf-8"?>
+<ds:datastoreItem xmlns:ds="http://schemas.openxmlformats.org/officeDocument/2006/customXml" ds:itemID="{A8BEE9C3-75AD-4607-B106-1B44B05722EA}">
+  <ds:schemaRefs>
+    <ds:schemaRef ds:uri="http://schemas.microsoft.com/sharepoint/v3/contenttype/forms"/>
+  </ds:schemaRefs>
+</ds:datastoreItem>
 </file>
</xml_diff>

<commit_message>
changes to gesta report
</commit_message>
<xml_diff>
--- a/docs/client_analysis/report_APS.docx
+++ b/docs/client_analysis/report_APS.docx
@@ -6775,7 +6775,7 @@
           <w:noProof/>
         </w:rPr>
         <w:drawing>
-          <wp:inline distT="0" distB="0" distL="0" distR="0" wp14:anchorId="68B4EA67" wp14:editId="663E20FA">
+          <wp:inline distT="0" distB="0" distL="0" distR="0" wp14:anchorId="68B4EA67" wp14:editId="501EB778">
             <wp:extent cx="5226685" cy="3020060"/>
             <wp:effectExtent l="19050" t="19050" r="12065" b="27940"/>
             <wp:docPr id="1965649793" name="Imagem 6" descr="Uma imagem com texto, mapa, captura de ecrã, diagrama&#10;&#10;Os conteúdos gerados por IA podem estar incorretos."/>
@@ -10107,6 +10107,7 @@
     </w:p>
     <w:bookmarkEnd w:id="28"/>
     <w:p/>
+    <w:p/>
     <w:p>
       <w:pPr>
         <w:pStyle w:val="Ttulo2"/>
@@ -10284,6 +10285,7 @@
           <w:b/>
           <w:bCs/>
         </w:rPr>
+        <w:lastRenderedPageBreak/>
         <w:t xml:space="preserve">Higiene, </w:t>
       </w:r>
       <w:proofErr w:type="spellStart"/>
@@ -10307,7 +10309,6 @@
     </w:p>
     <w:p>
       <w:r>
-        <w:lastRenderedPageBreak/>
         <w:t>- re</w:t>
       </w:r>
       <w:r>
@@ -10449,7 +10450,6 @@
         <w:t>formação e do reconhecimento de competências pode atuar como um fator motivacional, incentivando os trabalhadores a permanecerem na organização para continuar a desenvolver as suas carreiras.</w:t>
       </w:r>
     </w:p>
-    <w:p/>
     <w:p>
       <w:pPr>
         <w:pStyle w:val="Ttulo1"/>
@@ -10917,65 +10917,49 @@
           <w:sz w:val="24"/>
         </w:rPr>
       </w:pPr>
-    </w:p>
-    <w:p>
-      <w:pPr>
+      <w:r>
         <w:rPr>
           <w:sz w:val="24"/>
         </w:rPr>
-      </w:pPr>
+        <w:t>A Administração do Porto de Sines (APS) adota uma gestão orientada para a melhoria contínua da eficiência e da produtividade, tanto na gestão de pessoas</w:t>
+      </w:r>
       <w:r>
         <w:rPr>
           <w:sz w:val="24"/>
         </w:rPr>
-        <w:t>A Administração do Porto de Sines (APS) adota uma gestão orientada para a melhoria contínua da eficiência e da produtividade, tanto na gestão de pessoas</w:t>
+        <w:t>, como</w:t>
       </w:r>
       <w:r>
         <w:rPr>
           <w:sz w:val="24"/>
         </w:rPr>
-        <w:t>, como</w:t>
-      </w:r>
-      <w:r>
+        <w:t xml:space="preserve"> na otimização de processos operacionais e no desenvolvimento de infraestruturas estratégicas.</w:t>
+      </w:r>
+    </w:p>
+    <w:p>
+      <w:pPr>
         <w:rPr>
           <w:sz w:val="24"/>
         </w:rPr>
-        <w:t xml:space="preserve"> na otimização de processos operacionais e no desenvolvimento de infraestruturas estratégicas.</w:t>
-      </w:r>
-    </w:p>
-    <w:p>
-      <w:pPr>
+      </w:pPr>
+      <w:r>
         <w:rPr>
           <w:sz w:val="24"/>
         </w:rPr>
-      </w:pPr>
+        <w:t>Abaixo</w:t>
+      </w:r>
       <w:r>
         <w:rPr>
           <w:sz w:val="24"/>
         </w:rPr>
-        <w:t>Abaixo</w:t>
+        <w:t xml:space="preserve"> estão destacadas as práticas que favorecem a produtividade na empresa e </w:t>
       </w:r>
       <w:r>
         <w:rPr>
           <w:sz w:val="24"/>
         </w:rPr>
-        <w:t xml:space="preserve"> estão destacadas as práticas que favorecem a produtividade na empresa e </w:t>
-      </w:r>
-      <w:r>
-        <w:rPr>
-          <w:sz w:val="24"/>
-        </w:rPr>
         <w:t>o seu impacto:</w:t>
       </w:r>
-    </w:p>
-    <w:p>
-      <w:pPr>
-        <w:rPr>
-          <w:b/>
-          <w:bCs/>
-          <w:sz w:val="24"/>
-        </w:rPr>
-      </w:pPr>
     </w:p>
     <w:p>
       <w:pPr>
@@ -11208,7 +11192,6 @@
           <w:sz w:val="24"/>
           <w:szCs w:val="24"/>
         </w:rPr>
-        <w:lastRenderedPageBreak/>
         <w:t>incentivos à eficiência –</w:t>
       </w:r>
       <w:r>
@@ -11247,6 +11230,7 @@
           <w:bCs/>
           <w:sz w:val="24"/>
         </w:rPr>
+        <w:lastRenderedPageBreak/>
         <w:t xml:space="preserve">- </w:t>
       </w:r>
       <w:r>
@@ -11411,23 +11395,7 @@
           <w:sz w:val="24"/>
           <w:szCs w:val="24"/>
         </w:rPr>
-        <w:t>(</w:t>
-      </w:r>
-      <w:r>
-        <w:rPr>
-          <w:rFonts w:asciiTheme="minorHAnsi" w:hAnsiTheme="minorHAnsi" w:cstheme="minorHAnsi"/>
-          <w:sz w:val="24"/>
-          <w:szCs w:val="24"/>
-        </w:rPr>
-        <w:t>Termo em uso na geografia portuária, refere-se a uma área geográfica que serve e é influenciada por um centro urbano, como um porto ou cidade</w:t>
-      </w:r>
-      <w:r>
-        <w:rPr>
-          <w:rFonts w:asciiTheme="minorHAnsi" w:hAnsiTheme="minorHAnsi" w:cstheme="minorHAnsi"/>
-          <w:sz w:val="24"/>
-          <w:szCs w:val="24"/>
-        </w:rPr>
-        <w:t>)</w:t>
+        <w:t>(Termo em uso na geografia portuária, refere-se a uma área geográfica que serve e é influenciada por um centro urbano, como um porto ou cidade)</w:t>
       </w:r>
       <w:r>
         <w:rPr>
@@ -11494,6 +11462,15 @@
       <w:pPr>
         <w:rPr>
           <w:rFonts w:asciiTheme="minorHAnsi" w:hAnsiTheme="minorHAnsi" w:cstheme="minorHAnsi"/>
+          <w:sz w:val="24"/>
+        </w:rPr>
+      </w:pPr>
+    </w:p>
+    <w:p>
+      <w:pPr>
+        <w:rPr>
+          <w:rFonts w:asciiTheme="minorHAnsi" w:hAnsiTheme="minorHAnsi" w:cstheme="minorHAnsi"/>
+          <w:sz w:val="24"/>
         </w:rPr>
       </w:pPr>
     </w:p>
@@ -11570,6 +11547,7 @@
       <w:pPr>
         <w:spacing w:line="259" w:lineRule="auto"/>
         <w:rPr>
+          <w:rFonts w:asciiTheme="minorHAnsi" w:hAnsiTheme="minorHAnsi" w:cstheme="minorHAnsi"/>
           <w:b/>
           <w:bCs/>
           <w:sz w:val="24"/>
@@ -11577,6 +11555,7 @@
       </w:pPr>
       <w:r>
         <w:rPr>
+          <w:rFonts w:asciiTheme="minorHAnsi" w:hAnsiTheme="minorHAnsi" w:cstheme="minorHAnsi"/>
           <w:b/>
           <w:bCs/>
           <w:sz w:val="24"/>
@@ -11587,56 +11566,16 @@
     <w:p>
       <w:pPr>
         <w:rPr>
+          <w:rFonts w:asciiTheme="minorHAnsi" w:hAnsiTheme="minorHAnsi" w:cstheme="minorHAnsi"/>
           <w:sz w:val="24"/>
         </w:rPr>
       </w:pPr>
       <w:r>
         <w:rPr>
+          <w:rFonts w:asciiTheme="minorHAnsi" w:hAnsiTheme="minorHAnsi" w:cstheme="minorHAnsi"/>
           <w:sz w:val="24"/>
         </w:rPr>
-        <w:t xml:space="preserve">O ODS 7 </w:t>
-      </w:r>
-      <w:r>
-        <w:rPr>
-          <w:sz w:val="24"/>
-        </w:rPr>
-        <w:t>procura</w:t>
-      </w:r>
-      <w:r>
-        <w:rPr>
-          <w:sz w:val="24"/>
-        </w:rPr>
-        <w:t xml:space="preserve"> garantir que todos tenham acesso a energia confiável, sustentável, moderna e a preços acessíveis. O Porto de Sines </w:t>
-      </w:r>
-      <w:r>
-        <w:rPr>
-          <w:sz w:val="24"/>
-        </w:rPr>
-        <w:t>contribui</w:t>
-      </w:r>
-      <w:r>
-        <w:rPr>
-          <w:sz w:val="24"/>
-        </w:rPr>
-        <w:t xml:space="preserve"> para </w:t>
-      </w:r>
-      <w:r>
-        <w:rPr>
-          <w:sz w:val="24"/>
-        </w:rPr>
-        <w:t>esse objetivo</w:t>
-      </w:r>
-      <w:r>
-        <w:rPr>
-          <w:sz w:val="24"/>
-        </w:rPr>
-        <w:t xml:space="preserve"> por meio de uma administração energética mais eficaz e da implementação de tecnologias sustentáveis</w:t>
-      </w:r>
-      <w:r>
-        <w:rPr>
-          <w:sz w:val="24"/>
-        </w:rPr>
-        <w:t>:</w:t>
+        <w:t>O ODS 7 procura garantir que todos tenham acesso a energia confiável, sustentável, moderna e a preços acessíveis. O Porto de Sines contribui para esse objetivo por meio de uma administração energética mais eficaz e da implementação de tecnologias sustentáveis:</w:t>
       </w:r>
     </w:p>
     <w:p>
@@ -11649,6 +11588,7 @@
         <w:spacing w:before="0" w:line="259" w:lineRule="auto"/>
         <w:jc w:val="left"/>
         <w:rPr>
+          <w:rFonts w:asciiTheme="minorHAnsi" w:hAnsiTheme="minorHAnsi" w:cstheme="minorHAnsi"/>
           <w:b/>
           <w:bCs/>
           <w:sz w:val="24"/>
@@ -11657,30 +11597,25 @@
       </w:pPr>
       <w:r>
         <w:rPr>
+          <w:rFonts w:asciiTheme="minorHAnsi" w:hAnsiTheme="minorHAnsi" w:cstheme="minorHAnsi"/>
           <w:b/>
           <w:bCs/>
           <w:sz w:val="24"/>
           <w:szCs w:val="24"/>
         </w:rPr>
-        <w:lastRenderedPageBreak/>
         <w:t xml:space="preserve">implementação de eficiência energética - </w:t>
       </w:r>
       <w:r>
         <w:rPr>
+          <w:rFonts w:asciiTheme="minorHAnsi" w:hAnsiTheme="minorHAnsi" w:cstheme="minorHAnsi"/>
           <w:sz w:val="24"/>
           <w:szCs w:val="24"/>
         </w:rPr>
-        <w:t>a</w:t>
-      </w:r>
-      <w:r>
-        <w:rPr>
-          <w:sz w:val="24"/>
-          <w:szCs w:val="24"/>
-        </w:rPr>
-        <w:t xml:space="preserve"> APS implementa um sistema de gestão certificado que abrange aspetos ambientais, focando-se na otimização do consumo de energia através do Programa APS Eficiente e auditorias</w:t>
-      </w:r>
-      <w:r>
-        <w:rPr>
+        <w:t>a APS implementa um sistema de gestão certificado que abrange aspetos ambientais, focando-se na otimização do consumo de energia através do Programa APS Eficiente e auditorias</w:t>
+      </w:r>
+      <w:r>
+        <w:rPr>
+          <w:rFonts w:asciiTheme="minorHAnsi" w:hAnsiTheme="minorHAnsi" w:cstheme="minorHAnsi"/>
           <w:b/>
           <w:bCs/>
           <w:sz w:val="24"/>
@@ -11690,6 +11625,7 @@
       </w:r>
       <w:r>
         <w:rPr>
+          <w:rFonts w:asciiTheme="minorHAnsi" w:hAnsiTheme="minorHAnsi" w:cstheme="minorHAnsi"/>
           <w:sz w:val="24"/>
           <w:szCs w:val="24"/>
         </w:rPr>
@@ -11706,12 +11642,14 @@
         <w:spacing w:before="0" w:line="259" w:lineRule="auto"/>
         <w:jc w:val="left"/>
         <w:rPr>
+          <w:rFonts w:asciiTheme="minorHAnsi" w:hAnsiTheme="minorHAnsi" w:cstheme="minorHAnsi"/>
           <w:sz w:val="24"/>
           <w:szCs w:val="24"/>
         </w:rPr>
       </w:pPr>
       <w:r>
         <w:rPr>
+          <w:rFonts w:asciiTheme="minorHAnsi" w:hAnsiTheme="minorHAnsi" w:cstheme="minorHAnsi"/>
           <w:b/>
           <w:bCs/>
           <w:sz w:val="24"/>
@@ -11721,6 +11659,7 @@
       </w:r>
       <w:r>
         <w:rPr>
+          <w:rFonts w:asciiTheme="minorHAnsi" w:hAnsiTheme="minorHAnsi" w:cstheme="minorHAnsi"/>
           <w:sz w:val="24"/>
           <w:szCs w:val="24"/>
         </w:rPr>
@@ -11737,21 +11676,25 @@
         <w:spacing w:before="0" w:line="259" w:lineRule="auto"/>
         <w:jc w:val="left"/>
         <w:rPr>
+          <w:rFonts w:asciiTheme="minorHAnsi" w:hAnsiTheme="minorHAnsi" w:cstheme="minorHAnsi"/>
           <w:sz w:val="24"/>
           <w:szCs w:val="24"/>
         </w:rPr>
       </w:pPr>
       <w:r>
         <w:rPr>
+          <w:rFonts w:asciiTheme="minorHAnsi" w:hAnsiTheme="minorHAnsi" w:cstheme="minorHAnsi"/>
           <w:b/>
           <w:bCs/>
           <w:sz w:val="24"/>
           <w:szCs w:val="24"/>
         </w:rPr>
+        <w:lastRenderedPageBreak/>
         <w:t xml:space="preserve">promoção da sustentabilidade – </w:t>
       </w:r>
       <w:r>
         <w:rPr>
+          <w:rFonts w:asciiTheme="minorHAnsi" w:hAnsiTheme="minorHAnsi" w:cstheme="minorHAnsi"/>
           <w:sz w:val="24"/>
           <w:szCs w:val="24"/>
         </w:rPr>
@@ -11760,6 +11703,7 @@
       <w:proofErr w:type="spellStart"/>
       <w:r>
         <w:rPr>
+          <w:rFonts w:asciiTheme="minorHAnsi" w:hAnsiTheme="minorHAnsi" w:cstheme="minorHAnsi"/>
           <w:sz w:val="24"/>
           <w:szCs w:val="24"/>
         </w:rPr>
@@ -11768,6 +11712,7 @@
       <w:proofErr w:type="spellEnd"/>
       <w:r>
         <w:rPr>
+          <w:rFonts w:asciiTheme="minorHAnsi" w:hAnsiTheme="minorHAnsi" w:cstheme="minorHAnsi"/>
           <w:sz w:val="24"/>
           <w:szCs w:val="24"/>
         </w:rPr>
@@ -11777,6 +11722,7 @@
     <w:p>
       <w:pPr>
         <w:rPr>
+          <w:rFonts w:asciiTheme="minorHAnsi" w:hAnsiTheme="minorHAnsi" w:cstheme="minorHAnsi"/>
           <w:sz w:val="24"/>
         </w:rPr>
       </w:pPr>
@@ -11785,6 +11731,7 @@
       <w:pPr>
         <w:spacing w:line="259" w:lineRule="auto"/>
         <w:rPr>
+          <w:rFonts w:asciiTheme="minorHAnsi" w:hAnsiTheme="minorHAnsi" w:cstheme="minorHAnsi"/>
           <w:b/>
           <w:bCs/>
           <w:sz w:val="24"/>
@@ -11792,6 +11739,7 @@
       </w:pPr>
       <w:r>
         <w:rPr>
+          <w:rFonts w:asciiTheme="minorHAnsi" w:hAnsiTheme="minorHAnsi" w:cstheme="minorHAnsi"/>
           <w:b/>
           <w:bCs/>
           <w:sz w:val="24"/>
@@ -11802,68 +11750,16 @@
     <w:p>
       <w:pPr>
         <w:rPr>
+          <w:rFonts w:asciiTheme="minorHAnsi" w:hAnsiTheme="minorHAnsi" w:cstheme="minorHAnsi"/>
           <w:sz w:val="24"/>
         </w:rPr>
       </w:pPr>
       <w:r>
         <w:rPr>
+          <w:rFonts w:asciiTheme="minorHAnsi" w:hAnsiTheme="minorHAnsi" w:cstheme="minorHAnsi"/>
           <w:sz w:val="24"/>
         </w:rPr>
-        <w:t xml:space="preserve">O ODS 8 </w:t>
-      </w:r>
-      <w:r>
-        <w:rPr>
-          <w:sz w:val="24"/>
-        </w:rPr>
-        <w:t>tem como objetivo</w:t>
-      </w:r>
-      <w:r>
-        <w:rPr>
-          <w:sz w:val="24"/>
-        </w:rPr>
-        <w:t xml:space="preserve"> promover o crescimento económico sustentado, inclusivo e sustentável</w:t>
-      </w:r>
-      <w:r>
-        <w:rPr>
-          <w:sz w:val="24"/>
-        </w:rPr>
-        <w:t xml:space="preserve"> </w:t>
-      </w:r>
-      <w:r>
-        <w:rPr>
-          <w:sz w:val="24"/>
-        </w:rPr>
-        <w:t>e trabalho digno para todos. O Porto de Sines é uma infraestrutura estratégica</w:t>
-      </w:r>
-      <w:r>
-        <w:rPr>
-          <w:sz w:val="24"/>
-        </w:rPr>
-        <w:t xml:space="preserve">, atuando como </w:t>
-      </w:r>
-      <w:r>
-        <w:rPr>
-          <w:sz w:val="24"/>
-        </w:rPr>
-        <w:t xml:space="preserve">de dinamização e </w:t>
-      </w:r>
-      <w:r>
-        <w:rPr>
-          <w:sz w:val="24"/>
-        </w:rPr>
-        <w:t>gera</w:t>
-      </w:r>
-      <w:r>
-        <w:rPr>
-          <w:sz w:val="24"/>
-        </w:rPr>
-        <w:t xml:space="preserve"> emprego na sua região</w:t>
-      </w:r>
-      <w:r>
-        <w:rPr>
-          <w:sz w:val="24"/>
-        </w:rPr>
-        <w:t>:</w:t>
+        <w:t>O ODS 8 tem como objetivo promover o crescimento económico sustentado, inclusivo e sustentável e trabalho digno para todos. O Porto de Sines é uma infraestrutura estratégica, atuando como de dinamização e gera emprego na sua região:</w:t>
       </w:r>
     </w:p>
     <w:p>
@@ -11876,12 +11772,14 @@
         <w:spacing w:before="0" w:line="259" w:lineRule="auto"/>
         <w:jc w:val="left"/>
         <w:rPr>
+          <w:rFonts w:asciiTheme="minorHAnsi" w:hAnsiTheme="minorHAnsi" w:cstheme="minorHAnsi"/>
           <w:sz w:val="24"/>
           <w:szCs w:val="24"/>
         </w:rPr>
       </w:pPr>
       <w:r>
         <w:rPr>
+          <w:rFonts w:asciiTheme="minorHAnsi" w:hAnsiTheme="minorHAnsi" w:cstheme="minorHAnsi"/>
           <w:b/>
           <w:bCs/>
           <w:sz w:val="24"/>
@@ -11891,21 +11789,16 @@
       </w:r>
       <w:r>
         <w:rPr>
+          <w:rFonts w:asciiTheme="minorHAnsi" w:hAnsiTheme="minorHAnsi" w:cstheme="minorHAnsi"/>
           <w:sz w:val="24"/>
           <w:szCs w:val="24"/>
         </w:rPr>
-        <w:t xml:space="preserve">o </w:t>
-      </w:r>
-      <w:r>
-        <w:rPr>
-          <w:sz w:val="24"/>
-          <w:szCs w:val="24"/>
-        </w:rPr>
-        <w:t xml:space="preserve">Porto de Sines, dada a sua relevância estratégica, produz diversos efeitos </w:t>
+        <w:t xml:space="preserve">o Porto de Sines, dada a sua relevância estratégica, produz diversos efeitos </w:t>
       </w:r>
       <w:proofErr w:type="spellStart"/>
       <w:r>
         <w:rPr>
+          <w:rFonts w:asciiTheme="minorHAnsi" w:hAnsiTheme="minorHAnsi" w:cstheme="minorHAnsi"/>
           <w:i/>
           <w:iCs/>
           <w:sz w:val="24"/>
@@ -11916,31 +11809,11 @@
       <w:proofErr w:type="spellEnd"/>
       <w:r>
         <w:rPr>
+          <w:rFonts w:asciiTheme="minorHAnsi" w:hAnsiTheme="minorHAnsi" w:cstheme="minorHAnsi"/>
           <w:sz w:val="24"/>
           <w:szCs w:val="24"/>
         </w:rPr>
-        <w:t xml:space="preserve"> em termos económicos, sociais e ambientais</w:t>
-      </w:r>
-      <w:r>
-        <w:rPr>
-          <w:sz w:val="24"/>
-          <w:szCs w:val="24"/>
-        </w:rPr>
-        <w:t>, sendo</w:t>
-      </w:r>
-      <w:r>
-        <w:rPr>
-          <w:sz w:val="24"/>
-          <w:szCs w:val="24"/>
-        </w:rPr>
-        <w:t xml:space="preserve"> um centro que atrai talentos e investimentos, impulsionando o surgimento de micro, pequenas e médias empresas por meio de tercei</w:t>
-      </w:r>
-      <w:r>
-        <w:rPr>
-          <w:sz w:val="24"/>
-          <w:szCs w:val="24"/>
-        </w:rPr>
-        <w:t>ros;</w:t>
+        <w:t xml:space="preserve"> em termos económicos, sociais e ambientais, sendo um centro que atrai talentos e investimentos, impulsionando o surgimento de micro, pequenas e médias empresas por meio de terceiros;</w:t>
       </w:r>
     </w:p>
     <w:p>
@@ -11953,12 +11826,14 @@
         <w:spacing w:before="0" w:line="259" w:lineRule="auto"/>
         <w:jc w:val="left"/>
         <w:rPr>
+          <w:rFonts w:asciiTheme="minorHAnsi" w:hAnsiTheme="minorHAnsi" w:cstheme="minorHAnsi"/>
           <w:sz w:val="24"/>
           <w:szCs w:val="24"/>
         </w:rPr>
       </w:pPr>
       <w:r>
         <w:rPr>
+          <w:rFonts w:asciiTheme="minorHAnsi" w:hAnsiTheme="minorHAnsi" w:cstheme="minorHAnsi"/>
           <w:b/>
           <w:bCs/>
           <w:sz w:val="24"/>
@@ -11968,6 +11843,7 @@
       </w:r>
       <w:r>
         <w:rPr>
+          <w:rFonts w:asciiTheme="minorHAnsi" w:hAnsiTheme="minorHAnsi" w:cstheme="minorHAnsi"/>
           <w:sz w:val="24"/>
           <w:szCs w:val="24"/>
         </w:rPr>
@@ -11984,12 +11860,14 @@
         <w:spacing w:before="0" w:line="259" w:lineRule="auto"/>
         <w:jc w:val="left"/>
         <w:rPr>
+          <w:rFonts w:asciiTheme="minorHAnsi" w:hAnsiTheme="minorHAnsi" w:cstheme="minorHAnsi"/>
           <w:sz w:val="24"/>
           <w:szCs w:val="24"/>
         </w:rPr>
       </w:pPr>
       <w:r>
         <w:rPr>
+          <w:rFonts w:asciiTheme="minorHAnsi" w:hAnsiTheme="minorHAnsi" w:cstheme="minorHAnsi"/>
           <w:b/>
           <w:bCs/>
           <w:sz w:val="24"/>
@@ -11999,127 +11877,1205 @@
       </w:r>
       <w:r>
         <w:rPr>
+          <w:rFonts w:asciiTheme="minorHAnsi" w:hAnsiTheme="minorHAnsi" w:cstheme="minorHAnsi"/>
           <w:sz w:val="24"/>
           <w:szCs w:val="24"/>
         </w:rPr>
-        <w:t xml:space="preserve">existe um foco na </w:t>
-      </w:r>
-      <w:r>
-        <w:rPr>
+        <w:t>existe um foco na valorização profissional e um processo de educação profissional com o objetivo de potenciar as competências dos trabalhadores. A APS também adota princípios de boa governança e transparência no seu código de conduta.</w:t>
+      </w:r>
+    </w:p>
+    <w:p>
+      <w:pPr>
+        <w:rPr>
+          <w:rFonts w:asciiTheme="minorHAnsi" w:hAnsiTheme="minorHAnsi" w:cstheme="minorHAnsi"/>
           <w:sz w:val="24"/>
-          <w:szCs w:val="24"/>
-        </w:rPr>
-        <w:t xml:space="preserve">valorização profissional e um processo de </w:t>
-      </w:r>
-      <w:r>
-        <w:rPr>
+        </w:rPr>
+      </w:pPr>
+    </w:p>
+    <w:p>
+      <w:pPr>
+        <w:spacing w:line="259" w:lineRule="auto"/>
+        <w:rPr>
+          <w:rFonts w:asciiTheme="minorHAnsi" w:hAnsiTheme="minorHAnsi" w:cstheme="minorHAnsi"/>
           <w:sz w:val="24"/>
-          <w:szCs w:val="24"/>
-        </w:rPr>
-        <w:t>educação</w:t>
-      </w:r>
-      <w:r>
-        <w:rPr>
-          <w:sz w:val="24"/>
-          <w:szCs w:val="24"/>
-        </w:rPr>
-        <w:t xml:space="preserve"> profissional com o objetivo de potenciar as competências dos trabalhadores. A APS também adota princípios de boa governança e transparência no seu código de conduta</w:t>
-      </w:r>
-      <w:r>
-        <w:rPr>
-          <w:sz w:val="24"/>
-          <w:szCs w:val="24"/>
-        </w:rPr>
-        <w:t>.</w:t>
-      </w:r>
-    </w:p>
-    <w:p>
-      <w:pPr>
-        <w:rPr>
-          <w:sz w:val="24"/>
-        </w:rPr>
-      </w:pPr>
-    </w:p>
-    <w:p>
-      <w:pPr>
-        <w:spacing w:line="259" w:lineRule="auto"/>
-        <w:rPr>
-          <w:sz w:val="24"/>
-        </w:rPr>
-      </w:pPr>
-      <w:r>
-        <w:rPr>
+        </w:rPr>
+      </w:pPr>
+      <w:r>
+        <w:rPr>
+          <w:rFonts w:asciiTheme="minorHAnsi" w:hAnsiTheme="minorHAnsi" w:cstheme="minorHAnsi"/>
           <w:b/>
           <w:bCs/>
           <w:sz w:val="24"/>
         </w:rPr>
-        <w:t>ODS 9: Indústria</w:t>
-      </w:r>
-      <w:r>
-        <w:rPr>
+        <w:t>ODS 9: Indústria,</w:t>
+      </w:r>
+      <w:r>
+        <w:rPr>
+          <w:rFonts w:asciiTheme="minorHAnsi" w:hAnsiTheme="minorHAnsi" w:cstheme="minorHAnsi"/>
+          <w:sz w:val="24"/>
+        </w:rPr>
+        <w:t xml:space="preserve"> </w:t>
+      </w:r>
+      <w:r>
+        <w:rPr>
+          <w:rFonts w:asciiTheme="minorHAnsi" w:hAnsiTheme="minorHAnsi" w:cstheme="minorHAnsi"/>
           <w:b/>
           <w:bCs/>
           <w:sz w:val="24"/>
         </w:rPr>
-        <w:t>,</w:t>
-      </w:r>
-      <w:r>
-        <w:rPr>
+        <w:t>Inovação e Infraestruturas</w:t>
+      </w:r>
+    </w:p>
+    <w:p>
+      <w:pPr>
+        <w:spacing w:line="259" w:lineRule="auto"/>
+        <w:rPr>
+          <w:rFonts w:asciiTheme="minorHAnsi" w:hAnsiTheme="minorHAnsi" w:cstheme="minorHAnsi"/>
           <w:sz w:val="24"/>
         </w:rPr>
-        <w:t xml:space="preserve"> </w:t>
-      </w:r>
-      <w:r>
-        <w:rPr>
+      </w:pPr>
+      <w:r>
+        <w:rPr>
+          <w:rFonts w:asciiTheme="minorHAnsi" w:hAnsiTheme="minorHAnsi" w:cstheme="minorHAnsi"/>
+          <w:sz w:val="24"/>
+        </w:rPr>
+        <w:t xml:space="preserve">Outro ODS relevante, dada a natureza da organização, é o ODS 9, uma vez que o Porto de Sines é uma infraestrutura vital, líder nacional na movimentação de mercadorias. O seu desenvolvimento tem como objetivo apoiar o comércio internacional e criar um </w:t>
+      </w:r>
+      <w:r>
+        <w:rPr>
+          <w:rFonts w:asciiTheme="minorHAnsi" w:hAnsiTheme="minorHAnsi" w:cstheme="minorHAnsi"/>
+          <w:i/>
+          <w:iCs/>
+          <w:sz w:val="24"/>
+        </w:rPr>
+        <w:t>cluster</w:t>
+      </w:r>
+      <w:r>
+        <w:rPr>
+          <w:rFonts w:asciiTheme="minorHAnsi" w:hAnsiTheme="minorHAnsi" w:cstheme="minorHAnsi"/>
+          <w:sz w:val="24"/>
+        </w:rPr>
+        <w:t xml:space="preserve"> regional suportado na cadeia marítima, fundamental para a industrialização sustentável.</w:t>
+      </w:r>
+    </w:p>
+    <w:p>
+      <w:pPr>
+        <w:rPr>
+          <w:rFonts w:asciiTheme="minorHAnsi" w:hAnsiTheme="minorHAnsi" w:cstheme="minorHAnsi"/>
+        </w:rPr>
+      </w:pPr>
+    </w:p>
+    <w:p>
+      <w:pPr>
+        <w:pStyle w:val="Ttulo1"/>
+        <w:rPr>
+          <w:rFonts w:asciiTheme="minorHAnsi" w:hAnsiTheme="minorHAnsi" w:cstheme="minorHAnsi"/>
+          <w:sz w:val="24"/>
+        </w:rPr>
+      </w:pPr>
+      <w:r>
+        <w:rPr>
+          <w:rFonts w:asciiTheme="minorHAnsi" w:hAnsiTheme="minorHAnsi" w:cstheme="minorHAnsi"/>
+          <w:sz w:val="24"/>
+        </w:rPr>
+        <w:t xml:space="preserve">3.7.9 </w:t>
+      </w:r>
+    </w:p>
+    <w:p>
+      <w:pPr>
+        <w:rPr>
+          <w:rFonts w:asciiTheme="minorHAnsi" w:hAnsiTheme="minorHAnsi" w:cstheme="minorHAnsi"/>
+          <w:sz w:val="24"/>
+        </w:rPr>
+      </w:pPr>
+    </w:p>
+    <w:p>
+      <w:pPr>
+        <w:spacing w:line="259" w:lineRule="auto"/>
+        <w:rPr>
+          <w:rFonts w:asciiTheme="minorHAnsi" w:hAnsiTheme="minorHAnsi" w:cstheme="minorHAnsi"/>
+          <w:sz w:val="24"/>
+        </w:rPr>
+      </w:pPr>
+      <w:r>
+        <w:rPr>
+          <w:rFonts w:asciiTheme="minorHAnsi" w:hAnsiTheme="minorHAnsi" w:cstheme="minorHAnsi"/>
+          <w:sz w:val="24"/>
+        </w:rPr>
+        <w:t xml:space="preserve">A Administração do Porto de Sines (APS) demonstra um compromisso com a sustentabilidade e a eficiência energética, que se traduz em práticas alinhadas com os princípios da Economia Circular, representados pelas estratégias </w:t>
+      </w:r>
+      <w:proofErr w:type="spellStart"/>
+      <w:r>
+        <w:rPr>
+          <w:rFonts w:asciiTheme="minorHAnsi" w:hAnsiTheme="minorHAnsi" w:cstheme="minorHAnsi"/>
           <w:b/>
           <w:bCs/>
           <w:sz w:val="24"/>
         </w:rPr>
-        <w:t>Inovação e Infraestruturas</w:t>
-      </w:r>
-    </w:p>
-    <w:p>
-      <w:pPr>
-        <w:spacing w:line="259" w:lineRule="auto"/>
-        <w:rPr>
+        <w:t>ReSOLVE</w:t>
+      </w:r>
+      <w:proofErr w:type="spellEnd"/>
+      <w:r>
+        <w:rPr>
+          <w:rFonts w:asciiTheme="minorHAnsi" w:hAnsiTheme="minorHAnsi" w:cstheme="minorHAnsi"/>
           <w:sz w:val="24"/>
         </w:rPr>
-      </w:pPr>
-      <w:r>
-        <w:rPr>
+        <w:t xml:space="preserve"> (Regenerar, Partilhar, Otimizar, </w:t>
+      </w:r>
+      <w:r>
+        <w:rPr>
+          <w:rFonts w:asciiTheme="minorHAnsi" w:hAnsiTheme="minorHAnsi" w:cstheme="minorHAnsi"/>
           <w:sz w:val="24"/>
         </w:rPr>
-        <w:t xml:space="preserve">Outro ODS relevante, dada a natureza da organização, é o ODS 9, uma vez que o Porto de Sines é uma infraestrutura vital, líder nacional na movimentação de mercadorias. O seu desenvolvimento </w:t>
-      </w:r>
-      <w:r>
-        <w:rPr>
+        <w:t>Circular</w:t>
+      </w:r>
+      <w:r>
+        <w:rPr>
+          <w:rFonts w:asciiTheme="minorHAnsi" w:hAnsiTheme="minorHAnsi" w:cstheme="minorHAnsi"/>
           <w:sz w:val="24"/>
         </w:rPr>
-        <w:t>tem como objetivo</w:t>
-      </w:r>
-      <w:r>
-        <w:rPr>
+        <w:t>, Virtualizar, Trocar)</w:t>
+      </w:r>
+      <w:r>
+        <w:rPr>
+          <w:rFonts w:asciiTheme="minorHAnsi" w:hAnsiTheme="minorHAnsi" w:cstheme="minorHAnsi"/>
           <w:sz w:val="24"/>
         </w:rPr>
-        <w:t xml:space="preserve"> apoiar o comércio internacional e criar um </w:t>
-      </w:r>
-      <w:r>
-        <w:rPr>
+        <w:t>:</w:t>
+      </w:r>
+    </w:p>
+    <w:p>
+      <w:pPr>
+        <w:rPr>
+          <w:rFonts w:asciiTheme="minorHAnsi" w:hAnsiTheme="minorHAnsi" w:cstheme="minorHAnsi"/>
+          <w:sz w:val="24"/>
+        </w:rPr>
+      </w:pPr>
+    </w:p>
+    <w:p>
+      <w:pPr>
+        <w:pStyle w:val="PargrafodaLista"/>
+        <w:numPr>
+          <w:ilvl w:val="0"/>
+          <w:numId w:val="70"/>
+        </w:numPr>
+        <w:spacing w:before="0" w:line="259" w:lineRule="auto"/>
+        <w:jc w:val="left"/>
+        <w:rPr>
+          <w:rFonts w:asciiTheme="minorHAnsi" w:hAnsiTheme="minorHAnsi" w:cstheme="minorHAnsi"/>
+          <w:b/>
+          <w:bCs/>
+          <w:sz w:val="24"/>
+          <w:szCs w:val="24"/>
+        </w:rPr>
+      </w:pPr>
+      <w:r>
+        <w:rPr>
+          <w:rFonts w:asciiTheme="minorHAnsi" w:hAnsiTheme="minorHAnsi" w:cstheme="minorHAnsi"/>
+          <w:b/>
+          <w:bCs/>
+          <w:sz w:val="24"/>
+          <w:szCs w:val="24"/>
+        </w:rPr>
+        <w:t>Regenerar (</w:t>
+      </w:r>
+      <w:proofErr w:type="spellStart"/>
+      <w:r>
+        <w:rPr>
+          <w:rFonts w:asciiTheme="minorHAnsi" w:hAnsiTheme="minorHAnsi" w:cstheme="minorHAnsi"/>
+          <w:b/>
+          <w:bCs/>
+          <w:sz w:val="24"/>
+          <w:szCs w:val="24"/>
+        </w:rPr>
+        <w:t>Regenerate</w:t>
+      </w:r>
+      <w:proofErr w:type="spellEnd"/>
+      <w:r>
+        <w:rPr>
+          <w:rFonts w:asciiTheme="minorHAnsi" w:hAnsiTheme="minorHAnsi" w:cstheme="minorHAnsi"/>
+          <w:b/>
+          <w:bCs/>
+          <w:sz w:val="24"/>
+          <w:szCs w:val="24"/>
+        </w:rPr>
+        <w:t>)</w:t>
+      </w:r>
+    </w:p>
+    <w:p>
+      <w:pPr>
+        <w:rPr>
+          <w:rFonts w:asciiTheme="minorHAnsi" w:hAnsiTheme="minorHAnsi" w:cstheme="minorHAnsi"/>
+          <w:b/>
+          <w:bCs/>
+          <w:sz w:val="24"/>
+        </w:rPr>
+      </w:pPr>
+      <w:r>
+        <w:rPr>
+          <w:rFonts w:asciiTheme="minorHAnsi" w:hAnsiTheme="minorHAnsi" w:cstheme="minorHAnsi"/>
+          <w:b/>
+          <w:bCs/>
+          <w:sz w:val="24"/>
+        </w:rPr>
+        <w:t>Instalação de painéis solares:</w:t>
+      </w:r>
+    </w:p>
+    <w:p>
+      <w:pPr>
+        <w:pStyle w:val="PargrafodaLista"/>
+        <w:numPr>
+          <w:ilvl w:val="0"/>
+          <w:numId w:val="71"/>
+        </w:numPr>
+        <w:spacing w:before="0" w:line="259" w:lineRule="auto"/>
+        <w:jc w:val="left"/>
+        <w:rPr>
+          <w:rFonts w:asciiTheme="minorHAnsi" w:hAnsiTheme="minorHAnsi" w:cstheme="minorHAnsi"/>
+          <w:b/>
+          <w:bCs/>
+          <w:sz w:val="24"/>
+          <w:szCs w:val="24"/>
+        </w:rPr>
+      </w:pPr>
+      <w:r>
+        <w:rPr>
+          <w:rFonts w:asciiTheme="minorHAnsi" w:hAnsiTheme="minorHAnsi" w:cstheme="minorHAnsi"/>
+          <w:b/>
+          <w:bCs/>
+          <w:sz w:val="24"/>
+          <w:szCs w:val="24"/>
+        </w:rPr>
+        <w:t>benefício ambiental e operacional:</w:t>
+      </w:r>
+      <w:r>
+        <w:rPr>
+          <w:rFonts w:asciiTheme="minorHAnsi" w:hAnsiTheme="minorHAnsi" w:cstheme="minorHAnsi"/>
+          <w:sz w:val="24"/>
+          <w:szCs w:val="24"/>
+        </w:rPr>
+        <w:t xml:space="preserve"> aproveita-se de recursos renováveis para o aquecimento de águas sanitárias e para a geração de eletricidade. Assim, reduz a dependência de fontes não renováveis e a sua pegada de carbono.</w:t>
+      </w:r>
+    </w:p>
+    <w:p>
+      <w:pPr>
+        <w:rPr>
+          <w:rFonts w:asciiTheme="minorHAnsi" w:hAnsiTheme="minorHAnsi" w:cstheme="minorHAnsi"/>
+          <w:sz w:val="24"/>
+        </w:rPr>
+      </w:pPr>
+      <w:r>
+        <w:rPr>
+          <w:rFonts w:asciiTheme="minorHAnsi" w:hAnsiTheme="minorHAnsi" w:cstheme="minorHAnsi"/>
+          <w:b/>
+          <w:bCs/>
+          <w:sz w:val="24"/>
+        </w:rPr>
+        <w:t xml:space="preserve">Sugestão: </w:t>
+      </w:r>
+      <w:r>
+        <w:rPr>
+          <w:rFonts w:asciiTheme="minorHAnsi" w:hAnsiTheme="minorHAnsi" w:cstheme="minorHAnsi"/>
+          <w:sz w:val="24"/>
+        </w:rPr>
+        <w:t>utilização de materiais orgânicos (por exemplo, lamas de drenagem, resíduos verdes) como fertilizantes ou em processos de remediação de solos:</w:t>
+      </w:r>
+    </w:p>
+    <w:p>
+      <w:pPr>
+        <w:pStyle w:val="PargrafodaLista"/>
+        <w:numPr>
+          <w:ilvl w:val="0"/>
+          <w:numId w:val="71"/>
+        </w:numPr>
+        <w:spacing w:before="0" w:line="259" w:lineRule="auto"/>
+        <w:jc w:val="left"/>
+        <w:rPr>
+          <w:rFonts w:asciiTheme="minorHAnsi" w:hAnsiTheme="minorHAnsi" w:cstheme="minorHAnsi"/>
+          <w:sz w:val="24"/>
+          <w:szCs w:val="24"/>
+        </w:rPr>
+      </w:pPr>
+      <w:r>
+        <w:rPr>
+          <w:rFonts w:asciiTheme="minorHAnsi" w:hAnsiTheme="minorHAnsi" w:cstheme="minorHAnsi"/>
+          <w:b/>
+          <w:bCs/>
+          <w:sz w:val="24"/>
+          <w:szCs w:val="24"/>
+        </w:rPr>
+        <w:t>benefício ambiental e económico:</w:t>
+      </w:r>
+      <w:r>
+        <w:rPr>
+          <w:rFonts w:asciiTheme="minorHAnsi" w:hAnsiTheme="minorHAnsi" w:cstheme="minorHAnsi"/>
+          <w:sz w:val="24"/>
+          <w:szCs w:val="24"/>
+        </w:rPr>
+        <w:t xml:space="preserve"> restaura o capital natural, prevenindo a acumulação e convertendo subprodutos em recursos valiosos.</w:t>
+      </w:r>
+    </w:p>
+    <w:p>
+      <w:pPr>
+        <w:rPr>
+          <w:rFonts w:asciiTheme="minorHAnsi" w:hAnsiTheme="minorHAnsi" w:cstheme="minorHAnsi"/>
+          <w:b/>
+          <w:bCs/>
+          <w:sz w:val="24"/>
+        </w:rPr>
+      </w:pPr>
+    </w:p>
+    <w:p>
+      <w:pPr>
+        <w:pStyle w:val="PargrafodaLista"/>
+        <w:numPr>
+          <w:ilvl w:val="0"/>
+          <w:numId w:val="70"/>
+        </w:numPr>
+        <w:spacing w:before="0" w:line="259" w:lineRule="auto"/>
+        <w:jc w:val="left"/>
+        <w:rPr>
+          <w:rFonts w:asciiTheme="minorHAnsi" w:hAnsiTheme="minorHAnsi" w:cstheme="minorHAnsi"/>
+          <w:b/>
+          <w:bCs/>
+          <w:sz w:val="24"/>
+          <w:szCs w:val="24"/>
+        </w:rPr>
+      </w:pPr>
+      <w:r>
+        <w:rPr>
+          <w:rFonts w:asciiTheme="minorHAnsi" w:hAnsiTheme="minorHAnsi" w:cstheme="minorHAnsi"/>
+          <w:b/>
+          <w:bCs/>
+          <w:sz w:val="24"/>
+          <w:szCs w:val="24"/>
+        </w:rPr>
+        <w:t>Partilhar (Share)</w:t>
+      </w:r>
+    </w:p>
+    <w:p>
+      <w:pPr>
+        <w:rPr>
+          <w:rFonts w:asciiTheme="minorHAnsi" w:hAnsiTheme="minorHAnsi" w:cstheme="minorHAnsi"/>
+          <w:sz w:val="24"/>
+        </w:rPr>
+      </w:pPr>
+      <w:r>
+        <w:rPr>
+          <w:rFonts w:asciiTheme="minorHAnsi" w:hAnsiTheme="minorHAnsi" w:cstheme="minorHAnsi"/>
+          <w:b/>
+          <w:bCs/>
+          <w:sz w:val="24"/>
+        </w:rPr>
+        <w:t xml:space="preserve">Sugestão: </w:t>
+      </w:r>
+      <w:r>
+        <w:rPr>
+          <w:rFonts w:asciiTheme="minorHAnsi" w:hAnsiTheme="minorHAnsi" w:cstheme="minorHAnsi"/>
+          <w:sz w:val="24"/>
+        </w:rPr>
+        <w:t>adotar uma política para a partilha de equipamentos especializados (gruas, reboques, veículos pesados) entre os terminais concessionados e a APS:</w:t>
+      </w:r>
+    </w:p>
+    <w:p>
+      <w:pPr>
+        <w:pStyle w:val="PargrafodaLista"/>
+        <w:numPr>
+          <w:ilvl w:val="0"/>
+          <w:numId w:val="71"/>
+        </w:numPr>
+        <w:spacing w:before="0" w:line="259" w:lineRule="auto"/>
+        <w:jc w:val="left"/>
+        <w:rPr>
+          <w:rFonts w:asciiTheme="minorHAnsi" w:hAnsiTheme="minorHAnsi" w:cstheme="minorHAnsi"/>
+          <w:b/>
+          <w:bCs/>
+          <w:sz w:val="24"/>
+          <w:szCs w:val="24"/>
+        </w:rPr>
+      </w:pPr>
+      <w:r>
+        <w:rPr>
+          <w:rFonts w:asciiTheme="minorHAnsi" w:hAnsiTheme="minorHAnsi" w:cstheme="minorHAnsi"/>
+          <w:b/>
+          <w:bCs/>
+          <w:sz w:val="24"/>
+          <w:szCs w:val="24"/>
+        </w:rPr>
+        <w:t xml:space="preserve">benefício operacional e económico – </w:t>
+      </w:r>
+      <w:r>
+        <w:rPr>
+          <w:rFonts w:asciiTheme="minorHAnsi" w:hAnsiTheme="minorHAnsi" w:cstheme="minorHAnsi"/>
+          <w:sz w:val="24"/>
+          <w:szCs w:val="24"/>
+        </w:rPr>
+        <w:t>eleva a taxa de utilização dos ativos existentes (</w:t>
+      </w:r>
+      <w:proofErr w:type="spellStart"/>
+      <w:r>
+        <w:rPr>
+          <w:rFonts w:asciiTheme="minorHAnsi" w:hAnsiTheme="minorHAnsi" w:cstheme="minorHAnsi"/>
           <w:i/>
           <w:iCs/>
           <w:sz w:val="24"/>
-        </w:rPr>
-        <w:t>cluster</w:t>
-      </w:r>
-      <w:r>
-        <w:rPr>
+          <w:szCs w:val="24"/>
+        </w:rPr>
+        <w:t>asset</w:t>
+      </w:r>
+      <w:proofErr w:type="spellEnd"/>
+      <w:r>
+        <w:rPr>
+          <w:rFonts w:asciiTheme="minorHAnsi" w:hAnsiTheme="minorHAnsi" w:cstheme="minorHAnsi"/>
+          <w:i/>
+          <w:iCs/>
           <w:sz w:val="24"/>
-        </w:rPr>
-        <w:t xml:space="preserve"> regional suportado na cadeia marítima, fundamental para a industrialização sustentável.</w:t>
-      </w:r>
-    </w:p>
-    <w:p/>
-    <w:p/>
+          <w:szCs w:val="24"/>
+        </w:rPr>
+        <w:t xml:space="preserve"> </w:t>
+      </w:r>
+      <w:proofErr w:type="spellStart"/>
+      <w:r>
+        <w:rPr>
+          <w:rFonts w:asciiTheme="minorHAnsi" w:hAnsiTheme="minorHAnsi" w:cstheme="minorHAnsi"/>
+          <w:i/>
+          <w:iCs/>
+          <w:sz w:val="24"/>
+          <w:szCs w:val="24"/>
+        </w:rPr>
+        <w:t>utilization</w:t>
+      </w:r>
+      <w:proofErr w:type="spellEnd"/>
+      <w:r>
+        <w:rPr>
+          <w:rFonts w:asciiTheme="minorHAnsi" w:hAnsiTheme="minorHAnsi" w:cstheme="minorHAnsi"/>
+          <w:sz w:val="24"/>
+          <w:szCs w:val="24"/>
+        </w:rPr>
+        <w:t>), reduzindo assim a necessidade de adquirir novos equipamentos caros, melhorando o retorno do investimento.</w:t>
+      </w:r>
+    </w:p>
+    <w:p>
+      <w:pPr>
+        <w:rPr>
+          <w:rFonts w:asciiTheme="minorHAnsi" w:hAnsiTheme="minorHAnsi" w:cstheme="minorHAnsi"/>
+          <w:b/>
+          <w:bCs/>
+          <w:sz w:val="24"/>
+        </w:rPr>
+      </w:pPr>
+    </w:p>
+    <w:p>
+      <w:pPr>
+        <w:pStyle w:val="PargrafodaLista"/>
+        <w:numPr>
+          <w:ilvl w:val="0"/>
+          <w:numId w:val="70"/>
+        </w:numPr>
+        <w:spacing w:before="0" w:line="259" w:lineRule="auto"/>
+        <w:jc w:val="left"/>
+        <w:rPr>
+          <w:rFonts w:asciiTheme="minorHAnsi" w:hAnsiTheme="minorHAnsi" w:cstheme="minorHAnsi"/>
+          <w:b/>
+          <w:bCs/>
+          <w:sz w:val="24"/>
+          <w:szCs w:val="24"/>
+        </w:rPr>
+      </w:pPr>
+      <w:r>
+        <w:rPr>
+          <w:rFonts w:asciiTheme="minorHAnsi" w:hAnsiTheme="minorHAnsi" w:cstheme="minorHAnsi"/>
+          <w:b/>
+          <w:bCs/>
+          <w:sz w:val="24"/>
+          <w:szCs w:val="24"/>
+        </w:rPr>
+        <w:t>Otimizar (</w:t>
+      </w:r>
+      <w:proofErr w:type="spellStart"/>
+      <w:r>
+        <w:rPr>
+          <w:rFonts w:asciiTheme="minorHAnsi" w:hAnsiTheme="minorHAnsi" w:cstheme="minorHAnsi"/>
+          <w:b/>
+          <w:bCs/>
+          <w:sz w:val="24"/>
+          <w:szCs w:val="24"/>
+        </w:rPr>
+        <w:t>Optimize</w:t>
+      </w:r>
+      <w:proofErr w:type="spellEnd"/>
+      <w:r>
+        <w:rPr>
+          <w:rFonts w:asciiTheme="minorHAnsi" w:hAnsiTheme="minorHAnsi" w:cstheme="minorHAnsi"/>
+          <w:b/>
+          <w:bCs/>
+          <w:sz w:val="24"/>
+          <w:szCs w:val="24"/>
+        </w:rPr>
+        <w:t>)</w:t>
+      </w:r>
+    </w:p>
+    <w:p>
+      <w:pPr>
+        <w:rPr>
+          <w:rFonts w:asciiTheme="minorHAnsi" w:hAnsiTheme="minorHAnsi" w:cstheme="minorHAnsi"/>
+          <w:b/>
+          <w:bCs/>
+          <w:sz w:val="24"/>
+        </w:rPr>
+      </w:pPr>
+      <w:r>
+        <w:rPr>
+          <w:rFonts w:asciiTheme="minorHAnsi" w:hAnsiTheme="minorHAnsi" w:cstheme="minorHAnsi"/>
+          <w:b/>
+          <w:bCs/>
+          <w:sz w:val="24"/>
+        </w:rPr>
+        <w:t>Programa APS Eficiente / Auditoria Energética</w:t>
+      </w:r>
+      <w:r>
+        <w:rPr>
+          <w:rFonts w:asciiTheme="minorHAnsi" w:hAnsiTheme="minorHAnsi" w:cstheme="minorHAnsi"/>
+          <w:b/>
+          <w:bCs/>
+          <w:sz w:val="24"/>
+        </w:rPr>
+        <w:t>:</w:t>
+      </w:r>
+    </w:p>
+    <w:p>
+      <w:pPr>
+        <w:pStyle w:val="PargrafodaLista"/>
+        <w:numPr>
+          <w:ilvl w:val="0"/>
+          <w:numId w:val="71"/>
+        </w:numPr>
+        <w:spacing w:before="0" w:line="259" w:lineRule="auto"/>
+        <w:jc w:val="left"/>
+        <w:rPr>
+          <w:rFonts w:asciiTheme="minorHAnsi" w:hAnsiTheme="minorHAnsi" w:cstheme="minorHAnsi"/>
+          <w:b/>
+          <w:bCs/>
+          <w:sz w:val="24"/>
+          <w:szCs w:val="24"/>
+        </w:rPr>
+      </w:pPr>
+      <w:r>
+        <w:rPr>
+          <w:rFonts w:asciiTheme="minorHAnsi" w:hAnsiTheme="minorHAnsi" w:cstheme="minorHAnsi"/>
+          <w:b/>
+          <w:bCs/>
+          <w:sz w:val="24"/>
+          <w:szCs w:val="24"/>
+        </w:rPr>
+        <w:t xml:space="preserve">benefício económico e operacional: </w:t>
+      </w:r>
+      <w:r>
+        <w:rPr>
+          <w:rFonts w:asciiTheme="minorHAnsi" w:hAnsiTheme="minorHAnsi" w:cstheme="minorHAnsi"/>
+          <w:sz w:val="24"/>
+          <w:szCs w:val="24"/>
+        </w:rPr>
+        <w:t>possibilita aos gestores identificar áreas de desperdício e otimizar o consumo de energia (por exemplo, na climatização, iluminação e frota de veículos), gerando uma significativa redução dos custos.</w:t>
+      </w:r>
+    </w:p>
+    <w:p>
+      <w:pPr>
+        <w:ind w:left="360"/>
+        <w:rPr>
+          <w:rFonts w:asciiTheme="minorHAnsi" w:hAnsiTheme="minorHAnsi" w:cstheme="minorHAnsi"/>
+          <w:b/>
+          <w:bCs/>
+          <w:sz w:val="24"/>
+        </w:rPr>
+      </w:pPr>
+      <w:r>
+        <w:rPr>
+          <w:rFonts w:asciiTheme="minorHAnsi" w:hAnsiTheme="minorHAnsi" w:cstheme="minorHAnsi"/>
+          <w:b/>
+          <w:bCs/>
+          <w:sz w:val="24"/>
+        </w:rPr>
+        <w:t xml:space="preserve">Promoção da </w:t>
+      </w:r>
+      <w:proofErr w:type="spellStart"/>
+      <w:r>
+        <w:rPr>
+          <w:rFonts w:asciiTheme="minorHAnsi" w:hAnsiTheme="minorHAnsi" w:cstheme="minorHAnsi"/>
+          <w:b/>
+          <w:bCs/>
+          <w:sz w:val="24"/>
+        </w:rPr>
+        <w:t>eco-condução</w:t>
+      </w:r>
+      <w:proofErr w:type="spellEnd"/>
+      <w:r>
+        <w:rPr>
+          <w:rFonts w:asciiTheme="minorHAnsi" w:hAnsiTheme="minorHAnsi" w:cstheme="minorHAnsi"/>
+          <w:b/>
+          <w:bCs/>
+          <w:sz w:val="24"/>
+        </w:rPr>
+        <w:t>:</w:t>
+      </w:r>
+    </w:p>
+    <w:p>
+      <w:pPr>
+        <w:pStyle w:val="PargrafodaLista"/>
+        <w:numPr>
+          <w:ilvl w:val="0"/>
+          <w:numId w:val="71"/>
+        </w:numPr>
+        <w:spacing w:before="0" w:line="259" w:lineRule="auto"/>
+        <w:jc w:val="left"/>
+        <w:rPr>
+          <w:rFonts w:asciiTheme="minorHAnsi" w:hAnsiTheme="minorHAnsi" w:cstheme="minorHAnsi"/>
+          <w:b/>
+          <w:bCs/>
+          <w:sz w:val="24"/>
+          <w:szCs w:val="24"/>
+        </w:rPr>
+      </w:pPr>
+      <w:r>
+        <w:rPr>
+          <w:rFonts w:asciiTheme="minorHAnsi" w:hAnsiTheme="minorHAnsi" w:cstheme="minorHAnsi"/>
+          <w:b/>
+          <w:bCs/>
+          <w:sz w:val="24"/>
+          <w:szCs w:val="24"/>
+        </w:rPr>
+        <w:t xml:space="preserve">benefício operacional e ambiental: </w:t>
+      </w:r>
+      <w:r>
+        <w:rPr>
+          <w:rFonts w:asciiTheme="minorHAnsi" w:hAnsiTheme="minorHAnsi" w:cstheme="minorHAnsi"/>
+          <w:sz w:val="24"/>
+          <w:szCs w:val="24"/>
+        </w:rPr>
+        <w:t>reduz o consumo de combustível da frota automóvel da APS, que constitui um dos principais focos de consumo, através de práticas de condução mais eficientes.</w:t>
+      </w:r>
+    </w:p>
+    <w:p>
+      <w:pPr>
+        <w:rPr>
+          <w:rFonts w:asciiTheme="minorHAnsi" w:hAnsiTheme="minorHAnsi" w:cstheme="minorHAnsi"/>
+          <w:b/>
+          <w:bCs/>
+          <w:sz w:val="24"/>
+        </w:rPr>
+      </w:pPr>
+    </w:p>
+    <w:p>
+      <w:pPr>
+        <w:pStyle w:val="PargrafodaLista"/>
+        <w:numPr>
+          <w:ilvl w:val="0"/>
+          <w:numId w:val="70"/>
+        </w:numPr>
+        <w:spacing w:before="0" w:line="259" w:lineRule="auto"/>
+        <w:jc w:val="left"/>
+        <w:rPr>
+          <w:rFonts w:asciiTheme="minorHAnsi" w:hAnsiTheme="minorHAnsi" w:cstheme="minorHAnsi"/>
+          <w:b/>
+          <w:bCs/>
+          <w:sz w:val="24"/>
+          <w:szCs w:val="24"/>
+        </w:rPr>
+      </w:pPr>
+      <w:r>
+        <w:rPr>
+          <w:rFonts w:asciiTheme="minorHAnsi" w:hAnsiTheme="minorHAnsi" w:cstheme="minorHAnsi"/>
+          <w:b/>
+          <w:bCs/>
+          <w:sz w:val="24"/>
+          <w:szCs w:val="24"/>
+        </w:rPr>
+        <w:t>Circular (Loop)</w:t>
+      </w:r>
+    </w:p>
+    <w:p>
+      <w:pPr>
+        <w:rPr>
+          <w:rFonts w:asciiTheme="minorHAnsi" w:hAnsiTheme="minorHAnsi" w:cstheme="minorHAnsi"/>
+          <w:b/>
+          <w:bCs/>
+          <w:sz w:val="24"/>
+        </w:rPr>
+      </w:pPr>
+      <w:r>
+        <w:rPr>
+          <w:rFonts w:asciiTheme="minorHAnsi" w:hAnsiTheme="minorHAnsi" w:cstheme="minorHAnsi"/>
+          <w:b/>
+          <w:bCs/>
+          <w:sz w:val="24"/>
+        </w:rPr>
+        <w:lastRenderedPageBreak/>
+        <w:t>Recolha seletiva de resíduos:</w:t>
+      </w:r>
+    </w:p>
+    <w:p>
+      <w:pPr>
+        <w:pStyle w:val="PargrafodaLista"/>
+        <w:numPr>
+          <w:ilvl w:val="0"/>
+          <w:numId w:val="71"/>
+        </w:numPr>
+        <w:spacing w:before="0" w:line="259" w:lineRule="auto"/>
+        <w:jc w:val="left"/>
+        <w:rPr>
+          <w:rFonts w:asciiTheme="minorHAnsi" w:hAnsiTheme="minorHAnsi" w:cstheme="minorHAnsi"/>
+          <w:b/>
+          <w:bCs/>
+          <w:sz w:val="24"/>
+          <w:szCs w:val="24"/>
+        </w:rPr>
+      </w:pPr>
+      <w:r>
+        <w:rPr>
+          <w:rFonts w:asciiTheme="minorHAnsi" w:hAnsiTheme="minorHAnsi" w:cstheme="minorHAnsi"/>
+          <w:b/>
+          <w:bCs/>
+          <w:sz w:val="24"/>
+          <w:szCs w:val="24"/>
+        </w:rPr>
+        <w:t xml:space="preserve">benefício ambiental e operacional: </w:t>
+      </w:r>
+      <w:r>
+        <w:rPr>
+          <w:rFonts w:asciiTheme="minorHAnsi" w:hAnsiTheme="minorHAnsi" w:cstheme="minorHAnsi"/>
+          <w:sz w:val="24"/>
+          <w:szCs w:val="24"/>
+        </w:rPr>
+        <w:t>a</w:t>
+      </w:r>
+      <w:r>
+        <w:rPr>
+          <w:rFonts w:asciiTheme="minorHAnsi" w:hAnsiTheme="minorHAnsi" w:cstheme="minorHAnsi"/>
+          <w:sz w:val="24"/>
+          <w:szCs w:val="24"/>
+        </w:rPr>
+        <w:t>ssegura que os materiais são recolhidos separadamente nas instalações da APS, facilitando a reciclagem, a reintrodução dos materiais na economia e minimizando o volume de resíduos.</w:t>
+      </w:r>
+    </w:p>
+    <w:p>
+      <w:pPr>
+        <w:rPr>
+          <w:rFonts w:asciiTheme="minorHAnsi" w:hAnsiTheme="minorHAnsi" w:cstheme="minorHAnsi"/>
+          <w:sz w:val="24"/>
+        </w:rPr>
+      </w:pPr>
+      <w:r>
+        <w:rPr>
+          <w:rFonts w:asciiTheme="minorHAnsi" w:hAnsiTheme="minorHAnsi" w:cstheme="minorHAnsi"/>
+          <w:b/>
+          <w:bCs/>
+          <w:sz w:val="24"/>
+        </w:rPr>
+        <w:t xml:space="preserve">Sugestão: </w:t>
+      </w:r>
+      <w:r>
+        <w:rPr>
+          <w:rFonts w:asciiTheme="minorHAnsi" w:hAnsiTheme="minorHAnsi" w:cstheme="minorHAnsi"/>
+          <w:sz w:val="24"/>
+        </w:rPr>
+        <w:t xml:space="preserve">fomentar a simbiose industrial (conceito da economia circular onde o resíduo de uma empresa se torna matéria-prima para outra) </w:t>
+      </w:r>
+      <w:r>
+        <w:rPr>
+          <w:rFonts w:asciiTheme="minorHAnsi" w:hAnsiTheme="minorHAnsi" w:cstheme="minorHAnsi"/>
+          <w:sz w:val="24"/>
+        </w:rPr>
+        <w:t>com as empresas da ZILS (Zona Industrial e Logística de Sines)</w:t>
+      </w:r>
+      <w:r>
+        <w:rPr>
+          <w:rFonts w:asciiTheme="minorHAnsi" w:hAnsiTheme="minorHAnsi" w:cstheme="minorHAnsi"/>
+          <w:sz w:val="24"/>
+        </w:rPr>
+        <w:t>:</w:t>
+      </w:r>
+    </w:p>
+    <w:p>
+      <w:pPr>
+        <w:pStyle w:val="PargrafodaLista"/>
+        <w:numPr>
+          <w:ilvl w:val="0"/>
+          <w:numId w:val="71"/>
+        </w:numPr>
+        <w:spacing w:before="0" w:line="259" w:lineRule="auto"/>
+        <w:jc w:val="left"/>
+        <w:rPr>
+          <w:rFonts w:asciiTheme="minorHAnsi" w:hAnsiTheme="minorHAnsi" w:cstheme="minorHAnsi"/>
+          <w:b/>
+          <w:bCs/>
+          <w:sz w:val="24"/>
+          <w:szCs w:val="24"/>
+        </w:rPr>
+      </w:pPr>
+      <w:r>
+        <w:rPr>
+          <w:rFonts w:asciiTheme="minorHAnsi" w:hAnsiTheme="minorHAnsi" w:cstheme="minorHAnsi"/>
+          <w:b/>
+          <w:bCs/>
+          <w:sz w:val="24"/>
+          <w:szCs w:val="24"/>
+        </w:rPr>
+        <w:t xml:space="preserve">benefício económico e ambiental: </w:t>
+      </w:r>
+      <w:r>
+        <w:rPr>
+          <w:rFonts w:asciiTheme="minorHAnsi" w:hAnsiTheme="minorHAnsi" w:cstheme="minorHAnsi"/>
+          <w:sz w:val="24"/>
+          <w:szCs w:val="24"/>
+        </w:rPr>
+        <w:t>cria ciclos fechados de materiais, onde os resíduos de um terminal ou uma indústria se tornam matéria-prima para outra (por exemplo, resíduos de calor, vapor, ou subprodutos, promovendo a colaboração para otimizar o uso de recursos e reduzir o desperdício minerais).</w:t>
+      </w:r>
+    </w:p>
+    <w:p>
+      <w:pPr>
+        <w:pStyle w:val="PargrafodaLista"/>
+        <w:ind w:firstLine="0"/>
+        <w:rPr>
+          <w:rFonts w:asciiTheme="minorHAnsi" w:hAnsiTheme="minorHAnsi" w:cstheme="minorHAnsi"/>
+          <w:b/>
+          <w:bCs/>
+          <w:sz w:val="24"/>
+          <w:szCs w:val="24"/>
+        </w:rPr>
+      </w:pPr>
+    </w:p>
+    <w:p>
+      <w:pPr>
+        <w:pStyle w:val="PargrafodaLista"/>
+        <w:numPr>
+          <w:ilvl w:val="0"/>
+          <w:numId w:val="70"/>
+        </w:numPr>
+        <w:spacing w:before="0" w:line="259" w:lineRule="auto"/>
+        <w:jc w:val="left"/>
+        <w:rPr>
+          <w:rFonts w:asciiTheme="minorHAnsi" w:hAnsiTheme="minorHAnsi" w:cstheme="minorHAnsi"/>
+          <w:b/>
+          <w:bCs/>
+          <w:sz w:val="24"/>
+          <w:szCs w:val="24"/>
+        </w:rPr>
+      </w:pPr>
+      <w:r>
+        <w:rPr>
+          <w:rFonts w:asciiTheme="minorHAnsi" w:hAnsiTheme="minorHAnsi" w:cstheme="minorHAnsi"/>
+          <w:b/>
+          <w:bCs/>
+          <w:sz w:val="24"/>
+          <w:szCs w:val="24"/>
+        </w:rPr>
+        <w:t>Virtualizar (Virtualize)</w:t>
+      </w:r>
+    </w:p>
+    <w:p>
+      <w:pPr>
+        <w:rPr>
+          <w:rFonts w:asciiTheme="minorHAnsi" w:hAnsiTheme="minorHAnsi" w:cstheme="minorHAnsi"/>
+          <w:sz w:val="24"/>
+        </w:rPr>
+      </w:pPr>
+      <w:r>
+        <w:rPr>
+          <w:rFonts w:asciiTheme="minorHAnsi" w:hAnsiTheme="minorHAnsi" w:cstheme="minorHAnsi"/>
+          <w:b/>
+          <w:bCs/>
+          <w:sz w:val="24"/>
+        </w:rPr>
+        <w:t xml:space="preserve">Sugestão: </w:t>
+      </w:r>
+      <w:r>
+        <w:rPr>
+          <w:rFonts w:asciiTheme="minorHAnsi" w:hAnsiTheme="minorHAnsi" w:cstheme="minorHAnsi"/>
+          <w:sz w:val="24"/>
+        </w:rPr>
+        <w:t xml:space="preserve">Digitalizar e automatizar os processos logísticos e aduaneiros (e.g., </w:t>
+      </w:r>
+      <w:r>
+        <w:rPr>
+          <w:rFonts w:asciiTheme="minorHAnsi" w:hAnsiTheme="minorHAnsi" w:cstheme="minorHAnsi"/>
+          <w:sz w:val="24"/>
+        </w:rPr>
+        <w:t>faturação</w:t>
+      </w:r>
+      <w:r>
+        <w:rPr>
+          <w:rFonts w:asciiTheme="minorHAnsi" w:hAnsiTheme="minorHAnsi" w:cstheme="minorHAnsi"/>
+          <w:sz w:val="24"/>
+        </w:rPr>
+        <w:t>, documentação de carga, manifestos) através de plataformas eletrónicas</w:t>
+      </w:r>
+      <w:r>
+        <w:rPr>
+          <w:rFonts w:asciiTheme="minorHAnsi" w:hAnsiTheme="minorHAnsi" w:cstheme="minorHAnsi"/>
+          <w:sz w:val="24"/>
+        </w:rPr>
+        <w:t>:</w:t>
+      </w:r>
+    </w:p>
+    <w:p>
+      <w:pPr>
+        <w:pStyle w:val="PargrafodaLista"/>
+        <w:numPr>
+          <w:ilvl w:val="0"/>
+          <w:numId w:val="71"/>
+        </w:numPr>
+        <w:spacing w:before="0" w:line="259" w:lineRule="auto"/>
+        <w:jc w:val="left"/>
+        <w:rPr>
+          <w:rFonts w:asciiTheme="minorHAnsi" w:hAnsiTheme="minorHAnsi" w:cstheme="minorHAnsi"/>
+          <w:sz w:val="24"/>
+          <w:szCs w:val="24"/>
+        </w:rPr>
+      </w:pPr>
+      <w:r>
+        <w:rPr>
+          <w:rFonts w:asciiTheme="minorHAnsi" w:hAnsiTheme="minorHAnsi" w:cstheme="minorHAnsi"/>
+          <w:b/>
+          <w:bCs/>
+          <w:sz w:val="24"/>
+          <w:szCs w:val="24"/>
+        </w:rPr>
+        <w:t xml:space="preserve">Benefício operacional e ambiental: </w:t>
+      </w:r>
+      <w:r>
+        <w:rPr>
+          <w:rFonts w:asciiTheme="minorHAnsi" w:hAnsiTheme="minorHAnsi" w:cstheme="minorHAnsi"/>
+          <w:sz w:val="24"/>
+          <w:szCs w:val="24"/>
+        </w:rPr>
+        <w:t>melhora a eficiência operacional ao agilizar processos e diminui significativamente o consumo de papel e os recursos ligados à documentação física.</w:t>
+      </w:r>
+    </w:p>
+    <w:p>
+      <w:pPr>
+        <w:rPr>
+          <w:rFonts w:asciiTheme="minorHAnsi" w:hAnsiTheme="minorHAnsi" w:cstheme="minorHAnsi"/>
+          <w:b/>
+          <w:bCs/>
+          <w:sz w:val="24"/>
+        </w:rPr>
+      </w:pPr>
+    </w:p>
+    <w:p>
+      <w:pPr>
+        <w:pStyle w:val="PargrafodaLista"/>
+        <w:numPr>
+          <w:ilvl w:val="0"/>
+          <w:numId w:val="70"/>
+        </w:numPr>
+        <w:spacing w:before="0" w:line="259" w:lineRule="auto"/>
+        <w:jc w:val="left"/>
+        <w:rPr>
+          <w:rFonts w:asciiTheme="minorHAnsi" w:hAnsiTheme="minorHAnsi" w:cstheme="minorHAnsi"/>
+          <w:b/>
+          <w:bCs/>
+          <w:sz w:val="24"/>
+          <w:szCs w:val="24"/>
+        </w:rPr>
+      </w:pPr>
+      <w:r>
+        <w:rPr>
+          <w:rFonts w:asciiTheme="minorHAnsi" w:hAnsiTheme="minorHAnsi" w:cstheme="minorHAnsi"/>
+          <w:b/>
+          <w:bCs/>
+          <w:sz w:val="24"/>
+          <w:szCs w:val="24"/>
+        </w:rPr>
+        <w:t>Trocar (Exchange)</w:t>
+      </w:r>
+    </w:p>
+    <w:p>
+      <w:pPr>
+        <w:rPr>
+          <w:rFonts w:asciiTheme="minorHAnsi" w:hAnsiTheme="minorHAnsi" w:cstheme="minorHAnsi"/>
+          <w:sz w:val="24"/>
+        </w:rPr>
+      </w:pPr>
+      <w:r>
+        <w:rPr>
+          <w:rFonts w:asciiTheme="minorHAnsi" w:hAnsiTheme="minorHAnsi" w:cstheme="minorHAnsi"/>
+          <w:b/>
+          <w:bCs/>
+          <w:sz w:val="24"/>
+        </w:rPr>
+        <w:t xml:space="preserve">Estudo para a Implementação do </w:t>
+      </w:r>
+      <w:proofErr w:type="spellStart"/>
+      <w:r>
+        <w:rPr>
+          <w:rFonts w:asciiTheme="minorHAnsi" w:hAnsiTheme="minorHAnsi" w:cstheme="minorHAnsi"/>
+          <w:b/>
+          <w:bCs/>
+          <w:i/>
+          <w:iCs/>
+          <w:sz w:val="24"/>
+        </w:rPr>
+        <w:t>Cold</w:t>
+      </w:r>
+      <w:proofErr w:type="spellEnd"/>
+      <w:r>
+        <w:rPr>
+          <w:rFonts w:asciiTheme="minorHAnsi" w:hAnsiTheme="minorHAnsi" w:cstheme="minorHAnsi"/>
+          <w:b/>
+          <w:bCs/>
+          <w:i/>
+          <w:iCs/>
+          <w:sz w:val="24"/>
+        </w:rPr>
+        <w:t xml:space="preserve"> </w:t>
+      </w:r>
+      <w:proofErr w:type="spellStart"/>
+      <w:r>
+        <w:rPr>
+          <w:rFonts w:asciiTheme="minorHAnsi" w:hAnsiTheme="minorHAnsi" w:cstheme="minorHAnsi"/>
+          <w:b/>
+          <w:bCs/>
+          <w:i/>
+          <w:iCs/>
+          <w:sz w:val="24"/>
+        </w:rPr>
+        <w:t>Ironing</w:t>
+      </w:r>
+      <w:proofErr w:type="spellEnd"/>
+      <w:r>
+        <w:rPr>
+          <w:rFonts w:asciiTheme="minorHAnsi" w:hAnsiTheme="minorHAnsi" w:cstheme="minorHAnsi"/>
+          <w:sz w:val="24"/>
+        </w:rPr>
+        <w:t xml:space="preserve"> (Fornecimento de energia de terra a navios)</w:t>
+      </w:r>
+      <w:r>
+        <w:rPr>
+          <w:rFonts w:asciiTheme="minorHAnsi" w:hAnsiTheme="minorHAnsi" w:cstheme="minorHAnsi"/>
+          <w:sz w:val="24"/>
+        </w:rPr>
+        <w:t>:</w:t>
+      </w:r>
+    </w:p>
+    <w:p>
+      <w:pPr>
+        <w:pStyle w:val="PargrafodaLista"/>
+        <w:numPr>
+          <w:ilvl w:val="0"/>
+          <w:numId w:val="71"/>
+        </w:numPr>
+        <w:spacing w:before="0" w:line="259" w:lineRule="auto"/>
+        <w:jc w:val="left"/>
+        <w:rPr>
+          <w:rFonts w:asciiTheme="minorHAnsi" w:hAnsiTheme="minorHAnsi" w:cstheme="minorHAnsi"/>
+          <w:b/>
+          <w:bCs/>
+          <w:sz w:val="24"/>
+          <w:szCs w:val="24"/>
+        </w:rPr>
+      </w:pPr>
+      <w:r>
+        <w:rPr>
+          <w:rFonts w:asciiTheme="minorHAnsi" w:hAnsiTheme="minorHAnsi" w:cstheme="minorHAnsi"/>
+          <w:b/>
+          <w:bCs/>
+          <w:sz w:val="24"/>
+          <w:szCs w:val="24"/>
+        </w:rPr>
+        <w:t xml:space="preserve">benefício ambiental e operacional: </w:t>
+      </w:r>
+      <w:r>
+        <w:rPr>
+          <w:rFonts w:asciiTheme="minorHAnsi" w:hAnsiTheme="minorHAnsi" w:cstheme="minorHAnsi"/>
+          <w:sz w:val="24"/>
+          <w:szCs w:val="24"/>
+        </w:rPr>
+        <w:t>permite fazer a troca do combustível fóssil dos navios atracados por energia vinda da rede terreste, o que ajuda a reduzir as emissões diretas de gases de escape no porto e a poluição sonora.</w:t>
+      </w:r>
+    </w:p>
+    <w:p>
+      <w:pPr>
+        <w:rPr>
+          <w:rFonts w:asciiTheme="minorHAnsi" w:hAnsiTheme="minorHAnsi" w:cstheme="minorHAnsi"/>
+          <w:sz w:val="24"/>
+        </w:rPr>
+      </w:pPr>
+      <w:r>
+        <w:rPr>
+          <w:rFonts w:asciiTheme="minorHAnsi" w:hAnsiTheme="minorHAnsi" w:cstheme="minorHAnsi"/>
+          <w:b/>
+          <w:bCs/>
+          <w:sz w:val="24"/>
+        </w:rPr>
+        <w:t>Incentivo para a Eficiência Energética</w:t>
+      </w:r>
+      <w:r>
+        <w:rPr>
+          <w:rFonts w:asciiTheme="minorHAnsi" w:hAnsiTheme="minorHAnsi" w:cstheme="minorHAnsi"/>
+          <w:sz w:val="24"/>
+        </w:rPr>
+        <w:t xml:space="preserve"> </w:t>
+      </w:r>
+      <w:r>
+        <w:rPr>
+          <w:rFonts w:asciiTheme="minorHAnsi" w:hAnsiTheme="minorHAnsi" w:cstheme="minorHAnsi"/>
+          <w:b/>
+          <w:bCs/>
+          <w:sz w:val="24"/>
+        </w:rPr>
+        <w:t>dos terminais concessionados</w:t>
+      </w:r>
+      <w:r>
+        <w:rPr>
+          <w:rFonts w:asciiTheme="minorHAnsi" w:hAnsiTheme="minorHAnsi" w:cstheme="minorHAnsi"/>
+          <w:sz w:val="24"/>
+        </w:rPr>
+        <w:t>:</w:t>
+      </w:r>
+    </w:p>
+    <w:p>
+      <w:pPr>
+        <w:pStyle w:val="PargrafodaLista"/>
+        <w:numPr>
+          <w:ilvl w:val="0"/>
+          <w:numId w:val="71"/>
+        </w:numPr>
+        <w:spacing w:before="0" w:line="259" w:lineRule="auto"/>
+        <w:jc w:val="left"/>
+        <w:rPr>
+          <w:rFonts w:asciiTheme="minorHAnsi" w:hAnsiTheme="minorHAnsi" w:cstheme="minorHAnsi"/>
+          <w:b/>
+          <w:bCs/>
+          <w:sz w:val="24"/>
+          <w:szCs w:val="24"/>
+        </w:rPr>
+      </w:pPr>
+      <w:r>
+        <w:rPr>
+          <w:rFonts w:asciiTheme="minorHAnsi" w:hAnsiTheme="minorHAnsi" w:cstheme="minorHAnsi"/>
+          <w:b/>
+          <w:bCs/>
+          <w:sz w:val="24"/>
+          <w:szCs w:val="24"/>
+        </w:rPr>
+        <w:t xml:space="preserve">benefício económico e operacional: </w:t>
+      </w:r>
+      <w:r>
+        <w:rPr>
+          <w:rFonts w:asciiTheme="minorHAnsi" w:hAnsiTheme="minorHAnsi" w:cstheme="minorHAnsi"/>
+          <w:sz w:val="24"/>
+          <w:szCs w:val="24"/>
+        </w:rPr>
+        <w:t>a APS promove a troca de práticas e tecnologias pouco eficazes por soluções mais eficientes nas concessões.</w:t>
+      </w:r>
+    </w:p>
+    <w:p>
+      <w:pPr>
+        <w:rPr>
+          <w:rFonts w:asciiTheme="minorHAnsi" w:hAnsiTheme="minorHAnsi" w:cstheme="minorHAnsi"/>
+        </w:rPr>
+      </w:pPr>
+    </w:p>
     <w:p/>
     <w:p>
       <w:pPr>
@@ -12458,12 +13414,376 @@
     </w:p>
     <w:p>
       <w:pPr>
+        <w:rPr>
+          <w:color w:val="000000" w:themeColor="text1"/>
+        </w:rPr>
+      </w:pPr>
+      <w:bookmarkStart w:id="40" w:name="_Toc471979357"/>
+      <w:r>
+        <w:rPr>
+          <w:color w:val="000000" w:themeColor="text1"/>
+        </w:rPr>
+        <w:t>Eufrásio, D. A. M. (2024). </w:t>
+      </w:r>
+      <w:r>
+        <w:rPr>
+          <w:i/>
+          <w:iCs/>
+          <w:color w:val="000000" w:themeColor="text1"/>
+        </w:rPr>
+        <w:t>Caraterização Geofísica da Área Offshore Contígua ao Porto de Sines</w:t>
+      </w:r>
+      <w:r>
+        <w:rPr>
+          <w:color w:val="000000" w:themeColor="text1"/>
+        </w:rPr>
+        <w:t> (</w:t>
+      </w:r>
+      <w:proofErr w:type="spellStart"/>
+      <w:r>
+        <w:rPr>
+          <w:color w:val="000000" w:themeColor="text1"/>
+        </w:rPr>
+        <w:t>Master's</w:t>
+      </w:r>
+      <w:proofErr w:type="spellEnd"/>
+      <w:r>
+        <w:rPr>
+          <w:color w:val="000000" w:themeColor="text1"/>
+        </w:rPr>
+        <w:t xml:space="preserve"> </w:t>
+      </w:r>
+      <w:proofErr w:type="spellStart"/>
+      <w:r>
+        <w:rPr>
+          <w:color w:val="000000" w:themeColor="text1"/>
+        </w:rPr>
+        <w:t>thesis</w:t>
+      </w:r>
+      <w:proofErr w:type="spellEnd"/>
+      <w:r>
+        <w:rPr>
+          <w:color w:val="000000" w:themeColor="text1"/>
+        </w:rPr>
+        <w:t>, Universidade de Aveiro (Portugal)).</w:t>
+      </w:r>
+    </w:p>
+    <w:p>
+      <w:pPr>
+        <w:rPr>
+          <w:color w:val="000000" w:themeColor="text1"/>
+        </w:rPr>
+      </w:pPr>
+      <w:r>
+        <w:rPr>
+          <w:color w:val="000000" w:themeColor="text1"/>
+        </w:rPr>
+        <w:t>Guerreiro, R. F. (2009). </w:t>
+      </w:r>
+      <w:r>
+        <w:rPr>
+          <w:i/>
+          <w:iCs/>
+          <w:color w:val="000000" w:themeColor="text1"/>
+        </w:rPr>
+        <w:t>Eficiência energética na Administração do Porto de Sines</w:t>
+      </w:r>
+      <w:r>
+        <w:rPr>
+          <w:color w:val="000000" w:themeColor="text1"/>
+        </w:rPr>
+        <w:t> (</w:t>
+      </w:r>
+      <w:proofErr w:type="spellStart"/>
+      <w:r>
+        <w:rPr>
+          <w:color w:val="000000" w:themeColor="text1"/>
+        </w:rPr>
+        <w:t>Master's</w:t>
+      </w:r>
+      <w:proofErr w:type="spellEnd"/>
+      <w:r>
+        <w:rPr>
+          <w:color w:val="000000" w:themeColor="text1"/>
+        </w:rPr>
+        <w:t xml:space="preserve"> </w:t>
+      </w:r>
+      <w:proofErr w:type="spellStart"/>
+      <w:r>
+        <w:rPr>
+          <w:color w:val="000000" w:themeColor="text1"/>
+        </w:rPr>
+        <w:t>thesis</w:t>
+      </w:r>
+      <w:proofErr w:type="spellEnd"/>
+      <w:r>
+        <w:rPr>
+          <w:color w:val="000000" w:themeColor="text1"/>
+        </w:rPr>
+        <w:t>, Universidade NOVA de Lisboa (Portugal)).</w:t>
+      </w:r>
+    </w:p>
+    <w:p>
+      <w:pPr>
+        <w:rPr>
+          <w:color w:val="000000" w:themeColor="text1"/>
+          <w:lang w:val="es-ES"/>
+        </w:rPr>
+      </w:pPr>
+      <w:r>
+        <w:rPr>
+          <w:color w:val="000000" w:themeColor="text1"/>
+          <w:lang w:val="es-ES"/>
+        </w:rPr>
+        <w:t xml:space="preserve">Nieto </w:t>
+      </w:r>
+      <w:proofErr w:type="spellStart"/>
+      <w:r>
+        <w:rPr>
+          <w:color w:val="000000" w:themeColor="text1"/>
+          <w:lang w:val="es-ES"/>
+        </w:rPr>
+        <w:t>Masot</w:t>
+      </w:r>
+      <w:proofErr w:type="spellEnd"/>
+      <w:r>
+        <w:rPr>
+          <w:color w:val="000000" w:themeColor="text1"/>
+          <w:lang w:val="es-ES"/>
+        </w:rPr>
+        <w:t>, A. (2015). </w:t>
+      </w:r>
+      <w:r>
+        <w:rPr>
+          <w:i/>
+          <w:iCs/>
+          <w:color w:val="000000" w:themeColor="text1"/>
+          <w:lang w:val="es-ES"/>
+        </w:rPr>
+        <w:t>Aplicaciones TIG en el análisis territorial. Transferencia a universidad, sector público y empresas</w:t>
+      </w:r>
+      <w:r>
+        <w:rPr>
+          <w:color w:val="000000" w:themeColor="text1"/>
+          <w:lang w:val="es-ES"/>
+        </w:rPr>
+        <w:t>. Universidad de Extremadura, Grupo de Investigación en Desarrollo Sostenible y Planificación Territorial.</w:t>
+      </w:r>
+    </w:p>
+    <w:p>
+      <w:pPr>
+        <w:rPr>
+          <w:color w:val="000000" w:themeColor="text1"/>
+          <w:lang w:val="en-GB"/>
+        </w:rPr>
+      </w:pPr>
+      <w:r>
+        <w:rPr>
+          <w:color w:val="000000" w:themeColor="text1"/>
+          <w:lang w:val="en-GB"/>
+        </w:rPr>
+        <w:t>Moreira, P. (2013). A rail link from the port of Sines as a structuring element of regional development.</w:t>
+      </w:r>
+    </w:p>
+    <w:p>
+      <w:pPr>
+        <w:rPr>
+          <w:color w:val="000000" w:themeColor="text1"/>
+        </w:rPr>
+      </w:pPr>
+      <w:r>
+        <w:rPr>
+          <w:color w:val="000000" w:themeColor="text1"/>
+        </w:rPr>
+        <w:t>Correia, J. M. R. (2025). </w:t>
+      </w:r>
+      <w:r>
+        <w:rPr>
+          <w:i/>
+          <w:iCs/>
+          <w:color w:val="000000" w:themeColor="text1"/>
+        </w:rPr>
+        <w:t>Estudo e dimensionamento de soluções solares fotovoltaicas para o setor logístico: Porto de Sines</w:t>
+      </w:r>
+      <w:r>
+        <w:rPr>
+          <w:color w:val="000000" w:themeColor="text1"/>
+        </w:rPr>
+        <w:t> (</w:t>
+      </w:r>
+      <w:proofErr w:type="spellStart"/>
+      <w:r>
+        <w:rPr>
+          <w:color w:val="000000" w:themeColor="text1"/>
+        </w:rPr>
+        <w:t>Master's</w:t>
+      </w:r>
+      <w:proofErr w:type="spellEnd"/>
+      <w:r>
+        <w:rPr>
+          <w:color w:val="000000" w:themeColor="text1"/>
+        </w:rPr>
+        <w:t xml:space="preserve"> </w:t>
+      </w:r>
+      <w:proofErr w:type="spellStart"/>
+      <w:r>
+        <w:rPr>
+          <w:color w:val="000000" w:themeColor="text1"/>
+        </w:rPr>
+        <w:t>thesis</w:t>
+      </w:r>
+      <w:proofErr w:type="spellEnd"/>
+      <w:r>
+        <w:rPr>
+          <w:color w:val="000000" w:themeColor="text1"/>
+        </w:rPr>
+        <w:t>, Universidade de Évora).</w:t>
+      </w:r>
+    </w:p>
+    <w:p>
+      <w:pPr>
+        <w:rPr>
+          <w:color w:val="000000" w:themeColor="text1"/>
+        </w:rPr>
+      </w:pPr>
+      <w:r>
+        <w:rPr>
+          <w:color w:val="000000" w:themeColor="text1"/>
+        </w:rPr>
+        <w:t>Ramos, F. F. (2019). </w:t>
+      </w:r>
+      <w:r>
+        <w:rPr>
+          <w:i/>
+          <w:iCs/>
+          <w:color w:val="000000" w:themeColor="text1"/>
+        </w:rPr>
+        <w:t>Transporte de Contentores–Porto de Sines</w:t>
+      </w:r>
+      <w:r>
+        <w:rPr>
+          <w:color w:val="000000" w:themeColor="text1"/>
+        </w:rPr>
+        <w:t> (</w:t>
+      </w:r>
+      <w:proofErr w:type="spellStart"/>
+      <w:r>
+        <w:rPr>
+          <w:color w:val="000000" w:themeColor="text1"/>
+        </w:rPr>
+        <w:t>Master's</w:t>
+      </w:r>
+      <w:proofErr w:type="spellEnd"/>
+      <w:r>
+        <w:rPr>
+          <w:color w:val="000000" w:themeColor="text1"/>
+        </w:rPr>
+        <w:t xml:space="preserve"> </w:t>
+      </w:r>
+      <w:proofErr w:type="spellStart"/>
+      <w:r>
+        <w:rPr>
+          <w:color w:val="000000" w:themeColor="text1"/>
+        </w:rPr>
+        <w:t>thesis</w:t>
+      </w:r>
+      <w:proofErr w:type="spellEnd"/>
+      <w:r>
+        <w:rPr>
+          <w:color w:val="000000" w:themeColor="text1"/>
+        </w:rPr>
+        <w:t>, Universidade NOVA de Lisboa (Portugal)).</w:t>
+      </w:r>
+    </w:p>
+    <w:p>
+      <w:pPr>
+        <w:rPr>
+          <w:color w:val="000000" w:themeColor="text1"/>
+        </w:rPr>
+      </w:pPr>
+      <w:r>
+        <w:rPr>
+          <w:color w:val="000000" w:themeColor="text1"/>
+        </w:rPr>
+        <w:t>Campos, N. M. N. P. (2017). </w:t>
+      </w:r>
+      <w:r>
+        <w:rPr>
+          <w:i/>
+          <w:iCs/>
+          <w:color w:val="000000" w:themeColor="text1"/>
+        </w:rPr>
+        <w:t>Porto de Sines–Estudo do Modelo de Ordenamento</w:t>
+      </w:r>
+      <w:r>
+        <w:rPr>
+          <w:color w:val="000000" w:themeColor="text1"/>
+        </w:rPr>
+        <w:t> (</w:t>
+      </w:r>
+      <w:proofErr w:type="spellStart"/>
+      <w:r>
+        <w:rPr>
+          <w:color w:val="000000" w:themeColor="text1"/>
+        </w:rPr>
+        <w:t>Master's</w:t>
+      </w:r>
+      <w:proofErr w:type="spellEnd"/>
+      <w:r>
+        <w:rPr>
+          <w:color w:val="000000" w:themeColor="text1"/>
+        </w:rPr>
+        <w:t xml:space="preserve"> </w:t>
+      </w:r>
+      <w:proofErr w:type="spellStart"/>
+      <w:r>
+        <w:rPr>
+          <w:color w:val="000000" w:themeColor="text1"/>
+        </w:rPr>
+        <w:t>thesis</w:t>
+      </w:r>
+      <w:proofErr w:type="spellEnd"/>
+      <w:r>
+        <w:rPr>
+          <w:color w:val="000000" w:themeColor="text1"/>
+        </w:rPr>
+        <w:t>, Universidade NOVA de Lisboa (Portugal)).</w:t>
+      </w:r>
+    </w:p>
+    <w:p>
+      <w:pPr>
+        <w:rPr>
+          <w:color w:val="000000" w:themeColor="text1"/>
+        </w:rPr>
+      </w:pPr>
+      <w:r>
+        <w:rPr>
+          <w:color w:val="000000" w:themeColor="text1"/>
+        </w:rPr>
+        <w:t>Valente, F., Dantas, J., &amp; Dominguinhos, P. (2012). Empreendedorismo e desenvolvimento regional: o caso “DNA Cascais”. </w:t>
+      </w:r>
+      <w:r>
+        <w:rPr>
+          <w:i/>
+          <w:iCs/>
+          <w:color w:val="000000" w:themeColor="text1"/>
+        </w:rPr>
+        <w:t>COMISSÃO ORGANIZADORA</w:t>
+      </w:r>
+      <w:r>
+        <w:rPr>
+          <w:color w:val="000000" w:themeColor="text1"/>
+        </w:rPr>
+        <w:t>, 6.</w:t>
+      </w:r>
+    </w:p>
+    <w:p>
+      <w:pPr>
         <w:jc w:val="left"/>
         <w:rPr>
           <w:rFonts w:eastAsia="Arial Narrow"/>
         </w:rPr>
       </w:pPr>
-      <w:bookmarkStart w:id="40" w:name="_Toc471979357"/>
       <w:r>
         <w:rPr>
           <w:rFonts w:eastAsia="Arial Narrow"/>
@@ -16257,6 +17577,95 @@
     </w:lvl>
   </w:abstractNum>
   <w:abstractNum w:abstractNumId="10" w15:restartNumberingAfterBreak="0">
+    <w:nsid w:val="18047AD7"/>
+    <w:multiLevelType w:val="hybridMultilevel"/>
+    <w:tmpl w:val="06DECCF8"/>
+    <w:lvl w:ilvl="0" w:tplc="0816000F">
+      <w:start w:val="1"/>
+      <w:numFmt w:val="decimal"/>
+      <w:lvlText w:val="%1."/>
+      <w:lvlJc w:val="left"/>
+      <w:pPr>
+        <w:ind w:left="720" w:hanging="360"/>
+      </w:pPr>
+      <w:rPr>
+        <w:rFonts w:hint="default"/>
+      </w:rPr>
+    </w:lvl>
+    <w:lvl w:ilvl="1" w:tplc="08160019" w:tentative="1">
+      <w:start w:val="1"/>
+      <w:numFmt w:val="lowerLetter"/>
+      <w:lvlText w:val="%2."/>
+      <w:lvlJc w:val="left"/>
+      <w:pPr>
+        <w:ind w:left="1440" w:hanging="360"/>
+      </w:pPr>
+    </w:lvl>
+    <w:lvl w:ilvl="2" w:tplc="0816001B" w:tentative="1">
+      <w:start w:val="1"/>
+      <w:numFmt w:val="lowerRoman"/>
+      <w:lvlText w:val="%3."/>
+      <w:lvlJc w:val="right"/>
+      <w:pPr>
+        <w:ind w:left="2160" w:hanging="180"/>
+      </w:pPr>
+    </w:lvl>
+    <w:lvl w:ilvl="3" w:tplc="0816000F" w:tentative="1">
+      <w:start w:val="1"/>
+      <w:numFmt w:val="decimal"/>
+      <w:lvlText w:val="%4."/>
+      <w:lvlJc w:val="left"/>
+      <w:pPr>
+        <w:ind w:left="2880" w:hanging="360"/>
+      </w:pPr>
+    </w:lvl>
+    <w:lvl w:ilvl="4" w:tplc="08160019" w:tentative="1">
+      <w:start w:val="1"/>
+      <w:numFmt w:val="lowerLetter"/>
+      <w:lvlText w:val="%5."/>
+      <w:lvlJc w:val="left"/>
+      <w:pPr>
+        <w:ind w:left="3600" w:hanging="360"/>
+      </w:pPr>
+    </w:lvl>
+    <w:lvl w:ilvl="5" w:tplc="0816001B" w:tentative="1">
+      <w:start w:val="1"/>
+      <w:numFmt w:val="lowerRoman"/>
+      <w:lvlText w:val="%6."/>
+      <w:lvlJc w:val="right"/>
+      <w:pPr>
+        <w:ind w:left="4320" w:hanging="180"/>
+      </w:pPr>
+    </w:lvl>
+    <w:lvl w:ilvl="6" w:tplc="0816000F" w:tentative="1">
+      <w:start w:val="1"/>
+      <w:numFmt w:val="decimal"/>
+      <w:lvlText w:val="%7."/>
+      <w:lvlJc w:val="left"/>
+      <w:pPr>
+        <w:ind w:left="5040" w:hanging="360"/>
+      </w:pPr>
+    </w:lvl>
+    <w:lvl w:ilvl="7" w:tplc="08160019" w:tentative="1">
+      <w:start w:val="1"/>
+      <w:numFmt w:val="lowerLetter"/>
+      <w:lvlText w:val="%8."/>
+      <w:lvlJc w:val="left"/>
+      <w:pPr>
+        <w:ind w:left="5760" w:hanging="360"/>
+      </w:pPr>
+    </w:lvl>
+    <w:lvl w:ilvl="8" w:tplc="0816001B" w:tentative="1">
+      <w:start w:val="1"/>
+      <w:numFmt w:val="lowerRoman"/>
+      <w:lvlText w:val="%9."/>
+      <w:lvlJc w:val="right"/>
+      <w:pPr>
+        <w:ind w:left="6480" w:hanging="180"/>
+      </w:pPr>
+    </w:lvl>
+  </w:abstractNum>
+  <w:abstractNum w:abstractNumId="11" w15:restartNumberingAfterBreak="0">
     <w:nsid w:val="19A7627E"/>
     <w:multiLevelType w:val="hybridMultilevel"/>
     <w:tmpl w:val="5B7E7C72"/>
@@ -16345,7 +17754,7 @@
       </w:pPr>
     </w:lvl>
   </w:abstractNum>
-  <w:abstractNum w:abstractNumId="11" w15:restartNumberingAfterBreak="0">
+  <w:abstractNum w:abstractNumId="12" w15:restartNumberingAfterBreak="0">
     <w:nsid w:val="1B774F78"/>
     <w:multiLevelType w:val="multilevel"/>
     <w:tmpl w:val="E39459FC"/>
@@ -16494,7 +17903,7 @@
       </w:rPr>
     </w:lvl>
   </w:abstractNum>
-  <w:abstractNum w:abstractNumId="12" w15:restartNumberingAfterBreak="0">
+  <w:abstractNum w:abstractNumId="13" w15:restartNumberingAfterBreak="0">
     <w:nsid w:val="1BF661E8"/>
     <w:multiLevelType w:val="multilevel"/>
     <w:tmpl w:val="73FCEB28"/>
@@ -16611,7 +18020,7 @@
       </w:pPr>
     </w:lvl>
   </w:abstractNum>
-  <w:abstractNum w:abstractNumId="13" w15:restartNumberingAfterBreak="0">
+  <w:abstractNum w:abstractNumId="14" w15:restartNumberingAfterBreak="0">
     <w:nsid w:val="1C701CDC"/>
     <w:multiLevelType w:val="multilevel"/>
     <w:tmpl w:val="BF664D56"/>
@@ -16760,7 +18169,7 @@
       </w:rPr>
     </w:lvl>
   </w:abstractNum>
-  <w:abstractNum w:abstractNumId="14" w15:restartNumberingAfterBreak="0">
+  <w:abstractNum w:abstractNumId="15" w15:restartNumberingAfterBreak="0">
     <w:nsid w:val="1C760E56"/>
     <w:multiLevelType w:val="multilevel"/>
     <w:tmpl w:val="56E871D8"/>
@@ -16909,7 +18318,7 @@
       </w:rPr>
     </w:lvl>
   </w:abstractNum>
-  <w:abstractNum w:abstractNumId="15" w15:restartNumberingAfterBreak="0">
+  <w:abstractNum w:abstractNumId="16" w15:restartNumberingAfterBreak="0">
     <w:nsid w:val="20324A89"/>
     <w:multiLevelType w:val="multilevel"/>
     <w:tmpl w:val="407E8344"/>
@@ -17058,7 +18467,7 @@
       </w:rPr>
     </w:lvl>
   </w:abstractNum>
-  <w:abstractNum w:abstractNumId="16" w15:restartNumberingAfterBreak="0">
+  <w:abstractNum w:abstractNumId="17" w15:restartNumberingAfterBreak="0">
     <w:nsid w:val="226A0563"/>
     <w:multiLevelType w:val="hybridMultilevel"/>
     <w:tmpl w:val="102853FE"/>
@@ -17147,7 +18556,7 @@
       </w:pPr>
     </w:lvl>
   </w:abstractNum>
-  <w:abstractNum w:abstractNumId="17" w15:restartNumberingAfterBreak="0">
+  <w:abstractNum w:abstractNumId="18" w15:restartNumberingAfterBreak="0">
     <w:nsid w:val="2357798F"/>
     <w:multiLevelType w:val="hybridMultilevel"/>
     <w:tmpl w:val="71BCB9D2"/>
@@ -17260,7 +18669,7 @@
       </w:rPr>
     </w:lvl>
   </w:abstractNum>
-  <w:abstractNum w:abstractNumId="18" w15:restartNumberingAfterBreak="0">
+  <w:abstractNum w:abstractNumId="19" w15:restartNumberingAfterBreak="0">
     <w:nsid w:val="239A0739"/>
     <w:multiLevelType w:val="hybridMultilevel"/>
     <w:tmpl w:val="848092E0"/>
@@ -17373,7 +18782,7 @@
       </w:rPr>
     </w:lvl>
   </w:abstractNum>
-  <w:abstractNum w:abstractNumId="19" w15:restartNumberingAfterBreak="0">
+  <w:abstractNum w:abstractNumId="20" w15:restartNumberingAfterBreak="0">
     <w:nsid w:val="24E52E79"/>
     <w:multiLevelType w:val="multilevel"/>
     <w:tmpl w:val="04DCB64E"/>
@@ -17490,7 +18899,7 @@
       </w:pPr>
     </w:lvl>
   </w:abstractNum>
-  <w:abstractNum w:abstractNumId="20" w15:restartNumberingAfterBreak="0">
+  <w:abstractNum w:abstractNumId="21" w15:restartNumberingAfterBreak="0">
     <w:nsid w:val="26A2452C"/>
     <w:multiLevelType w:val="multilevel"/>
     <w:tmpl w:val="E0B6682A"/>
@@ -17639,7 +19048,7 @@
       </w:rPr>
     </w:lvl>
   </w:abstractNum>
-  <w:abstractNum w:abstractNumId="21" w15:restartNumberingAfterBreak="0">
+  <w:abstractNum w:abstractNumId="22" w15:restartNumberingAfterBreak="0">
     <w:nsid w:val="28230EA0"/>
     <w:multiLevelType w:val="multilevel"/>
     <w:tmpl w:val="7F5674C6"/>
@@ -17788,7 +19197,7 @@
       </w:rPr>
     </w:lvl>
   </w:abstractNum>
-  <w:abstractNum w:abstractNumId="22" w15:restartNumberingAfterBreak="0">
+  <w:abstractNum w:abstractNumId="23" w15:restartNumberingAfterBreak="0">
     <w:nsid w:val="28BA21AB"/>
     <w:multiLevelType w:val="multilevel"/>
     <w:tmpl w:val="C8FE7724"/>
@@ -17937,7 +19346,7 @@
       </w:rPr>
     </w:lvl>
   </w:abstractNum>
-  <w:abstractNum w:abstractNumId="23" w15:restartNumberingAfterBreak="0">
+  <w:abstractNum w:abstractNumId="24" w15:restartNumberingAfterBreak="0">
     <w:nsid w:val="294F78E2"/>
     <w:multiLevelType w:val="multilevel"/>
     <w:tmpl w:val="847AAE6E"/>
@@ -18086,7 +19495,7 @@
       </w:rPr>
     </w:lvl>
   </w:abstractNum>
-  <w:abstractNum w:abstractNumId="24" w15:restartNumberingAfterBreak="0">
+  <w:abstractNum w:abstractNumId="25" w15:restartNumberingAfterBreak="0">
     <w:nsid w:val="2A123E71"/>
     <w:multiLevelType w:val="multilevel"/>
     <w:tmpl w:val="7F9E537E"/>
@@ -18235,7 +19644,7 @@
       </w:rPr>
     </w:lvl>
   </w:abstractNum>
-  <w:abstractNum w:abstractNumId="25" w15:restartNumberingAfterBreak="0">
+  <w:abstractNum w:abstractNumId="26" w15:restartNumberingAfterBreak="0">
     <w:nsid w:val="2AAD7410"/>
     <w:multiLevelType w:val="multilevel"/>
     <w:tmpl w:val="BA386AE0"/>
@@ -18384,7 +19793,7 @@
       </w:rPr>
     </w:lvl>
   </w:abstractNum>
-  <w:abstractNum w:abstractNumId="26" w15:restartNumberingAfterBreak="0">
+  <w:abstractNum w:abstractNumId="27" w15:restartNumberingAfterBreak="0">
     <w:nsid w:val="2AFF22B0"/>
     <w:multiLevelType w:val="multilevel"/>
     <w:tmpl w:val="CB1EF420"/>
@@ -18533,7 +19942,7 @@
       </w:rPr>
     </w:lvl>
   </w:abstractNum>
-  <w:abstractNum w:abstractNumId="27" w15:restartNumberingAfterBreak="0">
+  <w:abstractNum w:abstractNumId="28" w15:restartNumberingAfterBreak="0">
     <w:nsid w:val="2B7C647E"/>
     <w:multiLevelType w:val="multilevel"/>
     <w:tmpl w:val="18AE20AC"/>
@@ -18682,7 +20091,7 @@
       </w:rPr>
     </w:lvl>
   </w:abstractNum>
-  <w:abstractNum w:abstractNumId="28" w15:restartNumberingAfterBreak="0">
+  <w:abstractNum w:abstractNumId="29" w15:restartNumberingAfterBreak="0">
     <w:nsid w:val="2C1851B1"/>
     <w:multiLevelType w:val="multilevel"/>
     <w:tmpl w:val="998AC6CE"/>
@@ -18831,7 +20240,7 @@
       </w:rPr>
     </w:lvl>
   </w:abstractNum>
-  <w:abstractNum w:abstractNumId="29" w15:restartNumberingAfterBreak="0">
+  <w:abstractNum w:abstractNumId="30" w15:restartNumberingAfterBreak="0">
     <w:nsid w:val="2C45119C"/>
     <w:multiLevelType w:val="multilevel"/>
     <w:tmpl w:val="5D68D430"/>
@@ -18980,7 +20389,7 @@
       </w:rPr>
     </w:lvl>
   </w:abstractNum>
-  <w:abstractNum w:abstractNumId="30" w15:restartNumberingAfterBreak="0">
+  <w:abstractNum w:abstractNumId="31" w15:restartNumberingAfterBreak="0">
     <w:nsid w:val="2F503F09"/>
     <w:multiLevelType w:val="hybridMultilevel"/>
     <w:tmpl w:val="05341264"/>
@@ -19093,7 +20502,7 @@
       </w:rPr>
     </w:lvl>
   </w:abstractNum>
-  <w:abstractNum w:abstractNumId="31" w15:restartNumberingAfterBreak="0">
+  <w:abstractNum w:abstractNumId="32" w15:restartNumberingAfterBreak="0">
     <w:nsid w:val="30F552F9"/>
     <w:multiLevelType w:val="hybridMultilevel"/>
     <w:tmpl w:val="AE4C47A8"/>
@@ -19206,7 +20615,7 @@
       </w:rPr>
     </w:lvl>
   </w:abstractNum>
-  <w:abstractNum w:abstractNumId="32" w15:restartNumberingAfterBreak="0">
+  <w:abstractNum w:abstractNumId="33" w15:restartNumberingAfterBreak="0">
     <w:nsid w:val="35C756A4"/>
     <w:multiLevelType w:val="multilevel"/>
     <w:tmpl w:val="429CC0BC"/>
@@ -19355,7 +20764,7 @@
       </w:rPr>
     </w:lvl>
   </w:abstractNum>
-  <w:abstractNum w:abstractNumId="33" w15:restartNumberingAfterBreak="0">
+  <w:abstractNum w:abstractNumId="34" w15:restartNumberingAfterBreak="0">
     <w:nsid w:val="370E45D4"/>
     <w:multiLevelType w:val="hybridMultilevel"/>
     <w:tmpl w:val="5334627C"/>
@@ -19468,7 +20877,7 @@
       </w:rPr>
     </w:lvl>
   </w:abstractNum>
-  <w:abstractNum w:abstractNumId="34" w15:restartNumberingAfterBreak="0">
+  <w:abstractNum w:abstractNumId="35" w15:restartNumberingAfterBreak="0">
     <w:nsid w:val="37172DEC"/>
     <w:multiLevelType w:val="multilevel"/>
     <w:tmpl w:val="F7FE9192"/>
@@ -19617,7 +21026,7 @@
       </w:rPr>
     </w:lvl>
   </w:abstractNum>
-  <w:abstractNum w:abstractNumId="35" w15:restartNumberingAfterBreak="0">
+  <w:abstractNum w:abstractNumId="36" w15:restartNumberingAfterBreak="0">
     <w:nsid w:val="391641E2"/>
     <w:multiLevelType w:val="hybridMultilevel"/>
     <w:tmpl w:val="76343DA4"/>
@@ -19730,7 +21139,7 @@
       </w:rPr>
     </w:lvl>
   </w:abstractNum>
-  <w:abstractNum w:abstractNumId="36" w15:restartNumberingAfterBreak="0">
+  <w:abstractNum w:abstractNumId="37" w15:restartNumberingAfterBreak="0">
     <w:nsid w:val="3E2D17E0"/>
     <w:multiLevelType w:val="multilevel"/>
     <w:tmpl w:val="30C0BB3E"/>
@@ -19879,7 +21288,7 @@
       </w:rPr>
     </w:lvl>
   </w:abstractNum>
-  <w:abstractNum w:abstractNumId="37" w15:restartNumberingAfterBreak="0">
+  <w:abstractNum w:abstractNumId="38" w15:restartNumberingAfterBreak="0">
     <w:nsid w:val="3EDE0F83"/>
     <w:multiLevelType w:val="multilevel"/>
     <w:tmpl w:val="8C16B850"/>
@@ -20028,7 +21437,7 @@
       </w:rPr>
     </w:lvl>
   </w:abstractNum>
-  <w:abstractNum w:abstractNumId="38" w15:restartNumberingAfterBreak="0">
+  <w:abstractNum w:abstractNumId="39" w15:restartNumberingAfterBreak="0">
     <w:nsid w:val="3F29463D"/>
     <w:multiLevelType w:val="hybridMultilevel"/>
     <w:tmpl w:val="CF0A6EBC"/>
@@ -20141,7 +21550,7 @@
       </w:rPr>
     </w:lvl>
   </w:abstractNum>
-  <w:abstractNum w:abstractNumId="39" w15:restartNumberingAfterBreak="0">
+  <w:abstractNum w:abstractNumId="40" w15:restartNumberingAfterBreak="0">
     <w:nsid w:val="4119155F"/>
     <w:multiLevelType w:val="multilevel"/>
     <w:tmpl w:val="3612C0B8"/>
@@ -20290,7 +21699,7 @@
       </w:rPr>
     </w:lvl>
   </w:abstractNum>
-  <w:abstractNum w:abstractNumId="40" w15:restartNumberingAfterBreak="0">
+  <w:abstractNum w:abstractNumId="41" w15:restartNumberingAfterBreak="0">
     <w:nsid w:val="41DB38A3"/>
     <w:multiLevelType w:val="hybridMultilevel"/>
     <w:tmpl w:val="F5F8D66A"/>
@@ -20403,7 +21812,7 @@
       </w:rPr>
     </w:lvl>
   </w:abstractNum>
-  <w:abstractNum w:abstractNumId="41" w15:restartNumberingAfterBreak="0">
+  <w:abstractNum w:abstractNumId="42" w15:restartNumberingAfterBreak="0">
     <w:nsid w:val="44CF0B65"/>
     <w:multiLevelType w:val="multilevel"/>
     <w:tmpl w:val="8D4C1900"/>
@@ -20552,7 +21961,7 @@
       </w:rPr>
     </w:lvl>
   </w:abstractNum>
-  <w:abstractNum w:abstractNumId="42" w15:restartNumberingAfterBreak="0">
+  <w:abstractNum w:abstractNumId="43" w15:restartNumberingAfterBreak="0">
     <w:nsid w:val="453371E5"/>
     <w:multiLevelType w:val="multilevel"/>
     <w:tmpl w:val="50043574"/>
@@ -20701,7 +22110,7 @@
       </w:rPr>
     </w:lvl>
   </w:abstractNum>
-  <w:abstractNum w:abstractNumId="43" w15:restartNumberingAfterBreak="0">
+  <w:abstractNum w:abstractNumId="44" w15:restartNumberingAfterBreak="0">
     <w:nsid w:val="47111BEA"/>
     <w:multiLevelType w:val="hybridMultilevel"/>
     <w:tmpl w:val="30CA0606"/>
@@ -20814,7 +22223,7 @@
       </w:rPr>
     </w:lvl>
   </w:abstractNum>
-  <w:abstractNum w:abstractNumId="44" w15:restartNumberingAfterBreak="0">
+  <w:abstractNum w:abstractNumId="45" w15:restartNumberingAfterBreak="0">
     <w:nsid w:val="47541B22"/>
     <w:multiLevelType w:val="multilevel"/>
     <w:tmpl w:val="BA2E0D68"/>
@@ -20943,7 +22352,7 @@
       </w:rPr>
     </w:lvl>
   </w:abstractNum>
-  <w:abstractNum w:abstractNumId="45" w15:restartNumberingAfterBreak="0">
+  <w:abstractNum w:abstractNumId="46" w15:restartNumberingAfterBreak="0">
     <w:nsid w:val="47DF0596"/>
     <w:multiLevelType w:val="hybridMultilevel"/>
     <w:tmpl w:val="00B219E8"/>
@@ -21056,7 +22465,7 @@
       </w:rPr>
     </w:lvl>
   </w:abstractNum>
-  <w:abstractNum w:abstractNumId="46" w15:restartNumberingAfterBreak="0">
+  <w:abstractNum w:abstractNumId="47" w15:restartNumberingAfterBreak="0">
     <w:nsid w:val="4A3D54BD"/>
     <w:multiLevelType w:val="hybridMultilevel"/>
     <w:tmpl w:val="618C97E0"/>
@@ -21169,7 +22578,7 @@
       </w:rPr>
     </w:lvl>
   </w:abstractNum>
-  <w:abstractNum w:abstractNumId="47" w15:restartNumberingAfterBreak="0">
+  <w:abstractNum w:abstractNumId="48" w15:restartNumberingAfterBreak="0">
     <w:nsid w:val="4B1821A8"/>
     <w:multiLevelType w:val="multilevel"/>
     <w:tmpl w:val="9F089724"/>
@@ -21318,7 +22727,7 @@
       </w:rPr>
     </w:lvl>
   </w:abstractNum>
-  <w:abstractNum w:abstractNumId="48" w15:restartNumberingAfterBreak="0">
+  <w:abstractNum w:abstractNumId="49" w15:restartNumberingAfterBreak="0">
     <w:nsid w:val="4D7F5014"/>
     <w:multiLevelType w:val="multilevel"/>
     <w:tmpl w:val="8A845BCE"/>
@@ -21467,7 +22876,7 @@
       </w:rPr>
     </w:lvl>
   </w:abstractNum>
-  <w:abstractNum w:abstractNumId="49" w15:restartNumberingAfterBreak="0">
+  <w:abstractNum w:abstractNumId="50" w15:restartNumberingAfterBreak="0">
     <w:nsid w:val="4FA403AB"/>
     <w:multiLevelType w:val="multilevel"/>
     <w:tmpl w:val="BFFCB63C"/>
@@ -21580,7 +22989,7 @@
       </w:pPr>
     </w:lvl>
   </w:abstractNum>
-  <w:abstractNum w:abstractNumId="50" w15:restartNumberingAfterBreak="0">
+  <w:abstractNum w:abstractNumId="51" w15:restartNumberingAfterBreak="0">
     <w:nsid w:val="506157B0"/>
     <w:multiLevelType w:val="multilevel"/>
     <w:tmpl w:val="7B0620D2"/>
@@ -21693,7 +23102,7 @@
       </w:pPr>
     </w:lvl>
   </w:abstractNum>
-  <w:abstractNum w:abstractNumId="51" w15:restartNumberingAfterBreak="0">
+  <w:abstractNum w:abstractNumId="52" w15:restartNumberingAfterBreak="0">
     <w:nsid w:val="562051D5"/>
     <w:multiLevelType w:val="hybridMultilevel"/>
     <w:tmpl w:val="5E8A59FE"/>
@@ -21806,7 +23215,7 @@
       </w:rPr>
     </w:lvl>
   </w:abstractNum>
-  <w:abstractNum w:abstractNumId="52" w15:restartNumberingAfterBreak="0">
+  <w:abstractNum w:abstractNumId="53" w15:restartNumberingAfterBreak="0">
     <w:nsid w:val="56820DB3"/>
     <w:multiLevelType w:val="hybridMultilevel"/>
     <w:tmpl w:val="45F64BB2"/>
@@ -21920,7 +23329,7 @@
       </w:pPr>
     </w:lvl>
   </w:abstractNum>
-  <w:abstractNum w:abstractNumId="53" w15:restartNumberingAfterBreak="0">
+  <w:abstractNum w:abstractNumId="54" w15:restartNumberingAfterBreak="0">
     <w:nsid w:val="56FC531A"/>
     <w:multiLevelType w:val="multilevel"/>
     <w:tmpl w:val="B70610DE"/>
@@ -22069,7 +23478,7 @@
       </w:rPr>
     </w:lvl>
   </w:abstractNum>
-  <w:abstractNum w:abstractNumId="54" w15:restartNumberingAfterBreak="0">
+  <w:abstractNum w:abstractNumId="55" w15:restartNumberingAfterBreak="0">
     <w:nsid w:val="646413DA"/>
     <w:multiLevelType w:val="multilevel"/>
     <w:tmpl w:val="7C78ABDA"/>
@@ -22182,7 +23591,7 @@
       </w:pPr>
     </w:lvl>
   </w:abstractNum>
-  <w:abstractNum w:abstractNumId="55" w15:restartNumberingAfterBreak="0">
+  <w:abstractNum w:abstractNumId="56" w15:restartNumberingAfterBreak="0">
     <w:nsid w:val="6787791A"/>
     <w:multiLevelType w:val="multilevel"/>
     <w:tmpl w:val="4E72DF3E"/>
@@ -22271,7 +23680,7 @@
       </w:pPr>
     </w:lvl>
   </w:abstractNum>
-  <w:abstractNum w:abstractNumId="56" w15:restartNumberingAfterBreak="0">
+  <w:abstractNum w:abstractNumId="57" w15:restartNumberingAfterBreak="0">
     <w:nsid w:val="680E395B"/>
     <w:multiLevelType w:val="multilevel"/>
     <w:tmpl w:val="24A636AC"/>
@@ -22420,7 +23829,7 @@
       </w:rPr>
     </w:lvl>
   </w:abstractNum>
-  <w:abstractNum w:abstractNumId="57" w15:restartNumberingAfterBreak="0">
+  <w:abstractNum w:abstractNumId="58" w15:restartNumberingAfterBreak="0">
     <w:nsid w:val="69110CB2"/>
     <w:multiLevelType w:val="hybridMultilevel"/>
     <w:tmpl w:val="50428718"/>
@@ -22533,7 +23942,7 @@
       </w:rPr>
     </w:lvl>
   </w:abstractNum>
-  <w:abstractNum w:abstractNumId="58" w15:restartNumberingAfterBreak="0">
+  <w:abstractNum w:abstractNumId="59" w15:restartNumberingAfterBreak="0">
     <w:nsid w:val="6A2567C9"/>
     <w:multiLevelType w:val="multilevel"/>
     <w:tmpl w:val="91AAA5DE"/>
@@ -22682,7 +24091,7 @@
       </w:rPr>
     </w:lvl>
   </w:abstractNum>
-  <w:abstractNum w:abstractNumId="59" w15:restartNumberingAfterBreak="0">
+  <w:abstractNum w:abstractNumId="60" w15:restartNumberingAfterBreak="0">
     <w:nsid w:val="6AF0433C"/>
     <w:multiLevelType w:val="hybridMultilevel"/>
     <w:tmpl w:val="3864D0DE"/>
@@ -22795,7 +24204,7 @@
       </w:rPr>
     </w:lvl>
   </w:abstractNum>
-  <w:abstractNum w:abstractNumId="60" w15:restartNumberingAfterBreak="0">
+  <w:abstractNum w:abstractNumId="61" w15:restartNumberingAfterBreak="0">
     <w:nsid w:val="6EB97BEE"/>
     <w:multiLevelType w:val="multilevel"/>
     <w:tmpl w:val="6310D4FC"/>
@@ -22944,7 +24353,7 @@
       </w:rPr>
     </w:lvl>
   </w:abstractNum>
-  <w:abstractNum w:abstractNumId="61" w15:restartNumberingAfterBreak="0">
+  <w:abstractNum w:abstractNumId="62" w15:restartNumberingAfterBreak="0">
     <w:nsid w:val="6EED3BBE"/>
     <w:multiLevelType w:val="multilevel"/>
     <w:tmpl w:val="44F01A2E"/>
@@ -23093,7 +24502,7 @@
       </w:rPr>
     </w:lvl>
   </w:abstractNum>
-  <w:abstractNum w:abstractNumId="62" w15:restartNumberingAfterBreak="0">
+  <w:abstractNum w:abstractNumId="63" w15:restartNumberingAfterBreak="0">
     <w:nsid w:val="74A110AB"/>
     <w:multiLevelType w:val="multilevel"/>
     <w:tmpl w:val="6B507A62"/>
@@ -23242,7 +24651,7 @@
       </w:rPr>
     </w:lvl>
   </w:abstractNum>
-  <w:abstractNum w:abstractNumId="63" w15:restartNumberingAfterBreak="0">
+  <w:abstractNum w:abstractNumId="64" w15:restartNumberingAfterBreak="0">
     <w:nsid w:val="77345C75"/>
     <w:multiLevelType w:val="hybridMultilevel"/>
     <w:tmpl w:val="BB7AAD66"/>
@@ -23355,7 +24764,7 @@
       </w:rPr>
     </w:lvl>
   </w:abstractNum>
-  <w:abstractNum w:abstractNumId="64" w15:restartNumberingAfterBreak="0">
+  <w:abstractNum w:abstractNumId="65" w15:restartNumberingAfterBreak="0">
     <w:nsid w:val="77B7015D"/>
     <w:multiLevelType w:val="multilevel"/>
     <w:tmpl w:val="FF286090"/>
@@ -23468,7 +24877,7 @@
       </w:pPr>
     </w:lvl>
   </w:abstractNum>
-  <w:abstractNum w:abstractNumId="65" w15:restartNumberingAfterBreak="0">
+  <w:abstractNum w:abstractNumId="66" w15:restartNumberingAfterBreak="0">
     <w:nsid w:val="77C9212A"/>
     <w:multiLevelType w:val="multilevel"/>
     <w:tmpl w:val="F89884D6"/>
@@ -23617,7 +25026,120 @@
       </w:rPr>
     </w:lvl>
   </w:abstractNum>
-  <w:abstractNum w:abstractNumId="66" w15:restartNumberingAfterBreak="0">
+  <w:abstractNum w:abstractNumId="67" w15:restartNumberingAfterBreak="0">
+    <w:nsid w:val="78E82C8B"/>
+    <w:multiLevelType w:val="hybridMultilevel"/>
+    <w:tmpl w:val="8746EFB6"/>
+    <w:lvl w:ilvl="0" w:tplc="08160001">
+      <w:start w:val="1"/>
+      <w:numFmt w:val="bullet"/>
+      <w:lvlText w:val=""/>
+      <w:lvlJc w:val="left"/>
+      <w:pPr>
+        <w:ind w:left="720" w:hanging="360"/>
+      </w:pPr>
+      <w:rPr>
+        <w:rFonts w:ascii="Symbol" w:hAnsi="Symbol" w:hint="default"/>
+      </w:rPr>
+    </w:lvl>
+    <w:lvl w:ilvl="1" w:tplc="08160003" w:tentative="1">
+      <w:start w:val="1"/>
+      <w:numFmt w:val="bullet"/>
+      <w:lvlText w:val="o"/>
+      <w:lvlJc w:val="left"/>
+      <w:pPr>
+        <w:ind w:left="1440" w:hanging="360"/>
+      </w:pPr>
+      <w:rPr>
+        <w:rFonts w:ascii="Courier New" w:hAnsi="Courier New" w:cs="Courier New" w:hint="default"/>
+      </w:rPr>
+    </w:lvl>
+    <w:lvl w:ilvl="2" w:tplc="08160005" w:tentative="1">
+      <w:start w:val="1"/>
+      <w:numFmt w:val="bullet"/>
+      <w:lvlText w:val=""/>
+      <w:lvlJc w:val="left"/>
+      <w:pPr>
+        <w:ind w:left="2160" w:hanging="360"/>
+      </w:pPr>
+      <w:rPr>
+        <w:rFonts w:ascii="Wingdings" w:hAnsi="Wingdings" w:hint="default"/>
+      </w:rPr>
+    </w:lvl>
+    <w:lvl w:ilvl="3" w:tplc="08160001" w:tentative="1">
+      <w:start w:val="1"/>
+      <w:numFmt w:val="bullet"/>
+      <w:lvlText w:val=""/>
+      <w:lvlJc w:val="left"/>
+      <w:pPr>
+        <w:ind w:left="2880" w:hanging="360"/>
+      </w:pPr>
+      <w:rPr>
+        <w:rFonts w:ascii="Symbol" w:hAnsi="Symbol" w:hint="default"/>
+      </w:rPr>
+    </w:lvl>
+    <w:lvl w:ilvl="4" w:tplc="08160003" w:tentative="1">
+      <w:start w:val="1"/>
+      <w:numFmt w:val="bullet"/>
+      <w:lvlText w:val="o"/>
+      <w:lvlJc w:val="left"/>
+      <w:pPr>
+        <w:ind w:left="3600" w:hanging="360"/>
+      </w:pPr>
+      <w:rPr>
+        <w:rFonts w:ascii="Courier New" w:hAnsi="Courier New" w:cs="Courier New" w:hint="default"/>
+      </w:rPr>
+    </w:lvl>
+    <w:lvl w:ilvl="5" w:tplc="08160005" w:tentative="1">
+      <w:start w:val="1"/>
+      <w:numFmt w:val="bullet"/>
+      <w:lvlText w:val=""/>
+      <w:lvlJc w:val="left"/>
+      <w:pPr>
+        <w:ind w:left="4320" w:hanging="360"/>
+      </w:pPr>
+      <w:rPr>
+        <w:rFonts w:ascii="Wingdings" w:hAnsi="Wingdings" w:hint="default"/>
+      </w:rPr>
+    </w:lvl>
+    <w:lvl w:ilvl="6" w:tplc="08160001" w:tentative="1">
+      <w:start w:val="1"/>
+      <w:numFmt w:val="bullet"/>
+      <w:lvlText w:val=""/>
+      <w:lvlJc w:val="left"/>
+      <w:pPr>
+        <w:ind w:left="5040" w:hanging="360"/>
+      </w:pPr>
+      <w:rPr>
+        <w:rFonts w:ascii="Symbol" w:hAnsi="Symbol" w:hint="default"/>
+      </w:rPr>
+    </w:lvl>
+    <w:lvl w:ilvl="7" w:tplc="08160003" w:tentative="1">
+      <w:start w:val="1"/>
+      <w:numFmt w:val="bullet"/>
+      <w:lvlText w:val="o"/>
+      <w:lvlJc w:val="left"/>
+      <w:pPr>
+        <w:ind w:left="5760" w:hanging="360"/>
+      </w:pPr>
+      <w:rPr>
+        <w:rFonts w:ascii="Courier New" w:hAnsi="Courier New" w:cs="Courier New" w:hint="default"/>
+      </w:rPr>
+    </w:lvl>
+    <w:lvl w:ilvl="8" w:tplc="08160005" w:tentative="1">
+      <w:start w:val="1"/>
+      <w:numFmt w:val="bullet"/>
+      <w:lvlText w:val=""/>
+      <w:lvlJc w:val="left"/>
+      <w:pPr>
+        <w:ind w:left="6480" w:hanging="360"/>
+      </w:pPr>
+      <w:rPr>
+        <w:rFonts w:ascii="Wingdings" w:hAnsi="Wingdings" w:hint="default"/>
+      </w:rPr>
+    </w:lvl>
+  </w:abstractNum>
+  <w:abstractNum w:abstractNumId="68" w15:restartNumberingAfterBreak="0">
     <w:nsid w:val="79115269"/>
     <w:multiLevelType w:val="multilevel"/>
     <w:tmpl w:val="BAEA2F18"/>
@@ -23766,7 +25288,7 @@
       </w:rPr>
     </w:lvl>
   </w:abstractNum>
-  <w:abstractNum w:abstractNumId="67" w15:restartNumberingAfterBreak="0">
+  <w:abstractNum w:abstractNumId="69" w15:restartNumberingAfterBreak="0">
     <w:nsid w:val="7BB647B6"/>
     <w:multiLevelType w:val="multilevel"/>
     <w:tmpl w:val="849E45F0"/>
@@ -23916,10 +25438,10 @@
     </w:lvl>
   </w:abstractNum>
   <w:num w:numId="1" w16cid:durableId="1307973366">
-    <w:abstractNumId w:val="52"/>
+    <w:abstractNumId w:val="53"/>
   </w:num>
   <w:num w:numId="2" w16cid:durableId="1734770271">
-    <w:abstractNumId w:val="52"/>
+    <w:abstractNumId w:val="53"/>
     <w:lvlOverride w:ilvl="0">
       <w:startOverride w:val="1"/>
     </w:lvlOverride>
@@ -23949,145 +25471,145 @@
     </w:lvlOverride>
   </w:num>
   <w:num w:numId="3" w16cid:durableId="1940985300">
-    <w:abstractNumId w:val="55"/>
+    <w:abstractNumId w:val="56"/>
   </w:num>
   <w:num w:numId="4" w16cid:durableId="97649398">
     <w:abstractNumId w:val="0"/>
   </w:num>
   <w:num w:numId="5" w16cid:durableId="1812288132">
-    <w:abstractNumId w:val="43"/>
+    <w:abstractNumId w:val="44"/>
   </w:num>
   <w:num w:numId="6" w16cid:durableId="1642464320">
-    <w:abstractNumId w:val="44"/>
+    <w:abstractNumId w:val="45"/>
   </w:num>
   <w:num w:numId="7" w16cid:durableId="1808275634">
-    <w:abstractNumId w:val="38"/>
+    <w:abstractNumId w:val="39"/>
   </w:num>
   <w:num w:numId="8" w16cid:durableId="1200897323">
-    <w:abstractNumId w:val="31"/>
+    <w:abstractNumId w:val="32"/>
   </w:num>
   <w:num w:numId="9" w16cid:durableId="1847789773">
     <w:abstractNumId w:val="5"/>
   </w:num>
   <w:num w:numId="10" w16cid:durableId="1597782777">
-    <w:abstractNumId w:val="18"/>
+    <w:abstractNumId w:val="19"/>
   </w:num>
   <w:num w:numId="11" w16cid:durableId="1585870811">
-    <w:abstractNumId w:val="51"/>
+    <w:abstractNumId w:val="52"/>
   </w:num>
   <w:num w:numId="12" w16cid:durableId="325521276">
-    <w:abstractNumId w:val="57"/>
+    <w:abstractNumId w:val="58"/>
   </w:num>
   <w:num w:numId="13" w16cid:durableId="627933182">
-    <w:abstractNumId w:val="35"/>
+    <w:abstractNumId w:val="36"/>
   </w:num>
   <w:num w:numId="14" w16cid:durableId="915015777">
     <w:abstractNumId w:val="9"/>
   </w:num>
   <w:num w:numId="15" w16cid:durableId="1285234806">
-    <w:abstractNumId w:val="33"/>
+    <w:abstractNumId w:val="34"/>
   </w:num>
   <w:num w:numId="16" w16cid:durableId="273832372">
+    <w:abstractNumId w:val="31"/>
+  </w:num>
+  <w:num w:numId="17" w16cid:durableId="1697347813">
+    <w:abstractNumId w:val="41"/>
+  </w:num>
+  <w:num w:numId="18" w16cid:durableId="1968464136">
+    <w:abstractNumId w:val="28"/>
+  </w:num>
+  <w:num w:numId="19" w16cid:durableId="400444398">
+    <w:abstractNumId w:val="23"/>
+  </w:num>
+  <w:num w:numId="20" w16cid:durableId="406536023">
+    <w:abstractNumId w:val="27"/>
+  </w:num>
+  <w:num w:numId="21" w16cid:durableId="1030881303">
+    <w:abstractNumId w:val="29"/>
+  </w:num>
+  <w:num w:numId="22" w16cid:durableId="1219239829">
+    <w:abstractNumId w:val="46"/>
+  </w:num>
+  <w:num w:numId="23" w16cid:durableId="1989554229">
     <w:abstractNumId w:val="30"/>
   </w:num>
-  <w:num w:numId="17" w16cid:durableId="1697347813">
-    <w:abstractNumId w:val="40"/>
+  <w:num w:numId="24" w16cid:durableId="881403803">
+    <w:abstractNumId w:val="25"/>
   </w:num>
-  <w:num w:numId="18" w16cid:durableId="1968464136">
-    <w:abstractNumId w:val="27"/>
-  </w:num>
-  <w:num w:numId="19" w16cid:durableId="400444398">
+  <w:num w:numId="25" w16cid:durableId="869145322">
     <w:abstractNumId w:val="22"/>
   </w:num>
-  <w:num w:numId="20" w16cid:durableId="406536023">
-    <w:abstractNumId w:val="26"/>
-  </w:num>
-  <w:num w:numId="21" w16cid:durableId="1030881303">
-    <w:abstractNumId w:val="28"/>
-  </w:num>
-  <w:num w:numId="22" w16cid:durableId="1219239829">
-    <w:abstractNumId w:val="45"/>
-  </w:num>
-  <w:num w:numId="23" w16cid:durableId="1989554229">
-    <w:abstractNumId w:val="29"/>
-  </w:num>
-  <w:num w:numId="24" w16cid:durableId="881403803">
-    <w:abstractNumId w:val="24"/>
-  </w:num>
-  <w:num w:numId="25" w16cid:durableId="869145322">
-    <w:abstractNumId w:val="21"/>
-  </w:num>
   <w:num w:numId="26" w16cid:durableId="1053118409">
-    <w:abstractNumId w:val="41"/>
+    <w:abstractNumId w:val="42"/>
   </w:num>
   <w:num w:numId="27" w16cid:durableId="677079251">
-    <w:abstractNumId w:val="13"/>
+    <w:abstractNumId w:val="14"/>
   </w:num>
   <w:num w:numId="28" w16cid:durableId="1662731740">
     <w:abstractNumId w:val="2"/>
   </w:num>
   <w:num w:numId="29" w16cid:durableId="1264415386">
-    <w:abstractNumId w:val="50"/>
+    <w:abstractNumId w:val="51"/>
   </w:num>
   <w:num w:numId="30" w16cid:durableId="1238442288">
+    <w:abstractNumId w:val="64"/>
+  </w:num>
+  <w:num w:numId="31" w16cid:durableId="1900823946">
+    <w:abstractNumId w:val="17"/>
+  </w:num>
+  <w:num w:numId="32" w16cid:durableId="1076778013">
+    <w:abstractNumId w:val="11"/>
+  </w:num>
+  <w:num w:numId="33" w16cid:durableId="1331715260">
     <w:abstractNumId w:val="63"/>
   </w:num>
-  <w:num w:numId="31" w16cid:durableId="1900823946">
+  <w:num w:numId="34" w16cid:durableId="199317269">
+    <w:abstractNumId w:val="43"/>
+  </w:num>
+  <w:num w:numId="35" w16cid:durableId="803740452">
+    <w:abstractNumId w:val="69"/>
+  </w:num>
+  <w:num w:numId="36" w16cid:durableId="817266422">
     <w:abstractNumId w:val="16"/>
   </w:num>
-  <w:num w:numId="32" w16cid:durableId="1076778013">
-    <w:abstractNumId w:val="10"/>
-  </w:num>
-  <w:num w:numId="33" w16cid:durableId="1331715260">
-    <w:abstractNumId w:val="62"/>
-  </w:num>
-  <w:num w:numId="34" w16cid:durableId="199317269">
-    <w:abstractNumId w:val="42"/>
-  </w:num>
-  <w:num w:numId="35" w16cid:durableId="803740452">
-    <w:abstractNumId w:val="67"/>
-  </w:num>
-  <w:num w:numId="36" w16cid:durableId="817266422">
-    <w:abstractNumId w:val="15"/>
-  </w:num>
   <w:num w:numId="37" w16cid:durableId="1125126375">
-    <w:abstractNumId w:val="53"/>
+    <w:abstractNumId w:val="54"/>
   </w:num>
   <w:num w:numId="38" w16cid:durableId="1431582945">
-    <w:abstractNumId w:val="11"/>
+    <w:abstractNumId w:val="12"/>
   </w:num>
   <w:num w:numId="39" w16cid:durableId="2001229837">
-    <w:abstractNumId w:val="47"/>
+    <w:abstractNumId w:val="48"/>
   </w:num>
   <w:num w:numId="40" w16cid:durableId="576404123">
-    <w:abstractNumId w:val="37"/>
+    <w:abstractNumId w:val="38"/>
   </w:num>
   <w:num w:numId="41" w16cid:durableId="669984504">
     <w:abstractNumId w:val="3"/>
   </w:num>
   <w:num w:numId="42" w16cid:durableId="864906958">
-    <w:abstractNumId w:val="23"/>
+    <w:abstractNumId w:val="24"/>
   </w:num>
   <w:num w:numId="43" w16cid:durableId="714306147">
-    <w:abstractNumId w:val="19"/>
+    <w:abstractNumId w:val="20"/>
   </w:num>
   <w:num w:numId="44" w16cid:durableId="1913544162">
-    <w:abstractNumId w:val="12"/>
+    <w:abstractNumId w:val="13"/>
   </w:num>
   <w:num w:numId="45" w16cid:durableId="987825131">
-    <w:abstractNumId w:val="54"/>
+    <w:abstractNumId w:val="55"/>
   </w:num>
   <w:num w:numId="46" w16cid:durableId="2029940620">
-    <w:abstractNumId w:val="64"/>
+    <w:abstractNumId w:val="65"/>
   </w:num>
   <w:num w:numId="47" w16cid:durableId="1410736754">
-    <w:abstractNumId w:val="65"/>
+    <w:abstractNumId w:val="66"/>
   </w:num>
   <w:num w:numId="48" w16cid:durableId="104931094">
-    <w:abstractNumId w:val="14"/>
+    <w:abstractNumId w:val="15"/>
   </w:num>
   <w:num w:numId="49" w16cid:durableId="150218884">
-    <w:abstractNumId w:val="34"/>
+    <w:abstractNumId w:val="35"/>
   </w:num>
   <w:num w:numId="50" w16cid:durableId="1810895858">
     <w:abstractNumId w:val="8"/>
@@ -24096,46 +25618,46 @@
     <w:abstractNumId w:val="6"/>
   </w:num>
   <w:num w:numId="52" w16cid:durableId="1887326611">
-    <w:abstractNumId w:val="39"/>
+    <w:abstractNumId w:val="40"/>
   </w:num>
   <w:num w:numId="53" w16cid:durableId="1890805139">
-    <w:abstractNumId w:val="36"/>
+    <w:abstractNumId w:val="37"/>
   </w:num>
   <w:num w:numId="54" w16cid:durableId="826701493">
     <w:abstractNumId w:val="1"/>
   </w:num>
   <w:num w:numId="55" w16cid:durableId="1076248964">
-    <w:abstractNumId w:val="48"/>
+    <w:abstractNumId w:val="49"/>
   </w:num>
   <w:num w:numId="56" w16cid:durableId="843321890">
-    <w:abstractNumId w:val="32"/>
+    <w:abstractNumId w:val="33"/>
   </w:num>
   <w:num w:numId="57" w16cid:durableId="1830321819">
+    <w:abstractNumId w:val="62"/>
+  </w:num>
+  <w:num w:numId="58" w16cid:durableId="1427768208">
+    <w:abstractNumId w:val="50"/>
+  </w:num>
+  <w:num w:numId="59" w16cid:durableId="1012489748">
     <w:abstractNumId w:val="61"/>
   </w:num>
-  <w:num w:numId="58" w16cid:durableId="1427768208">
-    <w:abstractNumId w:val="49"/>
-  </w:num>
-  <w:num w:numId="59" w16cid:durableId="1012489748">
-    <w:abstractNumId w:val="60"/>
-  </w:num>
   <w:num w:numId="60" w16cid:durableId="1778013999">
-    <w:abstractNumId w:val="58"/>
+    <w:abstractNumId w:val="59"/>
   </w:num>
   <w:num w:numId="61" w16cid:durableId="228733822">
-    <w:abstractNumId w:val="66"/>
+    <w:abstractNumId w:val="68"/>
   </w:num>
   <w:num w:numId="62" w16cid:durableId="1164710766">
-    <w:abstractNumId w:val="25"/>
+    <w:abstractNumId w:val="26"/>
   </w:num>
   <w:num w:numId="63" w16cid:durableId="1385594363">
-    <w:abstractNumId w:val="20"/>
+    <w:abstractNumId w:val="21"/>
   </w:num>
   <w:num w:numId="64" w16cid:durableId="1479104271">
-    <w:abstractNumId w:val="56"/>
+    <w:abstractNumId w:val="57"/>
   </w:num>
   <w:num w:numId="65" w16cid:durableId="583493995">
-    <w:abstractNumId w:val="59"/>
+    <w:abstractNumId w:val="60"/>
   </w:num>
   <w:num w:numId="66" w16cid:durableId="1615483936">
     <w:abstractNumId w:val="4"/>
@@ -24144,10 +25666,16 @@
     <w:abstractNumId w:val="7"/>
   </w:num>
   <w:num w:numId="68" w16cid:durableId="514611140">
-    <w:abstractNumId w:val="46"/>
+    <w:abstractNumId w:val="47"/>
   </w:num>
   <w:num w:numId="69" w16cid:durableId="1027490951">
-    <w:abstractNumId w:val="17"/>
+    <w:abstractNumId w:val="18"/>
+  </w:num>
+  <w:num w:numId="70" w16cid:durableId="1894920471">
+    <w:abstractNumId w:val="10"/>
+  </w:num>
+  <w:num w:numId="71" w16cid:durableId="1633099940">
+    <w:abstractNumId w:val="67"/>
   </w:num>
 </w:numbering>
 </file>
@@ -25501,15 +27029,6 @@
 </file>
 
 <file path=customXml/item1.xml><?xml version="1.0" encoding="utf-8"?>
-<?mso-contentType ?>
-<FormTemplates xmlns="http://schemas.microsoft.com/sharepoint/v3/contenttype/forms">
-  <Display>DocumentLibraryForm</Display>
-  <Edit>DocumentLibraryForm</Edit>
-  <New>DocumentLibraryForm</New>
-</FormTemplates>
-</file>
-
-<file path=customXml/item2.xml><?xml version="1.0" encoding="utf-8"?>
 <p:properties xmlns:p="http://schemas.microsoft.com/office/2006/metadata/properties" xmlns:xsi="http://www.w3.org/2001/XMLSchema-instance" xmlns:pc="http://schemas.microsoft.com/office/infopath/2007/PartnerControls">
   <documentManagement>
     <NotebookType xmlns="6e977478-40fc-4c96-9b59-58f9adc62218" xsi:nil="true"/>
@@ -25521,11 +27040,16 @@
 </p:properties>
 </file>
 
-<file path=customXml/item3.xml><?xml version="1.0" encoding="utf-8"?>
-<b:Sources xmlns:b="http://schemas.openxmlformats.org/officeDocument/2006/bibliography" xmlns="http://schemas.openxmlformats.org/officeDocument/2006/bibliography" SelectedStyle="\APA.XSL" StyleName="APA"/>
+<file path=customXml/item2.xml><?xml version="1.0" encoding="utf-8"?>
+<?mso-contentType ?>
+<FormTemplates xmlns="http://schemas.microsoft.com/sharepoint/v3/contenttype/forms">
+  <Display>DocumentLibraryForm</Display>
+  <Edit>DocumentLibraryForm</Edit>
+  <New>DocumentLibraryForm</New>
+</FormTemplates>
 </file>
 
-<file path=customXml/item4.xml><?xml version="1.0" encoding="utf-8"?>
+<file path=customXml/item3.xml><?xml version="1.0" encoding="utf-8"?>
 <ct:contentTypeSchema xmlns:ct="http://schemas.microsoft.com/office/2006/metadata/contentType" xmlns:ma="http://schemas.microsoft.com/office/2006/metadata/properties/metaAttributes" ct:_="" ma:_="" ma:contentTypeName="Documento" ma:contentTypeID="0x0101008F0F40A57A4B4943AE5F0D22A00E6876" ma:contentTypeVersion="7" ma:contentTypeDescription="Criar um novo documento." ma:contentTypeScope="" ma:versionID="0777f9d8bcaf4fa9f3f247f35de05543">
   <xsd:schema xmlns:xsd="http://www.w3.org/2001/XMLSchema" xmlns:xs="http://www.w3.org/2001/XMLSchema" xmlns:p="http://schemas.microsoft.com/office/2006/metadata/properties" xmlns:ns2="6e977478-40fc-4c96-9b59-58f9adc62218" targetNamespace="http://schemas.microsoft.com/office/2006/metadata/properties" ma:root="true" ma:fieldsID="6e1588d9447c950b5d06efd32159bf41" ns2:_="">
     <xsd:import namespace="6e977478-40fc-4c96-9b59-58f9adc62218"/>
@@ -25687,15 +27211,11 @@
 </ct:contentTypeSchema>
 </file>
 
-<file path=customXml/itemProps1.xml><?xml version="1.0" encoding="utf-8"?>
-<ds:datastoreItem xmlns:ds="http://schemas.openxmlformats.org/officeDocument/2006/customXml" ds:itemID="{A8BEE9C3-75AD-4607-B106-1B44B05722EA}">
-  <ds:schemaRefs>
-    <ds:schemaRef ds:uri="http://schemas.microsoft.com/sharepoint/v3/contenttype/forms"/>
-  </ds:schemaRefs>
-</ds:datastoreItem>
+<file path=customXml/item4.xml><?xml version="1.0" encoding="utf-8"?>
+<b:Sources xmlns:b="http://schemas.openxmlformats.org/officeDocument/2006/bibliography" xmlns="http://schemas.openxmlformats.org/officeDocument/2006/bibliography" SelectedStyle="\APA.XSL" StyleName="APA"/>
 </file>
 
-<file path=customXml/itemProps2.xml><?xml version="1.0" encoding="utf-8"?>
+<file path=customXml/itemProps1.xml><?xml version="1.0" encoding="utf-8"?>
 <ds:datastoreItem xmlns:ds="http://schemas.openxmlformats.org/officeDocument/2006/customXml" ds:itemID="{A02BD9CC-6025-4F76-BD90-0F1427CF0A06}">
   <ds:schemaRefs>
     <ds:schemaRef ds:uri="http://schemas.microsoft.com/office/2006/metadata/properties"/>
@@ -25705,15 +27225,15 @@
 </ds:datastoreItem>
 </file>
 
-<file path=customXml/itemProps3.xml><?xml version="1.0" encoding="utf-8"?>
-<ds:datastoreItem xmlns:ds="http://schemas.openxmlformats.org/officeDocument/2006/customXml" ds:itemID="{9C46D67E-02BF-4E37-8EF1-2391CC03D27F}">
+<file path=customXml/itemProps2.xml><?xml version="1.0" encoding="utf-8"?>
+<ds:datastoreItem xmlns:ds="http://schemas.openxmlformats.org/officeDocument/2006/customXml" ds:itemID="{A8BEE9C3-75AD-4607-B106-1B44B05722EA}">
   <ds:schemaRefs>
-    <ds:schemaRef ds:uri="http://schemas.openxmlformats.org/officeDocument/2006/bibliography"/>
+    <ds:schemaRef ds:uri="http://schemas.microsoft.com/sharepoint/v3/contenttype/forms"/>
   </ds:schemaRefs>
 </ds:datastoreItem>
 </file>
 
-<file path=customXml/itemProps4.xml><?xml version="1.0" encoding="utf-8"?>
+<file path=customXml/itemProps3.xml><?xml version="1.0" encoding="utf-8"?>
 <ds:datastoreItem xmlns:ds="http://schemas.openxmlformats.org/officeDocument/2006/customXml" ds:itemID="{F22FBF9B-697C-4384-8BA9-D9CACC814933}">
   <ds:schemaRefs>
     <ds:schemaRef ds:uri="http://schemas.microsoft.com/office/2006/metadata/contentType"/>
@@ -25729,4 +27249,12 @@
     <ds:schemaRef ds:uri="http://schemas.microsoft.com/internal/obd"/>
   </ds:schemaRefs>
 </ds:datastoreItem>
+</file>
+
+<file path=customXml/itemProps4.xml><?xml version="1.0" encoding="utf-8"?>
+<ds:datastoreItem xmlns:ds="http://schemas.openxmlformats.org/officeDocument/2006/customXml" ds:itemID="{9C46D67E-02BF-4E37-8EF1-2391CC03D27F}">
+  <ds:schemaRefs>
+    <ds:schemaRef ds:uri="http://schemas.openxmlformats.org/officeDocument/2006/bibliography"/>
+  </ds:schemaRefs>
+</ds:datastoreItem>
 </file>
</xml_diff>

<commit_message>
small changes to gesta report
</commit_message>
<xml_diff>
--- a/docs/client_analysis/report_APS.docx
+++ b/docs/client_analysis/report_APS.docx
@@ -5,6 +5,7 @@
     <w:p>
       <w:pPr>
         <w:pStyle w:val="Corpodetexto"/>
+        <w:ind w:left="720" w:hanging="180"/>
       </w:pPr>
       <w:bookmarkStart w:id="0" w:name="bkRunHead"/>
     </w:p>
@@ -80,6 +81,7 @@
     <w:p>
       <w:pPr>
         <w:pStyle w:val="Corpodetexto"/>
+        <w:ind w:left="3600" w:hanging="3060"/>
         <w:jc w:val="center"/>
       </w:pPr>
       <w:r>
@@ -3314,6 +3316,7 @@
     <w:p>
       <w:pPr>
         <w:spacing w:line="240" w:lineRule="auto"/>
+        <w:ind w:left="720" w:hanging="720"/>
         <w:jc w:val="left"/>
         <w:rPr>
           <w:rFonts w:cs="Times New Roman"/>
@@ -6775,7 +6778,7 @@
           <w:noProof/>
         </w:rPr>
         <w:drawing>
-          <wp:inline distT="0" distB="0" distL="0" distR="0" wp14:anchorId="68B4EA67" wp14:editId="501EB778">
+          <wp:inline distT="0" distB="0" distL="0" distR="0" wp14:anchorId="68B4EA67" wp14:editId="09350DFB">
             <wp:extent cx="5226685" cy="3020060"/>
             <wp:effectExtent l="19050" t="19050" r="12065" b="27940"/>
             <wp:docPr id="1965649793" name="Imagem 6" descr="Uma imagem com texto, mapa, captura de ecrã, diagrama&#10;&#10;Os conteúdos gerados por IA podem estar incorretos."/>
@@ -11297,7 +11300,30 @@
           <w:sz w:val="24"/>
           <w:szCs w:val="24"/>
         </w:rPr>
-        <w:t xml:space="preserve">APS gere a ZILS, uma </w:t>
+        <w:t>APS gere a ZILS</w:t>
+      </w:r>
+      <w:r>
+        <w:rPr>
+          <w:rFonts w:asciiTheme="minorHAnsi" w:hAnsiTheme="minorHAnsi" w:cstheme="minorHAnsi"/>
+          <w:sz w:val="24"/>
+          <w:szCs w:val="24"/>
+        </w:rPr>
+        <w:t xml:space="preserve"> </w:t>
+      </w:r>
+      <w:r>
+        <w:rPr>
+          <w:rFonts w:asciiTheme="minorHAnsi" w:hAnsiTheme="minorHAnsi" w:cstheme="minorHAnsi"/>
+          <w:sz w:val="24"/>
+        </w:rPr>
+        <w:t>(Zona Industrial e Logística de Sines)</w:t>
+      </w:r>
+      <w:r>
+        <w:rPr>
+          <w:rFonts w:asciiTheme="minorHAnsi" w:hAnsiTheme="minorHAnsi" w:cstheme="minorHAnsi"/>
+          <w:sz w:val="24"/>
+          <w:szCs w:val="24"/>
+        </w:rPr>
+        <w:t xml:space="preserve">, uma </w:t>
       </w:r>
       <w:r>
         <w:rPr>
@@ -11655,6 +11681,7 @@
           <w:sz w:val="24"/>
           <w:szCs w:val="24"/>
         </w:rPr>
+        <w:lastRenderedPageBreak/>
         <w:t xml:space="preserve">adoção de fontes renováveis – </w:t>
       </w:r>
       <w:r>
@@ -11689,7 +11716,6 @@
           <w:sz w:val="24"/>
           <w:szCs w:val="24"/>
         </w:rPr>
-        <w:lastRenderedPageBreak/>
         <w:t xml:space="preserve">promoção da sustentabilidade – </w:t>
       </w:r>
       <w:r>
@@ -12002,7 +12028,15 @@
           <w:rFonts w:asciiTheme="minorHAnsi" w:hAnsiTheme="minorHAnsi" w:cstheme="minorHAnsi"/>
           <w:sz w:val="24"/>
         </w:rPr>
-        <w:t xml:space="preserve">A Administração do Porto de Sines (APS) demonstra um compromisso com a sustentabilidade e a eficiência energética, que se traduz em práticas alinhadas com os princípios da Economia Circular, representados pelas estratégias </w:t>
+        <w:t xml:space="preserve">A Administração do Porto de Sines (APS) demonstra um compromisso com a sustentabilidade e a eficiência energética, que se traduz em práticas alinhadas com os princípios da Economia </w:t>
+      </w:r>
+      <w:r>
+        <w:rPr>
+          <w:rFonts w:asciiTheme="minorHAnsi" w:hAnsiTheme="minorHAnsi" w:cstheme="minorHAnsi"/>
+          <w:sz w:val="24"/>
+        </w:rPr>
+        <w:lastRenderedPageBreak/>
+        <w:t xml:space="preserve">Circular, representados pelas estratégias </w:t>
       </w:r>
       <w:proofErr w:type="spellStart"/>
       <w:r>
@@ -12590,6 +12624,7 @@
           <w:sz w:val="24"/>
           <w:szCs w:val="24"/>
         </w:rPr>
+        <w:lastRenderedPageBreak/>
         <w:t>Circular (Loop)</w:t>
       </w:r>
     </w:p>
@@ -12609,7 +12644,6 @@
           <w:bCs/>
           <w:sz w:val="24"/>
         </w:rPr>
-        <w:lastRenderedPageBreak/>
         <w:t>Recolha seletiva de resíduos:</w:t>
       </w:r>
     </w:p>
@@ -12685,7 +12719,7 @@
           <w:rFonts w:asciiTheme="minorHAnsi" w:hAnsiTheme="minorHAnsi" w:cstheme="minorHAnsi"/>
           <w:sz w:val="24"/>
         </w:rPr>
-        <w:t>com as empresas da ZILS (Zona Industrial e Logística de Sines)</w:t>
+        <w:t>com as empresas da ZILS</w:t>
       </w:r>
       <w:r>
         <w:rPr>
@@ -27029,6 +27063,15 @@
 </file>
 
 <file path=customXml/item1.xml><?xml version="1.0" encoding="utf-8"?>
+<?mso-contentType ?>
+<FormTemplates xmlns="http://schemas.microsoft.com/sharepoint/v3/contenttype/forms">
+  <Display>DocumentLibraryForm</Display>
+  <Edit>DocumentLibraryForm</Edit>
+  <New>DocumentLibraryForm</New>
+</FormTemplates>
+</file>
+
+<file path=customXml/item2.xml><?xml version="1.0" encoding="utf-8"?>
 <p:properties xmlns:p="http://schemas.microsoft.com/office/2006/metadata/properties" xmlns:xsi="http://www.w3.org/2001/XMLSchema-instance" xmlns:pc="http://schemas.microsoft.com/office/infopath/2007/PartnerControls">
   <documentManagement>
     <NotebookType xmlns="6e977478-40fc-4c96-9b59-58f9adc62218" xsi:nil="true"/>
@@ -27040,16 +27083,11 @@
 </p:properties>
 </file>
 
-<file path=customXml/item2.xml><?xml version="1.0" encoding="utf-8"?>
-<?mso-contentType ?>
-<FormTemplates xmlns="http://schemas.microsoft.com/sharepoint/v3/contenttype/forms">
-  <Display>DocumentLibraryForm</Display>
-  <Edit>DocumentLibraryForm</Edit>
-  <New>DocumentLibraryForm</New>
-</FormTemplates>
+<file path=customXml/item3.xml><?xml version="1.0" encoding="utf-8"?>
+<b:Sources xmlns:b="http://schemas.openxmlformats.org/officeDocument/2006/bibliography" xmlns="http://schemas.openxmlformats.org/officeDocument/2006/bibliography" SelectedStyle="\APA.XSL" StyleName="APA"/>
 </file>
 
-<file path=customXml/item3.xml><?xml version="1.0" encoding="utf-8"?>
+<file path=customXml/item4.xml><?xml version="1.0" encoding="utf-8"?>
 <ct:contentTypeSchema xmlns:ct="http://schemas.microsoft.com/office/2006/metadata/contentType" xmlns:ma="http://schemas.microsoft.com/office/2006/metadata/properties/metaAttributes" ct:_="" ma:_="" ma:contentTypeName="Documento" ma:contentTypeID="0x0101008F0F40A57A4B4943AE5F0D22A00E6876" ma:contentTypeVersion="7" ma:contentTypeDescription="Criar um novo documento." ma:contentTypeScope="" ma:versionID="0777f9d8bcaf4fa9f3f247f35de05543">
   <xsd:schema xmlns:xsd="http://www.w3.org/2001/XMLSchema" xmlns:xs="http://www.w3.org/2001/XMLSchema" xmlns:p="http://schemas.microsoft.com/office/2006/metadata/properties" xmlns:ns2="6e977478-40fc-4c96-9b59-58f9adc62218" targetNamespace="http://schemas.microsoft.com/office/2006/metadata/properties" ma:root="true" ma:fieldsID="6e1588d9447c950b5d06efd32159bf41" ns2:_="">
     <xsd:import namespace="6e977478-40fc-4c96-9b59-58f9adc62218"/>
@@ -27211,11 +27249,15 @@
 </ct:contentTypeSchema>
 </file>
 
-<file path=customXml/item4.xml><?xml version="1.0" encoding="utf-8"?>
-<b:Sources xmlns:b="http://schemas.openxmlformats.org/officeDocument/2006/bibliography" xmlns="http://schemas.openxmlformats.org/officeDocument/2006/bibliography" SelectedStyle="\APA.XSL" StyleName="APA"/>
+<file path=customXml/itemProps1.xml><?xml version="1.0" encoding="utf-8"?>
+<ds:datastoreItem xmlns:ds="http://schemas.openxmlformats.org/officeDocument/2006/customXml" ds:itemID="{A8BEE9C3-75AD-4607-B106-1B44B05722EA}">
+  <ds:schemaRefs>
+    <ds:schemaRef ds:uri="http://schemas.microsoft.com/sharepoint/v3/contenttype/forms"/>
+  </ds:schemaRefs>
+</ds:datastoreItem>
 </file>
 
-<file path=customXml/itemProps1.xml><?xml version="1.0" encoding="utf-8"?>
+<file path=customXml/itemProps2.xml><?xml version="1.0" encoding="utf-8"?>
 <ds:datastoreItem xmlns:ds="http://schemas.openxmlformats.org/officeDocument/2006/customXml" ds:itemID="{A02BD9CC-6025-4F76-BD90-0F1427CF0A06}">
   <ds:schemaRefs>
     <ds:schemaRef ds:uri="http://schemas.microsoft.com/office/2006/metadata/properties"/>
@@ -27225,15 +27267,15 @@
 </ds:datastoreItem>
 </file>
 
-<file path=customXml/itemProps2.xml><?xml version="1.0" encoding="utf-8"?>
-<ds:datastoreItem xmlns:ds="http://schemas.openxmlformats.org/officeDocument/2006/customXml" ds:itemID="{A8BEE9C3-75AD-4607-B106-1B44B05722EA}">
+<file path=customXml/itemProps3.xml><?xml version="1.0" encoding="utf-8"?>
+<ds:datastoreItem xmlns:ds="http://schemas.openxmlformats.org/officeDocument/2006/customXml" ds:itemID="{9C46D67E-02BF-4E37-8EF1-2391CC03D27F}">
   <ds:schemaRefs>
-    <ds:schemaRef ds:uri="http://schemas.microsoft.com/sharepoint/v3/contenttype/forms"/>
+    <ds:schemaRef ds:uri="http://schemas.openxmlformats.org/officeDocument/2006/bibliography"/>
   </ds:schemaRefs>
 </ds:datastoreItem>
 </file>
 
-<file path=customXml/itemProps3.xml><?xml version="1.0" encoding="utf-8"?>
+<file path=customXml/itemProps4.xml><?xml version="1.0" encoding="utf-8"?>
 <ds:datastoreItem xmlns:ds="http://schemas.openxmlformats.org/officeDocument/2006/customXml" ds:itemID="{F22FBF9B-697C-4384-8BA9-D9CACC814933}">
   <ds:schemaRefs>
     <ds:schemaRef ds:uri="http://schemas.microsoft.com/office/2006/metadata/contentType"/>
@@ -27249,12 +27291,4 @@
     <ds:schemaRef ds:uri="http://schemas.microsoft.com/internal/obd"/>
   </ds:schemaRefs>
 </ds:datastoreItem>
-</file>
-
-<file path=customXml/itemProps4.xml><?xml version="1.0" encoding="utf-8"?>
-<ds:datastoreItem xmlns:ds="http://schemas.openxmlformats.org/officeDocument/2006/customXml" ds:itemID="{9C46D67E-02BF-4E37-8EF1-2391CC03D27F}">
-  <ds:schemaRefs>
-    <ds:schemaRef ds:uri="http://schemas.openxmlformats.org/officeDocument/2006/bibliography"/>
-  </ds:schemaRefs>
-</ds:datastoreItem>
 </file>
</xml_diff>

<commit_message>
update in report_APS (3.7.8)
</commit_message>
<xml_diff>
--- a/docs/client_analysis/report_APS.docx
+++ b/docs/client_analysis/report_APS.docx
@@ -616,7 +616,7 @@
           <w:r>
             <w:fldChar w:fldCharType="separate"/>
           </w:r>
-          <w:hyperlink w:anchor="_Toc214752205" w:history="1">
+          <w:hyperlink w:anchor="_Toc214753050" w:history="1">
             <w:r>
               <w:rPr>
                 <w:rStyle w:val="Hiperligao"/>
@@ -644,7 +644,7 @@
                 <w:noProof/>
                 <w:webHidden/>
               </w:rPr>
-              <w:instrText xml:space="preserve"> PAGEREF _Toc214752205 \h </w:instrText>
+              <w:instrText xml:space="preserve"> PAGEREF _Toc214753050 \h </w:instrText>
             </w:r>
             <w:r>
               <w:rPr>
@@ -689,7 +689,7 @@
               <w14:ligatures w14:val="standardContextual"/>
             </w:rPr>
           </w:pPr>
-          <w:hyperlink w:anchor="_Toc214752206" w:history="1">
+          <w:hyperlink w:anchor="_Toc214753051" w:history="1">
             <w:r>
               <w:rPr>
                 <w:rStyle w:val="Hiperligao"/>
@@ -717,7 +717,7 @@
                 <w:noProof/>
                 <w:webHidden/>
               </w:rPr>
-              <w:instrText xml:space="preserve"> PAGEREF _Toc214752206 \h </w:instrText>
+              <w:instrText xml:space="preserve"> PAGEREF _Toc214753051 \h </w:instrText>
             </w:r>
             <w:r>
               <w:rPr>
@@ -762,7 +762,7 @@
               <w14:ligatures w14:val="standardContextual"/>
             </w:rPr>
           </w:pPr>
-          <w:hyperlink w:anchor="_Toc214752207" w:history="1">
+          <w:hyperlink w:anchor="_Toc214753052" w:history="1">
             <w:r>
               <w:rPr>
                 <w:rStyle w:val="Hiperligao"/>
@@ -789,7 +789,7 @@
                 <w:noProof/>
                 <w:webHidden/>
               </w:rPr>
-              <w:instrText xml:space="preserve"> PAGEREF _Toc214752207 \h </w:instrText>
+              <w:instrText xml:space="preserve"> PAGEREF _Toc214753052 \h </w:instrText>
             </w:r>
             <w:r>
               <w:rPr>
@@ -834,7 +834,7 @@
               <w14:ligatures w14:val="standardContextual"/>
             </w:rPr>
           </w:pPr>
-          <w:hyperlink w:anchor="_Toc214752208" w:history="1">
+          <w:hyperlink w:anchor="_Toc214753053" w:history="1">
             <w:r>
               <w:rPr>
                 <w:rStyle w:val="Hiperligao"/>
@@ -861,7 +861,7 @@
                 <w:noProof/>
                 <w:webHidden/>
               </w:rPr>
-              <w:instrText xml:space="preserve"> PAGEREF _Toc214752208 \h </w:instrText>
+              <w:instrText xml:space="preserve"> PAGEREF _Toc214753053 \h </w:instrText>
             </w:r>
             <w:r>
               <w:rPr>
@@ -906,7 +906,7 @@
               <w14:ligatures w14:val="standardContextual"/>
             </w:rPr>
           </w:pPr>
-          <w:hyperlink w:anchor="_Toc214752209" w:history="1">
+          <w:hyperlink w:anchor="_Toc214753054" w:history="1">
             <w:r>
               <w:rPr>
                 <w:rStyle w:val="Hiperligao"/>
@@ -933,7 +933,7 @@
                 <w:noProof/>
                 <w:webHidden/>
               </w:rPr>
-              <w:instrText xml:space="preserve"> PAGEREF _Toc214752209 \h </w:instrText>
+              <w:instrText xml:space="preserve"> PAGEREF _Toc214753054 \h </w:instrText>
             </w:r>
             <w:r>
               <w:rPr>
@@ -978,7 +978,7 @@
               <w14:ligatures w14:val="standardContextual"/>
             </w:rPr>
           </w:pPr>
-          <w:hyperlink w:anchor="_Toc214752210" w:history="1">
+          <w:hyperlink w:anchor="_Toc214753055" w:history="1">
             <w:r>
               <w:rPr>
                 <w:rStyle w:val="Hiperligao"/>
@@ -1007,7 +1007,7 @@
                 <w:noProof/>
                 <w:webHidden/>
               </w:rPr>
-              <w:instrText xml:space="preserve"> PAGEREF _Toc214752210 \h </w:instrText>
+              <w:instrText xml:space="preserve"> PAGEREF _Toc214753055 \h </w:instrText>
             </w:r>
             <w:r>
               <w:rPr>
@@ -1052,7 +1052,7 @@
               <w14:ligatures w14:val="standardContextual"/>
             </w:rPr>
           </w:pPr>
-          <w:hyperlink w:anchor="_Toc214752211" w:history="1">
+          <w:hyperlink w:anchor="_Toc214753056" w:history="1">
             <w:r>
               <w:rPr>
                 <w:rStyle w:val="Hiperligao"/>
@@ -1081,7 +1081,7 @@
                 <w:noProof/>
                 <w:webHidden/>
               </w:rPr>
-              <w:instrText xml:space="preserve"> PAGEREF _Toc214752211 \h </w:instrText>
+              <w:instrText xml:space="preserve"> PAGEREF _Toc214753056 \h </w:instrText>
             </w:r>
             <w:r>
               <w:rPr>
@@ -1126,7 +1126,7 @@
               <w14:ligatures w14:val="standardContextual"/>
             </w:rPr>
           </w:pPr>
-          <w:hyperlink w:anchor="_Toc214752212" w:history="1">
+          <w:hyperlink w:anchor="_Toc214753057" w:history="1">
             <w:r>
               <w:rPr>
                 <w:rStyle w:val="Hiperligao"/>
@@ -1155,7 +1155,7 @@
                 <w:noProof/>
                 <w:webHidden/>
               </w:rPr>
-              <w:instrText xml:space="preserve"> PAGEREF _Toc214752212 \h </w:instrText>
+              <w:instrText xml:space="preserve"> PAGEREF _Toc214753057 \h </w:instrText>
             </w:r>
             <w:r>
               <w:rPr>
@@ -1200,7 +1200,7 @@
               <w14:ligatures w14:val="standardContextual"/>
             </w:rPr>
           </w:pPr>
-          <w:hyperlink w:anchor="_Toc214752213" w:history="1">
+          <w:hyperlink w:anchor="_Toc214753058" w:history="1">
             <w:r>
               <w:rPr>
                 <w:rStyle w:val="Hiperligao"/>
@@ -1229,7 +1229,7 @@
                 <w:noProof/>
                 <w:webHidden/>
               </w:rPr>
-              <w:instrText xml:space="preserve"> PAGEREF _Toc214752213 \h </w:instrText>
+              <w:instrText xml:space="preserve"> PAGEREF _Toc214753058 \h </w:instrText>
             </w:r>
             <w:r>
               <w:rPr>
@@ -1274,7 +1274,7 @@
               <w14:ligatures w14:val="standardContextual"/>
             </w:rPr>
           </w:pPr>
-          <w:hyperlink w:anchor="_Toc214752214" w:history="1">
+          <w:hyperlink w:anchor="_Toc214753059" w:history="1">
             <w:r>
               <w:rPr>
                 <w:rStyle w:val="Hiperligao"/>
@@ -1303,7 +1303,7 @@
                 <w:noProof/>
                 <w:webHidden/>
               </w:rPr>
-              <w:instrText xml:space="preserve"> PAGEREF _Toc214752214 \h </w:instrText>
+              <w:instrText xml:space="preserve"> PAGEREF _Toc214753059 \h </w:instrText>
             </w:r>
             <w:r>
               <w:rPr>
@@ -1348,7 +1348,7 @@
               <w14:ligatures w14:val="standardContextual"/>
             </w:rPr>
           </w:pPr>
-          <w:hyperlink w:anchor="_Toc214752215" w:history="1">
+          <w:hyperlink w:anchor="_Toc214753060" w:history="1">
             <w:r>
               <w:rPr>
                 <w:rStyle w:val="Hiperligao"/>
@@ -1375,7 +1375,7 @@
                 <w:noProof/>
                 <w:webHidden/>
               </w:rPr>
-              <w:instrText xml:space="preserve"> PAGEREF _Toc214752215 \h </w:instrText>
+              <w:instrText xml:space="preserve"> PAGEREF _Toc214753060 \h </w:instrText>
             </w:r>
             <w:r>
               <w:rPr>
@@ -1420,7 +1420,7 @@
               <w14:ligatures w14:val="standardContextual"/>
             </w:rPr>
           </w:pPr>
-          <w:hyperlink w:anchor="_Toc214752216" w:history="1">
+          <w:hyperlink w:anchor="_Toc214753061" w:history="1">
             <w:r>
               <w:rPr>
                 <w:rStyle w:val="Hiperligao"/>
@@ -1447,7 +1447,7 @@
                 <w:noProof/>
                 <w:webHidden/>
               </w:rPr>
-              <w:instrText xml:space="preserve"> PAGEREF _Toc214752216 \h </w:instrText>
+              <w:instrText xml:space="preserve"> PAGEREF _Toc214753061 \h </w:instrText>
             </w:r>
             <w:r>
               <w:rPr>
@@ -1492,7 +1492,7 @@
               <w14:ligatures w14:val="standardContextual"/>
             </w:rPr>
           </w:pPr>
-          <w:hyperlink w:anchor="_Toc214752217" w:history="1">
+          <w:hyperlink w:anchor="_Toc214753062" w:history="1">
             <w:r>
               <w:rPr>
                 <w:rStyle w:val="Hiperligao"/>
@@ -1521,7 +1521,7 @@
                 <w:noProof/>
                 <w:webHidden/>
               </w:rPr>
-              <w:instrText xml:space="preserve"> PAGEREF _Toc214752217 \h </w:instrText>
+              <w:instrText xml:space="preserve"> PAGEREF _Toc214753062 \h </w:instrText>
             </w:r>
             <w:r>
               <w:rPr>
@@ -1566,7 +1566,7 @@
               <w14:ligatures w14:val="standardContextual"/>
             </w:rPr>
           </w:pPr>
-          <w:hyperlink w:anchor="_Toc214752218" w:history="1">
+          <w:hyperlink w:anchor="_Toc214753063" w:history="1">
             <w:r>
               <w:rPr>
                 <w:rStyle w:val="Hiperligao"/>
@@ -1595,7 +1595,7 @@
                 <w:noProof/>
                 <w:webHidden/>
               </w:rPr>
-              <w:instrText xml:space="preserve"> PAGEREF _Toc214752218 \h </w:instrText>
+              <w:instrText xml:space="preserve"> PAGEREF _Toc214753063 \h </w:instrText>
             </w:r>
             <w:r>
               <w:rPr>
@@ -1640,7 +1640,7 @@
               <w14:ligatures w14:val="standardContextual"/>
             </w:rPr>
           </w:pPr>
-          <w:hyperlink w:anchor="_Toc214752219" w:history="1">
+          <w:hyperlink w:anchor="_Toc214753064" w:history="1">
             <w:r>
               <w:rPr>
                 <w:rStyle w:val="Hiperligao"/>
@@ -1667,7 +1667,7 @@
                 <w:noProof/>
                 <w:webHidden/>
               </w:rPr>
-              <w:instrText xml:space="preserve"> PAGEREF _Toc214752219 \h </w:instrText>
+              <w:instrText xml:space="preserve"> PAGEREF _Toc214753064 \h </w:instrText>
             </w:r>
             <w:r>
               <w:rPr>
@@ -1712,7 +1712,7 @@
               <w14:ligatures w14:val="standardContextual"/>
             </w:rPr>
           </w:pPr>
-          <w:hyperlink w:anchor="_Toc214752220" w:history="1">
+          <w:hyperlink w:anchor="_Toc214753065" w:history="1">
             <w:r>
               <w:rPr>
                 <w:rStyle w:val="Hiperligao"/>
@@ -1741,7 +1741,7 @@
                 <w:noProof/>
                 <w:webHidden/>
               </w:rPr>
-              <w:instrText xml:space="preserve"> PAGEREF _Toc214752220 \h </w:instrText>
+              <w:instrText xml:space="preserve"> PAGEREF _Toc214753065 \h </w:instrText>
             </w:r>
             <w:r>
               <w:rPr>
@@ -1786,7 +1786,7 @@
               <w14:ligatures w14:val="standardContextual"/>
             </w:rPr>
           </w:pPr>
-          <w:hyperlink w:anchor="_Toc214752221" w:history="1">
+          <w:hyperlink w:anchor="_Toc214753066" w:history="1">
             <w:r>
               <w:rPr>
                 <w:rStyle w:val="Hiperligao"/>
@@ -1815,7 +1815,7 @@
                 <w:noProof/>
                 <w:webHidden/>
               </w:rPr>
-              <w:instrText xml:space="preserve"> PAGEREF _Toc214752221 \h </w:instrText>
+              <w:instrText xml:space="preserve"> PAGEREF _Toc214753066 \h </w:instrText>
             </w:r>
             <w:r>
               <w:rPr>
@@ -1860,7 +1860,7 @@
               <w14:ligatures w14:val="standardContextual"/>
             </w:rPr>
           </w:pPr>
-          <w:hyperlink w:anchor="_Toc214752222" w:history="1">
+          <w:hyperlink w:anchor="_Toc214753067" w:history="1">
             <w:r>
               <w:rPr>
                 <w:rStyle w:val="Hiperligao"/>
@@ -1889,7 +1889,7 @@
                 <w:noProof/>
                 <w:webHidden/>
               </w:rPr>
-              <w:instrText xml:space="preserve"> PAGEREF _Toc214752222 \h </w:instrText>
+              <w:instrText xml:space="preserve"> PAGEREF _Toc214753067 \h </w:instrText>
             </w:r>
             <w:r>
               <w:rPr>
@@ -1934,7 +1934,7 @@
               <w14:ligatures w14:val="standardContextual"/>
             </w:rPr>
           </w:pPr>
-          <w:hyperlink w:anchor="_Toc214752223" w:history="1">
+          <w:hyperlink w:anchor="_Toc214753068" w:history="1">
             <w:r>
               <w:rPr>
                 <w:rStyle w:val="Hiperligao"/>
@@ -1963,7 +1963,7 @@
                 <w:noProof/>
                 <w:webHidden/>
               </w:rPr>
-              <w:instrText xml:space="preserve"> PAGEREF _Toc214752223 \h </w:instrText>
+              <w:instrText xml:space="preserve"> PAGEREF _Toc214753068 \h </w:instrText>
             </w:r>
             <w:r>
               <w:rPr>
@@ -2008,7 +2008,7 @@
               <w14:ligatures w14:val="standardContextual"/>
             </w:rPr>
           </w:pPr>
-          <w:hyperlink w:anchor="_Toc214752224" w:history="1">
+          <w:hyperlink w:anchor="_Toc214753069" w:history="1">
             <w:r>
               <w:rPr>
                 <w:rStyle w:val="Hiperligao"/>
@@ -2035,7 +2035,7 @@
                 <w:noProof/>
                 <w:webHidden/>
               </w:rPr>
-              <w:instrText xml:space="preserve"> PAGEREF _Toc214752224 \h </w:instrText>
+              <w:instrText xml:space="preserve"> PAGEREF _Toc214753069 \h </w:instrText>
             </w:r>
             <w:r>
               <w:rPr>
@@ -2080,7 +2080,7 @@
               <w14:ligatures w14:val="standardContextual"/>
             </w:rPr>
           </w:pPr>
-          <w:hyperlink w:anchor="_Toc214752225" w:history="1">
+          <w:hyperlink w:anchor="_Toc214753070" w:history="1">
             <w:r>
               <w:rPr>
                 <w:rStyle w:val="Hiperligao"/>
@@ -2109,7 +2109,7 @@
                 <w:noProof/>
                 <w:webHidden/>
               </w:rPr>
-              <w:instrText xml:space="preserve"> PAGEREF _Toc214752225 \h </w:instrText>
+              <w:instrText xml:space="preserve"> PAGEREF _Toc214753070 \h </w:instrText>
             </w:r>
             <w:r>
               <w:rPr>
@@ -2154,7 +2154,7 @@
               <w14:ligatures w14:val="standardContextual"/>
             </w:rPr>
           </w:pPr>
-          <w:hyperlink w:anchor="_Toc214752226" w:history="1">
+          <w:hyperlink w:anchor="_Toc214753071" w:history="1">
             <w:r>
               <w:rPr>
                 <w:rStyle w:val="Hiperligao"/>
@@ -2183,7 +2183,7 @@
                 <w:noProof/>
                 <w:webHidden/>
               </w:rPr>
-              <w:instrText xml:space="preserve"> PAGEREF _Toc214752226 \h </w:instrText>
+              <w:instrText xml:space="preserve"> PAGEREF _Toc214753071 \h </w:instrText>
             </w:r>
             <w:r>
               <w:rPr>
@@ -2228,7 +2228,7 @@
               <w14:ligatures w14:val="standardContextual"/>
             </w:rPr>
           </w:pPr>
-          <w:hyperlink w:anchor="_Toc214752227" w:history="1">
+          <w:hyperlink w:anchor="_Toc214753072" w:history="1">
             <w:r>
               <w:rPr>
                 <w:rStyle w:val="Hiperligao"/>
@@ -2257,7 +2257,7 @@
                 <w:noProof/>
                 <w:webHidden/>
               </w:rPr>
-              <w:instrText xml:space="preserve"> PAGEREF _Toc214752227 \h </w:instrText>
+              <w:instrText xml:space="preserve"> PAGEREF _Toc214753072 \h </w:instrText>
             </w:r>
             <w:r>
               <w:rPr>
@@ -2302,7 +2302,7 @@
               <w14:ligatures w14:val="standardContextual"/>
             </w:rPr>
           </w:pPr>
-          <w:hyperlink w:anchor="_Toc214752228" w:history="1">
+          <w:hyperlink w:anchor="_Toc214753073" w:history="1">
             <w:r>
               <w:rPr>
                 <w:rStyle w:val="Hiperligao"/>
@@ -2329,7 +2329,7 @@
                 <w:noProof/>
                 <w:webHidden/>
               </w:rPr>
-              <w:instrText xml:space="preserve"> PAGEREF _Toc214752228 \h </w:instrText>
+              <w:instrText xml:space="preserve"> PAGEREF _Toc214753073 \h </w:instrText>
             </w:r>
             <w:r>
               <w:rPr>
@@ -2374,7 +2374,7 @@
               <w14:ligatures w14:val="standardContextual"/>
             </w:rPr>
           </w:pPr>
-          <w:hyperlink w:anchor="_Toc214752229" w:history="1">
+          <w:hyperlink w:anchor="_Toc214753074" w:history="1">
             <w:r>
               <w:rPr>
                 <w:rStyle w:val="Hiperligao"/>
@@ -2403,7 +2403,7 @@
                 <w:noProof/>
                 <w:webHidden/>
               </w:rPr>
-              <w:instrText xml:space="preserve"> PAGEREF _Toc214752229 \h </w:instrText>
+              <w:instrText xml:space="preserve"> PAGEREF _Toc214753074 \h </w:instrText>
             </w:r>
             <w:r>
               <w:rPr>
@@ -2448,7 +2448,7 @@
               <w14:ligatures w14:val="standardContextual"/>
             </w:rPr>
           </w:pPr>
-          <w:hyperlink w:anchor="_Toc214752230" w:history="1">
+          <w:hyperlink w:anchor="_Toc214753075" w:history="1">
             <w:r>
               <w:rPr>
                 <w:rStyle w:val="Hiperligao"/>
@@ -2477,7 +2477,7 @@
                 <w:noProof/>
                 <w:webHidden/>
               </w:rPr>
-              <w:instrText xml:space="preserve"> PAGEREF _Toc214752230 \h </w:instrText>
+              <w:instrText xml:space="preserve"> PAGEREF _Toc214753075 \h </w:instrText>
             </w:r>
             <w:r>
               <w:rPr>
@@ -2522,7 +2522,7 @@
               <w14:ligatures w14:val="standardContextual"/>
             </w:rPr>
           </w:pPr>
-          <w:hyperlink w:anchor="_Toc214752231" w:history="1">
+          <w:hyperlink w:anchor="_Toc214753076" w:history="1">
             <w:r>
               <w:rPr>
                 <w:rStyle w:val="Hiperligao"/>
@@ -2551,7 +2551,7 @@
                 <w:noProof/>
                 <w:webHidden/>
               </w:rPr>
-              <w:instrText xml:space="preserve"> PAGEREF _Toc214752231 \h </w:instrText>
+              <w:instrText xml:space="preserve"> PAGEREF _Toc214753076 \h </w:instrText>
             </w:r>
             <w:r>
               <w:rPr>
@@ -2596,13 +2596,13 @@
               <w14:ligatures w14:val="standardContextual"/>
             </w:rPr>
           </w:pPr>
-          <w:hyperlink w:anchor="_Toc214752232" w:history="1">
+          <w:hyperlink w:anchor="_Toc214753077" w:history="1">
             <w:r>
               <w:rPr>
                 <w:rStyle w:val="Hiperligao"/>
                 <w:noProof/>
               </w:rPr>
-              <w:t>II.5 Promoção da produtividade --- (3.7.8)</w:t>
+              <w:t>II.5 Promoção da produtividade</w:t>
             </w:r>
             <w:r>
               <w:rPr>
@@ -2623,7 +2623,7 @@
                 <w:noProof/>
                 <w:webHidden/>
               </w:rPr>
-              <w:instrText xml:space="preserve"> PAGEREF _Toc214752232 \h </w:instrText>
+              <w:instrText xml:space="preserve"> PAGEREF _Toc214753077 \h </w:instrText>
             </w:r>
             <w:r>
               <w:rPr>
@@ -2644,6 +2644,153 @@
                 <w:webHidden/>
               </w:rPr>
               <w:t>22</w:t>
+            </w:r>
+            <w:r>
+              <w:rPr>
+                <w:noProof/>
+                <w:webHidden/>
+              </w:rPr>
+              <w:fldChar w:fldCharType="end"/>
+            </w:r>
+          </w:hyperlink>
+        </w:p>
+        <w:p>
+          <w:pPr>
+            <w:pStyle w:val="ndice3"/>
+            <w:tabs>
+              <w:tab w:val="right" w:leader="dot" w:pos="9350"/>
+            </w:tabs>
+            <w:rPr>
+              <w:rFonts w:asciiTheme="minorHAnsi" w:eastAsiaTheme="minorEastAsia" w:hAnsiTheme="minorHAnsi" w:cstheme="minorBidi"/>
+              <w:noProof/>
+              <w:kern w:val="2"/>
+              <w:sz w:val="24"/>
+              <w14:ligatures w14:val="standardContextual"/>
+            </w:rPr>
+          </w:pPr>
+          <w:hyperlink w:anchor="_Toc214753078" w:history="1">
+            <w:r>
+              <w:rPr>
+                <w:rStyle w:val="Hiperligao"/>
+                <w:b/>
+                <w:bCs/>
+                <w:noProof/>
+              </w:rPr>
+              <w:t>3.7.8</w:t>
+            </w:r>
+            <w:r>
+              <w:rPr>
+                <w:noProof/>
+                <w:webHidden/>
+              </w:rPr>
+              <w:tab/>
+            </w:r>
+            <w:r>
+              <w:rPr>
+                <w:noProof/>
+                <w:webHidden/>
+              </w:rPr>
+              <w:fldChar w:fldCharType="begin"/>
+            </w:r>
+            <w:r>
+              <w:rPr>
+                <w:noProof/>
+                <w:webHidden/>
+              </w:rPr>
+              <w:instrText xml:space="preserve"> PAGEREF _Toc214753078 \h </w:instrText>
+            </w:r>
+            <w:r>
+              <w:rPr>
+                <w:noProof/>
+                <w:webHidden/>
+              </w:rPr>
+            </w:r>
+            <w:r>
+              <w:rPr>
+                <w:noProof/>
+                <w:webHidden/>
+              </w:rPr>
+              <w:fldChar w:fldCharType="separate"/>
+            </w:r>
+            <w:r>
+              <w:rPr>
+                <w:noProof/>
+                <w:webHidden/>
+              </w:rPr>
+              <w:t>22</w:t>
+            </w:r>
+            <w:r>
+              <w:rPr>
+                <w:noProof/>
+                <w:webHidden/>
+              </w:rPr>
+              <w:fldChar w:fldCharType="end"/>
+            </w:r>
+          </w:hyperlink>
+        </w:p>
+        <w:p>
+          <w:pPr>
+            <w:pStyle w:val="ndice2"/>
+            <w:tabs>
+              <w:tab w:val="right" w:leader="dot" w:pos="9350"/>
+            </w:tabs>
+            <w:rPr>
+              <w:rFonts w:asciiTheme="minorHAnsi" w:eastAsiaTheme="minorEastAsia" w:hAnsiTheme="minorHAnsi" w:cstheme="minorBidi"/>
+              <w:noProof/>
+              <w:kern w:val="2"/>
+              <w:sz w:val="24"/>
+              <w14:ligatures w14:val="standardContextual"/>
+            </w:rPr>
+          </w:pPr>
+          <w:hyperlink w:anchor="_Toc214753079" w:history="1">
+            <w:r>
+              <w:rPr>
+                <w:rStyle w:val="Hiperligao"/>
+                <w:rFonts w:cstheme="minorHAnsi"/>
+                <w:noProof/>
+              </w:rPr>
+              <w:t>II.6 Economia circular --- (3.7.7 / 3.7.9)</w:t>
+            </w:r>
+            <w:r>
+              <w:rPr>
+                <w:noProof/>
+                <w:webHidden/>
+              </w:rPr>
+              <w:tab/>
+            </w:r>
+            <w:r>
+              <w:rPr>
+                <w:noProof/>
+                <w:webHidden/>
+              </w:rPr>
+              <w:fldChar w:fldCharType="begin"/>
+            </w:r>
+            <w:r>
+              <w:rPr>
+                <w:noProof/>
+                <w:webHidden/>
+              </w:rPr>
+              <w:instrText xml:space="preserve"> PAGEREF _Toc214753079 \h </w:instrText>
+            </w:r>
+            <w:r>
+              <w:rPr>
+                <w:noProof/>
+                <w:webHidden/>
+              </w:rPr>
+            </w:r>
+            <w:r>
+              <w:rPr>
+                <w:noProof/>
+                <w:webHidden/>
+              </w:rPr>
+              <w:fldChar w:fldCharType="separate"/>
+            </w:r>
+            <w:r>
+              <w:rPr>
+                <w:noProof/>
+                <w:webHidden/>
+              </w:rPr>
+              <w:t>23</w:t>
             </w:r>
             <w:r>
               <w:rPr>
@@ -2668,13 +2815,14 @@
               <w14:ligatures w14:val="standardContextual"/>
             </w:rPr>
           </w:pPr>
-          <w:hyperlink w:anchor="_Toc214752233" w:history="1">
+          <w:hyperlink w:anchor="_Toc214753080" w:history="1">
             <w:r>
               <w:rPr>
                 <w:rStyle w:val="Hiperligao"/>
-                <w:noProof/>
-              </w:rPr>
-              <w:t>3.7.8</w:t>
+                <w:rFonts w:cstheme="minorHAnsi"/>
+                <w:noProof/>
+              </w:rPr>
+              <w:t>3.7.7</w:t>
             </w:r>
             <w:r>
               <w:rPr>
@@ -2695,7 +2843,7 @@
                 <w:noProof/>
                 <w:webHidden/>
               </w:rPr>
-              <w:instrText xml:space="preserve"> PAGEREF _Toc214752233 \h </w:instrText>
+              <w:instrText xml:space="preserve"> PAGEREF _Toc214753080 \h </w:instrText>
             </w:r>
             <w:r>
               <w:rPr>
@@ -2715,7 +2863,80 @@
                 <w:noProof/>
                 <w:webHidden/>
               </w:rPr>
-              <w:t>22</w:t>
+              <w:t>23</w:t>
+            </w:r>
+            <w:r>
+              <w:rPr>
+                <w:noProof/>
+                <w:webHidden/>
+              </w:rPr>
+              <w:fldChar w:fldCharType="end"/>
+            </w:r>
+          </w:hyperlink>
+        </w:p>
+        <w:p>
+          <w:pPr>
+            <w:pStyle w:val="ndice1"/>
+            <w:tabs>
+              <w:tab w:val="right" w:leader="dot" w:pos="9350"/>
+            </w:tabs>
+            <w:rPr>
+              <w:rFonts w:asciiTheme="minorHAnsi" w:eastAsiaTheme="minorEastAsia" w:hAnsiTheme="minorHAnsi" w:cstheme="minorBidi"/>
+              <w:noProof/>
+              <w:kern w:val="2"/>
+              <w:sz w:val="24"/>
+              <w14:ligatures w14:val="standardContextual"/>
+            </w:rPr>
+          </w:pPr>
+          <w:hyperlink w:anchor="_Toc214753081" w:history="1">
+            <w:r>
+              <w:rPr>
+                <w:rStyle w:val="Hiperligao"/>
+                <w:rFonts w:cstheme="minorHAnsi"/>
+                <w:noProof/>
+              </w:rPr>
+              <w:t>3.7.9</w:t>
+            </w:r>
+            <w:r>
+              <w:rPr>
+                <w:noProof/>
+                <w:webHidden/>
+              </w:rPr>
+              <w:tab/>
+            </w:r>
+            <w:r>
+              <w:rPr>
+                <w:noProof/>
+                <w:webHidden/>
+              </w:rPr>
+              <w:fldChar w:fldCharType="begin"/>
+            </w:r>
+            <w:r>
+              <w:rPr>
+                <w:noProof/>
+                <w:webHidden/>
+              </w:rPr>
+              <w:instrText xml:space="preserve"> PAGEREF _Toc214753081 \h </w:instrText>
+            </w:r>
+            <w:r>
+              <w:rPr>
+                <w:noProof/>
+                <w:webHidden/>
+              </w:rPr>
+            </w:r>
+            <w:r>
+              <w:rPr>
+                <w:noProof/>
+                <w:webHidden/>
+              </w:rPr>
+              <w:fldChar w:fldCharType="separate"/>
+            </w:r>
+            <w:r>
+              <w:rPr>
+                <w:noProof/>
+                <w:webHidden/>
+              </w:rPr>
+              <w:t>25</w:t>
             </w:r>
             <w:r>
               <w:rPr>
@@ -2740,14 +2961,13 @@
               <w14:ligatures w14:val="standardContextual"/>
             </w:rPr>
           </w:pPr>
-          <w:hyperlink w:anchor="_Toc214752234" w:history="1">
+          <w:hyperlink w:anchor="_Toc214753082" w:history="1">
             <w:r>
               <w:rPr>
                 <w:rStyle w:val="Hiperligao"/>
-                <w:rFonts w:cstheme="minorHAnsi"/>
-                <w:noProof/>
-              </w:rPr>
-              <w:t>II.6 Economia circular --- (3.7.7 / 3.7.9)</w:t>
+                <w:noProof/>
+              </w:rPr>
+              <w:t>II.7 Marketing</w:t>
             </w:r>
             <w:r>
               <w:rPr>
@@ -2768,7 +2988,7 @@
                 <w:noProof/>
                 <w:webHidden/>
               </w:rPr>
-              <w:instrText xml:space="preserve"> PAGEREF _Toc214752234 \h </w:instrText>
+              <w:instrText xml:space="preserve"> PAGEREF _Toc214753082 \h </w:instrText>
             </w:r>
             <w:r>
               <w:rPr>
@@ -2788,7 +3008,151 @@
                 <w:noProof/>
                 <w:webHidden/>
               </w:rPr>
-              <w:t>24</w:t>
+              <w:t>27</w:t>
+            </w:r>
+            <w:r>
+              <w:rPr>
+                <w:noProof/>
+                <w:webHidden/>
+              </w:rPr>
+              <w:fldChar w:fldCharType="end"/>
+            </w:r>
+          </w:hyperlink>
+        </w:p>
+        <w:p>
+          <w:pPr>
+            <w:pStyle w:val="ndice2"/>
+            <w:tabs>
+              <w:tab w:val="right" w:leader="dot" w:pos="9350"/>
+            </w:tabs>
+            <w:rPr>
+              <w:rFonts w:asciiTheme="minorHAnsi" w:eastAsiaTheme="minorEastAsia" w:hAnsiTheme="minorHAnsi" w:cstheme="minorBidi"/>
+              <w:noProof/>
+              <w:kern w:val="2"/>
+              <w:sz w:val="24"/>
+              <w14:ligatures w14:val="standardContextual"/>
+            </w:rPr>
+          </w:pPr>
+          <w:hyperlink w:anchor="_Toc214753083" w:history="1">
+            <w:r>
+              <w:rPr>
+                <w:rStyle w:val="Hiperligao"/>
+                <w:noProof/>
+              </w:rPr>
+              <w:t>II. 8 Gestão Financeira</w:t>
+            </w:r>
+            <w:r>
+              <w:rPr>
+                <w:noProof/>
+                <w:webHidden/>
+              </w:rPr>
+              <w:tab/>
+            </w:r>
+            <w:r>
+              <w:rPr>
+                <w:noProof/>
+                <w:webHidden/>
+              </w:rPr>
+              <w:fldChar w:fldCharType="begin"/>
+            </w:r>
+            <w:r>
+              <w:rPr>
+                <w:noProof/>
+                <w:webHidden/>
+              </w:rPr>
+              <w:instrText xml:space="preserve"> PAGEREF _Toc214753083 \h </w:instrText>
+            </w:r>
+            <w:r>
+              <w:rPr>
+                <w:noProof/>
+                <w:webHidden/>
+              </w:rPr>
+            </w:r>
+            <w:r>
+              <w:rPr>
+                <w:noProof/>
+                <w:webHidden/>
+              </w:rPr>
+              <w:fldChar w:fldCharType="separate"/>
+            </w:r>
+            <w:r>
+              <w:rPr>
+                <w:noProof/>
+                <w:webHidden/>
+              </w:rPr>
+              <w:t>27</w:t>
+            </w:r>
+            <w:r>
+              <w:rPr>
+                <w:noProof/>
+                <w:webHidden/>
+              </w:rPr>
+              <w:fldChar w:fldCharType="end"/>
+            </w:r>
+          </w:hyperlink>
+        </w:p>
+        <w:p>
+          <w:pPr>
+            <w:pStyle w:val="ndice2"/>
+            <w:tabs>
+              <w:tab w:val="right" w:leader="dot" w:pos="9350"/>
+            </w:tabs>
+            <w:rPr>
+              <w:rFonts w:asciiTheme="minorHAnsi" w:eastAsiaTheme="minorEastAsia" w:hAnsiTheme="minorHAnsi" w:cstheme="minorBidi"/>
+              <w:noProof/>
+              <w:kern w:val="2"/>
+              <w:sz w:val="24"/>
+              <w14:ligatures w14:val="standardContextual"/>
+            </w:rPr>
+          </w:pPr>
+          <w:hyperlink w:anchor="_Toc214753084" w:history="1">
+            <w:r>
+              <w:rPr>
+                <w:rStyle w:val="Hiperligao"/>
+                <w:noProof/>
+              </w:rPr>
+              <w:t>II.9 Gestão das Operações e Indústria 4.0</w:t>
+            </w:r>
+            <w:r>
+              <w:rPr>
+                <w:noProof/>
+                <w:webHidden/>
+              </w:rPr>
+              <w:tab/>
+            </w:r>
+            <w:r>
+              <w:rPr>
+                <w:noProof/>
+                <w:webHidden/>
+              </w:rPr>
+              <w:fldChar w:fldCharType="begin"/>
+            </w:r>
+            <w:r>
+              <w:rPr>
+                <w:noProof/>
+                <w:webHidden/>
+              </w:rPr>
+              <w:instrText xml:space="preserve"> PAGEREF _Toc214753084 \h </w:instrText>
+            </w:r>
+            <w:r>
+              <w:rPr>
+                <w:noProof/>
+                <w:webHidden/>
+              </w:rPr>
+            </w:r>
+            <w:r>
+              <w:rPr>
+                <w:noProof/>
+                <w:webHidden/>
+              </w:rPr>
+              <w:fldChar w:fldCharType="separate"/>
+            </w:r>
+            <w:r>
+              <w:rPr>
+                <w:noProof/>
+                <w:webHidden/>
+              </w:rPr>
+              <w:t>27</w:t>
             </w:r>
             <w:r>
               <w:rPr>
@@ -2813,14 +3177,13 @@
               <w14:ligatures w14:val="standardContextual"/>
             </w:rPr>
           </w:pPr>
-          <w:hyperlink w:anchor="_Toc214752235" w:history="1">
+          <w:hyperlink w:anchor="_Toc214753085" w:history="1">
             <w:r>
               <w:rPr>
                 <w:rStyle w:val="Hiperligao"/>
-                <w:rFonts w:cstheme="minorHAnsi"/>
-                <w:noProof/>
-              </w:rPr>
-              <w:t>3.7.7</w:t>
+                <w:noProof/>
+              </w:rPr>
+              <w:t>Parte III – Conclusão</w:t>
             </w:r>
             <w:r>
               <w:rPr>
@@ -2841,7 +3204,7 @@
                 <w:noProof/>
                 <w:webHidden/>
               </w:rPr>
-              <w:instrText xml:space="preserve"> PAGEREF _Toc214752235 \h </w:instrText>
+              <w:instrText xml:space="preserve"> PAGEREF _Toc214753085 \h </w:instrText>
             </w:r>
             <w:r>
               <w:rPr>
@@ -2861,7 +3224,151 @@
                 <w:noProof/>
                 <w:webHidden/>
               </w:rPr>
-              <w:t>24</w:t>
+              <w:t>28</w:t>
+            </w:r>
+            <w:r>
+              <w:rPr>
+                <w:noProof/>
+                <w:webHidden/>
+              </w:rPr>
+              <w:fldChar w:fldCharType="end"/>
+            </w:r>
+          </w:hyperlink>
+        </w:p>
+        <w:p>
+          <w:pPr>
+            <w:pStyle w:val="ndice2"/>
+            <w:tabs>
+              <w:tab w:val="right" w:leader="dot" w:pos="9350"/>
+            </w:tabs>
+            <w:rPr>
+              <w:rFonts w:asciiTheme="minorHAnsi" w:eastAsiaTheme="minorEastAsia" w:hAnsiTheme="minorHAnsi" w:cstheme="minorBidi"/>
+              <w:noProof/>
+              <w:kern w:val="2"/>
+              <w:sz w:val="24"/>
+              <w14:ligatures w14:val="standardContextual"/>
+            </w:rPr>
+          </w:pPr>
+          <w:hyperlink w:anchor="_Toc214753086" w:history="1">
+            <w:r>
+              <w:rPr>
+                <w:rStyle w:val="Hiperligao"/>
+                <w:noProof/>
+              </w:rPr>
+              <w:t>III.1 Conclusão</w:t>
+            </w:r>
+            <w:r>
+              <w:rPr>
+                <w:noProof/>
+                <w:webHidden/>
+              </w:rPr>
+              <w:tab/>
+            </w:r>
+            <w:r>
+              <w:rPr>
+                <w:noProof/>
+                <w:webHidden/>
+              </w:rPr>
+              <w:fldChar w:fldCharType="begin"/>
+            </w:r>
+            <w:r>
+              <w:rPr>
+                <w:noProof/>
+                <w:webHidden/>
+              </w:rPr>
+              <w:instrText xml:space="preserve"> PAGEREF _Toc214753086 \h </w:instrText>
+            </w:r>
+            <w:r>
+              <w:rPr>
+                <w:noProof/>
+                <w:webHidden/>
+              </w:rPr>
+            </w:r>
+            <w:r>
+              <w:rPr>
+                <w:noProof/>
+                <w:webHidden/>
+              </w:rPr>
+              <w:fldChar w:fldCharType="separate"/>
+            </w:r>
+            <w:r>
+              <w:rPr>
+                <w:noProof/>
+                <w:webHidden/>
+              </w:rPr>
+              <w:t>28</w:t>
+            </w:r>
+            <w:r>
+              <w:rPr>
+                <w:noProof/>
+                <w:webHidden/>
+              </w:rPr>
+              <w:fldChar w:fldCharType="end"/>
+            </w:r>
+          </w:hyperlink>
+        </w:p>
+        <w:p>
+          <w:pPr>
+            <w:pStyle w:val="ndice2"/>
+            <w:tabs>
+              <w:tab w:val="right" w:leader="dot" w:pos="9350"/>
+            </w:tabs>
+            <w:rPr>
+              <w:rFonts w:asciiTheme="minorHAnsi" w:eastAsiaTheme="minorEastAsia" w:hAnsiTheme="minorHAnsi" w:cstheme="minorBidi"/>
+              <w:noProof/>
+              <w:kern w:val="2"/>
+              <w:sz w:val="24"/>
+              <w14:ligatures w14:val="standardContextual"/>
+            </w:rPr>
+          </w:pPr>
+          <w:hyperlink w:anchor="_Toc214753087" w:history="1">
+            <w:r>
+              <w:rPr>
+                <w:rStyle w:val="Hiperligao"/>
+                <w:noProof/>
+              </w:rPr>
+              <w:t>III.2 Sugestões de melhoria</w:t>
+            </w:r>
+            <w:r>
+              <w:rPr>
+                <w:noProof/>
+                <w:webHidden/>
+              </w:rPr>
+              <w:tab/>
+            </w:r>
+            <w:r>
+              <w:rPr>
+                <w:noProof/>
+                <w:webHidden/>
+              </w:rPr>
+              <w:fldChar w:fldCharType="begin"/>
+            </w:r>
+            <w:r>
+              <w:rPr>
+                <w:noProof/>
+                <w:webHidden/>
+              </w:rPr>
+              <w:instrText xml:space="preserve"> PAGEREF _Toc214753087 \h </w:instrText>
+            </w:r>
+            <w:r>
+              <w:rPr>
+                <w:noProof/>
+                <w:webHidden/>
+              </w:rPr>
+            </w:r>
+            <w:r>
+              <w:rPr>
+                <w:noProof/>
+                <w:webHidden/>
+              </w:rPr>
+              <w:fldChar w:fldCharType="separate"/>
+            </w:r>
+            <w:r>
+              <w:rPr>
+                <w:noProof/>
+                <w:webHidden/>
+              </w:rPr>
+              <w:t>28</w:t>
             </w:r>
             <w:r>
               <w:rPr>
@@ -2886,14 +3393,13 @@
               <w14:ligatures w14:val="standardContextual"/>
             </w:rPr>
           </w:pPr>
-          <w:hyperlink w:anchor="_Toc214752236" w:history="1">
+          <w:hyperlink w:anchor="_Toc214753088" w:history="1">
             <w:r>
               <w:rPr>
                 <w:rStyle w:val="Hiperligao"/>
-                <w:rFonts w:cstheme="minorHAnsi"/>
-                <w:noProof/>
-              </w:rPr>
-              <w:t>3.7.9</w:t>
+                <w:noProof/>
+              </w:rPr>
+              <w:t>Referências</w:t>
             </w:r>
             <w:r>
               <w:rPr>
@@ -2914,7 +3420,7 @@
                 <w:noProof/>
                 <w:webHidden/>
               </w:rPr>
-              <w:instrText xml:space="preserve"> PAGEREF _Toc214752236 \h </w:instrText>
+              <w:instrText xml:space="preserve"> PAGEREF _Toc214753088 \h </w:instrText>
             </w:r>
             <w:r>
               <w:rPr>
@@ -2934,7 +3440,80 @@
                 <w:noProof/>
                 <w:webHidden/>
               </w:rPr>
-              <w:t>25</w:t>
+              <w:t>29</w:t>
+            </w:r>
+            <w:r>
+              <w:rPr>
+                <w:noProof/>
+                <w:webHidden/>
+              </w:rPr>
+              <w:fldChar w:fldCharType="end"/>
+            </w:r>
+          </w:hyperlink>
+        </w:p>
+        <w:p>
+          <w:pPr>
+            <w:pStyle w:val="ndice1"/>
+            <w:tabs>
+              <w:tab w:val="right" w:leader="dot" w:pos="9350"/>
+            </w:tabs>
+            <w:rPr>
+              <w:rFonts w:asciiTheme="minorHAnsi" w:eastAsiaTheme="minorEastAsia" w:hAnsiTheme="minorHAnsi" w:cstheme="minorBidi"/>
+              <w:noProof/>
+              <w:kern w:val="2"/>
+              <w:sz w:val="24"/>
+              <w14:ligatures w14:val="standardContextual"/>
+            </w:rPr>
+          </w:pPr>
+          <w:hyperlink w:anchor="_Toc214753089" w:history="1">
+            <w:r>
+              <w:rPr>
+                <w:rStyle w:val="Hiperligao"/>
+                <w:rFonts w:eastAsia="Arial Narrow"/>
+                <w:noProof/>
+              </w:rPr>
+              <w:t>Anexos</w:t>
+            </w:r>
+            <w:r>
+              <w:rPr>
+                <w:noProof/>
+                <w:webHidden/>
+              </w:rPr>
+              <w:tab/>
+            </w:r>
+            <w:r>
+              <w:rPr>
+                <w:noProof/>
+                <w:webHidden/>
+              </w:rPr>
+              <w:fldChar w:fldCharType="begin"/>
+            </w:r>
+            <w:r>
+              <w:rPr>
+                <w:noProof/>
+                <w:webHidden/>
+              </w:rPr>
+              <w:instrText xml:space="preserve"> PAGEREF _Toc214753089 \h </w:instrText>
+            </w:r>
+            <w:r>
+              <w:rPr>
+                <w:noProof/>
+                <w:webHidden/>
+              </w:rPr>
+            </w:r>
+            <w:r>
+              <w:rPr>
+                <w:noProof/>
+                <w:webHidden/>
+              </w:rPr>
+              <w:fldChar w:fldCharType="separate"/>
+            </w:r>
+            <w:r>
+              <w:rPr>
+                <w:noProof/>
+                <w:webHidden/>
+              </w:rPr>
+              <w:t>30</w:t>
             </w:r>
             <w:r>
               <w:rPr>
@@ -2959,13 +3538,13 @@
               <w14:ligatures w14:val="standardContextual"/>
             </w:rPr>
           </w:pPr>
-          <w:hyperlink w:anchor="_Toc214752237" w:history="1">
+          <w:hyperlink w:anchor="_Toc214753090" w:history="1">
             <w:r>
               <w:rPr>
                 <w:rStyle w:val="Hiperligao"/>
                 <w:noProof/>
               </w:rPr>
-              <w:t>II.7 Marketing</w:t>
+              <w:t>Opções Estratégicas para o Porto de Sines (2020-2030)</w:t>
             </w:r>
             <w:r>
               <w:rPr>
@@ -2986,7 +3565,7 @@
                 <w:noProof/>
                 <w:webHidden/>
               </w:rPr>
-              <w:instrText xml:space="preserve"> PAGEREF _Toc214752237 \h </w:instrText>
+              <w:instrText xml:space="preserve"> PAGEREF _Toc214753090 \h </w:instrText>
             </w:r>
             <w:r>
               <w:rPr>
@@ -3006,7 +3585,7 @@
                 <w:noProof/>
                 <w:webHidden/>
               </w:rPr>
-              <w:t>27</w:t>
+              <w:t>30</w:t>
             </w:r>
             <w:r>
               <w:rPr>
@@ -3031,13 +3610,13 @@
               <w14:ligatures w14:val="standardContextual"/>
             </w:rPr>
           </w:pPr>
-          <w:hyperlink w:anchor="_Toc214752238" w:history="1">
+          <w:hyperlink w:anchor="_Toc214753091" w:history="1">
             <w:r>
               <w:rPr>
                 <w:rStyle w:val="Hiperligao"/>
                 <w:noProof/>
               </w:rPr>
-              <w:t>II. 8 Gestão Financeira</w:t>
+              <w:t>Ligações e Hinterland</w:t>
             </w:r>
             <w:r>
               <w:rPr>
@@ -3058,7 +3637,7 @@
                 <w:noProof/>
                 <w:webHidden/>
               </w:rPr>
-              <w:instrText xml:space="preserve"> PAGEREF _Toc214752238 \h </w:instrText>
+              <w:instrText xml:space="preserve"> PAGEREF _Toc214753091 \h </w:instrText>
             </w:r>
             <w:r>
               <w:rPr>
@@ -3078,7 +3657,7 @@
                 <w:noProof/>
                 <w:webHidden/>
               </w:rPr>
-              <w:t>27</w:t>
+              <w:t>34</w:t>
             </w:r>
             <w:r>
               <w:rPr>
@@ -3103,13 +3682,13 @@
               <w14:ligatures w14:val="standardContextual"/>
             </w:rPr>
           </w:pPr>
-          <w:hyperlink w:anchor="_Toc214752239" w:history="1">
+          <w:hyperlink w:anchor="_Toc214753092" w:history="1">
             <w:r>
               <w:rPr>
                 <w:rStyle w:val="Hiperligao"/>
                 <w:noProof/>
               </w:rPr>
-              <w:t>II.9 Gestão das Operações e Indústria 4.0</w:t>
+              <w:t>Estatísticas</w:t>
             </w:r>
             <w:r>
               <w:rPr>
@@ -3130,584 +3709,7 @@
                 <w:noProof/>
                 <w:webHidden/>
               </w:rPr>
-              <w:instrText xml:space="preserve"> PAGEREF _Toc214752239 \h </w:instrText>
-            </w:r>
-            <w:r>
-              <w:rPr>
-                <w:noProof/>
-                <w:webHidden/>
-              </w:rPr>
-            </w:r>
-            <w:r>
-              <w:rPr>
-                <w:noProof/>
-                <w:webHidden/>
-              </w:rPr>
-              <w:fldChar w:fldCharType="separate"/>
-            </w:r>
-            <w:r>
-              <w:rPr>
-                <w:noProof/>
-                <w:webHidden/>
-              </w:rPr>
-              <w:t>27</w:t>
-            </w:r>
-            <w:r>
-              <w:rPr>
-                <w:noProof/>
-                <w:webHidden/>
-              </w:rPr>
-              <w:fldChar w:fldCharType="end"/>
-            </w:r>
-          </w:hyperlink>
-        </w:p>
-        <w:p>
-          <w:pPr>
-            <w:pStyle w:val="ndice1"/>
-            <w:tabs>
-              <w:tab w:val="right" w:leader="dot" w:pos="9350"/>
-            </w:tabs>
-            <w:rPr>
-              <w:rFonts w:asciiTheme="minorHAnsi" w:eastAsiaTheme="minorEastAsia" w:hAnsiTheme="minorHAnsi" w:cstheme="minorBidi"/>
-              <w:noProof/>
-              <w:kern w:val="2"/>
-              <w:sz w:val="24"/>
-              <w14:ligatures w14:val="standardContextual"/>
-            </w:rPr>
-          </w:pPr>
-          <w:hyperlink w:anchor="_Toc214752240" w:history="1">
-            <w:r>
-              <w:rPr>
-                <w:rStyle w:val="Hiperligao"/>
-                <w:noProof/>
-              </w:rPr>
-              <w:t>Parte III – Conclusão</w:t>
-            </w:r>
-            <w:r>
-              <w:rPr>
-                <w:noProof/>
-                <w:webHidden/>
-              </w:rPr>
-              <w:tab/>
-            </w:r>
-            <w:r>
-              <w:rPr>
-                <w:noProof/>
-                <w:webHidden/>
-              </w:rPr>
-              <w:fldChar w:fldCharType="begin"/>
-            </w:r>
-            <w:r>
-              <w:rPr>
-                <w:noProof/>
-                <w:webHidden/>
-              </w:rPr>
-              <w:instrText xml:space="preserve"> PAGEREF _Toc214752240 \h </w:instrText>
-            </w:r>
-            <w:r>
-              <w:rPr>
-                <w:noProof/>
-                <w:webHidden/>
-              </w:rPr>
-            </w:r>
-            <w:r>
-              <w:rPr>
-                <w:noProof/>
-                <w:webHidden/>
-              </w:rPr>
-              <w:fldChar w:fldCharType="separate"/>
-            </w:r>
-            <w:r>
-              <w:rPr>
-                <w:noProof/>
-                <w:webHidden/>
-              </w:rPr>
-              <w:t>28</w:t>
-            </w:r>
-            <w:r>
-              <w:rPr>
-                <w:noProof/>
-                <w:webHidden/>
-              </w:rPr>
-              <w:fldChar w:fldCharType="end"/>
-            </w:r>
-          </w:hyperlink>
-        </w:p>
-        <w:p>
-          <w:pPr>
-            <w:pStyle w:val="ndice2"/>
-            <w:tabs>
-              <w:tab w:val="right" w:leader="dot" w:pos="9350"/>
-            </w:tabs>
-            <w:rPr>
-              <w:rFonts w:asciiTheme="minorHAnsi" w:eastAsiaTheme="minorEastAsia" w:hAnsiTheme="minorHAnsi" w:cstheme="minorBidi"/>
-              <w:noProof/>
-              <w:kern w:val="2"/>
-              <w:sz w:val="24"/>
-              <w14:ligatures w14:val="standardContextual"/>
-            </w:rPr>
-          </w:pPr>
-          <w:hyperlink w:anchor="_Toc214752241" w:history="1">
-            <w:r>
-              <w:rPr>
-                <w:rStyle w:val="Hiperligao"/>
-                <w:noProof/>
-              </w:rPr>
-              <w:t>III.1 Conclusão</w:t>
-            </w:r>
-            <w:r>
-              <w:rPr>
-                <w:noProof/>
-                <w:webHidden/>
-              </w:rPr>
-              <w:tab/>
-            </w:r>
-            <w:r>
-              <w:rPr>
-                <w:noProof/>
-                <w:webHidden/>
-              </w:rPr>
-              <w:fldChar w:fldCharType="begin"/>
-            </w:r>
-            <w:r>
-              <w:rPr>
-                <w:noProof/>
-                <w:webHidden/>
-              </w:rPr>
-              <w:instrText xml:space="preserve"> PAGEREF _Toc214752241 \h </w:instrText>
-            </w:r>
-            <w:r>
-              <w:rPr>
-                <w:noProof/>
-                <w:webHidden/>
-              </w:rPr>
-            </w:r>
-            <w:r>
-              <w:rPr>
-                <w:noProof/>
-                <w:webHidden/>
-              </w:rPr>
-              <w:fldChar w:fldCharType="separate"/>
-            </w:r>
-            <w:r>
-              <w:rPr>
-                <w:noProof/>
-                <w:webHidden/>
-              </w:rPr>
-              <w:t>28</w:t>
-            </w:r>
-            <w:r>
-              <w:rPr>
-                <w:noProof/>
-                <w:webHidden/>
-              </w:rPr>
-              <w:fldChar w:fldCharType="end"/>
-            </w:r>
-          </w:hyperlink>
-        </w:p>
-        <w:p>
-          <w:pPr>
-            <w:pStyle w:val="ndice2"/>
-            <w:tabs>
-              <w:tab w:val="right" w:leader="dot" w:pos="9350"/>
-            </w:tabs>
-            <w:rPr>
-              <w:rFonts w:asciiTheme="minorHAnsi" w:eastAsiaTheme="minorEastAsia" w:hAnsiTheme="minorHAnsi" w:cstheme="minorBidi"/>
-              <w:noProof/>
-              <w:kern w:val="2"/>
-              <w:sz w:val="24"/>
-              <w14:ligatures w14:val="standardContextual"/>
-            </w:rPr>
-          </w:pPr>
-          <w:hyperlink w:anchor="_Toc214752242" w:history="1">
-            <w:r>
-              <w:rPr>
-                <w:rStyle w:val="Hiperligao"/>
-                <w:noProof/>
-              </w:rPr>
-              <w:t>III.2 Sugestões de melhoria</w:t>
-            </w:r>
-            <w:r>
-              <w:rPr>
-                <w:noProof/>
-                <w:webHidden/>
-              </w:rPr>
-              <w:tab/>
-            </w:r>
-            <w:r>
-              <w:rPr>
-                <w:noProof/>
-                <w:webHidden/>
-              </w:rPr>
-              <w:fldChar w:fldCharType="begin"/>
-            </w:r>
-            <w:r>
-              <w:rPr>
-                <w:noProof/>
-                <w:webHidden/>
-              </w:rPr>
-              <w:instrText xml:space="preserve"> PAGEREF _Toc214752242 \h </w:instrText>
-            </w:r>
-            <w:r>
-              <w:rPr>
-                <w:noProof/>
-                <w:webHidden/>
-              </w:rPr>
-            </w:r>
-            <w:r>
-              <w:rPr>
-                <w:noProof/>
-                <w:webHidden/>
-              </w:rPr>
-              <w:fldChar w:fldCharType="separate"/>
-            </w:r>
-            <w:r>
-              <w:rPr>
-                <w:noProof/>
-                <w:webHidden/>
-              </w:rPr>
-              <w:t>28</w:t>
-            </w:r>
-            <w:r>
-              <w:rPr>
-                <w:noProof/>
-                <w:webHidden/>
-              </w:rPr>
-              <w:fldChar w:fldCharType="end"/>
-            </w:r>
-          </w:hyperlink>
-        </w:p>
-        <w:p>
-          <w:pPr>
-            <w:pStyle w:val="ndice1"/>
-            <w:tabs>
-              <w:tab w:val="right" w:leader="dot" w:pos="9350"/>
-            </w:tabs>
-            <w:rPr>
-              <w:rFonts w:asciiTheme="minorHAnsi" w:eastAsiaTheme="minorEastAsia" w:hAnsiTheme="minorHAnsi" w:cstheme="minorBidi"/>
-              <w:noProof/>
-              <w:kern w:val="2"/>
-              <w:sz w:val="24"/>
-              <w14:ligatures w14:val="standardContextual"/>
-            </w:rPr>
-          </w:pPr>
-          <w:hyperlink w:anchor="_Toc214752243" w:history="1">
-            <w:r>
-              <w:rPr>
-                <w:rStyle w:val="Hiperligao"/>
-                <w:noProof/>
-              </w:rPr>
-              <w:t>Referências</w:t>
-            </w:r>
-            <w:r>
-              <w:rPr>
-                <w:noProof/>
-                <w:webHidden/>
-              </w:rPr>
-              <w:tab/>
-            </w:r>
-            <w:r>
-              <w:rPr>
-                <w:noProof/>
-                <w:webHidden/>
-              </w:rPr>
-              <w:fldChar w:fldCharType="begin"/>
-            </w:r>
-            <w:r>
-              <w:rPr>
-                <w:noProof/>
-                <w:webHidden/>
-              </w:rPr>
-              <w:instrText xml:space="preserve"> PAGEREF _Toc214752243 \h </w:instrText>
-            </w:r>
-            <w:r>
-              <w:rPr>
-                <w:noProof/>
-                <w:webHidden/>
-              </w:rPr>
-            </w:r>
-            <w:r>
-              <w:rPr>
-                <w:noProof/>
-                <w:webHidden/>
-              </w:rPr>
-              <w:fldChar w:fldCharType="separate"/>
-            </w:r>
-            <w:r>
-              <w:rPr>
-                <w:noProof/>
-                <w:webHidden/>
-              </w:rPr>
-              <w:t>29</w:t>
-            </w:r>
-            <w:r>
-              <w:rPr>
-                <w:noProof/>
-                <w:webHidden/>
-              </w:rPr>
-              <w:fldChar w:fldCharType="end"/>
-            </w:r>
-          </w:hyperlink>
-        </w:p>
-        <w:p>
-          <w:pPr>
-            <w:pStyle w:val="ndice1"/>
-            <w:tabs>
-              <w:tab w:val="right" w:leader="dot" w:pos="9350"/>
-            </w:tabs>
-            <w:rPr>
-              <w:rFonts w:asciiTheme="minorHAnsi" w:eastAsiaTheme="minorEastAsia" w:hAnsiTheme="minorHAnsi" w:cstheme="minorBidi"/>
-              <w:noProof/>
-              <w:kern w:val="2"/>
-              <w:sz w:val="24"/>
-              <w14:ligatures w14:val="standardContextual"/>
-            </w:rPr>
-          </w:pPr>
-          <w:hyperlink w:anchor="_Toc214752244" w:history="1">
-            <w:r>
-              <w:rPr>
-                <w:rStyle w:val="Hiperligao"/>
-                <w:rFonts w:eastAsia="Arial Narrow"/>
-                <w:noProof/>
-              </w:rPr>
-              <w:t>Anexos</w:t>
-            </w:r>
-            <w:r>
-              <w:rPr>
-                <w:noProof/>
-                <w:webHidden/>
-              </w:rPr>
-              <w:tab/>
-            </w:r>
-            <w:r>
-              <w:rPr>
-                <w:noProof/>
-                <w:webHidden/>
-              </w:rPr>
-              <w:fldChar w:fldCharType="begin"/>
-            </w:r>
-            <w:r>
-              <w:rPr>
-                <w:noProof/>
-                <w:webHidden/>
-              </w:rPr>
-              <w:instrText xml:space="preserve"> PAGEREF _Toc214752244 \h </w:instrText>
-            </w:r>
-            <w:r>
-              <w:rPr>
-                <w:noProof/>
-                <w:webHidden/>
-              </w:rPr>
-            </w:r>
-            <w:r>
-              <w:rPr>
-                <w:noProof/>
-                <w:webHidden/>
-              </w:rPr>
-              <w:fldChar w:fldCharType="separate"/>
-            </w:r>
-            <w:r>
-              <w:rPr>
-                <w:noProof/>
-                <w:webHidden/>
-              </w:rPr>
-              <w:t>30</w:t>
-            </w:r>
-            <w:r>
-              <w:rPr>
-                <w:noProof/>
-                <w:webHidden/>
-              </w:rPr>
-              <w:fldChar w:fldCharType="end"/>
-            </w:r>
-          </w:hyperlink>
-        </w:p>
-        <w:p>
-          <w:pPr>
-            <w:pStyle w:val="ndice2"/>
-            <w:tabs>
-              <w:tab w:val="right" w:leader="dot" w:pos="9350"/>
-            </w:tabs>
-            <w:rPr>
-              <w:rFonts w:asciiTheme="minorHAnsi" w:eastAsiaTheme="minorEastAsia" w:hAnsiTheme="minorHAnsi" w:cstheme="minorBidi"/>
-              <w:noProof/>
-              <w:kern w:val="2"/>
-              <w:sz w:val="24"/>
-              <w14:ligatures w14:val="standardContextual"/>
-            </w:rPr>
-          </w:pPr>
-          <w:hyperlink w:anchor="_Toc214752245" w:history="1">
-            <w:r>
-              <w:rPr>
-                <w:rStyle w:val="Hiperligao"/>
-                <w:noProof/>
-              </w:rPr>
-              <w:t>Opções Estratégicas para o Porto de Sines (2020-2030)</w:t>
-            </w:r>
-            <w:r>
-              <w:rPr>
-                <w:noProof/>
-                <w:webHidden/>
-              </w:rPr>
-              <w:tab/>
-            </w:r>
-            <w:r>
-              <w:rPr>
-                <w:noProof/>
-                <w:webHidden/>
-              </w:rPr>
-              <w:fldChar w:fldCharType="begin"/>
-            </w:r>
-            <w:r>
-              <w:rPr>
-                <w:noProof/>
-                <w:webHidden/>
-              </w:rPr>
-              <w:instrText xml:space="preserve"> PAGEREF _Toc214752245 \h </w:instrText>
-            </w:r>
-            <w:r>
-              <w:rPr>
-                <w:noProof/>
-                <w:webHidden/>
-              </w:rPr>
-            </w:r>
-            <w:r>
-              <w:rPr>
-                <w:noProof/>
-                <w:webHidden/>
-              </w:rPr>
-              <w:fldChar w:fldCharType="separate"/>
-            </w:r>
-            <w:r>
-              <w:rPr>
-                <w:noProof/>
-                <w:webHidden/>
-              </w:rPr>
-              <w:t>30</w:t>
-            </w:r>
-            <w:r>
-              <w:rPr>
-                <w:noProof/>
-                <w:webHidden/>
-              </w:rPr>
-              <w:fldChar w:fldCharType="end"/>
-            </w:r>
-          </w:hyperlink>
-        </w:p>
-        <w:p>
-          <w:pPr>
-            <w:pStyle w:val="ndice2"/>
-            <w:tabs>
-              <w:tab w:val="right" w:leader="dot" w:pos="9350"/>
-            </w:tabs>
-            <w:rPr>
-              <w:rFonts w:asciiTheme="minorHAnsi" w:eastAsiaTheme="minorEastAsia" w:hAnsiTheme="minorHAnsi" w:cstheme="minorBidi"/>
-              <w:noProof/>
-              <w:kern w:val="2"/>
-              <w:sz w:val="24"/>
-              <w14:ligatures w14:val="standardContextual"/>
-            </w:rPr>
-          </w:pPr>
-          <w:hyperlink w:anchor="_Toc214752246" w:history="1">
-            <w:r>
-              <w:rPr>
-                <w:rStyle w:val="Hiperligao"/>
-                <w:noProof/>
-              </w:rPr>
-              <w:t>Ligações e Hinterland</w:t>
-            </w:r>
-            <w:r>
-              <w:rPr>
-                <w:noProof/>
-                <w:webHidden/>
-              </w:rPr>
-              <w:tab/>
-            </w:r>
-            <w:r>
-              <w:rPr>
-                <w:noProof/>
-                <w:webHidden/>
-              </w:rPr>
-              <w:fldChar w:fldCharType="begin"/>
-            </w:r>
-            <w:r>
-              <w:rPr>
-                <w:noProof/>
-                <w:webHidden/>
-              </w:rPr>
-              <w:instrText xml:space="preserve"> PAGEREF _Toc214752246 \h </w:instrText>
-            </w:r>
-            <w:r>
-              <w:rPr>
-                <w:noProof/>
-                <w:webHidden/>
-              </w:rPr>
-            </w:r>
-            <w:r>
-              <w:rPr>
-                <w:noProof/>
-                <w:webHidden/>
-              </w:rPr>
-              <w:fldChar w:fldCharType="separate"/>
-            </w:r>
-            <w:r>
-              <w:rPr>
-                <w:noProof/>
-                <w:webHidden/>
-              </w:rPr>
-              <w:t>34</w:t>
-            </w:r>
-            <w:r>
-              <w:rPr>
-                <w:noProof/>
-                <w:webHidden/>
-              </w:rPr>
-              <w:fldChar w:fldCharType="end"/>
-            </w:r>
-          </w:hyperlink>
-        </w:p>
-        <w:p>
-          <w:pPr>
-            <w:pStyle w:val="ndice2"/>
-            <w:tabs>
-              <w:tab w:val="right" w:leader="dot" w:pos="9350"/>
-            </w:tabs>
-            <w:rPr>
-              <w:rFonts w:asciiTheme="minorHAnsi" w:eastAsiaTheme="minorEastAsia" w:hAnsiTheme="minorHAnsi" w:cstheme="minorBidi"/>
-              <w:noProof/>
-              <w:kern w:val="2"/>
-              <w:sz w:val="24"/>
-              <w14:ligatures w14:val="standardContextual"/>
-            </w:rPr>
-          </w:pPr>
-          <w:hyperlink w:anchor="_Toc214752247" w:history="1">
-            <w:r>
-              <w:rPr>
-                <w:rStyle w:val="Hiperligao"/>
-                <w:noProof/>
-              </w:rPr>
-              <w:t>Estatísticas</w:t>
-            </w:r>
-            <w:r>
-              <w:rPr>
-                <w:noProof/>
-                <w:webHidden/>
-              </w:rPr>
-              <w:tab/>
-            </w:r>
-            <w:r>
-              <w:rPr>
-                <w:noProof/>
-                <w:webHidden/>
-              </w:rPr>
-              <w:fldChar w:fldCharType="begin"/>
-            </w:r>
-            <w:r>
-              <w:rPr>
-                <w:noProof/>
-                <w:webHidden/>
-              </w:rPr>
-              <w:instrText xml:space="preserve"> PAGEREF _Toc214752247 \h </w:instrText>
+              <w:instrText xml:space="preserve"> PAGEREF _Toc214753092 \h </w:instrText>
             </w:r>
             <w:r>
               <w:rPr>
@@ -3752,7 +3754,7 @@
               <w14:ligatures w14:val="standardContextual"/>
             </w:rPr>
           </w:pPr>
-          <w:hyperlink w:anchor="_Toc214752248" w:history="1">
+          <w:hyperlink w:anchor="_Toc214753093" w:history="1">
             <w:r>
               <w:rPr>
                 <w:rStyle w:val="Hiperligao"/>
@@ -3781,7 +3783,7 @@
                 <w:noProof/>
                 <w:webHidden/>
               </w:rPr>
-              <w:instrText xml:space="preserve"> PAGEREF _Toc214752248 \h </w:instrText>
+              <w:instrText xml:space="preserve"> PAGEREF _Toc214753093 \h </w:instrText>
             </w:r>
             <w:r>
               <w:rPr>
@@ -3826,7 +3828,7 @@
               <w14:ligatures w14:val="standardContextual"/>
             </w:rPr>
           </w:pPr>
-          <w:hyperlink w:anchor="_Toc214752249" w:history="1">
+          <w:hyperlink w:anchor="_Toc214753094" w:history="1">
             <w:r>
               <w:rPr>
                 <w:rStyle w:val="Hiperligao"/>
@@ -3855,7 +3857,7 @@
                 <w:noProof/>
                 <w:webHidden/>
               </w:rPr>
-              <w:instrText xml:space="preserve"> PAGEREF _Toc214752249 \h </w:instrText>
+              <w:instrText xml:space="preserve"> PAGEREF _Toc214753094 \h </w:instrText>
             </w:r>
             <w:r>
               <w:rPr>
@@ -3900,7 +3902,7 @@
               <w14:ligatures w14:val="standardContextual"/>
             </w:rPr>
           </w:pPr>
-          <w:hyperlink w:anchor="_Toc214752250" w:history="1">
+          <w:hyperlink w:anchor="_Toc214753095" w:history="1">
             <w:r>
               <w:rPr>
                 <w:rStyle w:val="Hiperligao"/>
@@ -3929,7 +3931,7 @@
                 <w:noProof/>
                 <w:webHidden/>
               </w:rPr>
-              <w:instrText xml:space="preserve"> PAGEREF _Toc214752250 \h </w:instrText>
+              <w:instrText xml:space="preserve"> PAGEREF _Toc214753095 \h </w:instrText>
             </w:r>
             <w:r>
               <w:rPr>
@@ -4007,7 +4009,7 @@
           <w:lang w:bidi="pt-PT"/>
         </w:rPr>
       </w:pPr>
-      <w:bookmarkStart w:id="4" w:name="_Toc214752205"/>
+      <w:bookmarkStart w:id="4" w:name="_Toc214753050"/>
       <w:r>
         <w:rPr>
           <w:sz w:val="24"/>
@@ -4033,7 +4035,7 @@
           <w:lang w:bidi="pt-PT"/>
         </w:rPr>
       </w:pPr>
-      <w:bookmarkStart w:id="5" w:name="_Toc214752206"/>
+      <w:bookmarkStart w:id="5" w:name="_Toc214753051"/>
       <w:r>
         <w:rPr>
           <w:lang w:bidi="pt-PT"/>
@@ -5437,7 +5439,7 @@
       <w:pPr>
         <w:pStyle w:val="Ttulo2"/>
       </w:pPr>
-      <w:bookmarkStart w:id="6" w:name="_Toc214752207"/>
+      <w:bookmarkStart w:id="6" w:name="_Toc214753052"/>
       <w:r>
         <w:t>Abreviaturas</w:t>
       </w:r>
@@ -5457,6 +5459,9 @@
     <w:p>
       <w:r>
         <w:t>ZALSINES</w:t>
+      </w:r>
+      <w:r>
+        <w:t>/ZILS</w:t>
       </w:r>
       <w:r>
         <w:t xml:space="preserve"> - </w:t>
@@ -6151,7 +6156,7 @@
       <w:pPr>
         <w:pStyle w:val="Ttulo1"/>
       </w:pPr>
-      <w:bookmarkStart w:id="7" w:name="_Toc214752208"/>
+      <w:bookmarkStart w:id="7" w:name="_Toc214753053"/>
       <w:r>
         <w:lastRenderedPageBreak/>
         <w:t>Parte I – Introdução e estrutura do trabalho</w:t>
@@ -6162,7 +6167,7 @@
       <w:pPr>
         <w:pStyle w:val="Ttulo2"/>
       </w:pPr>
-      <w:bookmarkStart w:id="8" w:name="_Toc214752209"/>
+      <w:bookmarkStart w:id="8" w:name="_Toc214753054"/>
       <w:r>
         <w:t>I.1 Caracterização da organização</w:t>
       </w:r>
@@ -6179,7 +6184,7 @@
           <w:szCs w:val="22"/>
         </w:rPr>
       </w:pPr>
-      <w:bookmarkStart w:id="9" w:name="_Toc214752210"/>
+      <w:bookmarkStart w:id="9" w:name="_Toc214753055"/>
       <w:r>
         <w:rPr>
           <w:b/>
@@ -6228,7 +6233,7 @@
           <w:szCs w:val="22"/>
         </w:rPr>
       </w:pPr>
-      <w:bookmarkStart w:id="10" w:name="_Toc214752211"/>
+      <w:bookmarkStart w:id="10" w:name="_Toc214753056"/>
       <w:r>
         <w:rPr>
           <w:b/>
@@ -6291,7 +6296,7 @@
           <w:szCs w:val="22"/>
         </w:rPr>
       </w:pPr>
-      <w:bookmarkStart w:id="11" w:name="_Toc214752212"/>
+      <w:bookmarkStart w:id="11" w:name="_Toc214753057"/>
       <w:r>
         <w:rPr>
           <w:b/>
@@ -6346,7 +6351,7 @@
           <w:szCs w:val="22"/>
         </w:rPr>
       </w:pPr>
-      <w:bookmarkStart w:id="12" w:name="_Toc214752213"/>
+      <w:bookmarkStart w:id="12" w:name="_Toc214753058"/>
       <w:r>
         <w:rPr>
           <w:b/>
@@ -6416,6 +6421,11 @@
       <w:r>
         <w:t>:</w:t>
       </w:r>
+    </w:p>
+    <w:p>
+      <w:pPr>
+        <w:spacing w:after="0" w:line="360" w:lineRule="auto"/>
+      </w:pPr>
     </w:p>
     <w:p>
       <w:pPr>
@@ -6477,6 +6487,7 @@
                 <w:b/>
                 <w:bCs/>
               </w:rPr>
+              <w:lastRenderedPageBreak/>
               <w:t>APS</w:t>
             </w:r>
           </w:p>
@@ -6594,7 +6605,6 @@
           </w:tcPr>
           <w:p>
             <w:r>
-              <w:lastRenderedPageBreak/>
               <w:t>Volume de negócios</w:t>
             </w:r>
           </w:p>
@@ -7646,7 +7656,7 @@
           <w:szCs w:val="22"/>
         </w:rPr>
       </w:pPr>
-      <w:bookmarkStart w:id="13" w:name="_Toc214752214"/>
+      <w:bookmarkStart w:id="13" w:name="_Toc214753059"/>
       <w:r>
         <w:rPr>
           <w:b/>
@@ -7755,6 +7765,7 @@
         <w:rPr>
           <w:u w:val="single"/>
         </w:rPr>
+        <w:lastRenderedPageBreak/>
         <w:t>Granéis sólidos</w:t>
       </w:r>
       <w:r>
@@ -7813,7 +7824,6 @@
         <w:rPr>
           <w:u w:val="single"/>
         </w:rPr>
-        <w:lastRenderedPageBreak/>
         <w:t>Gás natural:</w:t>
       </w:r>
       <w:r>
@@ -7851,7 +7861,7 @@
           <w:noProof/>
         </w:rPr>
         <w:drawing>
-          <wp:inline distT="0" distB="0" distL="0" distR="0" wp14:anchorId="68B4EA67" wp14:editId="605ADD76">
+          <wp:inline distT="0" distB="0" distL="0" distR="0" wp14:anchorId="68B4EA67" wp14:editId="6C2640F7">
             <wp:extent cx="5226685" cy="3020060"/>
             <wp:effectExtent l="19050" t="19050" r="12065" b="27940"/>
             <wp:docPr id="1965649793" name="Imagem 6" descr="Uma imagem com texto, mapa, captura de ecrã, diagrama&#10;&#10;Os conteúdos gerados por IA podem estar incorretos."/>
@@ -8015,12 +8025,6 @@
     </w:p>
     <w:p>
       <w:pPr>
-        <w:spacing w:line="240" w:lineRule="auto"/>
-        <w:jc w:val="left"/>
-      </w:pPr>
-    </w:p>
-    <w:p>
-      <w:pPr>
         <w:jc w:val="left"/>
         <w:rPr>
           <w:rFonts w:cs="Times New Roman"/>
@@ -8039,7 +8043,7 @@
           <w:szCs w:val="22"/>
         </w:rPr>
       </w:pPr>
-      <w:bookmarkStart w:id="15" w:name="_Toc214752215"/>
+      <w:bookmarkStart w:id="15" w:name="_Toc214753060"/>
       <w:r>
         <w:lastRenderedPageBreak/>
         <w:t xml:space="preserve">Parte II – </w:t>
@@ -8053,7 +8057,7 @@
       <w:pPr>
         <w:pStyle w:val="Ttulo2"/>
       </w:pPr>
-      <w:bookmarkStart w:id="16" w:name="_Toc214752216"/>
+      <w:bookmarkStart w:id="16" w:name="_Toc214753061"/>
       <w:r>
         <w:t>II.1 Organização</w:t>
       </w:r>
@@ -8073,7 +8077,7 @@
           <w:szCs w:val="22"/>
         </w:rPr>
       </w:pPr>
-      <w:bookmarkStart w:id="17" w:name="_Toc214752217"/>
+      <w:bookmarkStart w:id="17" w:name="_Toc214753062"/>
       <w:r>
         <w:rPr>
           <w:b/>
@@ -8353,7 +8357,7 @@
           <w:szCs w:val="22"/>
         </w:rPr>
       </w:pPr>
-      <w:bookmarkStart w:id="19" w:name="_Toc214752218"/>
+      <w:bookmarkStart w:id="19" w:name="_Toc214753063"/>
       <w:r>
         <w:rPr>
           <w:b/>
@@ -8563,7 +8567,7 @@
       <w:pPr>
         <w:pStyle w:val="Ttulo2"/>
       </w:pPr>
-      <w:bookmarkStart w:id="20" w:name="_Toc214752219"/>
+      <w:bookmarkStart w:id="20" w:name="_Toc214753064"/>
       <w:r>
         <w:t>II.2 Planeamento</w:t>
       </w:r>
@@ -8648,7 +8652,7 @@
           <w:szCs w:val="22"/>
         </w:rPr>
       </w:pPr>
-      <w:bookmarkStart w:id="21" w:name="_Toc214752220"/>
+      <w:bookmarkStart w:id="21" w:name="_Toc214753065"/>
       <w:r>
         <w:rPr>
           <w:b/>
@@ -8977,7 +8981,7 @@
           <w:szCs w:val="22"/>
         </w:rPr>
       </w:pPr>
-      <w:bookmarkStart w:id="22" w:name="_Toc214752221"/>
+      <w:bookmarkStart w:id="22" w:name="_Toc214753066"/>
       <w:r>
         <w:rPr>
           <w:b/>
@@ -9398,7 +9402,7 @@
           <w:szCs w:val="20"/>
         </w:rPr>
       </w:pPr>
-      <w:bookmarkStart w:id="23" w:name="_Toc214752222"/>
+      <w:bookmarkStart w:id="23" w:name="_Toc214753067"/>
       <w:r>
         <w:rPr>
           <w:b/>
@@ -9945,7 +9949,7 @@
           <w:szCs w:val="22"/>
         </w:rPr>
       </w:pPr>
-      <w:bookmarkStart w:id="24" w:name="_Toc214752223"/>
+      <w:bookmarkStart w:id="24" w:name="_Toc214753068"/>
       <w:r>
         <w:rPr>
           <w:b/>
@@ -10519,7 +10523,7 @@
       <w:pPr>
         <w:pStyle w:val="Ttulo2"/>
       </w:pPr>
-      <w:bookmarkStart w:id="25" w:name="_Toc214752224"/>
+      <w:bookmarkStart w:id="25" w:name="_Toc214753069"/>
       <w:r>
         <w:t>II.3 Controlo e Sistemas de informação</w:t>
       </w:r>
@@ -10536,7 +10540,7 @@
           <w:szCs w:val="22"/>
         </w:rPr>
       </w:pPr>
-      <w:bookmarkStart w:id="26" w:name="_Toc214752225"/>
+      <w:bookmarkStart w:id="26" w:name="_Toc214753070"/>
       <w:r>
         <w:rPr>
           <w:b/>
@@ -10562,84 +10566,90 @@
       </w:r>
     </w:p>
     <w:p>
-      <w:r>
+      <w:pPr>
         <w:rPr>
           <w:b/>
           <w:bCs/>
         </w:rPr>
-        <w:t>1.</w:t>
-      </w:r>
-      <w:r>
-        <w:t xml:space="preserve"> Auditoria Energética e Sistema de Gestão de Energia</w:t>
-      </w:r>
-    </w:p>
-    <w:p>
-      <w:r>
-        <w:t>A Auditoria Energética é uma ferramenta-chave para o controlo tático e operacional da APS, especialmente no âmbito da sua aposta na gestão sustentável. Este instrumento permite o conhecimento dos consumos de energia na APS e a procura da eficiência energética. Esta auditoria é essencial na tomada de decisão na área da gestão de energia, pois realiza um balanço entre os inputs totais de energia e a sua utilização, quantificando o uso de energia por setor e função. Os resultados mostram que os principais centros de consumo de energia da APS são a climatização, a iluminação e a frota automóvel, além das perdas na rede de distribuição de energia aos terminais.</w:t>
-      </w:r>
-    </w:p>
-    <w:p>
-      <w:r>
-        <w:rPr>
-          <w:u w:val="single"/>
-        </w:rPr>
-        <w:t>Vantagem:</w:t>
-      </w:r>
-      <w:r>
-        <w:t xml:space="preserve"> </w:t>
-      </w:r>
-      <w:r>
-        <w:t>Ajuda a APS a otimizar o uso de energia, melhorando a sua imagem e competitividade no mercado mundial</w:t>
-      </w:r>
-      <w:r>
-        <w:t>.</w:t>
-      </w:r>
-    </w:p>
-    <w:p>
-      <w:r>
-        <w:rPr>
-          <w:u w:val="single"/>
-        </w:rPr>
-        <w:t>Limitação:</w:t>
-      </w:r>
-      <w:r>
-        <w:t xml:space="preserve"> </w:t>
-      </w:r>
-      <w:r>
-        <w:t>A APS não possui fronteiras bem definidas, o que torna difícil distinguir todos os tipos de consumos</w:t>
-      </w:r>
-      <w:r>
-        <w:t>.</w:t>
-      </w:r>
-    </w:p>
-    <w:p>
-      <w:r>
-        <w:rPr>
-          <w:u w:val="single"/>
-        </w:rPr>
-        <w:t>Proposta de melhoria:</w:t>
-      </w:r>
-      <w:r>
-        <w:t xml:space="preserve"> </w:t>
-      </w:r>
-      <w:r>
-        <w:t>Desenvolvimento de um incentivo para a eficiência energética das empresas concessionárias dos terminais do Porto de Sines</w:t>
-      </w:r>
-      <w:r>
-        <w:t>.</w:t>
-      </w:r>
-    </w:p>
-    <w:p>
+      </w:pPr>
       <w:r>
         <w:rPr>
           <w:b/>
           <w:bCs/>
         </w:rPr>
+        <w:t>1. Auditoria Energética e Sistema de Gestão de Energia</w:t>
+      </w:r>
+    </w:p>
+    <w:p>
+      <w:r>
+        <w:t>A Auditoria Energética é uma ferramenta-chave para o controlo tático e operacional da APS, especialmente no âmbito da sua aposta na gestão sustentável. Este instrumento permite o conhecimento dos consumos de energia na APS e a procura da eficiência energética. Esta auditoria é essencial na tomada de decisão na área da gestão de energia, pois realiza um balanço entre os inputs totais de energia e a sua utilização, quantificando o uso de energia por setor e função. Os resultados mostram que os principais centros de consumo de energia da APS são a climatização, a iluminação e a frota automóvel, além das perdas na rede de distribuição de energia aos terminais.</w:t>
+      </w:r>
+    </w:p>
+    <w:p>
+      <w:r>
+        <w:rPr>
+          <w:u w:val="single"/>
+        </w:rPr>
+        <w:t>Vantagem:</w:t>
+      </w:r>
+      <w:r>
+        <w:t xml:space="preserve"> </w:t>
+      </w:r>
+      <w:r>
+        <w:t>Ajuda a APS a otimizar o uso de energia, melhorando a sua imagem e competitividade no mercado mundial</w:t>
+      </w:r>
+      <w:r>
+        <w:t>.</w:t>
+      </w:r>
+    </w:p>
+    <w:p>
+      <w:r>
+        <w:rPr>
+          <w:u w:val="single"/>
+        </w:rPr>
+        <w:t>Limitação:</w:t>
+      </w:r>
+      <w:r>
+        <w:t xml:space="preserve"> </w:t>
+      </w:r>
+      <w:r>
+        <w:t>A APS não possui fronteiras bem definidas, o que torna difícil distinguir todos os tipos de consumos</w:t>
+      </w:r>
+      <w:r>
+        <w:t>.</w:t>
+      </w:r>
+    </w:p>
+    <w:p>
+      <w:r>
+        <w:rPr>
+          <w:u w:val="single"/>
+        </w:rPr>
+        <w:t>Proposta de melhoria:</w:t>
+      </w:r>
+      <w:r>
+        <w:t xml:space="preserve"> </w:t>
+      </w:r>
+      <w:r>
+        <w:t>Desenvolvimento de um incentivo para a eficiência energética das empresas concessionárias dos terminais do Porto de Sines</w:t>
+      </w:r>
+      <w:r>
+        <w:t>.</w:t>
+      </w:r>
+    </w:p>
+    <w:p>
+      <w:pPr>
+        <w:rPr>
+          <w:b/>
+          <w:bCs/>
+        </w:rPr>
+      </w:pPr>
+      <w:r>
+        <w:rPr>
+          <w:b/>
+          <w:bCs/>
+        </w:rPr>
         <w:lastRenderedPageBreak/>
-        <w:t>2.</w:t>
-      </w:r>
-      <w:r>
-        <w:t xml:space="preserve"> Sistemas de Certificação e Relatório de Sustentabilidade</w:t>
+        <w:t>2. Sistemas de Certificação e Relatório de Sustentabilidade</w:t>
       </w:r>
     </w:p>
     <w:p>
@@ -10744,15 +10754,18 @@
       </w:r>
     </w:p>
     <w:p>
-      <w:r>
+      <w:pPr>
         <w:rPr>
           <w:b/>
           <w:bCs/>
         </w:rPr>
-        <w:t>3.</w:t>
-      </w:r>
-      <w:r>
-        <w:t xml:space="preserve"> Sistemas de Informação Geográfica e Software de Processamento</w:t>
+      </w:pPr>
+      <w:r>
+        <w:rPr>
+          <w:b/>
+          <w:bCs/>
+        </w:rPr>
+        <w:t>3. Sistemas de Informação Geográfica e Software de Processamento</w:t>
       </w:r>
     </w:p>
     <w:p>
@@ -10873,15 +10886,18 @@
       </w:r>
     </w:p>
     <w:p>
-      <w:r>
+      <w:pPr>
         <w:rPr>
           <w:b/>
           <w:bCs/>
         </w:rPr>
-        <w:t>4.</w:t>
-      </w:r>
-      <w:r>
-        <w:t xml:space="preserve"> Instrumentos de Controlo no Planeamento da Transição Energética</w:t>
+      </w:pPr>
+      <w:r>
+        <w:rPr>
+          <w:b/>
+          <w:bCs/>
+        </w:rPr>
+        <w:t>4. Instrumentos de Controlo no Planeamento da Transição Energética</w:t>
       </w:r>
     </w:p>
     <w:p>
@@ -10933,7 +10949,7 @@
           <w:szCs w:val="22"/>
         </w:rPr>
       </w:pPr>
-      <w:bookmarkStart w:id="28" w:name="_Toc214752226"/>
+      <w:bookmarkStart w:id="28" w:name="_Toc214753071"/>
       <w:r>
         <w:rPr>
           <w:b/>
@@ -10990,7 +11006,7 @@
           <w:szCs w:val="22"/>
         </w:rPr>
       </w:pPr>
-      <w:bookmarkStart w:id="30" w:name="_Toc214752227"/>
+      <w:bookmarkStart w:id="30" w:name="_Toc214753072"/>
       <w:r>
         <w:rPr>
           <w:b/>
@@ -11054,7 +11070,19 @@
         <w:rPr>
           <w:rFonts w:asciiTheme="minorHAnsi" w:hAnsiTheme="minorHAnsi" w:cstheme="minorHAnsi"/>
         </w:rPr>
-        <w:t xml:space="preserve"> Pro - Utilizado para integrar a informação das cartas geológicas</w:t>
+        <w:t xml:space="preserve"> Pro - </w:t>
+      </w:r>
+      <w:r>
+        <w:rPr>
+          <w:rFonts w:asciiTheme="minorHAnsi" w:hAnsiTheme="minorHAnsi" w:cstheme="minorHAnsi"/>
+        </w:rPr>
+        <w:t>u</w:t>
+      </w:r>
+      <w:r>
+        <w:rPr>
+          <w:rFonts w:asciiTheme="minorHAnsi" w:hAnsiTheme="minorHAnsi" w:cstheme="minorHAnsi"/>
+        </w:rPr>
+        <w:t>tilizado para integrar a informação das cartas geológicas</w:t>
       </w:r>
     </w:p>
     <w:p>
@@ -11341,7 +11369,7 @@
           <w:color w:val="EE0000"/>
         </w:rPr>
       </w:pPr>
-      <w:bookmarkStart w:id="32" w:name="_Toc214752228"/>
+      <w:bookmarkStart w:id="32" w:name="_Toc214753073"/>
       <w:r>
         <w:lastRenderedPageBreak/>
         <w:t>II.</w:t>
@@ -11365,7 +11393,7 @@
           <w:szCs w:val="22"/>
         </w:rPr>
       </w:pPr>
-      <w:bookmarkStart w:id="33" w:name="_Toc214752229"/>
+      <w:bookmarkStart w:id="33" w:name="_Toc214753074"/>
       <w:r>
         <w:rPr>
           <w:b/>
@@ -11504,7 +11532,7 @@
           <w:szCs w:val="22"/>
         </w:rPr>
       </w:pPr>
-      <w:bookmarkStart w:id="34" w:name="_Toc214752230"/>
+      <w:bookmarkStart w:id="34" w:name="_Toc214753075"/>
       <w:r>
         <w:rPr>
           <w:b/>
@@ -11826,7 +11854,7 @@
           <w:szCs w:val="22"/>
         </w:rPr>
       </w:pPr>
-      <w:bookmarkStart w:id="35" w:name="_Toc214752231"/>
+      <w:bookmarkStart w:id="35" w:name="_Toc214753076"/>
       <w:r>
         <w:rPr>
           <w:b/>
@@ -12168,12 +12196,14 @@
         </w:rPr>
         <w:t xml:space="preserve">- </w:t>
       </w:r>
-      <w:r>
-        <w:rPr>
-          <w:rFonts w:asciiTheme="minorHAnsi" w:hAnsiTheme="minorHAnsi" w:cstheme="minorHAnsi"/>
-        </w:rPr>
-        <w:t>A</w:t>
-      </w:r>
+      <w:proofErr w:type="gramStart"/>
+      <w:r>
+        <w:rPr>
+          <w:rFonts w:asciiTheme="minorHAnsi" w:hAnsiTheme="minorHAnsi" w:cstheme="minorHAnsi"/>
+        </w:rPr>
+        <w:t>a</w:t>
+      </w:r>
+      <w:proofErr w:type="gramEnd"/>
       <w:r>
         <w:rPr>
           <w:rFonts w:asciiTheme="minorHAnsi" w:hAnsiTheme="minorHAnsi" w:cstheme="minorHAnsi"/>
@@ -12228,7 +12258,13 @@
         <w:rPr>
           <w:rFonts w:asciiTheme="minorHAnsi" w:hAnsiTheme="minorHAnsi" w:cstheme="minorHAnsi"/>
         </w:rPr>
-        <w:t xml:space="preserve">A </w:t>
+        <w:t>a</w:t>
+      </w:r>
+      <w:r>
+        <w:rPr>
+          <w:rFonts w:asciiTheme="minorHAnsi" w:hAnsiTheme="minorHAnsi" w:cstheme="minorHAnsi"/>
+        </w:rPr>
+        <w:t xml:space="preserve"> </w:t>
       </w:r>
       <w:r>
         <w:rPr>
@@ -12268,12 +12304,14 @@
         </w:rPr>
         <w:t xml:space="preserve"> - </w:t>
       </w:r>
-      <w:r>
-        <w:rPr>
-          <w:rFonts w:asciiTheme="minorHAnsi" w:hAnsiTheme="minorHAnsi" w:cstheme="minorHAnsi"/>
-        </w:rPr>
-        <w:t>É</w:t>
-      </w:r>
+      <w:proofErr w:type="gramStart"/>
+      <w:r>
+        <w:rPr>
+          <w:rFonts w:asciiTheme="minorHAnsi" w:hAnsiTheme="minorHAnsi" w:cstheme="minorHAnsi"/>
+        </w:rPr>
+        <w:t>é</w:t>
+      </w:r>
+      <w:proofErr w:type="gramEnd"/>
       <w:r>
         <w:rPr>
           <w:rFonts w:asciiTheme="minorHAnsi" w:hAnsiTheme="minorHAnsi" w:cstheme="minorHAnsi"/>
@@ -12324,12 +12362,14 @@
         </w:rPr>
         <w:t xml:space="preserve"> </w:t>
       </w:r>
-      <w:r>
-        <w:rPr>
-          <w:rFonts w:asciiTheme="minorHAnsi" w:hAnsiTheme="minorHAnsi" w:cstheme="minorHAnsi"/>
-        </w:rPr>
-        <w:t>A</w:t>
-      </w:r>
+      <w:proofErr w:type="gramStart"/>
+      <w:r>
+        <w:rPr>
+          <w:rFonts w:asciiTheme="minorHAnsi" w:hAnsiTheme="minorHAnsi" w:cstheme="minorHAnsi"/>
+        </w:rPr>
+        <w:t>a</w:t>
+      </w:r>
+      <w:proofErr w:type="gramEnd"/>
       <w:r>
         <w:rPr>
           <w:rFonts w:asciiTheme="minorHAnsi" w:hAnsiTheme="minorHAnsi" w:cstheme="minorHAnsi"/>
@@ -12386,7 +12426,13 @@
         <w:rPr>
           <w:rFonts w:asciiTheme="minorHAnsi" w:hAnsiTheme="minorHAnsi" w:cstheme="minorHAnsi"/>
         </w:rPr>
-        <w:t>- A</w:t>
+        <w:t xml:space="preserve">- </w:t>
+      </w:r>
+      <w:r>
+        <w:rPr>
+          <w:rFonts w:asciiTheme="minorHAnsi" w:hAnsiTheme="minorHAnsi" w:cstheme="minorHAnsi"/>
+        </w:rPr>
+        <w:t>a</w:t>
       </w:r>
       <w:r>
         <w:rPr>
@@ -12413,210 +12459,150 @@
       <w:pPr>
         <w:pStyle w:val="Ttulo2"/>
       </w:pPr>
-      <w:bookmarkStart w:id="36" w:name="_Toc214752232"/>
+      <w:bookmarkStart w:id="36" w:name="_Toc214753077"/>
       <w:r>
         <w:t>II.5 Promoção da produtividade</w:t>
       </w:r>
-      <w:r>
-        <w:t xml:space="preserve"> --- </w:t>
-      </w:r>
-      <w:r>
-        <w:rPr>
-          <w:color w:val="EE0000"/>
-        </w:rPr>
-        <w:t>(3.7.</w:t>
-      </w:r>
-      <w:r>
-        <w:rPr>
-          <w:color w:val="EE0000"/>
-        </w:rPr>
-        <w:t>8</w:t>
-      </w:r>
-      <w:r>
-        <w:rPr>
-          <w:color w:val="EE0000"/>
-        </w:rPr>
-        <w:t>)</w:t>
-      </w:r>
       <w:bookmarkEnd w:id="36"/>
     </w:p>
     <w:p>
       <w:pPr>
-        <w:pStyle w:val="Ttulo1"/>
-        <w:rPr>
-          <w:sz w:val="24"/>
-        </w:rPr>
-      </w:pPr>
-      <w:bookmarkStart w:id="37" w:name="_Toc214752233"/>
-      <w:r>
-        <w:rPr>
-          <w:sz w:val="24"/>
-        </w:rPr>
-        <w:t>3.7.8</w:t>
-      </w:r>
-      <w:bookmarkEnd w:id="37"/>
-      <w:r>
-        <w:rPr>
-          <w:sz w:val="24"/>
-        </w:rPr>
-        <w:t xml:space="preserve"> </w:t>
-      </w:r>
-    </w:p>
-    <w:p>
-      <w:pPr>
-        <w:rPr>
-          <w:sz w:val="24"/>
-        </w:rPr>
-      </w:pPr>
-      <w:r>
-        <w:rPr>
-          <w:sz w:val="24"/>
-        </w:rPr>
-        <w:t>A Administração do Porto de Sines (APS) adota uma gestão orientada para a melhoria contínua da eficiência e da produtividade, tanto na gestão de pessoas</w:t>
-      </w:r>
-      <w:r>
-        <w:rPr>
-          <w:sz w:val="24"/>
-        </w:rPr>
-        <w:t>, como</w:t>
-      </w:r>
-      <w:r>
-        <w:rPr>
-          <w:sz w:val="24"/>
-        </w:rPr>
-        <w:t xml:space="preserve"> na otimização de processos operacionais e no desenvolvimento de infraestruturas estratégicas.</w:t>
-      </w:r>
-    </w:p>
-    <w:p>
-      <w:pPr>
-        <w:rPr>
-          <w:sz w:val="24"/>
-        </w:rPr>
-      </w:pPr>
-      <w:r>
-        <w:rPr>
-          <w:sz w:val="24"/>
-        </w:rPr>
-        <w:t>Abaixo</w:t>
-      </w:r>
-      <w:r>
-        <w:rPr>
-          <w:sz w:val="24"/>
-        </w:rPr>
-        <w:t xml:space="preserve"> estão destacadas as práticas que favorecem a produtividade na empresa e </w:t>
-      </w:r>
-      <w:r>
-        <w:rPr>
-          <w:sz w:val="24"/>
-        </w:rPr>
-        <w:t>o seu impacto:</w:t>
-      </w:r>
-    </w:p>
-    <w:p>
-      <w:pPr>
+        <w:pStyle w:val="Ttulo3"/>
         <w:rPr>
           <w:b/>
           <w:bCs/>
-          <w:sz w:val="24"/>
-        </w:rPr>
-      </w:pPr>
-    </w:p>
-    <w:p>
-      <w:pPr>
-        <w:rPr>
-          <w:rFonts w:asciiTheme="minorHAnsi" w:hAnsiTheme="minorHAnsi" w:cstheme="minorHAnsi"/>
+          <w:color w:val="auto"/>
+          <w:sz w:val="22"/>
+          <w:szCs w:val="22"/>
+        </w:rPr>
+      </w:pPr>
+      <w:bookmarkStart w:id="37" w:name="_Toc214753078"/>
+      <w:r>
+        <w:rPr>
           <w:b/>
           <w:bCs/>
-          <w:sz w:val="24"/>
-        </w:rPr>
-      </w:pPr>
-      <w:r>
-        <w:rPr>
-          <w:rFonts w:asciiTheme="minorHAnsi" w:hAnsiTheme="minorHAnsi" w:cstheme="minorHAnsi"/>
+          <w:color w:val="auto"/>
+          <w:sz w:val="22"/>
+          <w:szCs w:val="22"/>
+        </w:rPr>
+        <w:t>3.7.8</w:t>
+      </w:r>
+      <w:bookmarkEnd w:id="37"/>
+      <w:r>
+        <w:rPr>
           <w:b/>
           <w:bCs/>
-          <w:sz w:val="24"/>
-        </w:rPr>
-        <w:lastRenderedPageBreak/>
-        <w:t xml:space="preserve">- </w:t>
-      </w:r>
-      <w:r>
+          <w:color w:val="auto"/>
+          <w:sz w:val="22"/>
+          <w:szCs w:val="22"/>
+        </w:rPr>
+        <w:t xml:space="preserve"> </w:t>
+      </w:r>
+    </w:p>
+    <w:p>
+      <w:pPr>
+        <w:rPr>
+          <w:szCs w:val="22"/>
+        </w:rPr>
+      </w:pPr>
+      <w:r>
+        <w:rPr>
+          <w:szCs w:val="22"/>
+        </w:rPr>
+        <w:t>A Administração do Porto de Sines (APS) adota uma gestão orientada para a melhoria contínua da eficiência e da produtividade, tanto na gestão de pessoas, como na otimização de processos operacionais e no desenvolvimento de infraestruturas estratégicas.</w:t>
+      </w:r>
+    </w:p>
+    <w:p>
+      <w:pPr>
+        <w:rPr>
+          <w:szCs w:val="22"/>
+        </w:rPr>
+      </w:pPr>
+      <w:r>
+        <w:rPr>
+          <w:szCs w:val="22"/>
+        </w:rPr>
+        <w:t>Abaixo estão destacadas as práticas que favorecem a produtividade na empresa e o seu impacto:</w:t>
+      </w:r>
+    </w:p>
+    <w:p>
+      <w:pPr>
         <w:rPr>
           <w:rFonts w:asciiTheme="minorHAnsi" w:hAnsiTheme="minorHAnsi" w:cstheme="minorHAnsi"/>
           <w:b/>
           <w:bCs/>
-          <w:sz w:val="24"/>
-        </w:rPr>
-        <w:t>Otimização de Processos e Gestão Operacional</w:t>
-      </w:r>
-    </w:p>
-    <w:p>
-      <w:pPr>
-        <w:spacing w:line="259" w:lineRule="auto"/>
-        <w:rPr>
-          <w:rFonts w:asciiTheme="minorHAnsi" w:hAnsiTheme="minorHAnsi" w:cstheme="minorHAnsi"/>
-          <w:sz w:val="24"/>
-        </w:rPr>
-      </w:pPr>
-      <w:r>
-        <w:rPr>
-          <w:rFonts w:asciiTheme="minorHAnsi" w:hAnsiTheme="minorHAnsi" w:cstheme="minorHAnsi"/>
-          <w:sz w:val="24"/>
-        </w:rPr>
-        <w:t xml:space="preserve">A APS adotou um sistema de gestão certificado que abrange qualidade, meio ambiente e segurança, além de implementar o Programa APS Eficiente, que inclui auditorias energéticas. Também foram introduzidas sessões de formação sobre </w:t>
-      </w:r>
-      <w:proofErr w:type="spellStart"/>
-      <w:r>
-        <w:rPr>
-          <w:rFonts w:asciiTheme="minorHAnsi" w:hAnsiTheme="minorHAnsi" w:cstheme="minorHAnsi"/>
-          <w:sz w:val="24"/>
-        </w:rPr>
-        <w:t>eco-condução</w:t>
-      </w:r>
-      <w:proofErr w:type="spellEnd"/>
-      <w:r>
-        <w:rPr>
-          <w:rFonts w:asciiTheme="minorHAnsi" w:hAnsiTheme="minorHAnsi" w:cstheme="minorHAnsi"/>
-          <w:sz w:val="24"/>
-        </w:rPr>
-        <w:t xml:space="preserve"> para os colaboradores, focando no consumo de energia da frota automóvel, e a APS realiza auditorias anuais aos concessionários e licenciados.</w:t>
-      </w:r>
-    </w:p>
-    <w:p>
-      <w:pPr>
-        <w:spacing w:line="259" w:lineRule="auto"/>
-        <w:rPr>
-          <w:rFonts w:asciiTheme="minorHAnsi" w:hAnsiTheme="minorHAnsi" w:cstheme="minorHAnsi"/>
-          <w:sz w:val="24"/>
-        </w:rPr>
-      </w:pPr>
-    </w:p>
-    <w:p>
-      <w:pPr>
+          <w:szCs w:val="22"/>
+        </w:rPr>
+      </w:pPr>
+      <w:r>
         <w:rPr>
           <w:rFonts w:asciiTheme="minorHAnsi" w:hAnsiTheme="minorHAnsi" w:cstheme="minorHAnsi"/>
           <w:b/>
           <w:bCs/>
-          <w:sz w:val="24"/>
-        </w:rPr>
-      </w:pPr>
-      <w:r>
+          <w:szCs w:val="22"/>
+        </w:rPr>
+        <w:t>Otimização de Processos e Gestão Operacional</w:t>
+      </w:r>
+    </w:p>
+    <w:p>
+      <w:pPr>
+        <w:spacing w:line="259" w:lineRule="auto"/>
+        <w:rPr>
+          <w:rFonts w:asciiTheme="minorHAnsi" w:hAnsiTheme="minorHAnsi" w:cstheme="minorHAnsi"/>
+          <w:szCs w:val="22"/>
+        </w:rPr>
+      </w:pPr>
+      <w:r>
+        <w:rPr>
+          <w:rFonts w:asciiTheme="minorHAnsi" w:hAnsiTheme="minorHAnsi" w:cstheme="minorHAnsi"/>
+          <w:szCs w:val="22"/>
+        </w:rPr>
+        <w:lastRenderedPageBreak/>
+        <w:t xml:space="preserve">A APS adotou um sistema de gestão certificado que abrange qualidade, meio ambiente e segurança, além de implementar o Programa APS Eficiente, que inclui auditorias energéticas. Também foram introduzidas sessões de formação sobre </w:t>
+      </w:r>
+      <w:proofErr w:type="spellStart"/>
+      <w:r>
+        <w:rPr>
+          <w:rFonts w:asciiTheme="minorHAnsi" w:hAnsiTheme="minorHAnsi" w:cstheme="minorHAnsi"/>
+          <w:szCs w:val="22"/>
+        </w:rPr>
+        <w:t>eco-condução</w:t>
+      </w:r>
+      <w:proofErr w:type="spellEnd"/>
+      <w:r>
+        <w:rPr>
+          <w:rFonts w:asciiTheme="minorHAnsi" w:hAnsiTheme="minorHAnsi" w:cstheme="minorHAnsi"/>
+          <w:szCs w:val="22"/>
+        </w:rPr>
+        <w:t xml:space="preserve"> para os colaboradores, focando no consumo de energia da frota automóvel, e a APS realiza auditorias anuais aos concessionários e licenciados.</w:t>
+      </w:r>
+    </w:p>
+    <w:p>
+      <w:pPr>
         <w:rPr>
           <w:rFonts w:asciiTheme="minorHAnsi" w:hAnsiTheme="minorHAnsi" w:cstheme="minorHAnsi"/>
           <w:b/>
           <w:bCs/>
-          <w:sz w:val="24"/>
-        </w:rPr>
-        <w:t xml:space="preserve">- </w:t>
-      </w:r>
+          <w:szCs w:val="22"/>
+        </w:rPr>
+      </w:pPr>
       <w:r>
         <w:rPr>
           <w:rFonts w:asciiTheme="minorHAnsi" w:hAnsiTheme="minorHAnsi" w:cstheme="minorHAnsi"/>
           <w:b/>
           <w:bCs/>
-          <w:sz w:val="24"/>
-        </w:rPr>
-        <w:t>Práticas Culturais, Incentivos e Gestão de Recursos Humanos</w:t>
+          <w:szCs w:val="22"/>
+        </w:rPr>
+        <w:t>P</w:t>
+      </w:r>
+      <w:r>
+        <w:rPr>
+          <w:rFonts w:asciiTheme="minorHAnsi" w:hAnsiTheme="minorHAnsi" w:cstheme="minorHAnsi"/>
+          <w:b/>
+          <w:bCs/>
+          <w:szCs w:val="22"/>
+        </w:rPr>
+        <w:t>ráticas Culturais, Incentivos e Gestão de Recursos Humanos</w:t>
       </w:r>
     </w:p>
     <w:p>
@@ -12630,25 +12616,37 @@
         <w:jc w:val="left"/>
         <w:rPr>
           <w:rFonts w:asciiTheme="minorHAnsi" w:hAnsiTheme="minorHAnsi" w:cstheme="minorHAnsi"/>
-          <w:sz w:val="24"/>
-          <w:szCs w:val="24"/>
-        </w:rPr>
-      </w:pPr>
-      <w:r>
-        <w:rPr>
-          <w:rFonts w:asciiTheme="minorHAnsi" w:hAnsiTheme="minorHAnsi" w:cstheme="minorHAnsi"/>
-          <w:b/>
-          <w:bCs/>
-          <w:sz w:val="24"/>
-          <w:szCs w:val="24"/>
-        </w:rPr>
-        <w:t>promoção da melhoria continua –</w:t>
-      </w:r>
-      <w:r>
-        <w:rPr>
-          <w:rFonts w:asciiTheme="minorHAnsi" w:hAnsiTheme="minorHAnsi" w:cstheme="minorHAnsi"/>
-          <w:sz w:val="24"/>
-          <w:szCs w:val="24"/>
+          <w:szCs w:val="22"/>
+        </w:rPr>
+      </w:pPr>
+      <w:r>
+        <w:rPr>
+          <w:rFonts w:asciiTheme="minorHAnsi" w:hAnsiTheme="minorHAnsi" w:cstheme="minorHAnsi"/>
+          <w:szCs w:val="22"/>
+          <w:u w:val="single"/>
+        </w:rPr>
+        <w:t>P</w:t>
+      </w:r>
+      <w:r>
+        <w:rPr>
+          <w:rFonts w:asciiTheme="minorHAnsi" w:hAnsiTheme="minorHAnsi" w:cstheme="minorHAnsi"/>
+          <w:szCs w:val="22"/>
+          <w:u w:val="single"/>
+        </w:rPr>
+        <w:t xml:space="preserve">romoção da melhoria continua </w:t>
+      </w:r>
+      <w:r>
+        <w:rPr>
+          <w:rFonts w:asciiTheme="minorHAnsi" w:hAnsiTheme="minorHAnsi" w:cstheme="minorHAnsi"/>
+          <w:szCs w:val="22"/>
+          <w:u w:val="single"/>
+        </w:rPr>
+        <w:t>-</w:t>
+      </w:r>
+      <w:r>
+        <w:rPr>
+          <w:rFonts w:asciiTheme="minorHAnsi" w:hAnsiTheme="minorHAnsi" w:cstheme="minorHAnsi"/>
+          <w:szCs w:val="22"/>
         </w:rPr>
         <w:t xml:space="preserve"> é privilegiada a comunicação vertical, sendo disponibilizado um canal para os trabalhadores fazerem recomendações ao conselho de administração;</w:t>
       </w:r>
@@ -12664,25 +12662,37 @@
         <w:jc w:val="left"/>
         <w:rPr>
           <w:rFonts w:asciiTheme="minorHAnsi" w:hAnsiTheme="minorHAnsi" w:cstheme="minorHAnsi"/>
-          <w:sz w:val="24"/>
-          <w:szCs w:val="24"/>
-        </w:rPr>
-      </w:pPr>
-      <w:r>
-        <w:rPr>
-          <w:rFonts w:asciiTheme="minorHAnsi" w:hAnsiTheme="minorHAnsi" w:cstheme="minorHAnsi"/>
-          <w:b/>
-          <w:bCs/>
-          <w:sz w:val="24"/>
-          <w:szCs w:val="24"/>
-        </w:rPr>
-        <w:t>foco na competência e atração de capital humano –</w:t>
-      </w:r>
-      <w:r>
-        <w:rPr>
-          <w:rFonts w:asciiTheme="minorHAnsi" w:hAnsiTheme="minorHAnsi" w:cstheme="minorHAnsi"/>
-          <w:sz w:val="24"/>
-          <w:szCs w:val="24"/>
+          <w:szCs w:val="22"/>
+        </w:rPr>
+      </w:pPr>
+      <w:r>
+        <w:rPr>
+          <w:rFonts w:asciiTheme="minorHAnsi" w:hAnsiTheme="minorHAnsi" w:cstheme="minorHAnsi"/>
+          <w:szCs w:val="22"/>
+          <w:u w:val="single"/>
+        </w:rPr>
+        <w:t>f</w:t>
+      </w:r>
+      <w:r>
+        <w:rPr>
+          <w:rFonts w:asciiTheme="minorHAnsi" w:hAnsiTheme="minorHAnsi" w:cstheme="minorHAnsi"/>
+          <w:szCs w:val="22"/>
+          <w:u w:val="single"/>
+        </w:rPr>
+        <w:t xml:space="preserve">oco na competência e atração de capital humano </w:t>
+      </w:r>
+      <w:r>
+        <w:rPr>
+          <w:rFonts w:asciiTheme="minorHAnsi" w:hAnsiTheme="minorHAnsi" w:cstheme="minorHAnsi"/>
+          <w:szCs w:val="22"/>
+          <w:u w:val="single"/>
+        </w:rPr>
+        <w:t>-</w:t>
+      </w:r>
+      <w:r>
+        <w:rPr>
+          <w:rFonts w:asciiTheme="minorHAnsi" w:hAnsiTheme="minorHAnsi" w:cstheme="minorHAnsi"/>
+          <w:szCs w:val="22"/>
         </w:rPr>
         <w:t xml:space="preserve"> a APS confere muita importância nas competências dos trabalhadores no recrutamento;</w:t>
       </w:r>
@@ -12698,25 +12708,37 @@
         <w:jc w:val="left"/>
         <w:rPr>
           <w:rFonts w:asciiTheme="minorHAnsi" w:hAnsiTheme="minorHAnsi" w:cstheme="minorHAnsi"/>
-          <w:sz w:val="24"/>
-          <w:szCs w:val="24"/>
-        </w:rPr>
-      </w:pPr>
-      <w:r>
-        <w:rPr>
-          <w:rFonts w:asciiTheme="minorHAnsi" w:hAnsiTheme="minorHAnsi" w:cstheme="minorHAnsi"/>
-          <w:b/>
-          <w:bCs/>
-          <w:sz w:val="24"/>
-          <w:szCs w:val="24"/>
-        </w:rPr>
-        <w:t>investimento em formação –</w:t>
-      </w:r>
-      <w:r>
-        <w:rPr>
-          <w:rFonts w:asciiTheme="minorHAnsi" w:hAnsiTheme="minorHAnsi" w:cstheme="minorHAnsi"/>
-          <w:sz w:val="24"/>
-          <w:szCs w:val="24"/>
+          <w:szCs w:val="22"/>
+        </w:rPr>
+      </w:pPr>
+      <w:r>
+        <w:rPr>
+          <w:rFonts w:asciiTheme="minorHAnsi" w:hAnsiTheme="minorHAnsi" w:cstheme="minorHAnsi"/>
+          <w:szCs w:val="22"/>
+          <w:u w:val="single"/>
+        </w:rPr>
+        <w:t>I</w:t>
+      </w:r>
+      <w:r>
+        <w:rPr>
+          <w:rFonts w:asciiTheme="minorHAnsi" w:hAnsiTheme="minorHAnsi" w:cstheme="minorHAnsi"/>
+          <w:szCs w:val="22"/>
+          <w:u w:val="single"/>
+        </w:rPr>
+        <w:t xml:space="preserve">nvestimento em formação </w:t>
+      </w:r>
+      <w:r>
+        <w:rPr>
+          <w:rFonts w:asciiTheme="minorHAnsi" w:hAnsiTheme="minorHAnsi" w:cstheme="minorHAnsi"/>
+          <w:szCs w:val="22"/>
+          <w:u w:val="single"/>
+        </w:rPr>
+        <w:t>-</w:t>
+      </w:r>
+      <w:r>
+        <w:rPr>
+          <w:rFonts w:asciiTheme="minorHAnsi" w:hAnsiTheme="minorHAnsi" w:cstheme="minorHAnsi"/>
+          <w:szCs w:val="22"/>
         </w:rPr>
         <w:t xml:space="preserve"> é proporcionado um processo de formação profissional com objetivo de melhorar as competências dos trabalhadores;</w:t>
       </w:r>
@@ -12732,64 +12754,57 @@
         <w:jc w:val="left"/>
         <w:rPr>
           <w:rFonts w:asciiTheme="minorHAnsi" w:hAnsiTheme="minorHAnsi" w:cstheme="minorHAnsi"/>
-          <w:sz w:val="24"/>
-          <w:szCs w:val="24"/>
-        </w:rPr>
-      </w:pPr>
-      <w:r>
+          <w:szCs w:val="22"/>
+        </w:rPr>
+      </w:pPr>
+      <w:r>
+        <w:rPr>
+          <w:rFonts w:asciiTheme="minorHAnsi" w:hAnsiTheme="minorHAnsi" w:cstheme="minorHAnsi"/>
+          <w:szCs w:val="22"/>
+          <w:u w:val="single"/>
+        </w:rPr>
+        <w:t>I</w:t>
+      </w:r>
+      <w:r>
+        <w:rPr>
+          <w:rFonts w:asciiTheme="minorHAnsi" w:hAnsiTheme="minorHAnsi" w:cstheme="minorHAnsi"/>
+          <w:szCs w:val="22"/>
+          <w:u w:val="single"/>
+        </w:rPr>
+        <w:t xml:space="preserve">ncentivos à eficiência </w:t>
+      </w:r>
+      <w:r>
+        <w:rPr>
+          <w:rFonts w:asciiTheme="minorHAnsi" w:hAnsiTheme="minorHAnsi" w:cstheme="minorHAnsi"/>
+          <w:szCs w:val="22"/>
+          <w:u w:val="single"/>
+        </w:rPr>
+        <w:t>-</w:t>
+      </w:r>
+      <w:r>
+        <w:rPr>
+          <w:rFonts w:asciiTheme="minorHAnsi" w:hAnsiTheme="minorHAnsi" w:cstheme="minorHAnsi"/>
+          <w:szCs w:val="22"/>
+        </w:rPr>
+        <w:t xml:space="preserve"> o porto de Sines procura implementar um incentivo para que as empresas concessionárias dos terminais se tornem mais eficientes em termos energéticos.</w:t>
+      </w:r>
+    </w:p>
+    <w:p>
+      <w:pPr>
+        <w:spacing w:line="259" w:lineRule="auto"/>
         <w:rPr>
           <w:rFonts w:asciiTheme="minorHAnsi" w:hAnsiTheme="minorHAnsi" w:cstheme="minorHAnsi"/>
           <w:b/>
           <w:bCs/>
-          <w:sz w:val="24"/>
-          <w:szCs w:val="24"/>
-        </w:rPr>
-        <w:t>incentivos à eficiência –</w:t>
-      </w:r>
-      <w:r>
-        <w:rPr>
-          <w:rFonts w:asciiTheme="minorHAnsi" w:hAnsiTheme="minorHAnsi" w:cstheme="minorHAnsi"/>
-          <w:sz w:val="24"/>
-          <w:szCs w:val="24"/>
-        </w:rPr>
-        <w:t xml:space="preserve"> o porto de Sines procura implementar um incentivo para que as empresas concessionárias dos terminais se tornem mais eficientes em termos energéticos.</w:t>
-      </w:r>
-    </w:p>
-    <w:p>
-      <w:pPr>
+          <w:szCs w:val="22"/>
+        </w:rPr>
+      </w:pPr>
+      <w:r>
         <w:rPr>
           <w:rFonts w:asciiTheme="minorHAnsi" w:hAnsiTheme="minorHAnsi" w:cstheme="minorHAnsi"/>
           <w:b/>
           <w:bCs/>
-          <w:sz w:val="24"/>
-        </w:rPr>
-      </w:pPr>
-    </w:p>
-    <w:p>
-      <w:pPr>
-        <w:spacing w:line="259" w:lineRule="auto"/>
-        <w:rPr>
-          <w:rFonts w:asciiTheme="minorHAnsi" w:hAnsiTheme="minorHAnsi" w:cstheme="minorHAnsi"/>
-          <w:b/>
-          <w:bCs/>
-          <w:sz w:val="24"/>
-        </w:rPr>
-      </w:pPr>
-      <w:r>
-        <w:rPr>
-          <w:rFonts w:asciiTheme="minorHAnsi" w:hAnsiTheme="minorHAnsi" w:cstheme="minorHAnsi"/>
-          <w:b/>
-          <w:bCs/>
-          <w:sz w:val="24"/>
-        </w:rPr>
-        <w:t xml:space="preserve">- </w:t>
-      </w:r>
-      <w:r>
-        <w:rPr>
-          <w:rFonts w:asciiTheme="minorHAnsi" w:hAnsiTheme="minorHAnsi" w:cstheme="minorHAnsi"/>
-          <w:b/>
-          <w:bCs/>
-          <w:sz w:val="24"/>
+          <w:szCs w:val="22"/>
         </w:rPr>
         <w:t>Otimização de Infraestrutura (Fator Externo de Produtividade)</w:t>
       </w:r>
@@ -12798,13 +12813,13 @@
       <w:pPr>
         <w:rPr>
           <w:rFonts w:asciiTheme="minorHAnsi" w:hAnsiTheme="minorHAnsi" w:cstheme="minorHAnsi"/>
-          <w:sz w:val="24"/>
-        </w:rPr>
-      </w:pPr>
-      <w:r>
-        <w:rPr>
-          <w:rFonts w:asciiTheme="minorHAnsi" w:hAnsiTheme="minorHAnsi" w:cstheme="minorHAnsi"/>
-          <w:sz w:val="24"/>
+          <w:szCs w:val="22"/>
+        </w:rPr>
+      </w:pPr>
+      <w:r>
+        <w:rPr>
+          <w:rFonts w:asciiTheme="minorHAnsi" w:hAnsiTheme="minorHAnsi" w:cstheme="minorHAnsi"/>
+          <w:szCs w:val="22"/>
         </w:rPr>
         <w:t xml:space="preserve">A contribuição da APS para a construção de infraestruturas é vital para que a cadeia logística opere de forma produtiva e eficiente: </w:t>
       </w:r>
@@ -12820,84 +12835,39 @@
         <w:jc w:val="left"/>
         <w:rPr>
           <w:rFonts w:asciiTheme="minorHAnsi" w:hAnsiTheme="minorHAnsi" w:cstheme="minorHAnsi"/>
-          <w:sz w:val="24"/>
-          <w:szCs w:val="24"/>
-        </w:rPr>
-      </w:pPr>
-      <w:r>
-        <w:rPr>
-          <w:rFonts w:asciiTheme="minorHAnsi" w:hAnsiTheme="minorHAnsi" w:cstheme="minorHAnsi"/>
-          <w:b/>
-          <w:bCs/>
-          <w:sz w:val="24"/>
-          <w:szCs w:val="24"/>
-        </w:rPr>
-        <w:t xml:space="preserve">investimento em estruturas estratégicas – </w:t>
-      </w:r>
-      <w:r>
-        <w:rPr>
-          <w:rFonts w:asciiTheme="minorHAnsi" w:hAnsiTheme="minorHAnsi" w:cstheme="minorHAnsi"/>
-          <w:sz w:val="24"/>
-          <w:szCs w:val="24"/>
-        </w:rPr>
-        <w:t xml:space="preserve">a </w:t>
-      </w:r>
-      <w:r>
-        <w:rPr>
-          <w:rFonts w:asciiTheme="minorHAnsi" w:hAnsiTheme="minorHAnsi" w:cstheme="minorHAnsi"/>
-          <w:sz w:val="24"/>
-          <w:szCs w:val="24"/>
-        </w:rPr>
-        <w:t>APS gere a ZILS</w:t>
-      </w:r>
-      <w:r>
-        <w:rPr>
-          <w:rFonts w:asciiTheme="minorHAnsi" w:hAnsiTheme="minorHAnsi" w:cstheme="minorHAnsi"/>
-          <w:sz w:val="24"/>
-          <w:szCs w:val="24"/>
-        </w:rPr>
-        <w:t xml:space="preserve"> </w:t>
-      </w:r>
-      <w:r>
-        <w:rPr>
-          <w:rFonts w:asciiTheme="minorHAnsi" w:hAnsiTheme="minorHAnsi" w:cstheme="minorHAnsi"/>
-          <w:sz w:val="24"/>
-        </w:rPr>
-        <w:t>(Zona Industrial e Logística de Sines)</w:t>
-      </w:r>
-      <w:r>
-        <w:rPr>
-          <w:rFonts w:asciiTheme="minorHAnsi" w:hAnsiTheme="minorHAnsi" w:cstheme="minorHAnsi"/>
-          <w:sz w:val="24"/>
-          <w:szCs w:val="24"/>
-        </w:rPr>
-        <w:t xml:space="preserve">, uma </w:t>
-      </w:r>
-      <w:r>
-        <w:rPr>
-          <w:rFonts w:asciiTheme="minorHAnsi" w:hAnsiTheme="minorHAnsi" w:cstheme="minorHAnsi"/>
-          <w:b/>
-          <w:bCs/>
-          <w:sz w:val="24"/>
-          <w:szCs w:val="24"/>
-        </w:rPr>
-        <w:t>plataforma logística e portuária com características ímpares</w:t>
-      </w:r>
-      <w:r>
-        <w:rPr>
-          <w:rFonts w:asciiTheme="minorHAnsi" w:hAnsiTheme="minorHAnsi" w:cstheme="minorHAnsi"/>
-          <w:sz w:val="24"/>
-          <w:szCs w:val="24"/>
-        </w:rPr>
-        <w:t xml:space="preserve"> (porto de águas profundas)</w:t>
-      </w:r>
-      <w:r>
-        <w:rPr>
-          <w:rFonts w:asciiTheme="minorHAnsi" w:hAnsiTheme="minorHAnsi" w:cstheme="minorHAnsi"/>
-          <w:sz w:val="24"/>
-          <w:szCs w:val="24"/>
-        </w:rPr>
-        <w:t>;</w:t>
+          <w:szCs w:val="22"/>
+        </w:rPr>
+      </w:pPr>
+      <w:r>
+        <w:rPr>
+          <w:rFonts w:asciiTheme="minorHAnsi" w:hAnsiTheme="minorHAnsi" w:cstheme="minorHAnsi"/>
+          <w:szCs w:val="22"/>
+          <w:u w:val="single"/>
+        </w:rPr>
+        <w:t>I</w:t>
+      </w:r>
+      <w:r>
+        <w:rPr>
+          <w:rFonts w:asciiTheme="minorHAnsi" w:hAnsiTheme="minorHAnsi" w:cstheme="minorHAnsi"/>
+          <w:szCs w:val="22"/>
+          <w:u w:val="single"/>
+        </w:rPr>
+        <w:t xml:space="preserve">nvestimento em estruturas estratégicas </w:t>
+      </w:r>
+      <w:r>
+        <w:rPr>
+          <w:rFonts w:asciiTheme="minorHAnsi" w:hAnsiTheme="minorHAnsi" w:cstheme="minorHAnsi"/>
+          <w:szCs w:val="22"/>
+          <w:u w:val="single"/>
+        </w:rPr>
+        <w:t>-</w:t>
+      </w:r>
+      <w:r>
+        <w:rPr>
+          <w:rFonts w:asciiTheme="minorHAnsi" w:hAnsiTheme="minorHAnsi" w:cstheme="minorHAnsi"/>
+          <w:szCs w:val="22"/>
+        </w:rPr>
+        <w:t xml:space="preserve"> a APS gere a ZILS, uma plataforma logística e portuária com características ímpares (porto de águas profundas);</w:t>
       </w:r>
     </w:p>
     <w:p>
@@ -12911,237 +12881,196 @@
         <w:jc w:val="left"/>
         <w:rPr>
           <w:rFonts w:asciiTheme="minorHAnsi" w:hAnsiTheme="minorHAnsi" w:cstheme="minorHAnsi"/>
+          <w:szCs w:val="22"/>
+        </w:rPr>
+      </w:pPr>
+      <w:proofErr w:type="spellStart"/>
+      <w:r>
+        <w:rPr>
+          <w:rFonts w:asciiTheme="minorHAnsi" w:hAnsiTheme="minorHAnsi" w:cstheme="minorHAnsi"/>
+          <w:szCs w:val="22"/>
+          <w:u w:val="single"/>
+        </w:rPr>
+        <w:t>I</w:t>
+      </w:r>
+      <w:r>
+        <w:rPr>
+          <w:rFonts w:asciiTheme="minorHAnsi" w:hAnsiTheme="minorHAnsi" w:cstheme="minorHAnsi"/>
+          <w:szCs w:val="22"/>
+          <w:u w:val="single"/>
+        </w:rPr>
+        <w:t>nterconectividade</w:t>
+      </w:r>
+      <w:proofErr w:type="spellEnd"/>
+      <w:r>
+        <w:rPr>
+          <w:rFonts w:asciiTheme="minorHAnsi" w:hAnsiTheme="minorHAnsi" w:cstheme="minorHAnsi"/>
+          <w:szCs w:val="22"/>
+          <w:u w:val="single"/>
+        </w:rPr>
+        <w:t xml:space="preserve"> do </w:t>
+      </w:r>
+      <w:proofErr w:type="spellStart"/>
+      <w:r>
+        <w:rPr>
+          <w:rFonts w:asciiTheme="minorHAnsi" w:hAnsiTheme="minorHAnsi" w:cstheme="minorHAnsi"/>
+          <w:szCs w:val="22"/>
+          <w:u w:val="single"/>
+        </w:rPr>
+        <w:t>Hinterland</w:t>
+      </w:r>
+      <w:proofErr w:type="spellEnd"/>
+      <w:r>
+        <w:rPr>
+          <w:rFonts w:asciiTheme="minorHAnsi" w:hAnsiTheme="minorHAnsi" w:cstheme="minorHAnsi"/>
+          <w:szCs w:val="22"/>
+          <w:u w:val="single"/>
+        </w:rPr>
+        <w:t xml:space="preserve"> -</w:t>
+      </w:r>
+      <w:r>
+        <w:rPr>
+          <w:rFonts w:asciiTheme="minorHAnsi" w:hAnsiTheme="minorHAnsi" w:cstheme="minorHAnsi"/>
+          <w:b/>
+          <w:bCs/>
+          <w:szCs w:val="22"/>
+        </w:rPr>
+        <w:t xml:space="preserve"> </w:t>
+      </w:r>
+      <w:r>
+        <w:rPr>
+          <w:rFonts w:asciiTheme="minorHAnsi" w:hAnsiTheme="minorHAnsi" w:cstheme="minorHAnsi"/>
+          <w:szCs w:val="22"/>
+        </w:rPr>
+        <w:t>de maneira a permitir ligações terrestres rápidas, eficazes e confiáveis.</w:t>
+      </w:r>
+    </w:p>
+    <w:p>
+      <w:pPr>
+        <w:rPr>
+          <w:rFonts w:asciiTheme="minorHAnsi" w:hAnsiTheme="minorHAnsi" w:cstheme="minorHAnsi"/>
+          <w:szCs w:val="22"/>
+        </w:rPr>
+      </w:pPr>
+      <w:r>
+        <w:rPr>
+          <w:rFonts w:asciiTheme="minorHAnsi" w:hAnsiTheme="minorHAnsi" w:cstheme="minorHAnsi"/>
+          <w:szCs w:val="22"/>
+        </w:rPr>
+        <w:t>As práticas de produtividade da APS funcionam como engrenagens interligadas num sistema. A otimização dos processos operacionais como, por exemplo, a gestão energética, é possível graças à melhoria continua proporcionada pela comunicação vertical, sustentada por uma infraestrutura que atrai o capital humano qualificado e necessário para a manutenção e inovação do sistema. Isto permite criar um ciclo de crescimento e desempenho.</w:t>
+      </w:r>
+    </w:p>
+    <w:p>
+      <w:pPr>
+        <w:rPr>
+          <w:rFonts w:asciiTheme="minorHAnsi" w:hAnsiTheme="minorHAnsi" w:cstheme="minorHAnsi"/>
           <w:sz w:val="24"/>
-          <w:szCs w:val="24"/>
-        </w:rPr>
-      </w:pPr>
-      <w:proofErr w:type="spellStart"/>
-      <w:r>
+        </w:rPr>
+      </w:pPr>
+    </w:p>
+    <w:p>
+      <w:pPr>
+        <w:rPr>
+          <w:rFonts w:asciiTheme="minorHAnsi" w:hAnsiTheme="minorHAnsi" w:cstheme="minorHAnsi"/>
+          <w:sz w:val="24"/>
+        </w:rPr>
+      </w:pPr>
+    </w:p>
+    <w:p>
+      <w:pPr>
+        <w:pStyle w:val="Ttulo2"/>
+        <w:rPr>
+          <w:rFonts w:asciiTheme="minorHAnsi" w:hAnsiTheme="minorHAnsi" w:cstheme="minorHAnsi"/>
+          <w:color w:val="EE0000"/>
+        </w:rPr>
+      </w:pPr>
+      <w:bookmarkStart w:id="38" w:name="_Toc214753079"/>
+      <w:r>
+        <w:rPr>
+          <w:rFonts w:asciiTheme="minorHAnsi" w:hAnsiTheme="minorHAnsi" w:cstheme="minorHAnsi"/>
+        </w:rPr>
+        <w:t>II.6 Economia circular</w:t>
+      </w:r>
+      <w:r>
+        <w:rPr>
+          <w:rFonts w:asciiTheme="minorHAnsi" w:hAnsiTheme="minorHAnsi" w:cstheme="minorHAnsi"/>
+        </w:rPr>
+        <w:t xml:space="preserve"> --- </w:t>
+      </w:r>
+      <w:r>
+        <w:rPr>
+          <w:rFonts w:asciiTheme="minorHAnsi" w:hAnsiTheme="minorHAnsi" w:cstheme="minorHAnsi"/>
+          <w:color w:val="EE0000"/>
+        </w:rPr>
+        <w:t>(3.7.7 / 3.7.9)</w:t>
+      </w:r>
+      <w:bookmarkEnd w:id="38"/>
+    </w:p>
+    <w:p>
+      <w:pPr>
+        <w:pStyle w:val="Ttulo1"/>
+        <w:rPr>
+          <w:rFonts w:asciiTheme="minorHAnsi" w:hAnsiTheme="minorHAnsi" w:cstheme="minorHAnsi"/>
+        </w:rPr>
+      </w:pPr>
+      <w:bookmarkStart w:id="39" w:name="_Toc214753080"/>
+      <w:r>
+        <w:rPr>
+          <w:rFonts w:asciiTheme="minorHAnsi" w:hAnsiTheme="minorHAnsi" w:cstheme="minorHAnsi"/>
+        </w:rPr>
+        <w:t>3.7.7</w:t>
+      </w:r>
+      <w:bookmarkEnd w:id="39"/>
+      <w:r>
+        <w:rPr>
+          <w:rFonts w:asciiTheme="minorHAnsi" w:hAnsiTheme="minorHAnsi" w:cstheme="minorHAnsi"/>
+        </w:rPr>
+        <w:t xml:space="preserve"> </w:t>
+      </w:r>
+    </w:p>
+    <w:p>
+      <w:pPr>
+        <w:spacing w:line="259" w:lineRule="auto"/>
+        <w:rPr>
+          <w:rFonts w:asciiTheme="minorHAnsi" w:hAnsiTheme="minorHAnsi" w:cstheme="minorHAnsi"/>
+          <w:sz w:val="24"/>
+        </w:rPr>
+      </w:pPr>
+      <w:r>
+        <w:rPr>
+          <w:rFonts w:asciiTheme="minorHAnsi" w:hAnsiTheme="minorHAnsi" w:cstheme="minorHAnsi"/>
+          <w:sz w:val="24"/>
+        </w:rPr>
+        <w:t>A Administração do Porto de Sines (APS) incorpora a sustentabilidade e a responsabilidade social nas suas atividades, resultando em contribuições diretas e potenciais para vários Objetivos de Desenvolvimento Sustentável (ODS) das Nações Unidas.</w:t>
+      </w:r>
+    </w:p>
+    <w:p>
+      <w:pPr>
+        <w:spacing w:line="259" w:lineRule="auto"/>
+        <w:rPr>
+          <w:rFonts w:asciiTheme="minorHAnsi" w:hAnsiTheme="minorHAnsi" w:cstheme="minorHAnsi"/>
+          <w:sz w:val="24"/>
+        </w:rPr>
+      </w:pPr>
+    </w:p>
+    <w:p>
+      <w:pPr>
+        <w:spacing w:line="259" w:lineRule="auto"/>
         <w:rPr>
           <w:rFonts w:asciiTheme="minorHAnsi" w:hAnsiTheme="minorHAnsi" w:cstheme="minorHAnsi"/>
           <w:b/>
           <w:bCs/>
           <w:sz w:val="24"/>
-          <w:szCs w:val="24"/>
-        </w:rPr>
-        <w:t>interconectividade</w:t>
-      </w:r>
-      <w:proofErr w:type="spellEnd"/>
+        </w:rPr>
+      </w:pPr>
       <w:r>
         <w:rPr>
           <w:rFonts w:asciiTheme="minorHAnsi" w:hAnsiTheme="minorHAnsi" w:cstheme="minorHAnsi"/>
           <w:b/>
           <w:bCs/>
           <w:sz w:val="24"/>
-          <w:szCs w:val="24"/>
-        </w:rPr>
-        <w:t xml:space="preserve"> do </w:t>
-      </w:r>
-      <w:proofErr w:type="spellStart"/>
-      <w:r>
-        <w:rPr>
-          <w:rFonts w:asciiTheme="minorHAnsi" w:hAnsiTheme="minorHAnsi" w:cstheme="minorHAnsi"/>
-          <w:b/>
-          <w:bCs/>
-          <w:i/>
-          <w:iCs/>
-          <w:sz w:val="24"/>
-          <w:szCs w:val="24"/>
-        </w:rPr>
-        <w:t>Hinterland</w:t>
-      </w:r>
-      <w:proofErr w:type="spellEnd"/>
-      <w:r>
-        <w:rPr>
-          <w:rFonts w:asciiTheme="minorHAnsi" w:hAnsiTheme="minorHAnsi" w:cstheme="minorHAnsi"/>
-          <w:b/>
-          <w:bCs/>
-          <w:i/>
-          <w:iCs/>
-          <w:sz w:val="24"/>
-          <w:szCs w:val="24"/>
-        </w:rPr>
-        <w:t xml:space="preserve"> </w:t>
-      </w:r>
-      <w:r>
-        <w:rPr>
-          <w:rFonts w:asciiTheme="minorHAnsi" w:hAnsiTheme="minorHAnsi" w:cstheme="minorHAnsi"/>
-          <w:sz w:val="24"/>
-          <w:szCs w:val="24"/>
-        </w:rPr>
-        <w:t>(Termo em uso na geografia portuária, refere-se a uma área geográfica que serve e é influenciada por um centro urbano, como um porto ou cidade)</w:t>
-      </w:r>
-      <w:r>
-        <w:rPr>
-          <w:rFonts w:asciiTheme="minorHAnsi" w:hAnsiTheme="minorHAnsi" w:cstheme="minorHAnsi"/>
-          <w:i/>
-          <w:iCs/>
-          <w:sz w:val="24"/>
-          <w:szCs w:val="24"/>
-        </w:rPr>
-        <w:t xml:space="preserve"> </w:t>
-      </w:r>
-      <w:r>
-        <w:rPr>
-          <w:rFonts w:asciiTheme="minorHAnsi" w:hAnsiTheme="minorHAnsi" w:cstheme="minorHAnsi"/>
-          <w:b/>
-          <w:bCs/>
-          <w:sz w:val="24"/>
-          <w:szCs w:val="24"/>
-        </w:rPr>
-        <w:t xml:space="preserve">– </w:t>
-      </w:r>
-      <w:r>
-        <w:rPr>
-          <w:rFonts w:asciiTheme="minorHAnsi" w:hAnsiTheme="minorHAnsi" w:cstheme="minorHAnsi"/>
-          <w:sz w:val="24"/>
-          <w:szCs w:val="24"/>
-        </w:rPr>
-        <w:t xml:space="preserve">de maneira a permitir </w:t>
-      </w:r>
-      <w:r>
-        <w:rPr>
-          <w:rFonts w:asciiTheme="minorHAnsi" w:hAnsiTheme="minorHAnsi" w:cstheme="minorHAnsi"/>
-          <w:sz w:val="24"/>
-          <w:szCs w:val="24"/>
-        </w:rPr>
-        <w:t>ligações terrestres rápidas, eficazes e confiáveis.</w:t>
-      </w:r>
-    </w:p>
-    <w:p>
-      <w:pPr>
-        <w:spacing w:line="259" w:lineRule="auto"/>
-        <w:rPr>
-          <w:rFonts w:asciiTheme="minorHAnsi" w:hAnsiTheme="minorHAnsi" w:cstheme="minorHAnsi"/>
-          <w:sz w:val="24"/>
-        </w:rPr>
-      </w:pPr>
-    </w:p>
-    <w:p>
-      <w:pPr>
-        <w:rPr>
-          <w:rFonts w:asciiTheme="minorHAnsi" w:hAnsiTheme="minorHAnsi" w:cstheme="minorHAnsi"/>
-          <w:sz w:val="24"/>
-        </w:rPr>
-      </w:pPr>
-      <w:r>
-        <w:rPr>
-          <w:rFonts w:asciiTheme="minorHAnsi" w:hAnsiTheme="minorHAnsi" w:cstheme="minorHAnsi"/>
-          <w:sz w:val="24"/>
-        </w:rPr>
-        <w:t>As práticas de produtividade da APS funcionam como engrenagens interligadas num sistema. A otimização dos processos operacionais como, por exemplo, a gestão energética, é possível graças à melhoria continua proporcionada pela comunicação vertical, sustentada por uma infraestrutura que atrai o capital humano qualificado e necessário para a manutenção e inovação do sistema. Isto permite criar um ciclo de crescimento e desempenho.</w:t>
-      </w:r>
-    </w:p>
-    <w:p>
-      <w:pPr>
-        <w:rPr>
-          <w:rFonts w:asciiTheme="minorHAnsi" w:hAnsiTheme="minorHAnsi" w:cstheme="minorHAnsi"/>
-          <w:sz w:val="24"/>
-        </w:rPr>
-      </w:pPr>
-    </w:p>
-    <w:p>
-      <w:pPr>
-        <w:rPr>
-          <w:rFonts w:asciiTheme="minorHAnsi" w:hAnsiTheme="minorHAnsi" w:cstheme="minorHAnsi"/>
-          <w:sz w:val="24"/>
-        </w:rPr>
-      </w:pPr>
-    </w:p>
-    <w:p>
-      <w:pPr>
-        <w:pStyle w:val="Ttulo2"/>
-        <w:rPr>
-          <w:rFonts w:asciiTheme="minorHAnsi" w:hAnsiTheme="minorHAnsi" w:cstheme="minorHAnsi"/>
-          <w:color w:val="EE0000"/>
-        </w:rPr>
-      </w:pPr>
-      <w:bookmarkStart w:id="38" w:name="_Toc214752234"/>
-      <w:r>
-        <w:rPr>
-          <w:rFonts w:asciiTheme="minorHAnsi" w:hAnsiTheme="minorHAnsi" w:cstheme="minorHAnsi"/>
-        </w:rPr>
-        <w:t>II.6 Economia circular</w:t>
-      </w:r>
-      <w:r>
-        <w:rPr>
-          <w:rFonts w:asciiTheme="minorHAnsi" w:hAnsiTheme="minorHAnsi" w:cstheme="minorHAnsi"/>
-        </w:rPr>
-        <w:t xml:space="preserve"> --- </w:t>
-      </w:r>
-      <w:r>
-        <w:rPr>
-          <w:rFonts w:asciiTheme="minorHAnsi" w:hAnsiTheme="minorHAnsi" w:cstheme="minorHAnsi"/>
-          <w:color w:val="EE0000"/>
-        </w:rPr>
-        <w:t>(3.7.7 / 3.7.9)</w:t>
-      </w:r>
-      <w:bookmarkEnd w:id="38"/>
-    </w:p>
-    <w:p>
-      <w:pPr>
-        <w:pStyle w:val="Ttulo1"/>
-        <w:rPr>
-          <w:rFonts w:asciiTheme="minorHAnsi" w:hAnsiTheme="minorHAnsi" w:cstheme="minorHAnsi"/>
-        </w:rPr>
-      </w:pPr>
-      <w:bookmarkStart w:id="39" w:name="_Toc214752235"/>
-      <w:r>
-        <w:rPr>
-          <w:rFonts w:asciiTheme="minorHAnsi" w:hAnsiTheme="minorHAnsi" w:cstheme="minorHAnsi"/>
-        </w:rPr>
-        <w:t>3.7.7</w:t>
-      </w:r>
-      <w:bookmarkEnd w:id="39"/>
-      <w:r>
-        <w:rPr>
-          <w:rFonts w:asciiTheme="minorHAnsi" w:hAnsiTheme="minorHAnsi" w:cstheme="minorHAnsi"/>
-        </w:rPr>
-        <w:t xml:space="preserve"> </w:t>
-      </w:r>
-    </w:p>
-    <w:p>
-      <w:pPr>
-        <w:spacing w:line="259" w:lineRule="auto"/>
-        <w:rPr>
-          <w:rFonts w:asciiTheme="minorHAnsi" w:hAnsiTheme="minorHAnsi" w:cstheme="minorHAnsi"/>
-          <w:sz w:val="24"/>
-        </w:rPr>
-      </w:pPr>
-      <w:r>
-        <w:rPr>
-          <w:rFonts w:asciiTheme="minorHAnsi" w:hAnsiTheme="minorHAnsi" w:cstheme="minorHAnsi"/>
-          <w:sz w:val="24"/>
-        </w:rPr>
-        <w:t>A Administração do Porto de Sines (APS) incorpora a sustentabilidade e a responsabilidade social nas suas atividades, resultando em contribuições diretas e potenciais para vários Objetivos de Desenvolvimento Sustentável (ODS) das Nações Unidas.</w:t>
-      </w:r>
-    </w:p>
-    <w:p>
-      <w:pPr>
-        <w:spacing w:line="259" w:lineRule="auto"/>
-        <w:rPr>
-          <w:rFonts w:asciiTheme="minorHAnsi" w:hAnsiTheme="minorHAnsi" w:cstheme="minorHAnsi"/>
-          <w:sz w:val="24"/>
-        </w:rPr>
-      </w:pPr>
-    </w:p>
-    <w:p>
-      <w:pPr>
-        <w:spacing w:line="259" w:lineRule="auto"/>
-        <w:rPr>
-          <w:rFonts w:asciiTheme="minorHAnsi" w:hAnsiTheme="minorHAnsi" w:cstheme="minorHAnsi"/>
-          <w:b/>
-          <w:bCs/>
-          <w:sz w:val="24"/>
-        </w:rPr>
-      </w:pPr>
-      <w:r>
-        <w:rPr>
-          <w:rFonts w:asciiTheme="minorHAnsi" w:hAnsiTheme="minorHAnsi" w:cstheme="minorHAnsi"/>
-          <w:b/>
-          <w:bCs/>
-          <w:sz w:val="24"/>
-        </w:rPr>
+        </w:rPr>
+        <w:lastRenderedPageBreak/>
         <w:t>ODS 7: Energia Acessível e Limpa</w:t>
       </w:r>
     </w:p>
@@ -13420,7 +13349,6 @@
           <w:sz w:val="24"/>
           <w:szCs w:val="24"/>
         </w:rPr>
-        <w:lastRenderedPageBreak/>
         <w:t xml:space="preserve">garantia de trabalho qualificado – </w:t>
       </w:r>
       <w:r>
@@ -13555,7 +13483,7 @@
           <w:sz w:val="24"/>
         </w:rPr>
       </w:pPr>
-      <w:bookmarkStart w:id="40" w:name="_Toc214752236"/>
+      <w:bookmarkStart w:id="40" w:name="_Toc214753081"/>
       <w:r>
         <w:rPr>
           <w:rFonts w:asciiTheme="minorHAnsi" w:hAnsiTheme="minorHAnsi" w:cstheme="minorHAnsi"/>
@@ -13850,7 +13778,6 @@
           <w:sz w:val="24"/>
           <w:szCs w:val="24"/>
         </w:rPr>
-        <w:lastRenderedPageBreak/>
         <w:t>Partilhar (Share)</w:t>
       </w:r>
     </w:p>
@@ -14069,6 +13996,7 @@
           <w:sz w:val="24"/>
           <w:szCs w:val="24"/>
         </w:rPr>
+        <w:lastRenderedPageBreak/>
         <w:t xml:space="preserve">benefício económico e operacional: </w:t>
       </w:r>
       <w:r>
@@ -14386,7 +14314,6 @@
           <w:bCs/>
           <w:sz w:val="24"/>
         </w:rPr>
-        <w:lastRenderedPageBreak/>
         <w:t xml:space="preserve">Sugestão: </w:t>
       </w:r>
       <w:r>
@@ -14583,6 +14510,7 @@
           <w:sz w:val="24"/>
           <w:szCs w:val="24"/>
         </w:rPr>
+        <w:lastRenderedPageBreak/>
         <w:t xml:space="preserve">benefício ambiental e operacional: </w:t>
       </w:r>
       <w:r>
@@ -14682,7 +14610,7 @@
       <w:pPr>
         <w:pStyle w:val="Ttulo2"/>
       </w:pPr>
-      <w:bookmarkStart w:id="41" w:name="_Toc214752237"/>
+      <w:bookmarkStart w:id="41" w:name="_Toc214753082"/>
       <w:r>
         <w:t xml:space="preserve">II.7 </w:t>
       </w:r>
@@ -14696,7 +14624,7 @@
       <w:pPr>
         <w:pStyle w:val="Ttulo2"/>
       </w:pPr>
-      <w:bookmarkStart w:id="42" w:name="_Toc214752238"/>
+      <w:bookmarkStart w:id="42" w:name="_Toc214753083"/>
       <w:r>
         <w:t>II.</w:t>
       </w:r>
@@ -14714,7 +14642,7 @@
       <w:pPr>
         <w:pStyle w:val="Ttulo2"/>
       </w:pPr>
-      <w:bookmarkStart w:id="43" w:name="_Toc214752239"/>
+      <w:bookmarkStart w:id="43" w:name="_Toc214753084"/>
       <w:r>
         <w:t>II.9 Gestão das Operações e Indústria 4.0</w:t>
       </w:r>
@@ -14742,7 +14670,7 @@
           <w:szCs w:val="22"/>
         </w:rPr>
       </w:pPr>
-      <w:bookmarkStart w:id="44" w:name="_Toc214752240"/>
+      <w:bookmarkStart w:id="44" w:name="_Toc214753085"/>
       <w:r>
         <w:lastRenderedPageBreak/>
         <w:t>Parte III – Conclusão</w:t>
@@ -14753,7 +14681,7 @@
       <w:pPr>
         <w:pStyle w:val="Ttulo2"/>
       </w:pPr>
-      <w:bookmarkStart w:id="45" w:name="_Toc214752241"/>
+      <w:bookmarkStart w:id="45" w:name="_Toc214753086"/>
       <w:r>
         <w:t>III.1 Conclusão</w:t>
       </w:r>
@@ -14765,7 +14693,7 @@
       <w:pPr>
         <w:pStyle w:val="Ttulo2"/>
       </w:pPr>
-      <w:bookmarkStart w:id="46" w:name="_Toc214752242"/>
+      <w:bookmarkStart w:id="46" w:name="_Toc214753087"/>
       <w:r>
         <w:t>III.2 Sugestões de melhoria</w:t>
       </w:r>
@@ -14780,7 +14708,7 @@
         <w:br w:type="page"/>
       </w:r>
       <w:bookmarkStart w:id="47" w:name="_Toc471979356"/>
-      <w:bookmarkStart w:id="48" w:name="_Toc214752243"/>
+      <w:bookmarkStart w:id="48" w:name="_Toc214753088"/>
       <w:r>
         <w:lastRenderedPageBreak/>
         <w:t>Referências</w:t>
@@ -15400,7 +15328,7 @@
           <w:rFonts w:eastAsia="Arial Narrow"/>
         </w:rPr>
       </w:pPr>
-      <w:bookmarkStart w:id="50" w:name="_Toc214752244"/>
+      <w:bookmarkStart w:id="50" w:name="_Toc214753089"/>
       <w:r>
         <w:rPr>
           <w:rFonts w:eastAsia="Arial Narrow"/>
@@ -15421,7 +15349,7 @@
       <w:pPr>
         <w:pStyle w:val="Ttulo2"/>
       </w:pPr>
-      <w:bookmarkStart w:id="51" w:name="_Toc214752245"/>
+      <w:bookmarkStart w:id="51" w:name="_Toc214753090"/>
       <w:r>
         <w:t>Opções Estratégicas para o Porto de Sines (2020-2030)</w:t>
       </w:r>
@@ -16582,7 +16510,7 @@
       <w:pPr>
         <w:pStyle w:val="Ttulo2"/>
       </w:pPr>
-      <w:bookmarkStart w:id="61" w:name="_Toc214752246"/>
+      <w:bookmarkStart w:id="61" w:name="_Toc214753091"/>
       <w:r>
         <w:t xml:space="preserve">Ligações e </w:t>
       </w:r>
@@ -16749,7 +16677,7 @@
       <w:pPr>
         <w:pStyle w:val="Ttulo2"/>
       </w:pPr>
-      <w:bookmarkStart w:id="63" w:name="_Toc214752247"/>
+      <w:bookmarkStart w:id="63" w:name="_Toc214753092"/>
       <w:r>
         <w:t>Estatísticas</w:t>
       </w:r>
@@ -16766,7 +16694,7 @@
           <w:szCs w:val="20"/>
         </w:rPr>
       </w:pPr>
-      <w:bookmarkStart w:id="64" w:name="_Toc214752248"/>
+      <w:bookmarkStart w:id="64" w:name="_Toc214753093"/>
       <w:r>
         <w:rPr>
           <w:b/>
@@ -17142,7 +17070,7 @@
           <w:szCs w:val="20"/>
         </w:rPr>
       </w:pPr>
-      <w:bookmarkStart w:id="68" w:name="_Toc214752249"/>
+      <w:bookmarkStart w:id="68" w:name="_Toc214753094"/>
       <w:r>
         <w:rPr>
           <w:b/>
@@ -17520,7 +17448,7 @@
           <w:szCs w:val="20"/>
         </w:rPr>
       </w:pPr>
-      <w:bookmarkStart w:id="72" w:name="_Toc214752250"/>
+      <w:bookmarkStart w:id="72" w:name="_Toc214753095"/>
       <w:r>
         <w:rPr>
           <w:b/>

</xml_diff>